<commit_message>
[CHANGE] change the code to handle the Yield table
</commit_message>
<xml_diff>
--- a/assets/templates/template_scada.docx
+++ b/assets/templates/template_scada.docx
@@ -315,8 +315,17 @@
                 <w:b/>
                 <w:bCs/>
               </w:rPr>
-              <w:t>Date d’émission</w:t>
+              <w:t xml:space="preserve">Date </w:t>
             </w:r>
+            <w:proofErr w:type="spellStart"/>
+            <w:r>
+              <w:rPr>
+                <w:b/>
+                <w:bCs/>
+              </w:rPr>
+              <w:t>d’émission</w:t>
+            </w:r>
+            <w:proofErr w:type="spellEnd"/>
           </w:p>
         </w:tc>
         <w:tc>
@@ -352,6 +361,7 @@
                 <w:bCs/>
               </w:rPr>
             </w:pPr>
+            <w:proofErr w:type="spellStart"/>
             <w:r>
               <w:rPr>
                 <w:b/>
@@ -359,6 +369,7 @@
               </w:rPr>
               <w:t>Rédacteur</w:t>
             </w:r>
+            <w:proofErr w:type="spellEnd"/>
           </w:p>
         </w:tc>
         <w:tc>
@@ -373,6 +384,7 @@
                 <w:bCs/>
               </w:rPr>
             </w:pPr>
+            <w:proofErr w:type="spellStart"/>
             <w:r>
               <w:rPr>
                 <w:b/>
@@ -380,6 +392,7 @@
               </w:rPr>
               <w:t>Vérificateur</w:t>
             </w:r>
+            <w:proofErr w:type="spellEnd"/>
           </w:p>
         </w:tc>
         <w:tc>
@@ -394,6 +407,7 @@
                 <w:bCs/>
               </w:rPr>
             </w:pPr>
+            <w:proofErr w:type="spellStart"/>
             <w:r>
               <w:rPr>
                 <w:b/>
@@ -401,6 +415,7 @@
               </w:rPr>
               <w:t>Approbateur</w:t>
             </w:r>
+            <w:proofErr w:type="spellEnd"/>
           </w:p>
         </w:tc>
       </w:tr>
@@ -974,9 +989,11 @@
         <w:lastRenderedPageBreak/>
         <w:t>Nom du parc : {{</w:t>
       </w:r>
+      <w:proofErr w:type="spellStart"/>
       <w:r>
         <w:t>park_name</w:t>
       </w:r>
+      <w:proofErr w:type="spellEnd"/>
       <w:r>
         <w:t xml:space="preserve">}} </w:t>
       </w:r>
@@ -985,31 +1002,43 @@
       <w:r>
         <w:t>Type d’éoliennes : {{</w:t>
       </w:r>
+      <w:proofErr w:type="spellStart"/>
       <w:r>
         <w:t>model_wtg</w:t>
       </w:r>
+      <w:proofErr w:type="spellEnd"/>
       <w:r>
         <w:t xml:space="preserve">}} </w:t>
       </w:r>
     </w:p>
     <w:p>
       <w:r>
-        <w:t>Nombre d’éoliennes : {{N</w:t>
+        <w:t>Nombre d’éoliennes : {{</w:t>
+      </w:r>
+      <w:proofErr w:type="spellStart"/>
+      <w:r>
+        <w:t>N</w:t>
       </w:r>
       <w:r>
         <w:t>ombre</w:t>
       </w:r>
       <w:r>
-        <w:t xml:space="preserve">_WTG}} </w:t>
+        <w:t>_WTG</w:t>
+      </w:r>
+      <w:proofErr w:type="spellEnd"/>
+      <w:r>
+        <w:t xml:space="preserve">}} </w:t>
       </w:r>
     </w:p>
     <w:p>
       <w:r>
         <w:t>Puissance totale installée : {{</w:t>
       </w:r>
+      <w:proofErr w:type="spellStart"/>
       <w:r>
         <w:t>nominal_power</w:t>
       </w:r>
+      <w:proofErr w:type="spellEnd"/>
       <w:r>
         <w:t xml:space="preserve">}} </w:t>
       </w:r>
@@ -1046,8 +1075,13 @@
       </w:r>
     </w:p>
     <w:p>
-      <w:r>
-        <w:t>Email : {{MAIL_AUTEUR}}</w:t>
+      <w:proofErr w:type="gramStart"/>
+      <w:r>
+        <w:t>Email</w:t>
+      </w:r>
+      <w:proofErr w:type="gramEnd"/>
+      <w:r>
+        <w:t xml:space="preserve"> : {{MAIL_AUTEUR}}</w:t>
       </w:r>
     </w:p>
     <w:p>
@@ -1067,8 +1101,13 @@
       </w:r>
     </w:p>
     <w:p>
-      <w:r>
-        <w:t>Email : {{MAIL_VERIFICATEUR}}</w:t>
+      <w:proofErr w:type="gramStart"/>
+      <w:r>
+        <w:t>Email</w:t>
+      </w:r>
+      <w:proofErr w:type="gramEnd"/>
+      <w:r>
+        <w:t xml:space="preserve"> : {{MAIL_VERIFICATEUR}}</w:t>
       </w:r>
     </w:p>
     <w:p>
@@ -1088,8 +1127,13 @@
       </w:r>
     </w:p>
     <w:p>
-      <w:r>
-        <w:t>Email : {{MAIL_APPROBATEUR}}</w:t>
+      <w:proofErr w:type="gramStart"/>
+      <w:r>
+        <w:t>Email</w:t>
+      </w:r>
+      <w:proofErr w:type="gramEnd"/>
+      <w:r>
+        <w:t xml:space="preserve"> : {{MAIL_APPROBATEUR}}</w:t>
       </w:r>
     </w:p>
     <w:p>
@@ -1123,25 +1167,57 @@
         <w:t xml:space="preserve">Les données SCADA du parc éolien </w:t>
       </w:r>
       <w:r>
-        <w:t>{{park_name}}</w:t>
+        <w:t>{{</w:t>
+      </w:r>
+      <w:proofErr w:type="spellStart"/>
+      <w:r>
+        <w:t>park_name</w:t>
+      </w:r>
+      <w:proofErr w:type="spellEnd"/>
+      <w:r>
+        <w:t>}}</w:t>
       </w:r>
       <w:r>
         <w:t xml:space="preserve"> ont été analysées sur la période du </w:t>
       </w:r>
       <w:r>
-        <w:t>{{analysis_start}}</w:t>
+        <w:t>{{</w:t>
+      </w:r>
+      <w:proofErr w:type="spellStart"/>
+      <w:r>
+        <w:t>analysis_start</w:t>
+      </w:r>
+      <w:proofErr w:type="spellEnd"/>
+      <w:r>
+        <w:t>}}</w:t>
       </w:r>
       <w:r>
         <w:t xml:space="preserve"> au </w:t>
       </w:r>
       <w:r>
-        <w:t>{{analysis_end}}</w:t>
+        <w:t>{{</w:t>
+      </w:r>
+      <w:proofErr w:type="spellStart"/>
+      <w:r>
+        <w:t>analysis_end</w:t>
+      </w:r>
+      <w:proofErr w:type="spellEnd"/>
+      <w:r>
+        <w:t>}}</w:t>
       </w:r>
       <w:r>
         <w:t xml:space="preserve">, à partir des informations fournies par le client. Le parc est composé de </w:t>
       </w:r>
       <w:r>
-        <w:t>{{turbine_count}}</w:t>
+        <w:t>{{</w:t>
+      </w:r>
+      <w:proofErr w:type="spellStart"/>
+      <w:r>
+        <w:t>turbine_count</w:t>
+      </w:r>
+      <w:proofErr w:type="spellEnd"/>
+      <w:r>
+        <w:t>}}</w:t>
       </w:r>
       <w:r>
         <w:t xml:space="preserve"> éoliennes de type</w:t>
@@ -1150,16 +1226,32 @@
         <w:t xml:space="preserve"> </w:t>
       </w:r>
       <w:r>
-        <w:t>{{model_wtg}</w:t>
-      </w:r>
+        <w:t>{{</w:t>
+      </w:r>
+      <w:proofErr w:type="spellStart"/>
+      <w:r>
+        <w:t>model_wtg</w:t>
+      </w:r>
+      <w:proofErr w:type="spellEnd"/>
       <w:r>
         <w:t>}</w:t>
       </w:r>
       <w:r>
+        <w:t>}</w:t>
+      </w:r>
+      <w:r>
         <w:t xml:space="preserve">, désignées </w:t>
       </w:r>
       <w:r>
-        <w:t>{{turbine_list}}</w:t>
+        <w:t>{{</w:t>
+      </w:r>
+      <w:proofErr w:type="spellStart"/>
+      <w:r>
+        <w:t>turbine_list</w:t>
+      </w:r>
+      <w:proofErr w:type="spellEnd"/>
+      <w:r>
+        <w:t>}}</w:t>
       </w:r>
       <w:r>
         <w:t xml:space="preserve"> L’ensemble des turbines a été pris en compte dans l’analyse.</w:t>
@@ -1181,13 +1273,21 @@
     <w:p/>
     <w:p>
       <w:r>
-        <w:t>[T</w:t>
+        <w:t>[</w:t>
+      </w:r>
+      <w:proofErr w:type="gramStart"/>
+      <w:r>
+        <w:t>T</w:t>
       </w:r>
       <w:r>
         <w:t>ODO</w:t>
       </w:r>
       <w:r>
-        <w:t>:SCADA_SUMMARY_TABLE]</w:t>
+        <w:t>:SCADA</w:t>
+      </w:r>
+      <w:proofErr w:type="gramEnd"/>
+      <w:r>
+        <w:t>_SUMMARY_TABLE]</w:t>
       </w:r>
     </w:p>
     <w:p>
@@ -1213,35 +1313,56 @@
       <w:r>
         <w:t>Le parc éolien {{</w:t>
       </w:r>
+      <w:proofErr w:type="spellStart"/>
       <w:r>
         <w:t>park_name</w:t>
       </w:r>
+      <w:proofErr w:type="spellEnd"/>
       <w:r>
         <w:t>}} est situé sur le territoire des communes de {{COMMUNES}}, dans la région de {{REGION}}. Il est composé de {{</w:t>
       </w:r>
+      <w:proofErr w:type="spellStart"/>
       <w:r>
         <w:t>turbine_count</w:t>
       </w:r>
+      <w:proofErr w:type="spellEnd"/>
       <w:r>
         <w:t>}} éoliennes de type {{</w:t>
       </w:r>
+      <w:proofErr w:type="spellStart"/>
       <w:r>
         <w:t>model_wtg</w:t>
       </w:r>
+      <w:proofErr w:type="spellEnd"/>
       <w:r>
         <w:t>}}, d’une puissance nominale unitaire de {{</w:t>
       </w:r>
+      <w:proofErr w:type="spellStart"/>
       <w:r>
         <w:t>nominal_power</w:t>
       </w:r>
+      <w:proofErr w:type="spellEnd"/>
       <w:r>
         <w:t>}}, soit une puissance totale installée de {{</w:t>
       </w:r>
-      <w:r>
-        <w:t xml:space="preserve">total_power </w:t>
-      </w:r>
-      <w:r>
-        <w:t>}}.</w:t>
+      <w:proofErr w:type="spellStart"/>
+      <w:r>
+        <w:t>total_</w:t>
+      </w:r>
+      <w:proofErr w:type="gramStart"/>
+      <w:r>
+        <w:t>power</w:t>
+      </w:r>
+      <w:proofErr w:type="spellEnd"/>
+      <w:r>
+        <w:t xml:space="preserve"> </w:t>
+      </w:r>
+      <w:r>
+        <w:t>}</w:t>
+      </w:r>
+      <w:proofErr w:type="gramEnd"/>
+      <w:r>
+        <w:t>}.</w:t>
       </w:r>
     </w:p>
     <w:p>
@@ -1251,11 +1372,29 @@
       <w:r>
         <w:t>Les éoliennes du parc sont identifiées comme suit : {{</w:t>
       </w:r>
+      <w:proofErr w:type="spellStart"/>
       <w:r>
         <w:t>turbine_list</w:t>
       </w:r>
-      <w:r>
-        <w:t>}}. L’implantation du parc et la disposition des éoliennes sont présen tées dans la figure ci-</w:t>
+      <w:proofErr w:type="spellEnd"/>
+      <w:r>
+        <w:t xml:space="preserve">}}. L’implantation du parc et la disposition des éoliennes sont </w:t>
+      </w:r>
+      <w:proofErr w:type="spellStart"/>
+      <w:r>
+        <w:t>présen</w:t>
+      </w:r>
+      <w:proofErr w:type="spellEnd"/>
+      <w:r>
+        <w:t xml:space="preserve"> </w:t>
+      </w:r>
+      <w:proofErr w:type="spellStart"/>
+      <w:r>
+        <w:t>tées</w:t>
+      </w:r>
+      <w:proofErr w:type="spellEnd"/>
+      <w:r>
+        <w:t xml:space="preserve"> dans la figure ci-</w:t>
       </w:r>
       <w:r>
         <w:t>après :</w:t>
@@ -1307,13 +1446,21 @@
     </w:p>
     <w:p>
       <w:r>
-        <w:t>[T</w:t>
+        <w:t>[</w:t>
+      </w:r>
+      <w:proofErr w:type="gramStart"/>
+      <w:r>
+        <w:t>T</w:t>
       </w:r>
       <w:r>
         <w:t>ODO</w:t>
       </w:r>
       <w:r>
-        <w:t>:CSV_FILES_TABLE]</w:t>
+        <w:t>:</w:t>
+      </w:r>
+      <w:proofErr w:type="gramEnd"/>
+      <w:r>
+        <w:t>CSV_FILES_TABLE]</w:t>
       </w:r>
     </w:p>
     <w:p>
@@ -1360,6 +1507,7 @@
                 <w:szCs w:val="22"/>
               </w:rPr>
             </w:pPr>
+            <w:proofErr w:type="spellStart"/>
             <w:r>
               <w:rPr>
                 <w:rFonts w:ascii="Cambria" w:eastAsia="MS Mincho" w:hAnsi="Cambria"/>
@@ -1396,6 +1544,7 @@
               </w:rPr>
               <w:t>e</w:t>
             </w:r>
+            <w:proofErr w:type="spellEnd"/>
           </w:p>
         </w:tc>
         <w:tc>
@@ -1419,8 +1568,18 @@
                 <w:sz w:val="22"/>
                 <w:szCs w:val="22"/>
               </w:rPr>
-              <w:t>Axes d’analyse</w:t>
+              <w:t xml:space="preserve">Axes </w:t>
             </w:r>
+            <w:proofErr w:type="spellStart"/>
+            <w:r>
+              <w:rPr>
+                <w:rFonts w:ascii="Cambria" w:eastAsia="MS Mincho" w:hAnsi="Cambria"/>
+                <w:sz w:val="22"/>
+                <w:szCs w:val="22"/>
+              </w:rPr>
+              <w:t>d’analyse</w:t>
+            </w:r>
+            <w:proofErr w:type="spellEnd"/>
           </w:p>
         </w:tc>
       </w:tr>
@@ -1440,13 +1599,23 @@
                 <w:szCs w:val="22"/>
               </w:rPr>
             </w:pPr>
+            <w:proofErr w:type="spellStart"/>
             <w:r>
               <w:rPr>
                 <w:rFonts w:ascii="Cambria" w:eastAsia="MS Mincho" w:hAnsi="Cambria"/>
                 <w:sz w:val="22"/>
                 <w:szCs w:val="22"/>
               </w:rPr>
-              <w:t>Qualité des données</w:t>
+              <w:t>Qualité</w:t>
+            </w:r>
+            <w:proofErr w:type="spellEnd"/>
+            <w:r>
+              <w:rPr>
+                <w:rFonts w:ascii="Cambria" w:eastAsia="MS Mincho" w:hAnsi="Cambria"/>
+                <w:sz w:val="22"/>
+                <w:szCs w:val="22"/>
+              </w:rPr>
+              <w:t xml:space="preserve"> des données</w:t>
             </w:r>
           </w:p>
         </w:tc>
@@ -1530,8 +1699,18 @@
                 <w:sz w:val="22"/>
                 <w:szCs w:val="22"/>
               </w:rPr>
-              <w:t>Production et disponibilité</w:t>
+              <w:t xml:space="preserve">Production et </w:t>
             </w:r>
+            <w:proofErr w:type="spellStart"/>
+            <w:r>
+              <w:rPr>
+                <w:rFonts w:ascii="Cambria" w:eastAsia="MS Mincho" w:hAnsi="Cambria"/>
+                <w:sz w:val="22"/>
+                <w:szCs w:val="22"/>
+              </w:rPr>
+              <w:t>disponibilité</w:t>
+            </w:r>
+            <w:proofErr w:type="spellEnd"/>
           </w:p>
         </w:tc>
         <w:tc>
@@ -1553,14 +1732,52 @@
                 <w:szCs w:val="22"/>
               </w:rPr>
             </w:pPr>
+            <w:proofErr w:type="spellStart"/>
             <w:r>
               <w:rPr>
                 <w:rFonts w:ascii="Cambria" w:eastAsia="MS Mincho" w:hAnsi="Cambria"/>
                 <w:sz w:val="22"/>
                 <w:szCs w:val="22"/>
               </w:rPr>
-              <w:t>Calcul de la disponibilité énergétique</w:t>
+              <w:t>Calcul</w:t>
             </w:r>
+            <w:proofErr w:type="spellEnd"/>
+            <w:r>
+              <w:rPr>
+                <w:rFonts w:ascii="Cambria" w:eastAsia="MS Mincho" w:hAnsi="Cambria"/>
+                <w:sz w:val="22"/>
+                <w:szCs w:val="22"/>
+              </w:rPr>
+              <w:t xml:space="preserve"> de la </w:t>
+            </w:r>
+            <w:proofErr w:type="spellStart"/>
+            <w:r>
+              <w:rPr>
+                <w:rFonts w:ascii="Cambria" w:eastAsia="MS Mincho" w:hAnsi="Cambria"/>
+                <w:sz w:val="22"/>
+                <w:szCs w:val="22"/>
+              </w:rPr>
+              <w:t>disponibilité</w:t>
+            </w:r>
+            <w:proofErr w:type="spellEnd"/>
+            <w:r>
+              <w:rPr>
+                <w:rFonts w:ascii="Cambria" w:eastAsia="MS Mincho" w:hAnsi="Cambria"/>
+                <w:sz w:val="22"/>
+                <w:szCs w:val="22"/>
+              </w:rPr>
+              <w:t xml:space="preserve"> </w:t>
+            </w:r>
+            <w:proofErr w:type="spellStart"/>
+            <w:r>
+              <w:rPr>
+                <w:rFonts w:ascii="Cambria" w:eastAsia="MS Mincho" w:hAnsi="Cambria"/>
+                <w:sz w:val="22"/>
+                <w:szCs w:val="22"/>
+              </w:rPr>
+              <w:t>énergétique</w:t>
+            </w:r>
+            <w:proofErr w:type="spellEnd"/>
           </w:p>
           <w:p>
             <w:pPr>
@@ -1577,14 +1794,52 @@
                 <w:szCs w:val="22"/>
               </w:rPr>
             </w:pPr>
+            <w:proofErr w:type="spellStart"/>
             <w:r>
               <w:rPr>
                 <w:rFonts w:ascii="Cambria" w:eastAsia="MS Mincho" w:hAnsi="Cambria"/>
                 <w:sz w:val="22"/>
                 <w:szCs w:val="22"/>
               </w:rPr>
-              <w:t>Calcul de la disponibilité temporelle</w:t>
+              <w:t>Calcul</w:t>
             </w:r>
+            <w:proofErr w:type="spellEnd"/>
+            <w:r>
+              <w:rPr>
+                <w:rFonts w:ascii="Cambria" w:eastAsia="MS Mincho" w:hAnsi="Cambria"/>
+                <w:sz w:val="22"/>
+                <w:szCs w:val="22"/>
+              </w:rPr>
+              <w:t xml:space="preserve"> de la </w:t>
+            </w:r>
+            <w:proofErr w:type="spellStart"/>
+            <w:r>
+              <w:rPr>
+                <w:rFonts w:ascii="Cambria" w:eastAsia="MS Mincho" w:hAnsi="Cambria"/>
+                <w:sz w:val="22"/>
+                <w:szCs w:val="22"/>
+              </w:rPr>
+              <w:t>disponibilité</w:t>
+            </w:r>
+            <w:proofErr w:type="spellEnd"/>
+            <w:r>
+              <w:rPr>
+                <w:rFonts w:ascii="Cambria" w:eastAsia="MS Mincho" w:hAnsi="Cambria"/>
+                <w:sz w:val="22"/>
+                <w:szCs w:val="22"/>
+              </w:rPr>
+              <w:t xml:space="preserve"> </w:t>
+            </w:r>
+            <w:proofErr w:type="spellStart"/>
+            <w:r>
+              <w:rPr>
+                <w:rFonts w:ascii="Cambria" w:eastAsia="MS Mincho" w:hAnsi="Cambria"/>
+                <w:sz w:val="22"/>
+                <w:szCs w:val="22"/>
+              </w:rPr>
+              <w:t>temporelle</w:t>
+            </w:r>
+            <w:proofErr w:type="spellEnd"/>
           </w:p>
           <w:p>
             <w:pPr>
@@ -1656,13 +1911,41 @@
                 <w:szCs w:val="22"/>
               </w:rPr>
             </w:pPr>
+            <w:proofErr w:type="spellStart"/>
             <w:r>
               <w:rPr>
                 <w:rFonts w:ascii="Cambria" w:eastAsia="MS Mincho" w:hAnsi="Cambria"/>
                 <w:sz w:val="22"/>
                 <w:szCs w:val="22"/>
               </w:rPr>
-              <w:t>Bridages (si applicable)</w:t>
+              <w:t>Bridages</w:t>
+            </w:r>
+            <w:proofErr w:type="spellEnd"/>
+            <w:r>
+              <w:rPr>
+                <w:rFonts w:ascii="Cambria" w:eastAsia="MS Mincho" w:hAnsi="Cambria"/>
+                <w:sz w:val="22"/>
+                <w:szCs w:val="22"/>
+              </w:rPr>
+              <w:t xml:space="preserve"> (</w:t>
+            </w:r>
+            <w:proofErr w:type="spellStart"/>
+            <w:r>
+              <w:rPr>
+                <w:rFonts w:ascii="Cambria" w:eastAsia="MS Mincho" w:hAnsi="Cambria"/>
+                <w:sz w:val="22"/>
+                <w:szCs w:val="22"/>
+              </w:rPr>
+              <w:t>si</w:t>
+            </w:r>
+            <w:proofErr w:type="spellEnd"/>
+            <w:r>
+              <w:rPr>
+                <w:rFonts w:ascii="Cambria" w:eastAsia="MS Mincho" w:hAnsi="Cambria"/>
+                <w:sz w:val="22"/>
+                <w:szCs w:val="22"/>
+              </w:rPr>
+              <w:t xml:space="preserve"> applicable)</w:t>
             </w:r>
           </w:p>
         </w:tc>
@@ -1772,8 +2055,18 @@
                 <w:sz w:val="22"/>
                 <w:szCs w:val="22"/>
               </w:rPr>
-              <w:t>Performance des éoliennes</w:t>
+              <w:t xml:space="preserve">Performance des </w:t>
             </w:r>
+            <w:proofErr w:type="spellStart"/>
+            <w:r>
+              <w:rPr>
+                <w:rFonts w:ascii="Cambria" w:eastAsia="MS Mincho" w:hAnsi="Cambria"/>
+                <w:sz w:val="22"/>
+                <w:szCs w:val="22"/>
+              </w:rPr>
+              <w:t>éoliennes</w:t>
+            </w:r>
+            <w:proofErr w:type="spellEnd"/>
           </w:p>
         </w:tc>
         <w:tc>
@@ -1823,13 +2116,41 @@
                 <w:szCs w:val="22"/>
               </w:rPr>
             </w:pPr>
+            <w:proofErr w:type="spellStart"/>
             <w:r>
               <w:rPr>
                 <w:rFonts w:ascii="Cambria" w:eastAsia="MS Mincho" w:hAnsi="Cambria"/>
                 <w:sz w:val="22"/>
                 <w:szCs w:val="22"/>
               </w:rPr>
-              <w:t>Analyse du comportement du pitch</w:t>
+              <w:t>Analyse</w:t>
+            </w:r>
+            <w:proofErr w:type="spellEnd"/>
+            <w:r>
+              <w:rPr>
+                <w:rFonts w:ascii="Cambria" w:eastAsia="MS Mincho" w:hAnsi="Cambria"/>
+                <w:sz w:val="22"/>
+                <w:szCs w:val="22"/>
+              </w:rPr>
+              <w:t xml:space="preserve"> du </w:t>
+            </w:r>
+            <w:proofErr w:type="spellStart"/>
+            <w:r>
+              <w:rPr>
+                <w:rFonts w:ascii="Cambria" w:eastAsia="MS Mincho" w:hAnsi="Cambria"/>
+                <w:sz w:val="22"/>
+                <w:szCs w:val="22"/>
+              </w:rPr>
+              <w:t>comportement</w:t>
+            </w:r>
+            <w:proofErr w:type="spellEnd"/>
+            <w:r>
+              <w:rPr>
+                <w:rFonts w:ascii="Cambria" w:eastAsia="MS Mincho" w:hAnsi="Cambria"/>
+                <w:sz w:val="22"/>
+                <w:szCs w:val="22"/>
+              </w:rPr>
+              <w:t xml:space="preserve"> du pitch</w:t>
             </w:r>
           </w:p>
           <w:p>
@@ -1875,13 +2196,23 @@
                 <w:szCs w:val="22"/>
               </w:rPr>
             </w:pPr>
+            <w:proofErr w:type="spellStart"/>
             <w:r>
               <w:rPr>
                 <w:rFonts w:ascii="Cambria" w:eastAsia="MS Mincho" w:hAnsi="Cambria"/>
                 <w:sz w:val="22"/>
                 <w:szCs w:val="22"/>
               </w:rPr>
-              <w:t>Analyse inter-turbines</w:t>
+              <w:t>Analyse</w:t>
+            </w:r>
+            <w:proofErr w:type="spellEnd"/>
+            <w:r>
+              <w:rPr>
+                <w:rFonts w:ascii="Cambria" w:eastAsia="MS Mincho" w:hAnsi="Cambria"/>
+                <w:sz w:val="22"/>
+                <w:szCs w:val="22"/>
+              </w:rPr>
+              <w:t xml:space="preserve"> inter-turbines</w:t>
             </w:r>
           </w:p>
           <w:p>
@@ -1900,13 +2231,41 @@
                 <w:szCs w:val="22"/>
               </w:rPr>
             </w:pPr>
+            <w:proofErr w:type="spellStart"/>
             <w:r>
               <w:rPr>
                 <w:rFonts w:ascii="Cambria" w:eastAsia="MS Mincho" w:hAnsi="Cambria"/>
                 <w:sz w:val="22"/>
                 <w:szCs w:val="22"/>
               </w:rPr>
-              <w:t>Cohérence globale des performances</w:t>
+              <w:t>Cohérence</w:t>
+            </w:r>
+            <w:proofErr w:type="spellEnd"/>
+            <w:r>
+              <w:rPr>
+                <w:rFonts w:ascii="Cambria" w:eastAsia="MS Mincho" w:hAnsi="Cambria"/>
+                <w:sz w:val="22"/>
+                <w:szCs w:val="22"/>
+              </w:rPr>
+              <w:t xml:space="preserve"> </w:t>
+            </w:r>
+            <w:proofErr w:type="spellStart"/>
+            <w:r>
+              <w:rPr>
+                <w:rFonts w:ascii="Cambria" w:eastAsia="MS Mincho" w:hAnsi="Cambria"/>
+                <w:sz w:val="22"/>
+                <w:szCs w:val="22"/>
+              </w:rPr>
+              <w:t>globale</w:t>
+            </w:r>
+            <w:proofErr w:type="spellEnd"/>
+            <w:r>
+              <w:rPr>
+                <w:rFonts w:ascii="Cambria" w:eastAsia="MS Mincho" w:hAnsi="Cambria"/>
+                <w:sz w:val="22"/>
+                <w:szCs w:val="22"/>
+              </w:rPr>
+              <w:t xml:space="preserve"> des performances</w:t>
             </w:r>
           </w:p>
         </w:tc>
@@ -1942,8 +2301,13 @@
           <w:numId w:val="6"/>
         </w:numPr>
       </w:pPr>
-      <w:r>
-        <w:t xml:space="preserve">variables environnementales : </w:t>
+      <w:proofErr w:type="gramStart"/>
+      <w:r>
+        <w:t>variables</w:t>
+      </w:r>
+      <w:proofErr w:type="gramEnd"/>
+      <w:r>
+        <w:t xml:space="preserve"> environnementales : </w:t>
       </w:r>
     </w:p>
     <w:p>
@@ -1954,8 +2318,13 @@
           <w:numId w:val="6"/>
         </w:numPr>
       </w:pPr>
-      <w:r>
-        <w:t xml:space="preserve">vitesse du vent </w:t>
+      <w:proofErr w:type="gramStart"/>
+      <w:r>
+        <w:t>vitesse</w:t>
+      </w:r>
+      <w:proofErr w:type="gramEnd"/>
+      <w:r>
+        <w:t xml:space="preserve"> du vent </w:t>
       </w:r>
     </w:p>
     <w:p>
@@ -1966,8 +2335,13 @@
           <w:numId w:val="6"/>
         </w:numPr>
       </w:pPr>
-      <w:r>
-        <w:t xml:space="preserve">direction du vent </w:t>
+      <w:proofErr w:type="gramStart"/>
+      <w:r>
+        <w:t>direction</w:t>
+      </w:r>
+      <w:proofErr w:type="gramEnd"/>
+      <w:r>
+        <w:t xml:space="preserve"> du vent </w:t>
       </w:r>
     </w:p>
     <w:p>
@@ -1978,8 +2352,13 @@
           <w:numId w:val="6"/>
         </w:numPr>
       </w:pPr>
-      <w:r>
-        <w:t xml:space="preserve">température ambiante </w:t>
+      <w:proofErr w:type="gramStart"/>
+      <w:r>
+        <w:t>température</w:t>
+      </w:r>
+      <w:proofErr w:type="gramEnd"/>
+      <w:r>
+        <w:t xml:space="preserve"> ambiante </w:t>
       </w:r>
     </w:p>
     <w:p>
@@ -1990,8 +2369,13 @@
           <w:numId w:val="6"/>
         </w:numPr>
       </w:pPr>
-      <w:r>
-        <w:t xml:space="preserve">variables opérationnelles clés : </w:t>
+      <w:proofErr w:type="gramStart"/>
+      <w:r>
+        <w:t>variables</w:t>
+      </w:r>
+      <w:proofErr w:type="gramEnd"/>
+      <w:r>
+        <w:t xml:space="preserve"> opérationnelles clés : </w:t>
       </w:r>
     </w:p>
     <w:p>
@@ -2002,8 +2386,13 @@
           <w:numId w:val="6"/>
         </w:numPr>
       </w:pPr>
-      <w:r>
-        <w:t xml:space="preserve">puissance active produite </w:t>
+      <w:proofErr w:type="gramStart"/>
+      <w:r>
+        <w:t>puissance</w:t>
+      </w:r>
+      <w:proofErr w:type="gramEnd"/>
+      <w:r>
+        <w:t xml:space="preserve"> active produite </w:t>
       </w:r>
     </w:p>
     <w:p/>
@@ -2024,13 +2413,29 @@
         <w:t xml:space="preserve">La figure ci-après présente la disponibilité des données SCADA, sur la période allant du </w:t>
       </w:r>
       <w:r>
-        <w:t>{{analysis_start}}</w:t>
+        <w:t>{{</w:t>
+      </w:r>
+      <w:proofErr w:type="spellStart"/>
+      <w:r>
+        <w:t>analysis_start</w:t>
+      </w:r>
+      <w:proofErr w:type="spellEnd"/>
+      <w:r>
+        <w:t>}}</w:t>
       </w:r>
       <w:r>
         <w:t xml:space="preserve"> au </w:t>
       </w:r>
       <w:r>
-        <w:t>{{analysis_end}}</w:t>
+        <w:t>{{</w:t>
+      </w:r>
+      <w:proofErr w:type="spellStart"/>
+      <w:r>
+        <w:t>analysis_end</w:t>
+      </w:r>
+      <w:proofErr w:type="spellEnd"/>
+      <w:r>
+        <w:t>}}</w:t>
       </w:r>
       <w:r>
         <w:t>.</w:t>
@@ -2113,7 +2518,21 @@
         <w:rPr>
           <w:lang w:val="en-US"/>
         </w:rPr>
-        <w:t>{{data_availability_chart}}</w:t>
+        <w:t>{{</w:t>
+      </w:r>
+      <w:proofErr w:type="spellStart"/>
+      <w:r>
+        <w:rPr>
+          <w:lang w:val="en-US"/>
+        </w:rPr>
+        <w:t>data_availability_chart</w:t>
+      </w:r>
+      <w:proofErr w:type="spellEnd"/>
+      <w:r>
+        <w:rPr>
+          <w:lang w:val="en-US"/>
+        </w:rPr>
+        <w:t>}}</w:t>
       </w:r>
     </w:p>
     <w:p>
@@ -2128,7 +2547,7 @@
         <w:pStyle w:val="Titre2"/>
       </w:pPr>
       <w:r>
-        <w:t xml:space="preserve">Disponibilité éner gétique </w:t>
+        <w:t xml:space="preserve">Disponibilité énergétique </w:t>
       </w:r>
     </w:p>
     <w:p>
@@ -2150,7 +2569,23 @@
         </w:numPr>
       </w:pPr>
       <w:r>
-        <w:t>Disponibilité énergétique brute (cut-in / cut-out) : calculée pour les périodes où la vitesse de vent est comprise entre les seuils de démarrage et d’arrêt des éoliennes, en incluant l’ensemble des indisponibilités (arrêts techniques, maintenance, limitations réseau, etc.)</w:t>
+        <w:t>Disponibilité énergétique brute (</w:t>
+      </w:r>
+      <w:proofErr w:type="spellStart"/>
+      <w:r>
+        <w:t>cut</w:t>
+      </w:r>
+      <w:proofErr w:type="spellEnd"/>
+      <w:r>
+        <w:t xml:space="preserve">-in / </w:t>
+      </w:r>
+      <w:proofErr w:type="spellStart"/>
+      <w:r>
+        <w:t>cut</w:t>
+      </w:r>
+      <w:proofErr w:type="spellEnd"/>
+      <w:r>
+        <w:t>-out) : calculée pour les périodes où la vitesse de vent est comprise entre les seuils de démarrage et d’arrêt des éoliennes, en incluant l’ensemble des indisponibilités (arrêts techniques, maintenance, limitations réseau, etc.)</w:t>
       </w:r>
     </w:p>
     <w:p>
@@ -2239,8 +2674,29 @@
           <w:numId w:val="8"/>
         </w:numPr>
       </w:pPr>
-      <w:r>
-        <w:t>la disponibilité énergétique brute (cut-in / cut-out),</w:t>
+      <w:proofErr w:type="gramStart"/>
+      <w:r>
+        <w:t>la</w:t>
+      </w:r>
+      <w:proofErr w:type="gramEnd"/>
+      <w:r>
+        <w:t xml:space="preserve"> disponibilité énergétique brute (</w:t>
+      </w:r>
+      <w:proofErr w:type="spellStart"/>
+      <w:r>
+        <w:t>cut</w:t>
+      </w:r>
+      <w:proofErr w:type="spellEnd"/>
+      <w:r>
+        <w:t xml:space="preserve">-in / </w:t>
+      </w:r>
+      <w:proofErr w:type="spellStart"/>
+      <w:r>
+        <w:t>cut</w:t>
+      </w:r>
+      <w:proofErr w:type="spellEnd"/>
+      <w:r>
+        <w:t>-out),</w:t>
       </w:r>
     </w:p>
     <w:p>
@@ -2251,54 +2707,101 @@
           <w:numId w:val="8"/>
         </w:numPr>
       </w:pPr>
-      <w:r>
-        <w:t>la disponibilité énergétique imputable au fabricant</w:t>
-      </w:r>
-    </w:p>
-    <w:p>
-      <w:pPr>
-        <w:rPr>
-          <w:lang w:val="en-US"/>
-        </w:rPr>
-      </w:pPr>
-      <w:r>
-        <w:rPr>
-          <w:lang w:val="en-US"/>
-        </w:rPr>
-        <w:t>[TABLE:EBA_CUT_IN_CUT_OUT_TABLE]</w:t>
-      </w:r>
-    </w:p>
-    <w:p>
-      <w:pPr>
-        <w:rPr>
-          <w:lang w:val="en-US"/>
-        </w:rPr>
-      </w:pPr>
-      <w:r>
-        <w:rPr>
-          <w:lang w:val="en-US"/>
-        </w:rPr>
-        <w:t>{{eba_cut_in_cut_out_chart}}</w:t>
-      </w:r>
-    </w:p>
-    <w:p>
-      <w:pPr>
-        <w:rPr>
-          <w:lang w:val="en-US"/>
-        </w:rPr>
-      </w:pPr>
-    </w:p>
-    <w:p>
-      <w:pPr>
-        <w:rPr>
-          <w:lang w:val="en-US"/>
-        </w:rPr>
-      </w:pPr>
-      <w:r>
-        <w:rPr>
-          <w:lang w:val="en-US"/>
-        </w:rPr>
-        <w:t>[TABLE:EBA_MANUFACTURER_TABLE]</w:t>
+      <w:proofErr w:type="gramStart"/>
+      <w:r>
+        <w:t>la</w:t>
+      </w:r>
+      <w:proofErr w:type="gramEnd"/>
+      <w:r>
+        <w:t xml:space="preserve"> disponibilité énergétique imputable au fabricant</w:t>
+      </w:r>
+    </w:p>
+    <w:p>
+      <w:pPr>
+        <w:rPr>
+          <w:lang w:val="en-US"/>
+        </w:rPr>
+      </w:pPr>
+      <w:r>
+        <w:rPr>
+          <w:lang w:val="en-US"/>
+        </w:rPr>
+        <w:t>[</w:t>
+      </w:r>
+      <w:proofErr w:type="gramStart"/>
+      <w:r>
+        <w:rPr>
+          <w:lang w:val="en-US"/>
+        </w:rPr>
+        <w:t>TABLE:EBA</w:t>
+      </w:r>
+      <w:proofErr w:type="gramEnd"/>
+      <w:r>
+        <w:rPr>
+          <w:lang w:val="en-US"/>
+        </w:rPr>
+        <w:t>_CUT_IN_CUT_OUT_TABLE]</w:t>
+      </w:r>
+    </w:p>
+    <w:p>
+      <w:pPr>
+        <w:rPr>
+          <w:lang w:val="en-US"/>
+        </w:rPr>
+      </w:pPr>
+      <w:r>
+        <w:rPr>
+          <w:lang w:val="en-US"/>
+        </w:rPr>
+        <w:t>{{</w:t>
+      </w:r>
+      <w:proofErr w:type="spellStart"/>
+      <w:r>
+        <w:rPr>
+          <w:lang w:val="en-US"/>
+        </w:rPr>
+        <w:t>eba_cut_in_cut_out_chart</w:t>
+      </w:r>
+      <w:proofErr w:type="spellEnd"/>
+      <w:r>
+        <w:rPr>
+          <w:lang w:val="en-US"/>
+        </w:rPr>
+        <w:t>}}</w:t>
+      </w:r>
+    </w:p>
+    <w:p>
+      <w:pPr>
+        <w:rPr>
+          <w:lang w:val="en-US"/>
+        </w:rPr>
+      </w:pPr>
+    </w:p>
+    <w:p>
+      <w:pPr>
+        <w:rPr>
+          <w:lang w:val="en-US"/>
+        </w:rPr>
+      </w:pPr>
+      <w:r>
+        <w:rPr>
+          <w:lang w:val="en-US"/>
+        </w:rPr>
+        <w:t>[</w:t>
+      </w:r>
+      <w:proofErr w:type="gramStart"/>
+      <w:r>
+        <w:rPr>
+          <w:lang w:val="en-US"/>
+        </w:rPr>
+        <w:t>TABLE:EBA</w:t>
+      </w:r>
+      <w:proofErr w:type="gramEnd"/>
+      <w:r>
+        <w:rPr>
+          <w:lang w:val="en-US"/>
+        </w:rPr>
+        <w:t>_MANUFACTURER_TABLE]</w:t>
       </w:r>
       <w:r>
         <w:rPr>
@@ -2317,19 +2820,41 @@
         <w:rPr>
           <w:lang w:val="en-US"/>
         </w:rPr>
-        <w:t>{{eba_manifacturer_chart}}</w:t>
-      </w:r>
-    </w:p>
-    <w:p>
-      <w:pPr>
-        <w:rPr>
-          <w:lang w:val="en-US"/>
-        </w:rPr>
-      </w:pPr>
-    </w:p>
-    <w:p>
-      <w:r>
-        <w:t>[TABLE:EBA_LOSS_TABLE]</w:t>
+        <w:t>{{</w:t>
+      </w:r>
+      <w:proofErr w:type="spellStart"/>
+      <w:r>
+        <w:rPr>
+          <w:lang w:val="en-US"/>
+        </w:rPr>
+        <w:t>eba_manifacturer_chart</w:t>
+      </w:r>
+      <w:proofErr w:type="spellEnd"/>
+      <w:r>
+        <w:rPr>
+          <w:lang w:val="en-US"/>
+        </w:rPr>
+        <w:t>}}</w:t>
+      </w:r>
+    </w:p>
+    <w:p>
+      <w:pPr>
+        <w:rPr>
+          <w:lang w:val="en-US"/>
+        </w:rPr>
+      </w:pPr>
+    </w:p>
+    <w:p>
+      <w:r>
+        <w:t>[</w:t>
+      </w:r>
+      <w:proofErr w:type="gramStart"/>
+      <w:r>
+        <w:t>TABLE:EBA</w:t>
+      </w:r>
+      <w:proofErr w:type="gramEnd"/>
+      <w:r>
+        <w:t>_LOSS_TABLE]</w:t>
       </w:r>
     </w:p>
     <w:p>
@@ -2361,7 +2886,21 @@
         <w:rPr>
           <w:lang w:val="en-US"/>
         </w:rPr>
-        <w:t>{{eba_loss_chart}}</w:t>
+        <w:t>{{</w:t>
+      </w:r>
+      <w:proofErr w:type="spellStart"/>
+      <w:r>
+        <w:rPr>
+          <w:lang w:val="en-US"/>
+        </w:rPr>
+        <w:t>eba_loss_chart</w:t>
+      </w:r>
+      <w:proofErr w:type="spellEnd"/>
+      <w:r>
+        <w:rPr>
+          <w:lang w:val="en-US"/>
+        </w:rPr>
+        <w:t>}}</w:t>
       </w:r>
     </w:p>
     <w:p>
@@ -2482,7 +3021,21 @@
         <w:rPr>
           <w:lang w:val="en-US"/>
         </w:rPr>
-        <w:t>[TABLE:ERROR_</w:t>
+        <w:t>[</w:t>
+      </w:r>
+      <w:proofErr w:type="gramStart"/>
+      <w:r>
+        <w:rPr>
+          <w:lang w:val="en-US"/>
+        </w:rPr>
+        <w:t>TABLE:ERROR</w:t>
+      </w:r>
+      <w:proofErr w:type="gramEnd"/>
+      <w:r>
+        <w:rPr>
+          <w:lang w:val="en-US"/>
+        </w:rPr>
+        <w:t>_</w:t>
       </w:r>
       <w:r>
         <w:rPr>
@@ -2507,7 +3060,21 @@
         <w:rPr>
           <w:lang w:val="en-US"/>
         </w:rPr>
-        <w:t>[TABLE:ERROR_</w:t>
+        <w:t>[</w:t>
+      </w:r>
+      <w:proofErr w:type="gramStart"/>
+      <w:r>
+        <w:rPr>
+          <w:lang w:val="en-US"/>
+        </w:rPr>
+        <w:t>TABLE:ERROR</w:t>
+      </w:r>
+      <w:proofErr w:type="gramEnd"/>
+      <w:r>
+        <w:rPr>
+          <w:lang w:val="en-US"/>
+        </w:rPr>
+        <w:t>_</w:t>
       </w:r>
       <w:r>
         <w:rPr>
@@ -2544,20 +3111,48 @@
         <w:rPr>
           <w:lang w:val="en-US"/>
         </w:rPr>
-        <w:t>{{top_error_code_frequency}}</w:t>
-      </w:r>
-    </w:p>
-    <w:p>
-      <w:pPr>
-        <w:rPr>
-          <w:lang w:val="en-US"/>
-        </w:rPr>
-      </w:pPr>
-      <w:r>
-        <w:rPr>
-          <w:lang w:val="en-US"/>
-        </w:rPr>
-        <w:t>{{treemap_error_code}}</w:t>
+        <w:t>{{</w:t>
+      </w:r>
+      <w:proofErr w:type="spellStart"/>
+      <w:r>
+        <w:rPr>
+          <w:lang w:val="en-US"/>
+        </w:rPr>
+        <w:t>top_error_code_frequency</w:t>
+      </w:r>
+      <w:proofErr w:type="spellEnd"/>
+      <w:r>
+        <w:rPr>
+          <w:lang w:val="en-US"/>
+        </w:rPr>
+        <w:t>}}</w:t>
+      </w:r>
+    </w:p>
+    <w:p>
+      <w:pPr>
+        <w:rPr>
+          <w:lang w:val="en-US"/>
+        </w:rPr>
+      </w:pPr>
+      <w:r>
+        <w:rPr>
+          <w:lang w:val="en-US"/>
+        </w:rPr>
+        <w:t>{{</w:t>
+      </w:r>
+      <w:proofErr w:type="spellStart"/>
+      <w:r>
+        <w:rPr>
+          <w:lang w:val="en-US"/>
+        </w:rPr>
+        <w:t>treemap_error_code</w:t>
+      </w:r>
+      <w:proofErr w:type="spellEnd"/>
+      <w:r>
+        <w:rPr>
+          <w:lang w:val="en-US"/>
+        </w:rPr>
+        <w:t>}}</w:t>
       </w:r>
     </w:p>
     <w:p>
@@ -2576,7 +3171,23 @@
     </w:p>
     <w:p>
       <w:r>
-        <w:t>L’analyse de la direction du vent vise à vérifier la cohérence des mesures directionnelles entre les éoliennes, ainsi que leur alignement avec une référence externe, afin de détecter d’éventuels défauts d’orientation (yaw misalignment).</w:t>
+        <w:t>L’analyse de la direction du vent vise à vérifier la cohérence des mesures directionnelles entre les éoliennes, ainsi que leur alignement avec une référence externe, afin de détecter d’éventuels défauts d’orientation (</w:t>
+      </w:r>
+      <w:proofErr w:type="spellStart"/>
+      <w:r>
+        <w:t>yaw</w:t>
+      </w:r>
+      <w:proofErr w:type="spellEnd"/>
+      <w:r>
+        <w:t xml:space="preserve"> </w:t>
+      </w:r>
+      <w:proofErr w:type="spellStart"/>
+      <w:r>
+        <w:t>misalignment</w:t>
+      </w:r>
+      <w:proofErr w:type="spellEnd"/>
+      <w:r>
+        <w:t>).</w:t>
       </w:r>
     </w:p>
     <w:p>
@@ -2646,43 +3257,93 @@
         <w:rPr>
           <w:lang w:val="en-US"/>
         </w:rPr>
-        <w:t>[TABLE:TIP_SPEED_RATIO_TABLE]</w:t>
-      </w:r>
-    </w:p>
-    <w:p>
-      <w:pPr>
-        <w:rPr>
-          <w:lang w:val="en-US"/>
-        </w:rPr>
-      </w:pPr>
-      <w:r>
-        <w:rPr>
-          <w:lang w:val="en-US"/>
-        </w:rPr>
-        <w:t>{{wind_direction_calibration}}</w:t>
-      </w:r>
-    </w:p>
-    <w:p>
-      <w:pPr>
-        <w:rPr>
-          <w:lang w:val="en-US"/>
-        </w:rPr>
-      </w:pPr>
-      <w:r>
-        <w:rPr>
-          <w:lang w:val="en-US"/>
-        </w:rPr>
-        <w:t>{{power_rose_chart}}</w:t>
-      </w:r>
-    </w:p>
-    <w:p>
-      <w:pPr>
-        <w:rPr>
-          <w:lang w:val="en-US"/>
-        </w:rPr>
-      </w:pPr>
-      <w:r>
-        <w:t>{{wind_rose_chart}}</w:t>
+        <w:t>[</w:t>
+      </w:r>
+      <w:proofErr w:type="gramStart"/>
+      <w:r>
+        <w:rPr>
+          <w:lang w:val="en-US"/>
+        </w:rPr>
+        <w:t>TABLE:TIP</w:t>
+      </w:r>
+      <w:proofErr w:type="gramEnd"/>
+      <w:r>
+        <w:rPr>
+          <w:lang w:val="en-US"/>
+        </w:rPr>
+        <w:t>_SPEED_RATIO_TABLE]</w:t>
+      </w:r>
+    </w:p>
+    <w:p>
+      <w:pPr>
+        <w:rPr>
+          <w:lang w:val="en-US"/>
+        </w:rPr>
+      </w:pPr>
+      <w:r>
+        <w:rPr>
+          <w:lang w:val="en-US"/>
+        </w:rPr>
+        <w:t>{{</w:t>
+      </w:r>
+      <w:proofErr w:type="spellStart"/>
+      <w:r>
+        <w:rPr>
+          <w:lang w:val="en-US"/>
+        </w:rPr>
+        <w:t>wind_direction_calibration</w:t>
+      </w:r>
+      <w:proofErr w:type="spellEnd"/>
+      <w:r>
+        <w:rPr>
+          <w:lang w:val="en-US"/>
+        </w:rPr>
+        <w:t>}}</w:t>
+      </w:r>
+    </w:p>
+    <w:p>
+      <w:pPr>
+        <w:rPr>
+          <w:lang w:val="en-US"/>
+        </w:rPr>
+      </w:pPr>
+      <w:r>
+        <w:rPr>
+          <w:lang w:val="en-US"/>
+        </w:rPr>
+        <w:t>{{</w:t>
+      </w:r>
+      <w:proofErr w:type="spellStart"/>
+      <w:r>
+        <w:rPr>
+          <w:lang w:val="en-US"/>
+        </w:rPr>
+        <w:t>power_rose_chart</w:t>
+      </w:r>
+      <w:proofErr w:type="spellEnd"/>
+      <w:r>
+        <w:rPr>
+          <w:lang w:val="en-US"/>
+        </w:rPr>
+        <w:t>}}</w:t>
+      </w:r>
+    </w:p>
+    <w:p>
+      <w:pPr>
+        <w:rPr>
+          <w:lang w:val="en-US"/>
+        </w:rPr>
+      </w:pPr>
+      <w:r>
+        <w:t>{{</w:t>
+      </w:r>
+      <w:proofErr w:type="spellStart"/>
+      <w:r>
+        <w:t>wind_rose_chart</w:t>
+      </w:r>
+      <w:proofErr w:type="spellEnd"/>
+      <w:r>
+        <w:t>}}</w:t>
       </w:r>
     </w:p>
     <w:p>
@@ -2769,7 +3430,15 @@
         <w:t>Exclusion</w:t>
       </w:r>
       <w:r>
-        <w:t xml:space="preserve"> des situations de sillage (wake effect), </w:t>
+        <w:t xml:space="preserve"> des situations de sillage (wake </w:t>
+      </w:r>
+      <w:proofErr w:type="spellStart"/>
+      <w:r>
+        <w:t>effect</w:t>
+      </w:r>
+      <w:proofErr w:type="spellEnd"/>
+      <w:r>
+        <w:t xml:space="preserve">), </w:t>
       </w:r>
     </w:p>
     <w:p>
@@ -2832,7 +3501,21 @@
         <w:rPr>
           <w:lang w:val="en-US"/>
         </w:rPr>
-        <w:t>[TABLE:NORMATIVE_YIELD_TABLE]</w:t>
+        <w:t>[</w:t>
+      </w:r>
+      <w:proofErr w:type="gramStart"/>
+      <w:r>
+        <w:rPr>
+          <w:lang w:val="en-US"/>
+        </w:rPr>
+        <w:t>TABLE:NORMATIVE</w:t>
+      </w:r>
+      <w:proofErr w:type="gramEnd"/>
+      <w:r>
+        <w:rPr>
+          <w:lang w:val="en-US"/>
+        </w:rPr>
+        <w:t>_YIELD_TABLE]</w:t>
       </w:r>
     </w:p>
     <w:p>
@@ -2879,8 +3562,13 @@
           <w:numId w:val="13"/>
         </w:numPr>
       </w:pPr>
-      <w:r>
-        <w:t xml:space="preserve">les périodes de limitations environnementales (bruit, chauves-souris, ombrage, etc.), </w:t>
+      <w:proofErr w:type="gramStart"/>
+      <w:r>
+        <w:t>les</w:t>
+      </w:r>
+      <w:proofErr w:type="gramEnd"/>
+      <w:r>
+        <w:t xml:space="preserve"> périodes de limitations environnementales (bruit, chauves-souris, ombrage, etc.), </w:t>
       </w:r>
     </w:p>
     <w:p>
@@ -2891,8 +3579,13 @@
           <w:numId w:val="13"/>
         </w:numPr>
       </w:pPr>
-      <w:r>
-        <w:t xml:space="preserve">les phases de démarrage et d’arrêt, </w:t>
+      <w:proofErr w:type="gramStart"/>
+      <w:r>
+        <w:t>les</w:t>
+      </w:r>
+      <w:proofErr w:type="gramEnd"/>
+      <w:r>
+        <w:t xml:space="preserve"> phases de démarrage et d’arrêt, </w:t>
       </w:r>
     </w:p>
     <w:p>
@@ -2903,8 +3596,13 @@
           <w:numId w:val="13"/>
         </w:numPr>
       </w:pPr>
-      <w:r>
-        <w:t xml:space="preserve">les situations transitoires ou non représentatives du fonctionnement normal. </w:t>
+      <w:proofErr w:type="gramStart"/>
+      <w:r>
+        <w:t>les</w:t>
+      </w:r>
+      <w:proofErr w:type="gramEnd"/>
+      <w:r>
+        <w:t xml:space="preserve"> situations transitoires ou non représentatives du fonctionnement normal. </w:t>
       </w:r>
     </w:p>
     <w:p>
@@ -2931,22 +3629,6 @@
         </w:rPr>
       </w:pPr>
       <w:r>
-        <w:t xml:space="preserve"> </w:t>
-      </w:r>
-      <w:r>
-        <w:rPr>
-          <w:lang w:val="en-US"/>
-        </w:rPr>
-        <w:t>[TODO FIGURERPM]</w:t>
-      </w:r>
-    </w:p>
-    <w:p>
-      <w:pPr>
-        <w:rPr>
-          <w:lang w:val="en-US"/>
-        </w:rPr>
-      </w:pPr>
-      <w:r>
         <w:rPr>
           <w:lang w:val="en-US"/>
         </w:rPr>
@@ -2960,9 +3642,11 @@
         </w:rPr>
         <w:t>{{</w:t>
       </w:r>
+      <w:proofErr w:type="spellStart"/>
       <w:r>
         <w:t>rpm_chart</w:t>
       </w:r>
+      <w:proofErr w:type="spellEnd"/>
       <w:r>
         <w:rPr>
           <w:lang w:val="en-US"/>
@@ -3107,7 +3791,15 @@
     </w:p>
     <w:p>
       <w:r>
-        <w:t>En complément de l'analyse comparative des courbes de puissance, une analyse individuelle de chaque éolienne est réalisée à partir des données SCADA brutes, sous forme de nuages de points. Cette approche vise à détecter d'éventuelles limitations de production non prévues, non nécessairement visibles dans une comparaison inter-éoliennes. Elle permet notamment d'identifier des situations de curtailment inattendu, visibles à travers des regroupements de points (clusters) s'écartant de la courbe de puissance nominale attendue. L'analyse repose sur la représentation de la puissance active en fonction de la vitesse du vent sous forme de nuages de points. Afin de représenter le comportement nominal des éoliennes, les données sont filtrées pour exclure :</w:t>
+        <w:t xml:space="preserve">En complément de l'analyse comparative des courbes de puissance, une analyse individuelle de chaque éolienne est réalisée à partir des données SCADA brutes, sous forme de nuages de points. Cette approche vise à détecter d'éventuelles limitations de production non prévues, non nécessairement visibles dans une comparaison inter-éoliennes. Elle permet notamment d'identifier des situations de </w:t>
+      </w:r>
+      <w:proofErr w:type="spellStart"/>
+      <w:r>
+        <w:t>curtailment</w:t>
+      </w:r>
+      <w:proofErr w:type="spellEnd"/>
+      <w:r>
+        <w:t xml:space="preserve"> inattendu, visibles à travers des regroupements de points (clusters) s'écartant de la courbe de puissance nominale attendue. L'analyse repose sur la représentation de la puissance active en fonction de la vitesse du vent sous forme de nuages de points. Afin de représenter le comportement nominal des éoliennes, les données sont filtrées pour exclure :</w:t>
       </w:r>
     </w:p>
     <w:p>
@@ -3118,8 +3810,13 @@
           <w:numId w:val="15"/>
         </w:numPr>
       </w:pPr>
-      <w:r>
-        <w:t xml:space="preserve">les périodes de limitations environnementales (bruit, chauves-souris, ombrage, etc.), </w:t>
+      <w:proofErr w:type="gramStart"/>
+      <w:r>
+        <w:t>les</w:t>
+      </w:r>
+      <w:proofErr w:type="gramEnd"/>
+      <w:r>
+        <w:t xml:space="preserve"> périodes de limitations environnementales (bruit, chauves-souris, ombrage, etc.), </w:t>
       </w:r>
     </w:p>
     <w:p>
@@ -3130,8 +3827,13 @@
           <w:numId w:val="15"/>
         </w:numPr>
       </w:pPr>
-      <w:r>
-        <w:t>les phases de démarrage et d'arrêt,</w:t>
+      <w:proofErr w:type="gramStart"/>
+      <w:r>
+        <w:t>les</w:t>
+      </w:r>
+      <w:proofErr w:type="gramEnd"/>
+      <w:r>
+        <w:t xml:space="preserve"> phases de démarrage et d'arrêt,</w:t>
       </w:r>
     </w:p>
     <w:p>
@@ -3142,8 +3844,13 @@
           <w:numId w:val="15"/>
         </w:numPr>
       </w:pPr>
-      <w:r>
-        <w:t xml:space="preserve">ainsi que les situations non représentatives du fonctionnement normal. </w:t>
+      <w:proofErr w:type="gramStart"/>
+      <w:r>
+        <w:t>ainsi</w:t>
+      </w:r>
+      <w:proofErr w:type="gramEnd"/>
+      <w:r>
+        <w:t xml:space="preserve"> que les situations non représentatives du fonctionnement normal. </w:t>
       </w:r>
     </w:p>
     <w:p>
@@ -3152,9 +3859,14 @@
       </w:r>
     </w:p>
     <w:p>
+      <w:proofErr w:type="gramStart"/>
       <w:r>
         <w:lastRenderedPageBreak/>
-        <w:t>préciser quelle éolienne est présentée dans le corps du rapport et lesquelles sont renvoyées en annexe, cohérence à maintenir avec l'analyse comparative des courbes de puissance. Dans l'étude de référence, E9 est présentée dans le corps du rapport.]</w:t>
+        <w:t>préciser</w:t>
+      </w:r>
+      <w:proofErr w:type="gramEnd"/>
+      <w:r>
+        <w:t xml:space="preserve"> quelle éolienne est présentée dans le corps du rapport et lesquelles sont renvoyées en annexe, cohérence à maintenir avec l'analyse comparative des courbes de puissance. Dans l'étude de référence, E9 est présentée dans le corps du rapport.]</w:t>
       </w:r>
     </w:p>
     <w:p>
@@ -3216,7 +3928,15 @@
         <w:pStyle w:val="Titre2"/>
       </w:pPr>
       <w:r>
-        <w:t>Disponibilité temporelle (Time-Based Availability – TBA)</w:t>
+        <w:t xml:space="preserve">Disponibilité temporelle (Time-Based </w:t>
+      </w:r>
+      <w:proofErr w:type="spellStart"/>
+      <w:r>
+        <w:t>Availability</w:t>
+      </w:r>
+      <w:proofErr w:type="spellEnd"/>
+      <w:r>
+        <w:t xml:space="preserve"> – TBA)</w:t>
       </w:r>
     </w:p>
     <w:p>

</xml_diff>

<commit_message>
[CHANGE] change the code to hanlde power curve for both runtest and SCADA
</commit_message>
<xml_diff>
--- a/assets/templates/template_scada.docx
+++ b/assets/templates/template_scada.docx
@@ -315,17 +315,8 @@
                 <w:b/>
                 <w:bCs/>
               </w:rPr>
-              <w:t xml:space="preserve">Date </w:t>
+              <w:t>Date d’émission</w:t>
             </w:r>
-            <w:proofErr w:type="spellStart"/>
-            <w:r>
-              <w:rPr>
-                <w:b/>
-                <w:bCs/>
-              </w:rPr>
-              <w:t>d’émission</w:t>
-            </w:r>
-            <w:proofErr w:type="spellEnd"/>
           </w:p>
         </w:tc>
         <w:tc>
@@ -361,7 +352,6 @@
                 <w:bCs/>
               </w:rPr>
             </w:pPr>
-            <w:proofErr w:type="spellStart"/>
             <w:r>
               <w:rPr>
                 <w:b/>
@@ -369,7 +359,6 @@
               </w:rPr>
               <w:t>Rédacteur</w:t>
             </w:r>
-            <w:proofErr w:type="spellEnd"/>
           </w:p>
         </w:tc>
         <w:tc>
@@ -384,7 +373,6 @@
                 <w:bCs/>
               </w:rPr>
             </w:pPr>
-            <w:proofErr w:type="spellStart"/>
             <w:r>
               <w:rPr>
                 <w:b/>
@@ -392,7 +380,6 @@
               </w:rPr>
               <w:t>Vérificateur</w:t>
             </w:r>
-            <w:proofErr w:type="spellEnd"/>
           </w:p>
         </w:tc>
         <w:tc>
@@ -407,7 +394,6 @@
                 <w:bCs/>
               </w:rPr>
             </w:pPr>
-            <w:proofErr w:type="spellStart"/>
             <w:r>
               <w:rPr>
                 <w:b/>
@@ -415,7 +401,6 @@
               </w:rPr>
               <w:t>Approbateur</w:t>
             </w:r>
-            <w:proofErr w:type="spellEnd"/>
           </w:p>
         </w:tc>
       </w:tr>
@@ -989,11 +974,9 @@
         <w:lastRenderedPageBreak/>
         <w:t>Nom du parc : {{</w:t>
       </w:r>
-      <w:proofErr w:type="spellStart"/>
       <w:r>
         <w:t>park_name</w:t>
       </w:r>
-      <w:proofErr w:type="spellEnd"/>
       <w:r>
         <w:t xml:space="preserve">}} </w:t>
       </w:r>
@@ -1002,161 +985,263 @@
       <w:r>
         <w:t>Type d’éoliennes : {{</w:t>
       </w:r>
-      <w:proofErr w:type="spellStart"/>
       <w:r>
         <w:t>model_wtg</w:t>
       </w:r>
-      <w:proofErr w:type="spellEnd"/>
       <w:r>
         <w:t xml:space="preserve">}} </w:t>
       </w:r>
     </w:p>
     <w:p>
       <w:r>
-        <w:t>Nombre d’éoliennes : {{</w:t>
-      </w:r>
-      <w:proofErr w:type="spellStart"/>
-      <w:r>
-        <w:t>N</w:t>
+        <w:t>Nombre d’éoliennes : {{N</w:t>
       </w:r>
       <w:r>
         <w:t>ombre</w:t>
       </w:r>
       <w:r>
-        <w:t>_WTG</w:t>
-      </w:r>
-      <w:proofErr w:type="spellEnd"/>
+        <w:t xml:space="preserve">_WTG}} </w:t>
+      </w:r>
+    </w:p>
+    <w:p>
+      <w:r>
+        <w:t>Puissance totale installée : {{</w:t>
+      </w:r>
+      <w:r>
+        <w:t>nominal_power</w:t>
+      </w:r>
       <w:r>
         <w:t xml:space="preserve">}} </w:t>
       </w:r>
     </w:p>
     <w:p>
       <w:r>
-        <w:t>Puissance totale installée : {{</w:t>
-      </w:r>
-      <w:proofErr w:type="spellStart"/>
+        <w:t xml:space="preserve">Localisation : {{LOCALISATION}} </w:t>
+      </w:r>
+    </w:p>
+    <w:p>
+      <w:r>
+        <w:t>Client : {{CLIENT}}</w:t>
+      </w:r>
+    </w:p>
+    <w:p>
+      <w:r>
+        <w:t xml:space="preserve">Contact : {{CONTACT_CLIENT}} </w:t>
+      </w:r>
+    </w:p>
+    <w:p>
+      <w:r>
+        <w:t xml:space="preserve">Constructeur / Exploitant : {{CONTRACTOR}} </w:t>
+      </w:r>
+    </w:p>
+    <w:p/>
+    <w:p>
+      <w:r>
+        <w:t>Rédacteur</w:t>
+      </w:r>
+    </w:p>
+    <w:p>
+      <w:r>
+        <w:t>{{AUTEUR}}</w:t>
+      </w:r>
+    </w:p>
+    <w:p>
+      <w:r>
+        <w:t>Email : {{MAIL_AUTEUR}}</w:t>
+      </w:r>
+    </w:p>
+    <w:p>
+      <w:r>
+        <w:t>Téléphone : {{TEL_AUTEUR}}</w:t>
+      </w:r>
+    </w:p>
+    <w:p/>
+    <w:p>
+      <w:r>
+        <w:t>Vérificateur</w:t>
+      </w:r>
+    </w:p>
+    <w:p>
+      <w:r>
+        <w:t>{{VERIFICATEUR}}</w:t>
+      </w:r>
+    </w:p>
+    <w:p>
+      <w:r>
+        <w:t>Email : {{MAIL_VERIFICATEUR}}</w:t>
+      </w:r>
+    </w:p>
+    <w:p>
+      <w:r>
+        <w:t>Téléphone : {{TEL_VERIFICATEUR}}</w:t>
+      </w:r>
+    </w:p>
+    <w:p/>
+    <w:p>
+      <w:r>
+        <w:t>Approbateur</w:t>
+      </w:r>
+    </w:p>
+    <w:p>
+      <w:r>
+        <w:t>{{APPROBATEUR}}</w:t>
+      </w:r>
+    </w:p>
+    <w:p>
+      <w:r>
+        <w:t>Email : {{MAIL_APPROBATEUR}}</w:t>
+      </w:r>
+    </w:p>
+    <w:p>
+      <w:r>
+        <w:t>Téléphone : {{TEL_APPROBATEUR}}</w:t>
+      </w:r>
+    </w:p>
+    <w:p/>
+    <w:p>
+      <w:pPr>
+        <w:spacing w:after="160" w:line="259" w:lineRule="auto"/>
+      </w:pPr>
+      <w:r>
+        <w:br w:type="page"/>
+      </w:r>
+    </w:p>
+    <w:p/>
+    <w:p>
+      <w:pPr>
+        <w:pStyle w:val="Titre1"/>
+      </w:pPr>
+      <w:r>
+        <w:t>Synthèse</w:t>
+      </w:r>
+    </w:p>
+    <w:p>
+      <w:pPr>
+        <w:jc w:val="both"/>
+      </w:pPr>
+      <w:r>
+        <w:t xml:space="preserve">Les données SCADA du parc éolien </w:t>
+      </w:r>
+      <w:r>
+        <w:t>{{park_name}}</w:t>
+      </w:r>
+      <w:r>
+        <w:t xml:space="preserve"> ont été analysées sur la période du </w:t>
+      </w:r>
+      <w:r>
+        <w:t>{{analysis_start}}</w:t>
+      </w:r>
+      <w:r>
+        <w:t xml:space="preserve"> au </w:t>
+      </w:r>
+      <w:r>
+        <w:t>{{analysis_end}}</w:t>
+      </w:r>
+      <w:r>
+        <w:t xml:space="preserve">, à partir des informations fournies par le client. Le parc est composé de </w:t>
+      </w:r>
+      <w:r>
+        <w:t>{{turbine_count}}</w:t>
+      </w:r>
+      <w:r>
+        <w:t xml:space="preserve"> éoliennes de type</w:t>
+      </w:r>
+      <w:r>
+        <w:t xml:space="preserve"> </w:t>
+      </w:r>
+      <w:r>
+        <w:t>{{model_wtg}</w:t>
+      </w:r>
+      <w:r>
+        <w:t>}</w:t>
+      </w:r>
+      <w:r>
+        <w:t xml:space="preserve">, désignées </w:t>
+      </w:r>
+      <w:r>
+        <w:t>{{turbine_list}}</w:t>
+      </w:r>
+      <w:r>
+        <w:t xml:space="preserve"> L’ensemble des turbines a été pris en compte dans l’analyse.</w:t>
+      </w:r>
+    </w:p>
+    <w:p>
+      <w:pPr>
+        <w:jc w:val="both"/>
+      </w:pPr>
+    </w:p>
+    <w:p>
+      <w:pPr>
+        <w:jc w:val="both"/>
+      </w:pPr>
+      <w:r>
+        <w:t>Le tableau ci-après présente une évaluation synthétique des performances du parc, en mettant en évidence, pour chaque indicateur, le niveau de performance de chaque éolienne ainsi que les éventuels écarts observés.</w:t>
+      </w:r>
+    </w:p>
+    <w:p/>
+    <w:p>
+      <w:r>
+        <w:t>[T</w:t>
+      </w:r>
+      <w:r>
+        <w:t>ODO</w:t>
+      </w:r>
+      <w:r>
+        <w:t>:SCADA_SUMMARY_TABLE]</w:t>
+      </w:r>
+    </w:p>
+    <w:p>
+      <w:pPr>
+        <w:pStyle w:val="Titre1"/>
+      </w:pPr>
+      <w:r>
+        <w:t>Contexte de l’étude</w:t>
+      </w:r>
+    </w:p>
+    <w:p>
+      <w:pPr>
+        <w:pStyle w:val="Titre2"/>
+      </w:pPr>
+      <w:r>
+        <w:t>Présentation générale du parc</w:t>
+      </w:r>
+    </w:p>
+    <w:p>
+      <w:pPr>
+        <w:jc w:val="both"/>
+      </w:pPr>
+      <w:r>
+        <w:t>Le parc éolien {{</w:t>
+      </w:r>
+      <w:r>
+        <w:t>park_name</w:t>
+      </w:r>
+      <w:r>
+        <w:t>}} est situé sur le territoire des communes de {{COMMUNES}}, dans la région de {{REGION}}. Il est composé de {{</w:t>
+      </w:r>
+      <w:r>
+        <w:t>turbine_count</w:t>
+      </w:r>
+      <w:r>
+        <w:t>}} éoliennes de type {{</w:t>
+      </w:r>
+      <w:r>
+        <w:t>model_wtg</w:t>
+      </w:r>
+      <w:r>
+        <w:t>}}, d’une puissance nominale unitaire de {{</w:t>
+      </w:r>
       <w:r>
         <w:t>nominal_power</w:t>
       </w:r>
-      <w:proofErr w:type="spellEnd"/>
-      <w:r>
-        <w:t xml:space="preserve">}} </w:t>
-      </w:r>
-    </w:p>
-    <w:p>
-      <w:r>
-        <w:t xml:space="preserve">Localisation : {{LOCALISATION}} </w:t>
-      </w:r>
-    </w:p>
-    <w:p>
-      <w:r>
-        <w:t>Client : {{CLIENT}}</w:t>
-      </w:r>
-    </w:p>
-    <w:p>
-      <w:r>
-        <w:t xml:space="preserve">Contact : {{CONTACT_CLIENT}} </w:t>
-      </w:r>
-    </w:p>
-    <w:p>
-      <w:r>
-        <w:t xml:space="preserve">Constructeur / Exploitant : {{CONTRACTOR}} </w:t>
-      </w:r>
-    </w:p>
-    <w:p/>
-    <w:p>
-      <w:r>
-        <w:t>Rédacteur</w:t>
-      </w:r>
-    </w:p>
-    <w:p>
-      <w:r>
-        <w:t>{{AUTEUR}}</w:t>
-      </w:r>
-    </w:p>
-    <w:p>
-      <w:proofErr w:type="gramStart"/>
-      <w:r>
-        <w:t>Email</w:t>
-      </w:r>
-      <w:proofErr w:type="gramEnd"/>
-      <w:r>
-        <w:t xml:space="preserve"> : {{MAIL_AUTEUR}}</w:t>
-      </w:r>
-    </w:p>
-    <w:p>
-      <w:r>
-        <w:t>Téléphone : {{TEL_AUTEUR}}</w:t>
-      </w:r>
-    </w:p>
-    <w:p/>
-    <w:p>
-      <w:r>
-        <w:t>Vérificateur</w:t>
-      </w:r>
-    </w:p>
-    <w:p>
-      <w:r>
-        <w:t>{{VERIFICATEUR}}</w:t>
-      </w:r>
-    </w:p>
-    <w:p>
-      <w:proofErr w:type="gramStart"/>
-      <w:r>
-        <w:t>Email</w:t>
-      </w:r>
-      <w:proofErr w:type="gramEnd"/>
-      <w:r>
-        <w:t xml:space="preserve"> : {{MAIL_VERIFICATEUR}}</w:t>
-      </w:r>
-    </w:p>
-    <w:p>
-      <w:r>
-        <w:t>Téléphone : {{TEL_VERIFICATEUR}}</w:t>
-      </w:r>
-    </w:p>
-    <w:p/>
-    <w:p>
-      <w:r>
-        <w:t>Approbateur</w:t>
-      </w:r>
-    </w:p>
-    <w:p>
-      <w:r>
-        <w:t>{{APPROBATEUR}}</w:t>
-      </w:r>
-    </w:p>
-    <w:p>
-      <w:proofErr w:type="gramStart"/>
-      <w:r>
-        <w:t>Email</w:t>
-      </w:r>
-      <w:proofErr w:type="gramEnd"/>
-      <w:r>
-        <w:t xml:space="preserve"> : {{MAIL_APPROBATEUR}}</w:t>
-      </w:r>
-    </w:p>
-    <w:p>
-      <w:r>
-        <w:t>Téléphone : {{TEL_APPROBATEUR}}</w:t>
-      </w:r>
-    </w:p>
-    <w:p/>
-    <w:p>
-      <w:pPr>
-        <w:spacing w:after="160" w:line="259" w:lineRule="auto"/>
-      </w:pPr>
-      <w:r>
-        <w:br w:type="page"/>
-      </w:r>
-    </w:p>
-    <w:p/>
-    <w:p>
-      <w:pPr>
-        <w:pStyle w:val="Titre1"/>
-      </w:pPr>
-      <w:r>
-        <w:t>Synthèse</w:t>
+      <w:r>
+        <w:t>}}, soit une puissance totale installée de {{</w:t>
+      </w:r>
+      <w:r>
+        <w:t xml:space="preserve">total_power </w:t>
+      </w:r>
+      <w:r>
+        <w:t>}}.</w:t>
       </w:r>
     </w:p>
     <w:p>
@@ -1164,303 +1249,71 @@
         <w:jc w:val="both"/>
       </w:pPr>
       <w:r>
-        <w:t xml:space="preserve">Les données SCADA du parc éolien </w:t>
-      </w:r>
-      <w:r>
-        <w:t>{{</w:t>
-      </w:r>
-      <w:proofErr w:type="spellStart"/>
-      <w:r>
-        <w:t>park_name</w:t>
-      </w:r>
-      <w:proofErr w:type="spellEnd"/>
-      <w:r>
-        <w:t>}}</w:t>
-      </w:r>
-      <w:r>
-        <w:t xml:space="preserve"> ont été analysées sur la période du </w:t>
-      </w:r>
-      <w:r>
-        <w:t>{{</w:t>
-      </w:r>
-      <w:proofErr w:type="spellStart"/>
-      <w:r>
-        <w:t>analysis_start</w:t>
-      </w:r>
-      <w:proofErr w:type="spellEnd"/>
-      <w:r>
-        <w:t>}}</w:t>
-      </w:r>
-      <w:r>
-        <w:t xml:space="preserve"> au </w:t>
-      </w:r>
-      <w:r>
-        <w:t>{{</w:t>
-      </w:r>
-      <w:proofErr w:type="spellStart"/>
-      <w:r>
-        <w:t>analysis_end</w:t>
-      </w:r>
-      <w:proofErr w:type="spellEnd"/>
-      <w:r>
-        <w:t>}}</w:t>
-      </w:r>
-      <w:r>
-        <w:t xml:space="preserve">, à partir des informations fournies par le client. Le parc est composé de </w:t>
-      </w:r>
-      <w:r>
-        <w:t>{{</w:t>
-      </w:r>
-      <w:proofErr w:type="spellStart"/>
-      <w:r>
-        <w:t>turbine_count</w:t>
-      </w:r>
-      <w:proofErr w:type="spellEnd"/>
-      <w:r>
-        <w:t>}}</w:t>
-      </w:r>
-      <w:r>
-        <w:t xml:space="preserve"> éoliennes de type</w:t>
-      </w:r>
+        <w:t>Les éoliennes du parc sont identifiées comme suit : {{</w:t>
+      </w:r>
+      <w:r>
+        <w:t>turbine_list</w:t>
+      </w:r>
+      <w:r>
+        <w:t>}}. L’implantation du parc et la disposition des éoliennes sont présen tées dans la figure ci-</w:t>
+      </w:r>
+      <w:r>
+        <w:t>après :</w:t>
+      </w:r>
+    </w:p>
+    <w:p>
+      <w:pPr>
+        <w:jc w:val="both"/>
+      </w:pPr>
+      <w:r>
+        <w:t>[TODO.IMAGE_POSITION]</w:t>
+      </w:r>
+    </w:p>
+    <w:p>
       <w:r>
         <w:t xml:space="preserve"> </w:t>
       </w:r>
-      <w:r>
-        <w:t>{{</w:t>
-      </w:r>
-      <w:proofErr w:type="spellStart"/>
-      <w:r>
-        <w:t>model_wtg</w:t>
-      </w:r>
-      <w:proofErr w:type="spellEnd"/>
-      <w:r>
-        <w:t>}</w:t>
-      </w:r>
-      <w:r>
-        <w:t>}</w:t>
-      </w:r>
-      <w:r>
-        <w:t xml:space="preserve">, désignées </w:t>
-      </w:r>
-      <w:r>
-        <w:t>{{</w:t>
-      </w:r>
-      <w:proofErr w:type="spellStart"/>
-      <w:r>
-        <w:t>turbine_list</w:t>
-      </w:r>
-      <w:proofErr w:type="spellEnd"/>
-      <w:r>
-        <w:t>}}</w:t>
-      </w:r>
-      <w:r>
-        <w:t xml:space="preserve"> L’ensemble des turbines a été pris en compte dans l’analyse.</w:t>
-      </w:r>
-    </w:p>
-    <w:p>
-      <w:pPr>
-        <w:jc w:val="both"/>
-      </w:pPr>
-    </w:p>
-    <w:p>
-      <w:pPr>
-        <w:jc w:val="both"/>
-      </w:pPr>
-      <w:r>
-        <w:t>Le tableau ci-après présente une évaluation synthétique des performances du parc, en mettant en évidence, pour chaque indicateur, le niveau de performance de chaque éolienne ainsi que les éventuels écarts observés.</w:t>
-      </w:r>
-    </w:p>
-    <w:p/>
-    <w:p>
-      <w:r>
-        <w:t>[</w:t>
-      </w:r>
-      <w:proofErr w:type="gramStart"/>
-      <w:r>
-        <w:t>T</w:t>
+    </w:p>
+    <w:p>
+      <w:pPr>
+        <w:pStyle w:val="Titre2"/>
+      </w:pPr>
+      <w:r>
+        <w:t>Coordonnées des éoliennes</w:t>
+      </w:r>
+    </w:p>
+    <w:p>
+      <w:r>
+        <w:t>Les coordonnées géographiques des éoliennes du parc sont présentées dans le tableau ci-dessous :</w:t>
+      </w:r>
+    </w:p>
+    <w:p>
+      <w:r>
+        <w:t>[TODO.TABLEAU COORDONNE GPS]</w:t>
+      </w:r>
+    </w:p>
+    <w:p>
+      <w:pPr>
+        <w:pStyle w:val="Titre2"/>
+      </w:pPr>
+      <w:r>
+        <w:t>Données fournies par le client</w:t>
+      </w:r>
+    </w:p>
+    <w:p>
+      <w:r>
+        <w:t>Dans le cadre de cette étude, plusieurs jeux de données ont été transmis par le client afin de permettre l’analyse des performances du parc éolien.</w:t>
+      </w:r>
+    </w:p>
+    <w:p>
+      <w:r>
+        <w:t>[T</w:t>
       </w:r>
       <w:r>
         <w:t>ODO</w:t>
       </w:r>
       <w:r>
-        <w:t>:SCADA</w:t>
-      </w:r>
-      <w:proofErr w:type="gramEnd"/>
-      <w:r>
-        <w:t>_SUMMARY_TABLE]</w:t>
-      </w:r>
-    </w:p>
-    <w:p>
-      <w:pPr>
-        <w:pStyle w:val="Titre1"/>
-      </w:pPr>
-      <w:r>
-        <w:t>Contexte de l’étude</w:t>
-      </w:r>
-    </w:p>
-    <w:p>
-      <w:pPr>
-        <w:pStyle w:val="Titre2"/>
-      </w:pPr>
-      <w:r>
-        <w:t>Présentation générale du parc</w:t>
-      </w:r>
-    </w:p>
-    <w:p>
-      <w:pPr>
-        <w:jc w:val="both"/>
-      </w:pPr>
-      <w:r>
-        <w:t>Le parc éolien {{</w:t>
-      </w:r>
-      <w:proofErr w:type="spellStart"/>
-      <w:r>
-        <w:t>park_name</w:t>
-      </w:r>
-      <w:proofErr w:type="spellEnd"/>
-      <w:r>
-        <w:t>}} est situé sur le territoire des communes de {{COMMUNES}}, dans la région de {{REGION}}. Il est composé de {{</w:t>
-      </w:r>
-      <w:proofErr w:type="spellStart"/>
-      <w:r>
-        <w:t>turbine_count</w:t>
-      </w:r>
-      <w:proofErr w:type="spellEnd"/>
-      <w:r>
-        <w:t>}} éoliennes de type {{</w:t>
-      </w:r>
-      <w:proofErr w:type="spellStart"/>
-      <w:r>
-        <w:t>model_wtg</w:t>
-      </w:r>
-      <w:proofErr w:type="spellEnd"/>
-      <w:r>
-        <w:t>}}, d’une puissance nominale unitaire de {{</w:t>
-      </w:r>
-      <w:proofErr w:type="spellStart"/>
-      <w:r>
-        <w:t>nominal_power</w:t>
-      </w:r>
-      <w:proofErr w:type="spellEnd"/>
-      <w:r>
-        <w:t>}}, soit une puissance totale installée de {{</w:t>
-      </w:r>
-      <w:proofErr w:type="spellStart"/>
-      <w:r>
-        <w:t>total_</w:t>
-      </w:r>
-      <w:proofErr w:type="gramStart"/>
-      <w:r>
-        <w:t>power</w:t>
-      </w:r>
-      <w:proofErr w:type="spellEnd"/>
-      <w:r>
-        <w:t xml:space="preserve"> </w:t>
-      </w:r>
-      <w:r>
-        <w:t>}</w:t>
-      </w:r>
-      <w:proofErr w:type="gramEnd"/>
-      <w:r>
-        <w:t>}.</w:t>
-      </w:r>
-    </w:p>
-    <w:p>
-      <w:pPr>
-        <w:jc w:val="both"/>
-      </w:pPr>
-      <w:r>
-        <w:t>Les éoliennes du parc sont identifiées comme suit : {{</w:t>
-      </w:r>
-      <w:proofErr w:type="spellStart"/>
-      <w:r>
-        <w:t>turbine_list</w:t>
-      </w:r>
-      <w:proofErr w:type="spellEnd"/>
-      <w:r>
-        <w:t xml:space="preserve">}}. L’implantation du parc et la disposition des éoliennes sont </w:t>
-      </w:r>
-      <w:proofErr w:type="spellStart"/>
-      <w:r>
-        <w:t>présen</w:t>
-      </w:r>
-      <w:proofErr w:type="spellEnd"/>
-      <w:r>
-        <w:t xml:space="preserve"> </w:t>
-      </w:r>
-      <w:proofErr w:type="spellStart"/>
-      <w:r>
-        <w:t>tées</w:t>
-      </w:r>
-      <w:proofErr w:type="spellEnd"/>
-      <w:r>
-        <w:t xml:space="preserve"> dans la figure ci-</w:t>
-      </w:r>
-      <w:r>
-        <w:t>après :</w:t>
-      </w:r>
-    </w:p>
-    <w:p>
-      <w:pPr>
-        <w:jc w:val="both"/>
-      </w:pPr>
-      <w:r>
-        <w:t>[TODO.IMAGE_POSITION]</w:t>
-      </w:r>
-    </w:p>
-    <w:p>
-      <w:r>
-        <w:t xml:space="preserve"> </w:t>
-      </w:r>
-    </w:p>
-    <w:p>
-      <w:pPr>
-        <w:pStyle w:val="Titre2"/>
-      </w:pPr>
-      <w:r>
-        <w:t>Coordonnées des éoliennes</w:t>
-      </w:r>
-    </w:p>
-    <w:p>
-      <w:r>
-        <w:t>Les coordonnées géographiques des éoliennes du parc sont présentées dans le tableau ci-dessous :</w:t>
-      </w:r>
-    </w:p>
-    <w:p>
-      <w:r>
-        <w:t>[TODO.TABLEAU COORDONNE GPS]</w:t>
-      </w:r>
-    </w:p>
-    <w:p>
-      <w:pPr>
-        <w:pStyle w:val="Titre2"/>
-      </w:pPr>
-      <w:r>
-        <w:t>Données fournies par le client</w:t>
-      </w:r>
-    </w:p>
-    <w:p>
-      <w:r>
-        <w:t>Dans le cadre de cette étude, plusieurs jeux de données ont été transmis par le client afin de permettre l’analyse des performances du parc éolien.</w:t>
-      </w:r>
-    </w:p>
-    <w:p>
-      <w:r>
-        <w:t>[</w:t>
-      </w:r>
-      <w:proofErr w:type="gramStart"/>
-      <w:r>
-        <w:t>T</w:t>
-      </w:r>
-      <w:r>
-        <w:t>ODO</w:t>
-      </w:r>
-      <w:r>
-        <w:t>:</w:t>
-      </w:r>
-      <w:proofErr w:type="gramEnd"/>
-      <w:r>
-        <w:t>CSV_FILES_TABLE]</w:t>
+        <w:t>:CSV_FILES_TABLE]</w:t>
       </w:r>
     </w:p>
     <w:p>
@@ -1507,7 +1360,6 @@
                 <w:szCs w:val="22"/>
               </w:rPr>
             </w:pPr>
-            <w:proofErr w:type="spellStart"/>
             <w:r>
               <w:rPr>
                 <w:rFonts w:ascii="Cambria" w:eastAsia="MS Mincho" w:hAnsi="Cambria"/>
@@ -1544,7 +1396,6 @@
               </w:rPr>
               <w:t>e</w:t>
             </w:r>
-            <w:proofErr w:type="spellEnd"/>
           </w:p>
         </w:tc>
         <w:tc>
@@ -1568,18 +1419,8 @@
                 <w:sz w:val="22"/>
                 <w:szCs w:val="22"/>
               </w:rPr>
-              <w:t xml:space="preserve">Axes </w:t>
+              <w:t>Axes d’analyse</w:t>
             </w:r>
-            <w:proofErr w:type="spellStart"/>
-            <w:r>
-              <w:rPr>
-                <w:rFonts w:ascii="Cambria" w:eastAsia="MS Mincho" w:hAnsi="Cambria"/>
-                <w:sz w:val="22"/>
-                <w:szCs w:val="22"/>
-              </w:rPr>
-              <w:t>d’analyse</w:t>
-            </w:r>
-            <w:proofErr w:type="spellEnd"/>
           </w:p>
         </w:tc>
       </w:tr>
@@ -1599,23 +1440,13 @@
                 <w:szCs w:val="22"/>
               </w:rPr>
             </w:pPr>
-            <w:proofErr w:type="spellStart"/>
             <w:r>
               <w:rPr>
                 <w:rFonts w:ascii="Cambria" w:eastAsia="MS Mincho" w:hAnsi="Cambria"/>
                 <w:sz w:val="22"/>
                 <w:szCs w:val="22"/>
               </w:rPr>
-              <w:t>Qualité</w:t>
-            </w:r>
-            <w:proofErr w:type="spellEnd"/>
-            <w:r>
-              <w:rPr>
-                <w:rFonts w:ascii="Cambria" w:eastAsia="MS Mincho" w:hAnsi="Cambria"/>
-                <w:sz w:val="22"/>
-                <w:szCs w:val="22"/>
-              </w:rPr>
-              <w:t xml:space="preserve"> des données</w:t>
+              <w:t>Qualité des données</w:t>
             </w:r>
           </w:p>
         </w:tc>
@@ -1699,18 +1530,8 @@
                 <w:sz w:val="22"/>
                 <w:szCs w:val="22"/>
               </w:rPr>
-              <w:t xml:space="preserve">Production et </w:t>
+              <w:t>Production et disponibilité</w:t>
             </w:r>
-            <w:proofErr w:type="spellStart"/>
-            <w:r>
-              <w:rPr>
-                <w:rFonts w:ascii="Cambria" w:eastAsia="MS Mincho" w:hAnsi="Cambria"/>
-                <w:sz w:val="22"/>
-                <w:szCs w:val="22"/>
-              </w:rPr>
-              <w:t>disponibilité</w:t>
-            </w:r>
-            <w:proofErr w:type="spellEnd"/>
           </w:p>
         </w:tc>
         <w:tc>
@@ -1732,52 +1553,14 @@
                 <w:szCs w:val="22"/>
               </w:rPr>
             </w:pPr>
-            <w:proofErr w:type="spellStart"/>
             <w:r>
               <w:rPr>
                 <w:rFonts w:ascii="Cambria" w:eastAsia="MS Mincho" w:hAnsi="Cambria"/>
                 <w:sz w:val="22"/>
                 <w:szCs w:val="22"/>
               </w:rPr>
-              <w:t>Calcul</w:t>
+              <w:t>Calcul de la disponibilité énergétique</w:t>
             </w:r>
-            <w:proofErr w:type="spellEnd"/>
-            <w:r>
-              <w:rPr>
-                <w:rFonts w:ascii="Cambria" w:eastAsia="MS Mincho" w:hAnsi="Cambria"/>
-                <w:sz w:val="22"/>
-                <w:szCs w:val="22"/>
-              </w:rPr>
-              <w:t xml:space="preserve"> de la </w:t>
-            </w:r>
-            <w:proofErr w:type="spellStart"/>
-            <w:r>
-              <w:rPr>
-                <w:rFonts w:ascii="Cambria" w:eastAsia="MS Mincho" w:hAnsi="Cambria"/>
-                <w:sz w:val="22"/>
-                <w:szCs w:val="22"/>
-              </w:rPr>
-              <w:t>disponibilité</w:t>
-            </w:r>
-            <w:proofErr w:type="spellEnd"/>
-            <w:r>
-              <w:rPr>
-                <w:rFonts w:ascii="Cambria" w:eastAsia="MS Mincho" w:hAnsi="Cambria"/>
-                <w:sz w:val="22"/>
-                <w:szCs w:val="22"/>
-              </w:rPr>
-              <w:t xml:space="preserve"> </w:t>
-            </w:r>
-            <w:proofErr w:type="spellStart"/>
-            <w:r>
-              <w:rPr>
-                <w:rFonts w:ascii="Cambria" w:eastAsia="MS Mincho" w:hAnsi="Cambria"/>
-                <w:sz w:val="22"/>
-                <w:szCs w:val="22"/>
-              </w:rPr>
-              <w:t>énergétique</w:t>
-            </w:r>
-            <w:proofErr w:type="spellEnd"/>
           </w:p>
           <w:p>
             <w:pPr>
@@ -1794,52 +1577,14 @@
                 <w:szCs w:val="22"/>
               </w:rPr>
             </w:pPr>
-            <w:proofErr w:type="spellStart"/>
             <w:r>
               <w:rPr>
                 <w:rFonts w:ascii="Cambria" w:eastAsia="MS Mincho" w:hAnsi="Cambria"/>
                 <w:sz w:val="22"/>
                 <w:szCs w:val="22"/>
               </w:rPr>
-              <w:t>Calcul</w:t>
+              <w:t>Calcul de la disponibilité temporelle</w:t>
             </w:r>
-            <w:proofErr w:type="spellEnd"/>
-            <w:r>
-              <w:rPr>
-                <w:rFonts w:ascii="Cambria" w:eastAsia="MS Mincho" w:hAnsi="Cambria"/>
-                <w:sz w:val="22"/>
-                <w:szCs w:val="22"/>
-              </w:rPr>
-              <w:t xml:space="preserve"> de la </w:t>
-            </w:r>
-            <w:proofErr w:type="spellStart"/>
-            <w:r>
-              <w:rPr>
-                <w:rFonts w:ascii="Cambria" w:eastAsia="MS Mincho" w:hAnsi="Cambria"/>
-                <w:sz w:val="22"/>
-                <w:szCs w:val="22"/>
-              </w:rPr>
-              <w:t>disponibilité</w:t>
-            </w:r>
-            <w:proofErr w:type="spellEnd"/>
-            <w:r>
-              <w:rPr>
-                <w:rFonts w:ascii="Cambria" w:eastAsia="MS Mincho" w:hAnsi="Cambria"/>
-                <w:sz w:val="22"/>
-                <w:szCs w:val="22"/>
-              </w:rPr>
-              <w:t xml:space="preserve"> </w:t>
-            </w:r>
-            <w:proofErr w:type="spellStart"/>
-            <w:r>
-              <w:rPr>
-                <w:rFonts w:ascii="Cambria" w:eastAsia="MS Mincho" w:hAnsi="Cambria"/>
-                <w:sz w:val="22"/>
-                <w:szCs w:val="22"/>
-              </w:rPr>
-              <w:t>temporelle</w:t>
-            </w:r>
-            <w:proofErr w:type="spellEnd"/>
           </w:p>
           <w:p>
             <w:pPr>
@@ -1911,41 +1656,13 @@
                 <w:szCs w:val="22"/>
               </w:rPr>
             </w:pPr>
-            <w:proofErr w:type="spellStart"/>
             <w:r>
               <w:rPr>
                 <w:rFonts w:ascii="Cambria" w:eastAsia="MS Mincho" w:hAnsi="Cambria"/>
                 <w:sz w:val="22"/>
                 <w:szCs w:val="22"/>
               </w:rPr>
-              <w:t>Bridages</w:t>
-            </w:r>
-            <w:proofErr w:type="spellEnd"/>
-            <w:r>
-              <w:rPr>
-                <w:rFonts w:ascii="Cambria" w:eastAsia="MS Mincho" w:hAnsi="Cambria"/>
-                <w:sz w:val="22"/>
-                <w:szCs w:val="22"/>
-              </w:rPr>
-              <w:t xml:space="preserve"> (</w:t>
-            </w:r>
-            <w:proofErr w:type="spellStart"/>
-            <w:r>
-              <w:rPr>
-                <w:rFonts w:ascii="Cambria" w:eastAsia="MS Mincho" w:hAnsi="Cambria"/>
-                <w:sz w:val="22"/>
-                <w:szCs w:val="22"/>
-              </w:rPr>
-              <w:t>si</w:t>
-            </w:r>
-            <w:proofErr w:type="spellEnd"/>
-            <w:r>
-              <w:rPr>
-                <w:rFonts w:ascii="Cambria" w:eastAsia="MS Mincho" w:hAnsi="Cambria"/>
-                <w:sz w:val="22"/>
-                <w:szCs w:val="22"/>
-              </w:rPr>
-              <w:t xml:space="preserve"> applicable)</w:t>
+              <w:t>Bridages (si applicable)</w:t>
             </w:r>
           </w:p>
         </w:tc>
@@ -2055,18 +1772,8 @@
                 <w:sz w:val="22"/>
                 <w:szCs w:val="22"/>
               </w:rPr>
-              <w:t xml:space="preserve">Performance des </w:t>
+              <w:t>Performance des éoliennes</w:t>
             </w:r>
-            <w:proofErr w:type="spellStart"/>
-            <w:r>
-              <w:rPr>
-                <w:rFonts w:ascii="Cambria" w:eastAsia="MS Mincho" w:hAnsi="Cambria"/>
-                <w:sz w:val="22"/>
-                <w:szCs w:val="22"/>
-              </w:rPr>
-              <w:t>éoliennes</w:t>
-            </w:r>
-            <w:proofErr w:type="spellEnd"/>
           </w:p>
         </w:tc>
         <w:tc>
@@ -2116,41 +1823,13 @@
                 <w:szCs w:val="22"/>
               </w:rPr>
             </w:pPr>
-            <w:proofErr w:type="spellStart"/>
             <w:r>
               <w:rPr>
                 <w:rFonts w:ascii="Cambria" w:eastAsia="MS Mincho" w:hAnsi="Cambria"/>
                 <w:sz w:val="22"/>
                 <w:szCs w:val="22"/>
               </w:rPr>
-              <w:t>Analyse</w:t>
-            </w:r>
-            <w:proofErr w:type="spellEnd"/>
-            <w:r>
-              <w:rPr>
-                <w:rFonts w:ascii="Cambria" w:eastAsia="MS Mincho" w:hAnsi="Cambria"/>
-                <w:sz w:val="22"/>
-                <w:szCs w:val="22"/>
-              </w:rPr>
-              <w:t xml:space="preserve"> du </w:t>
-            </w:r>
-            <w:proofErr w:type="spellStart"/>
-            <w:r>
-              <w:rPr>
-                <w:rFonts w:ascii="Cambria" w:eastAsia="MS Mincho" w:hAnsi="Cambria"/>
-                <w:sz w:val="22"/>
-                <w:szCs w:val="22"/>
-              </w:rPr>
-              <w:t>comportement</w:t>
-            </w:r>
-            <w:proofErr w:type="spellEnd"/>
-            <w:r>
-              <w:rPr>
-                <w:rFonts w:ascii="Cambria" w:eastAsia="MS Mincho" w:hAnsi="Cambria"/>
-                <w:sz w:val="22"/>
-                <w:szCs w:val="22"/>
-              </w:rPr>
-              <w:t xml:space="preserve"> du pitch</w:t>
+              <w:t>Analyse du comportement du pitch</w:t>
             </w:r>
           </w:p>
           <w:p>
@@ -2196,23 +1875,13 @@
                 <w:szCs w:val="22"/>
               </w:rPr>
             </w:pPr>
-            <w:proofErr w:type="spellStart"/>
             <w:r>
               <w:rPr>
                 <w:rFonts w:ascii="Cambria" w:eastAsia="MS Mincho" w:hAnsi="Cambria"/>
                 <w:sz w:val="22"/>
                 <w:szCs w:val="22"/>
               </w:rPr>
-              <w:t>Analyse</w:t>
-            </w:r>
-            <w:proofErr w:type="spellEnd"/>
-            <w:r>
-              <w:rPr>
-                <w:rFonts w:ascii="Cambria" w:eastAsia="MS Mincho" w:hAnsi="Cambria"/>
-                <w:sz w:val="22"/>
-                <w:szCs w:val="22"/>
-              </w:rPr>
-              <w:t xml:space="preserve"> inter-turbines</w:t>
+              <w:t>Analyse inter-turbines</w:t>
             </w:r>
           </w:p>
           <w:p>
@@ -2231,41 +1900,13 @@
                 <w:szCs w:val="22"/>
               </w:rPr>
             </w:pPr>
-            <w:proofErr w:type="spellStart"/>
             <w:r>
               <w:rPr>
                 <w:rFonts w:ascii="Cambria" w:eastAsia="MS Mincho" w:hAnsi="Cambria"/>
                 <w:sz w:val="22"/>
                 <w:szCs w:val="22"/>
               </w:rPr>
-              <w:t>Cohérence</w:t>
-            </w:r>
-            <w:proofErr w:type="spellEnd"/>
-            <w:r>
-              <w:rPr>
-                <w:rFonts w:ascii="Cambria" w:eastAsia="MS Mincho" w:hAnsi="Cambria"/>
-                <w:sz w:val="22"/>
-                <w:szCs w:val="22"/>
-              </w:rPr>
-              <w:t xml:space="preserve"> </w:t>
-            </w:r>
-            <w:proofErr w:type="spellStart"/>
-            <w:r>
-              <w:rPr>
-                <w:rFonts w:ascii="Cambria" w:eastAsia="MS Mincho" w:hAnsi="Cambria"/>
-                <w:sz w:val="22"/>
-                <w:szCs w:val="22"/>
-              </w:rPr>
-              <w:t>globale</w:t>
-            </w:r>
-            <w:proofErr w:type="spellEnd"/>
-            <w:r>
-              <w:rPr>
-                <w:rFonts w:ascii="Cambria" w:eastAsia="MS Mincho" w:hAnsi="Cambria"/>
-                <w:sz w:val="22"/>
-                <w:szCs w:val="22"/>
-              </w:rPr>
-              <w:t xml:space="preserve"> des performances</w:t>
+              <w:t>Cohérence globale des performances</w:t>
             </w:r>
           </w:p>
         </w:tc>
@@ -2301,13 +1942,8 @@
           <w:numId w:val="6"/>
         </w:numPr>
       </w:pPr>
-      <w:proofErr w:type="gramStart"/>
-      <w:r>
-        <w:t>variables</w:t>
-      </w:r>
-      <w:proofErr w:type="gramEnd"/>
-      <w:r>
-        <w:t xml:space="preserve"> environnementales : </w:t>
+      <w:r>
+        <w:t xml:space="preserve">variables environnementales : </w:t>
       </w:r>
     </w:p>
     <w:p>
@@ -2318,13 +1954,8 @@
           <w:numId w:val="6"/>
         </w:numPr>
       </w:pPr>
-      <w:proofErr w:type="gramStart"/>
-      <w:r>
-        <w:t>vitesse</w:t>
-      </w:r>
-      <w:proofErr w:type="gramEnd"/>
-      <w:r>
-        <w:t xml:space="preserve"> du vent </w:t>
+      <w:r>
+        <w:t xml:space="preserve">vitesse du vent </w:t>
       </w:r>
     </w:p>
     <w:p>
@@ -2335,13 +1966,8 @@
           <w:numId w:val="6"/>
         </w:numPr>
       </w:pPr>
-      <w:proofErr w:type="gramStart"/>
-      <w:r>
-        <w:t>direction</w:t>
-      </w:r>
-      <w:proofErr w:type="gramEnd"/>
-      <w:r>
-        <w:t xml:space="preserve"> du vent </w:t>
+      <w:r>
+        <w:t xml:space="preserve">direction du vent </w:t>
       </w:r>
     </w:p>
     <w:p>
@@ -2352,13 +1978,8 @@
           <w:numId w:val="6"/>
         </w:numPr>
       </w:pPr>
-      <w:proofErr w:type="gramStart"/>
-      <w:r>
-        <w:t>température</w:t>
-      </w:r>
-      <w:proofErr w:type="gramEnd"/>
-      <w:r>
-        <w:t xml:space="preserve"> ambiante </w:t>
+      <w:r>
+        <w:t xml:space="preserve">température ambiante </w:t>
       </w:r>
     </w:p>
     <w:p>
@@ -2369,13 +1990,8 @@
           <w:numId w:val="6"/>
         </w:numPr>
       </w:pPr>
-      <w:proofErr w:type="gramStart"/>
-      <w:r>
-        <w:t>variables</w:t>
-      </w:r>
-      <w:proofErr w:type="gramEnd"/>
-      <w:r>
-        <w:t xml:space="preserve"> opérationnelles clés : </w:t>
+      <w:r>
+        <w:t xml:space="preserve">variables opérationnelles clés : </w:t>
       </w:r>
     </w:p>
     <w:p>
@@ -2386,13 +2002,8 @@
           <w:numId w:val="6"/>
         </w:numPr>
       </w:pPr>
-      <w:proofErr w:type="gramStart"/>
-      <w:r>
-        <w:t>puissance</w:t>
-      </w:r>
-      <w:proofErr w:type="gramEnd"/>
-      <w:r>
-        <w:t xml:space="preserve"> active produite </w:t>
+      <w:r>
+        <w:t xml:space="preserve">puissance active produite </w:t>
       </w:r>
     </w:p>
     <w:p/>
@@ -2413,29 +2024,13 @@
         <w:t xml:space="preserve">La figure ci-après présente la disponibilité des données SCADA, sur la période allant du </w:t>
       </w:r>
       <w:r>
-        <w:t>{{</w:t>
-      </w:r>
-      <w:proofErr w:type="spellStart"/>
-      <w:r>
-        <w:t>analysis_start</w:t>
-      </w:r>
-      <w:proofErr w:type="spellEnd"/>
-      <w:r>
-        <w:t>}}</w:t>
+        <w:t>{{analysis_start}}</w:t>
       </w:r>
       <w:r>
         <w:t xml:space="preserve"> au </w:t>
       </w:r>
       <w:r>
-        <w:t>{{</w:t>
-      </w:r>
-      <w:proofErr w:type="spellStart"/>
-      <w:r>
-        <w:t>analysis_end</w:t>
-      </w:r>
-      <w:proofErr w:type="spellEnd"/>
-      <w:r>
-        <w:t>}}</w:t>
+        <w:t>{{analysis_end}}</w:t>
       </w:r>
       <w:r>
         <w:t>.</w:t>
@@ -2518,21 +2113,7 @@
         <w:rPr>
           <w:lang w:val="en-US"/>
         </w:rPr>
-        <w:t>{{</w:t>
-      </w:r>
-      <w:proofErr w:type="spellStart"/>
-      <w:r>
-        <w:rPr>
-          <w:lang w:val="en-US"/>
-        </w:rPr>
-        <w:t>data_availability_chart</w:t>
-      </w:r>
-      <w:proofErr w:type="spellEnd"/>
-      <w:r>
-        <w:rPr>
-          <w:lang w:val="en-US"/>
-        </w:rPr>
-        <w:t>}}</w:t>
+        <w:t>{{data_availability_chart}}</w:t>
       </w:r>
     </w:p>
     <w:p>
@@ -2569,23 +2150,7 @@
         </w:numPr>
       </w:pPr>
       <w:r>
-        <w:t>Disponibilité énergétique brute (</w:t>
-      </w:r>
-      <w:proofErr w:type="spellStart"/>
-      <w:r>
-        <w:t>cut</w:t>
-      </w:r>
-      <w:proofErr w:type="spellEnd"/>
-      <w:r>
-        <w:t xml:space="preserve">-in / </w:t>
-      </w:r>
-      <w:proofErr w:type="spellStart"/>
-      <w:r>
-        <w:t>cut</w:t>
-      </w:r>
-      <w:proofErr w:type="spellEnd"/>
-      <w:r>
-        <w:t>-out) : calculée pour les périodes où la vitesse de vent est comprise entre les seuils de démarrage et d’arrêt des éoliennes, en incluant l’ensemble des indisponibilités (arrêts techniques, maintenance, limitations réseau, etc.)</w:t>
+        <w:t>Disponibilité énergétique brute (cut-in / cut-out) : calculée pour les périodes où la vitesse de vent est comprise entre les seuils de démarrage et d’arrêt des éoliennes, en incluant l’ensemble des indisponibilités (arrêts techniques, maintenance, limitations réseau, etc.)</w:t>
       </w:r>
     </w:p>
     <w:p>
@@ -2674,29 +2239,8 @@
           <w:numId w:val="8"/>
         </w:numPr>
       </w:pPr>
-      <w:proofErr w:type="gramStart"/>
-      <w:r>
-        <w:t>la</w:t>
-      </w:r>
-      <w:proofErr w:type="gramEnd"/>
-      <w:r>
-        <w:t xml:space="preserve"> disponibilité énergétique brute (</w:t>
-      </w:r>
-      <w:proofErr w:type="spellStart"/>
-      <w:r>
-        <w:t>cut</w:t>
-      </w:r>
-      <w:proofErr w:type="spellEnd"/>
-      <w:r>
-        <w:t xml:space="preserve">-in / </w:t>
-      </w:r>
-      <w:proofErr w:type="spellStart"/>
-      <w:r>
-        <w:t>cut</w:t>
-      </w:r>
-      <w:proofErr w:type="spellEnd"/>
-      <w:r>
-        <w:t>-out),</w:t>
+      <w:r>
+        <w:t>la disponibilité énergétique brute (cut-in / cut-out),</w:t>
       </w:r>
     </w:p>
     <w:p>
@@ -2707,13 +2251,8 @@
           <w:numId w:val="8"/>
         </w:numPr>
       </w:pPr>
-      <w:proofErr w:type="gramStart"/>
-      <w:r>
-        <w:t>la</w:t>
-      </w:r>
-      <w:proofErr w:type="gramEnd"/>
-      <w:r>
-        <w:t xml:space="preserve"> disponibilité énergétique imputable au fabricant</w:t>
+      <w:r>
+        <w:t>la disponibilité énergétique imputable au fabricant</w:t>
       </w:r>
     </w:p>
     <w:p>
@@ -2726,21 +2265,20 @@
         <w:rPr>
           <w:lang w:val="en-US"/>
         </w:rPr>
-        <w:t>[</w:t>
-      </w:r>
-      <w:proofErr w:type="gramStart"/>
-      <w:r>
+        <w:t>[TABLE:EBA_CUT_IN_CUT_OUT_TABLE]</w:t>
+      </w:r>
+    </w:p>
+    <w:p>
+      <w:pPr>
         <w:rPr>
           <w:lang w:val="en-US"/>
         </w:rPr>
-        <w:t>TABLE:EBA</w:t>
-      </w:r>
-      <w:proofErr w:type="gramEnd"/>
+      </w:pPr>
       <w:r>
         <w:rPr>
           <w:lang w:val="en-US"/>
         </w:rPr>
-        <w:t>_CUT_IN_CUT_OUT_TABLE]</w:t>
+        <w:t>{{eba_cut_in_cut_out_chart}}</w:t>
       </w:r>
     </w:p>
     <w:p>
@@ -2749,25 +2287,24 @@
           <w:lang w:val="en-US"/>
         </w:rPr>
       </w:pPr>
-      <w:r>
+    </w:p>
+    <w:p>
+      <w:pPr>
         <w:rPr>
           <w:lang w:val="en-US"/>
         </w:rPr>
-        <w:t>{{</w:t>
-      </w:r>
-      <w:proofErr w:type="spellStart"/>
+      </w:pPr>
       <w:r>
         <w:rPr>
           <w:lang w:val="en-US"/>
         </w:rPr>
-        <w:t>eba_cut_in_cut_out_chart</w:t>
-      </w:r>
-      <w:proofErr w:type="spellEnd"/>
+        <w:t>[TABLE:EBA_MANUFACTURER_TABLE]</w:t>
+      </w:r>
       <w:r>
         <w:rPr>
           <w:lang w:val="en-US"/>
         </w:rPr>
-        <w:t>}}</w:t>
+        <w:t xml:space="preserve"> </w:t>
       </w:r>
     </w:p>
     <w:p>
@@ -2776,131 +2313,55 @@
           <w:lang w:val="en-US"/>
         </w:rPr>
       </w:pPr>
-    </w:p>
-    <w:p>
-      <w:pPr>
+      <w:r>
         <w:rPr>
           <w:lang w:val="en-US"/>
         </w:rPr>
-      </w:pPr>
-      <w:r>
+        <w:t>{{eba_manifacturer_chart}}</w:t>
+      </w:r>
+    </w:p>
+    <w:p>
+      <w:pPr>
         <w:rPr>
           <w:lang w:val="en-US"/>
         </w:rPr>
-        <w:t>[</w:t>
-      </w:r>
-      <w:proofErr w:type="gramStart"/>
-      <w:r>
+      </w:pPr>
+    </w:p>
+    <w:p>
+      <w:r>
+        <w:t>[TABLE:EBA_LOSS_TABLE]</w:t>
+      </w:r>
+    </w:p>
+    <w:p>
+      <w:r>
+        <w:t>En complément, les figures suivantes illustrent les pertes énergétiques associées aux indisponibilités, en mettant en évidence leur répartition dans le temps ainsi que leur contribution relative.</w:t>
+      </w:r>
+    </w:p>
+    <w:p/>
+    <w:p>
+      <w:pPr>
         <w:rPr>
           <w:lang w:val="en-US"/>
         </w:rPr>
-        <w:t>TABLE:EBA</w:t>
-      </w:r>
-      <w:proofErr w:type="gramEnd"/>
+      </w:pPr>
       <w:r>
         <w:rPr>
           <w:lang w:val="en-US"/>
         </w:rPr>
-        <w:t>_MANUFACTURER_TABLE]</w:t>
-      </w:r>
-      <w:r>
+        <w:t>[TODO.ANALYSE]</w:t>
+      </w:r>
+    </w:p>
+    <w:p>
+      <w:pPr>
         <w:rPr>
           <w:lang w:val="en-US"/>
         </w:rPr>
-        <w:t xml:space="preserve"> </w:t>
-      </w:r>
-    </w:p>
-    <w:p>
-      <w:pPr>
+      </w:pPr>
+      <w:r>
         <w:rPr>
           <w:lang w:val="en-US"/>
         </w:rPr>
-      </w:pPr>
-      <w:r>
-        <w:rPr>
-          <w:lang w:val="en-US"/>
-        </w:rPr>
-        <w:t>{{</w:t>
-      </w:r>
-      <w:proofErr w:type="spellStart"/>
-      <w:r>
-        <w:rPr>
-          <w:lang w:val="en-US"/>
-        </w:rPr>
-        <w:t>eba_manifacturer_chart</w:t>
-      </w:r>
-      <w:proofErr w:type="spellEnd"/>
-      <w:r>
-        <w:rPr>
-          <w:lang w:val="en-US"/>
-        </w:rPr>
-        <w:t>}}</w:t>
-      </w:r>
-    </w:p>
-    <w:p>
-      <w:pPr>
-        <w:rPr>
-          <w:lang w:val="en-US"/>
-        </w:rPr>
-      </w:pPr>
-    </w:p>
-    <w:p>
-      <w:r>
-        <w:t>[</w:t>
-      </w:r>
-      <w:proofErr w:type="gramStart"/>
-      <w:r>
-        <w:t>TABLE:EBA</w:t>
-      </w:r>
-      <w:proofErr w:type="gramEnd"/>
-      <w:r>
-        <w:t>_LOSS_TABLE]</w:t>
-      </w:r>
-    </w:p>
-    <w:p>
-      <w:r>
-        <w:t>En complément, les figures suivantes illustrent les pertes énergétiques associées aux indisponibilités, en mettant en évidence leur répartition dans le temps ainsi que leur contribution relative.</w:t>
-      </w:r>
-    </w:p>
-    <w:p/>
-    <w:p>
-      <w:pPr>
-        <w:rPr>
-          <w:lang w:val="en-US"/>
-        </w:rPr>
-      </w:pPr>
-      <w:r>
-        <w:rPr>
-          <w:lang w:val="en-US"/>
-        </w:rPr>
-        <w:t>[TODO.ANALYSE]</w:t>
-      </w:r>
-    </w:p>
-    <w:p>
-      <w:pPr>
-        <w:rPr>
-          <w:lang w:val="en-US"/>
-        </w:rPr>
-      </w:pPr>
-      <w:r>
-        <w:rPr>
-          <w:lang w:val="en-US"/>
-        </w:rPr>
-        <w:t>{{</w:t>
-      </w:r>
-      <w:proofErr w:type="spellStart"/>
-      <w:r>
-        <w:rPr>
-          <w:lang w:val="en-US"/>
-        </w:rPr>
-        <w:t>eba_loss_chart</w:t>
-      </w:r>
-      <w:proofErr w:type="spellEnd"/>
-      <w:r>
-        <w:rPr>
-          <w:lang w:val="en-US"/>
-        </w:rPr>
-        <w:t>}}</w:t>
+        <w:t>{{eba_loss_chart}}</w:t>
       </w:r>
     </w:p>
     <w:p>
@@ -3021,138 +2482,96 @@
         <w:rPr>
           <w:lang w:val="en-US"/>
         </w:rPr>
-        <w:t>[</w:t>
-      </w:r>
-      <w:proofErr w:type="gramStart"/>
+        <w:t>[TABLE:ERROR_</w:t>
+      </w:r>
       <w:r>
         <w:rPr>
           <w:lang w:val="en-US"/>
         </w:rPr>
-        <w:t>TABLE:ERROR</w:t>
-      </w:r>
-      <w:proofErr w:type="gramEnd"/>
+        <w:t>CODE_</w:t>
+      </w:r>
       <w:r>
         <w:rPr>
           <w:lang w:val="en-US"/>
         </w:rPr>
-        <w:t>_</w:t>
-      </w:r>
-      <w:r>
+        <w:t>PARETO_FREQUENCY]</w:t>
+      </w:r>
+    </w:p>
+    <w:p>
+      <w:pPr>
         <w:rPr>
           <w:lang w:val="en-US"/>
         </w:rPr>
+      </w:pPr>
+    </w:p>
+    <w:p>
+      <w:pPr>
+        <w:rPr>
+          <w:lang w:val="en-US"/>
+        </w:rPr>
+      </w:pPr>
+      <w:r>
+        <w:rPr>
+          <w:lang w:val="en-US"/>
+        </w:rPr>
+        <w:t>[TABLE:ERROR_</w:t>
+      </w:r>
+      <w:r>
+        <w:rPr>
+          <w:lang w:val="en-US"/>
+        </w:rPr>
         <w:t>CODE_</w:t>
       </w:r>
       <w:r>
         <w:rPr>
           <w:lang w:val="en-US"/>
         </w:rPr>
-        <w:t>PARETO_FREQUENCY]</w:t>
-      </w:r>
-    </w:p>
-    <w:p>
-      <w:pPr>
+        <w:t>PARETO_</w:t>
+      </w:r>
+      <w:r>
         <w:rPr>
           <w:lang w:val="en-US"/>
         </w:rPr>
-      </w:pPr>
+        <w:t>DURATION</w:t>
+      </w:r>
       <w:r>
         <w:rPr>
           <w:lang w:val="en-US"/>
         </w:rPr>
-        <w:t>[</w:t>
-      </w:r>
-      <w:proofErr w:type="gramStart"/>
-      <w:r>
+        <w:t>]</w:t>
+      </w:r>
+    </w:p>
+    <w:p>
+      <w:pPr>
         <w:rPr>
           <w:lang w:val="en-US"/>
         </w:rPr>
-        <w:t>TABLE:ERROR</w:t>
-      </w:r>
-      <w:proofErr w:type="gramEnd"/>
-      <w:r>
+      </w:pPr>
+    </w:p>
+    <w:p>
+      <w:pPr>
         <w:rPr>
           <w:lang w:val="en-US"/>
         </w:rPr>
-        <w:t>_</w:t>
-      </w:r>
+      </w:pPr>
       <w:r>
         <w:rPr>
           <w:lang w:val="en-US"/>
         </w:rPr>
-        <w:t>CODE_</w:t>
-      </w:r>
-      <w:r>
+        <w:t>{{top_error_code_frequency}}</w:t>
+      </w:r>
+    </w:p>
+    <w:p>
+      <w:pPr>
         <w:rPr>
           <w:lang w:val="en-US"/>
         </w:rPr>
-        <w:t>PARETO_</w:t>
-      </w:r>
+      </w:pPr>
       <w:r>
         <w:rPr>
           <w:lang w:val="en-US"/>
         </w:rPr>
-        <w:t>DURATION</w:t>
-      </w:r>
-      <w:r>
-        <w:rPr>
-          <w:lang w:val="en-US"/>
-        </w:rPr>
-        <w:t>]</w:t>
-      </w:r>
-    </w:p>
-    <w:p>
-      <w:pPr>
-        <w:rPr>
-          <w:lang w:val="en-US"/>
-        </w:rPr>
-      </w:pPr>
-      <w:r>
-        <w:rPr>
-          <w:lang w:val="en-US"/>
-        </w:rPr>
-        <w:t>{{</w:t>
-      </w:r>
-      <w:proofErr w:type="spellStart"/>
-      <w:r>
-        <w:rPr>
-          <w:lang w:val="en-US"/>
-        </w:rPr>
-        <w:t>top_error_code_frequency</w:t>
-      </w:r>
-      <w:proofErr w:type="spellEnd"/>
-      <w:r>
-        <w:rPr>
-          <w:lang w:val="en-US"/>
-        </w:rPr>
-        <w:t>}}</w:t>
-      </w:r>
-    </w:p>
-    <w:p>
-      <w:pPr>
-        <w:rPr>
-          <w:lang w:val="en-US"/>
-        </w:rPr>
-      </w:pPr>
-      <w:r>
-        <w:rPr>
-          <w:lang w:val="en-US"/>
-        </w:rPr>
-        <w:t>{{</w:t>
-      </w:r>
-      <w:proofErr w:type="spellStart"/>
-      <w:r>
-        <w:rPr>
-          <w:lang w:val="en-US"/>
-        </w:rPr>
-        <w:t>treemap_error_code</w:t>
-      </w:r>
-      <w:proofErr w:type="spellEnd"/>
-      <w:r>
-        <w:rPr>
-          <w:lang w:val="en-US"/>
-        </w:rPr>
-        <w:t>}}</w:t>
+        <w:t>{{treemap_error_code}}</w:t>
       </w:r>
     </w:p>
     <w:p>
@@ -3171,23 +2590,7 @@
     </w:p>
     <w:p>
       <w:r>
-        <w:t>L’analyse de la direction du vent vise à vérifier la cohérence des mesures directionnelles entre les éoliennes, ainsi que leur alignement avec une référence externe, afin de détecter d’éventuels défauts d’orientation (</w:t>
-      </w:r>
-      <w:proofErr w:type="spellStart"/>
-      <w:r>
-        <w:t>yaw</w:t>
-      </w:r>
-      <w:proofErr w:type="spellEnd"/>
-      <w:r>
-        <w:t xml:space="preserve"> </w:t>
-      </w:r>
-      <w:proofErr w:type="spellStart"/>
-      <w:r>
-        <w:t>misalignment</w:t>
-      </w:r>
-      <w:proofErr w:type="spellEnd"/>
-      <w:r>
-        <w:t>).</w:t>
+        <w:t>L’analyse de la direction du vent vise à vérifier la cohérence des mesures directionnelles entre les éoliennes, ainsi que leur alignement avec une référence externe, afin de détecter d’éventuels défauts d’orientation (yaw misalignment).</w:t>
       </w:r>
     </w:p>
     <w:p>
@@ -3243,7 +2646,6 @@
     <w:p/>
     <w:p>
       <w:r>
-        <w:lastRenderedPageBreak/>
         <w:t>Les figures ci-après présentent les roses des vents pour chaque éolienne sur les périodes communes, ainsi que les biais directionnels moyens calculés, en relatif entre éoliennes et par rapport à la référence externe.</w:t>
       </w:r>
     </w:p>
@@ -3257,21 +2659,20 @@
         <w:rPr>
           <w:lang w:val="en-US"/>
         </w:rPr>
-        <w:t>[</w:t>
-      </w:r>
-      <w:proofErr w:type="gramStart"/>
-      <w:r>
+        <w:t>[TABLE:TIP_SPEED_RATIO_TABLE]</w:t>
+      </w:r>
+    </w:p>
+    <w:p>
+      <w:pPr>
         <w:rPr>
           <w:lang w:val="en-US"/>
         </w:rPr>
-        <w:t>TABLE:TIP</w:t>
-      </w:r>
-      <w:proofErr w:type="gramEnd"/>
+      </w:pPr>
       <w:r>
         <w:rPr>
           <w:lang w:val="en-US"/>
         </w:rPr>
-        <w:t>_SPEED_RATIO_TABLE]</w:t>
+        <w:t>{{wind_direction_calibration}}</w:t>
       </w:r>
     </w:p>
     <w:p>
@@ -3284,66 +2685,17 @@
         <w:rPr>
           <w:lang w:val="en-US"/>
         </w:rPr>
-        <w:t>{{</w:t>
-      </w:r>
-      <w:proofErr w:type="spellStart"/>
-      <w:r>
+        <w:t>{{power_rose_chart}}</w:t>
+      </w:r>
+    </w:p>
+    <w:p>
+      <w:pPr>
         <w:rPr>
           <w:lang w:val="en-US"/>
         </w:rPr>
-        <w:t>wind_direction_calibration</w:t>
-      </w:r>
-      <w:proofErr w:type="spellEnd"/>
-      <w:r>
-        <w:rPr>
-          <w:lang w:val="en-US"/>
-        </w:rPr>
-        <w:t>}}</w:t>
-      </w:r>
-    </w:p>
-    <w:p>
-      <w:pPr>
-        <w:rPr>
-          <w:lang w:val="en-US"/>
-        </w:rPr>
-      </w:pPr>
-      <w:r>
-        <w:rPr>
-          <w:lang w:val="en-US"/>
-        </w:rPr>
-        <w:t>{{</w:t>
-      </w:r>
-      <w:proofErr w:type="spellStart"/>
-      <w:r>
-        <w:rPr>
-          <w:lang w:val="en-US"/>
-        </w:rPr>
-        <w:t>power_rose_chart</w:t>
-      </w:r>
-      <w:proofErr w:type="spellEnd"/>
-      <w:r>
-        <w:rPr>
-          <w:lang w:val="en-US"/>
-        </w:rPr>
-        <w:t>}}</w:t>
-      </w:r>
-    </w:p>
-    <w:p>
-      <w:pPr>
-        <w:rPr>
-          <w:lang w:val="en-US"/>
-        </w:rPr>
-      </w:pPr>
-      <w:r>
-        <w:t>{{</w:t>
-      </w:r>
-      <w:proofErr w:type="spellStart"/>
-      <w:r>
-        <w:t>wind_rose_chart</w:t>
-      </w:r>
-      <w:proofErr w:type="spellEnd"/>
-      <w:r>
-        <w:t>}}</w:t>
+      </w:pPr>
+      <w:r>
+        <w:t>{{wind_rose_chart}}</w:t>
       </w:r>
     </w:p>
     <w:p>
@@ -3430,15 +2782,7 @@
         <w:t>Exclusion</w:t>
       </w:r>
       <w:r>
-        <w:t xml:space="preserve"> des situations de sillage (wake </w:t>
-      </w:r>
-      <w:proofErr w:type="spellStart"/>
-      <w:r>
-        <w:t>effect</w:t>
-      </w:r>
-      <w:proofErr w:type="spellEnd"/>
-      <w:r>
-        <w:t xml:space="preserve">), </w:t>
+        <w:t xml:space="preserve"> des situations de sillage (wake effect), </w:t>
       </w:r>
     </w:p>
     <w:p>
@@ -3490,6 +2834,9 @@
       <w:r>
         <w:t>La correction de densité est réalisée par rapport à la densité d'air standard de référence de 1.225 kg/m³</w:t>
       </w:r>
+      <w:r>
+        <w:t>.</w:t>
+      </w:r>
     </w:p>
     <w:p>
       <w:pPr>
@@ -3501,21 +2848,21 @@
         <w:rPr>
           <w:lang w:val="en-US"/>
         </w:rPr>
-        <w:t>[</w:t>
-      </w:r>
-      <w:proofErr w:type="gramStart"/>
+        <w:t>[TABLE:NORMATIVE_YIELD_TABLE]</w:t>
+      </w:r>
+    </w:p>
+    <w:p>
       <w:r>
         <w:rPr>
           <w:lang w:val="en-US"/>
         </w:rPr>
-        <w:t>TABLE:NORMATIVE</w:t>
-      </w:r>
-      <w:proofErr w:type="gramEnd"/>
-      <w:r>
-        <w:rPr>
-          <w:lang w:val="en-US"/>
-        </w:rPr>
-        <w:t>_YIELD_TABLE]</w:t>
+        <w:t>{{</w:t>
+      </w:r>
+      <w:r>
+        <w:t>power_curve_chart</w:t>
+      </w:r>
+      <w:r>
+        <w:t>}}</w:t>
       </w:r>
     </w:p>
     <w:p>
@@ -3562,13 +2909,8 @@
           <w:numId w:val="13"/>
         </w:numPr>
       </w:pPr>
-      <w:proofErr w:type="gramStart"/>
-      <w:r>
-        <w:t>les</w:t>
-      </w:r>
-      <w:proofErr w:type="gramEnd"/>
-      <w:r>
-        <w:t xml:space="preserve"> périodes de limitations environnementales (bruit, chauves-souris, ombrage, etc.), </w:t>
+      <w:r>
+        <w:t xml:space="preserve">les périodes de limitations environnementales (bruit, chauves-souris, ombrage, etc.), </w:t>
       </w:r>
     </w:p>
     <w:p>
@@ -3579,13 +2921,8 @@
           <w:numId w:val="13"/>
         </w:numPr>
       </w:pPr>
-      <w:proofErr w:type="gramStart"/>
-      <w:r>
-        <w:t>les</w:t>
-      </w:r>
-      <w:proofErr w:type="gramEnd"/>
-      <w:r>
-        <w:t xml:space="preserve"> phases de démarrage et d’arrêt, </w:t>
+      <w:r>
+        <w:t xml:space="preserve">les phases de démarrage et d’arrêt, </w:t>
       </w:r>
     </w:p>
     <w:p>
@@ -3596,18 +2933,13 @@
           <w:numId w:val="13"/>
         </w:numPr>
       </w:pPr>
-      <w:proofErr w:type="gramStart"/>
-      <w:r>
-        <w:t>les</w:t>
-      </w:r>
-      <w:proofErr w:type="gramEnd"/>
-      <w:r>
-        <w:t xml:space="preserve"> situations transitoires ou non représentatives du fonctionnement normal. </w:t>
-      </w:r>
-    </w:p>
-    <w:p>
       <w:r>
         <w:lastRenderedPageBreak/>
+        <w:t xml:space="preserve">les situations transitoires ou non représentatives du fonctionnement normal. </w:t>
+      </w:r>
+    </w:p>
+    <w:p>
+      <w:r>
         <w:t xml:space="preserve">L’analyse est réalisée sur l’ensemble de la période d’étude, avec une visualisation de l’évolution </w:t>
       </w:r>
       <w:r>
@@ -3642,11 +2974,9 @@
         </w:rPr>
         <w:t>{{</w:t>
       </w:r>
-      <w:proofErr w:type="spellStart"/>
       <w:r>
         <w:t>rpm_chart</w:t>
       </w:r>
-      <w:proofErr w:type="spellEnd"/>
       <w:r>
         <w:rPr>
           <w:lang w:val="en-US"/>
@@ -3791,15 +3121,7 @@
     </w:p>
     <w:p>
       <w:r>
-        <w:t xml:space="preserve">En complément de l'analyse comparative des courbes de puissance, une analyse individuelle de chaque éolienne est réalisée à partir des données SCADA brutes, sous forme de nuages de points. Cette approche vise à détecter d'éventuelles limitations de production non prévues, non nécessairement visibles dans une comparaison inter-éoliennes. Elle permet notamment d'identifier des situations de </w:t>
-      </w:r>
-      <w:proofErr w:type="spellStart"/>
-      <w:r>
-        <w:t>curtailment</w:t>
-      </w:r>
-      <w:proofErr w:type="spellEnd"/>
-      <w:r>
-        <w:t xml:space="preserve"> inattendu, visibles à travers des regroupements de points (clusters) s'écartant de la courbe de puissance nominale attendue. L'analyse repose sur la représentation de la puissance active en fonction de la vitesse du vent sous forme de nuages de points. Afin de représenter le comportement nominal des éoliennes, les données sont filtrées pour exclure :</w:t>
+        <w:t>En complément de l'analyse comparative des courbes de puissance, une analyse individuelle de chaque éolienne est réalisée à partir des données SCADA brutes, sous forme de nuages de points. Cette approche vise à détecter d'éventuelles limitations de production non prévues, non nécessairement visibles dans une comparaison inter-éoliennes. Elle permet notamment d'identifier des situations de curtailment inattendu, visibles à travers des regroupements de points (clusters) s'écartant de la courbe de puissance nominale attendue. L'analyse repose sur la représentation de la puissance active en fonction de la vitesse du vent sous forme de nuages de points. Afin de représenter le comportement nominal des éoliennes, les données sont filtrées pour exclure :</w:t>
       </w:r>
     </w:p>
     <w:p>
@@ -3810,13 +3132,8 @@
           <w:numId w:val="15"/>
         </w:numPr>
       </w:pPr>
-      <w:proofErr w:type="gramStart"/>
-      <w:r>
-        <w:t>les</w:t>
-      </w:r>
-      <w:proofErr w:type="gramEnd"/>
-      <w:r>
-        <w:t xml:space="preserve"> périodes de limitations environnementales (bruit, chauves-souris, ombrage, etc.), </w:t>
+      <w:r>
+        <w:t xml:space="preserve">les périodes de limitations environnementales (bruit, chauves-souris, ombrage, etc.), </w:t>
       </w:r>
     </w:p>
     <w:p>
@@ -3827,13 +3144,8 @@
           <w:numId w:val="15"/>
         </w:numPr>
       </w:pPr>
-      <w:proofErr w:type="gramStart"/>
-      <w:r>
-        <w:t>les</w:t>
-      </w:r>
-      <w:proofErr w:type="gramEnd"/>
-      <w:r>
-        <w:t xml:space="preserve"> phases de démarrage et d'arrêt,</w:t>
+      <w:r>
+        <w:t>les phases de démarrage et d'arrêt,</w:t>
       </w:r>
     </w:p>
     <w:p>
@@ -3844,13 +3156,8 @@
           <w:numId w:val="15"/>
         </w:numPr>
       </w:pPr>
-      <w:proofErr w:type="gramStart"/>
-      <w:r>
-        <w:t>ainsi</w:t>
-      </w:r>
-      <w:proofErr w:type="gramEnd"/>
-      <w:r>
-        <w:t xml:space="preserve"> que les situations non représentatives du fonctionnement normal. </w:t>
+      <w:r>
+        <w:t xml:space="preserve">ainsi que les situations non représentatives du fonctionnement normal. </w:t>
       </w:r>
     </w:p>
     <w:p>
@@ -3859,14 +3166,9 @@
       </w:r>
     </w:p>
     <w:p>
-      <w:proofErr w:type="gramStart"/>
       <w:r>
         <w:lastRenderedPageBreak/>
-        <w:t>préciser</w:t>
-      </w:r>
-      <w:proofErr w:type="gramEnd"/>
-      <w:r>
-        <w:t xml:space="preserve"> quelle éolienne est présentée dans le corps du rapport et lesquelles sont renvoyées en annexe, cohérence à maintenir avec l'analyse comparative des courbes de puissance. Dans l'étude de référence, E9 est présentée dans le corps du rapport.]</w:t>
+        <w:t>préciser quelle éolienne est présentée dans le corps du rapport et lesquelles sont renvoyées en annexe, cohérence à maintenir avec l'analyse comparative des courbes de puissance. Dans l'étude de référence, E9 est présentée dans le corps du rapport.]</w:t>
       </w:r>
     </w:p>
     <w:p>
@@ -3928,15 +3230,7 @@
         <w:pStyle w:val="Titre2"/>
       </w:pPr>
       <w:r>
-        <w:t xml:space="preserve">Disponibilité temporelle (Time-Based </w:t>
-      </w:r>
-      <w:proofErr w:type="spellStart"/>
-      <w:r>
-        <w:t>Availability</w:t>
-      </w:r>
-      <w:proofErr w:type="spellEnd"/>
-      <w:r>
-        <w:t xml:space="preserve"> – TBA)</w:t>
+        <w:t>Disponibilité temporelle (Time-Based Availability – TBA)</w:t>
       </w:r>
     </w:p>
     <w:p>
@@ -6404,7 +5698,6 @@
   <w:style w:type="character" w:default="1" w:styleId="Policepardfaut">
     <w:name w:val="Default Paragraph Font"/>
     <w:uiPriority w:val="1"/>
-    <w:semiHidden/>
     <w:unhideWhenUsed/>
   </w:style>
   <w:style w:type="table" w:default="1" w:styleId="TableauNormal">

</xml_diff>

<commit_message>
[CHANGE] change the code to better analyze pitch parts
</commit_message>
<xml_diff>
--- a/assets/templates/template_scada.docx
+++ b/assets/templates/template_scada.docx
@@ -315,8 +315,17 @@
                 <w:b/>
                 <w:bCs/>
               </w:rPr>
-              <w:t>Date d’émission</w:t>
+              <w:t xml:space="preserve">Date </w:t>
             </w:r>
+            <w:proofErr w:type="spellStart"/>
+            <w:r>
+              <w:rPr>
+                <w:b/>
+                <w:bCs/>
+              </w:rPr>
+              <w:t>d’émission</w:t>
+            </w:r>
+            <w:proofErr w:type="spellEnd"/>
           </w:p>
         </w:tc>
         <w:tc>
@@ -352,6 +361,7 @@
                 <w:bCs/>
               </w:rPr>
             </w:pPr>
+            <w:proofErr w:type="spellStart"/>
             <w:r>
               <w:rPr>
                 <w:b/>
@@ -359,6 +369,7 @@
               </w:rPr>
               <w:t>Rédacteur</w:t>
             </w:r>
+            <w:proofErr w:type="spellEnd"/>
           </w:p>
         </w:tc>
         <w:tc>
@@ -373,6 +384,7 @@
                 <w:bCs/>
               </w:rPr>
             </w:pPr>
+            <w:proofErr w:type="spellStart"/>
             <w:r>
               <w:rPr>
                 <w:b/>
@@ -380,6 +392,7 @@
               </w:rPr>
               <w:t>Vérificateur</w:t>
             </w:r>
+            <w:proofErr w:type="spellEnd"/>
           </w:p>
         </w:tc>
         <w:tc>
@@ -394,6 +407,7 @@
                 <w:bCs/>
               </w:rPr>
             </w:pPr>
+            <w:proofErr w:type="spellStart"/>
             <w:r>
               <w:rPr>
                 <w:b/>
@@ -401,6 +415,7 @@
               </w:rPr>
               <w:t>Approbateur</w:t>
             </w:r>
+            <w:proofErr w:type="spellEnd"/>
           </w:p>
         </w:tc>
       </w:tr>
@@ -974,9 +989,11 @@
         <w:lastRenderedPageBreak/>
         <w:t>Nom du parc : {{</w:t>
       </w:r>
+      <w:proofErr w:type="spellStart"/>
       <w:r>
         <w:t>park_name</w:t>
       </w:r>
+      <w:proofErr w:type="spellEnd"/>
       <w:r>
         <w:t xml:space="preserve">}} </w:t>
       </w:r>
@@ -985,31 +1002,43 @@
       <w:r>
         <w:t>Type d’éoliennes : {{</w:t>
       </w:r>
+      <w:proofErr w:type="spellStart"/>
       <w:r>
         <w:t>model_wtg</w:t>
       </w:r>
+      <w:proofErr w:type="spellEnd"/>
       <w:r>
         <w:t xml:space="preserve">}} </w:t>
       </w:r>
     </w:p>
     <w:p>
       <w:r>
-        <w:t>Nombre d’éoliennes : {{N</w:t>
+        <w:t>Nombre d’éoliennes : {{</w:t>
+      </w:r>
+      <w:proofErr w:type="spellStart"/>
+      <w:r>
+        <w:t>N</w:t>
       </w:r>
       <w:r>
         <w:t>ombre</w:t>
       </w:r>
       <w:r>
-        <w:t xml:space="preserve">_WTG}} </w:t>
+        <w:t>_WTG</w:t>
+      </w:r>
+      <w:proofErr w:type="spellEnd"/>
+      <w:r>
+        <w:t xml:space="preserve">}} </w:t>
       </w:r>
     </w:p>
     <w:p>
       <w:r>
         <w:t>Puissance totale installée : {{</w:t>
       </w:r>
+      <w:proofErr w:type="spellStart"/>
       <w:r>
         <w:t>nominal_power</w:t>
       </w:r>
+      <w:proofErr w:type="spellEnd"/>
       <w:r>
         <w:t xml:space="preserve">}} </w:t>
       </w:r>
@@ -1046,8 +1075,13 @@
       </w:r>
     </w:p>
     <w:p>
-      <w:r>
-        <w:t>Email : {{MAIL_AUTEUR}}</w:t>
+      <w:proofErr w:type="gramStart"/>
+      <w:r>
+        <w:t>Email</w:t>
+      </w:r>
+      <w:proofErr w:type="gramEnd"/>
+      <w:r>
+        <w:t xml:space="preserve"> : {{MAIL_AUTEUR}}</w:t>
       </w:r>
     </w:p>
     <w:p>
@@ -1067,8 +1101,13 @@
       </w:r>
     </w:p>
     <w:p>
-      <w:r>
-        <w:t>Email : {{MAIL_VERIFICATEUR}}</w:t>
+      <w:proofErr w:type="gramStart"/>
+      <w:r>
+        <w:t>Email</w:t>
+      </w:r>
+      <w:proofErr w:type="gramEnd"/>
+      <w:r>
+        <w:t xml:space="preserve"> : {{MAIL_VERIFICATEUR}}</w:t>
       </w:r>
     </w:p>
     <w:p>
@@ -1088,8 +1127,13 @@
       </w:r>
     </w:p>
     <w:p>
-      <w:r>
-        <w:t>Email : {{MAIL_APPROBATEUR}}</w:t>
+      <w:proofErr w:type="gramStart"/>
+      <w:r>
+        <w:t>Email</w:t>
+      </w:r>
+      <w:proofErr w:type="gramEnd"/>
+      <w:r>
+        <w:t xml:space="preserve"> : {{MAIL_APPROBATEUR}}</w:t>
       </w:r>
     </w:p>
     <w:p>
@@ -1123,25 +1167,57 @@
         <w:t xml:space="preserve">Les données SCADA du parc éolien </w:t>
       </w:r>
       <w:r>
-        <w:t>{{park_name}}</w:t>
+        <w:t>{{</w:t>
+      </w:r>
+      <w:proofErr w:type="spellStart"/>
+      <w:r>
+        <w:t>park_name</w:t>
+      </w:r>
+      <w:proofErr w:type="spellEnd"/>
+      <w:r>
+        <w:t>}}</w:t>
       </w:r>
       <w:r>
         <w:t xml:space="preserve"> ont été analysées sur la période du </w:t>
       </w:r>
       <w:r>
-        <w:t>{{analysis_start}}</w:t>
+        <w:t>{{</w:t>
+      </w:r>
+      <w:proofErr w:type="spellStart"/>
+      <w:r>
+        <w:t>analysis_start</w:t>
+      </w:r>
+      <w:proofErr w:type="spellEnd"/>
+      <w:r>
+        <w:t>}}</w:t>
       </w:r>
       <w:r>
         <w:t xml:space="preserve"> au </w:t>
       </w:r>
       <w:r>
-        <w:t>{{analysis_end}}</w:t>
+        <w:t>{{</w:t>
+      </w:r>
+      <w:proofErr w:type="spellStart"/>
+      <w:r>
+        <w:t>analysis_end</w:t>
+      </w:r>
+      <w:proofErr w:type="spellEnd"/>
+      <w:r>
+        <w:t>}}</w:t>
       </w:r>
       <w:r>
         <w:t xml:space="preserve">, à partir des informations fournies par le client. Le parc est composé de </w:t>
       </w:r>
       <w:r>
-        <w:t>{{turbine_count}}</w:t>
+        <w:t>{{</w:t>
+      </w:r>
+      <w:proofErr w:type="spellStart"/>
+      <w:r>
+        <w:t>turbine_count</w:t>
+      </w:r>
+      <w:proofErr w:type="spellEnd"/>
+      <w:r>
+        <w:t>}}</w:t>
       </w:r>
       <w:r>
         <w:t xml:space="preserve"> éoliennes de type</w:t>
@@ -1150,16 +1226,32 @@
         <w:t xml:space="preserve"> </w:t>
       </w:r>
       <w:r>
-        <w:t>{{model_wtg}</w:t>
-      </w:r>
+        <w:t>{{</w:t>
+      </w:r>
+      <w:proofErr w:type="spellStart"/>
+      <w:r>
+        <w:t>model_wtg</w:t>
+      </w:r>
+      <w:proofErr w:type="spellEnd"/>
       <w:r>
         <w:t>}</w:t>
       </w:r>
       <w:r>
+        <w:t>}</w:t>
+      </w:r>
+      <w:r>
         <w:t xml:space="preserve">, désignées </w:t>
       </w:r>
       <w:r>
-        <w:t>{{turbine_list}}</w:t>
+        <w:t>{{</w:t>
+      </w:r>
+      <w:proofErr w:type="spellStart"/>
+      <w:r>
+        <w:t>turbine_list</w:t>
+      </w:r>
+      <w:proofErr w:type="spellEnd"/>
+      <w:r>
+        <w:t>}}</w:t>
       </w:r>
       <w:r>
         <w:t xml:space="preserve"> L’ensemble des turbines a été pris en compte dans l’analyse.</w:t>
@@ -1181,13 +1273,21 @@
     <w:p/>
     <w:p>
       <w:r>
-        <w:t>[T</w:t>
+        <w:t>[</w:t>
+      </w:r>
+      <w:proofErr w:type="gramStart"/>
+      <w:r>
+        <w:t>T</w:t>
       </w:r>
       <w:r>
         <w:t>ODO</w:t>
       </w:r>
       <w:r>
-        <w:t>:SCADA_SUMMARY_TABLE]</w:t>
+        <w:t>:SCADA</w:t>
+      </w:r>
+      <w:proofErr w:type="gramEnd"/>
+      <w:r>
+        <w:t>_SUMMARY_TABLE]</w:t>
       </w:r>
     </w:p>
     <w:p>
@@ -1213,35 +1313,56 @@
       <w:r>
         <w:t>Le parc éolien {{</w:t>
       </w:r>
+      <w:proofErr w:type="spellStart"/>
       <w:r>
         <w:t>park_name</w:t>
       </w:r>
+      <w:proofErr w:type="spellEnd"/>
       <w:r>
         <w:t>}} est situé sur le territoire des communes de {{COMMUNES}}, dans la région de {{REGION}}. Il est composé de {{</w:t>
       </w:r>
+      <w:proofErr w:type="spellStart"/>
       <w:r>
         <w:t>turbine_count</w:t>
       </w:r>
+      <w:proofErr w:type="spellEnd"/>
       <w:r>
         <w:t>}} éoliennes de type {{</w:t>
       </w:r>
+      <w:proofErr w:type="spellStart"/>
       <w:r>
         <w:t>model_wtg</w:t>
       </w:r>
+      <w:proofErr w:type="spellEnd"/>
       <w:r>
         <w:t>}}, d’une puissance nominale unitaire de {{</w:t>
       </w:r>
+      <w:proofErr w:type="spellStart"/>
       <w:r>
         <w:t>nominal_power</w:t>
       </w:r>
+      <w:proofErr w:type="spellEnd"/>
       <w:r>
         <w:t>}}, soit une puissance totale installée de {{</w:t>
       </w:r>
-      <w:r>
-        <w:t xml:space="preserve">total_power </w:t>
-      </w:r>
-      <w:r>
-        <w:t>}}.</w:t>
+      <w:proofErr w:type="spellStart"/>
+      <w:r>
+        <w:t>total_</w:t>
+      </w:r>
+      <w:proofErr w:type="gramStart"/>
+      <w:r>
+        <w:t>power</w:t>
+      </w:r>
+      <w:proofErr w:type="spellEnd"/>
+      <w:r>
+        <w:t xml:space="preserve"> </w:t>
+      </w:r>
+      <w:r>
+        <w:t>}</w:t>
+      </w:r>
+      <w:proofErr w:type="gramEnd"/>
+      <w:r>
+        <w:t>}.</w:t>
       </w:r>
     </w:p>
     <w:p>
@@ -1251,11 +1372,29 @@
       <w:r>
         <w:t>Les éoliennes du parc sont identifiées comme suit : {{</w:t>
       </w:r>
+      <w:proofErr w:type="spellStart"/>
       <w:r>
         <w:t>turbine_list</w:t>
       </w:r>
-      <w:r>
-        <w:t>}}. L’implantation du parc et la disposition des éoliennes sont présen tées dans la figure ci-</w:t>
+      <w:proofErr w:type="spellEnd"/>
+      <w:r>
+        <w:t xml:space="preserve">}}. L’implantation du parc et la disposition des éoliennes sont </w:t>
+      </w:r>
+      <w:proofErr w:type="spellStart"/>
+      <w:r>
+        <w:t>présen</w:t>
+      </w:r>
+      <w:proofErr w:type="spellEnd"/>
+      <w:r>
+        <w:t xml:space="preserve"> </w:t>
+      </w:r>
+      <w:proofErr w:type="spellStart"/>
+      <w:r>
+        <w:t>tées</w:t>
+      </w:r>
+      <w:proofErr w:type="spellEnd"/>
+      <w:r>
+        <w:t xml:space="preserve"> dans la figure ci-</w:t>
       </w:r>
       <w:r>
         <w:t>après :</w:t>
@@ -1307,13 +1446,21 @@
     </w:p>
     <w:p>
       <w:r>
-        <w:t>[T</w:t>
+        <w:t>[</w:t>
+      </w:r>
+      <w:proofErr w:type="gramStart"/>
+      <w:r>
+        <w:t>T</w:t>
       </w:r>
       <w:r>
         <w:t>ODO</w:t>
       </w:r>
       <w:r>
-        <w:t>:CSV_FILES_TABLE]</w:t>
+        <w:t>:</w:t>
+      </w:r>
+      <w:proofErr w:type="gramEnd"/>
+      <w:r>
+        <w:t>CSV_FILES_TABLE]</w:t>
       </w:r>
     </w:p>
     <w:p>
@@ -1360,6 +1507,7 @@
                 <w:szCs w:val="22"/>
               </w:rPr>
             </w:pPr>
+            <w:proofErr w:type="spellStart"/>
             <w:r>
               <w:rPr>
                 <w:rFonts w:ascii="Cambria" w:eastAsia="MS Mincho" w:hAnsi="Cambria"/>
@@ -1396,6 +1544,7 @@
               </w:rPr>
               <w:t>e</w:t>
             </w:r>
+            <w:proofErr w:type="spellEnd"/>
           </w:p>
         </w:tc>
         <w:tc>
@@ -1419,8 +1568,18 @@
                 <w:sz w:val="22"/>
                 <w:szCs w:val="22"/>
               </w:rPr>
-              <w:t>Axes d’analyse</w:t>
+              <w:t xml:space="preserve">Axes </w:t>
             </w:r>
+            <w:proofErr w:type="spellStart"/>
+            <w:r>
+              <w:rPr>
+                <w:rFonts w:ascii="Cambria" w:eastAsia="MS Mincho" w:hAnsi="Cambria"/>
+                <w:sz w:val="22"/>
+                <w:szCs w:val="22"/>
+              </w:rPr>
+              <w:t>d’analyse</w:t>
+            </w:r>
+            <w:proofErr w:type="spellEnd"/>
           </w:p>
         </w:tc>
       </w:tr>
@@ -1440,13 +1599,23 @@
                 <w:szCs w:val="22"/>
               </w:rPr>
             </w:pPr>
+            <w:proofErr w:type="spellStart"/>
             <w:r>
               <w:rPr>
                 <w:rFonts w:ascii="Cambria" w:eastAsia="MS Mincho" w:hAnsi="Cambria"/>
                 <w:sz w:val="22"/>
                 <w:szCs w:val="22"/>
               </w:rPr>
-              <w:t>Qualité des données</w:t>
+              <w:t>Qualité</w:t>
+            </w:r>
+            <w:proofErr w:type="spellEnd"/>
+            <w:r>
+              <w:rPr>
+                <w:rFonts w:ascii="Cambria" w:eastAsia="MS Mincho" w:hAnsi="Cambria"/>
+                <w:sz w:val="22"/>
+                <w:szCs w:val="22"/>
+              </w:rPr>
+              <w:t xml:space="preserve"> des données</w:t>
             </w:r>
           </w:p>
         </w:tc>
@@ -1530,8 +1699,18 @@
                 <w:sz w:val="22"/>
                 <w:szCs w:val="22"/>
               </w:rPr>
-              <w:t>Production et disponibilité</w:t>
+              <w:t xml:space="preserve">Production et </w:t>
             </w:r>
+            <w:proofErr w:type="spellStart"/>
+            <w:r>
+              <w:rPr>
+                <w:rFonts w:ascii="Cambria" w:eastAsia="MS Mincho" w:hAnsi="Cambria"/>
+                <w:sz w:val="22"/>
+                <w:szCs w:val="22"/>
+              </w:rPr>
+              <w:t>disponibilité</w:t>
+            </w:r>
+            <w:proofErr w:type="spellEnd"/>
           </w:p>
         </w:tc>
         <w:tc>
@@ -1553,14 +1732,52 @@
                 <w:szCs w:val="22"/>
               </w:rPr>
             </w:pPr>
+            <w:proofErr w:type="spellStart"/>
             <w:r>
               <w:rPr>
                 <w:rFonts w:ascii="Cambria" w:eastAsia="MS Mincho" w:hAnsi="Cambria"/>
                 <w:sz w:val="22"/>
                 <w:szCs w:val="22"/>
               </w:rPr>
-              <w:t>Calcul de la disponibilité énergétique</w:t>
+              <w:t>Calcul</w:t>
             </w:r>
+            <w:proofErr w:type="spellEnd"/>
+            <w:r>
+              <w:rPr>
+                <w:rFonts w:ascii="Cambria" w:eastAsia="MS Mincho" w:hAnsi="Cambria"/>
+                <w:sz w:val="22"/>
+                <w:szCs w:val="22"/>
+              </w:rPr>
+              <w:t xml:space="preserve"> de la </w:t>
+            </w:r>
+            <w:proofErr w:type="spellStart"/>
+            <w:r>
+              <w:rPr>
+                <w:rFonts w:ascii="Cambria" w:eastAsia="MS Mincho" w:hAnsi="Cambria"/>
+                <w:sz w:val="22"/>
+                <w:szCs w:val="22"/>
+              </w:rPr>
+              <w:t>disponibilité</w:t>
+            </w:r>
+            <w:proofErr w:type="spellEnd"/>
+            <w:r>
+              <w:rPr>
+                <w:rFonts w:ascii="Cambria" w:eastAsia="MS Mincho" w:hAnsi="Cambria"/>
+                <w:sz w:val="22"/>
+                <w:szCs w:val="22"/>
+              </w:rPr>
+              <w:t xml:space="preserve"> </w:t>
+            </w:r>
+            <w:proofErr w:type="spellStart"/>
+            <w:r>
+              <w:rPr>
+                <w:rFonts w:ascii="Cambria" w:eastAsia="MS Mincho" w:hAnsi="Cambria"/>
+                <w:sz w:val="22"/>
+                <w:szCs w:val="22"/>
+              </w:rPr>
+              <w:t>énergétique</w:t>
+            </w:r>
+            <w:proofErr w:type="spellEnd"/>
           </w:p>
           <w:p>
             <w:pPr>
@@ -1577,14 +1794,52 @@
                 <w:szCs w:val="22"/>
               </w:rPr>
             </w:pPr>
+            <w:proofErr w:type="spellStart"/>
             <w:r>
               <w:rPr>
                 <w:rFonts w:ascii="Cambria" w:eastAsia="MS Mincho" w:hAnsi="Cambria"/>
                 <w:sz w:val="22"/>
                 <w:szCs w:val="22"/>
               </w:rPr>
-              <w:t>Calcul de la disponibilité temporelle</w:t>
+              <w:t>Calcul</w:t>
             </w:r>
+            <w:proofErr w:type="spellEnd"/>
+            <w:r>
+              <w:rPr>
+                <w:rFonts w:ascii="Cambria" w:eastAsia="MS Mincho" w:hAnsi="Cambria"/>
+                <w:sz w:val="22"/>
+                <w:szCs w:val="22"/>
+              </w:rPr>
+              <w:t xml:space="preserve"> de la </w:t>
+            </w:r>
+            <w:proofErr w:type="spellStart"/>
+            <w:r>
+              <w:rPr>
+                <w:rFonts w:ascii="Cambria" w:eastAsia="MS Mincho" w:hAnsi="Cambria"/>
+                <w:sz w:val="22"/>
+                <w:szCs w:val="22"/>
+              </w:rPr>
+              <w:t>disponibilité</w:t>
+            </w:r>
+            <w:proofErr w:type="spellEnd"/>
+            <w:r>
+              <w:rPr>
+                <w:rFonts w:ascii="Cambria" w:eastAsia="MS Mincho" w:hAnsi="Cambria"/>
+                <w:sz w:val="22"/>
+                <w:szCs w:val="22"/>
+              </w:rPr>
+              <w:t xml:space="preserve"> </w:t>
+            </w:r>
+            <w:proofErr w:type="spellStart"/>
+            <w:r>
+              <w:rPr>
+                <w:rFonts w:ascii="Cambria" w:eastAsia="MS Mincho" w:hAnsi="Cambria"/>
+                <w:sz w:val="22"/>
+                <w:szCs w:val="22"/>
+              </w:rPr>
+              <w:t>temporelle</w:t>
+            </w:r>
+            <w:proofErr w:type="spellEnd"/>
           </w:p>
           <w:p>
             <w:pPr>
@@ -1656,13 +1911,41 @@
                 <w:szCs w:val="22"/>
               </w:rPr>
             </w:pPr>
+            <w:proofErr w:type="spellStart"/>
             <w:r>
               <w:rPr>
                 <w:rFonts w:ascii="Cambria" w:eastAsia="MS Mincho" w:hAnsi="Cambria"/>
                 <w:sz w:val="22"/>
                 <w:szCs w:val="22"/>
               </w:rPr>
-              <w:t>Bridages (si applicable)</w:t>
+              <w:t>Bridages</w:t>
+            </w:r>
+            <w:proofErr w:type="spellEnd"/>
+            <w:r>
+              <w:rPr>
+                <w:rFonts w:ascii="Cambria" w:eastAsia="MS Mincho" w:hAnsi="Cambria"/>
+                <w:sz w:val="22"/>
+                <w:szCs w:val="22"/>
+              </w:rPr>
+              <w:t xml:space="preserve"> (</w:t>
+            </w:r>
+            <w:proofErr w:type="spellStart"/>
+            <w:r>
+              <w:rPr>
+                <w:rFonts w:ascii="Cambria" w:eastAsia="MS Mincho" w:hAnsi="Cambria"/>
+                <w:sz w:val="22"/>
+                <w:szCs w:val="22"/>
+              </w:rPr>
+              <w:t>si</w:t>
+            </w:r>
+            <w:proofErr w:type="spellEnd"/>
+            <w:r>
+              <w:rPr>
+                <w:rFonts w:ascii="Cambria" w:eastAsia="MS Mincho" w:hAnsi="Cambria"/>
+                <w:sz w:val="22"/>
+                <w:szCs w:val="22"/>
+              </w:rPr>
+              <w:t xml:space="preserve"> applicable)</w:t>
             </w:r>
           </w:p>
         </w:tc>
@@ -1772,8 +2055,18 @@
                 <w:sz w:val="22"/>
                 <w:szCs w:val="22"/>
               </w:rPr>
-              <w:t>Performance des éoliennes</w:t>
+              <w:t xml:space="preserve">Performance des </w:t>
             </w:r>
+            <w:proofErr w:type="spellStart"/>
+            <w:r>
+              <w:rPr>
+                <w:rFonts w:ascii="Cambria" w:eastAsia="MS Mincho" w:hAnsi="Cambria"/>
+                <w:sz w:val="22"/>
+                <w:szCs w:val="22"/>
+              </w:rPr>
+              <w:t>éoliennes</w:t>
+            </w:r>
+            <w:proofErr w:type="spellEnd"/>
           </w:p>
         </w:tc>
         <w:tc>
@@ -1823,13 +2116,41 @@
                 <w:szCs w:val="22"/>
               </w:rPr>
             </w:pPr>
+            <w:proofErr w:type="spellStart"/>
             <w:r>
               <w:rPr>
                 <w:rFonts w:ascii="Cambria" w:eastAsia="MS Mincho" w:hAnsi="Cambria"/>
                 <w:sz w:val="22"/>
                 <w:szCs w:val="22"/>
               </w:rPr>
-              <w:t>Analyse du comportement du pitch</w:t>
+              <w:t>Analyse</w:t>
+            </w:r>
+            <w:proofErr w:type="spellEnd"/>
+            <w:r>
+              <w:rPr>
+                <w:rFonts w:ascii="Cambria" w:eastAsia="MS Mincho" w:hAnsi="Cambria"/>
+                <w:sz w:val="22"/>
+                <w:szCs w:val="22"/>
+              </w:rPr>
+              <w:t xml:space="preserve"> du </w:t>
+            </w:r>
+            <w:proofErr w:type="spellStart"/>
+            <w:r>
+              <w:rPr>
+                <w:rFonts w:ascii="Cambria" w:eastAsia="MS Mincho" w:hAnsi="Cambria"/>
+                <w:sz w:val="22"/>
+                <w:szCs w:val="22"/>
+              </w:rPr>
+              <w:t>comportement</w:t>
+            </w:r>
+            <w:proofErr w:type="spellEnd"/>
+            <w:r>
+              <w:rPr>
+                <w:rFonts w:ascii="Cambria" w:eastAsia="MS Mincho" w:hAnsi="Cambria"/>
+                <w:sz w:val="22"/>
+                <w:szCs w:val="22"/>
+              </w:rPr>
+              <w:t xml:space="preserve"> du pitch</w:t>
             </w:r>
           </w:p>
           <w:p>
@@ -1875,13 +2196,23 @@
                 <w:szCs w:val="22"/>
               </w:rPr>
             </w:pPr>
+            <w:proofErr w:type="spellStart"/>
             <w:r>
               <w:rPr>
                 <w:rFonts w:ascii="Cambria" w:eastAsia="MS Mincho" w:hAnsi="Cambria"/>
                 <w:sz w:val="22"/>
                 <w:szCs w:val="22"/>
               </w:rPr>
-              <w:t>Analyse inter-turbines</w:t>
+              <w:t>Analyse</w:t>
+            </w:r>
+            <w:proofErr w:type="spellEnd"/>
+            <w:r>
+              <w:rPr>
+                <w:rFonts w:ascii="Cambria" w:eastAsia="MS Mincho" w:hAnsi="Cambria"/>
+                <w:sz w:val="22"/>
+                <w:szCs w:val="22"/>
+              </w:rPr>
+              <w:t xml:space="preserve"> inter-turbines</w:t>
             </w:r>
           </w:p>
           <w:p>
@@ -1900,13 +2231,41 @@
                 <w:szCs w:val="22"/>
               </w:rPr>
             </w:pPr>
+            <w:proofErr w:type="spellStart"/>
             <w:r>
               <w:rPr>
                 <w:rFonts w:ascii="Cambria" w:eastAsia="MS Mincho" w:hAnsi="Cambria"/>
                 <w:sz w:val="22"/>
                 <w:szCs w:val="22"/>
               </w:rPr>
-              <w:t>Cohérence globale des performances</w:t>
+              <w:t>Cohérence</w:t>
+            </w:r>
+            <w:proofErr w:type="spellEnd"/>
+            <w:r>
+              <w:rPr>
+                <w:rFonts w:ascii="Cambria" w:eastAsia="MS Mincho" w:hAnsi="Cambria"/>
+                <w:sz w:val="22"/>
+                <w:szCs w:val="22"/>
+              </w:rPr>
+              <w:t xml:space="preserve"> </w:t>
+            </w:r>
+            <w:proofErr w:type="spellStart"/>
+            <w:r>
+              <w:rPr>
+                <w:rFonts w:ascii="Cambria" w:eastAsia="MS Mincho" w:hAnsi="Cambria"/>
+                <w:sz w:val="22"/>
+                <w:szCs w:val="22"/>
+              </w:rPr>
+              <w:t>globale</w:t>
+            </w:r>
+            <w:proofErr w:type="spellEnd"/>
+            <w:r>
+              <w:rPr>
+                <w:rFonts w:ascii="Cambria" w:eastAsia="MS Mincho" w:hAnsi="Cambria"/>
+                <w:sz w:val="22"/>
+                <w:szCs w:val="22"/>
+              </w:rPr>
+              <w:t xml:space="preserve"> des performances</w:t>
             </w:r>
           </w:p>
         </w:tc>
@@ -1942,8 +2301,13 @@
           <w:numId w:val="6"/>
         </w:numPr>
       </w:pPr>
-      <w:r>
-        <w:t xml:space="preserve">variables environnementales : </w:t>
+      <w:proofErr w:type="gramStart"/>
+      <w:r>
+        <w:t>variables</w:t>
+      </w:r>
+      <w:proofErr w:type="gramEnd"/>
+      <w:r>
+        <w:t xml:space="preserve"> environnementales : </w:t>
       </w:r>
     </w:p>
     <w:p>
@@ -1954,8 +2318,13 @@
           <w:numId w:val="6"/>
         </w:numPr>
       </w:pPr>
-      <w:r>
-        <w:t xml:space="preserve">vitesse du vent </w:t>
+      <w:proofErr w:type="gramStart"/>
+      <w:r>
+        <w:t>vitesse</w:t>
+      </w:r>
+      <w:proofErr w:type="gramEnd"/>
+      <w:r>
+        <w:t xml:space="preserve"> du vent </w:t>
       </w:r>
     </w:p>
     <w:p>
@@ -1966,8 +2335,13 @@
           <w:numId w:val="6"/>
         </w:numPr>
       </w:pPr>
-      <w:r>
-        <w:t xml:space="preserve">direction du vent </w:t>
+      <w:proofErr w:type="gramStart"/>
+      <w:r>
+        <w:t>direction</w:t>
+      </w:r>
+      <w:proofErr w:type="gramEnd"/>
+      <w:r>
+        <w:t xml:space="preserve"> du vent </w:t>
       </w:r>
     </w:p>
     <w:p>
@@ -1978,8 +2352,13 @@
           <w:numId w:val="6"/>
         </w:numPr>
       </w:pPr>
-      <w:r>
-        <w:t xml:space="preserve">température ambiante </w:t>
+      <w:proofErr w:type="gramStart"/>
+      <w:r>
+        <w:t>température</w:t>
+      </w:r>
+      <w:proofErr w:type="gramEnd"/>
+      <w:r>
+        <w:t xml:space="preserve"> ambiante </w:t>
       </w:r>
     </w:p>
     <w:p>
@@ -1990,8 +2369,13 @@
           <w:numId w:val="6"/>
         </w:numPr>
       </w:pPr>
-      <w:r>
-        <w:t xml:space="preserve">variables opérationnelles clés : </w:t>
+      <w:proofErr w:type="gramStart"/>
+      <w:r>
+        <w:t>variables</w:t>
+      </w:r>
+      <w:proofErr w:type="gramEnd"/>
+      <w:r>
+        <w:t xml:space="preserve"> opérationnelles clés : </w:t>
       </w:r>
     </w:p>
     <w:p>
@@ -2002,8 +2386,13 @@
           <w:numId w:val="6"/>
         </w:numPr>
       </w:pPr>
-      <w:r>
-        <w:t xml:space="preserve">puissance active produite </w:t>
+      <w:proofErr w:type="gramStart"/>
+      <w:r>
+        <w:t>puissance</w:t>
+      </w:r>
+      <w:proofErr w:type="gramEnd"/>
+      <w:r>
+        <w:t xml:space="preserve"> active produite </w:t>
       </w:r>
     </w:p>
     <w:p/>
@@ -2024,13 +2413,29 @@
         <w:t xml:space="preserve">La figure ci-après présente la disponibilité des données SCADA, sur la période allant du </w:t>
       </w:r>
       <w:r>
-        <w:t>{{analysis_start}}</w:t>
+        <w:t>{{</w:t>
+      </w:r>
+      <w:proofErr w:type="spellStart"/>
+      <w:r>
+        <w:t>analysis_start</w:t>
+      </w:r>
+      <w:proofErr w:type="spellEnd"/>
+      <w:r>
+        <w:t>}}</w:t>
       </w:r>
       <w:r>
         <w:t xml:space="preserve"> au </w:t>
       </w:r>
       <w:r>
-        <w:t>{{analysis_end}}</w:t>
+        <w:t>{{</w:t>
+      </w:r>
+      <w:proofErr w:type="spellStart"/>
+      <w:r>
+        <w:t>analysis_end</w:t>
+      </w:r>
+      <w:proofErr w:type="spellEnd"/>
+      <w:r>
+        <w:t>}}</w:t>
       </w:r>
       <w:r>
         <w:t>.</w:t>
@@ -2113,7 +2518,21 @@
         <w:rPr>
           <w:lang w:val="en-US"/>
         </w:rPr>
-        <w:t>{{data_availability_chart}}</w:t>
+        <w:t>{{</w:t>
+      </w:r>
+      <w:proofErr w:type="spellStart"/>
+      <w:r>
+        <w:rPr>
+          <w:lang w:val="en-US"/>
+        </w:rPr>
+        <w:t>data_availability_chart</w:t>
+      </w:r>
+      <w:proofErr w:type="spellEnd"/>
+      <w:r>
+        <w:rPr>
+          <w:lang w:val="en-US"/>
+        </w:rPr>
+        <w:t>}}</w:t>
       </w:r>
     </w:p>
     <w:p>
@@ -2150,7 +2569,23 @@
         </w:numPr>
       </w:pPr>
       <w:r>
-        <w:t>Disponibilité énergétique brute (cut-in / cut-out) : calculée pour les périodes où la vitesse de vent est comprise entre les seuils de démarrage et d’arrêt des éoliennes, en incluant l’ensemble des indisponibilités (arrêts techniques, maintenance, limitations réseau, etc.)</w:t>
+        <w:t>Disponibilité énergétique brute (</w:t>
+      </w:r>
+      <w:proofErr w:type="spellStart"/>
+      <w:r>
+        <w:t>cut</w:t>
+      </w:r>
+      <w:proofErr w:type="spellEnd"/>
+      <w:r>
+        <w:t xml:space="preserve">-in / </w:t>
+      </w:r>
+      <w:proofErr w:type="spellStart"/>
+      <w:r>
+        <w:t>cut</w:t>
+      </w:r>
+      <w:proofErr w:type="spellEnd"/>
+      <w:r>
+        <w:t>-out) : calculée pour les périodes où la vitesse de vent est comprise entre les seuils de démarrage et d’arrêt des éoliennes, en incluant l’ensemble des indisponibilités (arrêts techniques, maintenance, limitations réseau, etc.)</w:t>
       </w:r>
     </w:p>
     <w:p>
@@ -2239,8 +2674,29 @@
           <w:numId w:val="8"/>
         </w:numPr>
       </w:pPr>
-      <w:r>
-        <w:t>la disponibilité énergétique brute (cut-in / cut-out),</w:t>
+      <w:proofErr w:type="gramStart"/>
+      <w:r>
+        <w:t>la</w:t>
+      </w:r>
+      <w:proofErr w:type="gramEnd"/>
+      <w:r>
+        <w:t xml:space="preserve"> disponibilité énergétique brute (</w:t>
+      </w:r>
+      <w:proofErr w:type="spellStart"/>
+      <w:r>
+        <w:t>cut</w:t>
+      </w:r>
+      <w:proofErr w:type="spellEnd"/>
+      <w:r>
+        <w:t xml:space="preserve">-in / </w:t>
+      </w:r>
+      <w:proofErr w:type="spellStart"/>
+      <w:r>
+        <w:t>cut</w:t>
+      </w:r>
+      <w:proofErr w:type="spellEnd"/>
+      <w:r>
+        <w:t>-out),</w:t>
       </w:r>
     </w:p>
     <w:p>
@@ -2251,54 +2707,101 @@
           <w:numId w:val="8"/>
         </w:numPr>
       </w:pPr>
-      <w:r>
-        <w:t>la disponibilité énergétique imputable au fabricant</w:t>
-      </w:r>
-    </w:p>
-    <w:p>
-      <w:pPr>
-        <w:rPr>
-          <w:lang w:val="en-US"/>
-        </w:rPr>
-      </w:pPr>
-      <w:r>
-        <w:rPr>
-          <w:lang w:val="en-US"/>
-        </w:rPr>
-        <w:t>[TABLE:EBA_CUT_IN_CUT_OUT_TABLE]</w:t>
-      </w:r>
-    </w:p>
-    <w:p>
-      <w:pPr>
-        <w:rPr>
-          <w:lang w:val="en-US"/>
-        </w:rPr>
-      </w:pPr>
-      <w:r>
-        <w:rPr>
-          <w:lang w:val="en-US"/>
-        </w:rPr>
-        <w:t>{{eba_cut_in_cut_out_chart}}</w:t>
-      </w:r>
-    </w:p>
-    <w:p>
-      <w:pPr>
-        <w:rPr>
-          <w:lang w:val="en-US"/>
-        </w:rPr>
-      </w:pPr>
-    </w:p>
-    <w:p>
-      <w:pPr>
-        <w:rPr>
-          <w:lang w:val="en-US"/>
-        </w:rPr>
-      </w:pPr>
-      <w:r>
-        <w:rPr>
-          <w:lang w:val="en-US"/>
-        </w:rPr>
-        <w:t>[TABLE:EBA_MANUFACTURER_TABLE]</w:t>
+      <w:proofErr w:type="gramStart"/>
+      <w:r>
+        <w:t>la</w:t>
+      </w:r>
+      <w:proofErr w:type="gramEnd"/>
+      <w:r>
+        <w:t xml:space="preserve"> disponibilité énergétique imputable au fabricant</w:t>
+      </w:r>
+    </w:p>
+    <w:p>
+      <w:pPr>
+        <w:rPr>
+          <w:lang w:val="en-US"/>
+        </w:rPr>
+      </w:pPr>
+      <w:r>
+        <w:rPr>
+          <w:lang w:val="en-US"/>
+        </w:rPr>
+        <w:t>[</w:t>
+      </w:r>
+      <w:proofErr w:type="gramStart"/>
+      <w:r>
+        <w:rPr>
+          <w:lang w:val="en-US"/>
+        </w:rPr>
+        <w:t>TABLE:EBA</w:t>
+      </w:r>
+      <w:proofErr w:type="gramEnd"/>
+      <w:r>
+        <w:rPr>
+          <w:lang w:val="en-US"/>
+        </w:rPr>
+        <w:t>_CUT_IN_CUT_OUT_TABLE]</w:t>
+      </w:r>
+    </w:p>
+    <w:p>
+      <w:pPr>
+        <w:rPr>
+          <w:lang w:val="en-US"/>
+        </w:rPr>
+      </w:pPr>
+      <w:r>
+        <w:rPr>
+          <w:lang w:val="en-US"/>
+        </w:rPr>
+        <w:t>{{</w:t>
+      </w:r>
+      <w:proofErr w:type="spellStart"/>
+      <w:r>
+        <w:rPr>
+          <w:lang w:val="en-US"/>
+        </w:rPr>
+        <w:t>eba_cut_in_cut_out_chart</w:t>
+      </w:r>
+      <w:proofErr w:type="spellEnd"/>
+      <w:r>
+        <w:rPr>
+          <w:lang w:val="en-US"/>
+        </w:rPr>
+        <w:t>}}</w:t>
+      </w:r>
+    </w:p>
+    <w:p>
+      <w:pPr>
+        <w:rPr>
+          <w:lang w:val="en-US"/>
+        </w:rPr>
+      </w:pPr>
+    </w:p>
+    <w:p>
+      <w:pPr>
+        <w:rPr>
+          <w:lang w:val="en-US"/>
+        </w:rPr>
+      </w:pPr>
+      <w:r>
+        <w:rPr>
+          <w:lang w:val="en-US"/>
+        </w:rPr>
+        <w:t>[</w:t>
+      </w:r>
+      <w:proofErr w:type="gramStart"/>
+      <w:r>
+        <w:rPr>
+          <w:lang w:val="en-US"/>
+        </w:rPr>
+        <w:t>TABLE:EBA</w:t>
+      </w:r>
+      <w:proofErr w:type="gramEnd"/>
+      <w:r>
+        <w:rPr>
+          <w:lang w:val="en-US"/>
+        </w:rPr>
+        <w:t>_MANUFACTURER_TABLE]</w:t>
       </w:r>
       <w:r>
         <w:rPr>
@@ -2317,19 +2820,41 @@
         <w:rPr>
           <w:lang w:val="en-US"/>
         </w:rPr>
-        <w:t>{{eba_manifacturer_chart}}</w:t>
-      </w:r>
-    </w:p>
-    <w:p>
-      <w:pPr>
-        <w:rPr>
-          <w:lang w:val="en-US"/>
-        </w:rPr>
-      </w:pPr>
-    </w:p>
-    <w:p>
-      <w:r>
-        <w:t>[TABLE:EBA_LOSS_TABLE]</w:t>
+        <w:t>{{</w:t>
+      </w:r>
+      <w:proofErr w:type="spellStart"/>
+      <w:r>
+        <w:rPr>
+          <w:lang w:val="en-US"/>
+        </w:rPr>
+        <w:t>eba_manifacturer_chart</w:t>
+      </w:r>
+      <w:proofErr w:type="spellEnd"/>
+      <w:r>
+        <w:rPr>
+          <w:lang w:val="en-US"/>
+        </w:rPr>
+        <w:t>}}</w:t>
+      </w:r>
+    </w:p>
+    <w:p>
+      <w:pPr>
+        <w:rPr>
+          <w:lang w:val="en-US"/>
+        </w:rPr>
+      </w:pPr>
+    </w:p>
+    <w:p>
+      <w:r>
+        <w:t>[</w:t>
+      </w:r>
+      <w:proofErr w:type="gramStart"/>
+      <w:r>
+        <w:t>TABLE:EBA</w:t>
+      </w:r>
+      <w:proofErr w:type="gramEnd"/>
+      <w:r>
+        <w:t>_LOSS_TABLE]</w:t>
       </w:r>
     </w:p>
     <w:p>
@@ -2361,7 +2886,21 @@
         <w:rPr>
           <w:lang w:val="en-US"/>
         </w:rPr>
-        <w:t>{{eba_loss_chart}}</w:t>
+        <w:t>{{</w:t>
+      </w:r>
+      <w:proofErr w:type="spellStart"/>
+      <w:r>
+        <w:rPr>
+          <w:lang w:val="en-US"/>
+        </w:rPr>
+        <w:t>eba_loss_chart</w:t>
+      </w:r>
+      <w:proofErr w:type="spellEnd"/>
+      <w:r>
+        <w:rPr>
+          <w:lang w:val="en-US"/>
+        </w:rPr>
+        <w:t>}}</w:t>
       </w:r>
     </w:p>
     <w:p>
@@ -2482,7 +3021,21 @@
         <w:rPr>
           <w:lang w:val="en-US"/>
         </w:rPr>
-        <w:t>[TABLE:ERROR_</w:t>
+        <w:t>[</w:t>
+      </w:r>
+      <w:proofErr w:type="gramStart"/>
+      <w:r>
+        <w:rPr>
+          <w:lang w:val="en-US"/>
+        </w:rPr>
+        <w:t>TABLE:ERROR</w:t>
+      </w:r>
+      <w:proofErr w:type="gramEnd"/>
+      <w:r>
+        <w:rPr>
+          <w:lang w:val="en-US"/>
+        </w:rPr>
+        <w:t>_</w:t>
       </w:r>
       <w:r>
         <w:rPr>
@@ -2514,7 +3067,21 @@
         <w:rPr>
           <w:lang w:val="en-US"/>
         </w:rPr>
-        <w:t>[TABLE:ERROR_</w:t>
+        <w:t>[</w:t>
+      </w:r>
+      <w:proofErr w:type="gramStart"/>
+      <w:r>
+        <w:rPr>
+          <w:lang w:val="en-US"/>
+        </w:rPr>
+        <w:t>TABLE:ERROR</w:t>
+      </w:r>
+      <w:proofErr w:type="gramEnd"/>
+      <w:r>
+        <w:rPr>
+          <w:lang w:val="en-US"/>
+        </w:rPr>
+        <w:t>_</w:t>
       </w:r>
       <w:r>
         <w:rPr>
@@ -2558,20 +3125,48 @@
         <w:rPr>
           <w:lang w:val="en-US"/>
         </w:rPr>
-        <w:t>{{top_error_code_frequency}}</w:t>
-      </w:r>
-    </w:p>
-    <w:p>
-      <w:pPr>
-        <w:rPr>
-          <w:lang w:val="en-US"/>
-        </w:rPr>
-      </w:pPr>
-      <w:r>
-        <w:rPr>
-          <w:lang w:val="en-US"/>
-        </w:rPr>
-        <w:t>{{treemap_error_code}}</w:t>
+        <w:t>{{</w:t>
+      </w:r>
+      <w:proofErr w:type="spellStart"/>
+      <w:r>
+        <w:rPr>
+          <w:lang w:val="en-US"/>
+        </w:rPr>
+        <w:t>top_error_code_frequency</w:t>
+      </w:r>
+      <w:proofErr w:type="spellEnd"/>
+      <w:r>
+        <w:rPr>
+          <w:lang w:val="en-US"/>
+        </w:rPr>
+        <w:t>}}</w:t>
+      </w:r>
+    </w:p>
+    <w:p>
+      <w:pPr>
+        <w:rPr>
+          <w:lang w:val="en-US"/>
+        </w:rPr>
+      </w:pPr>
+      <w:r>
+        <w:rPr>
+          <w:lang w:val="en-US"/>
+        </w:rPr>
+        <w:t>{{</w:t>
+      </w:r>
+      <w:proofErr w:type="spellStart"/>
+      <w:r>
+        <w:rPr>
+          <w:lang w:val="en-US"/>
+        </w:rPr>
+        <w:t>treemap_error_code</w:t>
+      </w:r>
+      <w:proofErr w:type="spellEnd"/>
+      <w:r>
+        <w:rPr>
+          <w:lang w:val="en-US"/>
+        </w:rPr>
+        <w:t>}}</w:t>
       </w:r>
     </w:p>
     <w:p>
@@ -2590,7 +3185,23 @@
     </w:p>
     <w:p>
       <w:r>
-        <w:t>L’analyse de la direction du vent vise à vérifier la cohérence des mesures directionnelles entre les éoliennes, ainsi que leur alignement avec une référence externe, afin de détecter d’éventuels défauts d’orientation (yaw misalignment).</w:t>
+        <w:t>L’analyse de la direction du vent vise à vérifier la cohérence des mesures directionnelles entre les éoliennes, ainsi que leur alignement avec une référence externe, afin de détecter d’éventuels défauts d’orientation (</w:t>
+      </w:r>
+      <w:proofErr w:type="spellStart"/>
+      <w:r>
+        <w:t>yaw</w:t>
+      </w:r>
+      <w:proofErr w:type="spellEnd"/>
+      <w:r>
+        <w:t xml:space="preserve"> </w:t>
+      </w:r>
+      <w:proofErr w:type="spellStart"/>
+      <w:r>
+        <w:t>misalignment</w:t>
+      </w:r>
+      <w:proofErr w:type="spellEnd"/>
+      <w:r>
+        <w:t>).</w:t>
       </w:r>
     </w:p>
     <w:p>
@@ -2659,43 +3270,75 @@
         <w:rPr>
           <w:lang w:val="en-US"/>
         </w:rPr>
-        <w:t>[TABLE:TIP_SPEED_RATIO_TABLE]</w:t>
-      </w:r>
-    </w:p>
-    <w:p>
-      <w:pPr>
-        <w:rPr>
-          <w:lang w:val="en-US"/>
-        </w:rPr>
-      </w:pPr>
-      <w:r>
-        <w:rPr>
-          <w:lang w:val="en-US"/>
-        </w:rPr>
-        <w:t>{{wind_direction_calibration}}</w:t>
-      </w:r>
-    </w:p>
-    <w:p>
-      <w:pPr>
-        <w:rPr>
-          <w:lang w:val="en-US"/>
-        </w:rPr>
-      </w:pPr>
-      <w:r>
-        <w:rPr>
-          <w:lang w:val="en-US"/>
-        </w:rPr>
-        <w:t>{{power_rose_chart}}</w:t>
-      </w:r>
-    </w:p>
-    <w:p>
-      <w:pPr>
-        <w:rPr>
-          <w:lang w:val="en-US"/>
-        </w:rPr>
-      </w:pPr>
-      <w:r>
-        <w:t>{{wind_rose_chart}}</w:t>
+        <w:t>{{</w:t>
+      </w:r>
+      <w:proofErr w:type="spellStart"/>
+      <w:r>
+        <w:rPr>
+          <w:lang w:val="en-US"/>
+        </w:rPr>
+        <w:t>wind_direction_calibration</w:t>
+      </w:r>
+      <w:proofErr w:type="spellEnd"/>
+      <w:r>
+        <w:rPr>
+          <w:lang w:val="en-US"/>
+        </w:rPr>
+        <w:t>}}</w:t>
+      </w:r>
+    </w:p>
+    <w:p>
+      <w:pPr>
+        <w:rPr>
+          <w:lang w:val="en-US"/>
+        </w:rPr>
+      </w:pPr>
+      <w:r>
+        <w:rPr>
+          <w:lang w:val="en-US"/>
+        </w:rPr>
+        <w:t>{{</w:t>
+      </w:r>
+      <w:proofErr w:type="spellStart"/>
+      <w:r>
+        <w:rPr>
+          <w:lang w:val="en-US"/>
+        </w:rPr>
+        <w:t>power_rose_chart</w:t>
+      </w:r>
+      <w:proofErr w:type="spellEnd"/>
+      <w:r>
+        <w:rPr>
+          <w:lang w:val="en-US"/>
+        </w:rPr>
+        <w:t>}}</w:t>
+      </w:r>
+    </w:p>
+    <w:p>
+      <w:pPr>
+        <w:rPr>
+          <w:lang w:val="en-US"/>
+        </w:rPr>
+      </w:pPr>
+      <w:r>
+        <w:rPr>
+          <w:lang w:val="en-US"/>
+        </w:rPr>
+        <w:t>{{</w:t>
+      </w:r>
+      <w:proofErr w:type="spellStart"/>
+      <w:r>
+        <w:rPr>
+          <w:lang w:val="en-US"/>
+        </w:rPr>
+        <w:t>wind_rose_chart</w:t>
+      </w:r>
+      <w:proofErr w:type="spellEnd"/>
+      <w:r>
+        <w:rPr>
+          <w:lang w:val="en-US"/>
+        </w:rPr>
+        <w:t>}}</w:t>
       </w:r>
     </w:p>
     <w:p>
@@ -2782,7 +3425,15 @@
         <w:t>Exclusion</w:t>
       </w:r>
       <w:r>
-        <w:t xml:space="preserve"> des situations de sillage (wake effect), </w:t>
+        <w:t xml:space="preserve"> des situations de sillage (wake </w:t>
+      </w:r>
+      <w:proofErr w:type="spellStart"/>
+      <w:r>
+        <w:t>effect</w:t>
+      </w:r>
+      <w:proofErr w:type="spellEnd"/>
+      <w:r>
+        <w:t xml:space="preserve">), </w:t>
       </w:r>
     </w:p>
     <w:p>
@@ -2848,20 +3499,47 @@
         <w:rPr>
           <w:lang w:val="en-US"/>
         </w:rPr>
-        <w:t>[TABLE:NORMATIVE_YIELD_TABLE]</w:t>
-      </w:r>
-    </w:p>
-    <w:p>
+        <w:t>[</w:t>
+      </w:r>
+      <w:proofErr w:type="gramStart"/>
+      <w:r>
+        <w:rPr>
+          <w:lang w:val="en-US"/>
+        </w:rPr>
+        <w:t>TABLE:NORMATIVE</w:t>
+      </w:r>
+      <w:proofErr w:type="gramEnd"/>
+      <w:r>
+        <w:rPr>
+          <w:lang w:val="en-US"/>
+        </w:rPr>
+        <w:t>_YIELD_TABLE]</w:t>
+      </w:r>
+    </w:p>
+    <w:p>
+      <w:pPr>
+        <w:rPr>
+          <w:lang w:val="en-US"/>
+        </w:rPr>
+      </w:pPr>
       <w:r>
         <w:rPr>
           <w:lang w:val="en-US"/>
         </w:rPr>
         <w:t>{{</w:t>
       </w:r>
-      <w:r>
+      <w:proofErr w:type="spellStart"/>
+      <w:r>
+        <w:rPr>
+          <w:lang w:val="en-US"/>
+        </w:rPr>
         <w:t>power_curve_chart</w:t>
       </w:r>
-      <w:r>
+      <w:proofErr w:type="spellEnd"/>
+      <w:r>
+        <w:rPr>
+          <w:lang w:val="en-US"/>
+        </w:rPr>
         <w:t>}}</w:t>
       </w:r>
     </w:p>
@@ -2909,8 +3587,13 @@
           <w:numId w:val="13"/>
         </w:numPr>
       </w:pPr>
-      <w:r>
-        <w:t xml:space="preserve">les périodes de limitations environnementales (bruit, chauves-souris, ombrage, etc.), </w:t>
+      <w:proofErr w:type="gramStart"/>
+      <w:r>
+        <w:t>les</w:t>
+      </w:r>
+      <w:proofErr w:type="gramEnd"/>
+      <w:r>
+        <w:t xml:space="preserve"> périodes de limitations environnementales (bruit, chauves-souris, ombrage, etc.), </w:t>
       </w:r>
     </w:p>
     <w:p>
@@ -2921,8 +3604,13 @@
           <w:numId w:val="13"/>
         </w:numPr>
       </w:pPr>
-      <w:r>
-        <w:t xml:space="preserve">les phases de démarrage et d’arrêt, </w:t>
+      <w:proofErr w:type="gramStart"/>
+      <w:r>
+        <w:t>les</w:t>
+      </w:r>
+      <w:proofErr w:type="gramEnd"/>
+      <w:r>
+        <w:t xml:space="preserve"> phases de démarrage et d’arrêt, </w:t>
       </w:r>
     </w:p>
     <w:p>
@@ -2933,13 +3621,21 @@
           <w:numId w:val="13"/>
         </w:numPr>
       </w:pPr>
+      <w:proofErr w:type="gramStart"/>
+      <w:r>
+        <w:t>les</w:t>
+      </w:r>
+      <w:proofErr w:type="gramEnd"/>
+      <w:r>
+        <w:t xml:space="preserve"> situations transitoires ou non représentatives du fonctionnement normal. </w:t>
+      </w:r>
+    </w:p>
+    <w:p>
+      <w:pPr>
+        <w:jc w:val="both"/>
+      </w:pPr>
       <w:r>
         <w:lastRenderedPageBreak/>
-        <w:t xml:space="preserve">les situations transitoires ou non représentatives du fonctionnement normal. </w:t>
-      </w:r>
-    </w:p>
-    <w:p>
-      <w:r>
         <w:t xml:space="preserve">L’analyse est réalisée sur l’ensemble de la période d’étude, avec une visualisation de l’évolution </w:t>
       </w:r>
       <w:r>
@@ -2950,10 +3646,68 @@
       </w:r>
     </w:p>
     <w:p>
+      <w:pPr>
+        <w:jc w:val="both"/>
+      </w:pPr>
+      <w:r>
+        <w:t>Le TSR</w:t>
+      </w:r>
+      <w:r>
+        <w:t xml:space="preserve"> (Tip Speed Ratio) est ici introduit, il</w:t>
+      </w:r>
+      <w:r>
+        <w:t xml:space="preserve"> correspond au rapport entre la vitesse linéaire du bout des pales et la vitesse du vent arrivant sur l'hélice.</w:t>
+      </w:r>
+      <w:r>
+        <w:t xml:space="preserve"> Il doit être compris entre 7 et 9. Au-delà </w:t>
+      </w:r>
+      <w:r>
+        <w:t>les pales ont tendance à s'éroder prématurément.</w:t>
+      </w:r>
+    </w:p>
+    <w:p>
+      <w:pPr>
+        <w:jc w:val="both"/>
+      </w:pPr>
       <w:r>
         <w:t>Les figures ci-après présentent l’évolution de la vitesse de rotation du rotor en fonction de la puissance active pour chaque éolienne, sur la période analysée.</w:t>
       </w:r>
     </w:p>
+    <w:p/>
+    <w:p>
+      <w:pPr>
+        <w:rPr>
+          <w:lang w:val="en-US"/>
+        </w:rPr>
+      </w:pPr>
+      <w:r>
+        <w:rPr>
+          <w:lang w:val="en-US"/>
+        </w:rPr>
+        <w:t>[</w:t>
+      </w:r>
+      <w:proofErr w:type="gramStart"/>
+      <w:r>
+        <w:rPr>
+          <w:lang w:val="en-US"/>
+        </w:rPr>
+        <w:t>TABLE:TIP</w:t>
+      </w:r>
+      <w:proofErr w:type="gramEnd"/>
+      <w:r>
+        <w:rPr>
+          <w:lang w:val="en-US"/>
+        </w:rPr>
+        <w:t>_SPEED_RATIO_TABLE]</w:t>
+      </w:r>
+    </w:p>
+    <w:p>
+      <w:pPr>
+        <w:rPr>
+          <w:lang w:val="en-US"/>
+        </w:rPr>
+      </w:pPr>
+    </w:p>
     <w:p>
       <w:pPr>
         <w:rPr>
@@ -2968,15 +3722,29 @@
       </w:r>
     </w:p>
     <w:p>
+      <w:pPr>
+        <w:rPr>
+          <w:lang w:val="en-US"/>
+        </w:rPr>
+      </w:pPr>
+    </w:p>
+    <w:p>
+      <w:pPr>
+        <w:rPr>
+          <w:lang w:val="en-US"/>
+        </w:rPr>
+      </w:pPr>
       <w:r>
         <w:rPr>
           <w:lang w:val="en-US"/>
         </w:rPr>
         <w:t>{{</w:t>
       </w:r>
+      <w:proofErr w:type="spellStart"/>
       <w:r>
         <w:t>rpm_chart</w:t>
       </w:r>
+      <w:proofErr w:type="spellEnd"/>
       <w:r>
         <w:rPr>
           <w:lang w:val="en-US"/>
@@ -2984,6 +3752,7 @@
         <w:t>}}</w:t>
       </w:r>
     </w:p>
+    <w:p/>
     <w:p>
       <w:r>
         <w:rPr>
@@ -3087,21 +3856,75 @@
         <w:rPr>
           <w:lang w:val="en-US"/>
         </w:rPr>
-        <w:t>[TODO FIGURE PITCH]</w:t>
-      </w:r>
-    </w:p>
-    <w:p>
-      <w:pPr>
-        <w:rPr>
-          <w:lang w:val="en-US"/>
-        </w:rPr>
-      </w:pPr>
-      <w:r>
-        <w:rPr>
-          <w:lang w:val="en-US"/>
-        </w:rPr>
-        <w:t>[TODO TABLEAU PITCH]</w:t>
-      </w:r>
+        <w:t>[</w:t>
+      </w:r>
+      <w:proofErr w:type="gramStart"/>
+      <w:r>
+        <w:rPr>
+          <w:lang w:val="en-US"/>
+        </w:rPr>
+        <w:t>T</w:t>
+      </w:r>
+      <w:r>
+        <w:rPr>
+          <w:lang w:val="en-US"/>
+        </w:rPr>
+        <w:t>ABLE:PITCH</w:t>
+      </w:r>
+      <w:proofErr w:type="gramEnd"/>
+      <w:r>
+        <w:rPr>
+          <w:lang w:val="en-US"/>
+        </w:rPr>
+        <w:t>_TABLE</w:t>
+      </w:r>
+      <w:r>
+        <w:rPr>
+          <w:lang w:val="en-US"/>
+        </w:rPr>
+        <w:t>]</w:t>
+      </w:r>
+    </w:p>
+    <w:p>
+      <w:pPr>
+        <w:rPr>
+          <w:lang w:val="en-US"/>
+        </w:rPr>
+      </w:pPr>
+    </w:p>
+    <w:p>
+      <w:pPr>
+        <w:rPr>
+          <w:lang w:val="en-US"/>
+        </w:rPr>
+      </w:pPr>
+      <w:r>
+        <w:rPr>
+          <w:lang w:val="en-US"/>
+        </w:rPr>
+        <w:t>{{</w:t>
+      </w:r>
+      <w:proofErr w:type="spellStart"/>
+      <w:r>
+        <w:rPr>
+          <w:lang w:val="en-US"/>
+        </w:rPr>
+        <w:t>pitch_chart</w:t>
+      </w:r>
+      <w:proofErr w:type="spellEnd"/>
+      <w:r>
+        <w:rPr>
+          <w:lang w:val="en-US"/>
+        </w:rPr>
+        <w:t>}}</w:t>
+      </w:r>
+    </w:p>
+    <w:p>
+      <w:pPr>
+        <w:rPr>
+          <w:lang w:val="en-US"/>
+        </w:rPr>
+      </w:pPr>
     </w:p>
     <w:p>
       <w:r>
@@ -3121,7 +3944,19 @@
     </w:p>
     <w:p>
       <w:r>
-        <w:t>En complément de l'analyse comparative des courbes de puissance, une analyse individuelle de chaque éolienne est réalisée à partir des données SCADA brutes, sous forme de nuages de points. Cette approche vise à détecter d'éventuelles limitations de production non prévues, non nécessairement visibles dans une comparaison inter-éoliennes. Elle permet notamment d'identifier des situations de curtailment inattendu, visibles à travers des regroupements de points (clusters) s'écartant de la courbe de puissance nominale attendue. L'analyse repose sur la représentation de la puissance active en fonction de la vitesse du vent sous forme de nuages de points. Afin de représenter le comportement nominal des éoliennes, les données sont filtrées pour exclure :</w:t>
+        <w:t xml:space="preserve">En complément de l'analyse comparative des courbes de puissance, une analyse individuelle de chaque éolienne est réalisée à partir des données SCADA brutes, sous forme de nuages de points. Cette approche vise à détecter d'éventuelles limitations de production non prévues, non nécessairement visibles dans une comparaison inter-éoliennes. Elle permet notamment d'identifier des situations de </w:t>
+      </w:r>
+      <w:proofErr w:type="spellStart"/>
+      <w:r>
+        <w:t>curtailment</w:t>
+      </w:r>
+      <w:proofErr w:type="spellEnd"/>
+      <w:r>
+        <w:t xml:space="preserve"> inattendu, visibles à travers des regroupements de points (clusters) s'écartant de la courbe de puissance nominale attendue. L'analyse repose sur la représentation de la puissance active en fonction de la vitesse du vent sous forme de nuages </w:t>
+      </w:r>
+      <w:r>
+        <w:lastRenderedPageBreak/>
+        <w:t>de points. Afin de représenter le comportement nominal des éoliennes, les données sont filtrées pour exclure :</w:t>
       </w:r>
     </w:p>
     <w:p>
@@ -3132,8 +3967,13 @@
           <w:numId w:val="15"/>
         </w:numPr>
       </w:pPr>
-      <w:r>
-        <w:t xml:space="preserve">les périodes de limitations environnementales (bruit, chauves-souris, ombrage, etc.), </w:t>
+      <w:proofErr w:type="gramStart"/>
+      <w:r>
+        <w:t>les</w:t>
+      </w:r>
+      <w:proofErr w:type="gramEnd"/>
+      <w:r>
+        <w:t xml:space="preserve"> périodes de limitations environnementales (bruit, chauves-souris, ombrage, etc.), </w:t>
       </w:r>
     </w:p>
     <w:p>
@@ -3144,8 +3984,13 @@
           <w:numId w:val="15"/>
         </w:numPr>
       </w:pPr>
-      <w:r>
-        <w:t>les phases de démarrage et d'arrêt,</w:t>
+      <w:proofErr w:type="gramStart"/>
+      <w:r>
+        <w:t>les</w:t>
+      </w:r>
+      <w:proofErr w:type="gramEnd"/>
+      <w:r>
+        <w:t xml:space="preserve"> phases de démarrage et d'arrêt,</w:t>
       </w:r>
     </w:p>
     <w:p>
@@ -3156,8 +4001,13 @@
           <w:numId w:val="15"/>
         </w:numPr>
       </w:pPr>
-      <w:r>
-        <w:t xml:space="preserve">ainsi que les situations non représentatives du fonctionnement normal. </w:t>
+      <w:proofErr w:type="gramStart"/>
+      <w:r>
+        <w:t>ainsi</w:t>
+      </w:r>
+      <w:proofErr w:type="gramEnd"/>
+      <w:r>
+        <w:t xml:space="preserve"> que les situations non représentatives du fonctionnement normal. </w:t>
       </w:r>
     </w:p>
     <w:p>
@@ -3166,9 +4016,13 @@
       </w:r>
     </w:p>
     <w:p>
-      <w:r>
-        <w:lastRenderedPageBreak/>
-        <w:t>préciser quelle éolienne est présentée dans le corps du rapport et lesquelles sont renvoyées en annexe, cohérence à maintenir avec l'analyse comparative des courbes de puissance. Dans l'étude de référence, E9 est présentée dans le corps du rapport.]</w:t>
+      <w:proofErr w:type="gramStart"/>
+      <w:r>
+        <w:t>préciser</w:t>
+      </w:r>
+      <w:proofErr w:type="gramEnd"/>
+      <w:r>
+        <w:t xml:space="preserve"> quelle éolienne est présentée dans le corps du rapport et lesquelles sont renvoyées en annexe, cohérence à maintenir avec l'analyse comparative des courbes de puissance. Dans l'étude de référence, E9 est présentée dans le corps du rapport.]</w:t>
       </w:r>
     </w:p>
     <w:p>
@@ -3230,7 +4084,15 @@
         <w:pStyle w:val="Titre2"/>
       </w:pPr>
       <w:r>
-        <w:t>Disponibilité temporelle (Time-Based Availability – TBA)</w:t>
+        <w:t xml:space="preserve">Disponibilité temporelle (Time-Based </w:t>
+      </w:r>
+      <w:proofErr w:type="spellStart"/>
+      <w:r>
+        <w:t>Availability</w:t>
+      </w:r>
+      <w:proofErr w:type="spellEnd"/>
+      <w:r>
+        <w:t xml:space="preserve"> – TBA)</w:t>
       </w:r>
     </w:p>
     <w:p>

</xml_diff>

<commit_message>
[CHANGE] change the code to handle pitch issues
</commit_message>
<xml_diff>
--- a/assets/templates/template_scada.docx
+++ b/assets/templates/template_scada.docx
@@ -1075,13 +1075,8 @@
       </w:r>
     </w:p>
     <w:p>
-      <w:proofErr w:type="gramStart"/>
-      <w:r>
-        <w:t>Email</w:t>
-      </w:r>
-      <w:proofErr w:type="gramEnd"/>
-      <w:r>
-        <w:t xml:space="preserve"> : {{MAIL_AUTEUR}}</w:t>
+      <w:r>
+        <w:t>Email : {{MAIL_AUTEUR}}</w:t>
       </w:r>
     </w:p>
     <w:p>
@@ -1101,13 +1096,8 @@
       </w:r>
     </w:p>
     <w:p>
-      <w:proofErr w:type="gramStart"/>
-      <w:r>
-        <w:t>Email</w:t>
-      </w:r>
-      <w:proofErr w:type="gramEnd"/>
-      <w:r>
-        <w:t xml:space="preserve"> : {{MAIL_VERIFICATEUR}}</w:t>
+      <w:r>
+        <w:t>Email : {{MAIL_VERIFICATEUR}}</w:t>
       </w:r>
     </w:p>
     <w:p>
@@ -1127,13 +1117,8 @@
       </w:r>
     </w:p>
     <w:p>
-      <w:proofErr w:type="gramStart"/>
-      <w:r>
-        <w:t>Email</w:t>
-      </w:r>
-      <w:proofErr w:type="gramEnd"/>
-      <w:r>
-        <w:t xml:space="preserve"> : {{MAIL_APPROBATEUR}}</w:t>
+      <w:r>
+        <w:t>Email : {{MAIL_APPROBATEUR}}</w:t>
       </w:r>
     </w:p>
     <w:p>
@@ -1273,21 +1258,13 @@
     <w:p/>
     <w:p>
       <w:r>
-        <w:t>[</w:t>
-      </w:r>
-      <w:proofErr w:type="gramStart"/>
-      <w:r>
-        <w:t>T</w:t>
+        <w:t>[T</w:t>
       </w:r>
       <w:r>
         <w:t>ODO</w:t>
       </w:r>
       <w:r>
-        <w:t>:SCADA</w:t>
-      </w:r>
-      <w:proofErr w:type="gramEnd"/>
-      <w:r>
-        <w:t>_SUMMARY_TABLE]</w:t>
+        <w:t>:SCADA_SUMMARY_TABLE]</w:t>
       </w:r>
     </w:p>
     <w:p>
@@ -1347,22 +1324,14 @@
       </w:r>
       <w:proofErr w:type="spellStart"/>
       <w:r>
-        <w:t>total_</w:t>
-      </w:r>
-      <w:proofErr w:type="gramStart"/>
-      <w:r>
-        <w:t>power</w:t>
+        <w:t>total_power</w:t>
       </w:r>
       <w:proofErr w:type="spellEnd"/>
       <w:r>
         <w:t xml:space="preserve"> </w:t>
       </w:r>
       <w:r>
-        <w:t>}</w:t>
-      </w:r>
-      <w:proofErr w:type="gramEnd"/>
-      <w:r>
-        <w:t>}.</w:t>
+        <w:t>}}.</w:t>
       </w:r>
     </w:p>
     <w:p>
@@ -1446,21 +1415,13 @@
     </w:p>
     <w:p>
       <w:r>
-        <w:t>[</w:t>
-      </w:r>
-      <w:proofErr w:type="gramStart"/>
-      <w:r>
-        <w:t>T</w:t>
+        <w:t>[T</w:t>
       </w:r>
       <w:r>
         <w:t>ODO</w:t>
       </w:r>
       <w:r>
-        <w:t>:</w:t>
-      </w:r>
-      <w:proofErr w:type="gramEnd"/>
-      <w:r>
-        <w:t>CSV_FILES_TABLE]</w:t>
+        <w:t>:CSV_FILES_TABLE]</w:t>
       </w:r>
     </w:p>
     <w:p>
@@ -2301,13 +2262,8 @@
           <w:numId w:val="6"/>
         </w:numPr>
       </w:pPr>
-      <w:proofErr w:type="gramStart"/>
-      <w:r>
-        <w:t>variables</w:t>
-      </w:r>
-      <w:proofErr w:type="gramEnd"/>
-      <w:r>
-        <w:t xml:space="preserve"> environnementales : </w:t>
+      <w:r>
+        <w:t xml:space="preserve">variables environnementales : </w:t>
       </w:r>
     </w:p>
     <w:p>
@@ -2318,13 +2274,8 @@
           <w:numId w:val="6"/>
         </w:numPr>
       </w:pPr>
-      <w:proofErr w:type="gramStart"/>
-      <w:r>
-        <w:t>vitesse</w:t>
-      </w:r>
-      <w:proofErr w:type="gramEnd"/>
-      <w:r>
-        <w:t xml:space="preserve"> du vent </w:t>
+      <w:r>
+        <w:t xml:space="preserve">vitesse du vent </w:t>
       </w:r>
     </w:p>
     <w:p>
@@ -2335,13 +2286,8 @@
           <w:numId w:val="6"/>
         </w:numPr>
       </w:pPr>
-      <w:proofErr w:type="gramStart"/>
-      <w:r>
-        <w:t>direction</w:t>
-      </w:r>
-      <w:proofErr w:type="gramEnd"/>
-      <w:r>
-        <w:t xml:space="preserve"> du vent </w:t>
+      <w:r>
+        <w:t xml:space="preserve">direction du vent </w:t>
       </w:r>
     </w:p>
     <w:p>
@@ -2352,13 +2298,8 @@
           <w:numId w:val="6"/>
         </w:numPr>
       </w:pPr>
-      <w:proofErr w:type="gramStart"/>
-      <w:r>
-        <w:t>température</w:t>
-      </w:r>
-      <w:proofErr w:type="gramEnd"/>
-      <w:r>
-        <w:t xml:space="preserve"> ambiante </w:t>
+      <w:r>
+        <w:t xml:space="preserve">température ambiante </w:t>
       </w:r>
     </w:p>
     <w:p>
@@ -2369,13 +2310,8 @@
           <w:numId w:val="6"/>
         </w:numPr>
       </w:pPr>
-      <w:proofErr w:type="gramStart"/>
-      <w:r>
-        <w:t>variables</w:t>
-      </w:r>
-      <w:proofErr w:type="gramEnd"/>
-      <w:r>
-        <w:t xml:space="preserve"> opérationnelles clés : </w:t>
+      <w:r>
+        <w:t xml:space="preserve">variables opérationnelles clés : </w:t>
       </w:r>
     </w:p>
     <w:p>
@@ -2386,13 +2322,8 @@
           <w:numId w:val="6"/>
         </w:numPr>
       </w:pPr>
-      <w:proofErr w:type="gramStart"/>
-      <w:r>
-        <w:t>puissance</w:t>
-      </w:r>
-      <w:proofErr w:type="gramEnd"/>
-      <w:r>
-        <w:t xml:space="preserve"> active produite </w:t>
+      <w:r>
+        <w:t xml:space="preserve">puissance active produite </w:t>
       </w:r>
     </w:p>
     <w:p/>
@@ -2674,13 +2605,8 @@
           <w:numId w:val="8"/>
         </w:numPr>
       </w:pPr>
-      <w:proofErr w:type="gramStart"/>
-      <w:r>
-        <w:t>la</w:t>
-      </w:r>
-      <w:proofErr w:type="gramEnd"/>
-      <w:r>
-        <w:t xml:space="preserve"> disponibilité énergétique brute (</w:t>
+      <w:r>
+        <w:t>la disponibilité énergétique brute (</w:t>
       </w:r>
       <w:proofErr w:type="spellStart"/>
       <w:r>
@@ -2707,40 +2633,21 @@
           <w:numId w:val="8"/>
         </w:numPr>
       </w:pPr>
-      <w:proofErr w:type="gramStart"/>
-      <w:r>
-        <w:t>la</w:t>
-      </w:r>
-      <w:proofErr w:type="gramEnd"/>
-      <w:r>
-        <w:t xml:space="preserve"> disponibilité énergétique imputable au fabricant</w:t>
-      </w:r>
-    </w:p>
-    <w:p>
-      <w:pPr>
-        <w:rPr>
-          <w:lang w:val="en-US"/>
-        </w:rPr>
-      </w:pPr>
-      <w:r>
-        <w:rPr>
-          <w:lang w:val="en-US"/>
-        </w:rPr>
-        <w:t>[</w:t>
-      </w:r>
-      <w:proofErr w:type="gramStart"/>
-      <w:r>
-        <w:rPr>
-          <w:lang w:val="en-US"/>
-        </w:rPr>
-        <w:t>TABLE:EBA</w:t>
-      </w:r>
-      <w:proofErr w:type="gramEnd"/>
-      <w:r>
-        <w:rPr>
-          <w:lang w:val="en-US"/>
-        </w:rPr>
-        <w:t>_CUT_IN_CUT_OUT_TABLE]</w:t>
+      <w:r>
+        <w:t>la disponibilité énergétique imputable au fabricant</w:t>
+      </w:r>
+    </w:p>
+    <w:p>
+      <w:pPr>
+        <w:rPr>
+          <w:lang w:val="en-US"/>
+        </w:rPr>
+      </w:pPr>
+      <w:r>
+        <w:rPr>
+          <w:lang w:val="en-US"/>
+        </w:rPr>
+        <w:t>[TABLE:EBA_CUT_IN_CUT_OUT_TABLE]</w:t>
       </w:r>
     </w:p>
     <w:p>
@@ -2787,21 +2694,7 @@
         <w:rPr>
           <w:lang w:val="en-US"/>
         </w:rPr>
-        <w:t>[</w:t>
-      </w:r>
-      <w:proofErr w:type="gramStart"/>
-      <w:r>
-        <w:rPr>
-          <w:lang w:val="en-US"/>
-        </w:rPr>
-        <w:t>TABLE:EBA</w:t>
-      </w:r>
-      <w:proofErr w:type="gramEnd"/>
-      <w:r>
-        <w:rPr>
-          <w:lang w:val="en-US"/>
-        </w:rPr>
-        <w:t>_MANUFACTURER_TABLE]</w:t>
+        <w:t>[TABLE:EBA_MANUFACTURER_TABLE]</w:t>
       </w:r>
       <w:r>
         <w:rPr>
@@ -2846,15 +2739,7 @@
     </w:p>
     <w:p>
       <w:r>
-        <w:t>[</w:t>
-      </w:r>
-      <w:proofErr w:type="gramStart"/>
-      <w:r>
-        <w:t>TABLE:EBA</w:t>
-      </w:r>
-      <w:proofErr w:type="gramEnd"/>
-      <w:r>
-        <w:t>_LOSS_TABLE]</w:t>
+        <w:t>[TABLE:EBA_LOSS_TABLE]</w:t>
       </w:r>
     </w:p>
     <w:p>
@@ -3021,21 +2906,7 @@
         <w:rPr>
           <w:lang w:val="en-US"/>
         </w:rPr>
-        <w:t>[</w:t>
-      </w:r>
-      <w:proofErr w:type="gramStart"/>
-      <w:r>
-        <w:rPr>
-          <w:lang w:val="en-US"/>
-        </w:rPr>
-        <w:t>TABLE:ERROR</w:t>
-      </w:r>
-      <w:proofErr w:type="gramEnd"/>
-      <w:r>
-        <w:rPr>
-          <w:lang w:val="en-US"/>
-        </w:rPr>
-        <w:t>_</w:t>
+        <w:t>[TABLE:ERROR_</w:t>
       </w:r>
       <w:r>
         <w:rPr>
@@ -3067,21 +2938,7 @@
         <w:rPr>
           <w:lang w:val="en-US"/>
         </w:rPr>
-        <w:t>[</w:t>
-      </w:r>
-      <w:proofErr w:type="gramStart"/>
-      <w:r>
-        <w:rPr>
-          <w:lang w:val="en-US"/>
-        </w:rPr>
-        <w:t>TABLE:ERROR</w:t>
-      </w:r>
-      <w:proofErr w:type="gramEnd"/>
-      <w:r>
-        <w:rPr>
-          <w:lang w:val="en-US"/>
-        </w:rPr>
-        <w:t>_</w:t>
+        <w:t>[TABLE:ERROR_</w:t>
       </w:r>
       <w:r>
         <w:rPr>
@@ -3260,6 +3117,27 @@
         <w:t>Les figures ci-après présentent les roses des vents pour chaque éolienne sur les périodes communes, ainsi que les biais directionnels moyens calculés, en relatif entre éoliennes et par rapport à la référence externe.</w:t>
       </w:r>
     </w:p>
+    <w:p/>
+    <w:p>
+      <w:pPr>
+        <w:rPr>
+          <w:lang w:val="en-US"/>
+        </w:rPr>
+      </w:pPr>
+      <w:r>
+        <w:rPr>
+          <w:lang w:val="en-US"/>
+        </w:rPr>
+        <w:t>[TABLE:WIND_DIRECTION_CALIBRATION_TABLE]</w:t>
+      </w:r>
+    </w:p>
+    <w:p>
+      <w:pPr>
+        <w:rPr>
+          <w:lang w:val="en-US"/>
+        </w:rPr>
+      </w:pPr>
+    </w:p>
     <w:p>
       <w:pPr>
         <w:rPr>
@@ -3499,21 +3377,7 @@
         <w:rPr>
           <w:lang w:val="en-US"/>
         </w:rPr>
-        <w:t>[</w:t>
-      </w:r>
-      <w:proofErr w:type="gramStart"/>
-      <w:r>
-        <w:rPr>
-          <w:lang w:val="en-US"/>
-        </w:rPr>
-        <w:t>TABLE:NORMATIVE</w:t>
-      </w:r>
-      <w:proofErr w:type="gramEnd"/>
-      <w:r>
-        <w:rPr>
-          <w:lang w:val="en-US"/>
-        </w:rPr>
-        <w:t>_YIELD_TABLE]</w:t>
+        <w:t>[TABLE:NORMATIVE_YIELD_TABLE]</w:t>
       </w:r>
     </w:p>
     <w:p>
@@ -3587,13 +3451,9 @@
           <w:numId w:val="13"/>
         </w:numPr>
       </w:pPr>
-      <w:proofErr w:type="gramStart"/>
-      <w:r>
-        <w:t>les</w:t>
-      </w:r>
-      <w:proofErr w:type="gramEnd"/>
-      <w:r>
-        <w:t xml:space="preserve"> périodes de limitations environnementales (bruit, chauves-souris, ombrage, etc.), </w:t>
+      <w:r>
+        <w:lastRenderedPageBreak/>
+        <w:t xml:space="preserve">les périodes de limitations environnementales (bruit, chauves-souris, ombrage, etc.), </w:t>
       </w:r>
     </w:p>
     <w:p>
@@ -3604,13 +3464,8 @@
           <w:numId w:val="13"/>
         </w:numPr>
       </w:pPr>
-      <w:proofErr w:type="gramStart"/>
-      <w:r>
-        <w:t>les</w:t>
-      </w:r>
-      <w:proofErr w:type="gramEnd"/>
-      <w:r>
-        <w:t xml:space="preserve"> phases de démarrage et d’arrêt, </w:t>
+      <w:r>
+        <w:t xml:space="preserve">les phases de démarrage et d’arrêt, </w:t>
       </w:r>
     </w:p>
     <w:p>
@@ -3621,13 +3476,8 @@
           <w:numId w:val="13"/>
         </w:numPr>
       </w:pPr>
-      <w:proofErr w:type="gramStart"/>
-      <w:r>
-        <w:t>les</w:t>
-      </w:r>
-      <w:proofErr w:type="gramEnd"/>
-      <w:r>
-        <w:t xml:space="preserve"> situations transitoires ou non représentatives du fonctionnement normal. </w:t>
+      <w:r>
+        <w:t xml:space="preserve">les situations transitoires ou non représentatives du fonctionnement normal. </w:t>
       </w:r>
     </w:p>
     <w:p>
@@ -3635,7 +3485,6 @@
         <w:jc w:val="both"/>
       </w:pPr>
       <w:r>
-        <w:lastRenderedPageBreak/>
         <w:t xml:space="preserve">L’analyse est réalisée sur l’ensemble de la période d’étude, avec une visualisation de l’évolution </w:t>
       </w:r>
       <w:r>
@@ -3684,21 +3533,7 @@
         <w:rPr>
           <w:lang w:val="en-US"/>
         </w:rPr>
-        <w:t>[</w:t>
-      </w:r>
-      <w:proofErr w:type="gramStart"/>
-      <w:r>
-        <w:rPr>
-          <w:lang w:val="en-US"/>
-        </w:rPr>
-        <w:t>TABLE:TIP</w:t>
-      </w:r>
-      <w:proofErr w:type="gramEnd"/>
-      <w:r>
-        <w:rPr>
-          <w:lang w:val="en-US"/>
-        </w:rPr>
-        <w:t>_SPEED_RATIO_TABLE]</w:t>
+        <w:t>[TABLE:TIP_SPEED_RATIO_TABLE]</w:t>
       </w:r>
     </w:p>
     <w:p>
@@ -3856,27 +3691,13 @@
         <w:rPr>
           <w:lang w:val="en-US"/>
         </w:rPr>
-        <w:t>[</w:t>
-      </w:r>
-      <w:proofErr w:type="gramStart"/>
-      <w:r>
-        <w:rPr>
-          <w:lang w:val="en-US"/>
-        </w:rPr>
-        <w:t>T</w:t>
-      </w:r>
-      <w:r>
-        <w:rPr>
-          <w:lang w:val="en-US"/>
-        </w:rPr>
-        <w:t>ABLE:PITCH</w:t>
-      </w:r>
-      <w:proofErr w:type="gramEnd"/>
-      <w:r>
-        <w:rPr>
-          <w:lang w:val="en-US"/>
-        </w:rPr>
-        <w:t>_TABLE</w:t>
+        <w:t>[T</w:t>
+      </w:r>
+      <w:r>
+        <w:rPr>
+          <w:lang w:val="en-US"/>
+        </w:rPr>
+        <w:t>ABLE:PITCH_TABLE</w:t>
       </w:r>
       <w:r>
         <w:rPr>
@@ -3944,7 +3765,11 @@
     </w:p>
     <w:p>
       <w:r>
-        <w:t xml:space="preserve">En complément de l'analyse comparative des courbes de puissance, une analyse individuelle de chaque éolienne est réalisée à partir des données SCADA brutes, sous forme de nuages de points. Cette approche vise à détecter d'éventuelles limitations de production non prévues, non nécessairement visibles dans une comparaison inter-éoliennes. Elle permet notamment d'identifier des situations de </w:t>
+        <w:t xml:space="preserve">En complément de l'analyse comparative des courbes de puissance, une analyse individuelle de chaque éolienne est réalisée à partir des données SCADA brutes, sous forme de nuages de points. Cette approche vise à détecter d'éventuelles limitations de production non prévues, non nécessairement visibles dans une comparaison inter-éoliennes. Elle permet notamment </w:t>
+      </w:r>
+      <w:r>
+        <w:lastRenderedPageBreak/>
+        <w:t xml:space="preserve">d'identifier des situations de </w:t>
       </w:r>
       <w:proofErr w:type="spellStart"/>
       <w:r>
@@ -3952,11 +3777,7 @@
       </w:r>
       <w:proofErr w:type="spellEnd"/>
       <w:r>
-        <w:t xml:space="preserve"> inattendu, visibles à travers des regroupements de points (clusters) s'écartant de la courbe de puissance nominale attendue. L'analyse repose sur la représentation de la puissance active en fonction de la vitesse du vent sous forme de nuages </w:t>
-      </w:r>
-      <w:r>
-        <w:lastRenderedPageBreak/>
-        <w:t>de points. Afin de représenter le comportement nominal des éoliennes, les données sont filtrées pour exclure :</w:t>
+        <w:t xml:space="preserve"> inattendu, visibles à travers des regroupements de points (clusters) s'écartant de la courbe de puissance nominale attendue. L'analyse repose sur la représentation de la puissance active en fonction de la vitesse du vent sous forme de nuages de points. Afin de représenter le comportement nominal des éoliennes, les données sont filtrées pour exclure :</w:t>
       </w:r>
     </w:p>
     <w:p>
@@ -3967,13 +3788,8 @@
           <w:numId w:val="15"/>
         </w:numPr>
       </w:pPr>
-      <w:proofErr w:type="gramStart"/>
-      <w:r>
-        <w:t>les</w:t>
-      </w:r>
-      <w:proofErr w:type="gramEnd"/>
-      <w:r>
-        <w:t xml:space="preserve"> périodes de limitations environnementales (bruit, chauves-souris, ombrage, etc.), </w:t>
+      <w:r>
+        <w:t xml:space="preserve">les périodes de limitations environnementales (bruit, chauves-souris, ombrage, etc.), </w:t>
       </w:r>
     </w:p>
     <w:p>
@@ -3984,13 +3800,8 @@
           <w:numId w:val="15"/>
         </w:numPr>
       </w:pPr>
-      <w:proofErr w:type="gramStart"/>
-      <w:r>
-        <w:t>les</w:t>
-      </w:r>
-      <w:proofErr w:type="gramEnd"/>
-      <w:r>
-        <w:t xml:space="preserve"> phases de démarrage et d'arrêt,</w:t>
+      <w:r>
+        <w:t>les phases de démarrage et d'arrêt,</w:t>
       </w:r>
     </w:p>
     <w:p>
@@ -4001,13 +3812,8 @@
           <w:numId w:val="15"/>
         </w:numPr>
       </w:pPr>
-      <w:proofErr w:type="gramStart"/>
-      <w:r>
-        <w:t>ainsi</w:t>
-      </w:r>
-      <w:proofErr w:type="gramEnd"/>
-      <w:r>
-        <w:t xml:space="preserve"> que les situations non représentatives du fonctionnement normal. </w:t>
+      <w:r>
+        <w:t xml:space="preserve">ainsi que les situations non représentatives du fonctionnement normal. </w:t>
       </w:r>
     </w:p>
     <w:p>
@@ -4016,13 +3822,8 @@
       </w:r>
     </w:p>
     <w:p>
-      <w:proofErr w:type="gramStart"/>
-      <w:r>
-        <w:t>préciser</w:t>
-      </w:r>
-      <w:proofErr w:type="gramEnd"/>
-      <w:r>
-        <w:t xml:space="preserve"> quelle éolienne est présentée dans le corps du rapport et lesquelles sont renvoyées en annexe, cohérence à maintenir avec l'analyse comparative des courbes de puissance. Dans l'étude de référence, E9 est présentée dans le corps du rapport.]</w:t>
+      <w:r>
+        <w:t>préciser quelle éolienne est présentée dans le corps du rapport et lesquelles sont renvoyées en annexe, cohérence à maintenir avec l'analyse comparative des courbes de puissance. Dans l'étude de référence, E9 est présentée dans le corps du rapport.]</w:t>
       </w:r>
     </w:p>
     <w:p>

</xml_diff>

<commit_message>
[CHANGE] change the code (bad move)
</commit_message>
<xml_diff>
--- a/assets/templates/template_scada.docx
+++ b/assets/templates/template_scada.docx
@@ -152,7 +152,7 @@
           </mc:Choice>
           <mc:Fallback>
             <w:pict>
-              <v:shape w14:anchorId="53C37D39" id="Rectangle : avec coin rogné 31" o:spid="_x0000_s1026" style="position:absolute;margin-left:-14.05pt;margin-top:151.45pt;width:502.8pt;height:81.6pt;z-index:251660288;visibility:visible;mso-wrap-style:square;mso-width-percent:0;mso-height-percent:0;mso-wrap-distance-left:9pt;mso-wrap-distance-top:0;mso-wrap-distance-right:9pt;mso-wrap-distance-bottom:0;mso-position-horizontal:absolute;mso-position-horizontal-relative:margin;mso-position-vertical:absolute;mso-position-vertical-relative:page;mso-width-percent:0;mso-height-percent:0;mso-width-relative:margin;mso-height-relative:margin;v-text-anchor:top" coordsize="6385560,1036320" o:spt="100" o:gfxdata="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" adj="-11796480,,5400" path="m,l5924698,r460862,460862l6385560,1036320,,1036320,,xe" fillcolor="#0e2841 [3215]" stroked="f" strokeweight="1pt">
+              <v:shape w14:anchorId="53C37D39" id="Rectangle : avec coin rogné 31" o:spid="_x0000_s1026" style="position:absolute;left:0;text-align:left;margin-left:-14.05pt;margin-top:151.45pt;width:502.8pt;height:81.6pt;z-index:251660288;visibility:visible;mso-wrap-style:square;mso-width-percent:0;mso-height-percent:0;mso-wrap-distance-left:9pt;mso-wrap-distance-top:0;mso-wrap-distance-right:9pt;mso-wrap-distance-bottom:0;mso-position-horizontal:absolute;mso-position-horizontal-relative:margin;mso-position-vertical:absolute;mso-position-vertical-relative:page;mso-width-percent:0;mso-height-percent:0;mso-width-relative:margin;mso-height-relative:margin;v-text-anchor:top" coordsize="6385560,1036320" o:spt="100" o:gfxdata="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" adj="-11796480,,5400" path="m,l5924698,r460862,460862l6385560,1036320,,1036320,,xe" fillcolor="#0e2841 [3215]" stroked="f" strokeweight="1pt">
                 <v:stroke joinstyle="miter"/>
                 <v:formulas/>
                 <v:path arrowok="t" o:connecttype="custom" o:connectlocs="0,0;5924698,0;6385560,460862;6385560,1036320;0,1036320;0,0" o:connectangles="0,0,0,0,0,0" textboxrect="0,0,6385560,1036320"/>
@@ -1075,8 +1075,13 @@
       </w:r>
     </w:p>
     <w:p>
-      <w:r>
-        <w:t>Email : {{MAIL_AUTEUR}}</w:t>
+      <w:proofErr w:type="gramStart"/>
+      <w:r>
+        <w:t>Email</w:t>
+      </w:r>
+      <w:proofErr w:type="gramEnd"/>
+      <w:r>
+        <w:t xml:space="preserve"> : {{MAIL_AUTEUR}}</w:t>
       </w:r>
     </w:p>
     <w:p>
@@ -1096,8 +1101,13 @@
       </w:r>
     </w:p>
     <w:p>
-      <w:r>
-        <w:t>Email : {{MAIL_VERIFICATEUR}}</w:t>
+      <w:proofErr w:type="gramStart"/>
+      <w:r>
+        <w:t>Email</w:t>
+      </w:r>
+      <w:proofErr w:type="gramEnd"/>
+      <w:r>
+        <w:t xml:space="preserve"> : {{MAIL_VERIFICATEUR}}</w:t>
       </w:r>
     </w:p>
     <w:p>
@@ -1117,8 +1127,13 @@
       </w:r>
     </w:p>
     <w:p>
-      <w:r>
-        <w:t>Email : {{MAIL_APPROBATEUR}}</w:t>
+      <w:proofErr w:type="gramStart"/>
+      <w:r>
+        <w:t>Email</w:t>
+      </w:r>
+      <w:proofErr w:type="gramEnd"/>
+      <w:r>
+        <w:t xml:space="preserve"> : {{MAIL_APPROBATEUR}}</w:t>
       </w:r>
     </w:p>
     <w:p>
@@ -1145,9 +1160,6 @@
       </w:r>
     </w:p>
     <w:p>
-      <w:pPr>
-        <w:jc w:val="both"/>
-      </w:pPr>
       <w:r>
         <w:t xml:space="preserve">Les données SCADA du parc éolien </w:t>
       </w:r>
@@ -1242,15 +1254,8 @@
         <w:t xml:space="preserve"> L’ensemble des turbines a été pris en compte dans l’analyse.</w:t>
       </w:r>
     </w:p>
-    <w:p>
-      <w:pPr>
-        <w:jc w:val="both"/>
-      </w:pPr>
-    </w:p>
-    <w:p>
-      <w:pPr>
-        <w:jc w:val="both"/>
-      </w:pPr>
+    <w:p/>
+    <w:p>
       <w:r>
         <w:t>Le tableau ci-après présente une évaluation synthétique des performances du parc, en mettant en évidence, pour chaque indicateur, le niveau de performance de chaque éolienne ainsi que les éventuels écarts observés.</w:t>
       </w:r>
@@ -1258,13 +1263,21 @@
     <w:p/>
     <w:p>
       <w:r>
-        <w:t>[T</w:t>
+        <w:t>[</w:t>
+      </w:r>
+      <w:proofErr w:type="gramStart"/>
+      <w:r>
+        <w:t>T</w:t>
       </w:r>
       <w:r>
         <w:t>ODO</w:t>
       </w:r>
       <w:r>
-        <w:t>:SCADA_SUMMARY_TABLE]</w:t>
+        <w:t>:SCADA</w:t>
+      </w:r>
+      <w:proofErr w:type="gramEnd"/>
+      <w:r>
+        <w:t>_SUMMARY_TABLE]</w:t>
       </w:r>
     </w:p>
     <w:p>
@@ -1284,9 +1297,6 @@
       </w:r>
     </w:p>
     <w:p>
-      <w:pPr>
-        <w:jc w:val="both"/>
-      </w:pPr>
       <w:r>
         <w:t>Le parc éolien {{</w:t>
       </w:r>
@@ -1324,20 +1334,25 @@
       </w:r>
       <w:proofErr w:type="spellStart"/>
       <w:r>
-        <w:t>total_power</w:t>
+        <w:t>total_</w:t>
+      </w:r>
+      <w:proofErr w:type="gramStart"/>
+      <w:r>
+        <w:t>power</w:t>
       </w:r>
       <w:proofErr w:type="spellEnd"/>
       <w:r>
         <w:t xml:space="preserve"> </w:t>
       </w:r>
       <w:r>
-        <w:t>}}.</w:t>
-      </w:r>
-    </w:p>
-    <w:p>
-      <w:pPr>
-        <w:jc w:val="both"/>
-      </w:pPr>
+        <w:t>}</w:t>
+      </w:r>
+      <w:proofErr w:type="gramEnd"/>
+      <w:r>
+        <w:t>}.</w:t>
+      </w:r>
+    </w:p>
+    <w:p>
       <w:r>
         <w:t>Les éoliennes du parc sont identifiées comme suit : {{</w:t>
       </w:r>
@@ -1370,9 +1385,6 @@
       </w:r>
     </w:p>
     <w:p>
-      <w:pPr>
-        <w:jc w:val="both"/>
-      </w:pPr>
       <w:r>
         <w:t>[TODO.IMAGE_POSITION]</w:t>
       </w:r>
@@ -1415,13 +1427,21 @@
     </w:p>
     <w:p>
       <w:r>
-        <w:t>[T</w:t>
+        <w:t>[</w:t>
+      </w:r>
+      <w:proofErr w:type="gramStart"/>
+      <w:r>
+        <w:t>T</w:t>
       </w:r>
       <w:r>
         <w:t>ODO</w:t>
       </w:r>
       <w:r>
-        <w:t>:CSV_FILES_TABLE]</w:t>
+        <w:t>:</w:t>
+      </w:r>
+      <w:proofErr w:type="gramEnd"/>
+      <w:r>
+        <w:t>CSV_FILES_TABLE]</w:t>
       </w:r>
     </w:p>
     <w:p>
@@ -1450,8 +1470,8 @@
         <w:tblLook w:val="04A0" w:firstRow="1" w:lastRow="0" w:firstColumn="1" w:lastColumn="0" w:noHBand="0" w:noVBand="1"/>
       </w:tblPr>
       <w:tblGrid>
-        <w:gridCol w:w="2293"/>
-        <w:gridCol w:w="5964"/>
+        <w:gridCol w:w="2069"/>
+        <w:gridCol w:w="6188"/>
       </w:tblGrid>
       <w:tr>
         <w:tc>
@@ -1476,34 +1496,7 @@
                 <w:szCs w:val="22"/>
               </w:rPr>
               <w:lastRenderedPageBreak/>
-              <w:t>Thématiq</w:t>
-            </w:r>
-            <w:commentRangeStart w:id="0"/>
-            <w:r>
-              <w:rPr>
-                <w:rFonts w:ascii="Cambria" w:eastAsia="MS Mincho" w:hAnsi="Cambria"/>
-                <w:sz w:val="22"/>
-                <w:szCs w:val="22"/>
-              </w:rPr>
-              <w:t>u</w:t>
-            </w:r>
-            <w:commentRangeEnd w:id="0"/>
-            <w:r>
-              <w:rPr>
-                <w:rStyle w:val="Marquedecommentaire"/>
-                <w:rFonts w:ascii="Cambria" w:eastAsia="MS Mincho" w:hAnsi="Cambria"/>
-                <w:sz w:val="22"/>
-                <w:szCs w:val="22"/>
-              </w:rPr>
-              <w:commentReference w:id="0"/>
-            </w:r>
-            <w:r>
-              <w:rPr>
-                <w:rFonts w:ascii="Cambria" w:eastAsia="MS Mincho" w:hAnsi="Cambria"/>
-                <w:sz w:val="22"/>
-                <w:szCs w:val="22"/>
-              </w:rPr>
-              <w:t>e</w:t>
+              <w:t>Thématique</w:t>
             </w:r>
             <w:proofErr w:type="spellEnd"/>
           </w:p>
@@ -2262,8 +2255,13 @@
           <w:numId w:val="6"/>
         </w:numPr>
       </w:pPr>
-      <w:r>
-        <w:t xml:space="preserve">variables environnementales : </w:t>
+      <w:proofErr w:type="gramStart"/>
+      <w:r>
+        <w:t>variables</w:t>
+      </w:r>
+      <w:proofErr w:type="gramEnd"/>
+      <w:r>
+        <w:t xml:space="preserve"> environnementales : </w:t>
       </w:r>
     </w:p>
     <w:p>
@@ -2274,8 +2272,13 @@
           <w:numId w:val="6"/>
         </w:numPr>
       </w:pPr>
-      <w:r>
-        <w:t xml:space="preserve">vitesse du vent </w:t>
+      <w:proofErr w:type="gramStart"/>
+      <w:r>
+        <w:t>vitesse</w:t>
+      </w:r>
+      <w:proofErr w:type="gramEnd"/>
+      <w:r>
+        <w:t xml:space="preserve"> du vent </w:t>
       </w:r>
     </w:p>
     <w:p>
@@ -2286,8 +2289,13 @@
           <w:numId w:val="6"/>
         </w:numPr>
       </w:pPr>
-      <w:r>
-        <w:t xml:space="preserve">direction du vent </w:t>
+      <w:proofErr w:type="gramStart"/>
+      <w:r>
+        <w:t>direction</w:t>
+      </w:r>
+      <w:proofErr w:type="gramEnd"/>
+      <w:r>
+        <w:t xml:space="preserve"> du vent </w:t>
       </w:r>
     </w:p>
     <w:p>
@@ -2298,8 +2306,13 @@
           <w:numId w:val="6"/>
         </w:numPr>
       </w:pPr>
-      <w:r>
-        <w:t xml:space="preserve">température ambiante </w:t>
+      <w:proofErr w:type="gramStart"/>
+      <w:r>
+        <w:t>température</w:t>
+      </w:r>
+      <w:proofErr w:type="gramEnd"/>
+      <w:r>
+        <w:t xml:space="preserve"> ambiante </w:t>
       </w:r>
     </w:p>
     <w:p>
@@ -2310,8 +2323,13 @@
           <w:numId w:val="6"/>
         </w:numPr>
       </w:pPr>
-      <w:r>
-        <w:t xml:space="preserve">variables opérationnelles clés : </w:t>
+      <w:proofErr w:type="gramStart"/>
+      <w:r>
+        <w:t>variables</w:t>
+      </w:r>
+      <w:proofErr w:type="gramEnd"/>
+      <w:r>
+        <w:t xml:space="preserve"> opérationnelles clés : </w:t>
       </w:r>
     </w:p>
     <w:p>
@@ -2322,8 +2340,13 @@
           <w:numId w:val="6"/>
         </w:numPr>
       </w:pPr>
-      <w:r>
-        <w:t xml:space="preserve">puissance active produite </w:t>
+      <w:proofErr w:type="gramStart"/>
+      <w:r>
+        <w:t>puissance</w:t>
+      </w:r>
+      <w:proofErr w:type="gramEnd"/>
+      <w:r>
+        <w:t xml:space="preserve"> active produite </w:t>
       </w:r>
     </w:p>
     <w:p/>
@@ -2605,8 +2628,13 @@
           <w:numId w:val="8"/>
         </w:numPr>
       </w:pPr>
-      <w:r>
-        <w:t>la disponibilité énergétique brute (</w:t>
+      <w:proofErr w:type="gramStart"/>
+      <w:r>
+        <w:t>la</w:t>
+      </w:r>
+      <w:proofErr w:type="gramEnd"/>
+      <w:r>
+        <w:t xml:space="preserve"> disponibilité énergétique brute (</w:t>
       </w:r>
       <w:proofErr w:type="spellStart"/>
       <w:r>
@@ -2633,21 +2661,40 @@
           <w:numId w:val="8"/>
         </w:numPr>
       </w:pPr>
-      <w:r>
-        <w:t>la disponibilité énergétique imputable au fabricant</w:t>
-      </w:r>
-    </w:p>
-    <w:p>
-      <w:pPr>
-        <w:rPr>
-          <w:lang w:val="en-US"/>
-        </w:rPr>
-      </w:pPr>
-      <w:r>
-        <w:rPr>
-          <w:lang w:val="en-US"/>
-        </w:rPr>
-        <w:t>[TABLE:EBA_CUT_IN_CUT_OUT_TABLE]</w:t>
+      <w:proofErr w:type="gramStart"/>
+      <w:r>
+        <w:t>la</w:t>
+      </w:r>
+      <w:proofErr w:type="gramEnd"/>
+      <w:r>
+        <w:t xml:space="preserve"> disponibilité énergétique imputable au fabricant</w:t>
+      </w:r>
+    </w:p>
+    <w:p>
+      <w:pPr>
+        <w:rPr>
+          <w:lang w:val="en-US"/>
+        </w:rPr>
+      </w:pPr>
+      <w:r>
+        <w:rPr>
+          <w:lang w:val="en-US"/>
+        </w:rPr>
+        <w:t>[</w:t>
+      </w:r>
+      <w:proofErr w:type="gramStart"/>
+      <w:r>
+        <w:rPr>
+          <w:lang w:val="en-US"/>
+        </w:rPr>
+        <w:t>TABLE:EBA</w:t>
+      </w:r>
+      <w:proofErr w:type="gramEnd"/>
+      <w:r>
+        <w:rPr>
+          <w:lang w:val="en-US"/>
+        </w:rPr>
+        <w:t>_CUT_IN_CUT_OUT_TABLE]</w:t>
       </w:r>
     </w:p>
     <w:p>
@@ -2694,7 +2741,21 @@
         <w:rPr>
           <w:lang w:val="en-US"/>
         </w:rPr>
-        <w:t>[TABLE:EBA_MANUFACTURER_TABLE]</w:t>
+        <w:t>[</w:t>
+      </w:r>
+      <w:proofErr w:type="gramStart"/>
+      <w:r>
+        <w:rPr>
+          <w:lang w:val="en-US"/>
+        </w:rPr>
+        <w:t>TABLE:EBA</w:t>
+      </w:r>
+      <w:proofErr w:type="gramEnd"/>
+      <w:r>
+        <w:rPr>
+          <w:lang w:val="en-US"/>
+        </w:rPr>
+        <w:t>_MANUFACTURER_TABLE]</w:t>
       </w:r>
       <w:r>
         <w:rPr>
@@ -2739,7 +2800,15 @@
     </w:p>
     <w:p>
       <w:r>
-        <w:t>[TABLE:EBA_LOSS_TABLE]</w:t>
+        <w:t>[</w:t>
+      </w:r>
+      <w:proofErr w:type="gramStart"/>
+      <w:r>
+        <w:t>TABLE:EBA</w:t>
+      </w:r>
+      <w:proofErr w:type="gramEnd"/>
+      <w:r>
+        <w:t>_LOSS_TABLE]</w:t>
       </w:r>
     </w:p>
     <w:p>
@@ -2906,7 +2975,21 @@
         <w:rPr>
           <w:lang w:val="en-US"/>
         </w:rPr>
-        <w:t>[TABLE:ERROR_</w:t>
+        <w:t>[</w:t>
+      </w:r>
+      <w:proofErr w:type="gramStart"/>
+      <w:r>
+        <w:rPr>
+          <w:lang w:val="en-US"/>
+        </w:rPr>
+        <w:t>TABLE:ERROR</w:t>
+      </w:r>
+      <w:proofErr w:type="gramEnd"/>
+      <w:r>
+        <w:rPr>
+          <w:lang w:val="en-US"/>
+        </w:rPr>
+        <w:t>_</w:t>
       </w:r>
       <w:r>
         <w:rPr>
@@ -2938,7 +3021,21 @@
         <w:rPr>
           <w:lang w:val="en-US"/>
         </w:rPr>
-        <w:t>[TABLE:ERROR_</w:t>
+        <w:t>[</w:t>
+      </w:r>
+      <w:proofErr w:type="gramStart"/>
+      <w:r>
+        <w:rPr>
+          <w:lang w:val="en-US"/>
+        </w:rPr>
+        <w:t>TABLE:ERROR</w:t>
+      </w:r>
+      <w:proofErr w:type="gramEnd"/>
+      <w:r>
+        <w:rPr>
+          <w:lang w:val="en-US"/>
+        </w:rPr>
+        <w:t>_</w:t>
       </w:r>
       <w:r>
         <w:rPr>
@@ -3114,6 +3211,7 @@
     <w:p/>
     <w:p>
       <w:r>
+        <w:lastRenderedPageBreak/>
         <w:t>Les figures ci-après présentent les roses des vents pour chaque éolienne sur les périodes communes, ainsi que les biais directionnels moyens calculés, en relatif entre éoliennes et par rapport à la référence externe.</w:t>
       </w:r>
     </w:p>
@@ -3128,7 +3226,21 @@
         <w:rPr>
           <w:lang w:val="en-US"/>
         </w:rPr>
-        <w:t>[TABLE:WIND_DIRECTION_CALIBRATION_TABLE]</w:t>
+        <w:t>[</w:t>
+      </w:r>
+      <w:proofErr w:type="gramStart"/>
+      <w:r>
+        <w:rPr>
+          <w:lang w:val="en-US"/>
+        </w:rPr>
+        <w:t>TABLE:WIND</w:t>
+      </w:r>
+      <w:proofErr w:type="gramEnd"/>
+      <w:r>
+        <w:rPr>
+          <w:lang w:val="en-US"/>
+        </w:rPr>
+        <w:t>_DIRECTION_CALIBRATION_TABLE]</w:t>
       </w:r>
     </w:p>
     <w:p>
@@ -3377,7 +3489,21 @@
         <w:rPr>
           <w:lang w:val="en-US"/>
         </w:rPr>
-        <w:t>[TABLE:NORMATIVE_YIELD_TABLE]</w:t>
+        <w:t>[</w:t>
+      </w:r>
+      <w:proofErr w:type="gramStart"/>
+      <w:r>
+        <w:rPr>
+          <w:lang w:val="en-US"/>
+        </w:rPr>
+        <w:t>TABLE:NORMATIVE</w:t>
+      </w:r>
+      <w:proofErr w:type="gramEnd"/>
+      <w:r>
+        <w:rPr>
+          <w:lang w:val="en-US"/>
+        </w:rPr>
+        <w:t>_YIELD_TABLE]</w:t>
       </w:r>
     </w:p>
     <w:p>
@@ -3451,9 +3577,13 @@
           <w:numId w:val="13"/>
         </w:numPr>
       </w:pPr>
-      <w:r>
-        <w:lastRenderedPageBreak/>
-        <w:t xml:space="preserve">les périodes de limitations environnementales (bruit, chauves-souris, ombrage, etc.), </w:t>
+      <w:proofErr w:type="gramStart"/>
+      <w:r>
+        <w:t>les</w:t>
+      </w:r>
+      <w:proofErr w:type="gramEnd"/>
+      <w:r>
+        <w:t xml:space="preserve"> périodes de limitations environnementales (bruit, chauves-souris, ombrage, etc.), </w:t>
       </w:r>
     </w:p>
     <w:p>
@@ -3464,8 +3594,14 @@
           <w:numId w:val="13"/>
         </w:numPr>
       </w:pPr>
-      <w:r>
-        <w:t xml:space="preserve">les phases de démarrage et d’arrêt, </w:t>
+      <w:proofErr w:type="gramStart"/>
+      <w:r>
+        <w:lastRenderedPageBreak/>
+        <w:t>les</w:t>
+      </w:r>
+      <w:proofErr w:type="gramEnd"/>
+      <w:r>
+        <w:t xml:space="preserve"> phases de démarrage et d’arrêt, </w:t>
       </w:r>
     </w:p>
     <w:p>
@@ -3476,14 +3612,16 @@
           <w:numId w:val="13"/>
         </w:numPr>
       </w:pPr>
-      <w:r>
-        <w:t xml:space="preserve">les situations transitoires ou non représentatives du fonctionnement normal. </w:t>
-      </w:r>
-    </w:p>
-    <w:p>
-      <w:pPr>
-        <w:jc w:val="both"/>
-      </w:pPr>
+      <w:proofErr w:type="gramStart"/>
+      <w:r>
+        <w:t>les</w:t>
+      </w:r>
+      <w:proofErr w:type="gramEnd"/>
+      <w:r>
+        <w:t xml:space="preserve"> situations transitoires ou non représentatives du fonctionnement normal. </w:t>
+      </w:r>
+    </w:p>
+    <w:p>
       <w:r>
         <w:t xml:space="preserve">L’analyse est réalisée sur l’ensemble de la période d’étude, avec une visualisation de l’évolution </w:t>
       </w:r>
@@ -3495,9 +3633,6 @@
       </w:r>
     </w:p>
     <w:p>
-      <w:pPr>
-        <w:jc w:val="both"/>
-      </w:pPr>
       <w:r>
         <w:t>Le TSR</w:t>
       </w:r>
@@ -3515,9 +3650,6 @@
       </w:r>
     </w:p>
     <w:p>
-      <w:pPr>
-        <w:jc w:val="both"/>
-      </w:pPr>
       <w:r>
         <w:t>Les figures ci-après présentent l’évolution de la vitesse de rotation du rotor en fonction de la puissance active pour chaque éolienne, sur la période analysée.</w:t>
       </w:r>
@@ -3533,7 +3665,21 @@
         <w:rPr>
           <w:lang w:val="en-US"/>
         </w:rPr>
-        <w:t>[TABLE:TIP_SPEED_RATIO_TABLE]</w:t>
+        <w:t>[</w:t>
+      </w:r>
+      <w:proofErr w:type="gramStart"/>
+      <w:r>
+        <w:rPr>
+          <w:lang w:val="en-US"/>
+        </w:rPr>
+        <w:t>TABLE:TIP</w:t>
+      </w:r>
+      <w:proofErr w:type="gramEnd"/>
+      <w:r>
+        <w:rPr>
+          <w:lang w:val="en-US"/>
+        </w:rPr>
+        <w:t>_SPEED_RATIO_TABLE]</w:t>
       </w:r>
     </w:p>
     <w:p>
@@ -3691,13 +3837,27 @@
         <w:rPr>
           <w:lang w:val="en-US"/>
         </w:rPr>
-        <w:t>[T</w:t>
-      </w:r>
-      <w:r>
-        <w:rPr>
-          <w:lang w:val="en-US"/>
-        </w:rPr>
-        <w:t>ABLE:PITCH_TABLE</w:t>
+        <w:t>[</w:t>
+      </w:r>
+      <w:proofErr w:type="gramStart"/>
+      <w:r>
+        <w:rPr>
+          <w:lang w:val="en-US"/>
+        </w:rPr>
+        <w:t>T</w:t>
+      </w:r>
+      <w:r>
+        <w:rPr>
+          <w:lang w:val="en-US"/>
+        </w:rPr>
+        <w:t>ABLE:PITCH</w:t>
+      </w:r>
+      <w:proofErr w:type="gramEnd"/>
+      <w:r>
+        <w:rPr>
+          <w:lang w:val="en-US"/>
+        </w:rPr>
+        <w:t>_TABLE</w:t>
       </w:r>
       <w:r>
         <w:rPr>
@@ -3765,19 +3925,19 @@
     </w:p>
     <w:p>
       <w:r>
-        <w:t xml:space="preserve">En complément de l'analyse comparative des courbes de puissance, une analyse individuelle de chaque éolienne est réalisée à partir des données SCADA brutes, sous forme de nuages de points. Cette approche vise à détecter d'éventuelles limitations de production non prévues, non nécessairement visibles dans une comparaison inter-éoliennes. Elle permet notamment </w:t>
+        <w:t xml:space="preserve">En complément de l'analyse comparative des courbes de puissance, une analyse individuelle de chaque éolienne est réalisée à partir des données SCADA brutes, sous forme de nuages de points. Cette approche vise à détecter d'éventuelles limitations de production non prévues, non nécessairement visibles dans une comparaison inter-éoliennes. Elle permet notamment d'identifier des situations de </w:t>
+      </w:r>
+      <w:proofErr w:type="spellStart"/>
+      <w:r>
+        <w:t>curtailment</w:t>
+      </w:r>
+      <w:proofErr w:type="spellEnd"/>
+      <w:r>
+        <w:t xml:space="preserve"> inattendu, visibles à travers des regroupements de </w:t>
       </w:r>
       <w:r>
         <w:lastRenderedPageBreak/>
-        <w:t xml:space="preserve">d'identifier des situations de </w:t>
-      </w:r>
-      <w:proofErr w:type="spellStart"/>
-      <w:r>
-        <w:t>curtailment</w:t>
-      </w:r>
-      <w:proofErr w:type="spellEnd"/>
-      <w:r>
-        <w:t xml:space="preserve"> inattendu, visibles à travers des regroupements de points (clusters) s'écartant de la courbe de puissance nominale attendue. L'analyse repose sur la représentation de la puissance active en fonction de la vitesse du vent sous forme de nuages de points. Afin de représenter le comportement nominal des éoliennes, les données sont filtrées pour exclure :</w:t>
+        <w:t>points (clusters) s'écartant de la courbe de puissance nominale attendue. L'analyse repose sur la représentation de la puissance active en fonction de la vitesse du vent sous forme de nuages de points. Afin de représenter le comportement nominal des éoliennes, les données sont filtrées pour exclure :</w:t>
       </w:r>
     </w:p>
     <w:p>
@@ -3788,8 +3948,13 @@
           <w:numId w:val="15"/>
         </w:numPr>
       </w:pPr>
-      <w:r>
-        <w:t xml:space="preserve">les périodes de limitations environnementales (bruit, chauves-souris, ombrage, etc.), </w:t>
+      <w:proofErr w:type="gramStart"/>
+      <w:r>
+        <w:t>les</w:t>
+      </w:r>
+      <w:proofErr w:type="gramEnd"/>
+      <w:r>
+        <w:t xml:space="preserve"> périodes de limitations environnementales (bruit, chauves-souris, ombrage, etc.), </w:t>
       </w:r>
     </w:p>
     <w:p>
@@ -3800,8 +3965,13 @@
           <w:numId w:val="15"/>
         </w:numPr>
       </w:pPr>
-      <w:r>
-        <w:t>les phases de démarrage et d'arrêt,</w:t>
+      <w:proofErr w:type="gramStart"/>
+      <w:r>
+        <w:t>les</w:t>
+      </w:r>
+      <w:proofErr w:type="gramEnd"/>
+      <w:r>
+        <w:t xml:space="preserve"> phases de démarrage et d'arrêt,</w:t>
       </w:r>
     </w:p>
     <w:p>
@@ -3812,8 +3982,13 @@
           <w:numId w:val="15"/>
         </w:numPr>
       </w:pPr>
-      <w:r>
-        <w:t xml:space="preserve">ainsi que les situations non représentatives du fonctionnement normal. </w:t>
+      <w:proofErr w:type="gramStart"/>
+      <w:r>
+        <w:t>ainsi</w:t>
+      </w:r>
+      <w:proofErr w:type="gramEnd"/>
+      <w:r>
+        <w:t xml:space="preserve"> que les situations non représentatives du fonctionnement normal. </w:t>
       </w:r>
     </w:p>
     <w:p>
@@ -3822,8 +3997,13 @@
       </w:r>
     </w:p>
     <w:p>
-      <w:r>
-        <w:t>préciser quelle éolienne est présentée dans le corps du rapport et lesquelles sont renvoyées en annexe, cohérence à maintenir avec l'analyse comparative des courbes de puissance. Dans l'étude de référence, E9 est présentée dans le corps du rapport.]</w:t>
+      <w:proofErr w:type="gramStart"/>
+      <w:r>
+        <w:t>préciser</w:t>
+      </w:r>
+      <w:proofErr w:type="gramEnd"/>
+      <w:r>
+        <w:t xml:space="preserve"> quelle éolienne est présentée dans le corps du rapport et lesquelles sont renvoyées en annexe, cohérence à maintenir avec l'analyse comparative des courbes de puissance. Dans l'étude de référence, E9 est présentée dans le corps du rapport.]</w:t>
       </w:r>
     </w:p>
     <w:p>
@@ -3937,45 +4117,6 @@
     </w:sectPr>
   </w:body>
 </w:document>
-</file>
-
-<file path=word/comments.xml><?xml version="1.0" encoding="utf-8"?>
-<w:comments xmlns:wpc="http://schemas.microsoft.com/office/word/2010/wordprocessingCanvas" xmlns:cx="http://schemas.microsoft.com/office/drawing/2014/chartex" xmlns:cx1="http://schemas.microsoft.com/office/drawing/2015/9/8/chartex" xmlns:cx2="http://schemas.microsoft.com/office/drawing/2015/10/21/chartex" xmlns:cx3="http://schemas.microsoft.com/office/drawing/2016/5/9/chartex" xmlns:cx4="http://schemas.microsoft.com/office/drawing/2016/5/10/chartex" xmlns:cx5="http://schemas.microsoft.com/office/drawing/2016/5/11/chartex" xmlns:cx6="http://schemas.microsoft.com/office/drawing/2016/5/12/chartex" xmlns:cx7="http://schemas.microsoft.com/office/drawing/2016/5/13/chartex" xmlns:cx8="http://schemas.microsoft.com/office/drawing/2016/5/14/chartex" xmlns:mc="http://schemas.openxmlformats.org/markup-compatibility/2006" xmlns:aink="http://schemas.microsoft.com/office/drawing/2016/ink" xmlns:am3d="http://schemas.microsoft.com/office/drawing/2017/model3d" xmlns:o="urn:schemas-microsoft-com:office:office" xmlns:oel="http://schemas.microsoft.com/office/2019/extlst" xmlns:r="http://schemas.openxmlformats.org/officeDocument/2006/relationships" xmlns:m="http://schemas.openxmlformats.org/officeDocument/2006/math" xmlns:v="urn:schemas-microsoft-com:vml" xmlns:wp14="http://schemas.microsoft.com/office/word/2010/wordprocessingDrawing" xmlns:wp="http://schemas.openxmlformats.org/drawingml/2006/wordprocessingDrawing" xmlns:w10="urn:schemas-microsoft-com:office:word" xmlns:w="http://schemas.openxmlformats.org/wordprocessingml/2006/main" xmlns:w14="http://schemas.microsoft.com/office/word/2010/wordml" xmlns:w15="http://schemas.microsoft.com/office/word/2012/wordml" xmlns:w16cex="http://schemas.microsoft.com/office/word/2018/wordml/cex" xmlns:w16cid="http://schemas.microsoft.com/office/word/2016/wordml/cid" xmlns:w16="http://schemas.microsoft.com/office/word/2018/wordml" xmlns:w16du="http://schemas.microsoft.com/office/word/2023/wordml/word16du" xmlns:w16sdtdh="http://schemas.microsoft.com/office/word/2020/wordml/sdtdatahash" xmlns:w16sdtfl="http://schemas.microsoft.com/office/word/2024/wordml/sdtformatlock" xmlns:w16se="http://schemas.microsoft.com/office/word/2015/wordml/symex" xmlns:wpg="http://schemas.microsoft.com/office/word/2010/wordprocessingGroup" xmlns:wpi="http://schemas.microsoft.com/office/word/2010/wordprocessingInk" xmlns:wne="http://schemas.microsoft.com/office/word/2006/wordml" xmlns:wps="http://schemas.microsoft.com/office/word/2010/wordprocessingShape" mc:Ignorable="w14 w15 w16se w16cid w16 w16cex w16sdtdh w16sdtfl w16du wp14">
-  <w:comment w:id="0" w:author="N Bernard" w:date="2026-04-09T16:50:00Z" w:initials="NB">
-    <w:p>
-      <w:pPr>
-        <w:pStyle w:val="Commentaire"/>
-      </w:pPr>
-      <w:r>
-        <w:rPr>
-          <w:rStyle w:val="Marquedecommentaire"/>
-        </w:rPr>
-        <w:annotationRef/>
-      </w:r>
-      <w:r>
-        <w:t>On doit retrouver également ici la structure des chapitres et sous chapitres, mais ici en regroupant.</w:t>
-      </w:r>
-    </w:p>
-  </w:comment>
-</w:comments>
-</file>
-
-<file path=word/commentsExtended.xml><?xml version="1.0" encoding="utf-8"?>
-<w15:commentsEx xmlns:wpc="http://schemas.microsoft.com/office/word/2010/wordprocessingCanvas" xmlns:cx="http://schemas.microsoft.com/office/drawing/2014/chartex" xmlns:cx1="http://schemas.microsoft.com/office/drawing/2015/9/8/chartex" xmlns:cx2="http://schemas.microsoft.com/office/drawing/2015/10/21/chartex" xmlns:cx3="http://schemas.microsoft.com/office/drawing/2016/5/9/chartex" xmlns:cx4="http://schemas.microsoft.com/office/drawing/2016/5/10/chartex" xmlns:cx5="http://schemas.microsoft.com/office/drawing/2016/5/11/chartex" xmlns:cx6="http://schemas.microsoft.com/office/drawing/2016/5/12/chartex" xmlns:cx7="http://schemas.microsoft.com/office/drawing/2016/5/13/chartex" xmlns:cx8="http://schemas.microsoft.com/office/drawing/2016/5/14/chartex" xmlns:mc="http://schemas.openxmlformats.org/markup-compatibility/2006" xmlns:aink="http://schemas.microsoft.com/office/drawing/2016/ink" xmlns:am3d="http://schemas.microsoft.com/office/drawing/2017/model3d" xmlns:o="urn:schemas-microsoft-com:office:office" xmlns:oel="http://schemas.microsoft.com/office/2019/extlst" xmlns:r="http://schemas.openxmlformats.org/officeDocument/2006/relationships" xmlns:m="http://schemas.openxmlformats.org/officeDocument/2006/math" xmlns:v="urn:schemas-microsoft-com:vml" xmlns:wp14="http://schemas.microsoft.com/office/word/2010/wordprocessingDrawing" xmlns:wp="http://schemas.openxmlformats.org/drawingml/2006/wordprocessingDrawing" xmlns:w10="urn:schemas-microsoft-com:office:word" xmlns:w="http://schemas.openxmlformats.org/wordprocessingml/2006/main" xmlns:w14="http://schemas.microsoft.com/office/word/2010/wordml" xmlns:w15="http://schemas.microsoft.com/office/word/2012/wordml" xmlns:w16cex="http://schemas.microsoft.com/office/word/2018/wordml/cex" xmlns:w16cid="http://schemas.microsoft.com/office/word/2016/wordml/cid" xmlns:w16="http://schemas.microsoft.com/office/word/2018/wordml" xmlns:w16du="http://schemas.microsoft.com/office/word/2023/wordml/word16du" xmlns:w16sdtdh="http://schemas.microsoft.com/office/word/2020/wordml/sdtdatahash" xmlns:w16sdtfl="http://schemas.microsoft.com/office/word/2024/wordml/sdtformatlock" xmlns:w16se="http://schemas.microsoft.com/office/word/2015/wordml/symex" xmlns:wpg="http://schemas.microsoft.com/office/word/2010/wordprocessingGroup" xmlns:wpi="http://schemas.microsoft.com/office/word/2010/wordprocessingInk" xmlns:wne="http://schemas.microsoft.com/office/word/2006/wordml" xmlns:wps="http://schemas.microsoft.com/office/word/2010/wordprocessingShape" mc:Ignorable="w14 w15 w16se w16cid w16 w16cex w16sdtdh w16sdtfl w16du wp14">
-  <w15:commentEx w15:paraId="68049A65" w15:done="0"/>
-</w15:commentsEx>
-</file>
-
-<file path=word/commentsExtensible.xml><?xml version="1.0" encoding="utf-8"?>
-<w16cex:commentsExtensible xmlns:wpc="http://schemas.microsoft.com/office/word/2010/wordprocessingCanvas" xmlns:cx="http://schemas.microsoft.com/office/drawing/2014/chartex" xmlns:cx1="http://schemas.microsoft.com/office/drawing/2015/9/8/chartex" xmlns:cx2="http://schemas.microsoft.com/office/drawing/2015/10/21/chartex" xmlns:cx3="http://schemas.microsoft.com/office/drawing/2016/5/9/chartex" xmlns:cx4="http://schemas.microsoft.com/office/drawing/2016/5/10/chartex" xmlns:cx5="http://schemas.microsoft.com/office/drawing/2016/5/11/chartex" xmlns:cx6="http://schemas.microsoft.com/office/drawing/2016/5/12/chartex" xmlns:cx7="http://schemas.microsoft.com/office/drawing/2016/5/13/chartex" xmlns:cx8="http://schemas.microsoft.com/office/drawing/2016/5/14/chartex" xmlns:cr="http://schemas.microsoft.com/office/comments/2020/reactions" xmlns:mc="http://schemas.openxmlformats.org/markup-compatibility/2006" xmlns:aink="http://schemas.microsoft.com/office/drawing/2016/ink" xmlns:am3d="http://schemas.microsoft.com/office/drawing/2017/model3d" xmlns:o="urn:schemas-microsoft-com:office:office" xmlns:oel="http://schemas.microsoft.com/office/2019/extlst" xmlns:r="http://schemas.openxmlformats.org/officeDocument/2006/relationships" xmlns:m="http://schemas.openxmlformats.org/officeDocument/2006/math" xmlns:v="urn:schemas-microsoft-com:vml" xmlns:wp14="http://schemas.microsoft.com/office/word/2010/wordprocessingDrawing" xmlns:wp="http://schemas.openxmlformats.org/drawingml/2006/wordprocessingDrawing" xmlns:w10="urn:schemas-microsoft-com:office:word" xmlns:w="http://schemas.openxmlformats.org/wordprocessingml/2006/main" xmlns:w14="http://schemas.microsoft.com/office/word/2010/wordml" xmlns:w15="http://schemas.microsoft.com/office/word/2012/wordml" xmlns:w16cex="http://schemas.microsoft.com/office/word/2018/wordml/cex" xmlns:w16cid="http://schemas.microsoft.com/office/word/2016/wordml/cid" xmlns:w16="http://schemas.microsoft.com/office/word/2018/wordml" xmlns:w16du="http://schemas.microsoft.com/office/word/2023/wordml/word16du" xmlns:w16sdtdh="http://schemas.microsoft.com/office/word/2020/wordml/sdtdatahash" xmlns:w16sdtfl="http://schemas.microsoft.com/office/word/2024/wordml/sdtformatlock" xmlns:w16se="http://schemas.microsoft.com/office/word/2015/wordml/symex" xmlns:wpg="http://schemas.microsoft.com/office/word/2010/wordprocessingGroup" xmlns:wpi="http://schemas.microsoft.com/office/word/2010/wordprocessingInk" xmlns:wne="http://schemas.microsoft.com/office/word/2006/wordml" xmlns:wps="http://schemas.microsoft.com/office/word/2010/wordprocessingShape" mc:Ignorable="w14 w15 w16se w16cid w16 w16cex w16sdtdh w16sdtfl cr w16du wp14">
-  <w16cex:commentExtensible w16cex:durableId="417ECA6A" w16cex:dateUtc="2026-04-09T14:50:00Z"/>
-</w16cex:commentsExtensible>
-</file>
-
-<file path=word/commentsIds.xml><?xml version="1.0" encoding="utf-8"?>
-<w16cid:commentsIds xmlns:wpc="http://schemas.microsoft.com/office/word/2010/wordprocessingCanvas" xmlns:cx="http://schemas.microsoft.com/office/drawing/2014/chartex" xmlns:cx1="http://schemas.microsoft.com/office/drawing/2015/9/8/chartex" xmlns:cx2="http://schemas.microsoft.com/office/drawing/2015/10/21/chartex" xmlns:cx3="http://schemas.microsoft.com/office/drawing/2016/5/9/chartex" xmlns:cx4="http://schemas.microsoft.com/office/drawing/2016/5/10/chartex" xmlns:cx5="http://schemas.microsoft.com/office/drawing/2016/5/11/chartex" xmlns:cx6="http://schemas.microsoft.com/office/drawing/2016/5/12/chartex" xmlns:cx7="http://schemas.microsoft.com/office/drawing/2016/5/13/chartex" xmlns:cx8="http://schemas.microsoft.com/office/drawing/2016/5/14/chartex" xmlns:mc="http://schemas.openxmlformats.org/markup-compatibility/2006" xmlns:aink="http://schemas.microsoft.com/office/drawing/2016/ink" xmlns:am3d="http://schemas.microsoft.com/office/drawing/2017/model3d" xmlns:o="urn:schemas-microsoft-com:office:office" xmlns:oel="http://schemas.microsoft.com/office/2019/extlst" xmlns:r="http://schemas.openxmlformats.org/officeDocument/2006/relationships" xmlns:m="http://schemas.openxmlformats.org/officeDocument/2006/math" xmlns:v="urn:schemas-microsoft-com:vml" xmlns:wp14="http://schemas.microsoft.com/office/word/2010/wordprocessingDrawing" xmlns:wp="http://schemas.openxmlformats.org/drawingml/2006/wordprocessingDrawing" xmlns:w10="urn:schemas-microsoft-com:office:word" xmlns:w="http://schemas.openxmlformats.org/wordprocessingml/2006/main" xmlns:w14="http://schemas.microsoft.com/office/word/2010/wordml" xmlns:w15="http://schemas.microsoft.com/office/word/2012/wordml" xmlns:w16cex="http://schemas.microsoft.com/office/word/2018/wordml/cex" xmlns:w16cid="http://schemas.microsoft.com/office/word/2016/wordml/cid" xmlns:w16="http://schemas.microsoft.com/office/word/2018/wordml" xmlns:w16du="http://schemas.microsoft.com/office/word/2023/wordml/word16du" xmlns:w16sdtdh="http://schemas.microsoft.com/office/word/2020/wordml/sdtdatahash" xmlns:w16sdtfl="http://schemas.microsoft.com/office/word/2024/wordml/sdtformatlock" xmlns:w16se="http://schemas.microsoft.com/office/word/2015/wordml/symex" xmlns:wpg="http://schemas.microsoft.com/office/word/2010/wordprocessingGroup" xmlns:wpi="http://schemas.microsoft.com/office/word/2010/wordprocessingInk" xmlns:wne="http://schemas.microsoft.com/office/word/2006/wordml" xmlns:wps="http://schemas.microsoft.com/office/word/2010/wordprocessingShape" mc:Ignorable="w14 w15 w16se w16cid w16 w16cex w16sdtdh w16sdtfl w16du wp14">
-  <w16cid:commentId w16cid:paraId="68049A65" w16cid:durableId="417ECA6A"/>
-</w16cid:commentsIds>
 </file>
 
 <file path=word/numbering.xml><?xml version="1.0" encoding="utf-8"?>
@@ -5703,14 +5844,6 @@
     <w:abstractNumId w:val="6"/>
   </w:num>
 </w:numbering>
-</file>
-
-<file path=word/people.xml><?xml version="1.0" encoding="utf-8"?>
-<w15:people xmlns:wpc="http://schemas.microsoft.com/office/word/2010/wordprocessingCanvas" xmlns:cx="http://schemas.microsoft.com/office/drawing/2014/chartex" xmlns:cx1="http://schemas.microsoft.com/office/drawing/2015/9/8/chartex" xmlns:cx2="http://schemas.microsoft.com/office/drawing/2015/10/21/chartex" xmlns:cx3="http://schemas.microsoft.com/office/drawing/2016/5/9/chartex" xmlns:cx4="http://schemas.microsoft.com/office/drawing/2016/5/10/chartex" xmlns:cx5="http://schemas.microsoft.com/office/drawing/2016/5/11/chartex" xmlns:cx6="http://schemas.microsoft.com/office/drawing/2016/5/12/chartex" xmlns:cx7="http://schemas.microsoft.com/office/drawing/2016/5/13/chartex" xmlns:cx8="http://schemas.microsoft.com/office/drawing/2016/5/14/chartex" xmlns:mc="http://schemas.openxmlformats.org/markup-compatibility/2006" xmlns:aink="http://schemas.microsoft.com/office/drawing/2016/ink" xmlns:am3d="http://schemas.microsoft.com/office/drawing/2017/model3d" xmlns:o="urn:schemas-microsoft-com:office:office" xmlns:oel="http://schemas.microsoft.com/office/2019/extlst" xmlns:r="http://schemas.openxmlformats.org/officeDocument/2006/relationships" xmlns:m="http://schemas.openxmlformats.org/officeDocument/2006/math" xmlns:v="urn:schemas-microsoft-com:vml" xmlns:wp14="http://schemas.microsoft.com/office/word/2010/wordprocessingDrawing" xmlns:wp="http://schemas.openxmlformats.org/drawingml/2006/wordprocessingDrawing" xmlns:w10="urn:schemas-microsoft-com:office:word" xmlns:w="http://schemas.openxmlformats.org/wordprocessingml/2006/main" xmlns:w14="http://schemas.microsoft.com/office/word/2010/wordml" xmlns:w15="http://schemas.microsoft.com/office/word/2012/wordml" xmlns:w16cex="http://schemas.microsoft.com/office/word/2018/wordml/cex" xmlns:w16cid="http://schemas.microsoft.com/office/word/2016/wordml/cid" xmlns:w16="http://schemas.microsoft.com/office/word/2018/wordml" xmlns:w16du="http://schemas.microsoft.com/office/word/2023/wordml/word16du" xmlns:w16sdtdh="http://schemas.microsoft.com/office/word/2020/wordml/sdtdatahash" xmlns:w16sdtfl="http://schemas.microsoft.com/office/word/2024/wordml/sdtformatlock" xmlns:w16se="http://schemas.microsoft.com/office/word/2015/wordml/symex" xmlns:wpg="http://schemas.microsoft.com/office/word/2010/wordprocessingGroup" xmlns:wpi="http://schemas.microsoft.com/office/word/2010/wordprocessingInk" xmlns:wne="http://schemas.microsoft.com/office/word/2006/wordml" xmlns:wps="http://schemas.microsoft.com/office/word/2010/wordprocessingShape" mc:Ignorable="w14 w15 w16se w16cid w16 w16cex w16sdtdh w16sdtfl w16du wp14">
-  <w15:person w15:author="N Bernard">
-    <w15:presenceInfo w15:providerId="None" w15:userId="N Bernard"/>
-  </w15:person>
-</w15:people>
 </file>
 
 <file path=word/styles.xml><?xml version="1.0" encoding="utf-8"?>
@@ -6114,9 +6247,10 @@
     <w:name w:val="Normal"/>
     <w:uiPriority w:val="1"/>
     <w:qFormat/>
-    <w:rsid w:val="00776EF5"/>
+    <w:rsid w:val="00DC0CB0"/>
     <w:pPr>
       <w:spacing w:after="0" w:line="240" w:lineRule="auto"/>
+      <w:jc w:val="both"/>
     </w:pPr>
     <w:rPr>
       <w:rFonts w:ascii="Times New Roman" w:eastAsia="Times New Roman" w:hAnsi="Times New Roman" w:cs="Times New Roman"/>
@@ -6361,6 +6495,7 @@
   <w:style w:type="character" w:default="1" w:styleId="Policepardfaut">
     <w:name w:val="Default Paragraph Font"/>
     <w:uiPriority w:val="1"/>
+    <w:semiHidden/>
     <w:unhideWhenUsed/>
   </w:style>
   <w:style w:type="table" w:default="1" w:styleId="TableauNormal">

</xml_diff>

<commit_message>
Revert "[CHANGE] change the code (bad move)"
This reverts commit 0ea2f298bebddb8a137123cc0c86a575a22fefa2.
</commit_message>
<xml_diff>
--- a/assets/templates/template_scada.docx
+++ b/assets/templates/template_scada.docx
@@ -152,7 +152,7 @@
           </mc:Choice>
           <mc:Fallback>
             <w:pict>
-              <v:shape w14:anchorId="53C37D39" id="Rectangle : avec coin rogné 31" o:spid="_x0000_s1026" style="position:absolute;left:0;text-align:left;margin-left:-14.05pt;margin-top:151.45pt;width:502.8pt;height:81.6pt;z-index:251660288;visibility:visible;mso-wrap-style:square;mso-width-percent:0;mso-height-percent:0;mso-wrap-distance-left:9pt;mso-wrap-distance-top:0;mso-wrap-distance-right:9pt;mso-wrap-distance-bottom:0;mso-position-horizontal:absolute;mso-position-horizontal-relative:margin;mso-position-vertical:absolute;mso-position-vertical-relative:page;mso-width-percent:0;mso-height-percent:0;mso-width-relative:margin;mso-height-relative:margin;v-text-anchor:top" coordsize="6385560,1036320" o:spt="100" o:gfxdata="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" adj="-11796480,,5400" path="m,l5924698,r460862,460862l6385560,1036320,,1036320,,xe" fillcolor="#0e2841 [3215]" stroked="f" strokeweight="1pt">
+              <v:shape w14:anchorId="53C37D39" id="Rectangle : avec coin rogné 31" o:spid="_x0000_s1026" style="position:absolute;margin-left:-14.05pt;margin-top:151.45pt;width:502.8pt;height:81.6pt;z-index:251660288;visibility:visible;mso-wrap-style:square;mso-width-percent:0;mso-height-percent:0;mso-wrap-distance-left:9pt;mso-wrap-distance-top:0;mso-wrap-distance-right:9pt;mso-wrap-distance-bottom:0;mso-position-horizontal:absolute;mso-position-horizontal-relative:margin;mso-position-vertical:absolute;mso-position-vertical-relative:page;mso-width-percent:0;mso-height-percent:0;mso-width-relative:margin;mso-height-relative:margin;v-text-anchor:top" coordsize="6385560,1036320" o:spt="100" o:gfxdata="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" adj="-11796480,,5400" path="m,l5924698,r460862,460862l6385560,1036320,,1036320,,xe" fillcolor="#0e2841 [3215]" stroked="f" strokeweight="1pt">
                 <v:stroke joinstyle="miter"/>
                 <v:formulas/>
                 <v:path arrowok="t" o:connecttype="custom" o:connectlocs="0,0;5924698,0;6385560,460862;6385560,1036320;0,1036320;0,0" o:connectangles="0,0,0,0,0,0" textboxrect="0,0,6385560,1036320"/>
@@ -1075,13 +1075,8 @@
       </w:r>
     </w:p>
     <w:p>
-      <w:proofErr w:type="gramStart"/>
-      <w:r>
-        <w:t>Email</w:t>
-      </w:r>
-      <w:proofErr w:type="gramEnd"/>
-      <w:r>
-        <w:t xml:space="preserve"> : {{MAIL_AUTEUR}}</w:t>
+      <w:r>
+        <w:t>Email : {{MAIL_AUTEUR}}</w:t>
       </w:r>
     </w:p>
     <w:p>
@@ -1101,13 +1096,8 @@
       </w:r>
     </w:p>
     <w:p>
-      <w:proofErr w:type="gramStart"/>
-      <w:r>
-        <w:t>Email</w:t>
-      </w:r>
-      <w:proofErr w:type="gramEnd"/>
-      <w:r>
-        <w:t xml:space="preserve"> : {{MAIL_VERIFICATEUR}}</w:t>
+      <w:r>
+        <w:t>Email : {{MAIL_VERIFICATEUR}}</w:t>
       </w:r>
     </w:p>
     <w:p>
@@ -1127,13 +1117,8 @@
       </w:r>
     </w:p>
     <w:p>
-      <w:proofErr w:type="gramStart"/>
-      <w:r>
-        <w:t>Email</w:t>
-      </w:r>
-      <w:proofErr w:type="gramEnd"/>
-      <w:r>
-        <w:t xml:space="preserve"> : {{MAIL_APPROBATEUR}}</w:t>
+      <w:r>
+        <w:t>Email : {{MAIL_APPROBATEUR}}</w:t>
       </w:r>
     </w:p>
     <w:p>
@@ -1160,6 +1145,9 @@
       </w:r>
     </w:p>
     <w:p>
+      <w:pPr>
+        <w:jc w:val="both"/>
+      </w:pPr>
       <w:r>
         <w:t xml:space="preserve">Les données SCADA du parc éolien </w:t>
       </w:r>
@@ -1254,30 +1242,29 @@
         <w:t xml:space="preserve"> L’ensemble des turbines a été pris en compte dans l’analyse.</w:t>
       </w:r>
     </w:p>
+    <w:p>
+      <w:pPr>
+        <w:jc w:val="both"/>
+      </w:pPr>
+    </w:p>
+    <w:p>
+      <w:pPr>
+        <w:jc w:val="both"/>
+      </w:pPr>
+      <w:r>
+        <w:t>Le tableau ci-après présente une évaluation synthétique des performances du parc, en mettant en évidence, pour chaque indicateur, le niveau de performance de chaque éolienne ainsi que les éventuels écarts observés.</w:t>
+      </w:r>
+    </w:p>
     <w:p/>
     <w:p>
       <w:r>
-        <w:t>Le tableau ci-après présente une évaluation synthétique des performances du parc, en mettant en évidence, pour chaque indicateur, le niveau de performance de chaque éolienne ainsi que les éventuels écarts observés.</w:t>
-      </w:r>
-    </w:p>
-    <w:p/>
-    <w:p>
-      <w:r>
-        <w:t>[</w:t>
-      </w:r>
-      <w:proofErr w:type="gramStart"/>
-      <w:r>
-        <w:t>T</w:t>
+        <w:t>[T</w:t>
       </w:r>
       <w:r>
         <w:t>ODO</w:t>
       </w:r>
       <w:r>
-        <w:t>:SCADA</w:t>
-      </w:r>
-      <w:proofErr w:type="gramEnd"/>
-      <w:r>
-        <w:t>_SUMMARY_TABLE]</w:t>
+        <w:t>:SCADA_SUMMARY_TABLE]</w:t>
       </w:r>
     </w:p>
     <w:p>
@@ -1297,6 +1284,9 @@
       </w:r>
     </w:p>
     <w:p>
+      <w:pPr>
+        <w:jc w:val="both"/>
+      </w:pPr>
       <w:r>
         <w:t>Le parc éolien {{</w:t>
       </w:r>
@@ -1334,25 +1324,20 @@
       </w:r>
       <w:proofErr w:type="spellStart"/>
       <w:r>
-        <w:t>total_</w:t>
-      </w:r>
-      <w:proofErr w:type="gramStart"/>
-      <w:r>
-        <w:t>power</w:t>
+        <w:t>total_power</w:t>
       </w:r>
       <w:proofErr w:type="spellEnd"/>
       <w:r>
         <w:t xml:space="preserve"> </w:t>
       </w:r>
       <w:r>
-        <w:t>}</w:t>
-      </w:r>
-      <w:proofErr w:type="gramEnd"/>
-      <w:r>
-        <w:t>}.</w:t>
-      </w:r>
-    </w:p>
-    <w:p>
+        <w:t>}}.</w:t>
+      </w:r>
+    </w:p>
+    <w:p>
+      <w:pPr>
+        <w:jc w:val="both"/>
+      </w:pPr>
       <w:r>
         <w:t>Les éoliennes du parc sont identifiées comme suit : {{</w:t>
       </w:r>
@@ -1385,6 +1370,9 @@
       </w:r>
     </w:p>
     <w:p>
+      <w:pPr>
+        <w:jc w:val="both"/>
+      </w:pPr>
       <w:r>
         <w:t>[TODO.IMAGE_POSITION]</w:t>
       </w:r>
@@ -1427,21 +1415,13 @@
     </w:p>
     <w:p>
       <w:r>
-        <w:t>[</w:t>
-      </w:r>
-      <w:proofErr w:type="gramStart"/>
-      <w:r>
-        <w:t>T</w:t>
+        <w:t>[T</w:t>
       </w:r>
       <w:r>
         <w:t>ODO</w:t>
       </w:r>
       <w:r>
-        <w:t>:</w:t>
-      </w:r>
-      <w:proofErr w:type="gramEnd"/>
-      <w:r>
-        <w:t>CSV_FILES_TABLE]</w:t>
+        <w:t>:CSV_FILES_TABLE]</w:t>
       </w:r>
     </w:p>
     <w:p>
@@ -1470,8 +1450,8 @@
         <w:tblLook w:val="04A0" w:firstRow="1" w:lastRow="0" w:firstColumn="1" w:lastColumn="0" w:noHBand="0" w:noVBand="1"/>
       </w:tblPr>
       <w:tblGrid>
-        <w:gridCol w:w="2069"/>
-        <w:gridCol w:w="6188"/>
+        <w:gridCol w:w="2293"/>
+        <w:gridCol w:w="5964"/>
       </w:tblGrid>
       <w:tr>
         <w:tc>
@@ -1496,7 +1476,34 @@
                 <w:szCs w:val="22"/>
               </w:rPr>
               <w:lastRenderedPageBreak/>
-              <w:t>Thématique</w:t>
+              <w:t>Thématiq</w:t>
+            </w:r>
+            <w:commentRangeStart w:id="0"/>
+            <w:r>
+              <w:rPr>
+                <w:rFonts w:ascii="Cambria" w:eastAsia="MS Mincho" w:hAnsi="Cambria"/>
+                <w:sz w:val="22"/>
+                <w:szCs w:val="22"/>
+              </w:rPr>
+              <w:t>u</w:t>
+            </w:r>
+            <w:commentRangeEnd w:id="0"/>
+            <w:r>
+              <w:rPr>
+                <w:rStyle w:val="Marquedecommentaire"/>
+                <w:rFonts w:ascii="Cambria" w:eastAsia="MS Mincho" w:hAnsi="Cambria"/>
+                <w:sz w:val="22"/>
+                <w:szCs w:val="22"/>
+              </w:rPr>
+              <w:commentReference w:id="0"/>
+            </w:r>
+            <w:r>
+              <w:rPr>
+                <w:rFonts w:ascii="Cambria" w:eastAsia="MS Mincho" w:hAnsi="Cambria"/>
+                <w:sz w:val="22"/>
+                <w:szCs w:val="22"/>
+              </w:rPr>
+              <w:t>e</w:t>
             </w:r>
             <w:proofErr w:type="spellEnd"/>
           </w:p>
@@ -2255,13 +2262,8 @@
           <w:numId w:val="6"/>
         </w:numPr>
       </w:pPr>
-      <w:proofErr w:type="gramStart"/>
-      <w:r>
-        <w:t>variables</w:t>
-      </w:r>
-      <w:proofErr w:type="gramEnd"/>
-      <w:r>
-        <w:t xml:space="preserve"> environnementales : </w:t>
+      <w:r>
+        <w:t xml:space="preserve">variables environnementales : </w:t>
       </w:r>
     </w:p>
     <w:p>
@@ -2272,13 +2274,8 @@
           <w:numId w:val="6"/>
         </w:numPr>
       </w:pPr>
-      <w:proofErr w:type="gramStart"/>
-      <w:r>
-        <w:t>vitesse</w:t>
-      </w:r>
-      <w:proofErr w:type="gramEnd"/>
-      <w:r>
-        <w:t xml:space="preserve"> du vent </w:t>
+      <w:r>
+        <w:t xml:space="preserve">vitesse du vent </w:t>
       </w:r>
     </w:p>
     <w:p>
@@ -2289,13 +2286,8 @@
           <w:numId w:val="6"/>
         </w:numPr>
       </w:pPr>
-      <w:proofErr w:type="gramStart"/>
-      <w:r>
-        <w:t>direction</w:t>
-      </w:r>
-      <w:proofErr w:type="gramEnd"/>
-      <w:r>
-        <w:t xml:space="preserve"> du vent </w:t>
+      <w:r>
+        <w:t xml:space="preserve">direction du vent </w:t>
       </w:r>
     </w:p>
     <w:p>
@@ -2306,13 +2298,8 @@
           <w:numId w:val="6"/>
         </w:numPr>
       </w:pPr>
-      <w:proofErr w:type="gramStart"/>
-      <w:r>
-        <w:t>température</w:t>
-      </w:r>
-      <w:proofErr w:type="gramEnd"/>
-      <w:r>
-        <w:t xml:space="preserve"> ambiante </w:t>
+      <w:r>
+        <w:t xml:space="preserve">température ambiante </w:t>
       </w:r>
     </w:p>
     <w:p>
@@ -2323,13 +2310,8 @@
           <w:numId w:val="6"/>
         </w:numPr>
       </w:pPr>
-      <w:proofErr w:type="gramStart"/>
-      <w:r>
-        <w:t>variables</w:t>
-      </w:r>
-      <w:proofErr w:type="gramEnd"/>
-      <w:r>
-        <w:t xml:space="preserve"> opérationnelles clés : </w:t>
+      <w:r>
+        <w:t xml:space="preserve">variables opérationnelles clés : </w:t>
       </w:r>
     </w:p>
     <w:p>
@@ -2340,13 +2322,8 @@
           <w:numId w:val="6"/>
         </w:numPr>
       </w:pPr>
-      <w:proofErr w:type="gramStart"/>
-      <w:r>
-        <w:t>puissance</w:t>
-      </w:r>
-      <w:proofErr w:type="gramEnd"/>
-      <w:r>
-        <w:t xml:space="preserve"> active produite </w:t>
+      <w:r>
+        <w:t xml:space="preserve">puissance active produite </w:t>
       </w:r>
     </w:p>
     <w:p/>
@@ -2628,13 +2605,8 @@
           <w:numId w:val="8"/>
         </w:numPr>
       </w:pPr>
-      <w:proofErr w:type="gramStart"/>
-      <w:r>
-        <w:t>la</w:t>
-      </w:r>
-      <w:proofErr w:type="gramEnd"/>
-      <w:r>
-        <w:t xml:space="preserve"> disponibilité énergétique brute (</w:t>
+      <w:r>
+        <w:t>la disponibilité énergétique brute (</w:t>
       </w:r>
       <w:proofErr w:type="spellStart"/>
       <w:r>
@@ -2661,40 +2633,21 @@
           <w:numId w:val="8"/>
         </w:numPr>
       </w:pPr>
-      <w:proofErr w:type="gramStart"/>
-      <w:r>
-        <w:t>la</w:t>
-      </w:r>
-      <w:proofErr w:type="gramEnd"/>
-      <w:r>
-        <w:t xml:space="preserve"> disponibilité énergétique imputable au fabricant</w:t>
-      </w:r>
-    </w:p>
-    <w:p>
-      <w:pPr>
-        <w:rPr>
-          <w:lang w:val="en-US"/>
-        </w:rPr>
-      </w:pPr>
-      <w:r>
-        <w:rPr>
-          <w:lang w:val="en-US"/>
-        </w:rPr>
-        <w:t>[</w:t>
-      </w:r>
-      <w:proofErr w:type="gramStart"/>
-      <w:r>
-        <w:rPr>
-          <w:lang w:val="en-US"/>
-        </w:rPr>
-        <w:t>TABLE:EBA</w:t>
-      </w:r>
-      <w:proofErr w:type="gramEnd"/>
-      <w:r>
-        <w:rPr>
-          <w:lang w:val="en-US"/>
-        </w:rPr>
-        <w:t>_CUT_IN_CUT_OUT_TABLE]</w:t>
+      <w:r>
+        <w:t>la disponibilité énergétique imputable au fabricant</w:t>
+      </w:r>
+    </w:p>
+    <w:p>
+      <w:pPr>
+        <w:rPr>
+          <w:lang w:val="en-US"/>
+        </w:rPr>
+      </w:pPr>
+      <w:r>
+        <w:rPr>
+          <w:lang w:val="en-US"/>
+        </w:rPr>
+        <w:t>[TABLE:EBA_CUT_IN_CUT_OUT_TABLE]</w:t>
       </w:r>
     </w:p>
     <w:p>
@@ -2741,21 +2694,7 @@
         <w:rPr>
           <w:lang w:val="en-US"/>
         </w:rPr>
-        <w:t>[</w:t>
-      </w:r>
-      <w:proofErr w:type="gramStart"/>
-      <w:r>
-        <w:rPr>
-          <w:lang w:val="en-US"/>
-        </w:rPr>
-        <w:t>TABLE:EBA</w:t>
-      </w:r>
-      <w:proofErr w:type="gramEnd"/>
-      <w:r>
-        <w:rPr>
-          <w:lang w:val="en-US"/>
-        </w:rPr>
-        <w:t>_MANUFACTURER_TABLE]</w:t>
+        <w:t>[TABLE:EBA_MANUFACTURER_TABLE]</w:t>
       </w:r>
       <w:r>
         <w:rPr>
@@ -2800,15 +2739,7 @@
     </w:p>
     <w:p>
       <w:r>
-        <w:t>[</w:t>
-      </w:r>
-      <w:proofErr w:type="gramStart"/>
-      <w:r>
-        <w:t>TABLE:EBA</w:t>
-      </w:r>
-      <w:proofErr w:type="gramEnd"/>
-      <w:r>
-        <w:t>_LOSS_TABLE]</w:t>
+        <w:t>[TABLE:EBA_LOSS_TABLE]</w:t>
       </w:r>
     </w:p>
     <w:p>
@@ -2975,21 +2906,7 @@
         <w:rPr>
           <w:lang w:val="en-US"/>
         </w:rPr>
-        <w:t>[</w:t>
-      </w:r>
-      <w:proofErr w:type="gramStart"/>
-      <w:r>
-        <w:rPr>
-          <w:lang w:val="en-US"/>
-        </w:rPr>
-        <w:t>TABLE:ERROR</w:t>
-      </w:r>
-      <w:proofErr w:type="gramEnd"/>
-      <w:r>
-        <w:rPr>
-          <w:lang w:val="en-US"/>
-        </w:rPr>
-        <w:t>_</w:t>
+        <w:t>[TABLE:ERROR_</w:t>
       </w:r>
       <w:r>
         <w:rPr>
@@ -3021,21 +2938,7 @@
         <w:rPr>
           <w:lang w:val="en-US"/>
         </w:rPr>
-        <w:t>[</w:t>
-      </w:r>
-      <w:proofErr w:type="gramStart"/>
-      <w:r>
-        <w:rPr>
-          <w:lang w:val="en-US"/>
-        </w:rPr>
-        <w:t>TABLE:ERROR</w:t>
-      </w:r>
-      <w:proofErr w:type="gramEnd"/>
-      <w:r>
-        <w:rPr>
-          <w:lang w:val="en-US"/>
-        </w:rPr>
-        <w:t>_</w:t>
+        <w:t>[TABLE:ERROR_</w:t>
       </w:r>
       <w:r>
         <w:rPr>
@@ -3211,7 +3114,6 @@
     <w:p/>
     <w:p>
       <w:r>
-        <w:lastRenderedPageBreak/>
         <w:t>Les figures ci-après présentent les roses des vents pour chaque éolienne sur les périodes communes, ainsi que les biais directionnels moyens calculés, en relatif entre éoliennes et par rapport à la référence externe.</w:t>
       </w:r>
     </w:p>
@@ -3226,21 +3128,7 @@
         <w:rPr>
           <w:lang w:val="en-US"/>
         </w:rPr>
-        <w:t>[</w:t>
-      </w:r>
-      <w:proofErr w:type="gramStart"/>
-      <w:r>
-        <w:rPr>
-          <w:lang w:val="en-US"/>
-        </w:rPr>
-        <w:t>TABLE:WIND</w:t>
-      </w:r>
-      <w:proofErr w:type="gramEnd"/>
-      <w:r>
-        <w:rPr>
-          <w:lang w:val="en-US"/>
-        </w:rPr>
-        <w:t>_DIRECTION_CALIBRATION_TABLE]</w:t>
+        <w:t>[TABLE:WIND_DIRECTION_CALIBRATION_TABLE]</w:t>
       </w:r>
     </w:p>
     <w:p>
@@ -3489,21 +3377,7 @@
         <w:rPr>
           <w:lang w:val="en-US"/>
         </w:rPr>
-        <w:t>[</w:t>
-      </w:r>
-      <w:proofErr w:type="gramStart"/>
-      <w:r>
-        <w:rPr>
-          <w:lang w:val="en-US"/>
-        </w:rPr>
-        <w:t>TABLE:NORMATIVE</w:t>
-      </w:r>
-      <w:proofErr w:type="gramEnd"/>
-      <w:r>
-        <w:rPr>
-          <w:lang w:val="en-US"/>
-        </w:rPr>
-        <w:t>_YIELD_TABLE]</w:t>
+        <w:t>[TABLE:NORMATIVE_YIELD_TABLE]</w:t>
       </w:r>
     </w:p>
     <w:p>
@@ -3577,13 +3451,9 @@
           <w:numId w:val="13"/>
         </w:numPr>
       </w:pPr>
-      <w:proofErr w:type="gramStart"/>
-      <w:r>
-        <w:t>les</w:t>
-      </w:r>
-      <w:proofErr w:type="gramEnd"/>
-      <w:r>
-        <w:t xml:space="preserve"> périodes de limitations environnementales (bruit, chauves-souris, ombrage, etc.), </w:t>
+      <w:r>
+        <w:lastRenderedPageBreak/>
+        <w:t xml:space="preserve">les périodes de limitations environnementales (bruit, chauves-souris, ombrage, etc.), </w:t>
       </w:r>
     </w:p>
     <w:p>
@@ -3594,14 +3464,8 @@
           <w:numId w:val="13"/>
         </w:numPr>
       </w:pPr>
-      <w:proofErr w:type="gramStart"/>
-      <w:r>
-        <w:lastRenderedPageBreak/>
-        <w:t>les</w:t>
-      </w:r>
-      <w:proofErr w:type="gramEnd"/>
-      <w:r>
-        <w:t xml:space="preserve"> phases de démarrage et d’arrêt, </w:t>
+      <w:r>
+        <w:t xml:space="preserve">les phases de démarrage et d’arrêt, </w:t>
       </w:r>
     </w:p>
     <w:p>
@@ -3612,16 +3476,14 @@
           <w:numId w:val="13"/>
         </w:numPr>
       </w:pPr>
-      <w:proofErr w:type="gramStart"/>
-      <w:r>
-        <w:t>les</w:t>
-      </w:r>
-      <w:proofErr w:type="gramEnd"/>
-      <w:r>
-        <w:t xml:space="preserve"> situations transitoires ou non représentatives du fonctionnement normal. </w:t>
-      </w:r>
-    </w:p>
-    <w:p>
+      <w:r>
+        <w:t xml:space="preserve">les situations transitoires ou non représentatives du fonctionnement normal. </w:t>
+      </w:r>
+    </w:p>
+    <w:p>
+      <w:pPr>
+        <w:jc w:val="both"/>
+      </w:pPr>
       <w:r>
         <w:t xml:space="preserve">L’analyse est réalisée sur l’ensemble de la période d’étude, avec une visualisation de l’évolution </w:t>
       </w:r>
@@ -3633,6 +3495,9 @@
       </w:r>
     </w:p>
     <w:p>
+      <w:pPr>
+        <w:jc w:val="both"/>
+      </w:pPr>
       <w:r>
         <w:t>Le TSR</w:t>
       </w:r>
@@ -3650,6 +3515,9 @@
       </w:r>
     </w:p>
     <w:p>
+      <w:pPr>
+        <w:jc w:val="both"/>
+      </w:pPr>
       <w:r>
         <w:t>Les figures ci-après présentent l’évolution de la vitesse de rotation du rotor en fonction de la puissance active pour chaque éolienne, sur la période analysée.</w:t>
       </w:r>
@@ -3665,21 +3533,7 @@
         <w:rPr>
           <w:lang w:val="en-US"/>
         </w:rPr>
-        <w:t>[</w:t>
-      </w:r>
-      <w:proofErr w:type="gramStart"/>
-      <w:r>
-        <w:rPr>
-          <w:lang w:val="en-US"/>
-        </w:rPr>
-        <w:t>TABLE:TIP</w:t>
-      </w:r>
-      <w:proofErr w:type="gramEnd"/>
-      <w:r>
-        <w:rPr>
-          <w:lang w:val="en-US"/>
-        </w:rPr>
-        <w:t>_SPEED_RATIO_TABLE]</w:t>
+        <w:t>[TABLE:TIP_SPEED_RATIO_TABLE]</w:t>
       </w:r>
     </w:p>
     <w:p>
@@ -3837,27 +3691,13 @@
         <w:rPr>
           <w:lang w:val="en-US"/>
         </w:rPr>
-        <w:t>[</w:t>
-      </w:r>
-      <w:proofErr w:type="gramStart"/>
-      <w:r>
-        <w:rPr>
-          <w:lang w:val="en-US"/>
-        </w:rPr>
-        <w:t>T</w:t>
-      </w:r>
-      <w:r>
-        <w:rPr>
-          <w:lang w:val="en-US"/>
-        </w:rPr>
-        <w:t>ABLE:PITCH</w:t>
-      </w:r>
-      <w:proofErr w:type="gramEnd"/>
-      <w:r>
-        <w:rPr>
-          <w:lang w:val="en-US"/>
-        </w:rPr>
-        <w:t>_TABLE</w:t>
+        <w:t>[T</w:t>
+      </w:r>
+      <w:r>
+        <w:rPr>
+          <w:lang w:val="en-US"/>
+        </w:rPr>
+        <w:t>ABLE:PITCH_TABLE</w:t>
       </w:r>
       <w:r>
         <w:rPr>
@@ -3925,7 +3765,11 @@
     </w:p>
     <w:p>
       <w:r>
-        <w:t xml:space="preserve">En complément de l'analyse comparative des courbes de puissance, une analyse individuelle de chaque éolienne est réalisée à partir des données SCADA brutes, sous forme de nuages de points. Cette approche vise à détecter d'éventuelles limitations de production non prévues, non nécessairement visibles dans une comparaison inter-éoliennes. Elle permet notamment d'identifier des situations de </w:t>
+        <w:t xml:space="preserve">En complément de l'analyse comparative des courbes de puissance, une analyse individuelle de chaque éolienne est réalisée à partir des données SCADA brutes, sous forme de nuages de points. Cette approche vise à détecter d'éventuelles limitations de production non prévues, non nécessairement visibles dans une comparaison inter-éoliennes. Elle permet notamment </w:t>
+      </w:r>
+      <w:r>
+        <w:lastRenderedPageBreak/>
+        <w:t xml:space="preserve">d'identifier des situations de </w:t>
       </w:r>
       <w:proofErr w:type="spellStart"/>
       <w:r>
@@ -3933,11 +3777,7 @@
       </w:r>
       <w:proofErr w:type="spellEnd"/>
       <w:r>
-        <w:t xml:space="preserve"> inattendu, visibles à travers des regroupements de </w:t>
-      </w:r>
-      <w:r>
-        <w:lastRenderedPageBreak/>
-        <w:t>points (clusters) s'écartant de la courbe de puissance nominale attendue. L'analyse repose sur la représentation de la puissance active en fonction de la vitesse du vent sous forme de nuages de points. Afin de représenter le comportement nominal des éoliennes, les données sont filtrées pour exclure :</w:t>
+        <w:t xml:space="preserve"> inattendu, visibles à travers des regroupements de points (clusters) s'écartant de la courbe de puissance nominale attendue. L'analyse repose sur la représentation de la puissance active en fonction de la vitesse du vent sous forme de nuages de points. Afin de représenter le comportement nominal des éoliennes, les données sont filtrées pour exclure :</w:t>
       </w:r>
     </w:p>
     <w:p>
@@ -3948,13 +3788,8 @@
           <w:numId w:val="15"/>
         </w:numPr>
       </w:pPr>
-      <w:proofErr w:type="gramStart"/>
-      <w:r>
-        <w:t>les</w:t>
-      </w:r>
-      <w:proofErr w:type="gramEnd"/>
-      <w:r>
-        <w:t xml:space="preserve"> périodes de limitations environnementales (bruit, chauves-souris, ombrage, etc.), </w:t>
+      <w:r>
+        <w:t xml:space="preserve">les périodes de limitations environnementales (bruit, chauves-souris, ombrage, etc.), </w:t>
       </w:r>
     </w:p>
     <w:p>
@@ -3965,13 +3800,8 @@
           <w:numId w:val="15"/>
         </w:numPr>
       </w:pPr>
-      <w:proofErr w:type="gramStart"/>
-      <w:r>
-        <w:t>les</w:t>
-      </w:r>
-      <w:proofErr w:type="gramEnd"/>
-      <w:r>
-        <w:t xml:space="preserve"> phases de démarrage et d'arrêt,</w:t>
+      <w:r>
+        <w:t>les phases de démarrage et d'arrêt,</w:t>
       </w:r>
     </w:p>
     <w:p>
@@ -3982,13 +3812,8 @@
           <w:numId w:val="15"/>
         </w:numPr>
       </w:pPr>
-      <w:proofErr w:type="gramStart"/>
-      <w:r>
-        <w:t>ainsi</w:t>
-      </w:r>
-      <w:proofErr w:type="gramEnd"/>
-      <w:r>
-        <w:t xml:space="preserve"> que les situations non représentatives du fonctionnement normal. </w:t>
+      <w:r>
+        <w:t xml:space="preserve">ainsi que les situations non représentatives du fonctionnement normal. </w:t>
       </w:r>
     </w:p>
     <w:p>
@@ -3997,13 +3822,8 @@
       </w:r>
     </w:p>
     <w:p>
-      <w:proofErr w:type="gramStart"/>
-      <w:r>
-        <w:t>préciser</w:t>
-      </w:r>
-      <w:proofErr w:type="gramEnd"/>
-      <w:r>
-        <w:t xml:space="preserve"> quelle éolienne est présentée dans le corps du rapport et lesquelles sont renvoyées en annexe, cohérence à maintenir avec l'analyse comparative des courbes de puissance. Dans l'étude de référence, E9 est présentée dans le corps du rapport.]</w:t>
+      <w:r>
+        <w:t>préciser quelle éolienne est présentée dans le corps du rapport et lesquelles sont renvoyées en annexe, cohérence à maintenir avec l'analyse comparative des courbes de puissance. Dans l'étude de référence, E9 est présentée dans le corps du rapport.]</w:t>
       </w:r>
     </w:p>
     <w:p>
@@ -4117,6 +3937,45 @@
     </w:sectPr>
   </w:body>
 </w:document>
+</file>
+
+<file path=word/comments.xml><?xml version="1.0" encoding="utf-8"?>
+<w:comments xmlns:wpc="http://schemas.microsoft.com/office/word/2010/wordprocessingCanvas" xmlns:cx="http://schemas.microsoft.com/office/drawing/2014/chartex" xmlns:cx1="http://schemas.microsoft.com/office/drawing/2015/9/8/chartex" xmlns:cx2="http://schemas.microsoft.com/office/drawing/2015/10/21/chartex" xmlns:cx3="http://schemas.microsoft.com/office/drawing/2016/5/9/chartex" xmlns:cx4="http://schemas.microsoft.com/office/drawing/2016/5/10/chartex" xmlns:cx5="http://schemas.microsoft.com/office/drawing/2016/5/11/chartex" xmlns:cx6="http://schemas.microsoft.com/office/drawing/2016/5/12/chartex" xmlns:cx7="http://schemas.microsoft.com/office/drawing/2016/5/13/chartex" xmlns:cx8="http://schemas.microsoft.com/office/drawing/2016/5/14/chartex" xmlns:mc="http://schemas.openxmlformats.org/markup-compatibility/2006" xmlns:aink="http://schemas.microsoft.com/office/drawing/2016/ink" xmlns:am3d="http://schemas.microsoft.com/office/drawing/2017/model3d" xmlns:o="urn:schemas-microsoft-com:office:office" xmlns:oel="http://schemas.microsoft.com/office/2019/extlst" xmlns:r="http://schemas.openxmlformats.org/officeDocument/2006/relationships" xmlns:m="http://schemas.openxmlformats.org/officeDocument/2006/math" xmlns:v="urn:schemas-microsoft-com:vml" xmlns:wp14="http://schemas.microsoft.com/office/word/2010/wordprocessingDrawing" xmlns:wp="http://schemas.openxmlformats.org/drawingml/2006/wordprocessingDrawing" xmlns:w10="urn:schemas-microsoft-com:office:word" xmlns:w="http://schemas.openxmlformats.org/wordprocessingml/2006/main" xmlns:w14="http://schemas.microsoft.com/office/word/2010/wordml" xmlns:w15="http://schemas.microsoft.com/office/word/2012/wordml" xmlns:w16cex="http://schemas.microsoft.com/office/word/2018/wordml/cex" xmlns:w16cid="http://schemas.microsoft.com/office/word/2016/wordml/cid" xmlns:w16="http://schemas.microsoft.com/office/word/2018/wordml" xmlns:w16du="http://schemas.microsoft.com/office/word/2023/wordml/word16du" xmlns:w16sdtdh="http://schemas.microsoft.com/office/word/2020/wordml/sdtdatahash" xmlns:w16sdtfl="http://schemas.microsoft.com/office/word/2024/wordml/sdtformatlock" xmlns:w16se="http://schemas.microsoft.com/office/word/2015/wordml/symex" xmlns:wpg="http://schemas.microsoft.com/office/word/2010/wordprocessingGroup" xmlns:wpi="http://schemas.microsoft.com/office/word/2010/wordprocessingInk" xmlns:wne="http://schemas.microsoft.com/office/word/2006/wordml" xmlns:wps="http://schemas.microsoft.com/office/word/2010/wordprocessingShape" mc:Ignorable="w14 w15 w16se w16cid w16 w16cex w16sdtdh w16sdtfl w16du wp14">
+  <w:comment w:id="0" w:author="N Bernard" w:date="2026-04-09T16:50:00Z" w:initials="NB">
+    <w:p>
+      <w:pPr>
+        <w:pStyle w:val="Commentaire"/>
+      </w:pPr>
+      <w:r>
+        <w:rPr>
+          <w:rStyle w:val="Marquedecommentaire"/>
+        </w:rPr>
+        <w:annotationRef/>
+      </w:r>
+      <w:r>
+        <w:t>On doit retrouver également ici la structure des chapitres et sous chapitres, mais ici en regroupant.</w:t>
+      </w:r>
+    </w:p>
+  </w:comment>
+</w:comments>
+</file>
+
+<file path=word/commentsExtended.xml><?xml version="1.0" encoding="utf-8"?>
+<w15:commentsEx xmlns:wpc="http://schemas.microsoft.com/office/word/2010/wordprocessingCanvas" xmlns:cx="http://schemas.microsoft.com/office/drawing/2014/chartex" xmlns:cx1="http://schemas.microsoft.com/office/drawing/2015/9/8/chartex" xmlns:cx2="http://schemas.microsoft.com/office/drawing/2015/10/21/chartex" xmlns:cx3="http://schemas.microsoft.com/office/drawing/2016/5/9/chartex" xmlns:cx4="http://schemas.microsoft.com/office/drawing/2016/5/10/chartex" xmlns:cx5="http://schemas.microsoft.com/office/drawing/2016/5/11/chartex" xmlns:cx6="http://schemas.microsoft.com/office/drawing/2016/5/12/chartex" xmlns:cx7="http://schemas.microsoft.com/office/drawing/2016/5/13/chartex" xmlns:cx8="http://schemas.microsoft.com/office/drawing/2016/5/14/chartex" xmlns:mc="http://schemas.openxmlformats.org/markup-compatibility/2006" xmlns:aink="http://schemas.microsoft.com/office/drawing/2016/ink" xmlns:am3d="http://schemas.microsoft.com/office/drawing/2017/model3d" xmlns:o="urn:schemas-microsoft-com:office:office" xmlns:oel="http://schemas.microsoft.com/office/2019/extlst" xmlns:r="http://schemas.openxmlformats.org/officeDocument/2006/relationships" xmlns:m="http://schemas.openxmlformats.org/officeDocument/2006/math" xmlns:v="urn:schemas-microsoft-com:vml" xmlns:wp14="http://schemas.microsoft.com/office/word/2010/wordprocessingDrawing" xmlns:wp="http://schemas.openxmlformats.org/drawingml/2006/wordprocessingDrawing" xmlns:w10="urn:schemas-microsoft-com:office:word" xmlns:w="http://schemas.openxmlformats.org/wordprocessingml/2006/main" xmlns:w14="http://schemas.microsoft.com/office/word/2010/wordml" xmlns:w15="http://schemas.microsoft.com/office/word/2012/wordml" xmlns:w16cex="http://schemas.microsoft.com/office/word/2018/wordml/cex" xmlns:w16cid="http://schemas.microsoft.com/office/word/2016/wordml/cid" xmlns:w16="http://schemas.microsoft.com/office/word/2018/wordml" xmlns:w16du="http://schemas.microsoft.com/office/word/2023/wordml/word16du" xmlns:w16sdtdh="http://schemas.microsoft.com/office/word/2020/wordml/sdtdatahash" xmlns:w16sdtfl="http://schemas.microsoft.com/office/word/2024/wordml/sdtformatlock" xmlns:w16se="http://schemas.microsoft.com/office/word/2015/wordml/symex" xmlns:wpg="http://schemas.microsoft.com/office/word/2010/wordprocessingGroup" xmlns:wpi="http://schemas.microsoft.com/office/word/2010/wordprocessingInk" xmlns:wne="http://schemas.microsoft.com/office/word/2006/wordml" xmlns:wps="http://schemas.microsoft.com/office/word/2010/wordprocessingShape" mc:Ignorable="w14 w15 w16se w16cid w16 w16cex w16sdtdh w16sdtfl w16du wp14">
+  <w15:commentEx w15:paraId="68049A65" w15:done="0"/>
+</w15:commentsEx>
+</file>
+
+<file path=word/commentsExtensible.xml><?xml version="1.0" encoding="utf-8"?>
+<w16cex:commentsExtensible xmlns:wpc="http://schemas.microsoft.com/office/word/2010/wordprocessingCanvas" xmlns:cx="http://schemas.microsoft.com/office/drawing/2014/chartex" xmlns:cx1="http://schemas.microsoft.com/office/drawing/2015/9/8/chartex" xmlns:cx2="http://schemas.microsoft.com/office/drawing/2015/10/21/chartex" xmlns:cx3="http://schemas.microsoft.com/office/drawing/2016/5/9/chartex" xmlns:cx4="http://schemas.microsoft.com/office/drawing/2016/5/10/chartex" xmlns:cx5="http://schemas.microsoft.com/office/drawing/2016/5/11/chartex" xmlns:cx6="http://schemas.microsoft.com/office/drawing/2016/5/12/chartex" xmlns:cx7="http://schemas.microsoft.com/office/drawing/2016/5/13/chartex" xmlns:cx8="http://schemas.microsoft.com/office/drawing/2016/5/14/chartex" xmlns:cr="http://schemas.microsoft.com/office/comments/2020/reactions" xmlns:mc="http://schemas.openxmlformats.org/markup-compatibility/2006" xmlns:aink="http://schemas.microsoft.com/office/drawing/2016/ink" xmlns:am3d="http://schemas.microsoft.com/office/drawing/2017/model3d" xmlns:o="urn:schemas-microsoft-com:office:office" xmlns:oel="http://schemas.microsoft.com/office/2019/extlst" xmlns:r="http://schemas.openxmlformats.org/officeDocument/2006/relationships" xmlns:m="http://schemas.openxmlformats.org/officeDocument/2006/math" xmlns:v="urn:schemas-microsoft-com:vml" xmlns:wp14="http://schemas.microsoft.com/office/word/2010/wordprocessingDrawing" xmlns:wp="http://schemas.openxmlformats.org/drawingml/2006/wordprocessingDrawing" xmlns:w10="urn:schemas-microsoft-com:office:word" xmlns:w="http://schemas.openxmlformats.org/wordprocessingml/2006/main" xmlns:w14="http://schemas.microsoft.com/office/word/2010/wordml" xmlns:w15="http://schemas.microsoft.com/office/word/2012/wordml" xmlns:w16cex="http://schemas.microsoft.com/office/word/2018/wordml/cex" xmlns:w16cid="http://schemas.microsoft.com/office/word/2016/wordml/cid" xmlns:w16="http://schemas.microsoft.com/office/word/2018/wordml" xmlns:w16du="http://schemas.microsoft.com/office/word/2023/wordml/word16du" xmlns:w16sdtdh="http://schemas.microsoft.com/office/word/2020/wordml/sdtdatahash" xmlns:w16sdtfl="http://schemas.microsoft.com/office/word/2024/wordml/sdtformatlock" xmlns:w16se="http://schemas.microsoft.com/office/word/2015/wordml/symex" xmlns:wpg="http://schemas.microsoft.com/office/word/2010/wordprocessingGroup" xmlns:wpi="http://schemas.microsoft.com/office/word/2010/wordprocessingInk" xmlns:wne="http://schemas.microsoft.com/office/word/2006/wordml" xmlns:wps="http://schemas.microsoft.com/office/word/2010/wordprocessingShape" mc:Ignorable="w14 w15 w16se w16cid w16 w16cex w16sdtdh w16sdtfl cr w16du wp14">
+  <w16cex:commentExtensible w16cex:durableId="417ECA6A" w16cex:dateUtc="2026-04-09T14:50:00Z"/>
+</w16cex:commentsExtensible>
+</file>
+
+<file path=word/commentsIds.xml><?xml version="1.0" encoding="utf-8"?>
+<w16cid:commentsIds xmlns:wpc="http://schemas.microsoft.com/office/word/2010/wordprocessingCanvas" xmlns:cx="http://schemas.microsoft.com/office/drawing/2014/chartex" xmlns:cx1="http://schemas.microsoft.com/office/drawing/2015/9/8/chartex" xmlns:cx2="http://schemas.microsoft.com/office/drawing/2015/10/21/chartex" xmlns:cx3="http://schemas.microsoft.com/office/drawing/2016/5/9/chartex" xmlns:cx4="http://schemas.microsoft.com/office/drawing/2016/5/10/chartex" xmlns:cx5="http://schemas.microsoft.com/office/drawing/2016/5/11/chartex" xmlns:cx6="http://schemas.microsoft.com/office/drawing/2016/5/12/chartex" xmlns:cx7="http://schemas.microsoft.com/office/drawing/2016/5/13/chartex" xmlns:cx8="http://schemas.microsoft.com/office/drawing/2016/5/14/chartex" xmlns:mc="http://schemas.openxmlformats.org/markup-compatibility/2006" xmlns:aink="http://schemas.microsoft.com/office/drawing/2016/ink" xmlns:am3d="http://schemas.microsoft.com/office/drawing/2017/model3d" xmlns:o="urn:schemas-microsoft-com:office:office" xmlns:oel="http://schemas.microsoft.com/office/2019/extlst" xmlns:r="http://schemas.openxmlformats.org/officeDocument/2006/relationships" xmlns:m="http://schemas.openxmlformats.org/officeDocument/2006/math" xmlns:v="urn:schemas-microsoft-com:vml" xmlns:wp14="http://schemas.microsoft.com/office/word/2010/wordprocessingDrawing" xmlns:wp="http://schemas.openxmlformats.org/drawingml/2006/wordprocessingDrawing" xmlns:w10="urn:schemas-microsoft-com:office:word" xmlns:w="http://schemas.openxmlformats.org/wordprocessingml/2006/main" xmlns:w14="http://schemas.microsoft.com/office/word/2010/wordml" xmlns:w15="http://schemas.microsoft.com/office/word/2012/wordml" xmlns:w16cex="http://schemas.microsoft.com/office/word/2018/wordml/cex" xmlns:w16cid="http://schemas.microsoft.com/office/word/2016/wordml/cid" xmlns:w16="http://schemas.microsoft.com/office/word/2018/wordml" xmlns:w16du="http://schemas.microsoft.com/office/word/2023/wordml/word16du" xmlns:w16sdtdh="http://schemas.microsoft.com/office/word/2020/wordml/sdtdatahash" xmlns:w16sdtfl="http://schemas.microsoft.com/office/word/2024/wordml/sdtformatlock" xmlns:w16se="http://schemas.microsoft.com/office/word/2015/wordml/symex" xmlns:wpg="http://schemas.microsoft.com/office/word/2010/wordprocessingGroup" xmlns:wpi="http://schemas.microsoft.com/office/word/2010/wordprocessingInk" xmlns:wne="http://schemas.microsoft.com/office/word/2006/wordml" xmlns:wps="http://schemas.microsoft.com/office/word/2010/wordprocessingShape" mc:Ignorable="w14 w15 w16se w16cid w16 w16cex w16sdtdh w16sdtfl w16du wp14">
+  <w16cid:commentId w16cid:paraId="68049A65" w16cid:durableId="417ECA6A"/>
+</w16cid:commentsIds>
 </file>
 
 <file path=word/numbering.xml><?xml version="1.0" encoding="utf-8"?>
@@ -5844,6 +5703,14 @@
     <w:abstractNumId w:val="6"/>
   </w:num>
 </w:numbering>
+</file>
+
+<file path=word/people.xml><?xml version="1.0" encoding="utf-8"?>
+<w15:people xmlns:wpc="http://schemas.microsoft.com/office/word/2010/wordprocessingCanvas" xmlns:cx="http://schemas.microsoft.com/office/drawing/2014/chartex" xmlns:cx1="http://schemas.microsoft.com/office/drawing/2015/9/8/chartex" xmlns:cx2="http://schemas.microsoft.com/office/drawing/2015/10/21/chartex" xmlns:cx3="http://schemas.microsoft.com/office/drawing/2016/5/9/chartex" xmlns:cx4="http://schemas.microsoft.com/office/drawing/2016/5/10/chartex" xmlns:cx5="http://schemas.microsoft.com/office/drawing/2016/5/11/chartex" xmlns:cx6="http://schemas.microsoft.com/office/drawing/2016/5/12/chartex" xmlns:cx7="http://schemas.microsoft.com/office/drawing/2016/5/13/chartex" xmlns:cx8="http://schemas.microsoft.com/office/drawing/2016/5/14/chartex" xmlns:mc="http://schemas.openxmlformats.org/markup-compatibility/2006" xmlns:aink="http://schemas.microsoft.com/office/drawing/2016/ink" xmlns:am3d="http://schemas.microsoft.com/office/drawing/2017/model3d" xmlns:o="urn:schemas-microsoft-com:office:office" xmlns:oel="http://schemas.microsoft.com/office/2019/extlst" xmlns:r="http://schemas.openxmlformats.org/officeDocument/2006/relationships" xmlns:m="http://schemas.openxmlformats.org/officeDocument/2006/math" xmlns:v="urn:schemas-microsoft-com:vml" xmlns:wp14="http://schemas.microsoft.com/office/word/2010/wordprocessingDrawing" xmlns:wp="http://schemas.openxmlformats.org/drawingml/2006/wordprocessingDrawing" xmlns:w10="urn:schemas-microsoft-com:office:word" xmlns:w="http://schemas.openxmlformats.org/wordprocessingml/2006/main" xmlns:w14="http://schemas.microsoft.com/office/word/2010/wordml" xmlns:w15="http://schemas.microsoft.com/office/word/2012/wordml" xmlns:w16cex="http://schemas.microsoft.com/office/word/2018/wordml/cex" xmlns:w16cid="http://schemas.microsoft.com/office/word/2016/wordml/cid" xmlns:w16="http://schemas.microsoft.com/office/word/2018/wordml" xmlns:w16du="http://schemas.microsoft.com/office/word/2023/wordml/word16du" xmlns:w16sdtdh="http://schemas.microsoft.com/office/word/2020/wordml/sdtdatahash" xmlns:w16sdtfl="http://schemas.microsoft.com/office/word/2024/wordml/sdtformatlock" xmlns:w16se="http://schemas.microsoft.com/office/word/2015/wordml/symex" xmlns:wpg="http://schemas.microsoft.com/office/word/2010/wordprocessingGroup" xmlns:wpi="http://schemas.microsoft.com/office/word/2010/wordprocessingInk" xmlns:wne="http://schemas.microsoft.com/office/word/2006/wordml" xmlns:wps="http://schemas.microsoft.com/office/word/2010/wordprocessingShape" mc:Ignorable="w14 w15 w16se w16cid w16 w16cex w16sdtdh w16sdtfl w16du wp14">
+  <w15:person w15:author="N Bernard">
+    <w15:presenceInfo w15:providerId="None" w15:userId="N Bernard"/>
+  </w15:person>
+</w15:people>
 </file>
 
 <file path=word/styles.xml><?xml version="1.0" encoding="utf-8"?>
@@ -6247,10 +6114,9 @@
     <w:name w:val="Normal"/>
     <w:uiPriority w:val="1"/>
     <w:qFormat/>
-    <w:rsid w:val="00DC0CB0"/>
+    <w:rsid w:val="00776EF5"/>
     <w:pPr>
       <w:spacing w:after="0" w:line="240" w:lineRule="auto"/>
-      <w:jc w:val="both"/>
     </w:pPr>
     <w:rPr>
       <w:rFonts w:ascii="Times New Roman" w:eastAsia="Times New Roman" w:hAnsi="Times New Roman" w:cs="Times New Roman"/>
@@ -6495,7 +6361,6 @@
   <w:style w:type="character" w:default="1" w:styleId="Policepardfaut">
     <w:name w:val="Default Paragraph Font"/>
     <w:uiPriority w:val="1"/>
-    <w:semiHidden/>
     <w:unhideWhenUsed/>
   </w:style>
   <w:style w:type="table" w:default="1" w:styleId="TableauNormal">

</xml_diff>

<commit_message>
[CHANGE] change the code to handle performance level of the code
</commit_message>
<xml_diff>
--- a/assets/templates/template_scada.docx
+++ b/assets/templates/template_scada.docx
@@ -3830,7 +3830,19 @@
       <w:r>
         <w:t xml:space="preserve"> </w:t>
       </w:r>
-    </w:p>
+      <w:r>
+        <w:t>{{</w:t>
+      </w:r>
+      <w:proofErr w:type="spellStart"/>
+      <w:r>
+        <w:t>performance_level_chart</w:t>
+      </w:r>
+      <w:proofErr w:type="spellEnd"/>
+      <w:r>
+        <w:t>}}</w:t>
+      </w:r>
+    </w:p>
+    <w:p/>
     <w:p>
       <w:r>
         <w:t>[TODO.TABLEAU LMITE DE PUISSANCE]</w:t>

</xml_diff>

<commit_message>
[CHANGE] change the code to handle the different performance issues in the code, itselfs
</commit_message>
<xml_diff>
--- a/assets/templates/template_scada.docx
+++ b/assets/templates/template_scada.docx
@@ -315,17 +315,8 @@
                 <w:b/>
                 <w:bCs/>
               </w:rPr>
-              <w:t xml:space="preserve">Date </w:t>
+              <w:t>Date d’émission</w:t>
             </w:r>
-            <w:proofErr w:type="spellStart"/>
-            <w:r>
-              <w:rPr>
-                <w:b/>
-                <w:bCs/>
-              </w:rPr>
-              <w:t>d’émission</w:t>
-            </w:r>
-            <w:proofErr w:type="spellEnd"/>
           </w:p>
         </w:tc>
         <w:tc>
@@ -361,7 +352,6 @@
                 <w:bCs/>
               </w:rPr>
             </w:pPr>
-            <w:proofErr w:type="spellStart"/>
             <w:r>
               <w:rPr>
                 <w:b/>
@@ -369,7 +359,6 @@
               </w:rPr>
               <w:t>Rédacteur</w:t>
             </w:r>
-            <w:proofErr w:type="spellEnd"/>
           </w:p>
         </w:tc>
         <w:tc>
@@ -384,7 +373,6 @@
                 <w:bCs/>
               </w:rPr>
             </w:pPr>
-            <w:proofErr w:type="spellStart"/>
             <w:r>
               <w:rPr>
                 <w:b/>
@@ -392,7 +380,6 @@
               </w:rPr>
               <w:t>Vérificateur</w:t>
             </w:r>
-            <w:proofErr w:type="spellEnd"/>
           </w:p>
         </w:tc>
         <w:tc>
@@ -407,7 +394,6 @@
                 <w:bCs/>
               </w:rPr>
             </w:pPr>
-            <w:proofErr w:type="spellStart"/>
             <w:r>
               <w:rPr>
                 <w:b/>
@@ -415,7 +401,6 @@
               </w:rPr>
               <w:t>Approbateur</w:t>
             </w:r>
-            <w:proofErr w:type="spellEnd"/>
           </w:p>
         </w:tc>
       </w:tr>
@@ -989,11 +974,9 @@
         <w:lastRenderedPageBreak/>
         <w:t>Nom du parc : {{</w:t>
       </w:r>
-      <w:proofErr w:type="spellStart"/>
       <w:r>
         <w:t>park_name</w:t>
       </w:r>
-      <w:proofErr w:type="spellEnd"/>
       <w:r>
         <w:t xml:space="preserve">}} </w:t>
       </w:r>
@@ -1002,146 +985,263 @@
       <w:r>
         <w:t>Type d’éoliennes : {{</w:t>
       </w:r>
-      <w:proofErr w:type="spellStart"/>
       <w:r>
         <w:t>model_wtg</w:t>
       </w:r>
-      <w:proofErr w:type="spellEnd"/>
       <w:r>
         <w:t xml:space="preserve">}} </w:t>
       </w:r>
     </w:p>
     <w:p>
       <w:r>
-        <w:t>Nombre d’éoliennes : {{</w:t>
-      </w:r>
-      <w:proofErr w:type="spellStart"/>
-      <w:r>
-        <w:t>N</w:t>
+        <w:t>Nombre d’éoliennes : {{N</w:t>
       </w:r>
       <w:r>
         <w:t>ombre</w:t>
       </w:r>
       <w:r>
-        <w:t>_WTG</w:t>
-      </w:r>
-      <w:proofErr w:type="spellEnd"/>
+        <w:t xml:space="preserve">_WTG}} </w:t>
+      </w:r>
+    </w:p>
+    <w:p>
+      <w:r>
+        <w:t>Puissance totale installée : {{</w:t>
+      </w:r>
+      <w:r>
+        <w:t>nominal_power</w:t>
+      </w:r>
       <w:r>
         <w:t xml:space="preserve">}} </w:t>
       </w:r>
     </w:p>
     <w:p>
       <w:r>
-        <w:t>Puissance totale installée : {{</w:t>
-      </w:r>
-      <w:proofErr w:type="spellStart"/>
+        <w:t xml:space="preserve">Localisation : {{LOCALISATION}} </w:t>
+      </w:r>
+    </w:p>
+    <w:p>
+      <w:r>
+        <w:t>Client : {{CLIENT}}</w:t>
+      </w:r>
+    </w:p>
+    <w:p>
+      <w:r>
+        <w:t xml:space="preserve">Contact : {{CONTACT_CLIENT}} </w:t>
+      </w:r>
+    </w:p>
+    <w:p>
+      <w:r>
+        <w:t xml:space="preserve">Constructeur / Exploitant : {{CONTRACTOR}} </w:t>
+      </w:r>
+    </w:p>
+    <w:p/>
+    <w:p>
+      <w:r>
+        <w:t>Rédacteur</w:t>
+      </w:r>
+    </w:p>
+    <w:p>
+      <w:r>
+        <w:t>{{AUTEUR}}</w:t>
+      </w:r>
+    </w:p>
+    <w:p>
+      <w:r>
+        <w:t>Email : {{MAIL_AUTEUR}}</w:t>
+      </w:r>
+    </w:p>
+    <w:p>
+      <w:r>
+        <w:t>Téléphone : {{TEL_AUTEUR}}</w:t>
+      </w:r>
+    </w:p>
+    <w:p/>
+    <w:p>
+      <w:r>
+        <w:t>Vérificateur</w:t>
+      </w:r>
+    </w:p>
+    <w:p>
+      <w:r>
+        <w:t>{{VERIFICATEUR}}</w:t>
+      </w:r>
+    </w:p>
+    <w:p>
+      <w:r>
+        <w:t>Email : {{MAIL_VERIFICATEUR}}</w:t>
+      </w:r>
+    </w:p>
+    <w:p>
+      <w:r>
+        <w:t>Téléphone : {{TEL_VERIFICATEUR}}</w:t>
+      </w:r>
+    </w:p>
+    <w:p/>
+    <w:p>
+      <w:r>
+        <w:t>Approbateur</w:t>
+      </w:r>
+    </w:p>
+    <w:p>
+      <w:r>
+        <w:t>{{APPROBATEUR}}</w:t>
+      </w:r>
+    </w:p>
+    <w:p>
+      <w:r>
+        <w:t>Email : {{MAIL_APPROBATEUR}}</w:t>
+      </w:r>
+    </w:p>
+    <w:p>
+      <w:r>
+        <w:t>Téléphone : {{TEL_APPROBATEUR}}</w:t>
+      </w:r>
+    </w:p>
+    <w:p/>
+    <w:p>
+      <w:pPr>
+        <w:spacing w:after="160" w:line="259" w:lineRule="auto"/>
+      </w:pPr>
+      <w:r>
+        <w:br w:type="page"/>
+      </w:r>
+    </w:p>
+    <w:p/>
+    <w:p>
+      <w:pPr>
+        <w:pStyle w:val="Titre1"/>
+      </w:pPr>
+      <w:r>
+        <w:t>Synthèse</w:t>
+      </w:r>
+    </w:p>
+    <w:p>
+      <w:pPr>
+        <w:jc w:val="both"/>
+      </w:pPr>
+      <w:r>
+        <w:t xml:space="preserve">Les données SCADA du parc éolien </w:t>
+      </w:r>
+      <w:r>
+        <w:t>{{park_name}}</w:t>
+      </w:r>
+      <w:r>
+        <w:t xml:space="preserve"> ont été analysées sur la période du </w:t>
+      </w:r>
+      <w:r>
+        <w:t>{{analysis_start}}</w:t>
+      </w:r>
+      <w:r>
+        <w:t xml:space="preserve"> au </w:t>
+      </w:r>
+      <w:r>
+        <w:t>{{analysis_end}}</w:t>
+      </w:r>
+      <w:r>
+        <w:t xml:space="preserve">, à partir des informations fournies par le client. Le parc est composé de </w:t>
+      </w:r>
+      <w:r>
+        <w:t>{{turbine_count}}</w:t>
+      </w:r>
+      <w:r>
+        <w:t xml:space="preserve"> éoliennes de type</w:t>
+      </w:r>
+      <w:r>
+        <w:t xml:space="preserve"> </w:t>
+      </w:r>
+      <w:r>
+        <w:t>{{model_wtg}</w:t>
+      </w:r>
+      <w:r>
+        <w:t>}</w:t>
+      </w:r>
+      <w:r>
+        <w:t xml:space="preserve">, désignées </w:t>
+      </w:r>
+      <w:r>
+        <w:t>{{turbine_list}}</w:t>
+      </w:r>
+      <w:r>
+        <w:t xml:space="preserve"> L’ensemble des turbines a été pris en compte dans l’analyse.</w:t>
+      </w:r>
+    </w:p>
+    <w:p>
+      <w:pPr>
+        <w:jc w:val="both"/>
+      </w:pPr>
+    </w:p>
+    <w:p>
+      <w:pPr>
+        <w:jc w:val="both"/>
+      </w:pPr>
+      <w:r>
+        <w:t>Le tableau ci-après présente une évaluation synthétique des performances du parc, en mettant en évidence, pour chaque indicateur, le niveau de performance de chaque éolienne ainsi que les éventuels écarts observés.</w:t>
+      </w:r>
+    </w:p>
+    <w:p/>
+    <w:p>
+      <w:r>
+        <w:t>[T</w:t>
+      </w:r>
+      <w:r>
+        <w:t>ODO</w:t>
+      </w:r>
+      <w:r>
+        <w:t>:SCADA_SUMMARY_TABLE]</w:t>
+      </w:r>
+    </w:p>
+    <w:p>
+      <w:pPr>
+        <w:pStyle w:val="Titre1"/>
+      </w:pPr>
+      <w:r>
+        <w:t>Contexte de l’étude</w:t>
+      </w:r>
+    </w:p>
+    <w:p>
+      <w:pPr>
+        <w:pStyle w:val="Titre2"/>
+      </w:pPr>
+      <w:r>
+        <w:t>Présentation générale du parc</w:t>
+      </w:r>
+    </w:p>
+    <w:p>
+      <w:pPr>
+        <w:jc w:val="both"/>
+      </w:pPr>
+      <w:r>
+        <w:t>Le parc éolien {{</w:t>
+      </w:r>
+      <w:r>
+        <w:t>park_name</w:t>
+      </w:r>
+      <w:r>
+        <w:t>}} est situé sur le territoire des communes de {{COMMUNES}}, dans la région de {{REGION}}. Il est composé de {{</w:t>
+      </w:r>
+      <w:r>
+        <w:t>turbine_count</w:t>
+      </w:r>
+      <w:r>
+        <w:t>}} éoliennes de type {{</w:t>
+      </w:r>
+      <w:r>
+        <w:t>model_wtg</w:t>
+      </w:r>
+      <w:r>
+        <w:t>}}, d’une puissance nominale unitaire de {{</w:t>
+      </w:r>
       <w:r>
         <w:t>nominal_power</w:t>
       </w:r>
-      <w:proofErr w:type="spellEnd"/>
-      <w:r>
-        <w:t xml:space="preserve">}} </w:t>
-      </w:r>
-    </w:p>
-    <w:p>
-      <w:r>
-        <w:t xml:space="preserve">Localisation : {{LOCALISATION}} </w:t>
-      </w:r>
-    </w:p>
-    <w:p>
-      <w:r>
-        <w:t>Client : {{CLIENT}}</w:t>
-      </w:r>
-    </w:p>
-    <w:p>
-      <w:r>
-        <w:t xml:space="preserve">Contact : {{CONTACT_CLIENT}} </w:t>
-      </w:r>
-    </w:p>
-    <w:p>
-      <w:r>
-        <w:t xml:space="preserve">Constructeur / Exploitant : {{CONTRACTOR}} </w:t>
-      </w:r>
-    </w:p>
-    <w:p/>
-    <w:p>
-      <w:r>
-        <w:t>Rédacteur</w:t>
-      </w:r>
-    </w:p>
-    <w:p>
-      <w:r>
-        <w:t>{{AUTEUR}}</w:t>
-      </w:r>
-    </w:p>
-    <w:p>
-      <w:r>
-        <w:t>Email : {{MAIL_AUTEUR}}</w:t>
-      </w:r>
-    </w:p>
-    <w:p>
-      <w:r>
-        <w:t>Téléphone : {{TEL_AUTEUR}}</w:t>
-      </w:r>
-    </w:p>
-    <w:p/>
-    <w:p>
-      <w:r>
-        <w:t>Vérificateur</w:t>
-      </w:r>
-    </w:p>
-    <w:p>
-      <w:r>
-        <w:t>{{VERIFICATEUR}}</w:t>
-      </w:r>
-    </w:p>
-    <w:p>
-      <w:r>
-        <w:t>Email : {{MAIL_VERIFICATEUR}}</w:t>
-      </w:r>
-    </w:p>
-    <w:p>
-      <w:r>
-        <w:t>Téléphone : {{TEL_VERIFICATEUR}}</w:t>
-      </w:r>
-    </w:p>
-    <w:p/>
-    <w:p>
-      <w:r>
-        <w:t>Approbateur</w:t>
-      </w:r>
-    </w:p>
-    <w:p>
-      <w:r>
-        <w:t>{{APPROBATEUR}}</w:t>
-      </w:r>
-    </w:p>
-    <w:p>
-      <w:r>
-        <w:t>Email : {{MAIL_APPROBATEUR}}</w:t>
-      </w:r>
-    </w:p>
-    <w:p>
-      <w:r>
-        <w:t>Téléphone : {{TEL_APPROBATEUR}}</w:t>
-      </w:r>
-    </w:p>
-    <w:p/>
-    <w:p>
-      <w:pPr>
-        <w:spacing w:after="160" w:line="259" w:lineRule="auto"/>
-      </w:pPr>
-      <w:r>
-        <w:br w:type="page"/>
-      </w:r>
-    </w:p>
-    <w:p/>
-    <w:p>
-      <w:pPr>
-        <w:pStyle w:val="Titre1"/>
-      </w:pPr>
-      <w:r>
-        <w:t>Synthèse</w:t>
+      <w:r>
+        <w:t>}}, soit une puissance totale installée de {{</w:t>
+      </w:r>
+      <w:r>
+        <w:t xml:space="preserve">total_power </w:t>
+      </w:r>
+      <w:r>
+        <w:t>}}.</w:t>
       </w:r>
     </w:p>
     <w:p>
@@ -1149,221 +1249,13 @@
         <w:jc w:val="both"/>
       </w:pPr>
       <w:r>
-        <w:t xml:space="preserve">Les données SCADA du parc éolien </w:t>
-      </w:r>
-      <w:r>
-        <w:t>{{</w:t>
-      </w:r>
-      <w:proofErr w:type="spellStart"/>
-      <w:r>
-        <w:t>park_name</w:t>
-      </w:r>
-      <w:proofErr w:type="spellEnd"/>
-      <w:r>
-        <w:t>}}</w:t>
-      </w:r>
-      <w:r>
-        <w:t xml:space="preserve"> ont été analysées sur la période du </w:t>
-      </w:r>
-      <w:r>
-        <w:t>{{</w:t>
-      </w:r>
-      <w:proofErr w:type="spellStart"/>
-      <w:r>
-        <w:t>analysis_start</w:t>
-      </w:r>
-      <w:proofErr w:type="spellEnd"/>
-      <w:r>
-        <w:t>}}</w:t>
-      </w:r>
-      <w:r>
-        <w:t xml:space="preserve"> au </w:t>
-      </w:r>
-      <w:r>
-        <w:t>{{</w:t>
-      </w:r>
-      <w:proofErr w:type="spellStart"/>
-      <w:r>
-        <w:t>analysis_end</w:t>
-      </w:r>
-      <w:proofErr w:type="spellEnd"/>
-      <w:r>
-        <w:t>}}</w:t>
-      </w:r>
-      <w:r>
-        <w:t xml:space="preserve">, à partir des informations fournies par le client. Le parc est composé de </w:t>
-      </w:r>
-      <w:r>
-        <w:t>{{</w:t>
-      </w:r>
-      <w:proofErr w:type="spellStart"/>
-      <w:r>
-        <w:t>turbine_count</w:t>
-      </w:r>
-      <w:proofErr w:type="spellEnd"/>
-      <w:r>
-        <w:t>}}</w:t>
-      </w:r>
-      <w:r>
-        <w:t xml:space="preserve"> éoliennes de type</w:t>
-      </w:r>
-      <w:r>
-        <w:t xml:space="preserve"> </w:t>
-      </w:r>
-      <w:r>
-        <w:t>{{</w:t>
-      </w:r>
-      <w:proofErr w:type="spellStart"/>
-      <w:r>
-        <w:t>model_wtg</w:t>
-      </w:r>
-      <w:proofErr w:type="spellEnd"/>
-      <w:r>
-        <w:t>}</w:t>
-      </w:r>
-      <w:r>
-        <w:t>}</w:t>
-      </w:r>
-      <w:r>
-        <w:t xml:space="preserve">, désignées </w:t>
-      </w:r>
-      <w:r>
-        <w:t>{{</w:t>
-      </w:r>
-      <w:proofErr w:type="spellStart"/>
+        <w:t>Les éoliennes du parc sont identifiées comme suit : {{</w:t>
+      </w:r>
       <w:r>
         <w:t>turbine_list</w:t>
       </w:r>
-      <w:proofErr w:type="spellEnd"/>
-      <w:r>
-        <w:t>}}</w:t>
-      </w:r>
-      <w:r>
-        <w:t xml:space="preserve"> L’ensemble des turbines a été pris en compte dans l’analyse.</w:t>
-      </w:r>
-    </w:p>
-    <w:p>
-      <w:pPr>
-        <w:jc w:val="both"/>
-      </w:pPr>
-    </w:p>
-    <w:p>
-      <w:pPr>
-        <w:jc w:val="both"/>
-      </w:pPr>
-      <w:r>
-        <w:t>Le tableau ci-après présente une évaluation synthétique des performances du parc, en mettant en évidence, pour chaque indicateur, le niveau de performance de chaque éolienne ainsi que les éventuels écarts observés.</w:t>
-      </w:r>
-    </w:p>
-    <w:p/>
-    <w:p>
-      <w:r>
-        <w:t>[T</w:t>
-      </w:r>
-      <w:r>
-        <w:t>ODO</w:t>
-      </w:r>
-      <w:r>
-        <w:t>:SCADA_SUMMARY_TABLE]</w:t>
-      </w:r>
-    </w:p>
-    <w:p>
-      <w:pPr>
-        <w:pStyle w:val="Titre1"/>
-      </w:pPr>
-      <w:r>
-        <w:t>Contexte de l’étude</w:t>
-      </w:r>
-    </w:p>
-    <w:p>
-      <w:pPr>
-        <w:pStyle w:val="Titre2"/>
-      </w:pPr>
-      <w:r>
-        <w:t>Présentation générale du parc</w:t>
-      </w:r>
-    </w:p>
-    <w:p>
-      <w:pPr>
-        <w:jc w:val="both"/>
-      </w:pPr>
-      <w:r>
-        <w:t>Le parc éolien {{</w:t>
-      </w:r>
-      <w:proofErr w:type="spellStart"/>
-      <w:r>
-        <w:t>park_name</w:t>
-      </w:r>
-      <w:proofErr w:type="spellEnd"/>
-      <w:r>
-        <w:t>}} est situé sur le territoire des communes de {{COMMUNES}}, dans la région de {{REGION}}. Il est composé de {{</w:t>
-      </w:r>
-      <w:proofErr w:type="spellStart"/>
-      <w:r>
-        <w:t>turbine_count</w:t>
-      </w:r>
-      <w:proofErr w:type="spellEnd"/>
-      <w:r>
-        <w:t>}} éoliennes de type {{</w:t>
-      </w:r>
-      <w:proofErr w:type="spellStart"/>
-      <w:r>
-        <w:t>model_wtg</w:t>
-      </w:r>
-      <w:proofErr w:type="spellEnd"/>
-      <w:r>
-        <w:t>}}, d’une puissance nominale unitaire de {{</w:t>
-      </w:r>
-      <w:proofErr w:type="spellStart"/>
-      <w:r>
-        <w:t>nominal_power</w:t>
-      </w:r>
-      <w:proofErr w:type="spellEnd"/>
-      <w:r>
-        <w:t>}}, soit une puissance totale installée de {{</w:t>
-      </w:r>
-      <w:proofErr w:type="spellStart"/>
-      <w:r>
-        <w:t>total_power</w:t>
-      </w:r>
-      <w:proofErr w:type="spellEnd"/>
-      <w:r>
-        <w:t xml:space="preserve"> </w:t>
-      </w:r>
-      <w:r>
-        <w:t>}}.</w:t>
-      </w:r>
-    </w:p>
-    <w:p>
-      <w:pPr>
-        <w:jc w:val="both"/>
-      </w:pPr>
-      <w:r>
-        <w:t>Les éoliennes du parc sont identifiées comme suit : {{</w:t>
-      </w:r>
-      <w:proofErr w:type="spellStart"/>
-      <w:r>
-        <w:t>turbine_list</w:t>
-      </w:r>
-      <w:proofErr w:type="spellEnd"/>
-      <w:r>
-        <w:t xml:space="preserve">}}. L’implantation du parc et la disposition des éoliennes sont </w:t>
-      </w:r>
-      <w:proofErr w:type="spellStart"/>
-      <w:r>
-        <w:t>présen</w:t>
-      </w:r>
-      <w:proofErr w:type="spellEnd"/>
-      <w:r>
-        <w:t xml:space="preserve"> </w:t>
-      </w:r>
-      <w:proofErr w:type="spellStart"/>
-      <w:r>
-        <w:t>tées</w:t>
-      </w:r>
-      <w:proofErr w:type="spellEnd"/>
-      <w:r>
-        <w:t xml:space="preserve"> dans la figure ci-</w:t>
+      <w:r>
+        <w:t>}}. L’implantation du parc et la disposition des éoliennes sont présen tées dans la figure ci-</w:t>
       </w:r>
       <w:r>
         <w:t>après :</w:t>
@@ -1450,8 +1342,8 @@
         <w:tblLook w:val="04A0" w:firstRow="1" w:lastRow="0" w:firstColumn="1" w:lastColumn="0" w:noHBand="0" w:noVBand="1"/>
       </w:tblPr>
       <w:tblGrid>
-        <w:gridCol w:w="2293"/>
-        <w:gridCol w:w="5964"/>
+        <w:gridCol w:w="2069"/>
+        <w:gridCol w:w="6188"/>
       </w:tblGrid>
       <w:tr>
         <w:tc>
@@ -1468,7 +1360,6 @@
                 <w:szCs w:val="22"/>
               </w:rPr>
             </w:pPr>
-            <w:proofErr w:type="spellStart"/>
             <w:r>
               <w:rPr>
                 <w:rFonts w:ascii="Cambria" w:eastAsia="MS Mincho" w:hAnsi="Cambria"/>
@@ -1505,7 +1396,6 @@
               </w:rPr>
               <w:t>e</w:t>
             </w:r>
-            <w:proofErr w:type="spellEnd"/>
           </w:p>
         </w:tc>
         <w:tc>
@@ -1529,18 +1419,8 @@
                 <w:sz w:val="22"/>
                 <w:szCs w:val="22"/>
               </w:rPr>
-              <w:t xml:space="preserve">Axes </w:t>
+              <w:t>Axes d’analyse</w:t>
             </w:r>
-            <w:proofErr w:type="spellStart"/>
-            <w:r>
-              <w:rPr>
-                <w:rFonts w:ascii="Cambria" w:eastAsia="MS Mincho" w:hAnsi="Cambria"/>
-                <w:sz w:val="22"/>
-                <w:szCs w:val="22"/>
-              </w:rPr>
-              <w:t>d’analyse</w:t>
-            </w:r>
-            <w:proofErr w:type="spellEnd"/>
           </w:p>
         </w:tc>
       </w:tr>
@@ -1560,23 +1440,13 @@
                 <w:szCs w:val="22"/>
               </w:rPr>
             </w:pPr>
-            <w:proofErr w:type="spellStart"/>
             <w:r>
               <w:rPr>
                 <w:rFonts w:ascii="Cambria" w:eastAsia="MS Mincho" w:hAnsi="Cambria"/>
                 <w:sz w:val="22"/>
                 <w:szCs w:val="22"/>
               </w:rPr>
-              <w:t>Qualité</w:t>
-            </w:r>
-            <w:proofErr w:type="spellEnd"/>
-            <w:r>
-              <w:rPr>
-                <w:rFonts w:ascii="Cambria" w:eastAsia="MS Mincho" w:hAnsi="Cambria"/>
-                <w:sz w:val="22"/>
-                <w:szCs w:val="22"/>
-              </w:rPr>
-              <w:t xml:space="preserve"> des données</w:t>
+              <w:t>Qualité des données</w:t>
             </w:r>
           </w:p>
         </w:tc>
@@ -1660,18 +1530,8 @@
                 <w:sz w:val="22"/>
                 <w:szCs w:val="22"/>
               </w:rPr>
-              <w:t xml:space="preserve">Production et </w:t>
+              <w:t>Production et disponibilité</w:t>
             </w:r>
-            <w:proofErr w:type="spellStart"/>
-            <w:r>
-              <w:rPr>
-                <w:rFonts w:ascii="Cambria" w:eastAsia="MS Mincho" w:hAnsi="Cambria"/>
-                <w:sz w:val="22"/>
-                <w:szCs w:val="22"/>
-              </w:rPr>
-              <w:t>disponibilité</w:t>
-            </w:r>
-            <w:proofErr w:type="spellEnd"/>
           </w:p>
         </w:tc>
         <w:tc>
@@ -1693,52 +1553,14 @@
                 <w:szCs w:val="22"/>
               </w:rPr>
             </w:pPr>
-            <w:proofErr w:type="spellStart"/>
             <w:r>
               <w:rPr>
                 <w:rFonts w:ascii="Cambria" w:eastAsia="MS Mincho" w:hAnsi="Cambria"/>
                 <w:sz w:val="22"/>
                 <w:szCs w:val="22"/>
               </w:rPr>
-              <w:t>Calcul</w:t>
+              <w:t>Calcul de la disponibilité énergétique</w:t>
             </w:r>
-            <w:proofErr w:type="spellEnd"/>
-            <w:r>
-              <w:rPr>
-                <w:rFonts w:ascii="Cambria" w:eastAsia="MS Mincho" w:hAnsi="Cambria"/>
-                <w:sz w:val="22"/>
-                <w:szCs w:val="22"/>
-              </w:rPr>
-              <w:t xml:space="preserve"> de la </w:t>
-            </w:r>
-            <w:proofErr w:type="spellStart"/>
-            <w:r>
-              <w:rPr>
-                <w:rFonts w:ascii="Cambria" w:eastAsia="MS Mincho" w:hAnsi="Cambria"/>
-                <w:sz w:val="22"/>
-                <w:szCs w:val="22"/>
-              </w:rPr>
-              <w:t>disponibilité</w:t>
-            </w:r>
-            <w:proofErr w:type="spellEnd"/>
-            <w:r>
-              <w:rPr>
-                <w:rFonts w:ascii="Cambria" w:eastAsia="MS Mincho" w:hAnsi="Cambria"/>
-                <w:sz w:val="22"/>
-                <w:szCs w:val="22"/>
-              </w:rPr>
-              <w:t xml:space="preserve"> </w:t>
-            </w:r>
-            <w:proofErr w:type="spellStart"/>
-            <w:r>
-              <w:rPr>
-                <w:rFonts w:ascii="Cambria" w:eastAsia="MS Mincho" w:hAnsi="Cambria"/>
-                <w:sz w:val="22"/>
-                <w:szCs w:val="22"/>
-              </w:rPr>
-              <w:t>énergétique</w:t>
-            </w:r>
-            <w:proofErr w:type="spellEnd"/>
           </w:p>
           <w:p>
             <w:pPr>
@@ -1755,52 +1577,14 @@
                 <w:szCs w:val="22"/>
               </w:rPr>
             </w:pPr>
-            <w:proofErr w:type="spellStart"/>
             <w:r>
               <w:rPr>
                 <w:rFonts w:ascii="Cambria" w:eastAsia="MS Mincho" w:hAnsi="Cambria"/>
                 <w:sz w:val="22"/>
                 <w:szCs w:val="22"/>
               </w:rPr>
-              <w:t>Calcul</w:t>
+              <w:t>Calcul de la disponibilité temporelle</w:t>
             </w:r>
-            <w:proofErr w:type="spellEnd"/>
-            <w:r>
-              <w:rPr>
-                <w:rFonts w:ascii="Cambria" w:eastAsia="MS Mincho" w:hAnsi="Cambria"/>
-                <w:sz w:val="22"/>
-                <w:szCs w:val="22"/>
-              </w:rPr>
-              <w:t xml:space="preserve"> de la </w:t>
-            </w:r>
-            <w:proofErr w:type="spellStart"/>
-            <w:r>
-              <w:rPr>
-                <w:rFonts w:ascii="Cambria" w:eastAsia="MS Mincho" w:hAnsi="Cambria"/>
-                <w:sz w:val="22"/>
-                <w:szCs w:val="22"/>
-              </w:rPr>
-              <w:t>disponibilité</w:t>
-            </w:r>
-            <w:proofErr w:type="spellEnd"/>
-            <w:r>
-              <w:rPr>
-                <w:rFonts w:ascii="Cambria" w:eastAsia="MS Mincho" w:hAnsi="Cambria"/>
-                <w:sz w:val="22"/>
-                <w:szCs w:val="22"/>
-              </w:rPr>
-              <w:t xml:space="preserve"> </w:t>
-            </w:r>
-            <w:proofErr w:type="spellStart"/>
-            <w:r>
-              <w:rPr>
-                <w:rFonts w:ascii="Cambria" w:eastAsia="MS Mincho" w:hAnsi="Cambria"/>
-                <w:sz w:val="22"/>
-                <w:szCs w:val="22"/>
-              </w:rPr>
-              <w:t>temporelle</w:t>
-            </w:r>
-            <w:proofErr w:type="spellEnd"/>
           </w:p>
           <w:p>
             <w:pPr>
@@ -1872,41 +1656,13 @@
                 <w:szCs w:val="22"/>
               </w:rPr>
             </w:pPr>
-            <w:proofErr w:type="spellStart"/>
             <w:r>
               <w:rPr>
                 <w:rFonts w:ascii="Cambria" w:eastAsia="MS Mincho" w:hAnsi="Cambria"/>
                 <w:sz w:val="22"/>
                 <w:szCs w:val="22"/>
               </w:rPr>
-              <w:t>Bridages</w:t>
-            </w:r>
-            <w:proofErr w:type="spellEnd"/>
-            <w:r>
-              <w:rPr>
-                <w:rFonts w:ascii="Cambria" w:eastAsia="MS Mincho" w:hAnsi="Cambria"/>
-                <w:sz w:val="22"/>
-                <w:szCs w:val="22"/>
-              </w:rPr>
-              <w:t xml:space="preserve"> (</w:t>
-            </w:r>
-            <w:proofErr w:type="spellStart"/>
-            <w:r>
-              <w:rPr>
-                <w:rFonts w:ascii="Cambria" w:eastAsia="MS Mincho" w:hAnsi="Cambria"/>
-                <w:sz w:val="22"/>
-                <w:szCs w:val="22"/>
-              </w:rPr>
-              <w:t>si</w:t>
-            </w:r>
-            <w:proofErr w:type="spellEnd"/>
-            <w:r>
-              <w:rPr>
-                <w:rFonts w:ascii="Cambria" w:eastAsia="MS Mincho" w:hAnsi="Cambria"/>
-                <w:sz w:val="22"/>
-                <w:szCs w:val="22"/>
-              </w:rPr>
-              <w:t xml:space="preserve"> applicable)</w:t>
+              <w:t>Bridages (si applicable)</w:t>
             </w:r>
           </w:p>
         </w:tc>
@@ -2016,18 +1772,8 @@
                 <w:sz w:val="22"/>
                 <w:szCs w:val="22"/>
               </w:rPr>
-              <w:t xml:space="preserve">Performance des </w:t>
+              <w:t>Performance des éoliennes</w:t>
             </w:r>
-            <w:proofErr w:type="spellStart"/>
-            <w:r>
-              <w:rPr>
-                <w:rFonts w:ascii="Cambria" w:eastAsia="MS Mincho" w:hAnsi="Cambria"/>
-                <w:sz w:val="22"/>
-                <w:szCs w:val="22"/>
-              </w:rPr>
-              <w:t>éoliennes</w:t>
-            </w:r>
-            <w:proofErr w:type="spellEnd"/>
           </w:p>
         </w:tc>
         <w:tc>
@@ -2077,41 +1823,13 @@
                 <w:szCs w:val="22"/>
               </w:rPr>
             </w:pPr>
-            <w:proofErr w:type="spellStart"/>
             <w:r>
               <w:rPr>
                 <w:rFonts w:ascii="Cambria" w:eastAsia="MS Mincho" w:hAnsi="Cambria"/>
                 <w:sz w:val="22"/>
                 <w:szCs w:val="22"/>
               </w:rPr>
-              <w:t>Analyse</w:t>
-            </w:r>
-            <w:proofErr w:type="spellEnd"/>
-            <w:r>
-              <w:rPr>
-                <w:rFonts w:ascii="Cambria" w:eastAsia="MS Mincho" w:hAnsi="Cambria"/>
-                <w:sz w:val="22"/>
-                <w:szCs w:val="22"/>
-              </w:rPr>
-              <w:t xml:space="preserve"> du </w:t>
-            </w:r>
-            <w:proofErr w:type="spellStart"/>
-            <w:r>
-              <w:rPr>
-                <w:rFonts w:ascii="Cambria" w:eastAsia="MS Mincho" w:hAnsi="Cambria"/>
-                <w:sz w:val="22"/>
-                <w:szCs w:val="22"/>
-              </w:rPr>
-              <w:t>comportement</w:t>
-            </w:r>
-            <w:proofErr w:type="spellEnd"/>
-            <w:r>
-              <w:rPr>
-                <w:rFonts w:ascii="Cambria" w:eastAsia="MS Mincho" w:hAnsi="Cambria"/>
-                <w:sz w:val="22"/>
-                <w:szCs w:val="22"/>
-              </w:rPr>
-              <w:t xml:space="preserve"> du pitch</w:t>
+              <w:t>Analyse du comportement du pitch</w:t>
             </w:r>
           </w:p>
           <w:p>
@@ -2157,23 +1875,13 @@
                 <w:szCs w:val="22"/>
               </w:rPr>
             </w:pPr>
-            <w:proofErr w:type="spellStart"/>
             <w:r>
               <w:rPr>
                 <w:rFonts w:ascii="Cambria" w:eastAsia="MS Mincho" w:hAnsi="Cambria"/>
                 <w:sz w:val="22"/>
                 <w:szCs w:val="22"/>
               </w:rPr>
-              <w:t>Analyse</w:t>
-            </w:r>
-            <w:proofErr w:type="spellEnd"/>
-            <w:r>
-              <w:rPr>
-                <w:rFonts w:ascii="Cambria" w:eastAsia="MS Mincho" w:hAnsi="Cambria"/>
-                <w:sz w:val="22"/>
-                <w:szCs w:val="22"/>
-              </w:rPr>
-              <w:t xml:space="preserve"> inter-turbines</w:t>
+              <w:t>Analyse inter-turbines</w:t>
             </w:r>
           </w:p>
           <w:p>
@@ -2192,41 +1900,13 @@
                 <w:szCs w:val="22"/>
               </w:rPr>
             </w:pPr>
-            <w:proofErr w:type="spellStart"/>
             <w:r>
               <w:rPr>
                 <w:rFonts w:ascii="Cambria" w:eastAsia="MS Mincho" w:hAnsi="Cambria"/>
                 <w:sz w:val="22"/>
                 <w:szCs w:val="22"/>
               </w:rPr>
-              <w:t>Cohérence</w:t>
-            </w:r>
-            <w:proofErr w:type="spellEnd"/>
-            <w:r>
-              <w:rPr>
-                <w:rFonts w:ascii="Cambria" w:eastAsia="MS Mincho" w:hAnsi="Cambria"/>
-                <w:sz w:val="22"/>
-                <w:szCs w:val="22"/>
-              </w:rPr>
-              <w:t xml:space="preserve"> </w:t>
-            </w:r>
-            <w:proofErr w:type="spellStart"/>
-            <w:r>
-              <w:rPr>
-                <w:rFonts w:ascii="Cambria" w:eastAsia="MS Mincho" w:hAnsi="Cambria"/>
-                <w:sz w:val="22"/>
-                <w:szCs w:val="22"/>
-              </w:rPr>
-              <w:t>globale</w:t>
-            </w:r>
-            <w:proofErr w:type="spellEnd"/>
-            <w:r>
-              <w:rPr>
-                <w:rFonts w:ascii="Cambria" w:eastAsia="MS Mincho" w:hAnsi="Cambria"/>
-                <w:sz w:val="22"/>
-                <w:szCs w:val="22"/>
-              </w:rPr>
-              <w:t xml:space="preserve"> des performances</w:t>
+              <w:t>Cohérence globale des performances</w:t>
             </w:r>
           </w:p>
         </w:tc>
@@ -2344,29 +2024,13 @@
         <w:t xml:space="preserve">La figure ci-après présente la disponibilité des données SCADA, sur la période allant du </w:t>
       </w:r>
       <w:r>
-        <w:t>{{</w:t>
-      </w:r>
-      <w:proofErr w:type="spellStart"/>
-      <w:r>
-        <w:t>analysis_start</w:t>
-      </w:r>
-      <w:proofErr w:type="spellEnd"/>
-      <w:r>
-        <w:t>}}</w:t>
+        <w:t>{{analysis_start}}</w:t>
       </w:r>
       <w:r>
         <w:t xml:space="preserve"> au </w:t>
       </w:r>
       <w:r>
-        <w:t>{{</w:t>
-      </w:r>
-      <w:proofErr w:type="spellStart"/>
-      <w:r>
-        <w:t>analysis_end</w:t>
-      </w:r>
-      <w:proofErr w:type="spellEnd"/>
-      <w:r>
-        <w:t>}}</w:t>
+        <w:t>{{analysis_end}}</w:t>
       </w:r>
       <w:r>
         <w:t>.</w:t>
@@ -2449,21 +2113,7 @@
         <w:rPr>
           <w:lang w:val="en-US"/>
         </w:rPr>
-        <w:t>{{</w:t>
-      </w:r>
-      <w:proofErr w:type="spellStart"/>
-      <w:r>
-        <w:rPr>
-          <w:lang w:val="en-US"/>
-        </w:rPr>
-        <w:t>data_availability_chart</w:t>
-      </w:r>
-      <w:proofErr w:type="spellEnd"/>
-      <w:r>
-        <w:rPr>
-          <w:lang w:val="en-US"/>
-        </w:rPr>
-        <w:t>}}</w:t>
+        <w:t>{{data_availability_chart}}</w:t>
       </w:r>
     </w:p>
     <w:p>
@@ -2500,23 +2150,7 @@
         </w:numPr>
       </w:pPr>
       <w:r>
-        <w:t>Disponibilité énergétique brute (</w:t>
-      </w:r>
-      <w:proofErr w:type="spellStart"/>
-      <w:r>
-        <w:t>cut</w:t>
-      </w:r>
-      <w:proofErr w:type="spellEnd"/>
-      <w:r>
-        <w:t xml:space="preserve">-in / </w:t>
-      </w:r>
-      <w:proofErr w:type="spellStart"/>
-      <w:r>
-        <w:t>cut</w:t>
-      </w:r>
-      <w:proofErr w:type="spellEnd"/>
-      <w:r>
-        <w:t>-out) : calculée pour les périodes où la vitesse de vent est comprise entre les seuils de démarrage et d’arrêt des éoliennes, en incluant l’ensemble des indisponibilités (arrêts techniques, maintenance, limitations réseau, etc.)</w:t>
+        <w:t>Disponibilité énergétique brute (cut-in / cut-out) : calculée pour les périodes où la vitesse de vent est comprise entre les seuils de démarrage et d’arrêt des éoliennes, en incluant l’ensemble des indisponibilités (arrêts techniques, maintenance, limitations réseau, etc.)</w:t>
       </w:r>
     </w:p>
     <w:p>
@@ -2606,23 +2240,7 @@
         </w:numPr>
       </w:pPr>
       <w:r>
-        <w:t>la disponibilité énergétique brute (</w:t>
-      </w:r>
-      <w:proofErr w:type="spellStart"/>
-      <w:r>
-        <w:t>cut</w:t>
-      </w:r>
-      <w:proofErr w:type="spellEnd"/>
-      <w:r>
-        <w:t xml:space="preserve">-in / </w:t>
-      </w:r>
-      <w:proofErr w:type="spellStart"/>
-      <w:r>
-        <w:t>cut</w:t>
-      </w:r>
-      <w:proofErr w:type="spellEnd"/>
-      <w:r>
-        <w:t>-out),</w:t>
+        <w:t>la disponibilité énergétique brute (cut-in / cut-out),</w:t>
       </w:r>
     </w:p>
     <w:p>
@@ -2660,21 +2278,7 @@
         <w:rPr>
           <w:lang w:val="en-US"/>
         </w:rPr>
-        <w:t>{{</w:t>
-      </w:r>
-      <w:proofErr w:type="spellStart"/>
-      <w:r>
-        <w:rPr>
-          <w:lang w:val="en-US"/>
-        </w:rPr>
-        <w:t>eba_cut_in_cut_out_chart</w:t>
-      </w:r>
-      <w:proofErr w:type="spellEnd"/>
-      <w:r>
-        <w:rPr>
-          <w:lang w:val="en-US"/>
-        </w:rPr>
-        <w:t>}}</w:t>
+        <w:t>{{eba_cut_in_cut_out_chart}}</w:t>
       </w:r>
     </w:p>
     <w:p>
@@ -2713,21 +2317,7 @@
         <w:rPr>
           <w:lang w:val="en-US"/>
         </w:rPr>
-        <w:t>{{</w:t>
-      </w:r>
-      <w:proofErr w:type="spellStart"/>
-      <w:r>
-        <w:rPr>
-          <w:lang w:val="en-US"/>
-        </w:rPr>
-        <w:t>eba_manifacturer_chart</w:t>
-      </w:r>
-      <w:proofErr w:type="spellEnd"/>
-      <w:r>
-        <w:rPr>
-          <w:lang w:val="en-US"/>
-        </w:rPr>
-        <w:t>}}</w:t>
+        <w:t>{{eba_manifacturer_chart}}</w:t>
       </w:r>
     </w:p>
     <w:p>
@@ -2771,21 +2361,7 @@
         <w:rPr>
           <w:lang w:val="en-US"/>
         </w:rPr>
-        <w:t>{{</w:t>
-      </w:r>
-      <w:proofErr w:type="spellStart"/>
-      <w:r>
-        <w:rPr>
-          <w:lang w:val="en-US"/>
-        </w:rPr>
-        <w:t>eba_loss_chart</w:t>
-      </w:r>
-      <w:proofErr w:type="spellEnd"/>
-      <w:r>
-        <w:rPr>
-          <w:lang w:val="en-US"/>
-        </w:rPr>
-        <w:t>}}</w:t>
+        <w:t>{{eba_loss_chart}}</w:t>
       </w:r>
     </w:p>
     <w:p>
@@ -2982,48 +2558,20 @@
         <w:rPr>
           <w:lang w:val="en-US"/>
         </w:rPr>
-        <w:t>{{</w:t>
-      </w:r>
-      <w:proofErr w:type="spellStart"/>
-      <w:r>
-        <w:rPr>
-          <w:lang w:val="en-US"/>
-        </w:rPr>
-        <w:t>top_error_code_frequency</w:t>
-      </w:r>
-      <w:proofErr w:type="spellEnd"/>
-      <w:r>
-        <w:rPr>
-          <w:lang w:val="en-US"/>
-        </w:rPr>
-        <w:t>}}</w:t>
-      </w:r>
-    </w:p>
-    <w:p>
-      <w:pPr>
-        <w:rPr>
-          <w:lang w:val="en-US"/>
-        </w:rPr>
-      </w:pPr>
-      <w:r>
-        <w:rPr>
-          <w:lang w:val="en-US"/>
-        </w:rPr>
-        <w:t>{{</w:t>
-      </w:r>
-      <w:proofErr w:type="spellStart"/>
-      <w:r>
-        <w:rPr>
-          <w:lang w:val="en-US"/>
-        </w:rPr>
-        <w:t>treemap_error_code</w:t>
-      </w:r>
-      <w:proofErr w:type="spellEnd"/>
-      <w:r>
-        <w:rPr>
-          <w:lang w:val="en-US"/>
-        </w:rPr>
-        <w:t>}}</w:t>
+        <w:t>{{top_error_code_frequency}}</w:t>
+      </w:r>
+    </w:p>
+    <w:p>
+      <w:pPr>
+        <w:rPr>
+          <w:lang w:val="en-US"/>
+        </w:rPr>
+      </w:pPr>
+      <w:r>
+        <w:rPr>
+          <w:lang w:val="en-US"/>
+        </w:rPr>
+        <w:t>{{treemap_error_code}}</w:t>
       </w:r>
     </w:p>
     <w:p>
@@ -3042,23 +2590,7 @@
     </w:p>
     <w:p>
       <w:r>
-        <w:t>L’analyse de la direction du vent vise à vérifier la cohérence des mesures directionnelles entre les éoliennes, ainsi que leur alignement avec une référence externe, afin de détecter d’éventuels défauts d’orientation (</w:t>
-      </w:r>
-      <w:proofErr w:type="spellStart"/>
-      <w:r>
-        <w:t>yaw</w:t>
-      </w:r>
-      <w:proofErr w:type="spellEnd"/>
-      <w:r>
-        <w:t xml:space="preserve"> </w:t>
-      </w:r>
-      <w:proofErr w:type="spellStart"/>
-      <w:r>
-        <w:t>misalignment</w:t>
-      </w:r>
-      <w:proofErr w:type="spellEnd"/>
-      <w:r>
-        <w:t>).</w:t>
+        <w:t>L’analyse de la direction du vent vise à vérifier la cohérence des mesures directionnelles entre les éoliennes, ainsi que leur alignement avec une référence externe, afin de détecter d’éventuels défauts d’orientation (yaw misalignment).</w:t>
       </w:r>
     </w:p>
     <w:p>
@@ -3148,75 +2680,33 @@
         <w:rPr>
           <w:lang w:val="en-US"/>
         </w:rPr>
-        <w:t>{{</w:t>
-      </w:r>
-      <w:proofErr w:type="spellStart"/>
-      <w:r>
-        <w:rPr>
-          <w:lang w:val="en-US"/>
-        </w:rPr>
-        <w:t>wind_direction_calibration</w:t>
-      </w:r>
-      <w:proofErr w:type="spellEnd"/>
-      <w:r>
-        <w:rPr>
-          <w:lang w:val="en-US"/>
-        </w:rPr>
-        <w:t>}}</w:t>
-      </w:r>
-    </w:p>
-    <w:p>
-      <w:pPr>
-        <w:rPr>
-          <w:lang w:val="en-US"/>
-        </w:rPr>
-      </w:pPr>
-      <w:r>
-        <w:rPr>
-          <w:lang w:val="en-US"/>
-        </w:rPr>
-        <w:t>{{</w:t>
-      </w:r>
-      <w:proofErr w:type="spellStart"/>
-      <w:r>
-        <w:rPr>
-          <w:lang w:val="en-US"/>
-        </w:rPr>
-        <w:t>power_rose_chart</w:t>
-      </w:r>
-      <w:proofErr w:type="spellEnd"/>
-      <w:r>
-        <w:rPr>
-          <w:lang w:val="en-US"/>
-        </w:rPr>
-        <w:t>}}</w:t>
-      </w:r>
-    </w:p>
-    <w:p>
-      <w:pPr>
-        <w:rPr>
-          <w:lang w:val="en-US"/>
-        </w:rPr>
-      </w:pPr>
-      <w:r>
-        <w:rPr>
-          <w:lang w:val="en-US"/>
-        </w:rPr>
-        <w:t>{{</w:t>
-      </w:r>
-      <w:proofErr w:type="spellStart"/>
-      <w:r>
-        <w:rPr>
-          <w:lang w:val="en-US"/>
-        </w:rPr>
-        <w:t>wind_rose_chart</w:t>
-      </w:r>
-      <w:proofErr w:type="spellEnd"/>
-      <w:r>
-        <w:rPr>
-          <w:lang w:val="en-US"/>
-        </w:rPr>
-        <w:t>}}</w:t>
+        <w:t>{{wind_direction_calibration}}</w:t>
+      </w:r>
+    </w:p>
+    <w:p>
+      <w:pPr>
+        <w:rPr>
+          <w:lang w:val="en-US"/>
+        </w:rPr>
+      </w:pPr>
+      <w:r>
+        <w:rPr>
+          <w:lang w:val="en-US"/>
+        </w:rPr>
+        <w:t>{{power_rose_chart}}</w:t>
+      </w:r>
+    </w:p>
+    <w:p>
+      <w:pPr>
+        <w:rPr>
+          <w:lang w:val="en-US"/>
+        </w:rPr>
+      </w:pPr>
+      <w:r>
+        <w:rPr>
+          <w:lang w:val="en-US"/>
+        </w:rPr>
+        <w:t>{{wind_rose_chart}}</w:t>
       </w:r>
     </w:p>
     <w:p>
@@ -3303,15 +2793,7 @@
         <w:t>Exclusion</w:t>
       </w:r>
       <w:r>
-        <w:t xml:space="preserve"> des situations de sillage (wake </w:t>
-      </w:r>
-      <w:proofErr w:type="spellStart"/>
-      <w:r>
-        <w:t>effect</w:t>
-      </w:r>
-      <w:proofErr w:type="spellEnd"/>
-      <w:r>
-        <w:t xml:space="preserve">), </w:t>
+        <w:t xml:space="preserve"> des situations de sillage (wake effect), </w:t>
       </w:r>
     </w:p>
     <w:p>
@@ -3392,19 +2874,11 @@
         </w:rPr>
         <w:t>{{</w:t>
       </w:r>
-      <w:proofErr w:type="spellStart"/>
-      <w:r>
-        <w:rPr>
-          <w:lang w:val="en-US"/>
-        </w:rPr>
-        <w:t>power_curve_chart</w:t>
-      </w:r>
-      <w:proofErr w:type="spellEnd"/>
-      <w:r>
-        <w:rPr>
-          <w:lang w:val="en-US"/>
-        </w:rPr>
-        <w:t>}}</w:t>
+      <w:r>
+        <w:rPr>
+          <w:lang w:val="en-US"/>
+        </w:rPr>
+        <w:t>power_curve_chart}}</w:t>
       </w:r>
     </w:p>
     <w:p>
@@ -3575,11 +3049,9 @@
         </w:rPr>
         <w:t>{{</w:t>
       </w:r>
-      <w:proofErr w:type="spellStart"/>
       <w:r>
         <w:t>rpm_chart</w:t>
       </w:r>
-      <w:proofErr w:type="spellEnd"/>
       <w:r>
         <w:rPr>
           <w:lang w:val="en-US"/>
@@ -3725,14 +3197,12 @@
         </w:rPr>
         <w:t>{{</w:t>
       </w:r>
-      <w:proofErr w:type="spellStart"/>
       <w:r>
         <w:rPr>
           <w:lang w:val="en-US"/>
         </w:rPr>
         <w:t>pitch_chart</w:t>
       </w:r>
-      <w:proofErr w:type="spellEnd"/>
       <w:r>
         <w:rPr>
           <w:lang w:val="en-US"/>
@@ -3760,7 +3230,7 @@
         <w:pStyle w:val="Titre2"/>
       </w:pPr>
       <w:r>
-        <w:t>Analyse des limitations de puissance</w:t>
+        <w:t>Analyse des limitations</w:t>
       </w:r>
     </w:p>
     <w:p>
@@ -3769,15 +3239,10 @@
       </w:r>
       <w:r>
         <w:lastRenderedPageBreak/>
-        <w:t xml:space="preserve">d'identifier des situations de </w:t>
-      </w:r>
-      <w:proofErr w:type="spellStart"/>
-      <w:r>
-        <w:t>curtailment</w:t>
-      </w:r>
-      <w:proofErr w:type="spellEnd"/>
-      <w:r>
-        <w:t xml:space="preserve"> inattendu, visibles à travers des regroupements de points (clusters) s'écartant de la courbe de puissance nominale attendue. L'analyse repose sur la représentation de la puissance active en fonction de la vitesse du vent sous forme de nuages de points. Afin de représenter le comportement nominal des éoliennes, les données sont filtrées pour exclure :</w:t>
+        <w:t xml:space="preserve">d'identifier des situations de curtailment inattendu, visibles à travers des regroupements de points (clusters) s'écartant de la courbe de puissance nominale attendue. L'analyse repose sur la représentation de la puissance active en fonction de la vitesse du vent sous forme de nuages de points. Les figures ci-après présentent les nuages de points pour chaque éolienne. </w:t>
+      </w:r>
+      <w:r>
+        <w:t xml:space="preserve">Les figures illustres des classes de fonctionnements pour la puissance, l’orientation des pales et la rotation par mimutes :  </w:t>
       </w:r>
     </w:p>
     <w:p>
@@ -3785,11 +3250,11 @@
         <w:pStyle w:val="Paragraphedeliste"/>
         <w:numPr>
           <w:ilvl w:val="0"/>
-          <w:numId w:val="15"/>
+          <w:numId w:val="16"/>
         </w:numPr>
       </w:pPr>
       <w:r>
-        <w:t xml:space="preserve">les périodes de limitations environnementales (bruit, chauves-souris, ombrage, etc.), </w:t>
+        <w:t>Stop (low wind)</w:t>
       </w:r>
     </w:p>
     <w:p>
@@ -3797,11 +3262,11 @@
         <w:pStyle w:val="Paragraphedeliste"/>
         <w:numPr>
           <w:ilvl w:val="0"/>
-          <w:numId w:val="15"/>
+          <w:numId w:val="16"/>
         </w:numPr>
       </w:pPr>
       <w:r>
-        <w:t>les phases de démarrage et d'arrêt,</w:t>
+        <w:t>Start</w:t>
       </w:r>
     </w:p>
     <w:p>
@@ -3809,35 +3274,57 @@
         <w:pStyle w:val="Paragraphedeliste"/>
         <w:numPr>
           <w:ilvl w:val="0"/>
-          <w:numId w:val="15"/>
+          <w:numId w:val="16"/>
         </w:numPr>
       </w:pPr>
       <w:r>
-        <w:t xml:space="preserve">ainsi que les situations non représentatives du fonctionnement normal. </w:t>
-      </w:r>
-    </w:p>
-    <w:p>
-      <w:r>
-        <w:t>Les figures ci-après présentent les nuages de points pour chaque éolienne ainsi que leur évolution mensuelle sur la période d'analyse. Les figures relatives aux autres éoliennes sont disponibles en annexe.</w:t>
-      </w:r>
-    </w:p>
-    <w:p>
-      <w:r>
-        <w:t>préciser quelle éolienne est présentée dans le corps du rapport et lesquelles sont renvoyées en annexe, cohérence à maintenir avec l'analyse comparative des courbes de puissance. Dans l'étude de référence, E9 est présentée dans le corps du rapport.]</w:t>
-      </w:r>
-    </w:p>
-    <w:p>
-      <w:r>
-        <w:t xml:space="preserve"> </w:t>
-      </w:r>
+        <w:t>Max rotation</w:t>
+      </w:r>
+    </w:p>
+    <w:p>
+      <w:pPr>
+        <w:pStyle w:val="Paragraphedeliste"/>
+        <w:numPr>
+          <w:ilvl w:val="0"/>
+          <w:numId w:val="16"/>
+        </w:numPr>
+      </w:pPr>
+      <w:r>
+        <w:t>Max Power</w:t>
+      </w:r>
+    </w:p>
+    <w:p>
+      <w:pPr>
+        <w:pStyle w:val="Paragraphedeliste"/>
+        <w:numPr>
+          <w:ilvl w:val="0"/>
+          <w:numId w:val="16"/>
+        </w:numPr>
+      </w:pPr>
+      <w:r>
+        <w:t>Stop (high wind)</w:t>
+      </w:r>
+    </w:p>
+    <w:p>
+      <w:pPr>
+        <w:pStyle w:val="Paragraphedeliste"/>
+        <w:numPr>
+          <w:ilvl w:val="0"/>
+          <w:numId w:val="16"/>
+        </w:numPr>
+      </w:pPr>
+      <w:r>
+        <w:t>Outlier (anomalies)</w:t>
+      </w:r>
+    </w:p>
+    <w:p/>
+    <w:p>
       <w:r>
         <w:t>{{</w:t>
       </w:r>
-      <w:proofErr w:type="spellStart"/>
       <w:r>
         <w:t>performance_level_chart</w:t>
       </w:r>
-      <w:proofErr w:type="spellEnd"/>
       <w:r>
         <w:t>}}</w:t>
       </w:r>
@@ -3845,16 +3332,9 @@
     <w:p/>
     <w:p>
       <w:r>
-        <w:t>[TODO.TABLEAU LMITE DE PUISSANCE]</w:t>
-      </w:r>
-    </w:p>
-    <w:p>
-      <w:r>
-        <w:t>[TODO.IMAGE LIMITE DE PUISSANCE]</w:t>
-      </w:r>
-    </w:p>
-    <w:p>
-      <w:r>
+        <w:rPr>
+          <w:highlight w:val="lightGray"/>
+        </w:rPr>
         <w:t>[ANALYSE]</w:t>
       </w:r>
     </w:p>
@@ -3868,6 +3348,9 @@
     </w:p>
     <w:p>
       <w:r>
+        <w:rPr>
+          <w:highlight w:val="lightGray"/>
+        </w:rPr>
         <w:t>[ANALYSE]</w:t>
       </w:r>
     </w:p>
@@ -3881,6 +3364,9 @@
     </w:p>
     <w:p>
       <w:r>
+        <w:rPr>
+          <w:highlight w:val="lightGray"/>
+        </w:rPr>
         <w:t>[A COMPLETER]</w:t>
       </w:r>
     </w:p>
@@ -3897,15 +3383,7 @@
         <w:pStyle w:val="Titre2"/>
       </w:pPr>
       <w:r>
-        <w:t xml:space="preserve">Disponibilité temporelle (Time-Based </w:t>
-      </w:r>
-      <w:proofErr w:type="spellStart"/>
-      <w:r>
-        <w:t>Availability</w:t>
-      </w:r>
-      <w:proofErr w:type="spellEnd"/>
-      <w:r>
-        <w:t xml:space="preserve"> – TBA)</w:t>
+        <w:t>Disponibilité temporelle (Time-Based Availability – TBA)</w:t>
       </w:r>
     </w:p>
     <w:p>
@@ -4427,6 +3905,119 @@
     </w:lvl>
   </w:abstractNum>
   <w:abstractNum w:abstractNumId="4" w15:restartNumberingAfterBreak="0">
+    <w:nsid w:val="25211604"/>
+    <w:multiLevelType w:val="hybridMultilevel"/>
+    <w:tmpl w:val="B0BEE23C"/>
+    <w:lvl w:ilvl="0" w:tplc="040C0001">
+      <w:start w:val="1"/>
+      <w:numFmt w:val="bullet"/>
+      <w:lvlText w:val=""/>
+      <w:lvlJc w:val="left"/>
+      <w:pPr>
+        <w:ind w:left="720" w:hanging="360"/>
+      </w:pPr>
+      <w:rPr>
+        <w:rFonts w:ascii="Symbol" w:hAnsi="Symbol" w:hint="default"/>
+      </w:rPr>
+    </w:lvl>
+    <w:lvl w:ilvl="1" w:tplc="040C0003" w:tentative="1">
+      <w:start w:val="1"/>
+      <w:numFmt w:val="bullet"/>
+      <w:lvlText w:val="o"/>
+      <w:lvlJc w:val="left"/>
+      <w:pPr>
+        <w:ind w:left="1440" w:hanging="360"/>
+      </w:pPr>
+      <w:rPr>
+        <w:rFonts w:ascii="Courier New" w:hAnsi="Courier New" w:cs="Courier New" w:hint="default"/>
+      </w:rPr>
+    </w:lvl>
+    <w:lvl w:ilvl="2" w:tplc="040C0005" w:tentative="1">
+      <w:start w:val="1"/>
+      <w:numFmt w:val="bullet"/>
+      <w:lvlText w:val=""/>
+      <w:lvlJc w:val="left"/>
+      <w:pPr>
+        <w:ind w:left="2160" w:hanging="360"/>
+      </w:pPr>
+      <w:rPr>
+        <w:rFonts w:ascii="Wingdings" w:hAnsi="Wingdings" w:hint="default"/>
+      </w:rPr>
+    </w:lvl>
+    <w:lvl w:ilvl="3" w:tplc="040C0001" w:tentative="1">
+      <w:start w:val="1"/>
+      <w:numFmt w:val="bullet"/>
+      <w:lvlText w:val=""/>
+      <w:lvlJc w:val="left"/>
+      <w:pPr>
+        <w:ind w:left="2880" w:hanging="360"/>
+      </w:pPr>
+      <w:rPr>
+        <w:rFonts w:ascii="Symbol" w:hAnsi="Symbol" w:hint="default"/>
+      </w:rPr>
+    </w:lvl>
+    <w:lvl w:ilvl="4" w:tplc="040C0003" w:tentative="1">
+      <w:start w:val="1"/>
+      <w:numFmt w:val="bullet"/>
+      <w:lvlText w:val="o"/>
+      <w:lvlJc w:val="left"/>
+      <w:pPr>
+        <w:ind w:left="3600" w:hanging="360"/>
+      </w:pPr>
+      <w:rPr>
+        <w:rFonts w:ascii="Courier New" w:hAnsi="Courier New" w:cs="Courier New" w:hint="default"/>
+      </w:rPr>
+    </w:lvl>
+    <w:lvl w:ilvl="5" w:tplc="040C0005" w:tentative="1">
+      <w:start w:val="1"/>
+      <w:numFmt w:val="bullet"/>
+      <w:lvlText w:val=""/>
+      <w:lvlJc w:val="left"/>
+      <w:pPr>
+        <w:ind w:left="4320" w:hanging="360"/>
+      </w:pPr>
+      <w:rPr>
+        <w:rFonts w:ascii="Wingdings" w:hAnsi="Wingdings" w:hint="default"/>
+      </w:rPr>
+    </w:lvl>
+    <w:lvl w:ilvl="6" w:tplc="040C0001" w:tentative="1">
+      <w:start w:val="1"/>
+      <w:numFmt w:val="bullet"/>
+      <w:lvlText w:val=""/>
+      <w:lvlJc w:val="left"/>
+      <w:pPr>
+        <w:ind w:left="5040" w:hanging="360"/>
+      </w:pPr>
+      <w:rPr>
+        <w:rFonts w:ascii="Symbol" w:hAnsi="Symbol" w:hint="default"/>
+      </w:rPr>
+    </w:lvl>
+    <w:lvl w:ilvl="7" w:tplc="040C0003" w:tentative="1">
+      <w:start w:val="1"/>
+      <w:numFmt w:val="bullet"/>
+      <w:lvlText w:val="o"/>
+      <w:lvlJc w:val="left"/>
+      <w:pPr>
+        <w:ind w:left="5760" w:hanging="360"/>
+      </w:pPr>
+      <w:rPr>
+        <w:rFonts w:ascii="Courier New" w:hAnsi="Courier New" w:cs="Courier New" w:hint="default"/>
+      </w:rPr>
+    </w:lvl>
+    <w:lvl w:ilvl="8" w:tplc="040C0005" w:tentative="1">
+      <w:start w:val="1"/>
+      <w:numFmt w:val="bullet"/>
+      <w:lvlText w:val=""/>
+      <w:lvlJc w:val="left"/>
+      <w:pPr>
+        <w:ind w:left="6480" w:hanging="360"/>
+      </w:pPr>
+      <w:rPr>
+        <w:rFonts w:ascii="Wingdings" w:hAnsi="Wingdings" w:hint="default"/>
+      </w:rPr>
+    </w:lvl>
+  </w:abstractNum>
+  <w:abstractNum w:abstractNumId="5" w15:restartNumberingAfterBreak="0">
     <w:nsid w:val="26A54AD6"/>
     <w:multiLevelType w:val="hybridMultilevel"/>
     <w:tmpl w:val="35CC2584"/>
@@ -4539,7 +4130,7 @@
       </w:rPr>
     </w:lvl>
   </w:abstractNum>
-  <w:abstractNum w:abstractNumId="5" w15:restartNumberingAfterBreak="0">
+  <w:abstractNum w:abstractNumId="6" w15:restartNumberingAfterBreak="0">
     <w:nsid w:val="26B532D1"/>
     <w:multiLevelType w:val="hybridMultilevel"/>
     <w:tmpl w:val="7174CCBA"/>
@@ -4652,7 +4243,7 @@
       </w:rPr>
     </w:lvl>
   </w:abstractNum>
-  <w:abstractNum w:abstractNumId="6" w15:restartNumberingAfterBreak="0">
+  <w:abstractNum w:abstractNumId="7" w15:restartNumberingAfterBreak="0">
     <w:nsid w:val="2B0767A7"/>
     <w:multiLevelType w:val="hybridMultilevel"/>
     <w:tmpl w:val="5A34D448"/>
@@ -4765,7 +4356,7 @@
       </w:rPr>
     </w:lvl>
   </w:abstractNum>
-  <w:abstractNum w:abstractNumId="7" w15:restartNumberingAfterBreak="0">
+  <w:abstractNum w:abstractNumId="8" w15:restartNumberingAfterBreak="0">
     <w:nsid w:val="358273A7"/>
     <w:multiLevelType w:val="hybridMultilevel"/>
     <w:tmpl w:val="4776DC4C"/>
@@ -4878,7 +4469,7 @@
       </w:rPr>
     </w:lvl>
   </w:abstractNum>
-  <w:abstractNum w:abstractNumId="8" w15:restartNumberingAfterBreak="0">
+  <w:abstractNum w:abstractNumId="9" w15:restartNumberingAfterBreak="0">
     <w:nsid w:val="3A576601"/>
     <w:multiLevelType w:val="hybridMultilevel"/>
     <w:tmpl w:val="87A090BA"/>
@@ -4991,7 +4582,7 @@
       </w:rPr>
     </w:lvl>
   </w:abstractNum>
-  <w:abstractNum w:abstractNumId="9" w15:restartNumberingAfterBreak="0">
+  <w:abstractNum w:abstractNumId="10" w15:restartNumberingAfterBreak="0">
     <w:nsid w:val="4FD61365"/>
     <w:multiLevelType w:val="hybridMultilevel"/>
     <w:tmpl w:val="425E6152"/>
@@ -5104,7 +4695,7 @@
       </w:rPr>
     </w:lvl>
   </w:abstractNum>
-  <w:abstractNum w:abstractNumId="10" w15:restartNumberingAfterBreak="0">
+  <w:abstractNum w:abstractNumId="11" w15:restartNumberingAfterBreak="0">
     <w:nsid w:val="53A943CA"/>
     <w:multiLevelType w:val="hybridMultilevel"/>
     <w:tmpl w:val="34B8E88E"/>
@@ -5217,7 +4808,7 @@
       </w:rPr>
     </w:lvl>
   </w:abstractNum>
-  <w:abstractNum w:abstractNumId="11" w15:restartNumberingAfterBreak="0">
+  <w:abstractNum w:abstractNumId="12" w15:restartNumberingAfterBreak="0">
     <w:nsid w:val="55206C58"/>
     <w:multiLevelType w:val="hybridMultilevel"/>
     <w:tmpl w:val="E42AB0BC"/>
@@ -5330,7 +4921,7 @@
       </w:rPr>
     </w:lvl>
   </w:abstractNum>
-  <w:abstractNum w:abstractNumId="12" w15:restartNumberingAfterBreak="0">
+  <w:abstractNum w:abstractNumId="13" w15:restartNumberingAfterBreak="0">
     <w:nsid w:val="594164EE"/>
     <w:multiLevelType w:val="hybridMultilevel"/>
     <w:tmpl w:val="F09AFD8A"/>
@@ -5443,7 +5034,7 @@
       </w:rPr>
     </w:lvl>
   </w:abstractNum>
-  <w:abstractNum w:abstractNumId="13" w15:restartNumberingAfterBreak="0">
+  <w:abstractNum w:abstractNumId="14" w15:restartNumberingAfterBreak="0">
     <w:nsid w:val="62E82CBB"/>
     <w:multiLevelType w:val="hybridMultilevel"/>
     <w:tmpl w:val="94AC07A0"/>
@@ -5556,7 +5147,7 @@
       </w:rPr>
     </w:lvl>
   </w:abstractNum>
-  <w:abstractNum w:abstractNumId="14" w15:restartNumberingAfterBreak="0">
+  <w:abstractNum w:abstractNumId="15" w15:restartNumberingAfterBreak="0">
     <w:nsid w:val="6B864DCF"/>
     <w:multiLevelType w:val="hybridMultilevel"/>
     <w:tmpl w:val="90302C54"/>
@@ -5676,43 +5267,46 @@
     <w:abstractNumId w:val="3"/>
   </w:num>
   <w:num w:numId="3" w16cid:durableId="499976514">
-    <w:abstractNumId w:val="13"/>
+    <w:abstractNumId w:val="14"/>
   </w:num>
   <w:num w:numId="4" w16cid:durableId="586500175">
-    <w:abstractNumId w:val="7"/>
+    <w:abstractNumId w:val="8"/>
   </w:num>
   <w:num w:numId="5" w16cid:durableId="315955181">
     <w:abstractNumId w:val="0"/>
   </w:num>
   <w:num w:numId="6" w16cid:durableId="225188296">
-    <w:abstractNumId w:val="9"/>
+    <w:abstractNumId w:val="10"/>
   </w:num>
   <w:num w:numId="7" w16cid:durableId="500971371">
-    <w:abstractNumId w:val="11"/>
+    <w:abstractNumId w:val="12"/>
   </w:num>
   <w:num w:numId="8" w16cid:durableId="466968896">
     <w:abstractNumId w:val="2"/>
   </w:num>
   <w:num w:numId="9" w16cid:durableId="1994141544">
-    <w:abstractNumId w:val="12"/>
+    <w:abstractNumId w:val="13"/>
   </w:num>
   <w:num w:numId="10" w16cid:durableId="681318866">
-    <w:abstractNumId w:val="10"/>
+    <w:abstractNumId w:val="11"/>
   </w:num>
   <w:num w:numId="11" w16cid:durableId="1365206944">
+    <w:abstractNumId w:val="6"/>
+  </w:num>
+  <w:num w:numId="12" w16cid:durableId="1833135886">
+    <w:abstractNumId w:val="9"/>
+  </w:num>
+  <w:num w:numId="13" w16cid:durableId="184364037">
+    <w:abstractNumId w:val="15"/>
+  </w:num>
+  <w:num w:numId="14" w16cid:durableId="1952777486">
     <w:abstractNumId w:val="5"/>
   </w:num>
-  <w:num w:numId="12" w16cid:durableId="1833135886">
-    <w:abstractNumId w:val="8"/>
+  <w:num w:numId="15" w16cid:durableId="894321048">
+    <w:abstractNumId w:val="7"/>
   </w:num>
-  <w:num w:numId="13" w16cid:durableId="184364037">
-    <w:abstractNumId w:val="14"/>
-  </w:num>
-  <w:num w:numId="14" w16cid:durableId="1952777486">
+  <w:num w:numId="16" w16cid:durableId="2144540130">
     <w:abstractNumId w:val="4"/>
-  </w:num>
-  <w:num w:numId="15" w16cid:durableId="894321048">
-    <w:abstractNumId w:val="6"/>
   </w:num>
 </w:numbering>
 </file>
@@ -6373,6 +5967,7 @@
   <w:style w:type="character" w:default="1" w:styleId="Policepardfaut">
     <w:name w:val="Default Paragraph Font"/>
     <w:uiPriority w:val="1"/>
+    <w:semiHidden/>
     <w:unhideWhenUsed/>
   </w:style>
   <w:style w:type="table" w:default="1" w:styleId="TableauNormal">

</xml_diff>

<commit_message>
[CHANGE] change the way we detect anomalies for power, RPM and Pitchsé
</commit_message>
<xml_diff>
--- a/assets/templates/template_scada.docx
+++ b/assets/templates/template_scada.docx
@@ -315,8 +315,17 @@
                 <w:b/>
                 <w:bCs/>
               </w:rPr>
-              <w:t>Date d’émission</w:t>
+              <w:t xml:space="preserve">Date </w:t>
             </w:r>
+            <w:proofErr w:type="spellStart"/>
+            <w:r>
+              <w:rPr>
+                <w:b/>
+                <w:bCs/>
+              </w:rPr>
+              <w:t>d’émission</w:t>
+            </w:r>
+            <w:proofErr w:type="spellEnd"/>
           </w:p>
         </w:tc>
         <w:tc>
@@ -352,6 +361,7 @@
                 <w:bCs/>
               </w:rPr>
             </w:pPr>
+            <w:proofErr w:type="spellStart"/>
             <w:r>
               <w:rPr>
                 <w:b/>
@@ -359,6 +369,7 @@
               </w:rPr>
               <w:t>Rédacteur</w:t>
             </w:r>
+            <w:proofErr w:type="spellEnd"/>
           </w:p>
         </w:tc>
         <w:tc>
@@ -373,6 +384,7 @@
                 <w:bCs/>
               </w:rPr>
             </w:pPr>
+            <w:proofErr w:type="spellStart"/>
             <w:r>
               <w:rPr>
                 <w:b/>
@@ -380,6 +392,7 @@
               </w:rPr>
               <w:t>Vérificateur</w:t>
             </w:r>
+            <w:proofErr w:type="spellEnd"/>
           </w:p>
         </w:tc>
         <w:tc>
@@ -394,6 +407,7 @@
                 <w:bCs/>
               </w:rPr>
             </w:pPr>
+            <w:proofErr w:type="spellStart"/>
             <w:r>
               <w:rPr>
                 <w:b/>
@@ -401,6 +415,7 @@
               </w:rPr>
               <w:t>Approbateur</w:t>
             </w:r>
+            <w:proofErr w:type="spellEnd"/>
           </w:p>
         </w:tc>
       </w:tr>
@@ -974,9 +989,11 @@
         <w:lastRenderedPageBreak/>
         <w:t>Nom du parc : {{</w:t>
       </w:r>
+      <w:proofErr w:type="spellStart"/>
       <w:r>
         <w:t>park_name</w:t>
       </w:r>
+      <w:proofErr w:type="spellEnd"/>
       <w:r>
         <w:t xml:space="preserve">}} </w:t>
       </w:r>
@@ -985,31 +1002,43 @@
       <w:r>
         <w:t>Type d’éoliennes : {{</w:t>
       </w:r>
+      <w:proofErr w:type="spellStart"/>
       <w:r>
         <w:t>model_wtg</w:t>
       </w:r>
+      <w:proofErr w:type="spellEnd"/>
       <w:r>
         <w:t xml:space="preserve">}} </w:t>
       </w:r>
     </w:p>
     <w:p>
       <w:r>
-        <w:t>Nombre d’éoliennes : {{N</w:t>
+        <w:t>Nombre d’éoliennes : {{</w:t>
+      </w:r>
+      <w:proofErr w:type="spellStart"/>
+      <w:r>
+        <w:t>N</w:t>
       </w:r>
       <w:r>
         <w:t>ombre</w:t>
       </w:r>
       <w:r>
-        <w:t xml:space="preserve">_WTG}} </w:t>
+        <w:t>_WTG</w:t>
+      </w:r>
+      <w:proofErr w:type="spellEnd"/>
+      <w:r>
+        <w:t xml:space="preserve">}} </w:t>
       </w:r>
     </w:p>
     <w:p>
       <w:r>
         <w:t>Puissance totale installée : {{</w:t>
       </w:r>
+      <w:proofErr w:type="spellStart"/>
       <w:r>
         <w:t>nominal_power</w:t>
       </w:r>
+      <w:proofErr w:type="spellEnd"/>
       <w:r>
         <w:t xml:space="preserve">}} </w:t>
       </w:r>
@@ -1046,8 +1075,13 @@
       </w:r>
     </w:p>
     <w:p>
-      <w:r>
-        <w:t>Email : {{MAIL_AUTEUR}}</w:t>
+      <w:proofErr w:type="gramStart"/>
+      <w:r>
+        <w:t>Email</w:t>
+      </w:r>
+      <w:proofErr w:type="gramEnd"/>
+      <w:r>
+        <w:t xml:space="preserve"> : {{MAIL_AUTEUR}}</w:t>
       </w:r>
     </w:p>
     <w:p>
@@ -1067,8 +1101,13 @@
       </w:r>
     </w:p>
     <w:p>
-      <w:r>
-        <w:t>Email : {{MAIL_VERIFICATEUR}}</w:t>
+      <w:proofErr w:type="gramStart"/>
+      <w:r>
+        <w:t>Email</w:t>
+      </w:r>
+      <w:proofErr w:type="gramEnd"/>
+      <w:r>
+        <w:t xml:space="preserve"> : {{MAIL_VERIFICATEUR}}</w:t>
       </w:r>
     </w:p>
     <w:p>
@@ -1088,8 +1127,13 @@
       </w:r>
     </w:p>
     <w:p>
-      <w:r>
-        <w:t>Email : {{MAIL_APPROBATEUR}}</w:t>
+      <w:proofErr w:type="gramStart"/>
+      <w:r>
+        <w:t>Email</w:t>
+      </w:r>
+      <w:proofErr w:type="gramEnd"/>
+      <w:r>
+        <w:t xml:space="preserve"> : {{MAIL_APPROBATEUR}}</w:t>
       </w:r>
     </w:p>
     <w:p>
@@ -1123,25 +1167,57 @@
         <w:t xml:space="preserve">Les données SCADA du parc éolien </w:t>
       </w:r>
       <w:r>
-        <w:t>{{park_name}}</w:t>
+        <w:t>{{</w:t>
+      </w:r>
+      <w:proofErr w:type="spellStart"/>
+      <w:r>
+        <w:t>park_name</w:t>
+      </w:r>
+      <w:proofErr w:type="spellEnd"/>
+      <w:r>
+        <w:t>}}</w:t>
       </w:r>
       <w:r>
         <w:t xml:space="preserve"> ont été analysées sur la période du </w:t>
       </w:r>
       <w:r>
-        <w:t>{{analysis_start}}</w:t>
+        <w:t>{{</w:t>
+      </w:r>
+      <w:proofErr w:type="spellStart"/>
+      <w:r>
+        <w:t>analysis_start</w:t>
+      </w:r>
+      <w:proofErr w:type="spellEnd"/>
+      <w:r>
+        <w:t>}}</w:t>
       </w:r>
       <w:r>
         <w:t xml:space="preserve"> au </w:t>
       </w:r>
       <w:r>
-        <w:t>{{analysis_end}}</w:t>
+        <w:t>{{</w:t>
+      </w:r>
+      <w:proofErr w:type="spellStart"/>
+      <w:r>
+        <w:t>analysis_end</w:t>
+      </w:r>
+      <w:proofErr w:type="spellEnd"/>
+      <w:r>
+        <w:t>}}</w:t>
       </w:r>
       <w:r>
         <w:t xml:space="preserve">, à partir des informations fournies par le client. Le parc est composé de </w:t>
       </w:r>
       <w:r>
-        <w:t>{{turbine_count}}</w:t>
+        <w:t>{{</w:t>
+      </w:r>
+      <w:proofErr w:type="spellStart"/>
+      <w:r>
+        <w:t>turbine_count</w:t>
+      </w:r>
+      <w:proofErr w:type="spellEnd"/>
+      <w:r>
+        <w:t>}}</w:t>
       </w:r>
       <w:r>
         <w:t xml:space="preserve"> éoliennes de type</w:t>
@@ -1150,16 +1226,32 @@
         <w:t xml:space="preserve"> </w:t>
       </w:r>
       <w:r>
-        <w:t>{{model_wtg}</w:t>
-      </w:r>
+        <w:t>{{</w:t>
+      </w:r>
+      <w:proofErr w:type="spellStart"/>
+      <w:r>
+        <w:t>model_wtg</w:t>
+      </w:r>
+      <w:proofErr w:type="spellEnd"/>
       <w:r>
         <w:t>}</w:t>
       </w:r>
       <w:r>
+        <w:t>}</w:t>
+      </w:r>
+      <w:r>
         <w:t xml:space="preserve">, désignées </w:t>
       </w:r>
       <w:r>
-        <w:t>{{turbine_list}}</w:t>
+        <w:t>{{</w:t>
+      </w:r>
+      <w:proofErr w:type="spellStart"/>
+      <w:r>
+        <w:t>turbine_list</w:t>
+      </w:r>
+      <w:proofErr w:type="spellEnd"/>
+      <w:r>
+        <w:t>}}</w:t>
       </w:r>
       <w:r>
         <w:t xml:space="preserve"> L’ensemble des turbines a été pris en compte dans l’analyse.</w:t>
@@ -1181,13 +1273,21 @@
     <w:p/>
     <w:p>
       <w:r>
-        <w:t>[T</w:t>
+        <w:t>[</w:t>
+      </w:r>
+      <w:proofErr w:type="gramStart"/>
+      <w:r>
+        <w:t>T</w:t>
       </w:r>
       <w:r>
         <w:t>ODO</w:t>
       </w:r>
       <w:r>
-        <w:t>:SCADA_SUMMARY_TABLE]</w:t>
+        <w:t>:SCADA</w:t>
+      </w:r>
+      <w:proofErr w:type="gramEnd"/>
+      <w:r>
+        <w:t>_SUMMARY_TABLE]</w:t>
       </w:r>
     </w:p>
     <w:p>
@@ -1213,35 +1313,56 @@
       <w:r>
         <w:t>Le parc éolien {{</w:t>
       </w:r>
+      <w:proofErr w:type="spellStart"/>
       <w:r>
         <w:t>park_name</w:t>
       </w:r>
+      <w:proofErr w:type="spellEnd"/>
       <w:r>
         <w:t>}} est situé sur le territoire des communes de {{COMMUNES}}, dans la région de {{REGION}}. Il est composé de {{</w:t>
       </w:r>
+      <w:proofErr w:type="spellStart"/>
       <w:r>
         <w:t>turbine_count</w:t>
       </w:r>
+      <w:proofErr w:type="spellEnd"/>
       <w:r>
         <w:t>}} éoliennes de type {{</w:t>
       </w:r>
+      <w:proofErr w:type="spellStart"/>
       <w:r>
         <w:t>model_wtg</w:t>
       </w:r>
+      <w:proofErr w:type="spellEnd"/>
       <w:r>
         <w:t>}}, d’une puissance nominale unitaire de {{</w:t>
       </w:r>
+      <w:proofErr w:type="spellStart"/>
       <w:r>
         <w:t>nominal_power</w:t>
       </w:r>
+      <w:proofErr w:type="spellEnd"/>
       <w:r>
         <w:t>}}, soit une puissance totale installée de {{</w:t>
       </w:r>
-      <w:r>
-        <w:t xml:space="preserve">total_power </w:t>
-      </w:r>
-      <w:r>
-        <w:t>}}.</w:t>
+      <w:proofErr w:type="spellStart"/>
+      <w:r>
+        <w:t>total_</w:t>
+      </w:r>
+      <w:proofErr w:type="gramStart"/>
+      <w:r>
+        <w:t>power</w:t>
+      </w:r>
+      <w:proofErr w:type="spellEnd"/>
+      <w:r>
+        <w:t xml:space="preserve"> </w:t>
+      </w:r>
+      <w:r>
+        <w:t>}</w:t>
+      </w:r>
+      <w:proofErr w:type="gramEnd"/>
+      <w:r>
+        <w:t>}.</w:t>
       </w:r>
     </w:p>
     <w:p>
@@ -1251,11 +1372,29 @@
       <w:r>
         <w:t>Les éoliennes du parc sont identifiées comme suit : {{</w:t>
       </w:r>
+      <w:proofErr w:type="spellStart"/>
       <w:r>
         <w:t>turbine_list</w:t>
       </w:r>
-      <w:r>
-        <w:t>}}. L’implantation du parc et la disposition des éoliennes sont présen tées dans la figure ci-</w:t>
+      <w:proofErr w:type="spellEnd"/>
+      <w:r>
+        <w:t xml:space="preserve">}}. L’implantation du parc et la disposition des éoliennes sont </w:t>
+      </w:r>
+      <w:proofErr w:type="spellStart"/>
+      <w:r>
+        <w:t>présen</w:t>
+      </w:r>
+      <w:proofErr w:type="spellEnd"/>
+      <w:r>
+        <w:t xml:space="preserve"> </w:t>
+      </w:r>
+      <w:proofErr w:type="spellStart"/>
+      <w:r>
+        <w:t>tées</w:t>
+      </w:r>
+      <w:proofErr w:type="spellEnd"/>
+      <w:r>
+        <w:t xml:space="preserve"> dans la figure ci-</w:t>
       </w:r>
       <w:r>
         <w:t>après :</w:t>
@@ -1307,13 +1446,21 @@
     </w:p>
     <w:p>
       <w:r>
-        <w:t>[T</w:t>
+        <w:t>[</w:t>
+      </w:r>
+      <w:proofErr w:type="gramStart"/>
+      <w:r>
+        <w:t>T</w:t>
       </w:r>
       <w:r>
         <w:t>ODO</w:t>
       </w:r>
       <w:r>
-        <w:t>:CSV_FILES_TABLE]</w:t>
+        <w:t>:</w:t>
+      </w:r>
+      <w:proofErr w:type="gramEnd"/>
+      <w:r>
+        <w:t>CSV_FILES_TABLE]</w:t>
       </w:r>
     </w:p>
     <w:p>
@@ -1360,6 +1507,7 @@
                 <w:szCs w:val="22"/>
               </w:rPr>
             </w:pPr>
+            <w:proofErr w:type="spellStart"/>
             <w:r>
               <w:rPr>
                 <w:rFonts w:ascii="Cambria" w:eastAsia="MS Mincho" w:hAnsi="Cambria"/>
@@ -1396,6 +1544,7 @@
               </w:rPr>
               <w:t>e</w:t>
             </w:r>
+            <w:proofErr w:type="spellEnd"/>
           </w:p>
         </w:tc>
         <w:tc>
@@ -1419,8 +1568,18 @@
                 <w:sz w:val="22"/>
                 <w:szCs w:val="22"/>
               </w:rPr>
-              <w:t>Axes d’analyse</w:t>
+              <w:t xml:space="preserve">Axes </w:t>
             </w:r>
+            <w:proofErr w:type="spellStart"/>
+            <w:r>
+              <w:rPr>
+                <w:rFonts w:ascii="Cambria" w:eastAsia="MS Mincho" w:hAnsi="Cambria"/>
+                <w:sz w:val="22"/>
+                <w:szCs w:val="22"/>
+              </w:rPr>
+              <w:t>d’analyse</w:t>
+            </w:r>
+            <w:proofErr w:type="spellEnd"/>
           </w:p>
         </w:tc>
       </w:tr>
@@ -1440,13 +1599,23 @@
                 <w:szCs w:val="22"/>
               </w:rPr>
             </w:pPr>
+            <w:proofErr w:type="spellStart"/>
             <w:r>
               <w:rPr>
                 <w:rFonts w:ascii="Cambria" w:eastAsia="MS Mincho" w:hAnsi="Cambria"/>
                 <w:sz w:val="22"/>
                 <w:szCs w:val="22"/>
               </w:rPr>
-              <w:t>Qualité des données</w:t>
+              <w:t>Qualité</w:t>
+            </w:r>
+            <w:proofErr w:type="spellEnd"/>
+            <w:r>
+              <w:rPr>
+                <w:rFonts w:ascii="Cambria" w:eastAsia="MS Mincho" w:hAnsi="Cambria"/>
+                <w:sz w:val="22"/>
+                <w:szCs w:val="22"/>
+              </w:rPr>
+              <w:t xml:space="preserve"> des données</w:t>
             </w:r>
           </w:p>
         </w:tc>
@@ -1530,8 +1699,18 @@
                 <w:sz w:val="22"/>
                 <w:szCs w:val="22"/>
               </w:rPr>
-              <w:t>Production et disponibilité</w:t>
+              <w:t xml:space="preserve">Production et </w:t>
             </w:r>
+            <w:proofErr w:type="spellStart"/>
+            <w:r>
+              <w:rPr>
+                <w:rFonts w:ascii="Cambria" w:eastAsia="MS Mincho" w:hAnsi="Cambria"/>
+                <w:sz w:val="22"/>
+                <w:szCs w:val="22"/>
+              </w:rPr>
+              <w:t>disponibilité</w:t>
+            </w:r>
+            <w:proofErr w:type="spellEnd"/>
           </w:p>
         </w:tc>
         <w:tc>
@@ -1553,14 +1732,52 @@
                 <w:szCs w:val="22"/>
               </w:rPr>
             </w:pPr>
+            <w:proofErr w:type="spellStart"/>
             <w:r>
               <w:rPr>
                 <w:rFonts w:ascii="Cambria" w:eastAsia="MS Mincho" w:hAnsi="Cambria"/>
                 <w:sz w:val="22"/>
                 <w:szCs w:val="22"/>
               </w:rPr>
-              <w:t>Calcul de la disponibilité énergétique</w:t>
+              <w:t>Calcul</w:t>
             </w:r>
+            <w:proofErr w:type="spellEnd"/>
+            <w:r>
+              <w:rPr>
+                <w:rFonts w:ascii="Cambria" w:eastAsia="MS Mincho" w:hAnsi="Cambria"/>
+                <w:sz w:val="22"/>
+                <w:szCs w:val="22"/>
+              </w:rPr>
+              <w:t xml:space="preserve"> de la </w:t>
+            </w:r>
+            <w:proofErr w:type="spellStart"/>
+            <w:r>
+              <w:rPr>
+                <w:rFonts w:ascii="Cambria" w:eastAsia="MS Mincho" w:hAnsi="Cambria"/>
+                <w:sz w:val="22"/>
+                <w:szCs w:val="22"/>
+              </w:rPr>
+              <w:t>disponibilité</w:t>
+            </w:r>
+            <w:proofErr w:type="spellEnd"/>
+            <w:r>
+              <w:rPr>
+                <w:rFonts w:ascii="Cambria" w:eastAsia="MS Mincho" w:hAnsi="Cambria"/>
+                <w:sz w:val="22"/>
+                <w:szCs w:val="22"/>
+              </w:rPr>
+              <w:t xml:space="preserve"> </w:t>
+            </w:r>
+            <w:proofErr w:type="spellStart"/>
+            <w:r>
+              <w:rPr>
+                <w:rFonts w:ascii="Cambria" w:eastAsia="MS Mincho" w:hAnsi="Cambria"/>
+                <w:sz w:val="22"/>
+                <w:szCs w:val="22"/>
+              </w:rPr>
+              <w:t>énergétique</w:t>
+            </w:r>
+            <w:proofErr w:type="spellEnd"/>
           </w:p>
           <w:p>
             <w:pPr>
@@ -1577,14 +1794,52 @@
                 <w:szCs w:val="22"/>
               </w:rPr>
             </w:pPr>
+            <w:proofErr w:type="spellStart"/>
             <w:r>
               <w:rPr>
                 <w:rFonts w:ascii="Cambria" w:eastAsia="MS Mincho" w:hAnsi="Cambria"/>
                 <w:sz w:val="22"/>
                 <w:szCs w:val="22"/>
               </w:rPr>
-              <w:t>Calcul de la disponibilité temporelle</w:t>
+              <w:t>Calcul</w:t>
             </w:r>
+            <w:proofErr w:type="spellEnd"/>
+            <w:r>
+              <w:rPr>
+                <w:rFonts w:ascii="Cambria" w:eastAsia="MS Mincho" w:hAnsi="Cambria"/>
+                <w:sz w:val="22"/>
+                <w:szCs w:val="22"/>
+              </w:rPr>
+              <w:t xml:space="preserve"> de la </w:t>
+            </w:r>
+            <w:proofErr w:type="spellStart"/>
+            <w:r>
+              <w:rPr>
+                <w:rFonts w:ascii="Cambria" w:eastAsia="MS Mincho" w:hAnsi="Cambria"/>
+                <w:sz w:val="22"/>
+                <w:szCs w:val="22"/>
+              </w:rPr>
+              <w:t>disponibilité</w:t>
+            </w:r>
+            <w:proofErr w:type="spellEnd"/>
+            <w:r>
+              <w:rPr>
+                <w:rFonts w:ascii="Cambria" w:eastAsia="MS Mincho" w:hAnsi="Cambria"/>
+                <w:sz w:val="22"/>
+                <w:szCs w:val="22"/>
+              </w:rPr>
+              <w:t xml:space="preserve"> </w:t>
+            </w:r>
+            <w:proofErr w:type="spellStart"/>
+            <w:r>
+              <w:rPr>
+                <w:rFonts w:ascii="Cambria" w:eastAsia="MS Mincho" w:hAnsi="Cambria"/>
+                <w:sz w:val="22"/>
+                <w:szCs w:val="22"/>
+              </w:rPr>
+              <w:t>temporelle</w:t>
+            </w:r>
+            <w:proofErr w:type="spellEnd"/>
           </w:p>
           <w:p>
             <w:pPr>
@@ -1656,13 +1911,41 @@
                 <w:szCs w:val="22"/>
               </w:rPr>
             </w:pPr>
+            <w:proofErr w:type="spellStart"/>
             <w:r>
               <w:rPr>
                 <w:rFonts w:ascii="Cambria" w:eastAsia="MS Mincho" w:hAnsi="Cambria"/>
                 <w:sz w:val="22"/>
                 <w:szCs w:val="22"/>
               </w:rPr>
-              <w:t>Bridages (si applicable)</w:t>
+              <w:t>Bridages</w:t>
+            </w:r>
+            <w:proofErr w:type="spellEnd"/>
+            <w:r>
+              <w:rPr>
+                <w:rFonts w:ascii="Cambria" w:eastAsia="MS Mincho" w:hAnsi="Cambria"/>
+                <w:sz w:val="22"/>
+                <w:szCs w:val="22"/>
+              </w:rPr>
+              <w:t xml:space="preserve"> (</w:t>
+            </w:r>
+            <w:proofErr w:type="spellStart"/>
+            <w:r>
+              <w:rPr>
+                <w:rFonts w:ascii="Cambria" w:eastAsia="MS Mincho" w:hAnsi="Cambria"/>
+                <w:sz w:val="22"/>
+                <w:szCs w:val="22"/>
+              </w:rPr>
+              <w:t>si</w:t>
+            </w:r>
+            <w:proofErr w:type="spellEnd"/>
+            <w:r>
+              <w:rPr>
+                <w:rFonts w:ascii="Cambria" w:eastAsia="MS Mincho" w:hAnsi="Cambria"/>
+                <w:sz w:val="22"/>
+                <w:szCs w:val="22"/>
+              </w:rPr>
+              <w:t xml:space="preserve"> applicable)</w:t>
             </w:r>
           </w:p>
         </w:tc>
@@ -1772,8 +2055,18 @@
                 <w:sz w:val="22"/>
                 <w:szCs w:val="22"/>
               </w:rPr>
-              <w:t>Performance des éoliennes</w:t>
+              <w:t xml:space="preserve">Performance des </w:t>
             </w:r>
+            <w:proofErr w:type="spellStart"/>
+            <w:r>
+              <w:rPr>
+                <w:rFonts w:ascii="Cambria" w:eastAsia="MS Mincho" w:hAnsi="Cambria"/>
+                <w:sz w:val="22"/>
+                <w:szCs w:val="22"/>
+              </w:rPr>
+              <w:t>éoliennes</w:t>
+            </w:r>
+            <w:proofErr w:type="spellEnd"/>
           </w:p>
         </w:tc>
         <w:tc>
@@ -1823,13 +2116,41 @@
                 <w:szCs w:val="22"/>
               </w:rPr>
             </w:pPr>
+            <w:proofErr w:type="spellStart"/>
             <w:r>
               <w:rPr>
                 <w:rFonts w:ascii="Cambria" w:eastAsia="MS Mincho" w:hAnsi="Cambria"/>
                 <w:sz w:val="22"/>
                 <w:szCs w:val="22"/>
               </w:rPr>
-              <w:t>Analyse du comportement du pitch</w:t>
+              <w:t>Analyse</w:t>
+            </w:r>
+            <w:proofErr w:type="spellEnd"/>
+            <w:r>
+              <w:rPr>
+                <w:rFonts w:ascii="Cambria" w:eastAsia="MS Mincho" w:hAnsi="Cambria"/>
+                <w:sz w:val="22"/>
+                <w:szCs w:val="22"/>
+              </w:rPr>
+              <w:t xml:space="preserve"> du </w:t>
+            </w:r>
+            <w:proofErr w:type="spellStart"/>
+            <w:r>
+              <w:rPr>
+                <w:rFonts w:ascii="Cambria" w:eastAsia="MS Mincho" w:hAnsi="Cambria"/>
+                <w:sz w:val="22"/>
+                <w:szCs w:val="22"/>
+              </w:rPr>
+              <w:t>comportement</w:t>
+            </w:r>
+            <w:proofErr w:type="spellEnd"/>
+            <w:r>
+              <w:rPr>
+                <w:rFonts w:ascii="Cambria" w:eastAsia="MS Mincho" w:hAnsi="Cambria"/>
+                <w:sz w:val="22"/>
+                <w:szCs w:val="22"/>
+              </w:rPr>
+              <w:t xml:space="preserve"> du pitch</w:t>
             </w:r>
           </w:p>
           <w:p>
@@ -1875,13 +2196,23 @@
                 <w:szCs w:val="22"/>
               </w:rPr>
             </w:pPr>
+            <w:proofErr w:type="spellStart"/>
             <w:r>
               <w:rPr>
                 <w:rFonts w:ascii="Cambria" w:eastAsia="MS Mincho" w:hAnsi="Cambria"/>
                 <w:sz w:val="22"/>
                 <w:szCs w:val="22"/>
               </w:rPr>
-              <w:t>Analyse inter-turbines</w:t>
+              <w:t>Analyse</w:t>
+            </w:r>
+            <w:proofErr w:type="spellEnd"/>
+            <w:r>
+              <w:rPr>
+                <w:rFonts w:ascii="Cambria" w:eastAsia="MS Mincho" w:hAnsi="Cambria"/>
+                <w:sz w:val="22"/>
+                <w:szCs w:val="22"/>
+              </w:rPr>
+              <w:t xml:space="preserve"> inter-turbines</w:t>
             </w:r>
           </w:p>
           <w:p>
@@ -1900,13 +2231,41 @@
                 <w:szCs w:val="22"/>
               </w:rPr>
             </w:pPr>
+            <w:proofErr w:type="spellStart"/>
             <w:r>
               <w:rPr>
                 <w:rFonts w:ascii="Cambria" w:eastAsia="MS Mincho" w:hAnsi="Cambria"/>
                 <w:sz w:val="22"/>
                 <w:szCs w:val="22"/>
               </w:rPr>
-              <w:t>Cohérence globale des performances</w:t>
+              <w:t>Cohérence</w:t>
+            </w:r>
+            <w:proofErr w:type="spellEnd"/>
+            <w:r>
+              <w:rPr>
+                <w:rFonts w:ascii="Cambria" w:eastAsia="MS Mincho" w:hAnsi="Cambria"/>
+                <w:sz w:val="22"/>
+                <w:szCs w:val="22"/>
+              </w:rPr>
+              <w:t xml:space="preserve"> </w:t>
+            </w:r>
+            <w:proofErr w:type="spellStart"/>
+            <w:r>
+              <w:rPr>
+                <w:rFonts w:ascii="Cambria" w:eastAsia="MS Mincho" w:hAnsi="Cambria"/>
+                <w:sz w:val="22"/>
+                <w:szCs w:val="22"/>
+              </w:rPr>
+              <w:t>globale</w:t>
+            </w:r>
+            <w:proofErr w:type="spellEnd"/>
+            <w:r>
+              <w:rPr>
+                <w:rFonts w:ascii="Cambria" w:eastAsia="MS Mincho" w:hAnsi="Cambria"/>
+                <w:sz w:val="22"/>
+                <w:szCs w:val="22"/>
+              </w:rPr>
+              <w:t xml:space="preserve"> des performances</w:t>
             </w:r>
           </w:p>
         </w:tc>
@@ -1942,8 +2301,13 @@
           <w:numId w:val="6"/>
         </w:numPr>
       </w:pPr>
-      <w:r>
-        <w:t xml:space="preserve">variables environnementales : </w:t>
+      <w:proofErr w:type="gramStart"/>
+      <w:r>
+        <w:t>variables</w:t>
+      </w:r>
+      <w:proofErr w:type="gramEnd"/>
+      <w:r>
+        <w:t xml:space="preserve"> environnementales : </w:t>
       </w:r>
     </w:p>
     <w:p>
@@ -1954,8 +2318,13 @@
           <w:numId w:val="6"/>
         </w:numPr>
       </w:pPr>
-      <w:r>
-        <w:t xml:space="preserve">vitesse du vent </w:t>
+      <w:proofErr w:type="gramStart"/>
+      <w:r>
+        <w:t>vitesse</w:t>
+      </w:r>
+      <w:proofErr w:type="gramEnd"/>
+      <w:r>
+        <w:t xml:space="preserve"> du vent </w:t>
       </w:r>
     </w:p>
     <w:p>
@@ -1966,8 +2335,13 @@
           <w:numId w:val="6"/>
         </w:numPr>
       </w:pPr>
-      <w:r>
-        <w:t xml:space="preserve">direction du vent </w:t>
+      <w:proofErr w:type="gramStart"/>
+      <w:r>
+        <w:t>direction</w:t>
+      </w:r>
+      <w:proofErr w:type="gramEnd"/>
+      <w:r>
+        <w:t xml:space="preserve"> du vent </w:t>
       </w:r>
     </w:p>
     <w:p>
@@ -1978,8 +2352,13 @@
           <w:numId w:val="6"/>
         </w:numPr>
       </w:pPr>
-      <w:r>
-        <w:t xml:space="preserve">température ambiante </w:t>
+      <w:proofErr w:type="gramStart"/>
+      <w:r>
+        <w:t>température</w:t>
+      </w:r>
+      <w:proofErr w:type="gramEnd"/>
+      <w:r>
+        <w:t xml:space="preserve"> ambiante </w:t>
       </w:r>
     </w:p>
     <w:p>
@@ -1990,8 +2369,13 @@
           <w:numId w:val="6"/>
         </w:numPr>
       </w:pPr>
-      <w:r>
-        <w:t xml:space="preserve">variables opérationnelles clés : </w:t>
+      <w:proofErr w:type="gramStart"/>
+      <w:r>
+        <w:t>variables</w:t>
+      </w:r>
+      <w:proofErr w:type="gramEnd"/>
+      <w:r>
+        <w:t xml:space="preserve"> opérationnelles clés : </w:t>
       </w:r>
     </w:p>
     <w:p>
@@ -2002,8 +2386,13 @@
           <w:numId w:val="6"/>
         </w:numPr>
       </w:pPr>
-      <w:r>
-        <w:t xml:space="preserve">puissance active produite </w:t>
+      <w:proofErr w:type="gramStart"/>
+      <w:r>
+        <w:t>puissance</w:t>
+      </w:r>
+      <w:proofErr w:type="gramEnd"/>
+      <w:r>
+        <w:t xml:space="preserve"> active produite </w:t>
       </w:r>
     </w:p>
     <w:p/>
@@ -2024,13 +2413,29 @@
         <w:t xml:space="preserve">La figure ci-après présente la disponibilité des données SCADA, sur la période allant du </w:t>
       </w:r>
       <w:r>
-        <w:t>{{analysis_start}}</w:t>
+        <w:t>{{</w:t>
+      </w:r>
+      <w:proofErr w:type="spellStart"/>
+      <w:r>
+        <w:t>analysis_start</w:t>
+      </w:r>
+      <w:proofErr w:type="spellEnd"/>
+      <w:r>
+        <w:t>}}</w:t>
       </w:r>
       <w:r>
         <w:t xml:space="preserve"> au </w:t>
       </w:r>
       <w:r>
-        <w:t>{{analysis_end}}</w:t>
+        <w:t>{{</w:t>
+      </w:r>
+      <w:proofErr w:type="spellStart"/>
+      <w:r>
+        <w:t>analysis_end</w:t>
+      </w:r>
+      <w:proofErr w:type="spellEnd"/>
+      <w:r>
+        <w:t>}}</w:t>
       </w:r>
       <w:r>
         <w:t>.</w:t>
@@ -2113,7 +2518,21 @@
         <w:rPr>
           <w:lang w:val="en-US"/>
         </w:rPr>
-        <w:t>{{data_availability_chart}}</w:t>
+        <w:t>{{</w:t>
+      </w:r>
+      <w:proofErr w:type="spellStart"/>
+      <w:r>
+        <w:rPr>
+          <w:lang w:val="en-US"/>
+        </w:rPr>
+        <w:t>data_availability_chart</w:t>
+      </w:r>
+      <w:proofErr w:type="spellEnd"/>
+      <w:r>
+        <w:rPr>
+          <w:lang w:val="en-US"/>
+        </w:rPr>
+        <w:t>}}</w:t>
       </w:r>
     </w:p>
     <w:p>
@@ -2150,7 +2569,23 @@
         </w:numPr>
       </w:pPr>
       <w:r>
-        <w:t>Disponibilité énergétique brute (cut-in / cut-out) : calculée pour les périodes où la vitesse de vent est comprise entre les seuils de démarrage et d’arrêt des éoliennes, en incluant l’ensemble des indisponibilités (arrêts techniques, maintenance, limitations réseau, etc.)</w:t>
+        <w:t>Disponibilité énergétique brute (</w:t>
+      </w:r>
+      <w:proofErr w:type="spellStart"/>
+      <w:r>
+        <w:t>cut</w:t>
+      </w:r>
+      <w:proofErr w:type="spellEnd"/>
+      <w:r>
+        <w:t xml:space="preserve">-in / </w:t>
+      </w:r>
+      <w:proofErr w:type="spellStart"/>
+      <w:r>
+        <w:t>cut</w:t>
+      </w:r>
+      <w:proofErr w:type="spellEnd"/>
+      <w:r>
+        <w:t>-out) : calculée pour les périodes où la vitesse de vent est comprise entre les seuils de démarrage et d’arrêt des éoliennes, en incluant l’ensemble des indisponibilités (arrêts techniques, maintenance, limitations réseau, etc.)</w:t>
       </w:r>
     </w:p>
     <w:p>
@@ -2239,8 +2674,29 @@
           <w:numId w:val="8"/>
         </w:numPr>
       </w:pPr>
-      <w:r>
-        <w:t>la disponibilité énergétique brute (cut-in / cut-out),</w:t>
+      <w:proofErr w:type="gramStart"/>
+      <w:r>
+        <w:t>la</w:t>
+      </w:r>
+      <w:proofErr w:type="gramEnd"/>
+      <w:r>
+        <w:t xml:space="preserve"> disponibilité énergétique brute (</w:t>
+      </w:r>
+      <w:proofErr w:type="spellStart"/>
+      <w:r>
+        <w:t>cut</w:t>
+      </w:r>
+      <w:proofErr w:type="spellEnd"/>
+      <w:r>
+        <w:t xml:space="preserve">-in / </w:t>
+      </w:r>
+      <w:proofErr w:type="spellStart"/>
+      <w:r>
+        <w:t>cut</w:t>
+      </w:r>
+      <w:proofErr w:type="spellEnd"/>
+      <w:r>
+        <w:t>-out),</w:t>
       </w:r>
     </w:p>
     <w:p>
@@ -2251,54 +2707,101 @@
           <w:numId w:val="8"/>
         </w:numPr>
       </w:pPr>
-      <w:r>
-        <w:t>la disponibilité énergétique imputable au fabricant</w:t>
-      </w:r>
-    </w:p>
-    <w:p>
-      <w:pPr>
-        <w:rPr>
-          <w:lang w:val="en-US"/>
-        </w:rPr>
-      </w:pPr>
-      <w:r>
-        <w:rPr>
-          <w:lang w:val="en-US"/>
-        </w:rPr>
-        <w:t>[TABLE:EBA_CUT_IN_CUT_OUT_TABLE]</w:t>
-      </w:r>
-    </w:p>
-    <w:p>
-      <w:pPr>
-        <w:rPr>
-          <w:lang w:val="en-US"/>
-        </w:rPr>
-      </w:pPr>
-      <w:r>
-        <w:rPr>
-          <w:lang w:val="en-US"/>
-        </w:rPr>
-        <w:t>{{eba_cut_in_cut_out_chart}}</w:t>
-      </w:r>
-    </w:p>
-    <w:p>
-      <w:pPr>
-        <w:rPr>
-          <w:lang w:val="en-US"/>
-        </w:rPr>
-      </w:pPr>
-    </w:p>
-    <w:p>
-      <w:pPr>
-        <w:rPr>
-          <w:lang w:val="en-US"/>
-        </w:rPr>
-      </w:pPr>
-      <w:r>
-        <w:rPr>
-          <w:lang w:val="en-US"/>
-        </w:rPr>
-        <w:t>[TABLE:EBA_MANUFACTURER_TABLE]</w:t>
+      <w:proofErr w:type="gramStart"/>
+      <w:r>
+        <w:t>la</w:t>
+      </w:r>
+      <w:proofErr w:type="gramEnd"/>
+      <w:r>
+        <w:t xml:space="preserve"> disponibilité énergétique imputable au fabricant</w:t>
+      </w:r>
+    </w:p>
+    <w:p>
+      <w:pPr>
+        <w:rPr>
+          <w:lang w:val="en-US"/>
+        </w:rPr>
+      </w:pPr>
+      <w:r>
+        <w:rPr>
+          <w:lang w:val="en-US"/>
+        </w:rPr>
+        <w:t>[</w:t>
+      </w:r>
+      <w:proofErr w:type="gramStart"/>
+      <w:r>
+        <w:rPr>
+          <w:lang w:val="en-US"/>
+        </w:rPr>
+        <w:t>TABLE:EBA</w:t>
+      </w:r>
+      <w:proofErr w:type="gramEnd"/>
+      <w:r>
+        <w:rPr>
+          <w:lang w:val="en-US"/>
+        </w:rPr>
+        <w:t>_CUT_IN_CUT_OUT_TABLE]</w:t>
+      </w:r>
+    </w:p>
+    <w:p>
+      <w:pPr>
+        <w:rPr>
+          <w:lang w:val="en-US"/>
+        </w:rPr>
+      </w:pPr>
+      <w:r>
+        <w:rPr>
+          <w:lang w:val="en-US"/>
+        </w:rPr>
+        <w:t>{{</w:t>
+      </w:r>
+      <w:proofErr w:type="spellStart"/>
+      <w:r>
+        <w:rPr>
+          <w:lang w:val="en-US"/>
+        </w:rPr>
+        <w:t>eba_cut_in_cut_out_chart</w:t>
+      </w:r>
+      <w:proofErr w:type="spellEnd"/>
+      <w:r>
+        <w:rPr>
+          <w:lang w:val="en-US"/>
+        </w:rPr>
+        <w:t>}}</w:t>
+      </w:r>
+    </w:p>
+    <w:p>
+      <w:pPr>
+        <w:rPr>
+          <w:lang w:val="en-US"/>
+        </w:rPr>
+      </w:pPr>
+    </w:p>
+    <w:p>
+      <w:pPr>
+        <w:rPr>
+          <w:lang w:val="en-US"/>
+        </w:rPr>
+      </w:pPr>
+      <w:r>
+        <w:rPr>
+          <w:lang w:val="en-US"/>
+        </w:rPr>
+        <w:t>[</w:t>
+      </w:r>
+      <w:proofErr w:type="gramStart"/>
+      <w:r>
+        <w:rPr>
+          <w:lang w:val="en-US"/>
+        </w:rPr>
+        <w:t>TABLE:EBA</w:t>
+      </w:r>
+      <w:proofErr w:type="gramEnd"/>
+      <w:r>
+        <w:rPr>
+          <w:lang w:val="en-US"/>
+        </w:rPr>
+        <w:t>_MANUFACTURER_TABLE]</w:t>
       </w:r>
       <w:r>
         <w:rPr>
@@ -2317,19 +2820,41 @@
         <w:rPr>
           <w:lang w:val="en-US"/>
         </w:rPr>
-        <w:t>{{eba_manifacturer_chart}}</w:t>
-      </w:r>
-    </w:p>
-    <w:p>
-      <w:pPr>
-        <w:rPr>
-          <w:lang w:val="en-US"/>
-        </w:rPr>
-      </w:pPr>
-    </w:p>
-    <w:p>
-      <w:r>
-        <w:t>[TABLE:EBA_LOSS_TABLE]</w:t>
+        <w:t>{{</w:t>
+      </w:r>
+      <w:proofErr w:type="spellStart"/>
+      <w:r>
+        <w:rPr>
+          <w:lang w:val="en-US"/>
+        </w:rPr>
+        <w:t>eba_manifacturer_chart</w:t>
+      </w:r>
+      <w:proofErr w:type="spellEnd"/>
+      <w:r>
+        <w:rPr>
+          <w:lang w:val="en-US"/>
+        </w:rPr>
+        <w:t>}}</w:t>
+      </w:r>
+    </w:p>
+    <w:p>
+      <w:pPr>
+        <w:rPr>
+          <w:lang w:val="en-US"/>
+        </w:rPr>
+      </w:pPr>
+    </w:p>
+    <w:p>
+      <w:r>
+        <w:t>[</w:t>
+      </w:r>
+      <w:proofErr w:type="gramStart"/>
+      <w:r>
+        <w:t>TABLE:EBA</w:t>
+      </w:r>
+      <w:proofErr w:type="gramEnd"/>
+      <w:r>
+        <w:t>_LOSS_TABLE]</w:t>
       </w:r>
     </w:p>
     <w:p>
@@ -2361,7 +2886,21 @@
         <w:rPr>
           <w:lang w:val="en-US"/>
         </w:rPr>
-        <w:t>{{eba_loss_chart}}</w:t>
+        <w:t>{{</w:t>
+      </w:r>
+      <w:proofErr w:type="spellStart"/>
+      <w:r>
+        <w:rPr>
+          <w:lang w:val="en-US"/>
+        </w:rPr>
+        <w:t>eba_loss_chart</w:t>
+      </w:r>
+      <w:proofErr w:type="spellEnd"/>
+      <w:r>
+        <w:rPr>
+          <w:lang w:val="en-US"/>
+        </w:rPr>
+        <w:t>}}</w:t>
       </w:r>
     </w:p>
     <w:p>
@@ -2482,7 +3021,21 @@
         <w:rPr>
           <w:lang w:val="en-US"/>
         </w:rPr>
-        <w:t>[TABLE:ERROR_</w:t>
+        <w:t>[</w:t>
+      </w:r>
+      <w:proofErr w:type="gramStart"/>
+      <w:r>
+        <w:rPr>
+          <w:lang w:val="en-US"/>
+        </w:rPr>
+        <w:t>TABLE:ERROR</w:t>
+      </w:r>
+      <w:proofErr w:type="gramEnd"/>
+      <w:r>
+        <w:rPr>
+          <w:lang w:val="en-US"/>
+        </w:rPr>
+        <w:t>_</w:t>
       </w:r>
       <w:r>
         <w:rPr>
@@ -2514,7 +3067,21 @@
         <w:rPr>
           <w:lang w:val="en-US"/>
         </w:rPr>
-        <w:t>[TABLE:ERROR_</w:t>
+        <w:t>[</w:t>
+      </w:r>
+      <w:proofErr w:type="gramStart"/>
+      <w:r>
+        <w:rPr>
+          <w:lang w:val="en-US"/>
+        </w:rPr>
+        <w:t>TABLE:ERROR</w:t>
+      </w:r>
+      <w:proofErr w:type="gramEnd"/>
+      <w:r>
+        <w:rPr>
+          <w:lang w:val="en-US"/>
+        </w:rPr>
+        <w:t>_</w:t>
       </w:r>
       <w:r>
         <w:rPr>
@@ -2558,20 +3125,48 @@
         <w:rPr>
           <w:lang w:val="en-US"/>
         </w:rPr>
-        <w:t>{{top_error_code_frequency}}</w:t>
-      </w:r>
-    </w:p>
-    <w:p>
-      <w:pPr>
-        <w:rPr>
-          <w:lang w:val="en-US"/>
-        </w:rPr>
-      </w:pPr>
-      <w:r>
-        <w:rPr>
-          <w:lang w:val="en-US"/>
-        </w:rPr>
-        <w:t>{{treemap_error_code}}</w:t>
+        <w:t>{{</w:t>
+      </w:r>
+      <w:proofErr w:type="spellStart"/>
+      <w:r>
+        <w:rPr>
+          <w:lang w:val="en-US"/>
+        </w:rPr>
+        <w:t>top_error_code_frequency</w:t>
+      </w:r>
+      <w:proofErr w:type="spellEnd"/>
+      <w:r>
+        <w:rPr>
+          <w:lang w:val="en-US"/>
+        </w:rPr>
+        <w:t>}}</w:t>
+      </w:r>
+    </w:p>
+    <w:p>
+      <w:pPr>
+        <w:rPr>
+          <w:lang w:val="en-US"/>
+        </w:rPr>
+      </w:pPr>
+      <w:r>
+        <w:rPr>
+          <w:lang w:val="en-US"/>
+        </w:rPr>
+        <w:t>{{</w:t>
+      </w:r>
+      <w:proofErr w:type="spellStart"/>
+      <w:r>
+        <w:rPr>
+          <w:lang w:val="en-US"/>
+        </w:rPr>
+        <w:t>treemap_error_code</w:t>
+      </w:r>
+      <w:proofErr w:type="spellEnd"/>
+      <w:r>
+        <w:rPr>
+          <w:lang w:val="en-US"/>
+        </w:rPr>
+        <w:t>}}</w:t>
       </w:r>
     </w:p>
     <w:p>
@@ -2590,7 +3185,23 @@
     </w:p>
     <w:p>
       <w:r>
-        <w:t>L’analyse de la direction du vent vise à vérifier la cohérence des mesures directionnelles entre les éoliennes, ainsi que leur alignement avec une référence externe, afin de détecter d’éventuels défauts d’orientation (yaw misalignment).</w:t>
+        <w:t>L’analyse de la direction du vent vise à vérifier la cohérence des mesures directionnelles entre les éoliennes, ainsi que leur alignement avec une référence externe, afin de détecter d’éventuels défauts d’orientation (</w:t>
+      </w:r>
+      <w:proofErr w:type="spellStart"/>
+      <w:r>
+        <w:t>yaw</w:t>
+      </w:r>
+      <w:proofErr w:type="spellEnd"/>
+      <w:r>
+        <w:t xml:space="preserve"> </w:t>
+      </w:r>
+      <w:proofErr w:type="spellStart"/>
+      <w:r>
+        <w:t>misalignment</w:t>
+      </w:r>
+      <w:proofErr w:type="spellEnd"/>
+      <w:r>
+        <w:t>).</w:t>
       </w:r>
     </w:p>
     <w:p>
@@ -2660,53 +3271,109 @@
         <w:rPr>
           <w:lang w:val="en-US"/>
         </w:rPr>
-        <w:t>[TABLE:WIND_DIRECTION_CALIBRATION_TABLE]</w:t>
-      </w:r>
-    </w:p>
-    <w:p>
-      <w:pPr>
-        <w:rPr>
-          <w:lang w:val="en-US"/>
-        </w:rPr>
-      </w:pPr>
-    </w:p>
-    <w:p>
-      <w:pPr>
-        <w:rPr>
-          <w:lang w:val="en-US"/>
-        </w:rPr>
-      </w:pPr>
-      <w:r>
-        <w:rPr>
-          <w:lang w:val="en-US"/>
-        </w:rPr>
-        <w:t>{{wind_direction_calibration}}</w:t>
-      </w:r>
-    </w:p>
-    <w:p>
-      <w:pPr>
-        <w:rPr>
-          <w:lang w:val="en-US"/>
-        </w:rPr>
-      </w:pPr>
-      <w:r>
-        <w:rPr>
-          <w:lang w:val="en-US"/>
-        </w:rPr>
-        <w:t>{{power_rose_chart}}</w:t>
-      </w:r>
-    </w:p>
-    <w:p>
-      <w:pPr>
-        <w:rPr>
-          <w:lang w:val="en-US"/>
-        </w:rPr>
-      </w:pPr>
-      <w:r>
-        <w:rPr>
-          <w:lang w:val="en-US"/>
-        </w:rPr>
-        <w:t>{{wind_rose_chart}}</w:t>
+        <w:t>[</w:t>
+      </w:r>
+      <w:proofErr w:type="gramStart"/>
+      <w:r>
+        <w:rPr>
+          <w:lang w:val="en-US"/>
+        </w:rPr>
+        <w:t>TABLE:WIND</w:t>
+      </w:r>
+      <w:proofErr w:type="gramEnd"/>
+      <w:r>
+        <w:rPr>
+          <w:lang w:val="en-US"/>
+        </w:rPr>
+        <w:t>_DIRECTION_CALIBRATION_TABLE]</w:t>
+      </w:r>
+    </w:p>
+    <w:p>
+      <w:pPr>
+        <w:rPr>
+          <w:lang w:val="en-US"/>
+        </w:rPr>
+      </w:pPr>
+    </w:p>
+    <w:p>
+      <w:pPr>
+        <w:rPr>
+          <w:lang w:val="en-US"/>
+        </w:rPr>
+      </w:pPr>
+      <w:r>
+        <w:rPr>
+          <w:lang w:val="en-US"/>
+        </w:rPr>
+        <w:t>{{</w:t>
+      </w:r>
+      <w:proofErr w:type="spellStart"/>
+      <w:r>
+        <w:rPr>
+          <w:lang w:val="en-US"/>
+        </w:rPr>
+        <w:t>wind_direction_calibration</w:t>
+      </w:r>
+      <w:proofErr w:type="spellEnd"/>
+      <w:r>
+        <w:rPr>
+          <w:lang w:val="en-US"/>
+        </w:rPr>
+        <w:t>}}</w:t>
+      </w:r>
+    </w:p>
+    <w:p>
+      <w:pPr>
+        <w:rPr>
+          <w:lang w:val="en-US"/>
+        </w:rPr>
+      </w:pPr>
+      <w:r>
+        <w:rPr>
+          <w:lang w:val="en-US"/>
+        </w:rPr>
+        <w:t>{{</w:t>
+      </w:r>
+      <w:proofErr w:type="spellStart"/>
+      <w:r>
+        <w:rPr>
+          <w:lang w:val="en-US"/>
+        </w:rPr>
+        <w:t>power_rose_chart</w:t>
+      </w:r>
+      <w:proofErr w:type="spellEnd"/>
+      <w:r>
+        <w:rPr>
+          <w:lang w:val="en-US"/>
+        </w:rPr>
+        <w:t>}}</w:t>
+      </w:r>
+    </w:p>
+    <w:p>
+      <w:pPr>
+        <w:rPr>
+          <w:lang w:val="en-US"/>
+        </w:rPr>
+      </w:pPr>
+      <w:r>
+        <w:rPr>
+          <w:lang w:val="en-US"/>
+        </w:rPr>
+        <w:t>{{</w:t>
+      </w:r>
+      <w:proofErr w:type="spellStart"/>
+      <w:r>
+        <w:rPr>
+          <w:lang w:val="en-US"/>
+        </w:rPr>
+        <w:t>wind_rose_chart</w:t>
+      </w:r>
+      <w:proofErr w:type="spellEnd"/>
+      <w:r>
+        <w:rPr>
+          <w:lang w:val="en-US"/>
+        </w:rPr>
+        <w:t>}}</w:t>
       </w:r>
     </w:p>
     <w:p>
@@ -2793,7 +3460,15 @@
         <w:t>Exclusion</w:t>
       </w:r>
       <w:r>
-        <w:t xml:space="preserve"> des situations de sillage (wake effect), </w:t>
+        <w:t xml:space="preserve"> des situations de sillage (wake </w:t>
+      </w:r>
+      <w:proofErr w:type="spellStart"/>
+      <w:r>
+        <w:t>effect</w:t>
+      </w:r>
+      <w:proofErr w:type="spellEnd"/>
+      <w:r>
+        <w:t xml:space="preserve">), </w:t>
       </w:r>
     </w:p>
     <w:p>
@@ -2859,7 +3534,21 @@
         <w:rPr>
           <w:lang w:val="en-US"/>
         </w:rPr>
-        <w:t>[TABLE:NORMATIVE_YIELD_TABLE]</w:t>
+        <w:t>[</w:t>
+      </w:r>
+      <w:proofErr w:type="gramStart"/>
+      <w:r>
+        <w:rPr>
+          <w:lang w:val="en-US"/>
+        </w:rPr>
+        <w:t>TABLE:NORMATIVE</w:t>
+      </w:r>
+      <w:proofErr w:type="gramEnd"/>
+      <w:r>
+        <w:rPr>
+          <w:lang w:val="en-US"/>
+        </w:rPr>
+        <w:t>_YIELD_TABLE]</w:t>
       </w:r>
     </w:p>
     <w:p>
@@ -2874,11 +3563,19 @@
         </w:rPr>
         <w:t>{{</w:t>
       </w:r>
-      <w:r>
-        <w:rPr>
-          <w:lang w:val="en-US"/>
-        </w:rPr>
-        <w:t>power_curve_chart}}</w:t>
+      <w:proofErr w:type="spellStart"/>
+      <w:r>
+        <w:rPr>
+          <w:lang w:val="en-US"/>
+        </w:rPr>
+        <w:t>power_curve_chart</w:t>
+      </w:r>
+      <w:proofErr w:type="spellEnd"/>
+      <w:r>
+        <w:rPr>
+          <w:lang w:val="en-US"/>
+        </w:rPr>
+        <w:t>}}</w:t>
       </w:r>
     </w:p>
     <w:p>
@@ -2925,9 +3622,14 @@
           <w:numId w:val="13"/>
         </w:numPr>
       </w:pPr>
+      <w:proofErr w:type="gramStart"/>
       <w:r>
         <w:lastRenderedPageBreak/>
-        <w:t xml:space="preserve">les périodes de limitations environnementales (bruit, chauves-souris, ombrage, etc.), </w:t>
+        <w:t>les</w:t>
+      </w:r>
+      <w:proofErr w:type="gramEnd"/>
+      <w:r>
+        <w:t xml:space="preserve"> périodes de limitations environnementales (bruit, chauves-souris, ombrage, etc.), </w:t>
       </w:r>
     </w:p>
     <w:p>
@@ -2938,8 +3640,13 @@
           <w:numId w:val="13"/>
         </w:numPr>
       </w:pPr>
-      <w:r>
-        <w:t xml:space="preserve">les phases de démarrage et d’arrêt, </w:t>
+      <w:proofErr w:type="gramStart"/>
+      <w:r>
+        <w:t>les</w:t>
+      </w:r>
+      <w:proofErr w:type="gramEnd"/>
+      <w:r>
+        <w:t xml:space="preserve"> phases de démarrage et d’arrêt, </w:t>
       </w:r>
     </w:p>
     <w:p>
@@ -2950,8 +3657,13 @@
           <w:numId w:val="13"/>
         </w:numPr>
       </w:pPr>
-      <w:r>
-        <w:t xml:space="preserve">les situations transitoires ou non représentatives du fonctionnement normal. </w:t>
+      <w:proofErr w:type="gramStart"/>
+      <w:r>
+        <w:t>les</w:t>
+      </w:r>
+      <w:proofErr w:type="gramEnd"/>
+      <w:r>
+        <w:t xml:space="preserve"> situations transitoires ou non représentatives du fonctionnement normal. </w:t>
       </w:r>
     </w:p>
     <w:p>
@@ -3007,7 +3719,21 @@
         <w:rPr>
           <w:lang w:val="en-US"/>
         </w:rPr>
-        <w:t>[TABLE:TIP_SPEED_RATIO_TABLE]</w:t>
+        <w:t>[</w:t>
+      </w:r>
+      <w:proofErr w:type="gramStart"/>
+      <w:r>
+        <w:rPr>
+          <w:lang w:val="en-US"/>
+        </w:rPr>
+        <w:t>TABLE:TIP</w:t>
+      </w:r>
+      <w:proofErr w:type="gramEnd"/>
+      <w:r>
+        <w:rPr>
+          <w:lang w:val="en-US"/>
+        </w:rPr>
+        <w:t>_SPEED_RATIO_TABLE]</w:t>
       </w:r>
     </w:p>
     <w:p>
@@ -3049,9 +3775,11 @@
         </w:rPr>
         <w:t>{{</w:t>
       </w:r>
+      <w:proofErr w:type="spellStart"/>
       <w:r>
         <w:t>rpm_chart</w:t>
       </w:r>
+      <w:proofErr w:type="spellEnd"/>
       <w:r>
         <w:rPr>
           <w:lang w:val="en-US"/>
@@ -3163,13 +3891,27 @@
         <w:rPr>
           <w:lang w:val="en-US"/>
         </w:rPr>
-        <w:t>[T</w:t>
-      </w:r>
-      <w:r>
-        <w:rPr>
-          <w:lang w:val="en-US"/>
-        </w:rPr>
-        <w:t>ABLE:PITCH_TABLE</w:t>
+        <w:t>[</w:t>
+      </w:r>
+      <w:proofErr w:type="gramStart"/>
+      <w:r>
+        <w:rPr>
+          <w:lang w:val="en-US"/>
+        </w:rPr>
+        <w:t>T</w:t>
+      </w:r>
+      <w:r>
+        <w:rPr>
+          <w:lang w:val="en-US"/>
+        </w:rPr>
+        <w:t>ABLE:PITCH</w:t>
+      </w:r>
+      <w:proofErr w:type="gramEnd"/>
+      <w:r>
+        <w:rPr>
+          <w:lang w:val="en-US"/>
+        </w:rPr>
+        <w:t>_TABLE</w:t>
       </w:r>
       <w:r>
         <w:rPr>
@@ -3197,12 +3939,14 @@
         </w:rPr>
         <w:t>{{</w:t>
       </w:r>
+      <w:proofErr w:type="spellStart"/>
       <w:r>
         <w:rPr>
           <w:lang w:val="en-US"/>
         </w:rPr>
         <w:t>pitch_chart</w:t>
       </w:r>
+      <w:proofErr w:type="spellEnd"/>
       <w:r>
         <w:rPr>
           <w:lang w:val="en-US"/>
@@ -3239,10 +3983,26 @@
       </w:r>
       <w:r>
         <w:lastRenderedPageBreak/>
-        <w:t xml:space="preserve">d'identifier des situations de curtailment inattendu, visibles à travers des regroupements de points (clusters) s'écartant de la courbe de puissance nominale attendue. L'analyse repose sur la représentation de la puissance active en fonction de la vitesse du vent sous forme de nuages de points. Les figures ci-après présentent les nuages de points pour chaque éolienne. </w:t>
-      </w:r>
-      <w:r>
-        <w:t xml:space="preserve">Les figures illustres des classes de fonctionnements pour la puissance, l’orientation des pales et la rotation par mimutes :  </w:t>
+        <w:t xml:space="preserve">d'identifier des situations de </w:t>
+      </w:r>
+      <w:proofErr w:type="spellStart"/>
+      <w:r>
+        <w:t>curtailment</w:t>
+      </w:r>
+      <w:proofErr w:type="spellEnd"/>
+      <w:r>
+        <w:t xml:space="preserve"> inattendu, visibles à travers des regroupements de points (clusters) s'écartant de la courbe de puissance nominale attendue. L'analyse repose sur la représentation de la puissance active en fonction de la vitesse du vent sous forme de nuages de points. Les figures ci-après présentent les nuages de points pour chaque éolienne. </w:t>
+      </w:r>
+      <w:r>
+        <w:t xml:space="preserve">Les figures illustres des classes de fonctionnements pour la puissance, l’orientation des pales et la rotation par </w:t>
+      </w:r>
+      <w:proofErr w:type="spellStart"/>
+      <w:r>
+        <w:t>mimutes</w:t>
+      </w:r>
+      <w:proofErr w:type="spellEnd"/>
+      <w:r>
+        <w:t xml:space="preserve"> :  </w:t>
       </w:r>
     </w:p>
     <w:p>
@@ -3254,7 +4014,23 @@
         </w:numPr>
       </w:pPr>
       <w:r>
-        <w:t>Stop (low wind)</w:t>
+        <w:t>Stop (</w:t>
+      </w:r>
+      <w:proofErr w:type="spellStart"/>
+      <w:r>
+        <w:t>low</w:t>
+      </w:r>
+      <w:proofErr w:type="spellEnd"/>
+      <w:r>
+        <w:t xml:space="preserve"> </w:t>
+      </w:r>
+      <w:proofErr w:type="spellStart"/>
+      <w:r>
+        <w:t>wind</w:t>
+      </w:r>
+      <w:proofErr w:type="spellEnd"/>
+      <w:r>
+        <w:t>)</w:t>
       </w:r>
     </w:p>
     <w:p>
@@ -3278,7 +4054,7 @@
         </w:numPr>
       </w:pPr>
       <w:r>
-        <w:t>Max rotation</w:t>
+        <w:t>Phase transitoire</w:t>
       </w:r>
     </w:p>
     <w:p>
@@ -3290,7 +4066,7 @@
         </w:numPr>
       </w:pPr>
       <w:r>
-        <w:t>Max Power</w:t>
+        <w:t>Phase optimale de fonctionnement</w:t>
       </w:r>
     </w:p>
     <w:p>
@@ -3302,7 +4078,15 @@
         </w:numPr>
       </w:pPr>
       <w:r>
-        <w:t>Stop (high wind)</w:t>
+        <w:t xml:space="preserve">Stop (high </w:t>
+      </w:r>
+      <w:proofErr w:type="spellStart"/>
+      <w:r>
+        <w:t>wind</w:t>
+      </w:r>
+      <w:proofErr w:type="spellEnd"/>
+      <w:r>
+        <w:t>)</w:t>
       </w:r>
     </w:p>
     <w:p>
@@ -3313,8 +4097,13 @@
           <w:numId w:val="16"/>
         </w:numPr>
       </w:pPr>
-      <w:r>
-        <w:t>Outlier (anomalies)</w:t>
+      <w:proofErr w:type="spellStart"/>
+      <w:r>
+        <w:t>Outlier</w:t>
+      </w:r>
+      <w:proofErr w:type="spellEnd"/>
+      <w:r>
+        <w:t xml:space="preserve"> (anomalies)</w:t>
       </w:r>
     </w:p>
     <w:p/>
@@ -3322,9 +4111,11 @@
       <w:r>
         <w:t>{{</w:t>
       </w:r>
+      <w:proofErr w:type="spellStart"/>
       <w:r>
         <w:t>performance_level_chart</w:t>
       </w:r>
+      <w:proofErr w:type="spellEnd"/>
       <w:r>
         <w:t>}}</w:t>
       </w:r>
@@ -3383,7 +4174,15 @@
         <w:pStyle w:val="Titre2"/>
       </w:pPr>
       <w:r>
-        <w:t>Disponibilité temporelle (Time-Based Availability – TBA)</w:t>
+        <w:t xml:space="preserve">Disponibilité temporelle (Time-Based </w:t>
+      </w:r>
+      <w:proofErr w:type="spellStart"/>
+      <w:r>
+        <w:t>Availability</w:t>
+      </w:r>
+      <w:proofErr w:type="spellEnd"/>
+      <w:r>
+        <w:t xml:space="preserve"> – TBA)</w:t>
       </w:r>
     </w:p>
     <w:p>

</xml_diff>

<commit_message>
[CHANGE] fix somes issues in the templates
</commit_message>
<xml_diff>
--- a/assets/templates/template_scada.docx
+++ b/assets/templates/template_scada.docx
@@ -315,17 +315,8 @@
                 <w:b/>
                 <w:bCs/>
               </w:rPr>
-              <w:t xml:space="preserve">Date </w:t>
+              <w:t>Date d’émission</w:t>
             </w:r>
-            <w:proofErr w:type="spellStart"/>
-            <w:r>
-              <w:rPr>
-                <w:b/>
-                <w:bCs/>
-              </w:rPr>
-              <w:t>d’émission</w:t>
-            </w:r>
-            <w:proofErr w:type="spellEnd"/>
           </w:p>
         </w:tc>
         <w:tc>
@@ -361,7 +352,6 @@
                 <w:bCs/>
               </w:rPr>
             </w:pPr>
-            <w:proofErr w:type="spellStart"/>
             <w:r>
               <w:rPr>
                 <w:b/>
@@ -369,7 +359,6 @@
               </w:rPr>
               <w:t>Rédacteur</w:t>
             </w:r>
-            <w:proofErr w:type="spellEnd"/>
           </w:p>
         </w:tc>
         <w:tc>
@@ -384,7 +373,6 @@
                 <w:bCs/>
               </w:rPr>
             </w:pPr>
-            <w:proofErr w:type="spellStart"/>
             <w:r>
               <w:rPr>
                 <w:b/>
@@ -392,7 +380,6 @@
               </w:rPr>
               <w:t>Vérificateur</w:t>
             </w:r>
-            <w:proofErr w:type="spellEnd"/>
           </w:p>
         </w:tc>
         <w:tc>
@@ -407,7 +394,6 @@
                 <w:bCs/>
               </w:rPr>
             </w:pPr>
-            <w:proofErr w:type="spellStart"/>
             <w:r>
               <w:rPr>
                 <w:b/>
@@ -415,7 +401,6 @@
               </w:rPr>
               <w:t>Approbateur</w:t>
             </w:r>
-            <w:proofErr w:type="spellEnd"/>
           </w:p>
         </w:tc>
       </w:tr>
@@ -989,11 +974,9 @@
         <w:lastRenderedPageBreak/>
         <w:t>Nom du parc : {{</w:t>
       </w:r>
-      <w:proofErr w:type="spellStart"/>
       <w:r>
         <w:t>park_name</w:t>
       </w:r>
-      <w:proofErr w:type="spellEnd"/>
       <w:r>
         <w:t xml:space="preserve">}} </w:t>
       </w:r>
@@ -1002,161 +985,263 @@
       <w:r>
         <w:t>Type d’éoliennes : {{</w:t>
       </w:r>
-      <w:proofErr w:type="spellStart"/>
       <w:r>
         <w:t>model_wtg</w:t>
       </w:r>
-      <w:proofErr w:type="spellEnd"/>
       <w:r>
         <w:t xml:space="preserve">}} </w:t>
       </w:r>
     </w:p>
     <w:p>
       <w:r>
-        <w:t>Nombre d’éoliennes : {{</w:t>
-      </w:r>
-      <w:proofErr w:type="spellStart"/>
-      <w:r>
-        <w:t>N</w:t>
+        <w:t>Nombre d’éoliennes : {{N</w:t>
       </w:r>
       <w:r>
         <w:t>ombre</w:t>
       </w:r>
       <w:r>
-        <w:t>_WTG</w:t>
-      </w:r>
-      <w:proofErr w:type="spellEnd"/>
+        <w:t xml:space="preserve">_WTG}} </w:t>
+      </w:r>
+    </w:p>
+    <w:p>
+      <w:r>
+        <w:t>Puissance totale installée : {{</w:t>
+      </w:r>
+      <w:r>
+        <w:t>nominal_power</w:t>
+      </w:r>
       <w:r>
         <w:t xml:space="preserve">}} </w:t>
       </w:r>
     </w:p>
     <w:p>
       <w:r>
-        <w:t>Puissance totale installée : {{</w:t>
-      </w:r>
-      <w:proofErr w:type="spellStart"/>
+        <w:t xml:space="preserve">Localisation : {{LOCALISATION}} </w:t>
+      </w:r>
+    </w:p>
+    <w:p>
+      <w:r>
+        <w:t>Client : {{CLIENT}}</w:t>
+      </w:r>
+    </w:p>
+    <w:p>
+      <w:r>
+        <w:t xml:space="preserve">Contact : {{CONTACT_CLIENT}} </w:t>
+      </w:r>
+    </w:p>
+    <w:p>
+      <w:r>
+        <w:t xml:space="preserve">Constructeur / Exploitant : {{CONTRACTOR}} </w:t>
+      </w:r>
+    </w:p>
+    <w:p/>
+    <w:p>
+      <w:r>
+        <w:t>Rédacteur</w:t>
+      </w:r>
+    </w:p>
+    <w:p>
+      <w:r>
+        <w:t>{{AUTEUR}}</w:t>
+      </w:r>
+    </w:p>
+    <w:p>
+      <w:r>
+        <w:t>Email : {{MAIL_AUTEUR}}</w:t>
+      </w:r>
+    </w:p>
+    <w:p>
+      <w:r>
+        <w:t>Téléphone : {{TEL_AUTEUR}}</w:t>
+      </w:r>
+    </w:p>
+    <w:p/>
+    <w:p>
+      <w:r>
+        <w:t>Vérificateur</w:t>
+      </w:r>
+    </w:p>
+    <w:p>
+      <w:r>
+        <w:t>{{VERIFICATEUR}}</w:t>
+      </w:r>
+    </w:p>
+    <w:p>
+      <w:r>
+        <w:t>Email : {{MAIL_VERIFICATEUR}}</w:t>
+      </w:r>
+    </w:p>
+    <w:p>
+      <w:r>
+        <w:t>Téléphone : {{TEL_VERIFICATEUR}}</w:t>
+      </w:r>
+    </w:p>
+    <w:p/>
+    <w:p>
+      <w:r>
+        <w:t>Approbateur</w:t>
+      </w:r>
+    </w:p>
+    <w:p>
+      <w:r>
+        <w:t>{{APPROBATEUR}}</w:t>
+      </w:r>
+    </w:p>
+    <w:p>
+      <w:r>
+        <w:t>Email : {{MAIL_APPROBATEUR}}</w:t>
+      </w:r>
+    </w:p>
+    <w:p>
+      <w:r>
+        <w:t>Téléphone : {{TEL_APPROBATEUR}}</w:t>
+      </w:r>
+    </w:p>
+    <w:p/>
+    <w:p>
+      <w:pPr>
+        <w:spacing w:after="160" w:line="259" w:lineRule="auto"/>
+      </w:pPr>
+      <w:r>
+        <w:br w:type="page"/>
+      </w:r>
+    </w:p>
+    <w:p/>
+    <w:p>
+      <w:pPr>
+        <w:pStyle w:val="Titre1"/>
+      </w:pPr>
+      <w:r>
+        <w:t>Synthèse</w:t>
+      </w:r>
+    </w:p>
+    <w:p>
+      <w:pPr>
+        <w:jc w:val="both"/>
+      </w:pPr>
+      <w:r>
+        <w:t xml:space="preserve">Les données SCADA du parc éolien </w:t>
+      </w:r>
+      <w:r>
+        <w:t>{{park_name}}</w:t>
+      </w:r>
+      <w:r>
+        <w:t xml:space="preserve"> ont été analysées sur la période du </w:t>
+      </w:r>
+      <w:r>
+        <w:t>{{analysis_start}}</w:t>
+      </w:r>
+      <w:r>
+        <w:t xml:space="preserve"> au </w:t>
+      </w:r>
+      <w:r>
+        <w:t>{{analysis_end}}</w:t>
+      </w:r>
+      <w:r>
+        <w:t xml:space="preserve">, à partir des informations fournies par le client. Le parc est composé de </w:t>
+      </w:r>
+      <w:r>
+        <w:t>{{turbine_count}}</w:t>
+      </w:r>
+      <w:r>
+        <w:t xml:space="preserve"> éoliennes de type</w:t>
+      </w:r>
+      <w:r>
+        <w:t xml:space="preserve"> </w:t>
+      </w:r>
+      <w:r>
+        <w:t>{{model_wtg}</w:t>
+      </w:r>
+      <w:r>
+        <w:t>}</w:t>
+      </w:r>
+      <w:r>
+        <w:t xml:space="preserve">, désignées </w:t>
+      </w:r>
+      <w:r>
+        <w:t>{{turbine_list}}</w:t>
+      </w:r>
+      <w:r>
+        <w:t xml:space="preserve"> L’ensemble des turbines a été pris en compte dans l’analyse.</w:t>
+      </w:r>
+    </w:p>
+    <w:p>
+      <w:pPr>
+        <w:jc w:val="both"/>
+      </w:pPr>
+    </w:p>
+    <w:p>
+      <w:pPr>
+        <w:jc w:val="both"/>
+      </w:pPr>
+      <w:r>
+        <w:t>Le tableau ci-après présente une évaluation synthétique des performances du parc, en mettant en évidence, pour chaque indicateur, le niveau de performance de chaque éolienne ainsi que les éventuels écarts observés.</w:t>
+      </w:r>
+    </w:p>
+    <w:p/>
+    <w:p>
+      <w:r>
+        <w:t>[T</w:t>
+      </w:r>
+      <w:r>
+        <w:t>ODO</w:t>
+      </w:r>
+      <w:r>
+        <w:t>:SCADA_SUMMARY_TABLE]</w:t>
+      </w:r>
+    </w:p>
+    <w:p>
+      <w:pPr>
+        <w:pStyle w:val="Titre1"/>
+      </w:pPr>
+      <w:r>
+        <w:t>Contexte de l’étude</w:t>
+      </w:r>
+    </w:p>
+    <w:p>
+      <w:pPr>
+        <w:pStyle w:val="Titre2"/>
+      </w:pPr>
+      <w:r>
+        <w:t>Présentation générale du parc</w:t>
+      </w:r>
+    </w:p>
+    <w:p>
+      <w:pPr>
+        <w:jc w:val="both"/>
+      </w:pPr>
+      <w:r>
+        <w:t>Le parc éolien {{</w:t>
+      </w:r>
+      <w:r>
+        <w:t>park_name</w:t>
+      </w:r>
+      <w:r>
+        <w:t>}} est situé sur le territoire des communes de {{COMMUNES}}, dans la région de {{REGION}}. Il est composé de {{</w:t>
+      </w:r>
+      <w:r>
+        <w:t>turbine_count</w:t>
+      </w:r>
+      <w:r>
+        <w:t>}} éoliennes de type {{</w:t>
+      </w:r>
+      <w:r>
+        <w:t>model_wtg</w:t>
+      </w:r>
+      <w:r>
+        <w:t>}}, d’une puissance nominale unitaire de {{</w:t>
+      </w:r>
       <w:r>
         <w:t>nominal_power</w:t>
       </w:r>
-      <w:proofErr w:type="spellEnd"/>
-      <w:r>
-        <w:t xml:space="preserve">}} </w:t>
-      </w:r>
-    </w:p>
-    <w:p>
-      <w:r>
-        <w:t xml:space="preserve">Localisation : {{LOCALISATION}} </w:t>
-      </w:r>
-    </w:p>
-    <w:p>
-      <w:r>
-        <w:t>Client : {{CLIENT}}</w:t>
-      </w:r>
-    </w:p>
-    <w:p>
-      <w:r>
-        <w:t xml:space="preserve">Contact : {{CONTACT_CLIENT}} </w:t>
-      </w:r>
-    </w:p>
-    <w:p>
-      <w:r>
-        <w:t xml:space="preserve">Constructeur / Exploitant : {{CONTRACTOR}} </w:t>
-      </w:r>
-    </w:p>
-    <w:p/>
-    <w:p>
-      <w:r>
-        <w:t>Rédacteur</w:t>
-      </w:r>
-    </w:p>
-    <w:p>
-      <w:r>
-        <w:t>{{AUTEUR}}</w:t>
-      </w:r>
-    </w:p>
-    <w:p>
-      <w:proofErr w:type="gramStart"/>
-      <w:r>
-        <w:t>Email</w:t>
-      </w:r>
-      <w:proofErr w:type="gramEnd"/>
-      <w:r>
-        <w:t xml:space="preserve"> : {{MAIL_AUTEUR}}</w:t>
-      </w:r>
-    </w:p>
-    <w:p>
-      <w:r>
-        <w:t>Téléphone : {{TEL_AUTEUR}}</w:t>
-      </w:r>
-    </w:p>
-    <w:p/>
-    <w:p>
-      <w:r>
-        <w:t>Vérificateur</w:t>
-      </w:r>
-    </w:p>
-    <w:p>
-      <w:r>
-        <w:t>{{VERIFICATEUR}}</w:t>
-      </w:r>
-    </w:p>
-    <w:p>
-      <w:proofErr w:type="gramStart"/>
-      <w:r>
-        <w:t>Email</w:t>
-      </w:r>
-      <w:proofErr w:type="gramEnd"/>
-      <w:r>
-        <w:t xml:space="preserve"> : {{MAIL_VERIFICATEUR}}</w:t>
-      </w:r>
-    </w:p>
-    <w:p>
-      <w:r>
-        <w:t>Téléphone : {{TEL_VERIFICATEUR}}</w:t>
-      </w:r>
-    </w:p>
-    <w:p/>
-    <w:p>
-      <w:r>
-        <w:t>Approbateur</w:t>
-      </w:r>
-    </w:p>
-    <w:p>
-      <w:r>
-        <w:t>{{APPROBATEUR}}</w:t>
-      </w:r>
-    </w:p>
-    <w:p>
-      <w:proofErr w:type="gramStart"/>
-      <w:r>
-        <w:t>Email</w:t>
-      </w:r>
-      <w:proofErr w:type="gramEnd"/>
-      <w:r>
-        <w:t xml:space="preserve"> : {{MAIL_APPROBATEUR}}</w:t>
-      </w:r>
-    </w:p>
-    <w:p>
-      <w:r>
-        <w:t>Téléphone : {{TEL_APPROBATEUR}}</w:t>
-      </w:r>
-    </w:p>
-    <w:p/>
-    <w:p>
-      <w:pPr>
-        <w:spacing w:after="160" w:line="259" w:lineRule="auto"/>
-      </w:pPr>
-      <w:r>
-        <w:br w:type="page"/>
-      </w:r>
-    </w:p>
-    <w:p/>
-    <w:p>
-      <w:pPr>
-        <w:pStyle w:val="Titre1"/>
-      </w:pPr>
-      <w:r>
-        <w:t>Synthèse</w:t>
+      <w:r>
+        <w:t>}}, soit une puissance totale installée de {{</w:t>
+      </w:r>
+      <w:r>
+        <w:t xml:space="preserve">total_power </w:t>
+      </w:r>
+      <w:r>
+        <w:t>}}.</w:t>
       </w:r>
     </w:p>
     <w:p>
@@ -1164,303 +1249,71 @@
         <w:jc w:val="both"/>
       </w:pPr>
       <w:r>
-        <w:t xml:space="preserve">Les données SCADA du parc éolien </w:t>
-      </w:r>
-      <w:r>
-        <w:t>{{</w:t>
-      </w:r>
-      <w:proofErr w:type="spellStart"/>
-      <w:r>
-        <w:t>park_name</w:t>
-      </w:r>
-      <w:proofErr w:type="spellEnd"/>
-      <w:r>
-        <w:t>}}</w:t>
-      </w:r>
-      <w:r>
-        <w:t xml:space="preserve"> ont été analysées sur la période du </w:t>
-      </w:r>
-      <w:r>
-        <w:t>{{</w:t>
-      </w:r>
-      <w:proofErr w:type="spellStart"/>
-      <w:r>
-        <w:t>analysis_start</w:t>
-      </w:r>
-      <w:proofErr w:type="spellEnd"/>
-      <w:r>
-        <w:t>}}</w:t>
-      </w:r>
-      <w:r>
-        <w:t xml:space="preserve"> au </w:t>
-      </w:r>
-      <w:r>
-        <w:t>{{</w:t>
-      </w:r>
-      <w:proofErr w:type="spellStart"/>
-      <w:r>
-        <w:t>analysis_end</w:t>
-      </w:r>
-      <w:proofErr w:type="spellEnd"/>
-      <w:r>
-        <w:t>}}</w:t>
-      </w:r>
-      <w:r>
-        <w:t xml:space="preserve">, à partir des informations fournies par le client. Le parc est composé de </w:t>
-      </w:r>
-      <w:r>
-        <w:t>{{</w:t>
-      </w:r>
-      <w:proofErr w:type="spellStart"/>
-      <w:r>
-        <w:t>turbine_count</w:t>
-      </w:r>
-      <w:proofErr w:type="spellEnd"/>
-      <w:r>
-        <w:t>}}</w:t>
-      </w:r>
-      <w:r>
-        <w:t xml:space="preserve"> éoliennes de type</w:t>
-      </w:r>
+        <w:t>Les éoliennes du parc sont identifiées comme suit : {{</w:t>
+      </w:r>
+      <w:r>
+        <w:t>turbine_list</w:t>
+      </w:r>
+      <w:r>
+        <w:t>}}. L’implantation du parc et la disposition des éoliennes sont présen tées dans la figure ci-</w:t>
+      </w:r>
+      <w:r>
+        <w:t>après :</w:t>
+      </w:r>
+    </w:p>
+    <w:p>
+      <w:pPr>
+        <w:jc w:val="both"/>
+      </w:pPr>
+      <w:r>
+        <w:t>[TODO.IMAGE_POSITION]</w:t>
+      </w:r>
+    </w:p>
+    <w:p>
       <w:r>
         <w:t xml:space="preserve"> </w:t>
       </w:r>
-      <w:r>
-        <w:t>{{</w:t>
-      </w:r>
-      <w:proofErr w:type="spellStart"/>
-      <w:r>
-        <w:t>model_wtg</w:t>
-      </w:r>
-      <w:proofErr w:type="spellEnd"/>
-      <w:r>
-        <w:t>}</w:t>
-      </w:r>
-      <w:r>
-        <w:t>}</w:t>
-      </w:r>
-      <w:r>
-        <w:t xml:space="preserve">, désignées </w:t>
-      </w:r>
-      <w:r>
-        <w:t>{{</w:t>
-      </w:r>
-      <w:proofErr w:type="spellStart"/>
-      <w:r>
-        <w:t>turbine_list</w:t>
-      </w:r>
-      <w:proofErr w:type="spellEnd"/>
-      <w:r>
-        <w:t>}}</w:t>
-      </w:r>
-      <w:r>
-        <w:t xml:space="preserve"> L’ensemble des turbines a été pris en compte dans l’analyse.</w:t>
-      </w:r>
-    </w:p>
-    <w:p>
-      <w:pPr>
-        <w:jc w:val="both"/>
-      </w:pPr>
-    </w:p>
-    <w:p>
-      <w:pPr>
-        <w:jc w:val="both"/>
-      </w:pPr>
-      <w:r>
-        <w:t>Le tableau ci-après présente une évaluation synthétique des performances du parc, en mettant en évidence, pour chaque indicateur, le niveau de performance de chaque éolienne ainsi que les éventuels écarts observés.</w:t>
-      </w:r>
-    </w:p>
-    <w:p/>
-    <w:p>
-      <w:r>
-        <w:t>[</w:t>
-      </w:r>
-      <w:proofErr w:type="gramStart"/>
-      <w:r>
-        <w:t>T</w:t>
+    </w:p>
+    <w:p>
+      <w:pPr>
+        <w:pStyle w:val="Titre2"/>
+      </w:pPr>
+      <w:r>
+        <w:t>Coordonnées des éoliennes</w:t>
+      </w:r>
+    </w:p>
+    <w:p>
+      <w:r>
+        <w:t>Les coordonnées géographiques des éoliennes du parc sont présentées dans le tableau ci-dessous :</w:t>
+      </w:r>
+    </w:p>
+    <w:p>
+      <w:r>
+        <w:t>[TODO.TABLEAU COORDONNE GPS]</w:t>
+      </w:r>
+    </w:p>
+    <w:p>
+      <w:pPr>
+        <w:pStyle w:val="Titre2"/>
+      </w:pPr>
+      <w:r>
+        <w:t>Données fournies par le client</w:t>
+      </w:r>
+    </w:p>
+    <w:p>
+      <w:r>
+        <w:t>Dans le cadre de cette étude, plusieurs jeux de données ont été transmis par le client afin de permettre l’analyse des performances du parc éolien.</w:t>
+      </w:r>
+    </w:p>
+    <w:p>
+      <w:r>
+        <w:t>[T</w:t>
       </w:r>
       <w:r>
         <w:t>ODO</w:t>
       </w:r>
       <w:r>
-        <w:t>:SCADA</w:t>
-      </w:r>
-      <w:proofErr w:type="gramEnd"/>
-      <w:r>
-        <w:t>_SUMMARY_TABLE]</w:t>
-      </w:r>
-    </w:p>
-    <w:p>
-      <w:pPr>
-        <w:pStyle w:val="Titre1"/>
-      </w:pPr>
-      <w:r>
-        <w:t>Contexte de l’étude</w:t>
-      </w:r>
-    </w:p>
-    <w:p>
-      <w:pPr>
-        <w:pStyle w:val="Titre2"/>
-      </w:pPr>
-      <w:r>
-        <w:t>Présentation générale du parc</w:t>
-      </w:r>
-    </w:p>
-    <w:p>
-      <w:pPr>
-        <w:jc w:val="both"/>
-      </w:pPr>
-      <w:r>
-        <w:t>Le parc éolien {{</w:t>
-      </w:r>
-      <w:proofErr w:type="spellStart"/>
-      <w:r>
-        <w:t>park_name</w:t>
-      </w:r>
-      <w:proofErr w:type="spellEnd"/>
-      <w:r>
-        <w:t>}} est situé sur le territoire des communes de {{COMMUNES}}, dans la région de {{REGION}}. Il est composé de {{</w:t>
-      </w:r>
-      <w:proofErr w:type="spellStart"/>
-      <w:r>
-        <w:t>turbine_count</w:t>
-      </w:r>
-      <w:proofErr w:type="spellEnd"/>
-      <w:r>
-        <w:t>}} éoliennes de type {{</w:t>
-      </w:r>
-      <w:proofErr w:type="spellStart"/>
-      <w:r>
-        <w:t>model_wtg</w:t>
-      </w:r>
-      <w:proofErr w:type="spellEnd"/>
-      <w:r>
-        <w:t>}}, d’une puissance nominale unitaire de {{</w:t>
-      </w:r>
-      <w:proofErr w:type="spellStart"/>
-      <w:r>
-        <w:t>nominal_power</w:t>
-      </w:r>
-      <w:proofErr w:type="spellEnd"/>
-      <w:r>
-        <w:t>}}, soit une puissance totale installée de {{</w:t>
-      </w:r>
-      <w:proofErr w:type="spellStart"/>
-      <w:r>
-        <w:t>total_</w:t>
-      </w:r>
-      <w:proofErr w:type="gramStart"/>
-      <w:r>
-        <w:t>power</w:t>
-      </w:r>
-      <w:proofErr w:type="spellEnd"/>
-      <w:r>
-        <w:t xml:space="preserve"> </w:t>
-      </w:r>
-      <w:r>
-        <w:t>}</w:t>
-      </w:r>
-      <w:proofErr w:type="gramEnd"/>
-      <w:r>
-        <w:t>}.</w:t>
-      </w:r>
-    </w:p>
-    <w:p>
-      <w:pPr>
-        <w:jc w:val="both"/>
-      </w:pPr>
-      <w:r>
-        <w:t>Les éoliennes du parc sont identifiées comme suit : {{</w:t>
-      </w:r>
-      <w:proofErr w:type="spellStart"/>
-      <w:r>
-        <w:t>turbine_list</w:t>
-      </w:r>
-      <w:proofErr w:type="spellEnd"/>
-      <w:r>
-        <w:t xml:space="preserve">}}. L’implantation du parc et la disposition des éoliennes sont </w:t>
-      </w:r>
-      <w:proofErr w:type="spellStart"/>
-      <w:r>
-        <w:t>présen</w:t>
-      </w:r>
-      <w:proofErr w:type="spellEnd"/>
-      <w:r>
-        <w:t xml:space="preserve"> </w:t>
-      </w:r>
-      <w:proofErr w:type="spellStart"/>
-      <w:r>
-        <w:t>tées</w:t>
-      </w:r>
-      <w:proofErr w:type="spellEnd"/>
-      <w:r>
-        <w:t xml:space="preserve"> dans la figure ci-</w:t>
-      </w:r>
-      <w:r>
-        <w:t>après :</w:t>
-      </w:r>
-    </w:p>
-    <w:p>
-      <w:pPr>
-        <w:jc w:val="both"/>
-      </w:pPr>
-      <w:r>
-        <w:t>[TODO.IMAGE_POSITION]</w:t>
-      </w:r>
-    </w:p>
-    <w:p>
-      <w:r>
-        <w:t xml:space="preserve"> </w:t>
-      </w:r>
-    </w:p>
-    <w:p>
-      <w:pPr>
-        <w:pStyle w:val="Titre2"/>
-      </w:pPr>
-      <w:r>
-        <w:t>Coordonnées des éoliennes</w:t>
-      </w:r>
-    </w:p>
-    <w:p>
-      <w:r>
-        <w:t>Les coordonnées géographiques des éoliennes du parc sont présentées dans le tableau ci-dessous :</w:t>
-      </w:r>
-    </w:p>
-    <w:p>
-      <w:r>
-        <w:t>[TODO.TABLEAU COORDONNE GPS]</w:t>
-      </w:r>
-    </w:p>
-    <w:p>
-      <w:pPr>
-        <w:pStyle w:val="Titre2"/>
-      </w:pPr>
-      <w:r>
-        <w:t>Données fournies par le client</w:t>
-      </w:r>
-    </w:p>
-    <w:p>
-      <w:r>
-        <w:t>Dans le cadre de cette étude, plusieurs jeux de données ont été transmis par le client afin de permettre l’analyse des performances du parc éolien.</w:t>
-      </w:r>
-    </w:p>
-    <w:p>
-      <w:r>
-        <w:t>[</w:t>
-      </w:r>
-      <w:proofErr w:type="gramStart"/>
-      <w:r>
-        <w:t>T</w:t>
-      </w:r>
-      <w:r>
-        <w:t>ODO</w:t>
-      </w:r>
-      <w:r>
-        <w:t>:</w:t>
-      </w:r>
-      <w:proofErr w:type="gramEnd"/>
-      <w:r>
-        <w:t>CSV_FILES_TABLE]</w:t>
+        <w:t>:CSV_FILES_TABLE]</w:t>
       </w:r>
     </w:p>
     <w:p>
@@ -1489,8 +1342,8 @@
         <w:tblLook w:val="04A0" w:firstRow="1" w:lastRow="0" w:firstColumn="1" w:lastColumn="0" w:noHBand="0" w:noVBand="1"/>
       </w:tblPr>
       <w:tblGrid>
-        <w:gridCol w:w="2069"/>
-        <w:gridCol w:w="6188"/>
+        <w:gridCol w:w="2293"/>
+        <w:gridCol w:w="5964"/>
       </w:tblGrid>
       <w:tr>
         <w:tc>
@@ -1507,7 +1360,6 @@
                 <w:szCs w:val="22"/>
               </w:rPr>
             </w:pPr>
-            <w:proofErr w:type="spellStart"/>
             <w:r>
               <w:rPr>
                 <w:rFonts w:ascii="Cambria" w:eastAsia="MS Mincho" w:hAnsi="Cambria"/>
@@ -1544,7 +1396,6 @@
               </w:rPr>
               <w:t>e</w:t>
             </w:r>
-            <w:proofErr w:type="spellEnd"/>
           </w:p>
         </w:tc>
         <w:tc>
@@ -1568,18 +1419,8 @@
                 <w:sz w:val="22"/>
                 <w:szCs w:val="22"/>
               </w:rPr>
-              <w:t xml:space="preserve">Axes </w:t>
+              <w:t>Axes d’analyse</w:t>
             </w:r>
-            <w:proofErr w:type="spellStart"/>
-            <w:r>
-              <w:rPr>
-                <w:rFonts w:ascii="Cambria" w:eastAsia="MS Mincho" w:hAnsi="Cambria"/>
-                <w:sz w:val="22"/>
-                <w:szCs w:val="22"/>
-              </w:rPr>
-              <w:t>d’analyse</w:t>
-            </w:r>
-            <w:proofErr w:type="spellEnd"/>
           </w:p>
         </w:tc>
       </w:tr>
@@ -1599,23 +1440,13 @@
                 <w:szCs w:val="22"/>
               </w:rPr>
             </w:pPr>
-            <w:proofErr w:type="spellStart"/>
             <w:r>
               <w:rPr>
                 <w:rFonts w:ascii="Cambria" w:eastAsia="MS Mincho" w:hAnsi="Cambria"/>
                 <w:sz w:val="22"/>
                 <w:szCs w:val="22"/>
               </w:rPr>
-              <w:t>Qualité</w:t>
-            </w:r>
-            <w:proofErr w:type="spellEnd"/>
-            <w:r>
-              <w:rPr>
-                <w:rFonts w:ascii="Cambria" w:eastAsia="MS Mincho" w:hAnsi="Cambria"/>
-                <w:sz w:val="22"/>
-                <w:szCs w:val="22"/>
-              </w:rPr>
-              <w:t xml:space="preserve"> des données</w:t>
+              <w:t>Qualité des données</w:t>
             </w:r>
           </w:p>
         </w:tc>
@@ -1699,18 +1530,8 @@
                 <w:sz w:val="22"/>
                 <w:szCs w:val="22"/>
               </w:rPr>
-              <w:t xml:space="preserve">Production et </w:t>
+              <w:t>Production et disponibilité</w:t>
             </w:r>
-            <w:proofErr w:type="spellStart"/>
-            <w:r>
-              <w:rPr>
-                <w:rFonts w:ascii="Cambria" w:eastAsia="MS Mincho" w:hAnsi="Cambria"/>
-                <w:sz w:val="22"/>
-                <w:szCs w:val="22"/>
-              </w:rPr>
-              <w:t>disponibilité</w:t>
-            </w:r>
-            <w:proofErr w:type="spellEnd"/>
           </w:p>
         </w:tc>
         <w:tc>
@@ -1732,52 +1553,14 @@
                 <w:szCs w:val="22"/>
               </w:rPr>
             </w:pPr>
-            <w:proofErr w:type="spellStart"/>
             <w:r>
               <w:rPr>
                 <w:rFonts w:ascii="Cambria" w:eastAsia="MS Mincho" w:hAnsi="Cambria"/>
                 <w:sz w:val="22"/>
                 <w:szCs w:val="22"/>
               </w:rPr>
-              <w:t>Calcul</w:t>
+              <w:t>Calcul de la disponibilité énergétique</w:t>
             </w:r>
-            <w:proofErr w:type="spellEnd"/>
-            <w:r>
-              <w:rPr>
-                <w:rFonts w:ascii="Cambria" w:eastAsia="MS Mincho" w:hAnsi="Cambria"/>
-                <w:sz w:val="22"/>
-                <w:szCs w:val="22"/>
-              </w:rPr>
-              <w:t xml:space="preserve"> de la </w:t>
-            </w:r>
-            <w:proofErr w:type="spellStart"/>
-            <w:r>
-              <w:rPr>
-                <w:rFonts w:ascii="Cambria" w:eastAsia="MS Mincho" w:hAnsi="Cambria"/>
-                <w:sz w:val="22"/>
-                <w:szCs w:val="22"/>
-              </w:rPr>
-              <w:t>disponibilité</w:t>
-            </w:r>
-            <w:proofErr w:type="spellEnd"/>
-            <w:r>
-              <w:rPr>
-                <w:rFonts w:ascii="Cambria" w:eastAsia="MS Mincho" w:hAnsi="Cambria"/>
-                <w:sz w:val="22"/>
-                <w:szCs w:val="22"/>
-              </w:rPr>
-              <w:t xml:space="preserve"> </w:t>
-            </w:r>
-            <w:proofErr w:type="spellStart"/>
-            <w:r>
-              <w:rPr>
-                <w:rFonts w:ascii="Cambria" w:eastAsia="MS Mincho" w:hAnsi="Cambria"/>
-                <w:sz w:val="22"/>
-                <w:szCs w:val="22"/>
-              </w:rPr>
-              <w:t>énergétique</w:t>
-            </w:r>
-            <w:proofErr w:type="spellEnd"/>
           </w:p>
           <w:p>
             <w:pPr>
@@ -1794,52 +1577,14 @@
                 <w:szCs w:val="22"/>
               </w:rPr>
             </w:pPr>
-            <w:proofErr w:type="spellStart"/>
             <w:r>
               <w:rPr>
                 <w:rFonts w:ascii="Cambria" w:eastAsia="MS Mincho" w:hAnsi="Cambria"/>
                 <w:sz w:val="22"/>
                 <w:szCs w:val="22"/>
               </w:rPr>
-              <w:t>Calcul</w:t>
+              <w:t>Calcul de la disponibilité temporelle</w:t>
             </w:r>
-            <w:proofErr w:type="spellEnd"/>
-            <w:r>
-              <w:rPr>
-                <w:rFonts w:ascii="Cambria" w:eastAsia="MS Mincho" w:hAnsi="Cambria"/>
-                <w:sz w:val="22"/>
-                <w:szCs w:val="22"/>
-              </w:rPr>
-              <w:t xml:space="preserve"> de la </w:t>
-            </w:r>
-            <w:proofErr w:type="spellStart"/>
-            <w:r>
-              <w:rPr>
-                <w:rFonts w:ascii="Cambria" w:eastAsia="MS Mincho" w:hAnsi="Cambria"/>
-                <w:sz w:val="22"/>
-                <w:szCs w:val="22"/>
-              </w:rPr>
-              <w:t>disponibilité</w:t>
-            </w:r>
-            <w:proofErr w:type="spellEnd"/>
-            <w:r>
-              <w:rPr>
-                <w:rFonts w:ascii="Cambria" w:eastAsia="MS Mincho" w:hAnsi="Cambria"/>
-                <w:sz w:val="22"/>
-                <w:szCs w:val="22"/>
-              </w:rPr>
-              <w:t xml:space="preserve"> </w:t>
-            </w:r>
-            <w:proofErr w:type="spellStart"/>
-            <w:r>
-              <w:rPr>
-                <w:rFonts w:ascii="Cambria" w:eastAsia="MS Mincho" w:hAnsi="Cambria"/>
-                <w:sz w:val="22"/>
-                <w:szCs w:val="22"/>
-              </w:rPr>
-              <w:t>temporelle</w:t>
-            </w:r>
-            <w:proofErr w:type="spellEnd"/>
           </w:p>
           <w:p>
             <w:pPr>
@@ -1911,41 +1656,13 @@
                 <w:szCs w:val="22"/>
               </w:rPr>
             </w:pPr>
-            <w:proofErr w:type="spellStart"/>
             <w:r>
               <w:rPr>
                 <w:rFonts w:ascii="Cambria" w:eastAsia="MS Mincho" w:hAnsi="Cambria"/>
                 <w:sz w:val="22"/>
                 <w:szCs w:val="22"/>
               </w:rPr>
-              <w:t>Bridages</w:t>
-            </w:r>
-            <w:proofErr w:type="spellEnd"/>
-            <w:r>
-              <w:rPr>
-                <w:rFonts w:ascii="Cambria" w:eastAsia="MS Mincho" w:hAnsi="Cambria"/>
-                <w:sz w:val="22"/>
-                <w:szCs w:val="22"/>
-              </w:rPr>
-              <w:t xml:space="preserve"> (</w:t>
-            </w:r>
-            <w:proofErr w:type="spellStart"/>
-            <w:r>
-              <w:rPr>
-                <w:rFonts w:ascii="Cambria" w:eastAsia="MS Mincho" w:hAnsi="Cambria"/>
-                <w:sz w:val="22"/>
-                <w:szCs w:val="22"/>
-              </w:rPr>
-              <w:t>si</w:t>
-            </w:r>
-            <w:proofErr w:type="spellEnd"/>
-            <w:r>
-              <w:rPr>
-                <w:rFonts w:ascii="Cambria" w:eastAsia="MS Mincho" w:hAnsi="Cambria"/>
-                <w:sz w:val="22"/>
-                <w:szCs w:val="22"/>
-              </w:rPr>
-              <w:t xml:space="preserve"> applicable)</w:t>
+              <w:t>Bridages (si applicable)</w:t>
             </w:r>
           </w:p>
         </w:tc>
@@ -2055,18 +1772,8 @@
                 <w:sz w:val="22"/>
                 <w:szCs w:val="22"/>
               </w:rPr>
-              <w:t xml:space="preserve">Performance des </w:t>
+              <w:t>Performance des éoliennes</w:t>
             </w:r>
-            <w:proofErr w:type="spellStart"/>
-            <w:r>
-              <w:rPr>
-                <w:rFonts w:ascii="Cambria" w:eastAsia="MS Mincho" w:hAnsi="Cambria"/>
-                <w:sz w:val="22"/>
-                <w:szCs w:val="22"/>
-              </w:rPr>
-              <w:t>éoliennes</w:t>
-            </w:r>
-            <w:proofErr w:type="spellEnd"/>
           </w:p>
         </w:tc>
         <w:tc>
@@ -2116,41 +1823,13 @@
                 <w:szCs w:val="22"/>
               </w:rPr>
             </w:pPr>
-            <w:proofErr w:type="spellStart"/>
             <w:r>
               <w:rPr>
                 <w:rFonts w:ascii="Cambria" w:eastAsia="MS Mincho" w:hAnsi="Cambria"/>
                 <w:sz w:val="22"/>
                 <w:szCs w:val="22"/>
               </w:rPr>
-              <w:t>Analyse</w:t>
-            </w:r>
-            <w:proofErr w:type="spellEnd"/>
-            <w:r>
-              <w:rPr>
-                <w:rFonts w:ascii="Cambria" w:eastAsia="MS Mincho" w:hAnsi="Cambria"/>
-                <w:sz w:val="22"/>
-                <w:szCs w:val="22"/>
-              </w:rPr>
-              <w:t xml:space="preserve"> du </w:t>
-            </w:r>
-            <w:proofErr w:type="spellStart"/>
-            <w:r>
-              <w:rPr>
-                <w:rFonts w:ascii="Cambria" w:eastAsia="MS Mincho" w:hAnsi="Cambria"/>
-                <w:sz w:val="22"/>
-                <w:szCs w:val="22"/>
-              </w:rPr>
-              <w:t>comportement</w:t>
-            </w:r>
-            <w:proofErr w:type="spellEnd"/>
-            <w:r>
-              <w:rPr>
-                <w:rFonts w:ascii="Cambria" w:eastAsia="MS Mincho" w:hAnsi="Cambria"/>
-                <w:sz w:val="22"/>
-                <w:szCs w:val="22"/>
-              </w:rPr>
-              <w:t xml:space="preserve"> du pitch</w:t>
+              <w:t>Analyse du comportement du pitch</w:t>
             </w:r>
           </w:p>
           <w:p>
@@ -2196,23 +1875,13 @@
                 <w:szCs w:val="22"/>
               </w:rPr>
             </w:pPr>
-            <w:proofErr w:type="spellStart"/>
             <w:r>
               <w:rPr>
                 <w:rFonts w:ascii="Cambria" w:eastAsia="MS Mincho" w:hAnsi="Cambria"/>
                 <w:sz w:val="22"/>
                 <w:szCs w:val="22"/>
               </w:rPr>
-              <w:t>Analyse</w:t>
-            </w:r>
-            <w:proofErr w:type="spellEnd"/>
-            <w:r>
-              <w:rPr>
-                <w:rFonts w:ascii="Cambria" w:eastAsia="MS Mincho" w:hAnsi="Cambria"/>
-                <w:sz w:val="22"/>
-                <w:szCs w:val="22"/>
-              </w:rPr>
-              <w:t xml:space="preserve"> inter-turbines</w:t>
+              <w:t>Analyse inter-turbines</w:t>
             </w:r>
           </w:p>
           <w:p>
@@ -2231,41 +1900,13 @@
                 <w:szCs w:val="22"/>
               </w:rPr>
             </w:pPr>
-            <w:proofErr w:type="spellStart"/>
             <w:r>
               <w:rPr>
                 <w:rFonts w:ascii="Cambria" w:eastAsia="MS Mincho" w:hAnsi="Cambria"/>
                 <w:sz w:val="22"/>
                 <w:szCs w:val="22"/>
               </w:rPr>
-              <w:t>Cohérence</w:t>
-            </w:r>
-            <w:proofErr w:type="spellEnd"/>
-            <w:r>
-              <w:rPr>
-                <w:rFonts w:ascii="Cambria" w:eastAsia="MS Mincho" w:hAnsi="Cambria"/>
-                <w:sz w:val="22"/>
-                <w:szCs w:val="22"/>
-              </w:rPr>
-              <w:t xml:space="preserve"> </w:t>
-            </w:r>
-            <w:proofErr w:type="spellStart"/>
-            <w:r>
-              <w:rPr>
-                <w:rFonts w:ascii="Cambria" w:eastAsia="MS Mincho" w:hAnsi="Cambria"/>
-                <w:sz w:val="22"/>
-                <w:szCs w:val="22"/>
-              </w:rPr>
-              <w:t>globale</w:t>
-            </w:r>
-            <w:proofErr w:type="spellEnd"/>
-            <w:r>
-              <w:rPr>
-                <w:rFonts w:ascii="Cambria" w:eastAsia="MS Mincho" w:hAnsi="Cambria"/>
-                <w:sz w:val="22"/>
-                <w:szCs w:val="22"/>
-              </w:rPr>
-              <w:t xml:space="preserve"> des performances</w:t>
+              <w:t>Cohérence globale des performances</w:t>
             </w:r>
           </w:p>
         </w:tc>
@@ -2301,13 +1942,8 @@
           <w:numId w:val="6"/>
         </w:numPr>
       </w:pPr>
-      <w:proofErr w:type="gramStart"/>
-      <w:r>
-        <w:t>variables</w:t>
-      </w:r>
-      <w:proofErr w:type="gramEnd"/>
-      <w:r>
-        <w:t xml:space="preserve"> environnementales : </w:t>
+      <w:r>
+        <w:t xml:space="preserve">variables environnementales : </w:t>
       </w:r>
     </w:p>
     <w:p>
@@ -2318,13 +1954,8 @@
           <w:numId w:val="6"/>
         </w:numPr>
       </w:pPr>
-      <w:proofErr w:type="gramStart"/>
-      <w:r>
-        <w:t>vitesse</w:t>
-      </w:r>
-      <w:proofErr w:type="gramEnd"/>
-      <w:r>
-        <w:t xml:space="preserve"> du vent </w:t>
+      <w:r>
+        <w:t xml:space="preserve">vitesse du vent </w:t>
       </w:r>
     </w:p>
     <w:p>
@@ -2335,13 +1966,8 @@
           <w:numId w:val="6"/>
         </w:numPr>
       </w:pPr>
-      <w:proofErr w:type="gramStart"/>
-      <w:r>
-        <w:t>direction</w:t>
-      </w:r>
-      <w:proofErr w:type="gramEnd"/>
-      <w:r>
-        <w:t xml:space="preserve"> du vent </w:t>
+      <w:r>
+        <w:t xml:space="preserve">direction du vent </w:t>
       </w:r>
     </w:p>
     <w:p>
@@ -2352,13 +1978,8 @@
           <w:numId w:val="6"/>
         </w:numPr>
       </w:pPr>
-      <w:proofErr w:type="gramStart"/>
-      <w:r>
-        <w:t>température</w:t>
-      </w:r>
-      <w:proofErr w:type="gramEnd"/>
-      <w:r>
-        <w:t xml:space="preserve"> ambiante </w:t>
+      <w:r>
+        <w:t xml:space="preserve">température ambiante </w:t>
       </w:r>
     </w:p>
     <w:p>
@@ -2369,13 +1990,8 @@
           <w:numId w:val="6"/>
         </w:numPr>
       </w:pPr>
-      <w:proofErr w:type="gramStart"/>
-      <w:r>
-        <w:t>variables</w:t>
-      </w:r>
-      <w:proofErr w:type="gramEnd"/>
-      <w:r>
-        <w:t xml:space="preserve"> opérationnelles clés : </w:t>
+      <w:r>
+        <w:t xml:space="preserve">variables opérationnelles clés : </w:t>
       </w:r>
     </w:p>
     <w:p>
@@ -2386,13 +2002,8 @@
           <w:numId w:val="6"/>
         </w:numPr>
       </w:pPr>
-      <w:proofErr w:type="gramStart"/>
-      <w:r>
-        <w:t>puissance</w:t>
-      </w:r>
-      <w:proofErr w:type="gramEnd"/>
-      <w:r>
-        <w:t xml:space="preserve"> active produite </w:t>
+      <w:r>
+        <w:t xml:space="preserve">puissance active produite </w:t>
       </w:r>
     </w:p>
     <w:p/>
@@ -2413,29 +2024,13 @@
         <w:t xml:space="preserve">La figure ci-après présente la disponibilité des données SCADA, sur la période allant du </w:t>
       </w:r>
       <w:r>
-        <w:t>{{</w:t>
-      </w:r>
-      <w:proofErr w:type="spellStart"/>
-      <w:r>
-        <w:t>analysis_start</w:t>
-      </w:r>
-      <w:proofErr w:type="spellEnd"/>
-      <w:r>
-        <w:t>}}</w:t>
+        <w:t>{{analysis_start}}</w:t>
       </w:r>
       <w:r>
         <w:t xml:space="preserve"> au </w:t>
       </w:r>
       <w:r>
-        <w:t>{{</w:t>
-      </w:r>
-      <w:proofErr w:type="spellStart"/>
-      <w:r>
-        <w:t>analysis_end</w:t>
-      </w:r>
-      <w:proofErr w:type="spellEnd"/>
-      <w:r>
-        <w:t>}}</w:t>
+        <w:t>{{analysis_end}}</w:t>
       </w:r>
       <w:r>
         <w:t>.</w:t>
@@ -2518,21 +2113,7 @@
         <w:rPr>
           <w:lang w:val="en-US"/>
         </w:rPr>
-        <w:t>{{</w:t>
-      </w:r>
-      <w:proofErr w:type="spellStart"/>
-      <w:r>
-        <w:rPr>
-          <w:lang w:val="en-US"/>
-        </w:rPr>
-        <w:t>data_availability_chart</w:t>
-      </w:r>
-      <w:proofErr w:type="spellEnd"/>
-      <w:r>
-        <w:rPr>
-          <w:lang w:val="en-US"/>
-        </w:rPr>
-        <w:t>}}</w:t>
+        <w:t>{{data_availability_chart}}</w:t>
       </w:r>
     </w:p>
     <w:p>
@@ -2569,23 +2150,7 @@
         </w:numPr>
       </w:pPr>
       <w:r>
-        <w:t>Disponibilité énergétique brute (</w:t>
-      </w:r>
-      <w:proofErr w:type="spellStart"/>
-      <w:r>
-        <w:t>cut</w:t>
-      </w:r>
-      <w:proofErr w:type="spellEnd"/>
-      <w:r>
-        <w:t xml:space="preserve">-in / </w:t>
-      </w:r>
-      <w:proofErr w:type="spellStart"/>
-      <w:r>
-        <w:t>cut</w:t>
-      </w:r>
-      <w:proofErr w:type="spellEnd"/>
-      <w:r>
-        <w:t>-out) : calculée pour les périodes où la vitesse de vent est comprise entre les seuils de démarrage et d’arrêt des éoliennes, en incluant l’ensemble des indisponibilités (arrêts techniques, maintenance, limitations réseau, etc.)</w:t>
+        <w:t>Disponibilité énergétique brute (cut-in / cut-out) : calculée pour les périodes où la vitesse de vent est comprise entre les seuils de démarrage et d’arrêt des éoliennes, en incluant l’ensemble des indisponibilités (arrêts techniques, maintenance, limitations réseau, etc.)</w:t>
       </w:r>
     </w:p>
     <w:p>
@@ -2674,29 +2239,8 @@
           <w:numId w:val="8"/>
         </w:numPr>
       </w:pPr>
-      <w:proofErr w:type="gramStart"/>
-      <w:r>
-        <w:t>la</w:t>
-      </w:r>
-      <w:proofErr w:type="gramEnd"/>
-      <w:r>
-        <w:t xml:space="preserve"> disponibilité énergétique brute (</w:t>
-      </w:r>
-      <w:proofErr w:type="spellStart"/>
-      <w:r>
-        <w:t>cut</w:t>
-      </w:r>
-      <w:proofErr w:type="spellEnd"/>
-      <w:r>
-        <w:t xml:space="preserve">-in / </w:t>
-      </w:r>
-      <w:proofErr w:type="spellStart"/>
-      <w:r>
-        <w:t>cut</w:t>
-      </w:r>
-      <w:proofErr w:type="spellEnd"/>
-      <w:r>
-        <w:t>-out),</w:t>
+      <w:r>
+        <w:t>la disponibilité énergétique brute (cut-in / cut-out),</w:t>
       </w:r>
     </w:p>
     <w:p>
@@ -2707,101 +2251,54 @@
           <w:numId w:val="8"/>
         </w:numPr>
       </w:pPr>
-      <w:proofErr w:type="gramStart"/>
-      <w:r>
-        <w:t>la</w:t>
-      </w:r>
-      <w:proofErr w:type="gramEnd"/>
-      <w:r>
-        <w:t xml:space="preserve"> disponibilité énergétique imputable au fabricant</w:t>
-      </w:r>
-    </w:p>
-    <w:p>
-      <w:pPr>
-        <w:rPr>
-          <w:lang w:val="en-US"/>
-        </w:rPr>
-      </w:pPr>
-      <w:r>
-        <w:rPr>
-          <w:lang w:val="en-US"/>
-        </w:rPr>
-        <w:t>[</w:t>
-      </w:r>
-      <w:proofErr w:type="gramStart"/>
-      <w:r>
-        <w:rPr>
-          <w:lang w:val="en-US"/>
-        </w:rPr>
-        <w:t>TABLE:EBA</w:t>
-      </w:r>
-      <w:proofErr w:type="gramEnd"/>
-      <w:r>
-        <w:rPr>
-          <w:lang w:val="en-US"/>
-        </w:rPr>
-        <w:t>_CUT_IN_CUT_OUT_TABLE]</w:t>
-      </w:r>
-    </w:p>
-    <w:p>
-      <w:pPr>
-        <w:rPr>
-          <w:lang w:val="en-US"/>
-        </w:rPr>
-      </w:pPr>
-      <w:r>
-        <w:rPr>
-          <w:lang w:val="en-US"/>
-        </w:rPr>
-        <w:t>{{</w:t>
-      </w:r>
-      <w:proofErr w:type="spellStart"/>
-      <w:r>
-        <w:rPr>
-          <w:lang w:val="en-US"/>
-        </w:rPr>
-        <w:t>eba_cut_in_cut_out_chart</w:t>
-      </w:r>
-      <w:proofErr w:type="spellEnd"/>
-      <w:r>
-        <w:rPr>
-          <w:lang w:val="en-US"/>
-        </w:rPr>
-        <w:t>}}</w:t>
-      </w:r>
-    </w:p>
-    <w:p>
-      <w:pPr>
-        <w:rPr>
-          <w:lang w:val="en-US"/>
-        </w:rPr>
-      </w:pPr>
-    </w:p>
-    <w:p>
-      <w:pPr>
-        <w:rPr>
-          <w:lang w:val="en-US"/>
-        </w:rPr>
-      </w:pPr>
-      <w:r>
-        <w:rPr>
-          <w:lang w:val="en-US"/>
-        </w:rPr>
-        <w:t>[</w:t>
-      </w:r>
-      <w:proofErr w:type="gramStart"/>
-      <w:r>
-        <w:rPr>
-          <w:lang w:val="en-US"/>
-        </w:rPr>
-        <w:t>TABLE:EBA</w:t>
-      </w:r>
-      <w:proofErr w:type="gramEnd"/>
-      <w:r>
-        <w:rPr>
-          <w:lang w:val="en-US"/>
-        </w:rPr>
-        <w:t>_MANUFACTURER_TABLE]</w:t>
+      <w:r>
+        <w:t>la disponibilité énergétique imputable au fabricant</w:t>
+      </w:r>
+    </w:p>
+    <w:p>
+      <w:pPr>
+        <w:rPr>
+          <w:lang w:val="en-US"/>
+        </w:rPr>
+      </w:pPr>
+      <w:r>
+        <w:rPr>
+          <w:lang w:val="en-US"/>
+        </w:rPr>
+        <w:t>[TABLE:EBA_CUT_IN_CUT_OUT_TABLE]</w:t>
+      </w:r>
+    </w:p>
+    <w:p>
+      <w:pPr>
+        <w:rPr>
+          <w:lang w:val="en-US"/>
+        </w:rPr>
+      </w:pPr>
+      <w:r>
+        <w:rPr>
+          <w:lang w:val="en-US"/>
+        </w:rPr>
+        <w:t>{{eba_cut_in_cut_out_chart}}</w:t>
+      </w:r>
+    </w:p>
+    <w:p>
+      <w:pPr>
+        <w:rPr>
+          <w:lang w:val="en-US"/>
+        </w:rPr>
+      </w:pPr>
+    </w:p>
+    <w:p>
+      <w:pPr>
+        <w:rPr>
+          <w:lang w:val="en-US"/>
+        </w:rPr>
+      </w:pPr>
+      <w:r>
+        <w:rPr>
+          <w:lang w:val="en-US"/>
+        </w:rPr>
+        <w:t>[TABLE:EBA_MANUFACTURER_TABLE]</w:t>
       </w:r>
       <w:r>
         <w:rPr>
@@ -2820,41 +2317,19 @@
         <w:rPr>
           <w:lang w:val="en-US"/>
         </w:rPr>
-        <w:t>{{</w:t>
-      </w:r>
-      <w:proofErr w:type="spellStart"/>
-      <w:r>
-        <w:rPr>
-          <w:lang w:val="en-US"/>
-        </w:rPr>
-        <w:t>eba_manifacturer_chart</w:t>
-      </w:r>
-      <w:proofErr w:type="spellEnd"/>
-      <w:r>
-        <w:rPr>
-          <w:lang w:val="en-US"/>
-        </w:rPr>
-        <w:t>}}</w:t>
-      </w:r>
-    </w:p>
-    <w:p>
-      <w:pPr>
-        <w:rPr>
-          <w:lang w:val="en-US"/>
-        </w:rPr>
-      </w:pPr>
-    </w:p>
-    <w:p>
-      <w:r>
-        <w:t>[</w:t>
-      </w:r>
-      <w:proofErr w:type="gramStart"/>
-      <w:r>
-        <w:t>TABLE:EBA</w:t>
-      </w:r>
-      <w:proofErr w:type="gramEnd"/>
-      <w:r>
-        <w:t>_LOSS_TABLE]</w:t>
+        <w:t>{{eba_manifacturer_chart}}</w:t>
+      </w:r>
+    </w:p>
+    <w:p>
+      <w:pPr>
+        <w:rPr>
+          <w:lang w:val="en-US"/>
+        </w:rPr>
+      </w:pPr>
+    </w:p>
+    <w:p>
+      <w:r>
+        <w:t>[TABLE:EBA_LOSS_TABLE]</w:t>
       </w:r>
     </w:p>
     <w:p>
@@ -2886,21 +2361,7 @@
         <w:rPr>
           <w:lang w:val="en-US"/>
         </w:rPr>
-        <w:t>{{</w:t>
-      </w:r>
-      <w:proofErr w:type="spellStart"/>
-      <w:r>
-        <w:rPr>
-          <w:lang w:val="en-US"/>
-        </w:rPr>
-        <w:t>eba_loss_chart</w:t>
-      </w:r>
-      <w:proofErr w:type="spellEnd"/>
-      <w:r>
-        <w:rPr>
-          <w:lang w:val="en-US"/>
-        </w:rPr>
-        <w:t>}}</w:t>
+        <w:t>{{eba_loss_chart}}</w:t>
       </w:r>
     </w:p>
     <w:p>
@@ -3021,21 +2482,7 @@
         <w:rPr>
           <w:lang w:val="en-US"/>
         </w:rPr>
-        <w:t>[</w:t>
-      </w:r>
-      <w:proofErr w:type="gramStart"/>
-      <w:r>
-        <w:rPr>
-          <w:lang w:val="en-US"/>
-        </w:rPr>
-        <w:t>TABLE:ERROR</w:t>
-      </w:r>
-      <w:proofErr w:type="gramEnd"/>
-      <w:r>
-        <w:rPr>
-          <w:lang w:val="en-US"/>
-        </w:rPr>
-        <w:t>_</w:t>
+        <w:t>[TABLE:ERROR_</w:t>
       </w:r>
       <w:r>
         <w:rPr>
@@ -3067,21 +2514,7 @@
         <w:rPr>
           <w:lang w:val="en-US"/>
         </w:rPr>
-        <w:t>[</w:t>
-      </w:r>
-      <w:proofErr w:type="gramStart"/>
-      <w:r>
-        <w:rPr>
-          <w:lang w:val="en-US"/>
-        </w:rPr>
-        <w:t>TABLE:ERROR</w:t>
-      </w:r>
-      <w:proofErr w:type="gramEnd"/>
-      <w:r>
-        <w:rPr>
-          <w:lang w:val="en-US"/>
-        </w:rPr>
-        <w:t>_</w:t>
+        <w:t>[TABLE:ERROR_</w:t>
       </w:r>
       <w:r>
         <w:rPr>
@@ -3125,48 +2558,20 @@
         <w:rPr>
           <w:lang w:val="en-US"/>
         </w:rPr>
-        <w:t>{{</w:t>
-      </w:r>
-      <w:proofErr w:type="spellStart"/>
-      <w:r>
-        <w:rPr>
-          <w:lang w:val="en-US"/>
-        </w:rPr>
-        <w:t>top_error_code_frequency</w:t>
-      </w:r>
-      <w:proofErr w:type="spellEnd"/>
-      <w:r>
-        <w:rPr>
-          <w:lang w:val="en-US"/>
-        </w:rPr>
-        <w:t>}}</w:t>
-      </w:r>
-    </w:p>
-    <w:p>
-      <w:pPr>
-        <w:rPr>
-          <w:lang w:val="en-US"/>
-        </w:rPr>
-      </w:pPr>
-      <w:r>
-        <w:rPr>
-          <w:lang w:val="en-US"/>
-        </w:rPr>
-        <w:t>{{</w:t>
-      </w:r>
-      <w:proofErr w:type="spellStart"/>
-      <w:r>
-        <w:rPr>
-          <w:lang w:val="en-US"/>
-        </w:rPr>
-        <w:t>treemap_error_code</w:t>
-      </w:r>
-      <w:proofErr w:type="spellEnd"/>
-      <w:r>
-        <w:rPr>
-          <w:lang w:val="en-US"/>
-        </w:rPr>
-        <w:t>}}</w:t>
+        <w:t>{{top_error_code_frequency}}</w:t>
+      </w:r>
+    </w:p>
+    <w:p>
+      <w:pPr>
+        <w:rPr>
+          <w:lang w:val="en-US"/>
+        </w:rPr>
+      </w:pPr>
+      <w:r>
+        <w:rPr>
+          <w:lang w:val="en-US"/>
+        </w:rPr>
+        <w:t>{{treemap_error_code}}</w:t>
       </w:r>
     </w:p>
     <w:p>
@@ -3185,23 +2590,7 @@
     </w:p>
     <w:p>
       <w:r>
-        <w:t>L’analyse de la direction du vent vise à vérifier la cohérence des mesures directionnelles entre les éoliennes, ainsi que leur alignement avec une référence externe, afin de détecter d’éventuels défauts d’orientation (</w:t>
-      </w:r>
-      <w:proofErr w:type="spellStart"/>
-      <w:r>
-        <w:t>yaw</w:t>
-      </w:r>
-      <w:proofErr w:type="spellEnd"/>
-      <w:r>
-        <w:t xml:space="preserve"> </w:t>
-      </w:r>
-      <w:proofErr w:type="spellStart"/>
-      <w:r>
-        <w:t>misalignment</w:t>
-      </w:r>
-      <w:proofErr w:type="spellEnd"/>
-      <w:r>
-        <w:t>).</w:t>
+        <w:t>L’analyse de la direction du vent vise à vérifier la cohérence des mesures directionnelles entre les éoliennes, ainsi que leur alignement avec une référence externe, afin de détecter d’éventuels défauts d’orientation (yaw misalignment).</w:t>
       </w:r>
     </w:p>
     <w:p>
@@ -3271,109 +2660,53 @@
         <w:rPr>
           <w:lang w:val="en-US"/>
         </w:rPr>
-        <w:t>[</w:t>
-      </w:r>
-      <w:proofErr w:type="gramStart"/>
-      <w:r>
-        <w:rPr>
-          <w:lang w:val="en-US"/>
-        </w:rPr>
-        <w:t>TABLE:WIND</w:t>
-      </w:r>
-      <w:proofErr w:type="gramEnd"/>
-      <w:r>
-        <w:rPr>
-          <w:lang w:val="en-US"/>
-        </w:rPr>
-        <w:t>_DIRECTION_CALIBRATION_TABLE]</w:t>
-      </w:r>
-    </w:p>
-    <w:p>
-      <w:pPr>
-        <w:rPr>
-          <w:lang w:val="en-US"/>
-        </w:rPr>
-      </w:pPr>
-    </w:p>
-    <w:p>
-      <w:pPr>
-        <w:rPr>
-          <w:lang w:val="en-US"/>
-        </w:rPr>
-      </w:pPr>
-      <w:r>
-        <w:rPr>
-          <w:lang w:val="en-US"/>
-        </w:rPr>
-        <w:t>{{</w:t>
-      </w:r>
-      <w:proofErr w:type="spellStart"/>
-      <w:r>
-        <w:rPr>
-          <w:lang w:val="en-US"/>
-        </w:rPr>
-        <w:t>wind_direction_calibration</w:t>
-      </w:r>
-      <w:proofErr w:type="spellEnd"/>
-      <w:r>
-        <w:rPr>
-          <w:lang w:val="en-US"/>
-        </w:rPr>
-        <w:t>}}</w:t>
-      </w:r>
-    </w:p>
-    <w:p>
-      <w:pPr>
-        <w:rPr>
-          <w:lang w:val="en-US"/>
-        </w:rPr>
-      </w:pPr>
-      <w:r>
-        <w:rPr>
-          <w:lang w:val="en-US"/>
-        </w:rPr>
-        <w:t>{{</w:t>
-      </w:r>
-      <w:proofErr w:type="spellStart"/>
-      <w:r>
-        <w:rPr>
-          <w:lang w:val="en-US"/>
-        </w:rPr>
-        <w:t>power_rose_chart</w:t>
-      </w:r>
-      <w:proofErr w:type="spellEnd"/>
-      <w:r>
-        <w:rPr>
-          <w:lang w:val="en-US"/>
-        </w:rPr>
-        <w:t>}}</w:t>
-      </w:r>
-    </w:p>
-    <w:p>
-      <w:pPr>
-        <w:rPr>
-          <w:lang w:val="en-US"/>
-        </w:rPr>
-      </w:pPr>
-      <w:r>
-        <w:rPr>
-          <w:lang w:val="en-US"/>
-        </w:rPr>
-        <w:t>{{</w:t>
-      </w:r>
-      <w:proofErr w:type="spellStart"/>
-      <w:r>
-        <w:rPr>
-          <w:lang w:val="en-US"/>
-        </w:rPr>
-        <w:t>wind_rose_chart</w:t>
-      </w:r>
-      <w:proofErr w:type="spellEnd"/>
-      <w:r>
-        <w:rPr>
-          <w:lang w:val="en-US"/>
-        </w:rPr>
-        <w:t>}}</w:t>
+        <w:t>[TABLE:WIND_DIRECTION_CALIBRATION_TABLE]</w:t>
+      </w:r>
+    </w:p>
+    <w:p>
+      <w:pPr>
+        <w:rPr>
+          <w:lang w:val="en-US"/>
+        </w:rPr>
+      </w:pPr>
+    </w:p>
+    <w:p>
+      <w:pPr>
+        <w:rPr>
+          <w:lang w:val="en-US"/>
+        </w:rPr>
+      </w:pPr>
+      <w:r>
+        <w:rPr>
+          <w:lang w:val="en-US"/>
+        </w:rPr>
+        <w:t>{{wind_direction_calibration}}</w:t>
+      </w:r>
+    </w:p>
+    <w:p>
+      <w:pPr>
+        <w:rPr>
+          <w:lang w:val="en-US"/>
+        </w:rPr>
+      </w:pPr>
+      <w:r>
+        <w:rPr>
+          <w:lang w:val="en-US"/>
+        </w:rPr>
+        <w:t>{{power_rose_chart}}</w:t>
+      </w:r>
+    </w:p>
+    <w:p>
+      <w:pPr>
+        <w:rPr>
+          <w:lang w:val="en-US"/>
+        </w:rPr>
+      </w:pPr>
+      <w:r>
+        <w:rPr>
+          <w:lang w:val="en-US"/>
+        </w:rPr>
+        <w:t>{{wind_rose_chart}}</w:t>
       </w:r>
     </w:p>
     <w:p>
@@ -3460,15 +2793,7 @@
         <w:t>Exclusion</w:t>
       </w:r>
       <w:r>
-        <w:t xml:space="preserve"> des situations de sillage (wake </w:t>
-      </w:r>
-      <w:proofErr w:type="spellStart"/>
-      <w:r>
-        <w:t>effect</w:t>
-      </w:r>
-      <w:proofErr w:type="spellEnd"/>
-      <w:r>
-        <w:t xml:space="preserve">), </w:t>
+        <w:t xml:space="preserve"> des situations de sillage (wake effect), </w:t>
       </w:r>
     </w:p>
     <w:p>
@@ -3534,21 +2859,7 @@
         <w:rPr>
           <w:lang w:val="en-US"/>
         </w:rPr>
-        <w:t>[</w:t>
-      </w:r>
-      <w:proofErr w:type="gramStart"/>
-      <w:r>
-        <w:rPr>
-          <w:lang w:val="en-US"/>
-        </w:rPr>
-        <w:t>TABLE:NORMATIVE</w:t>
-      </w:r>
-      <w:proofErr w:type="gramEnd"/>
-      <w:r>
-        <w:rPr>
-          <w:lang w:val="en-US"/>
-        </w:rPr>
-        <w:t>_YIELD_TABLE]</w:t>
+        <w:t>[TABLE:NORMATIVE_YIELD_TABLE]</w:t>
       </w:r>
     </w:p>
     <w:p>
@@ -3563,19 +2874,11 @@
         </w:rPr>
         <w:t>{{</w:t>
       </w:r>
-      <w:proofErr w:type="spellStart"/>
-      <w:r>
-        <w:rPr>
-          <w:lang w:val="en-US"/>
-        </w:rPr>
-        <w:t>power_curve_chart</w:t>
-      </w:r>
-      <w:proofErr w:type="spellEnd"/>
-      <w:r>
-        <w:rPr>
-          <w:lang w:val="en-US"/>
-        </w:rPr>
-        <w:t>}}</w:t>
+      <w:r>
+        <w:rPr>
+          <w:lang w:val="en-US"/>
+        </w:rPr>
+        <w:t>power_curve_chart}}</w:t>
       </w:r>
     </w:p>
     <w:p>
@@ -3622,14 +2925,9 @@
           <w:numId w:val="13"/>
         </w:numPr>
       </w:pPr>
-      <w:proofErr w:type="gramStart"/>
       <w:r>
         <w:lastRenderedPageBreak/>
-        <w:t>les</w:t>
-      </w:r>
-      <w:proofErr w:type="gramEnd"/>
-      <w:r>
-        <w:t xml:space="preserve"> périodes de limitations environnementales (bruit, chauves-souris, ombrage, etc.), </w:t>
+        <w:t xml:space="preserve">les périodes de limitations environnementales (bruit, chauves-souris, ombrage, etc.), </w:t>
       </w:r>
     </w:p>
     <w:p>
@@ -3640,13 +2938,8 @@
           <w:numId w:val="13"/>
         </w:numPr>
       </w:pPr>
-      <w:proofErr w:type="gramStart"/>
-      <w:r>
-        <w:t>les</w:t>
-      </w:r>
-      <w:proofErr w:type="gramEnd"/>
-      <w:r>
-        <w:t xml:space="preserve"> phases de démarrage et d’arrêt, </w:t>
+      <w:r>
+        <w:t xml:space="preserve">les phases de démarrage et d’arrêt, </w:t>
       </w:r>
     </w:p>
     <w:p>
@@ -3657,13 +2950,8 @@
           <w:numId w:val="13"/>
         </w:numPr>
       </w:pPr>
-      <w:proofErr w:type="gramStart"/>
-      <w:r>
-        <w:t>les</w:t>
-      </w:r>
-      <w:proofErr w:type="gramEnd"/>
-      <w:r>
-        <w:t xml:space="preserve"> situations transitoires ou non représentatives du fonctionnement normal. </w:t>
+      <w:r>
+        <w:t xml:space="preserve">les situations transitoires ou non représentatives du fonctionnement normal. </w:t>
       </w:r>
     </w:p>
     <w:p>
@@ -3719,21 +3007,7 @@
         <w:rPr>
           <w:lang w:val="en-US"/>
         </w:rPr>
-        <w:t>[</w:t>
-      </w:r>
-      <w:proofErr w:type="gramStart"/>
-      <w:r>
-        <w:rPr>
-          <w:lang w:val="en-US"/>
-        </w:rPr>
-        <w:t>TABLE:TIP</w:t>
-      </w:r>
-      <w:proofErr w:type="gramEnd"/>
-      <w:r>
-        <w:rPr>
-          <w:lang w:val="en-US"/>
-        </w:rPr>
-        <w:t>_SPEED_RATIO_TABLE]</w:t>
+        <w:t>[TABLE:TIP_SPEED_RATIO_TABLE]</w:t>
       </w:r>
     </w:p>
     <w:p>
@@ -3775,11 +3049,9 @@
         </w:rPr>
         <w:t>{{</w:t>
       </w:r>
-      <w:proofErr w:type="spellStart"/>
       <w:r>
         <w:t>rpm_chart</w:t>
       </w:r>
-      <w:proofErr w:type="spellEnd"/>
       <w:r>
         <w:rPr>
           <w:lang w:val="en-US"/>
@@ -3891,27 +3163,13 @@
         <w:rPr>
           <w:lang w:val="en-US"/>
         </w:rPr>
-        <w:t>[</w:t>
-      </w:r>
-      <w:proofErr w:type="gramStart"/>
-      <w:r>
-        <w:rPr>
-          <w:lang w:val="en-US"/>
-        </w:rPr>
-        <w:t>T</w:t>
-      </w:r>
-      <w:r>
-        <w:rPr>
-          <w:lang w:val="en-US"/>
-        </w:rPr>
-        <w:t>ABLE:PITCH</w:t>
-      </w:r>
-      <w:proofErr w:type="gramEnd"/>
-      <w:r>
-        <w:rPr>
-          <w:lang w:val="en-US"/>
-        </w:rPr>
-        <w:t>_TABLE</w:t>
+        <w:t>[T</w:t>
+      </w:r>
+      <w:r>
+        <w:rPr>
+          <w:lang w:val="en-US"/>
+        </w:rPr>
+        <w:t>ABLE:PITCH_TABLE</w:t>
       </w:r>
       <w:r>
         <w:rPr>
@@ -3939,14 +3197,12 @@
         </w:rPr>
         <w:t>{{</w:t>
       </w:r>
-      <w:proofErr w:type="spellStart"/>
       <w:r>
         <w:rPr>
           <w:lang w:val="en-US"/>
         </w:rPr>
         <w:t>pitch_chart</w:t>
       </w:r>
-      <w:proofErr w:type="spellEnd"/>
       <w:r>
         <w:rPr>
           <w:lang w:val="en-US"/>
@@ -3983,26 +3239,16 @@
       </w:r>
       <w:r>
         <w:lastRenderedPageBreak/>
-        <w:t xml:space="preserve">d'identifier des situations de </w:t>
-      </w:r>
-      <w:proofErr w:type="spellStart"/>
-      <w:r>
-        <w:t>curtailment</w:t>
-      </w:r>
-      <w:proofErr w:type="spellEnd"/>
-      <w:r>
-        <w:t xml:space="preserve"> inattendu, visibles à travers des regroupements de points (clusters) s'écartant de la courbe de puissance nominale attendue. L'analyse repose sur la représentation de la puissance active en fonction de la vitesse du vent sous forme de nuages de points. Les figures ci-après présentent les nuages de points pour chaque éolienne. </w:t>
+        <w:t xml:space="preserve">d'identifier des situations de curtailment inattendu, visibles à travers des regroupements de points (clusters) s'écartant de la courbe de puissance nominale attendue. L'analyse repose sur la représentation de la puissance active en fonction de la vitesse du vent sous forme de nuages de points. Les figures ci-après présentent les nuages de points pour chaque éolienne. </w:t>
       </w:r>
       <w:r>
         <w:t xml:space="preserve">Les figures illustres des classes de fonctionnements pour la puissance, l’orientation des pales et la rotation par </w:t>
       </w:r>
-      <w:proofErr w:type="spellStart"/>
-      <w:r>
-        <w:t>mimutes</w:t>
-      </w:r>
-      <w:proofErr w:type="spellEnd"/>
-      <w:r>
-        <w:t xml:space="preserve"> :  </w:t>
+      <w:r>
+        <w:t>minute</w:t>
+      </w:r>
+      <w:r>
+        <w:t xml:space="preserve">:  </w:t>
       </w:r>
     </w:p>
     <w:p>
@@ -4014,23 +3260,7 @@
         </w:numPr>
       </w:pPr>
       <w:r>
-        <w:t>Stop (</w:t>
-      </w:r>
-      <w:proofErr w:type="spellStart"/>
-      <w:r>
-        <w:t>low</w:t>
-      </w:r>
-      <w:proofErr w:type="spellEnd"/>
-      <w:r>
-        <w:t xml:space="preserve"> </w:t>
-      </w:r>
-      <w:proofErr w:type="spellStart"/>
-      <w:r>
-        <w:t>wind</w:t>
-      </w:r>
-      <w:proofErr w:type="spellEnd"/>
-      <w:r>
-        <w:t>)</w:t>
+        <w:t>Stop (low wind)</w:t>
       </w:r>
     </w:p>
     <w:p>
@@ -4078,15 +3308,7 @@
         </w:numPr>
       </w:pPr>
       <w:r>
-        <w:t xml:space="preserve">Stop (high </w:t>
-      </w:r>
-      <w:proofErr w:type="spellStart"/>
-      <w:r>
-        <w:t>wind</w:t>
-      </w:r>
-      <w:proofErr w:type="spellEnd"/>
-      <w:r>
-        <w:t>)</w:t>
+        <w:t>Stop (high wind)</w:t>
       </w:r>
     </w:p>
     <w:p>
@@ -4097,13 +3319,8 @@
           <w:numId w:val="16"/>
         </w:numPr>
       </w:pPr>
-      <w:proofErr w:type="spellStart"/>
-      <w:r>
-        <w:t>Outlier</w:t>
-      </w:r>
-      <w:proofErr w:type="spellEnd"/>
-      <w:r>
-        <w:t xml:space="preserve"> (anomalies)</w:t>
+      <w:r>
+        <w:t>Outlier (anomalies)</w:t>
       </w:r>
     </w:p>
     <w:p/>
@@ -4111,11 +3328,9 @@
       <w:r>
         <w:t>{{</w:t>
       </w:r>
-      <w:proofErr w:type="spellStart"/>
       <w:r>
         <w:t>performance_level_chart</w:t>
       </w:r>
-      <w:proofErr w:type="spellEnd"/>
       <w:r>
         <w:t>}}</w:t>
       </w:r>
@@ -4174,15 +3389,7 @@
         <w:pStyle w:val="Titre2"/>
       </w:pPr>
       <w:r>
-        <w:t xml:space="preserve">Disponibilité temporelle (Time-Based </w:t>
-      </w:r>
-      <w:proofErr w:type="spellStart"/>
-      <w:r>
-        <w:t>Availability</w:t>
-      </w:r>
-      <w:proofErr w:type="spellEnd"/>
-      <w:r>
-        <w:t xml:space="preserve"> – TBA)</w:t>
+        <w:t>Disponibilité temporelle (Time-Based Availability – TBA)</w:t>
       </w:r>
     </w:p>
     <w:p>

</xml_diff>

<commit_message>
[CHANGE] take the code to handle the different aspect of the projects
</commit_message>
<xml_diff>
--- a/assets/templates/template_scada.docx
+++ b/assets/templates/template_scada.docx
@@ -315,17 +315,8 @@
                 <w:b/>
                 <w:bCs/>
               </w:rPr>
-              <w:t xml:space="preserve">Date </w:t>
+              <w:t>Date d’émission</w:t>
             </w:r>
-            <w:proofErr w:type="spellStart"/>
-            <w:r>
-              <w:rPr>
-                <w:b/>
-                <w:bCs/>
-              </w:rPr>
-              <w:t>d’émission</w:t>
-            </w:r>
-            <w:proofErr w:type="spellEnd"/>
           </w:p>
         </w:tc>
         <w:tc>
@@ -361,7 +352,6 @@
                 <w:bCs/>
               </w:rPr>
             </w:pPr>
-            <w:proofErr w:type="spellStart"/>
             <w:r>
               <w:rPr>
                 <w:b/>
@@ -369,7 +359,6 @@
               </w:rPr>
               <w:t>Rédacteur</w:t>
             </w:r>
-            <w:proofErr w:type="spellEnd"/>
           </w:p>
         </w:tc>
         <w:tc>
@@ -384,7 +373,6 @@
                 <w:bCs/>
               </w:rPr>
             </w:pPr>
-            <w:proofErr w:type="spellStart"/>
             <w:r>
               <w:rPr>
                 <w:b/>
@@ -392,7 +380,6 @@
               </w:rPr>
               <w:t>Vérificateur</w:t>
             </w:r>
-            <w:proofErr w:type="spellEnd"/>
           </w:p>
         </w:tc>
         <w:tc>
@@ -407,7 +394,6 @@
                 <w:bCs/>
               </w:rPr>
             </w:pPr>
-            <w:proofErr w:type="spellStart"/>
             <w:r>
               <w:rPr>
                 <w:b/>
@@ -415,7 +401,6 @@
               </w:rPr>
               <w:t>Approbateur</w:t>
             </w:r>
-            <w:proofErr w:type="spellEnd"/>
           </w:p>
         </w:tc>
       </w:tr>
@@ -989,11 +974,9 @@
         <w:lastRenderedPageBreak/>
         <w:t>Nom du parc : {{</w:t>
       </w:r>
-      <w:proofErr w:type="spellStart"/>
       <w:r>
         <w:t>park_name</w:t>
       </w:r>
-      <w:proofErr w:type="spellEnd"/>
       <w:r>
         <w:t xml:space="preserve">}} </w:t>
       </w:r>
@@ -1002,161 +985,263 @@
       <w:r>
         <w:t>Type d’éoliennes : {{</w:t>
       </w:r>
-      <w:proofErr w:type="spellStart"/>
       <w:r>
         <w:t>model_wtg</w:t>
       </w:r>
-      <w:proofErr w:type="spellEnd"/>
       <w:r>
         <w:t xml:space="preserve">}} </w:t>
       </w:r>
     </w:p>
     <w:p>
       <w:r>
-        <w:t>Nombre d’éoliennes : {{</w:t>
-      </w:r>
-      <w:proofErr w:type="spellStart"/>
-      <w:r>
-        <w:t>N</w:t>
+        <w:t>Nombre d’éoliennes : {{N</w:t>
       </w:r>
       <w:r>
         <w:t>ombre</w:t>
       </w:r>
       <w:r>
-        <w:t>_WTG</w:t>
-      </w:r>
-      <w:proofErr w:type="spellEnd"/>
+        <w:t xml:space="preserve">_WTG}} </w:t>
+      </w:r>
+    </w:p>
+    <w:p>
+      <w:r>
+        <w:t>Puissance totale installée : {{</w:t>
+      </w:r>
+      <w:r>
+        <w:t>nominal_power</w:t>
+      </w:r>
       <w:r>
         <w:t xml:space="preserve">}} </w:t>
       </w:r>
     </w:p>
     <w:p>
       <w:r>
-        <w:t>Puissance totale installée : {{</w:t>
-      </w:r>
-      <w:proofErr w:type="spellStart"/>
+        <w:t xml:space="preserve">Localisation : {{LOCALISATION}} </w:t>
+      </w:r>
+    </w:p>
+    <w:p>
+      <w:r>
+        <w:t>Client : {{CLIENT}}</w:t>
+      </w:r>
+    </w:p>
+    <w:p>
+      <w:r>
+        <w:t xml:space="preserve">Contact : {{CONTACT_CLIENT}} </w:t>
+      </w:r>
+    </w:p>
+    <w:p>
+      <w:r>
+        <w:t xml:space="preserve">Constructeur / Exploitant : {{CONTRACTOR}} </w:t>
+      </w:r>
+    </w:p>
+    <w:p/>
+    <w:p>
+      <w:r>
+        <w:t>Rédacteur</w:t>
+      </w:r>
+    </w:p>
+    <w:p>
+      <w:r>
+        <w:t>{{AUTEUR}}</w:t>
+      </w:r>
+    </w:p>
+    <w:p>
+      <w:r>
+        <w:t>Email : {{MAIL_AUTEUR}}</w:t>
+      </w:r>
+    </w:p>
+    <w:p>
+      <w:r>
+        <w:t>Téléphone : {{TEL_AUTEUR}}</w:t>
+      </w:r>
+    </w:p>
+    <w:p/>
+    <w:p>
+      <w:r>
+        <w:t>Vérificateur</w:t>
+      </w:r>
+    </w:p>
+    <w:p>
+      <w:r>
+        <w:t>{{VERIFICATEUR}}</w:t>
+      </w:r>
+    </w:p>
+    <w:p>
+      <w:r>
+        <w:t>Email : {{MAIL_VERIFICATEUR}}</w:t>
+      </w:r>
+    </w:p>
+    <w:p>
+      <w:r>
+        <w:t>Téléphone : {{TEL_VERIFICATEUR}}</w:t>
+      </w:r>
+    </w:p>
+    <w:p/>
+    <w:p>
+      <w:r>
+        <w:t>Approbateur</w:t>
+      </w:r>
+    </w:p>
+    <w:p>
+      <w:r>
+        <w:t>{{APPROBATEUR}}</w:t>
+      </w:r>
+    </w:p>
+    <w:p>
+      <w:r>
+        <w:t>Email : {{MAIL_APPROBATEUR}}</w:t>
+      </w:r>
+    </w:p>
+    <w:p>
+      <w:r>
+        <w:t>Téléphone : {{TEL_APPROBATEUR}}</w:t>
+      </w:r>
+    </w:p>
+    <w:p/>
+    <w:p>
+      <w:pPr>
+        <w:spacing w:after="160" w:line="259" w:lineRule="auto"/>
+      </w:pPr>
+      <w:r>
+        <w:br w:type="page"/>
+      </w:r>
+    </w:p>
+    <w:p/>
+    <w:p>
+      <w:pPr>
+        <w:pStyle w:val="Titre1"/>
+      </w:pPr>
+      <w:r>
+        <w:t>Synthèse</w:t>
+      </w:r>
+    </w:p>
+    <w:p>
+      <w:pPr>
+        <w:jc w:val="both"/>
+      </w:pPr>
+      <w:r>
+        <w:t xml:space="preserve">Les données SCADA du parc éolien </w:t>
+      </w:r>
+      <w:r>
+        <w:t>{{park_name}}</w:t>
+      </w:r>
+      <w:r>
+        <w:t xml:space="preserve"> ont été analysées sur la période du </w:t>
+      </w:r>
+      <w:r>
+        <w:t>{{analysis_start}}</w:t>
+      </w:r>
+      <w:r>
+        <w:t xml:space="preserve"> au </w:t>
+      </w:r>
+      <w:r>
+        <w:t>{{analysis_end}}</w:t>
+      </w:r>
+      <w:r>
+        <w:t xml:space="preserve">, à partir des informations fournies par le client. Le parc est composé de </w:t>
+      </w:r>
+      <w:r>
+        <w:t>{{turbine_count}}</w:t>
+      </w:r>
+      <w:r>
+        <w:t xml:space="preserve"> éoliennes de type</w:t>
+      </w:r>
+      <w:r>
+        <w:t xml:space="preserve"> </w:t>
+      </w:r>
+      <w:r>
+        <w:t>{{model_wtg}</w:t>
+      </w:r>
+      <w:r>
+        <w:t>}</w:t>
+      </w:r>
+      <w:r>
+        <w:t xml:space="preserve">, désignées </w:t>
+      </w:r>
+      <w:r>
+        <w:t>{{turbine_list}}</w:t>
+      </w:r>
+      <w:r>
+        <w:t xml:space="preserve"> L’ensemble des turbines a été pris en compte dans l’analyse.</w:t>
+      </w:r>
+    </w:p>
+    <w:p>
+      <w:pPr>
+        <w:jc w:val="both"/>
+      </w:pPr>
+    </w:p>
+    <w:p>
+      <w:pPr>
+        <w:jc w:val="both"/>
+      </w:pPr>
+      <w:r>
+        <w:t>Le tableau ci-après présente une évaluation synthétique des performances du parc, en mettant en évidence, pour chaque indicateur, le niveau de performance de chaque éolienne ainsi que les éventuels écarts observés.</w:t>
+      </w:r>
+    </w:p>
+    <w:p/>
+    <w:p>
+      <w:r>
+        <w:t>[T</w:t>
+      </w:r>
+      <w:r>
+        <w:t>ODO</w:t>
+      </w:r>
+      <w:r>
+        <w:t>:SCADA_SUMMARY_TABLE]</w:t>
+      </w:r>
+    </w:p>
+    <w:p>
+      <w:pPr>
+        <w:pStyle w:val="Titre1"/>
+      </w:pPr>
+      <w:r>
+        <w:t>Contexte de l’étude</w:t>
+      </w:r>
+    </w:p>
+    <w:p>
+      <w:pPr>
+        <w:pStyle w:val="Titre2"/>
+      </w:pPr>
+      <w:r>
+        <w:t>Présentation générale du parc</w:t>
+      </w:r>
+    </w:p>
+    <w:p>
+      <w:pPr>
+        <w:jc w:val="both"/>
+      </w:pPr>
+      <w:r>
+        <w:t>Le parc éolien {{</w:t>
+      </w:r>
+      <w:r>
+        <w:t>park_name</w:t>
+      </w:r>
+      <w:r>
+        <w:t>}} est situé sur le territoire des communes de {{COMMUNES}}, dans la région de {{REGION}}. Il est composé de {{</w:t>
+      </w:r>
+      <w:r>
+        <w:t>turbine_count</w:t>
+      </w:r>
+      <w:r>
+        <w:t>}} éoliennes de type {{</w:t>
+      </w:r>
+      <w:r>
+        <w:t>model_wtg</w:t>
+      </w:r>
+      <w:r>
+        <w:t>}}, d’une puissance nominale unitaire de {{</w:t>
+      </w:r>
       <w:r>
         <w:t>nominal_power</w:t>
       </w:r>
-      <w:proofErr w:type="spellEnd"/>
-      <w:r>
-        <w:t xml:space="preserve">}} </w:t>
-      </w:r>
-    </w:p>
-    <w:p>
-      <w:r>
-        <w:t xml:space="preserve">Localisation : {{LOCALISATION}} </w:t>
-      </w:r>
-    </w:p>
-    <w:p>
-      <w:r>
-        <w:t>Client : {{CLIENT}}</w:t>
-      </w:r>
-    </w:p>
-    <w:p>
-      <w:r>
-        <w:t xml:space="preserve">Contact : {{CONTACT_CLIENT}} </w:t>
-      </w:r>
-    </w:p>
-    <w:p>
-      <w:r>
-        <w:t xml:space="preserve">Constructeur / Exploitant : {{CONTRACTOR}} </w:t>
-      </w:r>
-    </w:p>
-    <w:p/>
-    <w:p>
-      <w:r>
-        <w:t>Rédacteur</w:t>
-      </w:r>
-    </w:p>
-    <w:p>
-      <w:r>
-        <w:t>{{AUTEUR}}</w:t>
-      </w:r>
-    </w:p>
-    <w:p>
-      <w:proofErr w:type="gramStart"/>
-      <w:r>
-        <w:t>Email</w:t>
-      </w:r>
-      <w:proofErr w:type="gramEnd"/>
-      <w:r>
-        <w:t xml:space="preserve"> : {{MAIL_AUTEUR}}</w:t>
-      </w:r>
-    </w:p>
-    <w:p>
-      <w:r>
-        <w:t>Téléphone : {{TEL_AUTEUR}}</w:t>
-      </w:r>
-    </w:p>
-    <w:p/>
-    <w:p>
-      <w:r>
-        <w:t>Vérificateur</w:t>
-      </w:r>
-    </w:p>
-    <w:p>
-      <w:r>
-        <w:t>{{VERIFICATEUR}}</w:t>
-      </w:r>
-    </w:p>
-    <w:p>
-      <w:proofErr w:type="gramStart"/>
-      <w:r>
-        <w:t>Email</w:t>
-      </w:r>
-      <w:proofErr w:type="gramEnd"/>
-      <w:r>
-        <w:t xml:space="preserve"> : {{MAIL_VERIFICATEUR}}</w:t>
-      </w:r>
-    </w:p>
-    <w:p>
-      <w:r>
-        <w:t>Téléphone : {{TEL_VERIFICATEUR}}</w:t>
-      </w:r>
-    </w:p>
-    <w:p/>
-    <w:p>
-      <w:r>
-        <w:t>Approbateur</w:t>
-      </w:r>
-    </w:p>
-    <w:p>
-      <w:r>
-        <w:t>{{APPROBATEUR}}</w:t>
-      </w:r>
-    </w:p>
-    <w:p>
-      <w:proofErr w:type="gramStart"/>
-      <w:r>
-        <w:t>Email</w:t>
-      </w:r>
-      <w:proofErr w:type="gramEnd"/>
-      <w:r>
-        <w:t xml:space="preserve"> : {{MAIL_APPROBATEUR}}</w:t>
-      </w:r>
-    </w:p>
-    <w:p>
-      <w:r>
-        <w:t>Téléphone : {{TEL_APPROBATEUR}}</w:t>
-      </w:r>
-    </w:p>
-    <w:p/>
-    <w:p>
-      <w:pPr>
-        <w:spacing w:after="160" w:line="259" w:lineRule="auto"/>
-      </w:pPr>
-      <w:r>
-        <w:br w:type="page"/>
-      </w:r>
-    </w:p>
-    <w:p/>
-    <w:p>
-      <w:pPr>
-        <w:pStyle w:val="Titre1"/>
-      </w:pPr>
-      <w:r>
-        <w:t>Synthèse</w:t>
+      <w:r>
+        <w:t>}}, soit une puissance totale installée de {{</w:t>
+      </w:r>
+      <w:r>
+        <w:t xml:space="preserve">total_power </w:t>
+      </w:r>
+      <w:r>
+        <w:t>}}.</w:t>
       </w:r>
     </w:p>
     <w:p>
@@ -1164,303 +1249,71 @@
         <w:jc w:val="both"/>
       </w:pPr>
       <w:r>
-        <w:t xml:space="preserve">Les données SCADA du parc éolien </w:t>
-      </w:r>
-      <w:r>
-        <w:t>{{</w:t>
-      </w:r>
-      <w:proofErr w:type="spellStart"/>
-      <w:r>
-        <w:t>park_name</w:t>
-      </w:r>
-      <w:proofErr w:type="spellEnd"/>
-      <w:r>
-        <w:t>}}</w:t>
-      </w:r>
-      <w:r>
-        <w:t xml:space="preserve"> ont été analysées sur la période du </w:t>
-      </w:r>
-      <w:r>
-        <w:t>{{</w:t>
-      </w:r>
-      <w:proofErr w:type="spellStart"/>
-      <w:r>
-        <w:t>analysis_start</w:t>
-      </w:r>
-      <w:proofErr w:type="spellEnd"/>
-      <w:r>
-        <w:t>}}</w:t>
-      </w:r>
-      <w:r>
-        <w:t xml:space="preserve"> au </w:t>
-      </w:r>
-      <w:r>
-        <w:t>{{</w:t>
-      </w:r>
-      <w:proofErr w:type="spellStart"/>
-      <w:r>
-        <w:t>analysis_end</w:t>
-      </w:r>
-      <w:proofErr w:type="spellEnd"/>
-      <w:r>
-        <w:t>}}</w:t>
-      </w:r>
-      <w:r>
-        <w:t xml:space="preserve">, à partir des informations fournies par le client. Le parc est composé de </w:t>
-      </w:r>
-      <w:r>
-        <w:t>{{</w:t>
-      </w:r>
-      <w:proofErr w:type="spellStart"/>
-      <w:r>
-        <w:t>turbine_count</w:t>
-      </w:r>
-      <w:proofErr w:type="spellEnd"/>
-      <w:r>
-        <w:t>}}</w:t>
-      </w:r>
-      <w:r>
-        <w:t xml:space="preserve"> éoliennes de type</w:t>
-      </w:r>
+        <w:t>Les éoliennes du parc sont identifiées comme suit : {{</w:t>
+      </w:r>
+      <w:r>
+        <w:t>turbine_list</w:t>
+      </w:r>
+      <w:r>
+        <w:t>}}. L’implantation du parc et la disposition des éoliennes sont présen tées dans la figure ci-</w:t>
+      </w:r>
+      <w:r>
+        <w:t>après :</w:t>
+      </w:r>
+    </w:p>
+    <w:p>
+      <w:pPr>
+        <w:jc w:val="both"/>
+      </w:pPr>
+      <w:r>
+        <w:t>[TODO.IMAGE_POSITION]</w:t>
+      </w:r>
+    </w:p>
+    <w:p>
       <w:r>
         <w:t xml:space="preserve"> </w:t>
       </w:r>
-      <w:r>
-        <w:t>{{</w:t>
-      </w:r>
-      <w:proofErr w:type="spellStart"/>
-      <w:r>
-        <w:t>model_wtg</w:t>
-      </w:r>
-      <w:proofErr w:type="spellEnd"/>
-      <w:r>
-        <w:t>}</w:t>
-      </w:r>
-      <w:r>
-        <w:t>}</w:t>
-      </w:r>
-      <w:r>
-        <w:t xml:space="preserve">, désignées </w:t>
-      </w:r>
-      <w:r>
-        <w:t>{{</w:t>
-      </w:r>
-      <w:proofErr w:type="spellStart"/>
-      <w:r>
-        <w:t>turbine_list</w:t>
-      </w:r>
-      <w:proofErr w:type="spellEnd"/>
-      <w:r>
-        <w:t>}}</w:t>
-      </w:r>
-      <w:r>
-        <w:t xml:space="preserve"> L’ensemble des turbines a été pris en compte dans l’analyse.</w:t>
-      </w:r>
-    </w:p>
-    <w:p>
-      <w:pPr>
-        <w:jc w:val="both"/>
-      </w:pPr>
-    </w:p>
-    <w:p>
-      <w:pPr>
-        <w:jc w:val="both"/>
-      </w:pPr>
-      <w:r>
-        <w:t>Le tableau ci-après présente une évaluation synthétique des performances du parc, en mettant en évidence, pour chaque indicateur, le niveau de performance de chaque éolienne ainsi que les éventuels écarts observés.</w:t>
-      </w:r>
-    </w:p>
-    <w:p/>
-    <w:p>
-      <w:r>
-        <w:t>[</w:t>
-      </w:r>
-      <w:proofErr w:type="gramStart"/>
-      <w:r>
-        <w:t>T</w:t>
+    </w:p>
+    <w:p>
+      <w:pPr>
+        <w:pStyle w:val="Titre2"/>
+      </w:pPr>
+      <w:r>
+        <w:t>Coordonnées des éoliennes</w:t>
+      </w:r>
+    </w:p>
+    <w:p>
+      <w:r>
+        <w:t>Les coordonnées géographiques des éoliennes du parc sont présentées dans le tableau ci-dessous :</w:t>
+      </w:r>
+    </w:p>
+    <w:p>
+      <w:r>
+        <w:t>[TODO.TABLEAU COORDONNE GPS]</w:t>
+      </w:r>
+    </w:p>
+    <w:p>
+      <w:pPr>
+        <w:pStyle w:val="Titre2"/>
+      </w:pPr>
+      <w:r>
+        <w:t>Données fournies par le client</w:t>
+      </w:r>
+    </w:p>
+    <w:p>
+      <w:r>
+        <w:t>Dans le cadre de cette étude, plusieurs jeux de données ont été transmis par le client afin de permettre l’analyse des performances du parc éolien.</w:t>
+      </w:r>
+    </w:p>
+    <w:p>
+      <w:r>
+        <w:t>[T</w:t>
       </w:r>
       <w:r>
         <w:t>ODO</w:t>
       </w:r>
       <w:r>
-        <w:t>:SCADA</w:t>
-      </w:r>
-      <w:proofErr w:type="gramEnd"/>
-      <w:r>
-        <w:t>_SUMMARY_TABLE]</w:t>
-      </w:r>
-    </w:p>
-    <w:p>
-      <w:pPr>
-        <w:pStyle w:val="Titre1"/>
-      </w:pPr>
-      <w:r>
-        <w:t>Contexte de l’étude</w:t>
-      </w:r>
-    </w:p>
-    <w:p>
-      <w:pPr>
-        <w:pStyle w:val="Titre2"/>
-      </w:pPr>
-      <w:r>
-        <w:t>Présentation générale du parc</w:t>
-      </w:r>
-    </w:p>
-    <w:p>
-      <w:pPr>
-        <w:jc w:val="both"/>
-      </w:pPr>
-      <w:r>
-        <w:t>Le parc éolien {{</w:t>
-      </w:r>
-      <w:proofErr w:type="spellStart"/>
-      <w:r>
-        <w:t>park_name</w:t>
-      </w:r>
-      <w:proofErr w:type="spellEnd"/>
-      <w:r>
-        <w:t>}} est situé sur le territoire des communes de {{COMMUNES}}, dans la région de {{REGION}}. Il est composé de {{</w:t>
-      </w:r>
-      <w:proofErr w:type="spellStart"/>
-      <w:r>
-        <w:t>turbine_count</w:t>
-      </w:r>
-      <w:proofErr w:type="spellEnd"/>
-      <w:r>
-        <w:t>}} éoliennes de type {{</w:t>
-      </w:r>
-      <w:proofErr w:type="spellStart"/>
-      <w:r>
-        <w:t>model_wtg</w:t>
-      </w:r>
-      <w:proofErr w:type="spellEnd"/>
-      <w:r>
-        <w:t>}}, d’une puissance nominale unitaire de {{</w:t>
-      </w:r>
-      <w:proofErr w:type="spellStart"/>
-      <w:r>
-        <w:t>nominal_power</w:t>
-      </w:r>
-      <w:proofErr w:type="spellEnd"/>
-      <w:r>
-        <w:t>}}, soit une puissance totale installée de {{</w:t>
-      </w:r>
-      <w:proofErr w:type="spellStart"/>
-      <w:r>
-        <w:t>total_</w:t>
-      </w:r>
-      <w:proofErr w:type="gramStart"/>
-      <w:r>
-        <w:t>power</w:t>
-      </w:r>
-      <w:proofErr w:type="spellEnd"/>
-      <w:r>
-        <w:t xml:space="preserve"> </w:t>
-      </w:r>
-      <w:r>
-        <w:t>}</w:t>
-      </w:r>
-      <w:proofErr w:type="gramEnd"/>
-      <w:r>
-        <w:t>}.</w:t>
-      </w:r>
-    </w:p>
-    <w:p>
-      <w:pPr>
-        <w:jc w:val="both"/>
-      </w:pPr>
-      <w:r>
-        <w:t>Les éoliennes du parc sont identifiées comme suit : {{</w:t>
-      </w:r>
-      <w:proofErr w:type="spellStart"/>
-      <w:r>
-        <w:t>turbine_list</w:t>
-      </w:r>
-      <w:proofErr w:type="spellEnd"/>
-      <w:r>
-        <w:t xml:space="preserve">}}. L’implantation du parc et la disposition des éoliennes sont </w:t>
-      </w:r>
-      <w:proofErr w:type="spellStart"/>
-      <w:r>
-        <w:t>présen</w:t>
-      </w:r>
-      <w:proofErr w:type="spellEnd"/>
-      <w:r>
-        <w:t xml:space="preserve"> </w:t>
-      </w:r>
-      <w:proofErr w:type="spellStart"/>
-      <w:r>
-        <w:t>tées</w:t>
-      </w:r>
-      <w:proofErr w:type="spellEnd"/>
-      <w:r>
-        <w:t xml:space="preserve"> dans la figure ci-</w:t>
-      </w:r>
-      <w:r>
-        <w:t>après :</w:t>
-      </w:r>
-    </w:p>
-    <w:p>
-      <w:pPr>
-        <w:jc w:val="both"/>
-      </w:pPr>
-      <w:r>
-        <w:t>[TODO.IMAGE_POSITION]</w:t>
-      </w:r>
-    </w:p>
-    <w:p>
-      <w:r>
-        <w:t xml:space="preserve"> </w:t>
-      </w:r>
-    </w:p>
-    <w:p>
-      <w:pPr>
-        <w:pStyle w:val="Titre2"/>
-      </w:pPr>
-      <w:r>
-        <w:t>Coordonnées des éoliennes</w:t>
-      </w:r>
-    </w:p>
-    <w:p>
-      <w:r>
-        <w:t>Les coordonnées géographiques des éoliennes du parc sont présentées dans le tableau ci-dessous :</w:t>
-      </w:r>
-    </w:p>
-    <w:p>
-      <w:r>
-        <w:t>[TODO.TABLEAU COORDONNE GPS]</w:t>
-      </w:r>
-    </w:p>
-    <w:p>
-      <w:pPr>
-        <w:pStyle w:val="Titre2"/>
-      </w:pPr>
-      <w:r>
-        <w:t>Données fournies par le client</w:t>
-      </w:r>
-    </w:p>
-    <w:p>
-      <w:r>
-        <w:t>Dans le cadre de cette étude, plusieurs jeux de données ont été transmis par le client afin de permettre l’analyse des performances du parc éolien.</w:t>
-      </w:r>
-    </w:p>
-    <w:p>
-      <w:r>
-        <w:t>[</w:t>
-      </w:r>
-      <w:proofErr w:type="gramStart"/>
-      <w:r>
-        <w:t>T</w:t>
-      </w:r>
-      <w:r>
-        <w:t>ODO</w:t>
-      </w:r>
-      <w:r>
-        <w:t>:</w:t>
-      </w:r>
-      <w:proofErr w:type="gramEnd"/>
-      <w:r>
-        <w:t>CSV_FILES_TABLE]</w:t>
+        <w:t>:CSV_FILES_TABLE]</w:t>
       </w:r>
     </w:p>
     <w:p>
@@ -1507,7 +1360,6 @@
                 <w:szCs w:val="22"/>
               </w:rPr>
             </w:pPr>
-            <w:proofErr w:type="spellStart"/>
             <w:r>
               <w:rPr>
                 <w:rFonts w:ascii="Cambria" w:eastAsia="MS Mincho" w:hAnsi="Cambria"/>
@@ -1544,7 +1396,6 @@
               </w:rPr>
               <w:t>e</w:t>
             </w:r>
-            <w:proofErr w:type="spellEnd"/>
           </w:p>
         </w:tc>
         <w:tc>
@@ -1568,18 +1419,8 @@
                 <w:sz w:val="22"/>
                 <w:szCs w:val="22"/>
               </w:rPr>
-              <w:t xml:space="preserve">Axes </w:t>
+              <w:t>Axes d’analyse</w:t>
             </w:r>
-            <w:proofErr w:type="spellStart"/>
-            <w:r>
-              <w:rPr>
-                <w:rFonts w:ascii="Cambria" w:eastAsia="MS Mincho" w:hAnsi="Cambria"/>
-                <w:sz w:val="22"/>
-                <w:szCs w:val="22"/>
-              </w:rPr>
-              <w:t>d’analyse</w:t>
-            </w:r>
-            <w:proofErr w:type="spellEnd"/>
           </w:p>
         </w:tc>
       </w:tr>
@@ -1599,23 +1440,13 @@
                 <w:szCs w:val="22"/>
               </w:rPr>
             </w:pPr>
-            <w:proofErr w:type="spellStart"/>
             <w:r>
               <w:rPr>
                 <w:rFonts w:ascii="Cambria" w:eastAsia="MS Mincho" w:hAnsi="Cambria"/>
                 <w:sz w:val="22"/>
                 <w:szCs w:val="22"/>
               </w:rPr>
-              <w:t>Qualité</w:t>
-            </w:r>
-            <w:proofErr w:type="spellEnd"/>
-            <w:r>
-              <w:rPr>
-                <w:rFonts w:ascii="Cambria" w:eastAsia="MS Mincho" w:hAnsi="Cambria"/>
-                <w:sz w:val="22"/>
-                <w:szCs w:val="22"/>
-              </w:rPr>
-              <w:t xml:space="preserve"> des données</w:t>
+              <w:t>Qualité des données</w:t>
             </w:r>
           </w:p>
         </w:tc>
@@ -1699,18 +1530,8 @@
                 <w:sz w:val="22"/>
                 <w:szCs w:val="22"/>
               </w:rPr>
-              <w:t xml:space="preserve">Production et </w:t>
+              <w:t>Production et disponibilité</w:t>
             </w:r>
-            <w:proofErr w:type="spellStart"/>
-            <w:r>
-              <w:rPr>
-                <w:rFonts w:ascii="Cambria" w:eastAsia="MS Mincho" w:hAnsi="Cambria"/>
-                <w:sz w:val="22"/>
-                <w:szCs w:val="22"/>
-              </w:rPr>
-              <w:t>disponibilité</w:t>
-            </w:r>
-            <w:proofErr w:type="spellEnd"/>
           </w:p>
         </w:tc>
         <w:tc>
@@ -1732,52 +1553,14 @@
                 <w:szCs w:val="22"/>
               </w:rPr>
             </w:pPr>
-            <w:proofErr w:type="spellStart"/>
             <w:r>
               <w:rPr>
                 <w:rFonts w:ascii="Cambria" w:eastAsia="MS Mincho" w:hAnsi="Cambria"/>
                 <w:sz w:val="22"/>
                 <w:szCs w:val="22"/>
               </w:rPr>
-              <w:t>Calcul</w:t>
+              <w:t>Calcul de la disponibilité énergétique</w:t>
             </w:r>
-            <w:proofErr w:type="spellEnd"/>
-            <w:r>
-              <w:rPr>
-                <w:rFonts w:ascii="Cambria" w:eastAsia="MS Mincho" w:hAnsi="Cambria"/>
-                <w:sz w:val="22"/>
-                <w:szCs w:val="22"/>
-              </w:rPr>
-              <w:t xml:space="preserve"> de la </w:t>
-            </w:r>
-            <w:proofErr w:type="spellStart"/>
-            <w:r>
-              <w:rPr>
-                <w:rFonts w:ascii="Cambria" w:eastAsia="MS Mincho" w:hAnsi="Cambria"/>
-                <w:sz w:val="22"/>
-                <w:szCs w:val="22"/>
-              </w:rPr>
-              <w:t>disponibilité</w:t>
-            </w:r>
-            <w:proofErr w:type="spellEnd"/>
-            <w:r>
-              <w:rPr>
-                <w:rFonts w:ascii="Cambria" w:eastAsia="MS Mincho" w:hAnsi="Cambria"/>
-                <w:sz w:val="22"/>
-                <w:szCs w:val="22"/>
-              </w:rPr>
-              <w:t xml:space="preserve"> </w:t>
-            </w:r>
-            <w:proofErr w:type="spellStart"/>
-            <w:r>
-              <w:rPr>
-                <w:rFonts w:ascii="Cambria" w:eastAsia="MS Mincho" w:hAnsi="Cambria"/>
-                <w:sz w:val="22"/>
-                <w:szCs w:val="22"/>
-              </w:rPr>
-              <w:t>énergétique</w:t>
-            </w:r>
-            <w:proofErr w:type="spellEnd"/>
           </w:p>
           <w:p>
             <w:pPr>
@@ -1794,52 +1577,14 @@
                 <w:szCs w:val="22"/>
               </w:rPr>
             </w:pPr>
-            <w:proofErr w:type="spellStart"/>
             <w:r>
               <w:rPr>
                 <w:rFonts w:ascii="Cambria" w:eastAsia="MS Mincho" w:hAnsi="Cambria"/>
                 <w:sz w:val="22"/>
                 <w:szCs w:val="22"/>
               </w:rPr>
-              <w:t>Calcul</w:t>
+              <w:t>Calcul de la disponibilité temporelle</w:t>
             </w:r>
-            <w:proofErr w:type="spellEnd"/>
-            <w:r>
-              <w:rPr>
-                <w:rFonts w:ascii="Cambria" w:eastAsia="MS Mincho" w:hAnsi="Cambria"/>
-                <w:sz w:val="22"/>
-                <w:szCs w:val="22"/>
-              </w:rPr>
-              <w:t xml:space="preserve"> de la </w:t>
-            </w:r>
-            <w:proofErr w:type="spellStart"/>
-            <w:r>
-              <w:rPr>
-                <w:rFonts w:ascii="Cambria" w:eastAsia="MS Mincho" w:hAnsi="Cambria"/>
-                <w:sz w:val="22"/>
-                <w:szCs w:val="22"/>
-              </w:rPr>
-              <w:t>disponibilité</w:t>
-            </w:r>
-            <w:proofErr w:type="spellEnd"/>
-            <w:r>
-              <w:rPr>
-                <w:rFonts w:ascii="Cambria" w:eastAsia="MS Mincho" w:hAnsi="Cambria"/>
-                <w:sz w:val="22"/>
-                <w:szCs w:val="22"/>
-              </w:rPr>
-              <w:t xml:space="preserve"> </w:t>
-            </w:r>
-            <w:proofErr w:type="spellStart"/>
-            <w:r>
-              <w:rPr>
-                <w:rFonts w:ascii="Cambria" w:eastAsia="MS Mincho" w:hAnsi="Cambria"/>
-                <w:sz w:val="22"/>
-                <w:szCs w:val="22"/>
-              </w:rPr>
-              <w:t>temporelle</w:t>
-            </w:r>
-            <w:proofErr w:type="spellEnd"/>
           </w:p>
           <w:p>
             <w:pPr>
@@ -1911,41 +1656,13 @@
                 <w:szCs w:val="22"/>
               </w:rPr>
             </w:pPr>
-            <w:proofErr w:type="spellStart"/>
             <w:r>
               <w:rPr>
                 <w:rFonts w:ascii="Cambria" w:eastAsia="MS Mincho" w:hAnsi="Cambria"/>
                 <w:sz w:val="22"/>
                 <w:szCs w:val="22"/>
               </w:rPr>
-              <w:t>Bridages</w:t>
-            </w:r>
-            <w:proofErr w:type="spellEnd"/>
-            <w:r>
-              <w:rPr>
-                <w:rFonts w:ascii="Cambria" w:eastAsia="MS Mincho" w:hAnsi="Cambria"/>
-                <w:sz w:val="22"/>
-                <w:szCs w:val="22"/>
-              </w:rPr>
-              <w:t xml:space="preserve"> (</w:t>
-            </w:r>
-            <w:proofErr w:type="spellStart"/>
-            <w:r>
-              <w:rPr>
-                <w:rFonts w:ascii="Cambria" w:eastAsia="MS Mincho" w:hAnsi="Cambria"/>
-                <w:sz w:val="22"/>
-                <w:szCs w:val="22"/>
-              </w:rPr>
-              <w:t>si</w:t>
-            </w:r>
-            <w:proofErr w:type="spellEnd"/>
-            <w:r>
-              <w:rPr>
-                <w:rFonts w:ascii="Cambria" w:eastAsia="MS Mincho" w:hAnsi="Cambria"/>
-                <w:sz w:val="22"/>
-                <w:szCs w:val="22"/>
-              </w:rPr>
-              <w:t xml:space="preserve"> applicable)</w:t>
+              <w:t>Bridages (si applicable)</w:t>
             </w:r>
           </w:p>
         </w:tc>
@@ -2055,18 +1772,8 @@
                 <w:sz w:val="22"/>
                 <w:szCs w:val="22"/>
               </w:rPr>
-              <w:t xml:space="preserve">Performance des </w:t>
+              <w:t>Performance des éoliennes</w:t>
             </w:r>
-            <w:proofErr w:type="spellStart"/>
-            <w:r>
-              <w:rPr>
-                <w:rFonts w:ascii="Cambria" w:eastAsia="MS Mincho" w:hAnsi="Cambria"/>
-                <w:sz w:val="22"/>
-                <w:szCs w:val="22"/>
-              </w:rPr>
-              <w:t>éoliennes</w:t>
-            </w:r>
-            <w:proofErr w:type="spellEnd"/>
           </w:p>
         </w:tc>
         <w:tc>
@@ -2116,41 +1823,13 @@
                 <w:szCs w:val="22"/>
               </w:rPr>
             </w:pPr>
-            <w:proofErr w:type="spellStart"/>
             <w:r>
               <w:rPr>
                 <w:rFonts w:ascii="Cambria" w:eastAsia="MS Mincho" w:hAnsi="Cambria"/>
                 <w:sz w:val="22"/>
                 <w:szCs w:val="22"/>
               </w:rPr>
-              <w:t>Analyse</w:t>
-            </w:r>
-            <w:proofErr w:type="spellEnd"/>
-            <w:r>
-              <w:rPr>
-                <w:rFonts w:ascii="Cambria" w:eastAsia="MS Mincho" w:hAnsi="Cambria"/>
-                <w:sz w:val="22"/>
-                <w:szCs w:val="22"/>
-              </w:rPr>
-              <w:t xml:space="preserve"> du </w:t>
-            </w:r>
-            <w:proofErr w:type="spellStart"/>
-            <w:r>
-              <w:rPr>
-                <w:rFonts w:ascii="Cambria" w:eastAsia="MS Mincho" w:hAnsi="Cambria"/>
-                <w:sz w:val="22"/>
-                <w:szCs w:val="22"/>
-              </w:rPr>
-              <w:t>comportement</w:t>
-            </w:r>
-            <w:proofErr w:type="spellEnd"/>
-            <w:r>
-              <w:rPr>
-                <w:rFonts w:ascii="Cambria" w:eastAsia="MS Mincho" w:hAnsi="Cambria"/>
-                <w:sz w:val="22"/>
-                <w:szCs w:val="22"/>
-              </w:rPr>
-              <w:t xml:space="preserve"> du pitch</w:t>
+              <w:t>Analyse du comportement du pitch</w:t>
             </w:r>
           </w:p>
           <w:p>
@@ -2196,23 +1875,13 @@
                 <w:szCs w:val="22"/>
               </w:rPr>
             </w:pPr>
-            <w:proofErr w:type="spellStart"/>
             <w:r>
               <w:rPr>
                 <w:rFonts w:ascii="Cambria" w:eastAsia="MS Mincho" w:hAnsi="Cambria"/>
                 <w:sz w:val="22"/>
                 <w:szCs w:val="22"/>
               </w:rPr>
-              <w:t>Analyse</w:t>
-            </w:r>
-            <w:proofErr w:type="spellEnd"/>
-            <w:r>
-              <w:rPr>
-                <w:rFonts w:ascii="Cambria" w:eastAsia="MS Mincho" w:hAnsi="Cambria"/>
-                <w:sz w:val="22"/>
-                <w:szCs w:val="22"/>
-              </w:rPr>
-              <w:t xml:space="preserve"> inter-turbines</w:t>
+              <w:t>Analyse inter-turbines</w:t>
             </w:r>
           </w:p>
           <w:p>
@@ -2231,41 +1900,13 @@
                 <w:szCs w:val="22"/>
               </w:rPr>
             </w:pPr>
-            <w:proofErr w:type="spellStart"/>
             <w:r>
               <w:rPr>
                 <w:rFonts w:ascii="Cambria" w:eastAsia="MS Mincho" w:hAnsi="Cambria"/>
                 <w:sz w:val="22"/>
                 <w:szCs w:val="22"/>
               </w:rPr>
-              <w:t>Cohérence</w:t>
-            </w:r>
-            <w:proofErr w:type="spellEnd"/>
-            <w:r>
-              <w:rPr>
-                <w:rFonts w:ascii="Cambria" w:eastAsia="MS Mincho" w:hAnsi="Cambria"/>
-                <w:sz w:val="22"/>
-                <w:szCs w:val="22"/>
-              </w:rPr>
-              <w:t xml:space="preserve"> </w:t>
-            </w:r>
-            <w:proofErr w:type="spellStart"/>
-            <w:r>
-              <w:rPr>
-                <w:rFonts w:ascii="Cambria" w:eastAsia="MS Mincho" w:hAnsi="Cambria"/>
-                <w:sz w:val="22"/>
-                <w:szCs w:val="22"/>
-              </w:rPr>
-              <w:t>globale</w:t>
-            </w:r>
-            <w:proofErr w:type="spellEnd"/>
-            <w:r>
-              <w:rPr>
-                <w:rFonts w:ascii="Cambria" w:eastAsia="MS Mincho" w:hAnsi="Cambria"/>
-                <w:sz w:val="22"/>
-                <w:szCs w:val="22"/>
-              </w:rPr>
-              <w:t xml:space="preserve"> des performances</w:t>
+              <w:t>Cohérence globale des performances</w:t>
             </w:r>
           </w:p>
         </w:tc>
@@ -2301,13 +1942,8 @@
           <w:numId w:val="6"/>
         </w:numPr>
       </w:pPr>
-      <w:proofErr w:type="gramStart"/>
-      <w:r>
-        <w:t>variables</w:t>
-      </w:r>
-      <w:proofErr w:type="gramEnd"/>
-      <w:r>
-        <w:t xml:space="preserve"> environnementales : </w:t>
+      <w:r>
+        <w:t xml:space="preserve">variables environnementales : </w:t>
       </w:r>
     </w:p>
     <w:p>
@@ -2318,13 +1954,8 @@
           <w:numId w:val="6"/>
         </w:numPr>
       </w:pPr>
-      <w:proofErr w:type="gramStart"/>
-      <w:r>
-        <w:t>vitesse</w:t>
-      </w:r>
-      <w:proofErr w:type="gramEnd"/>
-      <w:r>
-        <w:t xml:space="preserve"> du vent </w:t>
+      <w:r>
+        <w:t xml:space="preserve">vitesse du vent </w:t>
       </w:r>
     </w:p>
     <w:p>
@@ -2335,13 +1966,8 @@
           <w:numId w:val="6"/>
         </w:numPr>
       </w:pPr>
-      <w:proofErr w:type="gramStart"/>
-      <w:r>
-        <w:t>direction</w:t>
-      </w:r>
-      <w:proofErr w:type="gramEnd"/>
-      <w:r>
-        <w:t xml:space="preserve"> du vent </w:t>
+      <w:r>
+        <w:t xml:space="preserve">direction du vent </w:t>
       </w:r>
     </w:p>
     <w:p>
@@ -2352,13 +1978,8 @@
           <w:numId w:val="6"/>
         </w:numPr>
       </w:pPr>
-      <w:proofErr w:type="gramStart"/>
-      <w:r>
-        <w:t>température</w:t>
-      </w:r>
-      <w:proofErr w:type="gramEnd"/>
-      <w:r>
-        <w:t xml:space="preserve"> ambiante </w:t>
+      <w:r>
+        <w:t xml:space="preserve">température ambiante </w:t>
       </w:r>
     </w:p>
     <w:p>
@@ -2369,13 +1990,8 @@
           <w:numId w:val="6"/>
         </w:numPr>
       </w:pPr>
-      <w:proofErr w:type="gramStart"/>
-      <w:r>
-        <w:t>variables</w:t>
-      </w:r>
-      <w:proofErr w:type="gramEnd"/>
-      <w:r>
-        <w:t xml:space="preserve"> opérationnelles clés : </w:t>
+      <w:r>
+        <w:t xml:space="preserve">variables opérationnelles clés : </w:t>
       </w:r>
     </w:p>
     <w:p>
@@ -2386,13 +2002,8 @@
           <w:numId w:val="6"/>
         </w:numPr>
       </w:pPr>
-      <w:proofErr w:type="gramStart"/>
-      <w:r>
-        <w:t>puissance</w:t>
-      </w:r>
-      <w:proofErr w:type="gramEnd"/>
-      <w:r>
-        <w:t xml:space="preserve"> active produite </w:t>
+      <w:r>
+        <w:t xml:space="preserve">puissance active produite </w:t>
       </w:r>
     </w:p>
     <w:p/>
@@ -2413,29 +2024,13 @@
         <w:t xml:space="preserve">La figure ci-après présente la disponibilité des données SCADA, sur la période allant du </w:t>
       </w:r>
       <w:r>
-        <w:t>{{</w:t>
-      </w:r>
-      <w:proofErr w:type="spellStart"/>
-      <w:r>
-        <w:t>analysis_start</w:t>
-      </w:r>
-      <w:proofErr w:type="spellEnd"/>
-      <w:r>
-        <w:t>}}</w:t>
+        <w:t>{{analysis_start}}</w:t>
       </w:r>
       <w:r>
         <w:t xml:space="preserve"> au </w:t>
       </w:r>
       <w:r>
-        <w:t>{{</w:t>
-      </w:r>
-      <w:proofErr w:type="spellStart"/>
-      <w:r>
-        <w:t>analysis_end</w:t>
-      </w:r>
-      <w:proofErr w:type="spellEnd"/>
-      <w:r>
-        <w:t>}}</w:t>
+        <w:t>{{analysis_end}}</w:t>
       </w:r>
       <w:r>
         <w:t>.</w:t>
@@ -2445,6 +2040,15 @@
     <w:p>
       <w:r>
         <w:t xml:space="preserve"> Sur la base des résultats obtenus :</w:t>
+      </w:r>
+    </w:p>
+    <w:p>
+      <w:r>
+        <w:t>•</w:t>
+      </w:r>
+      <w:r>
+        <w:tab/>
+        <w:t xml:space="preserve">la disponibilité moyenne des données SCADA sur la période d’analyse est de {{DISPO_SCADA}} % pour l’ensemble des éoliennes, </w:t>
       </w:r>
     </w:p>
     <w:p>
@@ -2454,15 +2058,6 @@
       </w:r>
       <w:r>
         <w:tab/>
-        <w:t xml:space="preserve">la disponibilité moyenne des données SCADA sur la période d’analyse est de {{DISPO_SCADA}} % pour l’ensemble des éoliennes, </w:t>
-      </w:r>
-    </w:p>
-    <w:p>
-      <w:r>
-        <w:t>•</w:t>
-      </w:r>
-      <w:r>
-        <w:tab/>
         <w:t xml:space="preserve">Ce niveau de disponibilité est considéré comme satisfaisant/NON Satisfaisant pour la réalisation d’une analyse de performance fiable. </w:t>
       </w:r>
     </w:p>
@@ -2518,21 +2113,7 @@
         <w:rPr>
           <w:lang w:val="en-US"/>
         </w:rPr>
-        <w:t>{{</w:t>
-      </w:r>
-      <w:proofErr w:type="spellStart"/>
-      <w:r>
-        <w:rPr>
-          <w:lang w:val="en-US"/>
-        </w:rPr>
-        <w:t>data_availability_chart</w:t>
-      </w:r>
-      <w:proofErr w:type="spellEnd"/>
-      <w:r>
-        <w:rPr>
-          <w:lang w:val="en-US"/>
-        </w:rPr>
-        <w:t>}}</w:t>
+        <w:t>{{data_availability_chart}}</w:t>
       </w:r>
     </w:p>
     <w:p>
@@ -2547,15 +2128,7 @@
         <w:pStyle w:val="Titre2"/>
       </w:pPr>
       <w:r>
-        <w:t xml:space="preserve">Disponibilité </w:t>
-      </w:r>
-      <w:proofErr w:type="spellStart"/>
-      <w:r>
-        <w:t>éner</w:t>
-      </w:r>
-      <w:proofErr w:type="spellEnd"/>
-      <w:r>
-        <w:t xml:space="preserve"> gétique </w:t>
+        <w:t xml:space="preserve">Disponibilité énergétique </w:t>
       </w:r>
     </w:p>
     <w:p>
@@ -2577,23 +2150,7 @@
         </w:numPr>
       </w:pPr>
       <w:r>
-        <w:t>Disponibilité énergétique brute (</w:t>
-      </w:r>
-      <w:proofErr w:type="spellStart"/>
-      <w:r>
-        <w:t>cut</w:t>
-      </w:r>
-      <w:proofErr w:type="spellEnd"/>
-      <w:r>
-        <w:t xml:space="preserve">-in / </w:t>
-      </w:r>
-      <w:proofErr w:type="spellStart"/>
-      <w:r>
-        <w:t>cut</w:t>
-      </w:r>
-      <w:proofErr w:type="spellEnd"/>
-      <w:r>
-        <w:t>-out) : calculée pour les périodes où la vitesse de vent est comprise entre les seuils de démarrage et d’arrêt des éoliennes, en incluant l’ensemble des indisponibilités (arrêts techniques, maintenance, limitations réseau, etc.)</w:t>
+        <w:t>Disponibilité énergétique brute (cut-in / cut-out) : calculée pour les périodes où la vitesse de vent est comprise entre les seuils de démarrage et d’arrêt des éoliennes, en incluant l’ensemble des indisponibilités (arrêts techniques, maintenance, limitations réseau, etc.)</w:t>
       </w:r>
     </w:p>
     <w:p>
@@ -2682,29 +2239,8 @@
           <w:numId w:val="8"/>
         </w:numPr>
       </w:pPr>
-      <w:proofErr w:type="gramStart"/>
-      <w:r>
-        <w:t>la</w:t>
-      </w:r>
-      <w:proofErr w:type="gramEnd"/>
-      <w:r>
-        <w:t xml:space="preserve"> disponibilité énergétique brute (</w:t>
-      </w:r>
-      <w:proofErr w:type="spellStart"/>
-      <w:r>
-        <w:t>cut</w:t>
-      </w:r>
-      <w:proofErr w:type="spellEnd"/>
-      <w:r>
-        <w:t xml:space="preserve">-in / </w:t>
-      </w:r>
-      <w:proofErr w:type="spellStart"/>
-      <w:r>
-        <w:t>cut</w:t>
-      </w:r>
-      <w:proofErr w:type="spellEnd"/>
-      <w:r>
-        <w:t>-out),</w:t>
+      <w:r>
+        <w:t>la disponibilité énergétique brute (cut-in / cut-out),</w:t>
       </w:r>
     </w:p>
     <w:p>
@@ -2715,101 +2251,54 @@
           <w:numId w:val="8"/>
         </w:numPr>
       </w:pPr>
-      <w:proofErr w:type="gramStart"/>
-      <w:r>
-        <w:t>la</w:t>
-      </w:r>
-      <w:proofErr w:type="gramEnd"/>
-      <w:r>
-        <w:t xml:space="preserve"> disponibilité énergétique imputable au fabricant</w:t>
-      </w:r>
-    </w:p>
-    <w:p>
-      <w:pPr>
-        <w:rPr>
-          <w:lang w:val="en-US"/>
-        </w:rPr>
-      </w:pPr>
-      <w:r>
-        <w:rPr>
-          <w:lang w:val="en-US"/>
-        </w:rPr>
-        <w:t>[</w:t>
-      </w:r>
-      <w:proofErr w:type="gramStart"/>
-      <w:r>
-        <w:rPr>
-          <w:lang w:val="en-US"/>
-        </w:rPr>
-        <w:t>TABLE:EBA</w:t>
-      </w:r>
-      <w:proofErr w:type="gramEnd"/>
-      <w:r>
-        <w:rPr>
-          <w:lang w:val="en-US"/>
-        </w:rPr>
-        <w:t>_CUT_IN_CUT_OUT_TABLE]</w:t>
-      </w:r>
-    </w:p>
-    <w:p>
-      <w:pPr>
-        <w:rPr>
-          <w:lang w:val="en-US"/>
-        </w:rPr>
-      </w:pPr>
-      <w:r>
-        <w:rPr>
-          <w:lang w:val="en-US"/>
-        </w:rPr>
-        <w:t>{{</w:t>
-      </w:r>
-      <w:proofErr w:type="spellStart"/>
-      <w:r>
-        <w:rPr>
-          <w:lang w:val="en-US"/>
-        </w:rPr>
-        <w:t>eba_cut_in_cut_out_chart</w:t>
-      </w:r>
-      <w:proofErr w:type="spellEnd"/>
-      <w:r>
-        <w:rPr>
-          <w:lang w:val="en-US"/>
-        </w:rPr>
-        <w:t>}}</w:t>
-      </w:r>
-    </w:p>
-    <w:p>
-      <w:pPr>
-        <w:rPr>
-          <w:lang w:val="en-US"/>
-        </w:rPr>
-      </w:pPr>
-    </w:p>
-    <w:p>
-      <w:pPr>
-        <w:rPr>
-          <w:lang w:val="en-US"/>
-        </w:rPr>
-      </w:pPr>
-      <w:r>
-        <w:rPr>
-          <w:lang w:val="en-US"/>
-        </w:rPr>
-        <w:t>[</w:t>
-      </w:r>
-      <w:proofErr w:type="gramStart"/>
-      <w:r>
-        <w:rPr>
-          <w:lang w:val="en-US"/>
-        </w:rPr>
-        <w:t>TABLE:EBA</w:t>
-      </w:r>
-      <w:proofErr w:type="gramEnd"/>
-      <w:r>
-        <w:rPr>
-          <w:lang w:val="en-US"/>
-        </w:rPr>
-        <w:t>_MANUFACTURER_TABLE]</w:t>
+      <w:r>
+        <w:t>la disponibilité énergétique imputable au fabricant</w:t>
+      </w:r>
+    </w:p>
+    <w:p>
+      <w:pPr>
+        <w:rPr>
+          <w:lang w:val="en-US"/>
+        </w:rPr>
+      </w:pPr>
+      <w:r>
+        <w:rPr>
+          <w:lang w:val="en-US"/>
+        </w:rPr>
+        <w:t>[TABLE:EBA_CUT_IN_CUT_OUT_TABLE]</w:t>
+      </w:r>
+    </w:p>
+    <w:p>
+      <w:pPr>
+        <w:rPr>
+          <w:lang w:val="en-US"/>
+        </w:rPr>
+      </w:pPr>
+      <w:r>
+        <w:rPr>
+          <w:lang w:val="en-US"/>
+        </w:rPr>
+        <w:t>{{eba_cut_in_cut_out_chart}}</w:t>
+      </w:r>
+    </w:p>
+    <w:p>
+      <w:pPr>
+        <w:rPr>
+          <w:lang w:val="en-US"/>
+        </w:rPr>
+      </w:pPr>
+    </w:p>
+    <w:p>
+      <w:pPr>
+        <w:rPr>
+          <w:lang w:val="en-US"/>
+        </w:rPr>
+      </w:pPr>
+      <w:r>
+        <w:rPr>
+          <w:lang w:val="en-US"/>
+        </w:rPr>
+        <w:t>[TABLE:EBA_MANUFACTURER_TABLE]</w:t>
       </w:r>
       <w:r>
         <w:rPr>
@@ -2828,41 +2317,19 @@
         <w:rPr>
           <w:lang w:val="en-US"/>
         </w:rPr>
-        <w:t>{{</w:t>
-      </w:r>
-      <w:proofErr w:type="spellStart"/>
-      <w:r>
-        <w:rPr>
-          <w:lang w:val="en-US"/>
-        </w:rPr>
-        <w:t>eba_manifacturer_chart</w:t>
-      </w:r>
-      <w:proofErr w:type="spellEnd"/>
-      <w:r>
-        <w:rPr>
-          <w:lang w:val="en-US"/>
-        </w:rPr>
-        <w:t>}}</w:t>
-      </w:r>
-    </w:p>
-    <w:p>
-      <w:pPr>
-        <w:rPr>
-          <w:lang w:val="en-US"/>
-        </w:rPr>
-      </w:pPr>
-    </w:p>
-    <w:p>
-      <w:r>
-        <w:t>[</w:t>
-      </w:r>
-      <w:proofErr w:type="gramStart"/>
-      <w:r>
-        <w:t>TABLE:EBA</w:t>
-      </w:r>
-      <w:proofErr w:type="gramEnd"/>
-      <w:r>
-        <w:t>_LOSS_TABLE]</w:t>
+        <w:t>{{eba_manifacturer_chart}}</w:t>
+      </w:r>
+    </w:p>
+    <w:p>
+      <w:pPr>
+        <w:rPr>
+          <w:lang w:val="en-US"/>
+        </w:rPr>
+      </w:pPr>
+    </w:p>
+    <w:p>
+      <w:r>
+        <w:t>[TABLE:EBA_LOSS_TABLE]</w:t>
       </w:r>
     </w:p>
     <w:p>
@@ -2894,21 +2361,7 @@
         <w:rPr>
           <w:lang w:val="en-US"/>
         </w:rPr>
-        <w:t>{{</w:t>
-      </w:r>
-      <w:proofErr w:type="spellStart"/>
-      <w:r>
-        <w:rPr>
-          <w:lang w:val="en-US"/>
-        </w:rPr>
-        <w:t>eba_loss_chart</w:t>
-      </w:r>
-      <w:proofErr w:type="spellEnd"/>
-      <w:r>
-        <w:rPr>
-          <w:lang w:val="en-US"/>
-        </w:rPr>
-        <w:t>}}</w:t>
+        <w:t>{{eba_loss_chart}}</w:t>
       </w:r>
     </w:p>
     <w:p>
@@ -3029,21 +2482,7 @@
         <w:rPr>
           <w:lang w:val="en-US"/>
         </w:rPr>
-        <w:t>[</w:t>
-      </w:r>
-      <w:proofErr w:type="gramStart"/>
-      <w:r>
-        <w:rPr>
-          <w:lang w:val="en-US"/>
-        </w:rPr>
-        <w:t>TABLE:ERROR</w:t>
-      </w:r>
-      <w:proofErr w:type="gramEnd"/>
-      <w:r>
-        <w:rPr>
-          <w:lang w:val="en-US"/>
-        </w:rPr>
-        <w:t>_</w:t>
+        <w:t>[TABLE:ERROR_</w:t>
       </w:r>
       <w:r>
         <w:rPr>
@@ -3075,55 +2514,7 @@
         <w:rPr>
           <w:lang w:val="en-US"/>
         </w:rPr>
-        <w:t>{{</w:t>
-      </w:r>
-      <w:proofErr w:type="spellStart"/>
-      <w:r>
-        <w:rPr>
-          <w:lang w:val="en-US"/>
-        </w:rPr>
-        <w:t>top_error_code_frequency</w:t>
-      </w:r>
-      <w:proofErr w:type="spellEnd"/>
-      <w:r>
-        <w:rPr>
-          <w:lang w:val="en-US"/>
-        </w:rPr>
-        <w:t>}}</w:t>
-      </w:r>
-    </w:p>
-    <w:p>
-      <w:pPr>
-        <w:rPr>
-          <w:lang w:val="en-US"/>
-        </w:rPr>
-      </w:pPr>
-    </w:p>
-    <w:p>
-      <w:pPr>
-        <w:rPr>
-          <w:lang w:val="en-US"/>
-        </w:rPr>
-      </w:pPr>
-      <w:r>
-        <w:rPr>
-          <w:lang w:val="en-US"/>
-        </w:rPr>
-        <w:t>[</w:t>
-      </w:r>
-      <w:proofErr w:type="gramStart"/>
-      <w:r>
-        <w:rPr>
-          <w:lang w:val="en-US"/>
-        </w:rPr>
-        <w:t>TABLE:ERROR</w:t>
-      </w:r>
-      <w:proofErr w:type="gramEnd"/>
-      <w:r>
-        <w:rPr>
-          <w:lang w:val="en-US"/>
-        </w:rPr>
-        <w:t>_</w:t>
+        <w:t>[TABLE:ERROR_</w:t>
       </w:r>
       <w:r>
         <w:rPr>
@@ -3167,29 +2558,21 @@
         <w:rPr>
           <w:lang w:val="en-US"/>
         </w:rPr>
-        <w:t>{{</w:t>
-      </w:r>
-      <w:proofErr w:type="spellStart"/>
-      <w:r>
-        <w:rPr>
-          <w:lang w:val="en-US"/>
-        </w:rPr>
-        <w:t>treemap_error_code</w:t>
-      </w:r>
-      <w:proofErr w:type="spellEnd"/>
-      <w:r>
-        <w:rPr>
-          <w:lang w:val="en-US"/>
-        </w:rPr>
-        <w:t>}}</w:t>
-      </w:r>
-    </w:p>
-    <w:p>
-      <w:pPr>
-        <w:rPr>
-          <w:lang w:val="en-US"/>
-        </w:rPr>
-      </w:pPr>
+        <w:t>{{top_error_code_frequency}}</w:t>
+      </w:r>
+    </w:p>
+    <w:p>
+      <w:pPr>
+        <w:rPr>
+          <w:lang w:val="en-US"/>
+        </w:rPr>
+      </w:pPr>
+      <w:r>
+        <w:rPr>
+          <w:lang w:val="en-US"/>
+        </w:rPr>
+        <w:t>{{treemap_error_code}}</w:t>
+      </w:r>
     </w:p>
     <w:p>
       <w:pPr>
@@ -3207,23 +2590,7 @@
     </w:p>
     <w:p>
       <w:r>
-        <w:t>L’analyse de la direction du vent vise à vérifier la cohérence des mesures directionnelles entre les éoliennes, ainsi que leur alignement avec une référence externe, afin de détecter d’éventuels défauts d’orientation (</w:t>
-      </w:r>
-      <w:proofErr w:type="spellStart"/>
-      <w:r>
-        <w:t>yaw</w:t>
-      </w:r>
-      <w:proofErr w:type="spellEnd"/>
-      <w:r>
-        <w:t xml:space="preserve"> </w:t>
-      </w:r>
-      <w:proofErr w:type="spellStart"/>
-      <w:r>
-        <w:t>misalignment</w:t>
-      </w:r>
-      <w:proofErr w:type="spellEnd"/>
-      <w:r>
-        <w:t>).</w:t>
+        <w:t>L’analyse de la direction du vent vise à vérifier la cohérence des mesures directionnelles entre les éoliennes, ainsi que leur alignement avec une référence externe, afin de détecter d’éventuels défauts d’orientation (yaw misalignment).</w:t>
       </w:r>
     </w:p>
     <w:p>
@@ -3273,7 +2640,6 @@
     </w:p>
     <w:p>
       <w:r>
-        <w:lastRenderedPageBreak/>
         <w:t xml:space="preserve">Les seuils d'acceptabilité généralement retenus dans l'industrie éolienne sont les suivants : écart relatif inter-éoliennes &lt; 8°, écart absolu par rapport à la référence externe &lt; 20°. </w:t>
       </w:r>
     </w:p>
@@ -3283,103 +2649,64 @@
         <w:t>Les figures ci-après présentent les roses des vents pour chaque éolienne sur les périodes communes, ainsi que les biais directionnels moyens calculés, en relatif entre éoliennes et par rapport à la référence externe.</w:t>
       </w:r>
     </w:p>
-    <w:p>
-      <w:pPr>
-        <w:rPr>
-          <w:lang w:val="en-US"/>
-        </w:rPr>
-      </w:pPr>
-      <w:r>
-        <w:rPr>
-          <w:lang w:val="en-US"/>
-        </w:rPr>
-        <w:t>[</w:t>
-      </w:r>
-      <w:proofErr w:type="gramStart"/>
-      <w:r>
-        <w:rPr>
-          <w:lang w:val="en-US"/>
-        </w:rPr>
-        <w:t>TABLE:TIP</w:t>
-      </w:r>
-      <w:proofErr w:type="gramEnd"/>
-      <w:r>
-        <w:rPr>
-          <w:lang w:val="en-US"/>
-        </w:rPr>
-        <w:t>_SPEED_RATIO_TABLE]</w:t>
-      </w:r>
-    </w:p>
-    <w:p>
-      <w:pPr>
-        <w:rPr>
-          <w:lang w:val="en-US"/>
-        </w:rPr>
-      </w:pPr>
-      <w:r>
-        <w:rPr>
-          <w:lang w:val="en-US"/>
-        </w:rPr>
-        <w:t>{{</w:t>
-      </w:r>
-      <w:proofErr w:type="spellStart"/>
-      <w:r>
-        <w:rPr>
-          <w:lang w:val="en-US"/>
-        </w:rPr>
-        <w:t>wind_direction_calibration</w:t>
-      </w:r>
-      <w:proofErr w:type="spellEnd"/>
-      <w:r>
-        <w:rPr>
-          <w:lang w:val="en-US"/>
-        </w:rPr>
-        <w:t>}}</w:t>
-      </w:r>
-    </w:p>
-    <w:p>
-      <w:pPr>
-        <w:rPr>
-          <w:lang w:val="en-US"/>
-        </w:rPr>
-      </w:pPr>
-      <w:r>
-        <w:rPr>
-          <w:lang w:val="en-US"/>
-        </w:rPr>
-        <w:t>{{</w:t>
-      </w:r>
-      <w:proofErr w:type="spellStart"/>
-      <w:r>
-        <w:rPr>
-          <w:lang w:val="en-US"/>
-        </w:rPr>
-        <w:t>power_rose_chart</w:t>
-      </w:r>
-      <w:proofErr w:type="spellEnd"/>
-      <w:r>
-        <w:rPr>
-          <w:lang w:val="en-US"/>
-        </w:rPr>
-        <w:t>}}</w:t>
-      </w:r>
-    </w:p>
-    <w:p>
-      <w:pPr>
-        <w:rPr>
-          <w:lang w:val="en-US"/>
-        </w:rPr>
-      </w:pPr>
-      <w:r>
-        <w:t>{{</w:t>
-      </w:r>
-      <w:proofErr w:type="spellStart"/>
-      <w:r>
-        <w:t>wind_rose_chart</w:t>
-      </w:r>
-      <w:proofErr w:type="spellEnd"/>
-      <w:r>
-        <w:t>}}</w:t>
+    <w:p/>
+    <w:p>
+      <w:pPr>
+        <w:rPr>
+          <w:lang w:val="en-US"/>
+        </w:rPr>
+      </w:pPr>
+      <w:r>
+        <w:rPr>
+          <w:lang w:val="en-US"/>
+        </w:rPr>
+        <w:t>[TABLE:WIND_DIRECTION_CALIBRATION_TABLE]</w:t>
+      </w:r>
+    </w:p>
+    <w:p>
+      <w:pPr>
+        <w:rPr>
+          <w:lang w:val="en-US"/>
+        </w:rPr>
+      </w:pPr>
+    </w:p>
+    <w:p>
+      <w:pPr>
+        <w:rPr>
+          <w:lang w:val="en-US"/>
+        </w:rPr>
+      </w:pPr>
+      <w:r>
+        <w:rPr>
+          <w:lang w:val="en-US"/>
+        </w:rPr>
+        <w:t>{{wind_direction_calibration}}</w:t>
+      </w:r>
+    </w:p>
+    <w:p>
+      <w:pPr>
+        <w:rPr>
+          <w:lang w:val="en-US"/>
+        </w:rPr>
+      </w:pPr>
+      <w:r>
+        <w:rPr>
+          <w:lang w:val="en-US"/>
+        </w:rPr>
+        <w:t>{{power_rose_chart}}</w:t>
+      </w:r>
+    </w:p>
+    <w:p>
+      <w:pPr>
+        <w:rPr>
+          <w:lang w:val="en-US"/>
+        </w:rPr>
+      </w:pPr>
+      <w:r>
+        <w:rPr>
+          <w:lang w:val="en-US"/>
+        </w:rPr>
+        <w:t>{{wind_rose_chart}}</w:t>
       </w:r>
     </w:p>
     <w:p>
@@ -3466,15 +2793,7 @@
         <w:t>Exclusion</w:t>
       </w:r>
       <w:r>
-        <w:t xml:space="preserve"> des situations de sillage (wake </w:t>
-      </w:r>
-      <w:proofErr w:type="spellStart"/>
-      <w:r>
-        <w:t>effect</w:t>
-      </w:r>
-      <w:proofErr w:type="spellEnd"/>
-      <w:r>
-        <w:t xml:space="preserve">), </w:t>
+        <w:t xml:space="preserve"> des situations de sillage (wake effect), </w:t>
       </w:r>
     </w:p>
     <w:p>
@@ -3526,32 +2845,40 @@
       <w:r>
         <w:t>La correction de densité est réalisée par rapport à la densité d'air standard de référence de 1.225 kg/m³</w:t>
       </w:r>
-    </w:p>
-    <w:p>
-      <w:pPr>
-        <w:rPr>
-          <w:lang w:val="en-US"/>
-        </w:rPr>
-      </w:pPr>
-      <w:r>
-        <w:rPr>
-          <w:lang w:val="en-US"/>
-        </w:rPr>
-        <w:t>[</w:t>
-      </w:r>
-      <w:proofErr w:type="gramStart"/>
-      <w:r>
-        <w:rPr>
-          <w:lang w:val="en-US"/>
-        </w:rPr>
-        <w:t>TABLE:NORMATIVE</w:t>
-      </w:r>
-      <w:proofErr w:type="gramEnd"/>
-      <w:r>
-        <w:rPr>
-          <w:lang w:val="en-US"/>
-        </w:rPr>
-        <w:t>_YIELD_TABLE]</w:t>
+      <w:r>
+        <w:t>.</w:t>
+      </w:r>
+    </w:p>
+    <w:p>
+      <w:pPr>
+        <w:rPr>
+          <w:lang w:val="en-US"/>
+        </w:rPr>
+      </w:pPr>
+      <w:r>
+        <w:rPr>
+          <w:lang w:val="en-US"/>
+        </w:rPr>
+        <w:t>[TABLE:NORMATIVE_YIELD_TABLE]</w:t>
+      </w:r>
+    </w:p>
+    <w:p>
+      <w:pPr>
+        <w:rPr>
+          <w:lang w:val="en-US"/>
+        </w:rPr>
+      </w:pPr>
+      <w:r>
+        <w:rPr>
+          <w:lang w:val="en-US"/>
+        </w:rPr>
+        <w:t>{{</w:t>
+      </w:r>
+      <w:r>
+        <w:rPr>
+          <w:lang w:val="en-US"/>
+        </w:rPr>
+        <w:t>power_curve_chart}}</w:t>
       </w:r>
     </w:p>
     <w:p>
@@ -3598,13 +2925,9 @@
           <w:numId w:val="13"/>
         </w:numPr>
       </w:pPr>
-      <w:proofErr w:type="gramStart"/>
-      <w:r>
-        <w:t>les</w:t>
-      </w:r>
-      <w:proofErr w:type="gramEnd"/>
-      <w:r>
-        <w:t xml:space="preserve"> périodes de limitations environnementales (bruit, chauves-souris, ombrage, etc.), </w:t>
+      <w:r>
+        <w:lastRenderedPageBreak/>
+        <w:t xml:space="preserve">les périodes de limitations environnementales (bruit, chauves-souris, ombrage, etc.), </w:t>
       </w:r>
     </w:p>
     <w:p>
@@ -3615,14 +2938,8 @@
           <w:numId w:val="13"/>
         </w:numPr>
       </w:pPr>
-      <w:proofErr w:type="gramStart"/>
-      <w:r>
-        <w:lastRenderedPageBreak/>
-        <w:t>les</w:t>
-      </w:r>
-      <w:proofErr w:type="gramEnd"/>
-      <w:r>
-        <w:t xml:space="preserve"> phases de démarrage et d’arrêt, </w:t>
+      <w:r>
+        <w:t xml:space="preserve">les phases de démarrage et d’arrêt, </w:t>
       </w:r>
     </w:p>
     <w:p>
@@ -3633,16 +2950,14 @@
           <w:numId w:val="13"/>
         </w:numPr>
       </w:pPr>
-      <w:proofErr w:type="gramStart"/>
-      <w:r>
-        <w:t>les</w:t>
-      </w:r>
-      <w:proofErr w:type="gramEnd"/>
-      <w:r>
-        <w:t xml:space="preserve"> situations transitoires ou non représentatives du fonctionnement normal. </w:t>
-      </w:r>
-    </w:p>
-    <w:p>
+      <w:r>
+        <w:t xml:space="preserve">les situations transitoires ou non représentatives du fonctionnement normal. </w:t>
+      </w:r>
+    </w:p>
+    <w:p>
+      <w:pPr>
+        <w:jc w:val="both"/>
+      </w:pPr>
       <w:r>
         <w:t xml:space="preserve">L’analyse est réalisée sur l’ensemble de la période d’étude, avec une visualisation de l’évolution </w:t>
       </w:r>
@@ -3654,25 +2969,53 @@
       </w:r>
     </w:p>
     <w:p>
+      <w:pPr>
+        <w:jc w:val="both"/>
+      </w:pPr>
+      <w:r>
+        <w:t>Le TSR</w:t>
+      </w:r>
+      <w:r>
+        <w:t xml:space="preserve"> (Tip Speed Ratio) est ici introduit, il</w:t>
+      </w:r>
+      <w:r>
+        <w:t xml:space="preserve"> correspond au rapport entre la vitesse linéaire du bout des pales et la vitesse du vent arrivant sur l'hélice.</w:t>
+      </w:r>
+      <w:r>
+        <w:t xml:space="preserve"> Il doit être compris entre 7 et 9. Au-delà </w:t>
+      </w:r>
+      <w:r>
+        <w:t>les pales ont tendance à s'éroder prématurément.</w:t>
+      </w:r>
+    </w:p>
+    <w:p>
+      <w:pPr>
+        <w:jc w:val="both"/>
+      </w:pPr>
       <w:r>
         <w:t>Les figures ci-après présentent l’évolution de la vitesse de rotation du rotor en fonction de la puissance active pour chaque éolienne, sur la période analysée.</w:t>
       </w:r>
     </w:p>
-    <w:p>
-      <w:pPr>
-        <w:rPr>
-          <w:lang w:val="en-US"/>
-        </w:rPr>
-      </w:pPr>
-      <w:r>
-        <w:t xml:space="preserve"> </w:t>
-      </w:r>
-      <w:r>
-        <w:rPr>
-          <w:lang w:val="en-US"/>
-        </w:rPr>
-        <w:t>[TODO FIGURERPM]</w:t>
-      </w:r>
+    <w:p/>
+    <w:p>
+      <w:pPr>
+        <w:rPr>
+          <w:lang w:val="en-US"/>
+        </w:rPr>
+      </w:pPr>
+      <w:r>
+        <w:rPr>
+          <w:lang w:val="en-US"/>
+        </w:rPr>
+        <w:t>[TABLE:TIP_SPEED_RATIO_TABLE]</w:t>
+      </w:r>
+    </w:p>
+    <w:p>
+      <w:pPr>
+        <w:rPr>
+          <w:lang w:val="en-US"/>
+        </w:rPr>
+      </w:pPr>
     </w:p>
     <w:p>
       <w:pPr>
@@ -3688,17 +3031,27 @@
       </w:r>
     </w:p>
     <w:p>
+      <w:pPr>
+        <w:rPr>
+          <w:lang w:val="en-US"/>
+        </w:rPr>
+      </w:pPr>
+    </w:p>
+    <w:p>
+      <w:pPr>
+        <w:rPr>
+          <w:lang w:val="en-US"/>
+        </w:rPr>
+      </w:pPr>
       <w:r>
         <w:rPr>
           <w:lang w:val="en-US"/>
         </w:rPr>
         <w:t>{{</w:t>
       </w:r>
-      <w:proofErr w:type="spellStart"/>
       <w:r>
         <w:t>rpm_chart</w:t>
       </w:r>
-      <w:proofErr w:type="spellEnd"/>
       <w:r>
         <w:rPr>
           <w:lang w:val="en-US"/>
@@ -3706,6 +3059,7 @@
         <w:t>}}</w:t>
       </w:r>
     </w:p>
+    <w:p/>
     <w:p>
       <w:r>
         <w:rPr>
@@ -3809,21 +3163,59 @@
         <w:rPr>
           <w:lang w:val="en-US"/>
         </w:rPr>
-        <w:t>[TODO FIGURE PITCH]</w:t>
-      </w:r>
-    </w:p>
-    <w:p>
-      <w:pPr>
-        <w:rPr>
-          <w:lang w:val="en-US"/>
-        </w:rPr>
-      </w:pPr>
-      <w:r>
-        <w:rPr>
-          <w:lang w:val="en-US"/>
-        </w:rPr>
-        <w:t>[TODO TABLEAU PITCH]</w:t>
-      </w:r>
+        <w:t>[T</w:t>
+      </w:r>
+      <w:r>
+        <w:rPr>
+          <w:lang w:val="en-US"/>
+        </w:rPr>
+        <w:t>ABLE:PITCH_TABLE</w:t>
+      </w:r>
+      <w:r>
+        <w:rPr>
+          <w:lang w:val="en-US"/>
+        </w:rPr>
+        <w:t>]</w:t>
+      </w:r>
+    </w:p>
+    <w:p>
+      <w:pPr>
+        <w:rPr>
+          <w:lang w:val="en-US"/>
+        </w:rPr>
+      </w:pPr>
+    </w:p>
+    <w:p>
+      <w:pPr>
+        <w:rPr>
+          <w:lang w:val="en-US"/>
+        </w:rPr>
+      </w:pPr>
+      <w:r>
+        <w:rPr>
+          <w:lang w:val="en-US"/>
+        </w:rPr>
+        <w:t>{{</w:t>
+      </w:r>
+      <w:r>
+        <w:rPr>
+          <w:lang w:val="en-US"/>
+        </w:rPr>
+        <w:t>pitch_chart</w:t>
+      </w:r>
+      <w:r>
+        <w:rPr>
+          <w:lang w:val="en-US"/>
+        </w:rPr>
+        <w:t>}}</w:t>
+      </w:r>
+    </w:p>
+    <w:p>
+      <w:pPr>
+        <w:rPr>
+          <w:lang w:val="en-US"/>
+        </w:rPr>
+      </w:pPr>
     </w:p>
     <w:p>
       <w:r>
@@ -3838,20 +3230,25 @@
         <w:pStyle w:val="Titre2"/>
       </w:pPr>
       <w:r>
-        <w:t>Analyse des limitations de puissance</w:t>
-      </w:r>
-    </w:p>
-    <w:p>
-      <w:r>
-        <w:t xml:space="preserve">En complément de l'analyse comparative des courbes de puissance, une analyse individuelle de chaque éolienne est réalisée à partir des données SCADA brutes, sous forme de nuages de points. Cette approche vise à détecter d'éventuelles limitations de production non prévues, non nécessairement visibles dans une comparaison inter-éoliennes. Elle permet notamment d'identifier des situations de </w:t>
-      </w:r>
-      <w:proofErr w:type="spellStart"/>
-      <w:r>
-        <w:t>curtailment</w:t>
-      </w:r>
-      <w:proofErr w:type="spellEnd"/>
-      <w:r>
-        <w:t xml:space="preserve"> inattendu, visibles à travers des regroupements de points (clusters) s'écartant de la courbe de puissance nominale attendue. L'analyse repose sur la représentation de la puissance active en fonction de la vitesse du vent sous forme de nuages de points. Afin de représenter le comportement nominal des éoliennes, les données sont filtrées pour exclure :</w:t>
+        <w:t>Analyse des limitations</w:t>
+      </w:r>
+    </w:p>
+    <w:p>
+      <w:r>
+        <w:t xml:space="preserve">En complément de l'analyse comparative des courbes de puissance, une analyse individuelle de chaque éolienne est réalisée à partir des données SCADA brutes, sous forme de nuages de points. Cette approche vise à détecter d'éventuelles limitations de production non prévues, non nécessairement visibles dans une comparaison inter-éoliennes. Elle permet notamment </w:t>
+      </w:r>
+      <w:r>
+        <w:lastRenderedPageBreak/>
+        <w:t xml:space="preserve">d'identifier des situations de curtailment inattendu, visibles à travers des regroupements de points (clusters) s'écartant de la courbe de puissance nominale attendue. L'analyse repose sur la représentation de la puissance active en fonction de la vitesse du vent sous forme de nuages de points. Les figures ci-après présentent les nuages de points pour chaque éolienne. </w:t>
+      </w:r>
+      <w:r>
+        <w:t xml:space="preserve">Les figures illustres des classes de fonctionnements pour la puissance, l’orientation des pales et la rotation par </w:t>
+      </w:r>
+      <w:r>
+        <w:t>minute</w:t>
+      </w:r>
+      <w:r>
+        <w:t xml:space="preserve">:  </w:t>
       </w:r>
     </w:p>
     <w:p>
@@ -3859,16 +3256,11 @@
         <w:pStyle w:val="Paragraphedeliste"/>
         <w:numPr>
           <w:ilvl w:val="0"/>
-          <w:numId w:val="15"/>
+          <w:numId w:val="16"/>
         </w:numPr>
       </w:pPr>
-      <w:proofErr w:type="gramStart"/>
-      <w:r>
-        <w:t>les</w:t>
-      </w:r>
-      <w:proofErr w:type="gramEnd"/>
-      <w:r>
-        <w:t xml:space="preserve"> périodes de limitations environnementales (bruit, chauves-souris, ombrage, etc.), </w:t>
+      <w:r>
+        <w:t>Stop (low wind)</w:t>
       </w:r>
     </w:p>
     <w:p>
@@ -3876,16 +3268,11 @@
         <w:pStyle w:val="Paragraphedeliste"/>
         <w:numPr>
           <w:ilvl w:val="0"/>
-          <w:numId w:val="15"/>
+          <w:numId w:val="16"/>
         </w:numPr>
       </w:pPr>
-      <w:proofErr w:type="gramStart"/>
-      <w:r>
-        <w:t>les</w:t>
-      </w:r>
-      <w:proofErr w:type="gramEnd"/>
-      <w:r>
-        <w:t xml:space="preserve"> phases de démarrage et d'arrêt,</w:t>
+      <w:r>
+        <w:t>Start</w:t>
       </w:r>
     </w:p>
     <w:p>
@@ -3893,51 +3280,67 @@
         <w:pStyle w:val="Paragraphedeliste"/>
         <w:numPr>
           <w:ilvl w:val="0"/>
-          <w:numId w:val="15"/>
+          <w:numId w:val="16"/>
         </w:numPr>
       </w:pPr>
-      <w:proofErr w:type="gramStart"/>
-      <w:r>
-        <w:t>ainsi</w:t>
-      </w:r>
-      <w:proofErr w:type="gramEnd"/>
-      <w:r>
-        <w:t xml:space="preserve"> que les situations non représentatives du fonctionnement normal. </w:t>
-      </w:r>
-    </w:p>
-    <w:p>
-      <w:r>
-        <w:lastRenderedPageBreak/>
-        <w:t>Les figures ci-après présentent les nuages de points pour chaque éolienne ainsi que leur évolution mensuelle sur la période d'analyse. Les figures relatives aux autres éoliennes sont disponibles en annexe.</w:t>
-      </w:r>
-    </w:p>
-    <w:p>
-      <w:proofErr w:type="gramStart"/>
-      <w:r>
-        <w:t>préciser</w:t>
-      </w:r>
-      <w:proofErr w:type="gramEnd"/>
-      <w:r>
-        <w:t xml:space="preserve"> quelle éolienne est présentée dans le corps du rapport et lesquelles sont renvoyées en annexe, cohérence à maintenir avec l'analyse comparative des courbes de puissance. Dans l'étude de référence, E9 est présentée dans le corps du rapport.]</w:t>
-      </w:r>
-    </w:p>
-    <w:p>
-      <w:r>
-        <w:t xml:space="preserve"> </w:t>
-      </w:r>
-    </w:p>
-    <w:p>
-      <w:r>
-        <w:t>[TODO.TABLEAU LMITE DE PUISSANCE]</w:t>
-      </w:r>
-    </w:p>
-    <w:p>
-      <w:r>
-        <w:t>[TODO.IMAGE LIMITE DE PUISSANCE]</w:t>
-      </w:r>
-    </w:p>
-    <w:p>
-      <w:r>
+      <w:r>
+        <w:t>Phase transitoire</w:t>
+      </w:r>
+    </w:p>
+    <w:p>
+      <w:pPr>
+        <w:pStyle w:val="Paragraphedeliste"/>
+        <w:numPr>
+          <w:ilvl w:val="0"/>
+          <w:numId w:val="16"/>
+        </w:numPr>
+      </w:pPr>
+      <w:r>
+        <w:t>Phase optimale de fonctionnement</w:t>
+      </w:r>
+    </w:p>
+    <w:p>
+      <w:pPr>
+        <w:pStyle w:val="Paragraphedeliste"/>
+        <w:numPr>
+          <w:ilvl w:val="0"/>
+          <w:numId w:val="16"/>
+        </w:numPr>
+      </w:pPr>
+      <w:r>
+        <w:t>Stop (high wind)</w:t>
+      </w:r>
+    </w:p>
+    <w:p>
+      <w:pPr>
+        <w:pStyle w:val="Paragraphedeliste"/>
+        <w:numPr>
+          <w:ilvl w:val="0"/>
+          <w:numId w:val="16"/>
+        </w:numPr>
+      </w:pPr>
+      <w:r>
+        <w:t>Outlier (anomalies)</w:t>
+      </w:r>
+    </w:p>
+    <w:p/>
+    <w:p>
+      <w:r>
+        <w:t>{{</w:t>
+      </w:r>
+      <w:r>
+        <w:t>performance_level_chart</w:t>
+      </w:r>
+      <w:r>
+        <w:t>}}</w:t>
+      </w:r>
+    </w:p>
+    <w:p/>
+    <w:p>
+      <w:r>
+        <w:rPr>
+          <w:highlight w:val="lightGray"/>
+        </w:rPr>
         <w:t>[ANALYSE]</w:t>
       </w:r>
     </w:p>
@@ -3951,6 +3354,9 @@
     </w:p>
     <w:p>
       <w:r>
+        <w:rPr>
+          <w:highlight w:val="lightGray"/>
+        </w:rPr>
         <w:t>[ANALYSE]</w:t>
       </w:r>
     </w:p>
@@ -3964,6 +3370,9 @@
     </w:p>
     <w:p>
       <w:r>
+        <w:rPr>
+          <w:highlight w:val="lightGray"/>
+        </w:rPr>
         <w:t>[A COMPLETER]</w:t>
       </w:r>
     </w:p>
@@ -3980,15 +3389,7 @@
         <w:pStyle w:val="Titre2"/>
       </w:pPr>
       <w:r>
-        <w:t xml:space="preserve">Disponibilité temporelle (Time-Based </w:t>
-      </w:r>
-      <w:proofErr w:type="spellStart"/>
-      <w:r>
-        <w:t>Availability</w:t>
-      </w:r>
-      <w:proofErr w:type="spellEnd"/>
-      <w:r>
-        <w:t xml:space="preserve"> – TBA)</w:t>
+        <w:t>Disponibilité temporelle (Time-Based Availability – TBA)</w:t>
       </w:r>
     </w:p>
     <w:p>
@@ -4510,6 +3911,119 @@
     </w:lvl>
   </w:abstractNum>
   <w:abstractNum w:abstractNumId="4" w15:restartNumberingAfterBreak="0">
+    <w:nsid w:val="25211604"/>
+    <w:multiLevelType w:val="hybridMultilevel"/>
+    <w:tmpl w:val="B0BEE23C"/>
+    <w:lvl w:ilvl="0" w:tplc="040C0001">
+      <w:start w:val="1"/>
+      <w:numFmt w:val="bullet"/>
+      <w:lvlText w:val=""/>
+      <w:lvlJc w:val="left"/>
+      <w:pPr>
+        <w:ind w:left="720" w:hanging="360"/>
+      </w:pPr>
+      <w:rPr>
+        <w:rFonts w:ascii="Symbol" w:hAnsi="Symbol" w:hint="default"/>
+      </w:rPr>
+    </w:lvl>
+    <w:lvl w:ilvl="1" w:tplc="040C0003" w:tentative="1">
+      <w:start w:val="1"/>
+      <w:numFmt w:val="bullet"/>
+      <w:lvlText w:val="o"/>
+      <w:lvlJc w:val="left"/>
+      <w:pPr>
+        <w:ind w:left="1440" w:hanging="360"/>
+      </w:pPr>
+      <w:rPr>
+        <w:rFonts w:ascii="Courier New" w:hAnsi="Courier New" w:cs="Courier New" w:hint="default"/>
+      </w:rPr>
+    </w:lvl>
+    <w:lvl w:ilvl="2" w:tplc="040C0005" w:tentative="1">
+      <w:start w:val="1"/>
+      <w:numFmt w:val="bullet"/>
+      <w:lvlText w:val=""/>
+      <w:lvlJc w:val="left"/>
+      <w:pPr>
+        <w:ind w:left="2160" w:hanging="360"/>
+      </w:pPr>
+      <w:rPr>
+        <w:rFonts w:ascii="Wingdings" w:hAnsi="Wingdings" w:hint="default"/>
+      </w:rPr>
+    </w:lvl>
+    <w:lvl w:ilvl="3" w:tplc="040C0001" w:tentative="1">
+      <w:start w:val="1"/>
+      <w:numFmt w:val="bullet"/>
+      <w:lvlText w:val=""/>
+      <w:lvlJc w:val="left"/>
+      <w:pPr>
+        <w:ind w:left="2880" w:hanging="360"/>
+      </w:pPr>
+      <w:rPr>
+        <w:rFonts w:ascii="Symbol" w:hAnsi="Symbol" w:hint="default"/>
+      </w:rPr>
+    </w:lvl>
+    <w:lvl w:ilvl="4" w:tplc="040C0003" w:tentative="1">
+      <w:start w:val="1"/>
+      <w:numFmt w:val="bullet"/>
+      <w:lvlText w:val="o"/>
+      <w:lvlJc w:val="left"/>
+      <w:pPr>
+        <w:ind w:left="3600" w:hanging="360"/>
+      </w:pPr>
+      <w:rPr>
+        <w:rFonts w:ascii="Courier New" w:hAnsi="Courier New" w:cs="Courier New" w:hint="default"/>
+      </w:rPr>
+    </w:lvl>
+    <w:lvl w:ilvl="5" w:tplc="040C0005" w:tentative="1">
+      <w:start w:val="1"/>
+      <w:numFmt w:val="bullet"/>
+      <w:lvlText w:val=""/>
+      <w:lvlJc w:val="left"/>
+      <w:pPr>
+        <w:ind w:left="4320" w:hanging="360"/>
+      </w:pPr>
+      <w:rPr>
+        <w:rFonts w:ascii="Wingdings" w:hAnsi="Wingdings" w:hint="default"/>
+      </w:rPr>
+    </w:lvl>
+    <w:lvl w:ilvl="6" w:tplc="040C0001" w:tentative="1">
+      <w:start w:val="1"/>
+      <w:numFmt w:val="bullet"/>
+      <w:lvlText w:val=""/>
+      <w:lvlJc w:val="left"/>
+      <w:pPr>
+        <w:ind w:left="5040" w:hanging="360"/>
+      </w:pPr>
+      <w:rPr>
+        <w:rFonts w:ascii="Symbol" w:hAnsi="Symbol" w:hint="default"/>
+      </w:rPr>
+    </w:lvl>
+    <w:lvl w:ilvl="7" w:tplc="040C0003" w:tentative="1">
+      <w:start w:val="1"/>
+      <w:numFmt w:val="bullet"/>
+      <w:lvlText w:val="o"/>
+      <w:lvlJc w:val="left"/>
+      <w:pPr>
+        <w:ind w:left="5760" w:hanging="360"/>
+      </w:pPr>
+      <w:rPr>
+        <w:rFonts w:ascii="Courier New" w:hAnsi="Courier New" w:cs="Courier New" w:hint="default"/>
+      </w:rPr>
+    </w:lvl>
+    <w:lvl w:ilvl="8" w:tplc="040C0005" w:tentative="1">
+      <w:start w:val="1"/>
+      <w:numFmt w:val="bullet"/>
+      <w:lvlText w:val=""/>
+      <w:lvlJc w:val="left"/>
+      <w:pPr>
+        <w:ind w:left="6480" w:hanging="360"/>
+      </w:pPr>
+      <w:rPr>
+        <w:rFonts w:ascii="Wingdings" w:hAnsi="Wingdings" w:hint="default"/>
+      </w:rPr>
+    </w:lvl>
+  </w:abstractNum>
+  <w:abstractNum w:abstractNumId="5" w15:restartNumberingAfterBreak="0">
     <w:nsid w:val="26A54AD6"/>
     <w:multiLevelType w:val="hybridMultilevel"/>
     <w:tmpl w:val="35CC2584"/>
@@ -4622,7 +4136,7 @@
       </w:rPr>
     </w:lvl>
   </w:abstractNum>
-  <w:abstractNum w:abstractNumId="5" w15:restartNumberingAfterBreak="0">
+  <w:abstractNum w:abstractNumId="6" w15:restartNumberingAfterBreak="0">
     <w:nsid w:val="26B532D1"/>
     <w:multiLevelType w:val="hybridMultilevel"/>
     <w:tmpl w:val="7174CCBA"/>
@@ -4735,7 +4249,7 @@
       </w:rPr>
     </w:lvl>
   </w:abstractNum>
-  <w:abstractNum w:abstractNumId="6" w15:restartNumberingAfterBreak="0">
+  <w:abstractNum w:abstractNumId="7" w15:restartNumberingAfterBreak="0">
     <w:nsid w:val="2B0767A7"/>
     <w:multiLevelType w:val="hybridMultilevel"/>
     <w:tmpl w:val="5A34D448"/>
@@ -4848,7 +4362,7 @@
       </w:rPr>
     </w:lvl>
   </w:abstractNum>
-  <w:abstractNum w:abstractNumId="7" w15:restartNumberingAfterBreak="0">
+  <w:abstractNum w:abstractNumId="8" w15:restartNumberingAfterBreak="0">
     <w:nsid w:val="358273A7"/>
     <w:multiLevelType w:val="hybridMultilevel"/>
     <w:tmpl w:val="4776DC4C"/>
@@ -4961,7 +4475,7 @@
       </w:rPr>
     </w:lvl>
   </w:abstractNum>
-  <w:abstractNum w:abstractNumId="8" w15:restartNumberingAfterBreak="0">
+  <w:abstractNum w:abstractNumId="9" w15:restartNumberingAfterBreak="0">
     <w:nsid w:val="3A576601"/>
     <w:multiLevelType w:val="hybridMultilevel"/>
     <w:tmpl w:val="87A090BA"/>
@@ -5074,7 +4588,7 @@
       </w:rPr>
     </w:lvl>
   </w:abstractNum>
-  <w:abstractNum w:abstractNumId="9" w15:restartNumberingAfterBreak="0">
+  <w:abstractNum w:abstractNumId="10" w15:restartNumberingAfterBreak="0">
     <w:nsid w:val="4FD61365"/>
     <w:multiLevelType w:val="hybridMultilevel"/>
     <w:tmpl w:val="425E6152"/>
@@ -5187,7 +4701,7 @@
       </w:rPr>
     </w:lvl>
   </w:abstractNum>
-  <w:abstractNum w:abstractNumId="10" w15:restartNumberingAfterBreak="0">
+  <w:abstractNum w:abstractNumId="11" w15:restartNumberingAfterBreak="0">
     <w:nsid w:val="53A943CA"/>
     <w:multiLevelType w:val="hybridMultilevel"/>
     <w:tmpl w:val="34B8E88E"/>
@@ -5300,7 +4814,7 @@
       </w:rPr>
     </w:lvl>
   </w:abstractNum>
-  <w:abstractNum w:abstractNumId="11" w15:restartNumberingAfterBreak="0">
+  <w:abstractNum w:abstractNumId="12" w15:restartNumberingAfterBreak="0">
     <w:nsid w:val="55206C58"/>
     <w:multiLevelType w:val="hybridMultilevel"/>
     <w:tmpl w:val="E42AB0BC"/>
@@ -5413,7 +4927,7 @@
       </w:rPr>
     </w:lvl>
   </w:abstractNum>
-  <w:abstractNum w:abstractNumId="12" w15:restartNumberingAfterBreak="0">
+  <w:abstractNum w:abstractNumId="13" w15:restartNumberingAfterBreak="0">
     <w:nsid w:val="594164EE"/>
     <w:multiLevelType w:val="hybridMultilevel"/>
     <w:tmpl w:val="F09AFD8A"/>
@@ -5526,7 +5040,7 @@
       </w:rPr>
     </w:lvl>
   </w:abstractNum>
-  <w:abstractNum w:abstractNumId="13" w15:restartNumberingAfterBreak="0">
+  <w:abstractNum w:abstractNumId="14" w15:restartNumberingAfterBreak="0">
     <w:nsid w:val="62E82CBB"/>
     <w:multiLevelType w:val="hybridMultilevel"/>
     <w:tmpl w:val="94AC07A0"/>
@@ -5639,7 +5153,7 @@
       </w:rPr>
     </w:lvl>
   </w:abstractNum>
-  <w:abstractNum w:abstractNumId="14" w15:restartNumberingAfterBreak="0">
+  <w:abstractNum w:abstractNumId="15" w15:restartNumberingAfterBreak="0">
     <w:nsid w:val="6B864DCF"/>
     <w:multiLevelType w:val="hybridMultilevel"/>
     <w:tmpl w:val="90302C54"/>
@@ -5759,43 +5273,46 @@
     <w:abstractNumId w:val="3"/>
   </w:num>
   <w:num w:numId="3" w16cid:durableId="499976514">
-    <w:abstractNumId w:val="13"/>
+    <w:abstractNumId w:val="14"/>
   </w:num>
   <w:num w:numId="4" w16cid:durableId="586500175">
-    <w:abstractNumId w:val="7"/>
+    <w:abstractNumId w:val="8"/>
   </w:num>
   <w:num w:numId="5" w16cid:durableId="315955181">
     <w:abstractNumId w:val="0"/>
   </w:num>
   <w:num w:numId="6" w16cid:durableId="225188296">
-    <w:abstractNumId w:val="9"/>
+    <w:abstractNumId w:val="10"/>
   </w:num>
   <w:num w:numId="7" w16cid:durableId="500971371">
-    <w:abstractNumId w:val="11"/>
+    <w:abstractNumId w:val="12"/>
   </w:num>
   <w:num w:numId="8" w16cid:durableId="466968896">
     <w:abstractNumId w:val="2"/>
   </w:num>
   <w:num w:numId="9" w16cid:durableId="1994141544">
-    <w:abstractNumId w:val="12"/>
+    <w:abstractNumId w:val="13"/>
   </w:num>
   <w:num w:numId="10" w16cid:durableId="681318866">
-    <w:abstractNumId w:val="10"/>
+    <w:abstractNumId w:val="11"/>
   </w:num>
   <w:num w:numId="11" w16cid:durableId="1365206944">
+    <w:abstractNumId w:val="6"/>
+  </w:num>
+  <w:num w:numId="12" w16cid:durableId="1833135886">
+    <w:abstractNumId w:val="9"/>
+  </w:num>
+  <w:num w:numId="13" w16cid:durableId="184364037">
+    <w:abstractNumId w:val="15"/>
+  </w:num>
+  <w:num w:numId="14" w16cid:durableId="1952777486">
     <w:abstractNumId w:val="5"/>
   </w:num>
-  <w:num w:numId="12" w16cid:durableId="1833135886">
-    <w:abstractNumId w:val="8"/>
+  <w:num w:numId="15" w16cid:durableId="894321048">
+    <w:abstractNumId w:val="7"/>
   </w:num>
-  <w:num w:numId="13" w16cid:durableId="184364037">
-    <w:abstractNumId w:val="14"/>
-  </w:num>
-  <w:num w:numId="14" w16cid:durableId="1952777486">
+  <w:num w:numId="16" w16cid:durableId="2144540130">
     <w:abstractNumId w:val="4"/>
-  </w:num>
-  <w:num w:numId="15" w16cid:durableId="894321048">
-    <w:abstractNumId w:val="6"/>
   </w:num>
 </w:numbering>
 </file>

</xml_diff>

<commit_message>
[CHANGE] change the code to handle the code for better performance
</commit_message>
<xml_diff>
--- a/assets/templates/template_scada.docx
+++ b/assets/templates/template_scada.docx
@@ -2077,32 +2077,17 @@
         </w:rPr>
         <w:t xml:space="preserve"> développer en fonction du projet)</w:t>
       </w:r>
-    </w:p>
-    <w:p>
-      <w:pPr>
-        <w:rPr>
-          <w:lang w:val="en-US"/>
-        </w:rPr>
-      </w:pPr>
-      <w:r>
-        <w:rPr>
-          <w:lang w:val="en-US"/>
-        </w:rPr>
-        <w:t>[</w:t>
-      </w:r>
-      <w:r>
-        <w:rPr>
-          <w:lang w:val="en-US"/>
-        </w:rPr>
-        <w:t>TODO</w:t>
-      </w:r>
-      <w:r>
-        <w:rPr>
-          <w:lang w:val="en-US"/>
-        </w:rPr>
-        <w:t>:DATA_AVAILABILITY_TABLE]</w:t>
-      </w:r>
-    </w:p>
+      <w:r>
+        <w:t>.</w:t>
+      </w:r>
+    </w:p>
+    <w:p/>
+    <w:p>
+      <w:r>
+        <w:t>[TABLE:DATA_AVAILABILITY_TABLE]</w:t>
+      </w:r>
+    </w:p>
+    <w:p/>
     <w:p>
       <w:pPr>
         <w:rPr>
@@ -5973,7 +5958,6 @@
   <w:style w:type="character" w:default="1" w:styleId="Policepardfaut">
     <w:name w:val="Default Paragraph Font"/>
     <w:uiPriority w:val="1"/>
-    <w:semiHidden/>
     <w:unhideWhenUsed/>
   </w:style>
   <w:style w:type="table" w:default="1" w:styleId="TableauNormal">

</xml_diff>

<commit_message>
[CHANGE] change the code to handle different status
</commit_message>
<xml_diff>
--- a/assets/templates/template_scada.docx
+++ b/assets/templates/template_scada.docx
@@ -2083,11 +2083,25 @@
     </w:p>
     <w:p/>
     <w:p>
-      <w:r>
+      <w:pPr>
+        <w:rPr>
+          <w:lang w:val="en-US"/>
+        </w:rPr>
+      </w:pPr>
+      <w:r>
+        <w:rPr>
+          <w:lang w:val="en-US"/>
+        </w:rPr>
         <w:t>[TABLE:DATA_AVAILABILITY_TABLE]</w:t>
       </w:r>
     </w:p>
-    <w:p/>
+    <w:p>
+      <w:pPr>
+        <w:rPr>
+          <w:lang w:val="en-US"/>
+        </w:rPr>
+      </w:pPr>
+    </w:p>
     <w:p>
       <w:pPr>
         <w:rPr>
@@ -3311,20 +3325,46 @@
     <w:p/>
     <w:p>
       <w:r>
-        <w:t>{{</w:t>
-      </w:r>
-      <w:r>
-        <w:t>performance_level_chart</w:t>
-      </w:r>
-      <w:r>
-        <w:t>}}</w:t>
-      </w:r>
-    </w:p>
-    <w:p/>
-    <w:p>
+        <w:t>[TABLE:PERFORMANCE_LEVEL_TABLE]</w:t>
+      </w:r>
+    </w:p>
+    <w:p>
+      <w:pPr>
+        <w:rPr>
+          <w:lang w:val="en-US"/>
+        </w:rPr>
+      </w:pPr>
+    </w:p>
+    <w:p>
+      <w:pPr>
+        <w:rPr>
+          <w:lang w:val="en-US"/>
+        </w:rPr>
+      </w:pPr>
+      <w:r>
+        <w:rPr>
+          <w:lang w:val="en-US"/>
+        </w:rPr>
+        <w:t>{{performance_level_chart}}</w:t>
+      </w:r>
+    </w:p>
+    <w:p>
+      <w:pPr>
+        <w:rPr>
+          <w:lang w:val="en-US"/>
+        </w:rPr>
+      </w:pPr>
+    </w:p>
+    <w:p>
+      <w:pPr>
+        <w:rPr>
+          <w:lang w:val="en-US"/>
+        </w:rPr>
+      </w:pPr>
       <w:r>
         <w:rPr>
           <w:highlight w:val="lightGray"/>
+          <w:lang w:val="en-US"/>
         </w:rPr>
         <w:t>[ANALYSE]</w:t>
       </w:r>

</xml_diff>

<commit_message>
[CHANGE] change the code to get the different GPS coordinates
</commit_message>
<xml_diff>
--- a/assets/templates/template_scada.docx
+++ b/assets/templates/template_scada.docx
@@ -1016,22 +1016,49 @@
     </w:p>
     <w:p>
       <w:r>
-        <w:t xml:space="preserve">Localisation : {{LOCALISATION}} </w:t>
-      </w:r>
-    </w:p>
-    <w:p>
-      <w:r>
-        <w:t>Client : {{CLIENT}}</w:t>
-      </w:r>
-    </w:p>
-    <w:p>
-      <w:r>
-        <w:t xml:space="preserve">Contact : {{CONTACT_CLIENT}} </w:t>
-      </w:r>
-    </w:p>
-    <w:p>
-      <w:r>
-        <w:t xml:space="preserve">Constructeur / Exploitant : {{CONTRACTOR}} </w:t>
+        <w:t>Localisation : {{</w:t>
+      </w:r>
+      <w:r>
+        <w:t>client_location</w:t>
+      </w:r>
+      <w:r>
+        <w:t xml:space="preserve">}} </w:t>
+      </w:r>
+    </w:p>
+    <w:p>
+      <w:r>
+        <w:t>Client : {{</w:t>
+      </w:r>
+      <w:r>
+        <w:t>client_name</w:t>
+      </w:r>
+      <w:r>
+        <w:t>}}</w:t>
+      </w:r>
+    </w:p>
+    <w:p>
+      <w:r>
+        <w:t>Contact : {{</w:t>
+      </w:r>
+      <w:r>
+        <w:t>client_contact</w:t>
+      </w:r>
+      <w:r>
+        <w:t xml:space="preserve"> </w:t>
+      </w:r>
+      <w:r>
+        <w:t xml:space="preserve">}} </w:t>
+      </w:r>
+    </w:p>
+    <w:p>
+      <w:r>
+        <w:t>Constructeur / Exploitant : {{</w:t>
+      </w:r>
+      <w:r>
+        <w:t>constructor</w:t>
+      </w:r>
+      <w:r>
+        <w:t xml:space="preserve">}} </w:t>
       </w:r>
     </w:p>
     <w:p/>
@@ -1041,18 +1068,64 @@
       </w:r>
     </w:p>
     <w:p>
-      <w:r>
-        <w:t>{{AUTEUR}}</w:t>
-      </w:r>
-    </w:p>
-    <w:p>
-      <w:r>
-        <w:t>Email : {{MAIL_AUTEUR}}</w:t>
-      </w:r>
-    </w:p>
-    <w:p>
-      <w:r>
-        <w:t>Téléphone : {{TEL_AUTEUR}}</w:t>
+      <w:pPr>
+        <w:rPr>
+          <w:lang w:val="en-US"/>
+        </w:rPr>
+      </w:pPr>
+      <w:r>
+        <w:rPr>
+          <w:lang w:val="en-US"/>
+        </w:rPr>
+        <w:t>{{</w:t>
+      </w:r>
+      <w:r>
+        <w:rPr>
+          <w:lang w:val="en-US"/>
+        </w:rPr>
+        <w:t>author_name</w:t>
+      </w:r>
+      <w:r>
+        <w:rPr>
+          <w:lang w:val="en-US"/>
+        </w:rPr>
+        <w:t>}}</w:t>
+      </w:r>
+    </w:p>
+    <w:p>
+      <w:pPr>
+        <w:rPr>
+          <w:lang w:val="en-US"/>
+        </w:rPr>
+      </w:pPr>
+      <w:r>
+        <w:rPr>
+          <w:lang w:val="en-US"/>
+        </w:rPr>
+        <w:t>Email : {{</w:t>
+      </w:r>
+      <w:r>
+        <w:rPr>
+          <w:lang w:val="en-US"/>
+        </w:rPr>
+        <w:t>author_email</w:t>
+      </w:r>
+      <w:r>
+        <w:rPr>
+          <w:lang w:val="en-US"/>
+        </w:rPr>
+        <w:t>}}</w:t>
+      </w:r>
+    </w:p>
+    <w:p>
+      <w:r>
+        <w:t>Téléphone : {{</w:t>
+      </w:r>
+      <w:r>
+        <w:t>author_phone</w:t>
+      </w:r>
+      <w:r>
+        <w:t>}}</w:t>
       </w:r>
     </w:p>
     <w:p/>
@@ -1291,7 +1364,7 @@
     </w:p>
     <w:p>
       <w:r>
-        <w:t>[TODO.TABLEAU COORDONNE GPS]</w:t>
+        <w:t>[TABLE:GPS_COORDINATES_TABLE]</w:t>
       </w:r>
     </w:p>
     <w:p>
@@ -1309,10 +1382,10 @@
     </w:p>
     <w:p>
       <w:r>
-        <w:t>[T</w:t>
-      </w:r>
-      <w:r>
-        <w:t>ODO</w:t>
+        <w:t>[</w:t>
+      </w:r>
+      <w:r>
+        <w:t>TABLE</w:t>
       </w:r>
       <w:r>
         <w:t>:CSV_FILES_TABLE]</w:t>

</xml_diff>

<commit_message>
[CHANGE] change the code to metadata
</commit_message>
<xml_diff>
--- a/assets/templates/template_scada.docx
+++ b/assets/templates/template_scada.docx
@@ -1063,7 +1063,15 @@
     </w:p>
     <w:p/>
     <w:p>
-      <w:r>
+      <w:pPr>
+        <w:rPr>
+          <w:lang w:val="en-US"/>
+        </w:rPr>
+      </w:pPr>
+      <w:r>
+        <w:rPr>
+          <w:lang w:val="en-US"/>
+        </w:rPr>
         <w:t>Rédacteur</w:t>
       </w:r>
     </w:p>
@@ -1135,18 +1143,64 @@
       </w:r>
     </w:p>
     <w:p>
-      <w:r>
-        <w:t>{{VERIFICATEUR}}</w:t>
-      </w:r>
-    </w:p>
-    <w:p>
-      <w:r>
-        <w:t>Email : {{MAIL_VERIFICATEUR}}</w:t>
-      </w:r>
-    </w:p>
-    <w:p>
-      <w:r>
-        <w:t>Téléphone : {{TEL_VERIFICATEUR}}</w:t>
+      <w:pPr>
+        <w:rPr>
+          <w:lang w:val="en-US"/>
+        </w:rPr>
+      </w:pPr>
+      <w:r>
+        <w:rPr>
+          <w:lang w:val="en-US"/>
+        </w:rPr>
+        <w:t>{{</w:t>
+      </w:r>
+      <w:r>
+        <w:rPr>
+          <w:lang w:val="en-US"/>
+        </w:rPr>
+        <w:t>verificator_name</w:t>
+      </w:r>
+      <w:r>
+        <w:rPr>
+          <w:lang w:val="en-US"/>
+        </w:rPr>
+        <w:t>}}</w:t>
+      </w:r>
+    </w:p>
+    <w:p>
+      <w:pPr>
+        <w:rPr>
+          <w:lang w:val="en-US"/>
+        </w:rPr>
+      </w:pPr>
+      <w:r>
+        <w:rPr>
+          <w:lang w:val="en-US"/>
+        </w:rPr>
+        <w:t>Email : {{</w:t>
+      </w:r>
+      <w:r>
+        <w:rPr>
+          <w:lang w:val="en-US"/>
+        </w:rPr>
+        <w:t xml:space="preserve">verificator_email </w:t>
+      </w:r>
+      <w:r>
+        <w:rPr>
+          <w:lang w:val="en-US"/>
+        </w:rPr>
+        <w:t>}}</w:t>
+      </w:r>
+    </w:p>
+    <w:p>
+      <w:r>
+        <w:t>Téléphone : {{</w:t>
+      </w:r>
+      <w:r>
+        <w:t>verificator_phone</w:t>
+      </w:r>
+      <w:r>
+        <w:t>}}</w:t>
       </w:r>
     </w:p>
     <w:p/>
@@ -1156,18 +1210,67 @@
       </w:r>
     </w:p>
     <w:p>
-      <w:r>
-        <w:t>{{APPROBATEUR}}</w:t>
-      </w:r>
-    </w:p>
-    <w:p>
-      <w:r>
-        <w:t>Email : {{MAIL_APPROBATEUR}}</w:t>
-      </w:r>
-    </w:p>
-    <w:p>
-      <w:r>
-        <w:t>Téléphone : {{TEL_APPROBATEUR}}</w:t>
+      <w:pPr>
+        <w:rPr>
+          <w:lang w:val="en-US"/>
+        </w:rPr>
+      </w:pPr>
+      <w:r>
+        <w:rPr>
+          <w:lang w:val="en-US"/>
+        </w:rPr>
+        <w:t>{{</w:t>
+      </w:r>
+      <w:r>
+        <w:rPr>
+          <w:lang w:val="en-US"/>
+        </w:rPr>
+        <w:t xml:space="preserve">approver_name </w:t>
+      </w:r>
+      <w:r>
+        <w:rPr>
+          <w:lang w:val="en-US"/>
+        </w:rPr>
+        <w:t>}}</w:t>
+      </w:r>
+    </w:p>
+    <w:p>
+      <w:pPr>
+        <w:rPr>
+          <w:lang w:val="en-US"/>
+        </w:rPr>
+      </w:pPr>
+      <w:r>
+        <w:rPr>
+          <w:lang w:val="en-US"/>
+        </w:rPr>
+        <w:t>Email : {{</w:t>
+      </w:r>
+      <w:r>
+        <w:rPr>
+          <w:lang w:val="en-US"/>
+        </w:rPr>
+        <w:t xml:space="preserve">approver_email </w:t>
+      </w:r>
+      <w:r>
+        <w:rPr>
+          <w:lang w:val="en-US"/>
+        </w:rPr>
+        <w:t>}}</w:t>
+      </w:r>
+    </w:p>
+    <w:p>
+      <w:r>
+        <w:t>Téléphone : {{</w:t>
+      </w:r>
+      <w:r>
+        <w:t>approver_phone</w:t>
+      </w:r>
+      <w:r>
+        <w:t xml:space="preserve"> </w:t>
+      </w:r>
+      <w:r>
+        <w:t>}}</w:t>
       </w:r>
     </w:p>
     <w:p/>
@@ -6073,6 +6176,7 @@
   <w:style w:type="character" w:default="1" w:styleId="Policepardfaut">
     <w:name w:val="Default Paragraph Font"/>
     <w:uiPriority w:val="1"/>
+    <w:semiHidden/>
     <w:unhideWhenUsed/>
   </w:style>
   <w:style w:type="table" w:default="1" w:styleId="TableauNormal">

</xml_diff>

<commit_message>
[CHANGE] support more metadata in the word scada output
</commit_message>
<xml_diff>
--- a/assets/templates/template_scada.docx
+++ b/assets/templates/template_scada.docx
@@ -268,7 +268,21 @@
           <w:sz w:val="36"/>
           <w:szCs w:val="36"/>
         </w:rPr>
-        <w:t xml:space="preserve"> {{CLIENT}}</w:t>
+        <w:t xml:space="preserve"> {{</w:t>
+      </w:r>
+      <w:r>
+        <w:rPr>
+          <w:sz w:val="36"/>
+          <w:szCs w:val="36"/>
+        </w:rPr>
+        <w:t>client_name</w:t>
+      </w:r>
+      <w:r>
+        <w:rPr>
+          <w:sz w:val="36"/>
+          <w:szCs w:val="36"/>
+        </w:rPr>
+        <w:t>}}</w:t>
       </w:r>
     </w:p>
     <w:p>
@@ -1044,251 +1058,378 @@
         <w:t>client_contact</w:t>
       </w:r>
       <w:r>
+        <w:t xml:space="preserve">}} </w:t>
+      </w:r>
+    </w:p>
+    <w:p>
+      <w:r>
+        <w:t>Constructeur / Exploitant : {{</w:t>
+      </w:r>
+      <w:r>
+        <w:t>constructor</w:t>
+      </w:r>
+      <w:r>
+        <w:t xml:space="preserve">}} </w:t>
+      </w:r>
+    </w:p>
+    <w:p/>
+    <w:p>
+      <w:r>
+        <w:t>Rédacteur</w:t>
+      </w:r>
+    </w:p>
+    <w:p>
+      <w:r>
+        <w:t>{{</w:t>
+      </w:r>
+      <w:r>
+        <w:t>author_name</w:t>
+      </w:r>
+      <w:r>
+        <w:t>}}</w:t>
+      </w:r>
+    </w:p>
+    <w:p>
+      <w:pPr>
+        <w:rPr>
+          <w:lang w:val="en-US"/>
+        </w:rPr>
+      </w:pPr>
+      <w:r>
+        <w:rPr>
+          <w:lang w:val="en-US"/>
+        </w:rPr>
+        <w:t>Email : {{</w:t>
+      </w:r>
+      <w:r>
+        <w:rPr>
+          <w:lang w:val="en-US"/>
+        </w:rPr>
+        <w:t>author_email</w:t>
+      </w:r>
+      <w:r>
+        <w:rPr>
+          <w:lang w:val="en-US"/>
+        </w:rPr>
+        <w:t>}}</w:t>
+      </w:r>
+    </w:p>
+    <w:p>
+      <w:pPr>
+        <w:rPr>
+          <w:lang w:val="en-US"/>
+        </w:rPr>
+      </w:pPr>
+      <w:r>
+        <w:rPr>
+          <w:lang w:val="en-US"/>
+        </w:rPr>
+        <w:t>Téléphone : {{</w:t>
+      </w:r>
+      <w:r>
+        <w:rPr>
+          <w:lang w:val="en-US"/>
+        </w:rPr>
+        <w:t>author_phone</w:t>
+      </w:r>
+      <w:r>
+        <w:rPr>
+          <w:lang w:val="en-US"/>
+        </w:rPr>
+        <w:t>}}</w:t>
+      </w:r>
+    </w:p>
+    <w:p>
+      <w:pPr>
+        <w:rPr>
+          <w:lang w:val="en-US"/>
+        </w:rPr>
+      </w:pPr>
+    </w:p>
+    <w:p>
+      <w:pPr>
+        <w:rPr>
+          <w:lang w:val="en-US"/>
+        </w:rPr>
+      </w:pPr>
+      <w:r>
+        <w:rPr>
+          <w:lang w:val="en-US"/>
+        </w:rPr>
+        <w:t>Vérificateur</w:t>
+      </w:r>
+    </w:p>
+    <w:p>
+      <w:pPr>
+        <w:rPr>
+          <w:lang w:val="en-US"/>
+        </w:rPr>
+      </w:pPr>
+      <w:r>
+        <w:rPr>
+          <w:lang w:val="en-US"/>
+        </w:rPr>
+        <w:t>{{</w:t>
+      </w:r>
+      <w:r>
+        <w:rPr>
+          <w:lang w:val="en-US"/>
+        </w:rPr>
+        <w:t>verificator_name</w:t>
+      </w:r>
+      <w:r>
+        <w:rPr>
+          <w:lang w:val="en-US"/>
+        </w:rPr>
+        <w:t>}}</w:t>
+      </w:r>
+    </w:p>
+    <w:p>
+      <w:pPr>
+        <w:rPr>
+          <w:lang w:val="en-US"/>
+        </w:rPr>
+      </w:pPr>
+      <w:r>
+        <w:rPr>
+          <w:lang w:val="en-US"/>
+        </w:rPr>
+        <w:t>Email : {{</w:t>
+      </w:r>
+      <w:r>
+        <w:rPr>
+          <w:lang w:val="en-US"/>
+        </w:rPr>
+        <w:t>verificator_email</w:t>
+      </w:r>
+      <w:r>
+        <w:rPr>
+          <w:lang w:val="en-US"/>
+        </w:rPr>
+        <w:t>}}</w:t>
+      </w:r>
+    </w:p>
+    <w:p>
+      <w:pPr>
+        <w:rPr>
+          <w:lang w:val="en-US"/>
+        </w:rPr>
+      </w:pPr>
+      <w:r>
+        <w:rPr>
+          <w:lang w:val="en-US"/>
+        </w:rPr>
+        <w:t>Téléphone : {{</w:t>
+      </w:r>
+      <w:r>
+        <w:rPr>
+          <w:lang w:val="en-US"/>
+        </w:rPr>
+        <w:t>verificator_phone</w:t>
+      </w:r>
+      <w:r>
+        <w:rPr>
+          <w:lang w:val="en-US"/>
+        </w:rPr>
+        <w:t>}}</w:t>
+      </w:r>
+    </w:p>
+    <w:p>
+      <w:pPr>
+        <w:rPr>
+          <w:lang w:val="en-US"/>
+        </w:rPr>
+      </w:pPr>
+    </w:p>
+    <w:p>
+      <w:pPr>
+        <w:rPr>
+          <w:lang w:val="en-US"/>
+        </w:rPr>
+      </w:pPr>
+      <w:r>
+        <w:rPr>
+          <w:lang w:val="en-US"/>
+        </w:rPr>
+        <w:t>Approbateur</w:t>
+      </w:r>
+    </w:p>
+    <w:p>
+      <w:pPr>
+        <w:rPr>
+          <w:lang w:val="en-US"/>
+        </w:rPr>
+      </w:pPr>
+      <w:r>
+        <w:rPr>
+          <w:lang w:val="en-US"/>
+        </w:rPr>
+        <w:t>{{</w:t>
+      </w:r>
+      <w:r>
+        <w:rPr>
+          <w:lang w:val="en-US"/>
+        </w:rPr>
+        <w:t>approver_name</w:t>
+      </w:r>
+      <w:r>
+        <w:rPr>
+          <w:lang w:val="en-US"/>
+        </w:rPr>
+        <w:t>}</w:t>
+      </w:r>
+      <w:r>
+        <w:rPr>
+          <w:lang w:val="en-US"/>
+        </w:rPr>
+        <w:t>}</w:t>
+      </w:r>
+    </w:p>
+    <w:p>
+      <w:pPr>
+        <w:rPr>
+          <w:lang w:val="en-US"/>
+        </w:rPr>
+      </w:pPr>
+      <w:r>
+        <w:rPr>
+          <w:lang w:val="en-US"/>
+        </w:rPr>
+        <w:t>Email : {{</w:t>
+      </w:r>
+      <w:r>
+        <w:rPr>
+          <w:lang w:val="en-US"/>
+        </w:rPr>
+        <w:t>approver_email</w:t>
+      </w:r>
+      <w:r>
+        <w:rPr>
+          <w:lang w:val="en-US"/>
+        </w:rPr>
+        <w:t>}}</w:t>
+      </w:r>
+    </w:p>
+    <w:p>
+      <w:r>
+        <w:t>Téléphone : {{</w:t>
+      </w:r>
+      <w:r>
+        <w:t>approver_phone</w:t>
+      </w:r>
+      <w:r>
+        <w:t>}}</w:t>
+      </w:r>
+    </w:p>
+    <w:p/>
+    <w:p>
+      <w:pPr>
+        <w:spacing w:after="160" w:line="259" w:lineRule="auto"/>
+      </w:pPr>
+      <w:r>
+        <w:br w:type="page"/>
+      </w:r>
+    </w:p>
+    <w:p/>
+    <w:p>
+      <w:pPr>
+        <w:pStyle w:val="Titre1"/>
+      </w:pPr>
+      <w:r>
+        <w:t>Synthèse</w:t>
+      </w:r>
+    </w:p>
+    <w:p>
+      <w:pPr>
+        <w:jc w:val="both"/>
+      </w:pPr>
+      <w:r>
+        <w:t xml:space="preserve">Les données SCADA du parc éolien </w:t>
+      </w:r>
+      <w:r>
+        <w:t>{{park_name}}</w:t>
+      </w:r>
+      <w:r>
+        <w:t xml:space="preserve"> ont été analysées sur la période du </w:t>
+      </w:r>
+      <w:r>
+        <w:t>{{analysis_start}}</w:t>
+      </w:r>
+      <w:r>
+        <w:t xml:space="preserve"> au </w:t>
+      </w:r>
+      <w:r>
+        <w:t>{{analysis_end}}</w:t>
+      </w:r>
+      <w:r>
+        <w:t xml:space="preserve">, à partir des informations fournies par le client. Le parc est composé de </w:t>
+      </w:r>
+      <w:r>
+        <w:t>{{turbine_count}}</w:t>
+      </w:r>
+      <w:r>
+        <w:t xml:space="preserve"> éoliennes de type</w:t>
+      </w:r>
+      <w:r>
         <w:t xml:space="preserve"> </w:t>
       </w:r>
       <w:r>
-        <w:t xml:space="preserve">}} </w:t>
-      </w:r>
-    </w:p>
-    <w:p>
-      <w:r>
-        <w:t>Constructeur / Exploitant : {{</w:t>
-      </w:r>
-      <w:r>
-        <w:t>constructor</w:t>
-      </w:r>
-      <w:r>
-        <w:t xml:space="preserve">}} </w:t>
+        <w:t>{{model_wtg}</w:t>
+      </w:r>
+      <w:r>
+        <w:t>}</w:t>
+      </w:r>
+      <w:r>
+        <w:t xml:space="preserve">, désignées </w:t>
+      </w:r>
+      <w:r>
+        <w:t>{{turbine_list}}</w:t>
+      </w:r>
+      <w:r>
+        <w:t xml:space="preserve"> L’ensemble des turbines a été pris en compte dans l’analyse.</w:t>
+      </w:r>
+    </w:p>
+    <w:p>
+      <w:pPr>
+        <w:jc w:val="both"/>
+      </w:pPr>
+    </w:p>
+    <w:p>
+      <w:pPr>
+        <w:jc w:val="both"/>
+      </w:pPr>
+      <w:r>
+        <w:t>Le tableau ci-après présente une évaluation synthétique des performances du parc, en mettant en évidence, pour chaque indicateur, le niveau de performance de chaque éolienne ainsi que les éventuels écarts observés.</w:t>
+      </w:r>
+    </w:p>
+    <w:p>
+      <w:pPr>
+        <w:jc w:val="both"/>
+      </w:pPr>
+    </w:p>
+    <w:p>
+      <w:pPr>
+        <w:jc w:val="both"/>
+      </w:pPr>
+      <w:r>
+        <w:t>[TABLE:STATUS_SUMMARY_TABLE]</w:t>
       </w:r>
     </w:p>
     <w:p/>
     <w:p>
       <w:pPr>
-        <w:rPr>
-          <w:lang w:val="en-US"/>
-        </w:rPr>
-      </w:pPr>
-      <w:r>
-        <w:rPr>
-          <w:lang w:val="en-US"/>
-        </w:rPr>
-        <w:t>Rédacteur</w:t>
-      </w:r>
-    </w:p>
-    <w:p>
-      <w:pPr>
-        <w:rPr>
-          <w:lang w:val="en-US"/>
-        </w:rPr>
-      </w:pPr>
-      <w:r>
-        <w:rPr>
-          <w:lang w:val="en-US"/>
-        </w:rPr>
-        <w:t>{{</w:t>
-      </w:r>
-      <w:r>
-        <w:rPr>
-          <w:lang w:val="en-US"/>
-        </w:rPr>
-        <w:t>author_name</w:t>
-      </w:r>
-      <w:r>
-        <w:rPr>
-          <w:lang w:val="en-US"/>
-        </w:rPr>
-        <w:t>}}</w:t>
-      </w:r>
-    </w:p>
-    <w:p>
-      <w:pPr>
-        <w:rPr>
-          <w:lang w:val="en-US"/>
-        </w:rPr>
-      </w:pPr>
-      <w:r>
-        <w:rPr>
-          <w:lang w:val="en-US"/>
-        </w:rPr>
-        <w:t>Email : {{</w:t>
-      </w:r>
-      <w:r>
-        <w:rPr>
-          <w:lang w:val="en-US"/>
-        </w:rPr>
-        <w:t>author_email</w:t>
-      </w:r>
-      <w:r>
-        <w:rPr>
-          <w:lang w:val="en-US"/>
-        </w:rPr>
-        <w:t>}}</w:t>
-      </w:r>
-    </w:p>
-    <w:p>
-      <w:r>
-        <w:t>Téléphone : {{</w:t>
-      </w:r>
-      <w:r>
-        <w:t>author_phone</w:t>
-      </w:r>
-      <w:r>
-        <w:t>}}</w:t>
-      </w:r>
-    </w:p>
-    <w:p/>
-    <w:p>
-      <w:r>
-        <w:t>Vérificateur</w:t>
-      </w:r>
-    </w:p>
-    <w:p>
-      <w:pPr>
-        <w:rPr>
-          <w:lang w:val="en-US"/>
-        </w:rPr>
-      </w:pPr>
-      <w:r>
-        <w:rPr>
-          <w:lang w:val="en-US"/>
-        </w:rPr>
-        <w:t>{{</w:t>
-      </w:r>
-      <w:r>
-        <w:rPr>
-          <w:lang w:val="en-US"/>
-        </w:rPr>
-        <w:t>verificator_name</w:t>
-      </w:r>
-      <w:r>
-        <w:rPr>
-          <w:lang w:val="en-US"/>
-        </w:rPr>
-        <w:t>}}</w:t>
-      </w:r>
-    </w:p>
-    <w:p>
-      <w:pPr>
-        <w:rPr>
-          <w:lang w:val="en-US"/>
-        </w:rPr>
-      </w:pPr>
-      <w:r>
-        <w:rPr>
-          <w:lang w:val="en-US"/>
-        </w:rPr>
-        <w:t>Email : {{</w:t>
-      </w:r>
-      <w:r>
-        <w:rPr>
-          <w:lang w:val="en-US"/>
-        </w:rPr>
-        <w:t xml:space="preserve">verificator_email </w:t>
-      </w:r>
-      <w:r>
-        <w:rPr>
-          <w:lang w:val="en-US"/>
-        </w:rPr>
-        <w:t>}}</w:t>
-      </w:r>
-    </w:p>
-    <w:p>
-      <w:r>
-        <w:t>Téléphone : {{</w:t>
-      </w:r>
-      <w:r>
-        <w:t>verificator_phone</w:t>
-      </w:r>
-      <w:r>
-        <w:t>}}</w:t>
-      </w:r>
-    </w:p>
-    <w:p/>
-    <w:p>
-      <w:r>
-        <w:t>Approbateur</w:t>
-      </w:r>
-    </w:p>
-    <w:p>
-      <w:pPr>
-        <w:rPr>
-          <w:lang w:val="en-US"/>
-        </w:rPr>
-      </w:pPr>
-      <w:r>
-        <w:rPr>
-          <w:lang w:val="en-US"/>
-        </w:rPr>
-        <w:t>{{</w:t>
-      </w:r>
-      <w:r>
-        <w:rPr>
-          <w:lang w:val="en-US"/>
-        </w:rPr>
-        <w:t xml:space="preserve">approver_name </w:t>
-      </w:r>
-      <w:r>
-        <w:rPr>
-          <w:lang w:val="en-US"/>
-        </w:rPr>
-        <w:t>}}</w:t>
-      </w:r>
-    </w:p>
-    <w:p>
-      <w:pPr>
-        <w:rPr>
-          <w:lang w:val="en-US"/>
-        </w:rPr>
-      </w:pPr>
-      <w:r>
-        <w:rPr>
-          <w:lang w:val="en-US"/>
-        </w:rPr>
-        <w:t>Email : {{</w:t>
-      </w:r>
-      <w:r>
-        <w:rPr>
-          <w:lang w:val="en-US"/>
-        </w:rPr>
-        <w:t xml:space="preserve">approver_email </w:t>
-      </w:r>
-      <w:r>
-        <w:rPr>
-          <w:lang w:val="en-US"/>
-        </w:rPr>
-        <w:t>}}</w:t>
-      </w:r>
-    </w:p>
-    <w:p>
-      <w:r>
-        <w:t>Téléphone : {{</w:t>
-      </w:r>
-      <w:r>
-        <w:t>approver_phone</w:t>
-      </w:r>
-      <w:r>
-        <w:t xml:space="preserve"> </w:t>
-      </w:r>
-      <w:r>
-        <w:t>}}</w:t>
-      </w:r>
-    </w:p>
-    <w:p/>
-    <w:p>
-      <w:pPr>
-        <w:spacing w:after="160" w:line="259" w:lineRule="auto"/>
-      </w:pPr>
-      <w:r>
-        <w:br w:type="page"/>
-      </w:r>
-    </w:p>
-    <w:p/>
-    <w:p>
-      <w:pPr>
         <w:pStyle w:val="Titre1"/>
       </w:pPr>
       <w:r>
-        <w:t>Synthèse</w:t>
+        <w:t>Contexte de l’étude</w:t>
+      </w:r>
+    </w:p>
+    <w:p>
+      <w:pPr>
+        <w:pStyle w:val="Titre2"/>
+      </w:pPr>
+      <w:r>
+        <w:t>Présentation générale du parc</w:t>
       </w:r>
     </w:p>
     <w:p>
@@ -1296,136 +1437,43 @@
         <w:jc w:val="both"/>
       </w:pPr>
       <w:r>
-        <w:t xml:space="preserve">Les données SCADA du parc éolien </w:t>
-      </w:r>
-      <w:r>
-        <w:t>{{park_name}}</w:t>
-      </w:r>
-      <w:r>
-        <w:t xml:space="preserve"> ont été analysées sur la période du </w:t>
-      </w:r>
-      <w:r>
-        <w:t>{{analysis_start}}</w:t>
-      </w:r>
-      <w:r>
-        <w:t xml:space="preserve"> au </w:t>
-      </w:r>
-      <w:r>
-        <w:t>{{analysis_end}}</w:t>
-      </w:r>
-      <w:r>
-        <w:t xml:space="preserve">, à partir des informations fournies par le client. Le parc est composé de </w:t>
-      </w:r>
-      <w:r>
-        <w:t>{{turbine_count}}</w:t>
-      </w:r>
-      <w:r>
-        <w:t xml:space="preserve"> éoliennes de type</w:t>
-      </w:r>
-      <w:r>
-        <w:t xml:space="preserve"> </w:t>
-      </w:r>
-      <w:r>
-        <w:t>{{model_wtg}</w:t>
-      </w:r>
-      <w:r>
-        <w:t>}</w:t>
-      </w:r>
-      <w:r>
-        <w:t xml:space="preserve">, désignées </w:t>
-      </w:r>
-      <w:r>
-        <w:t>{{turbine_list}}</w:t>
-      </w:r>
-      <w:r>
-        <w:t xml:space="preserve"> L’ensemble des turbines a été pris en compte dans l’analyse.</w:t>
+        <w:t>Le parc éolien {{</w:t>
+      </w:r>
+      <w:r>
+        <w:t>park_name</w:t>
+      </w:r>
+      <w:r>
+        <w:t>}} est situé sur le territoire des communes de {{COMMUNES}}, dans la région de {{REGION}}. Il est composé de {{</w:t>
+      </w:r>
+      <w:r>
+        <w:t>turbine_count</w:t>
+      </w:r>
+      <w:r>
+        <w:t>}} éoliennes de type {{</w:t>
+      </w:r>
+      <w:r>
+        <w:t>model_wtg</w:t>
+      </w:r>
+      <w:r>
+        <w:t>}}, d’une puissance nominale unitaire de {{</w:t>
+      </w:r>
+      <w:r>
+        <w:t>nominal_power</w:t>
+      </w:r>
+      <w:r>
+        <w:t>}}, soit une puissance totale installée de {{</w:t>
+      </w:r>
+      <w:r>
+        <w:t xml:space="preserve">total_power </w:t>
+      </w:r>
+      <w:r>
+        <w:t>}}.</w:t>
       </w:r>
     </w:p>
     <w:p>
       <w:pPr>
         <w:jc w:val="both"/>
       </w:pPr>
-    </w:p>
-    <w:p>
-      <w:pPr>
-        <w:jc w:val="both"/>
-      </w:pPr>
-      <w:r>
-        <w:t>Le tableau ci-après présente une évaluation synthétique des performances du parc, en mettant en évidence, pour chaque indicateur, le niveau de performance de chaque éolienne ainsi que les éventuels écarts observés.</w:t>
-      </w:r>
-    </w:p>
-    <w:p>
-      <w:pPr>
-        <w:jc w:val="both"/>
-      </w:pPr>
-    </w:p>
-    <w:p>
-      <w:pPr>
-        <w:jc w:val="both"/>
-      </w:pPr>
-      <w:r>
-        <w:t>[TABLE:STATUS_SUMMARY_TABLE]</w:t>
-      </w:r>
-    </w:p>
-    <w:p/>
-    <w:p>
-      <w:pPr>
-        <w:pStyle w:val="Titre1"/>
-      </w:pPr>
-      <w:r>
-        <w:t>Contexte de l’étude</w:t>
-      </w:r>
-    </w:p>
-    <w:p>
-      <w:pPr>
-        <w:pStyle w:val="Titre2"/>
-      </w:pPr>
-      <w:r>
-        <w:t>Présentation générale du parc</w:t>
-      </w:r>
-    </w:p>
-    <w:p>
-      <w:pPr>
-        <w:jc w:val="both"/>
-      </w:pPr>
-      <w:r>
-        <w:t>Le parc éolien {{</w:t>
-      </w:r>
-      <w:r>
-        <w:t>park_name</w:t>
-      </w:r>
-      <w:r>
-        <w:t>}} est situé sur le territoire des communes de {{COMMUNES}}, dans la région de {{REGION}}. Il est composé de {{</w:t>
-      </w:r>
-      <w:r>
-        <w:t>turbine_count</w:t>
-      </w:r>
-      <w:r>
-        <w:t>}} éoliennes de type {{</w:t>
-      </w:r>
-      <w:r>
-        <w:t>model_wtg</w:t>
-      </w:r>
-      <w:r>
-        <w:t>}}, d’une puissance nominale unitaire de {{</w:t>
-      </w:r>
-      <w:r>
-        <w:t>nominal_power</w:t>
-      </w:r>
-      <w:r>
-        <w:t>}}, soit une puissance totale installée de {{</w:t>
-      </w:r>
-      <w:r>
-        <w:t xml:space="preserve">total_power </w:t>
-      </w:r>
-      <w:r>
-        <w:t>}}.</w:t>
-      </w:r>
-    </w:p>
-    <w:p>
-      <w:pPr>
-        <w:jc w:val="both"/>
-      </w:pPr>
       <w:r>
         <w:t>Les éoliennes du parc sont identifiées comme suit : {{</w:t>
       </w:r>
@@ -1433,7 +1481,7 @@
         <w:t>turbine_list</w:t>
       </w:r>
       <w:r>
-        <w:t>}}. L’implantation du parc et la disposition des éoliennes sont présen tées dans la figure ci-</w:t>
+        <w:t>}}. L’implantation du parc et la disposition des éoliennes sont présentées dans la figure ci-</w:t>
       </w:r>
       <w:r>
         <w:t>après :</w:t>

</xml_diff>

<commit_message>
[ADD] new file and logic to handle TBA
</commit_message>
<xml_diff>
--- a/assets/templates/template_scada.docx
+++ b/assets/templates/template_scada.docx
@@ -3696,15 +3696,109 @@
         <w:t>La disponibilité temporelle (TBA) permet d’évaluer la proportion du temps pendant lequel les éoliennes sont en état de fonctionnement, indépendamment du niveau de production.</w:t>
       </w:r>
     </w:p>
-    <w:p>
-      <w:r>
-        <w:t>[TODO.FIGURE]</w:t>
-      </w:r>
-    </w:p>
-    <w:p>
-      <w:r>
-        <w:t>[TODO.TABLEAU]</w:t>
-      </w:r>
+    <w:p/>
+    <w:p>
+      <w:pPr>
+        <w:rPr>
+          <w:lang w:val="en-US"/>
+        </w:rPr>
+      </w:pPr>
+      <w:r>
+        <w:rPr>
+          <w:lang w:val="en-US"/>
+        </w:rPr>
+        <w:t>[T</w:t>
+      </w:r>
+      <w:r>
+        <w:rPr>
+          <w:lang w:val="en-US"/>
+        </w:rPr>
+        <w:t>ABLE :TBA_C</w:t>
+      </w:r>
+      <w:r>
+        <w:rPr>
+          <w:lang w:val="en-US"/>
+        </w:rPr>
+        <w:t>UT_CUT_OUT_TABLE]</w:t>
+      </w:r>
+    </w:p>
+    <w:p>
+      <w:pPr>
+        <w:rPr>
+          <w:lang w:val="en-US"/>
+        </w:rPr>
+      </w:pPr>
+      <w:r>
+        <w:rPr>
+          <w:lang w:val="en-US"/>
+        </w:rPr>
+        <w:t>{{</w:t>
+      </w:r>
+      <w:r>
+        <w:rPr>
+          <w:lang w:val="en-US"/>
+        </w:rPr>
+        <w:t>tba_cut_in_cut_out_chart</w:t>
+      </w:r>
+      <w:r>
+        <w:rPr>
+          <w:lang w:val="en-US"/>
+        </w:rPr>
+        <w:t>}}</w:t>
+      </w:r>
+    </w:p>
+    <w:p>
+      <w:pPr>
+        <w:rPr>
+          <w:lang w:val="en-US"/>
+        </w:rPr>
+      </w:pPr>
+    </w:p>
+    <w:p>
+      <w:pPr>
+        <w:rPr>
+          <w:lang w:val="en-US"/>
+        </w:rPr>
+      </w:pPr>
+      <w:r>
+        <w:rPr>
+          <w:lang w:val="en-US"/>
+        </w:rPr>
+        <w:t>[TABLE :TBA_</w:t>
+      </w:r>
+      <w:r>
+        <w:rPr>
+          <w:lang w:val="en-US"/>
+        </w:rPr>
+        <w:t>MANUFACURER</w:t>
+      </w:r>
+      <w:r>
+        <w:rPr>
+          <w:lang w:val="en-US"/>
+        </w:rPr>
+        <w:t>_TABLE]</w:t>
+      </w:r>
+    </w:p>
+    <w:p>
+      <w:r>
+        <w:rPr>
+          <w:lang w:val="en-US"/>
+        </w:rPr>
+        <w:t>{{</w:t>
+      </w:r>
+      <w:r>
+        <w:t>tba_manufacturer_chart</w:t>
+      </w:r>
+      <w:r>
+        <w:t>}}</w:t>
+      </w:r>
+    </w:p>
+    <w:p>
+      <w:pPr>
+        <w:rPr>
+          <w:lang w:val="en-US"/>
+        </w:rPr>
+      </w:pPr>
     </w:p>
     <w:p>
       <w:pPr>
@@ -6272,7 +6366,6 @@
   <w:style w:type="character" w:default="1" w:styleId="Policepardfaut">
     <w:name w:val="Default Paragraph Font"/>
     <w:uiPriority w:val="1"/>
-    <w:semiHidden/>
     <w:unhideWhenUsed/>
   </w:style>
   <w:style w:type="table" w:default="1" w:styleId="TableauNormal">

</xml_diff>

<commit_message>
[CHANGE] change the code to handle TBA (Time base Availability)
</commit_message>
<xml_diff>
--- a/assets/templates/template_scada.docx
+++ b/assets/templates/template_scada.docx
@@ -3713,13 +3713,19 @@
         <w:rPr>
           <w:lang w:val="en-US"/>
         </w:rPr>
-        <w:t>ABLE :TBA_C</w:t>
-      </w:r>
-      <w:r>
-        <w:rPr>
-          <w:lang w:val="en-US"/>
-        </w:rPr>
-        <w:t>UT_CUT_OUT_TABLE]</w:t>
+        <w:t>ABLE:TBA</w:t>
+      </w:r>
+      <w:r>
+        <w:rPr>
+          <w:lang w:val="en-US"/>
+        </w:rPr>
+        <w:t>_CUT_IN_CUT_OUT_TABLE</w:t>
+      </w:r>
+      <w:r>
+        <w:rPr>
+          <w:lang w:val="en-US"/>
+        </w:rPr>
+        <w:t>]</w:t>
       </w:r>
     </w:p>
     <w:p>
@@ -3764,22 +3770,33 @@
         <w:rPr>
           <w:lang w:val="en-US"/>
         </w:rPr>
-        <w:t>[TABLE :TBA_</w:t>
-      </w:r>
-      <w:r>
-        <w:rPr>
-          <w:lang w:val="en-US"/>
-        </w:rPr>
-        <w:t>MANUFACURER</w:t>
-      </w:r>
-      <w:r>
-        <w:rPr>
-          <w:lang w:val="en-US"/>
-        </w:rPr>
-        <w:t>_TABLE]</w:t>
-      </w:r>
-    </w:p>
-    <w:p>
+        <w:t>[TABLE:TBA_</w:t>
+      </w:r>
+      <w:r>
+        <w:rPr>
+          <w:lang w:val="en-US"/>
+        </w:rPr>
+        <w:t>MANUFAC</w:t>
+      </w:r>
+      <w:r>
+        <w:rPr>
+          <w:lang w:val="en-US"/>
+        </w:rPr>
+        <w:t>T</w:t>
+      </w:r>
+      <w:r>
+        <w:rPr>
+          <w:lang w:val="en-US"/>
+        </w:rPr>
+        <w:t>URER_TABLE]</w:t>
+      </w:r>
+    </w:p>
+    <w:p>
+      <w:pPr>
+        <w:rPr>
+          <w:lang w:val="en-US"/>
+        </w:rPr>
+      </w:pPr>
       <w:r>
         <w:rPr>
           <w:lang w:val="en-US"/>
@@ -3787,10 +3804,10 @@
         <w:t>{{</w:t>
       </w:r>
       <w:r>
-        <w:t>tba_manufacturer_chart</w:t>
-      </w:r>
-      <w:r>
-        <w:t>}}</w:t>
+        <w:rPr>
+          <w:lang w:val="en-US"/>
+        </w:rPr>
+        <w:t>tba_manufacturer_chart}}</w:t>
       </w:r>
     </w:p>
     <w:p>
@@ -6366,6 +6383,7 @@
   <w:style w:type="character" w:default="1" w:styleId="Policepardfaut">
     <w:name w:val="Default Paragraph Font"/>
     <w:uiPriority w:val="1"/>
+    <w:semiHidden/>
     <w:unhideWhenUsed/>
   </w:style>
   <w:style w:type="table" w:default="1" w:styleId="TableauNormal">

</xml_diff>

<commit_message>
[CHANGE] change the code to handle headers
</commit_message>
<xml_diff>
--- a/assets/templates/template_scada.docx
+++ b/assets/templates/template_scada.docx
@@ -2578,7 +2578,19 @@
         <w:rPr>
           <w:lang w:val="en-US"/>
         </w:rPr>
-        <w:t>{{eba_manifacturer_chart}}</w:t>
+        <w:t>{{eba_man</w:t>
+      </w:r>
+      <w:r>
+        <w:rPr>
+          <w:lang w:val="en-US"/>
+        </w:rPr>
+        <w:t>u</w:t>
+      </w:r>
+      <w:r>
+        <w:rPr>
+          <w:lang w:val="en-US"/>
+        </w:rPr>
+        <w:t>facturer_chart}}</w:t>
       </w:r>
     </w:p>
     <w:p>

</xml_diff>

<commit_message>
[CHANGE] change the code to handle the different issues
</commit_message>
<xml_diff>
--- a/assets/templates/template_scada.docx
+++ b/assets/templates/template_scada.docx
@@ -1352,239 +1352,1946 @@
         <w:br w:type="page"/>
       </w:r>
     </w:p>
+    <w:sdt>
+      <w:sdtPr>
+        <w:id w:val="-1308466361"/>
+        <w:docPartObj>
+          <w:docPartGallery w:val="Table of Contents"/>
+          <w:docPartUnique/>
+        </w:docPartObj>
+      </w:sdtPr>
+      <w:sdtEndPr>
+        <w:rPr>
+          <w:rFonts w:ascii="Times New Roman" w:eastAsia="Times New Roman" w:hAnsi="Times New Roman" w:cs="Times New Roman"/>
+          <w:b/>
+          <w:bCs/>
+          <w:color w:val="auto"/>
+          <w:sz w:val="24"/>
+          <w:szCs w:val="24"/>
+        </w:rPr>
+      </w:sdtEndPr>
+      <w:sdtContent>
+        <w:p>
+          <w:pPr>
+            <w:pStyle w:val="En-ttedetabledesmatires"/>
+          </w:pPr>
+          <w:r>
+            <w:t>Table des matières</w:t>
+          </w:r>
+        </w:p>
+        <w:p>
+          <w:pPr>
+            <w:pStyle w:val="TM1"/>
+            <w:tabs>
+              <w:tab w:val="left" w:pos="480"/>
+              <w:tab w:val="right" w:leader="dot" w:pos="9062"/>
+            </w:tabs>
+            <w:rPr>
+              <w:noProof/>
+            </w:rPr>
+          </w:pPr>
+          <w:r>
+            <w:fldChar w:fldCharType="begin"/>
+          </w:r>
+          <w:r>
+            <w:instrText xml:space="preserve"> TOC \o "1-3" \h \z \u </w:instrText>
+          </w:r>
+          <w:r>
+            <w:fldChar w:fldCharType="separate"/>
+          </w:r>
+          <w:hyperlink w:anchor="_Toc230021426" w:history="1">
+            <w:r>
+              <w:rPr>
+                <w:rStyle w:val="Lienhypertexte"/>
+                <w:noProof/>
+              </w:rPr>
+              <w:t>1</w:t>
+            </w:r>
+            <w:r>
+              <w:rPr>
+                <w:noProof/>
+              </w:rPr>
+              <w:tab/>
+            </w:r>
+            <w:r>
+              <w:rPr>
+                <w:rStyle w:val="Lienhypertexte"/>
+                <w:noProof/>
+              </w:rPr>
+              <w:t>Synthèse</w:t>
+            </w:r>
+            <w:r>
+              <w:rPr>
+                <w:noProof/>
+                <w:webHidden/>
+              </w:rPr>
+              <w:tab/>
+            </w:r>
+            <w:r>
+              <w:rPr>
+                <w:noProof/>
+                <w:webHidden/>
+              </w:rPr>
+              <w:fldChar w:fldCharType="begin"/>
+            </w:r>
+            <w:r>
+              <w:rPr>
+                <w:noProof/>
+                <w:webHidden/>
+              </w:rPr>
+              <w:instrText xml:space="preserve"> PAGEREF _Toc230021426 \h </w:instrText>
+            </w:r>
+            <w:r>
+              <w:rPr>
+                <w:noProof/>
+                <w:webHidden/>
+              </w:rPr>
+            </w:r>
+            <w:r>
+              <w:rPr>
+                <w:noProof/>
+                <w:webHidden/>
+              </w:rPr>
+              <w:fldChar w:fldCharType="separate"/>
+            </w:r>
+            <w:r>
+              <w:rPr>
+                <w:noProof/>
+                <w:webHidden/>
+              </w:rPr>
+              <w:t>3</w:t>
+            </w:r>
+            <w:r>
+              <w:rPr>
+                <w:noProof/>
+                <w:webHidden/>
+              </w:rPr>
+              <w:fldChar w:fldCharType="end"/>
+            </w:r>
+          </w:hyperlink>
+        </w:p>
+        <w:p>
+          <w:pPr>
+            <w:pStyle w:val="TM1"/>
+            <w:tabs>
+              <w:tab w:val="left" w:pos="480"/>
+              <w:tab w:val="right" w:leader="dot" w:pos="9062"/>
+            </w:tabs>
+            <w:rPr>
+              <w:noProof/>
+            </w:rPr>
+          </w:pPr>
+          <w:hyperlink w:anchor="_Toc230021427" w:history="1">
+            <w:r>
+              <w:rPr>
+                <w:rStyle w:val="Lienhypertexte"/>
+                <w:noProof/>
+              </w:rPr>
+              <w:t>2</w:t>
+            </w:r>
+            <w:r>
+              <w:rPr>
+                <w:noProof/>
+              </w:rPr>
+              <w:tab/>
+            </w:r>
+            <w:r>
+              <w:rPr>
+                <w:rStyle w:val="Lienhypertexte"/>
+                <w:noProof/>
+              </w:rPr>
+              <w:t>Contexte de l’étude</w:t>
+            </w:r>
+            <w:r>
+              <w:rPr>
+                <w:noProof/>
+                <w:webHidden/>
+              </w:rPr>
+              <w:tab/>
+            </w:r>
+            <w:r>
+              <w:rPr>
+                <w:noProof/>
+                <w:webHidden/>
+              </w:rPr>
+              <w:fldChar w:fldCharType="begin"/>
+            </w:r>
+            <w:r>
+              <w:rPr>
+                <w:noProof/>
+                <w:webHidden/>
+              </w:rPr>
+              <w:instrText xml:space="preserve"> PAGEREF _Toc230021427 \h </w:instrText>
+            </w:r>
+            <w:r>
+              <w:rPr>
+                <w:noProof/>
+                <w:webHidden/>
+              </w:rPr>
+            </w:r>
+            <w:r>
+              <w:rPr>
+                <w:noProof/>
+                <w:webHidden/>
+              </w:rPr>
+              <w:fldChar w:fldCharType="separate"/>
+            </w:r>
+            <w:r>
+              <w:rPr>
+                <w:noProof/>
+                <w:webHidden/>
+              </w:rPr>
+              <w:t>3</w:t>
+            </w:r>
+            <w:r>
+              <w:rPr>
+                <w:noProof/>
+                <w:webHidden/>
+              </w:rPr>
+              <w:fldChar w:fldCharType="end"/>
+            </w:r>
+          </w:hyperlink>
+        </w:p>
+        <w:p>
+          <w:pPr>
+            <w:pStyle w:val="TM2"/>
+            <w:tabs>
+              <w:tab w:val="left" w:pos="960"/>
+              <w:tab w:val="right" w:leader="dot" w:pos="9062"/>
+            </w:tabs>
+            <w:rPr>
+              <w:noProof/>
+            </w:rPr>
+          </w:pPr>
+          <w:hyperlink w:anchor="_Toc230021428" w:history="1">
+            <w:r>
+              <w:rPr>
+                <w:rStyle w:val="Lienhypertexte"/>
+                <w:noProof/>
+              </w:rPr>
+              <w:t>2.1</w:t>
+            </w:r>
+            <w:r>
+              <w:rPr>
+                <w:noProof/>
+              </w:rPr>
+              <w:tab/>
+            </w:r>
+            <w:r>
+              <w:rPr>
+                <w:rStyle w:val="Lienhypertexte"/>
+                <w:noProof/>
+              </w:rPr>
+              <w:t>Présentation générale du parc</w:t>
+            </w:r>
+            <w:r>
+              <w:rPr>
+                <w:noProof/>
+                <w:webHidden/>
+              </w:rPr>
+              <w:tab/>
+            </w:r>
+            <w:r>
+              <w:rPr>
+                <w:noProof/>
+                <w:webHidden/>
+              </w:rPr>
+              <w:fldChar w:fldCharType="begin"/>
+            </w:r>
+            <w:r>
+              <w:rPr>
+                <w:noProof/>
+                <w:webHidden/>
+              </w:rPr>
+              <w:instrText xml:space="preserve"> PAGEREF _Toc230021428 \h </w:instrText>
+            </w:r>
+            <w:r>
+              <w:rPr>
+                <w:noProof/>
+                <w:webHidden/>
+              </w:rPr>
+            </w:r>
+            <w:r>
+              <w:rPr>
+                <w:noProof/>
+                <w:webHidden/>
+              </w:rPr>
+              <w:fldChar w:fldCharType="separate"/>
+            </w:r>
+            <w:r>
+              <w:rPr>
+                <w:noProof/>
+                <w:webHidden/>
+              </w:rPr>
+              <w:t>3</w:t>
+            </w:r>
+            <w:r>
+              <w:rPr>
+                <w:noProof/>
+                <w:webHidden/>
+              </w:rPr>
+              <w:fldChar w:fldCharType="end"/>
+            </w:r>
+          </w:hyperlink>
+        </w:p>
+        <w:p>
+          <w:pPr>
+            <w:pStyle w:val="TM2"/>
+            <w:tabs>
+              <w:tab w:val="left" w:pos="960"/>
+              <w:tab w:val="right" w:leader="dot" w:pos="9062"/>
+            </w:tabs>
+            <w:rPr>
+              <w:noProof/>
+            </w:rPr>
+          </w:pPr>
+          <w:hyperlink w:anchor="_Toc230021429" w:history="1">
+            <w:r>
+              <w:rPr>
+                <w:rStyle w:val="Lienhypertexte"/>
+                <w:noProof/>
+              </w:rPr>
+              <w:t>2.2</w:t>
+            </w:r>
+            <w:r>
+              <w:rPr>
+                <w:noProof/>
+              </w:rPr>
+              <w:tab/>
+            </w:r>
+            <w:r>
+              <w:rPr>
+                <w:rStyle w:val="Lienhypertexte"/>
+                <w:noProof/>
+              </w:rPr>
+              <w:t>Coordonnées des éoliennes</w:t>
+            </w:r>
+            <w:r>
+              <w:rPr>
+                <w:noProof/>
+                <w:webHidden/>
+              </w:rPr>
+              <w:tab/>
+            </w:r>
+            <w:r>
+              <w:rPr>
+                <w:noProof/>
+                <w:webHidden/>
+              </w:rPr>
+              <w:fldChar w:fldCharType="begin"/>
+            </w:r>
+            <w:r>
+              <w:rPr>
+                <w:noProof/>
+                <w:webHidden/>
+              </w:rPr>
+              <w:instrText xml:space="preserve"> PAGEREF _Toc230021429 \h </w:instrText>
+            </w:r>
+            <w:r>
+              <w:rPr>
+                <w:noProof/>
+                <w:webHidden/>
+              </w:rPr>
+            </w:r>
+            <w:r>
+              <w:rPr>
+                <w:noProof/>
+                <w:webHidden/>
+              </w:rPr>
+              <w:fldChar w:fldCharType="separate"/>
+            </w:r>
+            <w:r>
+              <w:rPr>
+                <w:noProof/>
+                <w:webHidden/>
+              </w:rPr>
+              <w:t>3</w:t>
+            </w:r>
+            <w:r>
+              <w:rPr>
+                <w:noProof/>
+                <w:webHidden/>
+              </w:rPr>
+              <w:fldChar w:fldCharType="end"/>
+            </w:r>
+          </w:hyperlink>
+        </w:p>
+        <w:p>
+          <w:pPr>
+            <w:pStyle w:val="TM2"/>
+            <w:tabs>
+              <w:tab w:val="left" w:pos="960"/>
+              <w:tab w:val="right" w:leader="dot" w:pos="9062"/>
+            </w:tabs>
+            <w:rPr>
+              <w:noProof/>
+            </w:rPr>
+          </w:pPr>
+          <w:hyperlink w:anchor="_Toc230021430" w:history="1">
+            <w:r>
+              <w:rPr>
+                <w:rStyle w:val="Lienhypertexte"/>
+                <w:noProof/>
+              </w:rPr>
+              <w:t>2.3</w:t>
+            </w:r>
+            <w:r>
+              <w:rPr>
+                <w:noProof/>
+              </w:rPr>
+              <w:tab/>
+            </w:r>
+            <w:r>
+              <w:rPr>
+                <w:rStyle w:val="Lienhypertexte"/>
+                <w:noProof/>
+              </w:rPr>
+              <w:t>Données fournies par le client</w:t>
+            </w:r>
+            <w:r>
+              <w:rPr>
+                <w:noProof/>
+                <w:webHidden/>
+              </w:rPr>
+              <w:tab/>
+            </w:r>
+            <w:r>
+              <w:rPr>
+                <w:noProof/>
+                <w:webHidden/>
+              </w:rPr>
+              <w:fldChar w:fldCharType="begin"/>
+            </w:r>
+            <w:r>
+              <w:rPr>
+                <w:noProof/>
+                <w:webHidden/>
+              </w:rPr>
+              <w:instrText xml:space="preserve"> PAGEREF _Toc230021430 \h </w:instrText>
+            </w:r>
+            <w:r>
+              <w:rPr>
+                <w:noProof/>
+                <w:webHidden/>
+              </w:rPr>
+            </w:r>
+            <w:r>
+              <w:rPr>
+                <w:noProof/>
+                <w:webHidden/>
+              </w:rPr>
+              <w:fldChar w:fldCharType="separate"/>
+            </w:r>
+            <w:r>
+              <w:rPr>
+                <w:noProof/>
+                <w:webHidden/>
+              </w:rPr>
+              <w:t>3</w:t>
+            </w:r>
+            <w:r>
+              <w:rPr>
+                <w:noProof/>
+                <w:webHidden/>
+              </w:rPr>
+              <w:fldChar w:fldCharType="end"/>
+            </w:r>
+          </w:hyperlink>
+        </w:p>
+        <w:p>
+          <w:pPr>
+            <w:pStyle w:val="TM2"/>
+            <w:tabs>
+              <w:tab w:val="left" w:pos="960"/>
+              <w:tab w:val="right" w:leader="dot" w:pos="9062"/>
+            </w:tabs>
+            <w:rPr>
+              <w:noProof/>
+            </w:rPr>
+          </w:pPr>
+          <w:hyperlink w:anchor="_Toc230021431" w:history="1">
+            <w:r>
+              <w:rPr>
+                <w:rStyle w:val="Lienhypertexte"/>
+                <w:noProof/>
+              </w:rPr>
+              <w:t>2.4</w:t>
+            </w:r>
+            <w:r>
+              <w:rPr>
+                <w:noProof/>
+              </w:rPr>
+              <w:tab/>
+            </w:r>
+            <w:r>
+              <w:rPr>
+                <w:rStyle w:val="Lienhypertexte"/>
+                <w:noProof/>
+              </w:rPr>
+              <w:t>Périmètre de l’analyse SCADA</w:t>
+            </w:r>
+            <w:r>
+              <w:rPr>
+                <w:noProof/>
+                <w:webHidden/>
+              </w:rPr>
+              <w:tab/>
+            </w:r>
+            <w:r>
+              <w:rPr>
+                <w:noProof/>
+                <w:webHidden/>
+              </w:rPr>
+              <w:fldChar w:fldCharType="begin"/>
+            </w:r>
+            <w:r>
+              <w:rPr>
+                <w:noProof/>
+                <w:webHidden/>
+              </w:rPr>
+              <w:instrText xml:space="preserve"> PAGEREF _Toc230021431 \h </w:instrText>
+            </w:r>
+            <w:r>
+              <w:rPr>
+                <w:noProof/>
+                <w:webHidden/>
+              </w:rPr>
+            </w:r>
+            <w:r>
+              <w:rPr>
+                <w:noProof/>
+                <w:webHidden/>
+              </w:rPr>
+              <w:fldChar w:fldCharType="separate"/>
+            </w:r>
+            <w:r>
+              <w:rPr>
+                <w:noProof/>
+                <w:webHidden/>
+              </w:rPr>
+              <w:t>3</w:t>
+            </w:r>
+            <w:r>
+              <w:rPr>
+                <w:noProof/>
+                <w:webHidden/>
+              </w:rPr>
+              <w:fldChar w:fldCharType="end"/>
+            </w:r>
+          </w:hyperlink>
+        </w:p>
+        <w:p>
+          <w:pPr>
+            <w:pStyle w:val="TM1"/>
+            <w:tabs>
+              <w:tab w:val="left" w:pos="480"/>
+              <w:tab w:val="right" w:leader="dot" w:pos="9062"/>
+            </w:tabs>
+            <w:rPr>
+              <w:noProof/>
+            </w:rPr>
+          </w:pPr>
+          <w:hyperlink w:anchor="_Toc230021432" w:history="1">
+            <w:r>
+              <w:rPr>
+                <w:rStyle w:val="Lienhypertexte"/>
+                <w:noProof/>
+              </w:rPr>
+              <w:t>3</w:t>
+            </w:r>
+            <w:r>
+              <w:rPr>
+                <w:noProof/>
+              </w:rPr>
+              <w:tab/>
+            </w:r>
+            <w:r>
+              <w:rPr>
+                <w:rStyle w:val="Lienhypertexte"/>
+                <w:noProof/>
+              </w:rPr>
+              <w:t>Analyse détaillée</w:t>
+            </w:r>
+            <w:r>
+              <w:rPr>
+                <w:noProof/>
+                <w:webHidden/>
+              </w:rPr>
+              <w:tab/>
+            </w:r>
+            <w:r>
+              <w:rPr>
+                <w:noProof/>
+                <w:webHidden/>
+              </w:rPr>
+              <w:fldChar w:fldCharType="begin"/>
+            </w:r>
+            <w:r>
+              <w:rPr>
+                <w:noProof/>
+                <w:webHidden/>
+              </w:rPr>
+              <w:instrText xml:space="preserve"> PAGEREF _Toc230021432 \h </w:instrText>
+            </w:r>
+            <w:r>
+              <w:rPr>
+                <w:noProof/>
+                <w:webHidden/>
+              </w:rPr>
+            </w:r>
+            <w:r>
+              <w:rPr>
+                <w:noProof/>
+                <w:webHidden/>
+              </w:rPr>
+              <w:fldChar w:fldCharType="separate"/>
+            </w:r>
+            <w:r>
+              <w:rPr>
+                <w:noProof/>
+                <w:webHidden/>
+              </w:rPr>
+              <w:t>4</w:t>
+            </w:r>
+            <w:r>
+              <w:rPr>
+                <w:noProof/>
+                <w:webHidden/>
+              </w:rPr>
+              <w:fldChar w:fldCharType="end"/>
+            </w:r>
+          </w:hyperlink>
+        </w:p>
+        <w:p>
+          <w:pPr>
+            <w:pStyle w:val="TM2"/>
+            <w:tabs>
+              <w:tab w:val="left" w:pos="960"/>
+              <w:tab w:val="right" w:leader="dot" w:pos="9062"/>
+            </w:tabs>
+            <w:rPr>
+              <w:noProof/>
+            </w:rPr>
+          </w:pPr>
+          <w:hyperlink w:anchor="_Toc230021433" w:history="1">
+            <w:r>
+              <w:rPr>
+                <w:rStyle w:val="Lienhypertexte"/>
+                <w:noProof/>
+              </w:rPr>
+              <w:t>3.1</w:t>
+            </w:r>
+            <w:r>
+              <w:rPr>
+                <w:noProof/>
+              </w:rPr>
+              <w:tab/>
+            </w:r>
+            <w:r>
+              <w:rPr>
+                <w:rStyle w:val="Lienhypertexte"/>
+                <w:noProof/>
+              </w:rPr>
+              <w:t>Disponibilité des données SCADA</w:t>
+            </w:r>
+            <w:r>
+              <w:rPr>
+                <w:noProof/>
+                <w:webHidden/>
+              </w:rPr>
+              <w:tab/>
+            </w:r>
+            <w:r>
+              <w:rPr>
+                <w:noProof/>
+                <w:webHidden/>
+              </w:rPr>
+              <w:fldChar w:fldCharType="begin"/>
+            </w:r>
+            <w:r>
+              <w:rPr>
+                <w:noProof/>
+                <w:webHidden/>
+              </w:rPr>
+              <w:instrText xml:space="preserve"> PAGEREF _Toc230021433 \h </w:instrText>
+            </w:r>
+            <w:r>
+              <w:rPr>
+                <w:noProof/>
+                <w:webHidden/>
+              </w:rPr>
+            </w:r>
+            <w:r>
+              <w:rPr>
+                <w:noProof/>
+                <w:webHidden/>
+              </w:rPr>
+              <w:fldChar w:fldCharType="separate"/>
+            </w:r>
+            <w:r>
+              <w:rPr>
+                <w:noProof/>
+                <w:webHidden/>
+              </w:rPr>
+              <w:t>4</w:t>
+            </w:r>
+            <w:r>
+              <w:rPr>
+                <w:noProof/>
+                <w:webHidden/>
+              </w:rPr>
+              <w:fldChar w:fldCharType="end"/>
+            </w:r>
+          </w:hyperlink>
+        </w:p>
+        <w:p>
+          <w:pPr>
+            <w:pStyle w:val="TM2"/>
+            <w:tabs>
+              <w:tab w:val="left" w:pos="960"/>
+              <w:tab w:val="right" w:leader="dot" w:pos="9062"/>
+            </w:tabs>
+            <w:rPr>
+              <w:noProof/>
+            </w:rPr>
+          </w:pPr>
+          <w:hyperlink w:anchor="_Toc230021434" w:history="1">
+            <w:r>
+              <w:rPr>
+                <w:rStyle w:val="Lienhypertexte"/>
+                <w:noProof/>
+              </w:rPr>
+              <w:t>3.2</w:t>
+            </w:r>
+            <w:r>
+              <w:rPr>
+                <w:noProof/>
+              </w:rPr>
+              <w:tab/>
+            </w:r>
+            <w:r>
+              <w:rPr>
+                <w:rStyle w:val="Lienhypertexte"/>
+                <w:noProof/>
+              </w:rPr>
+              <w:t>Disponibilité énergétique</w:t>
+            </w:r>
+            <w:r>
+              <w:rPr>
+                <w:noProof/>
+                <w:webHidden/>
+              </w:rPr>
+              <w:tab/>
+            </w:r>
+            <w:r>
+              <w:rPr>
+                <w:noProof/>
+                <w:webHidden/>
+              </w:rPr>
+              <w:fldChar w:fldCharType="begin"/>
+            </w:r>
+            <w:r>
+              <w:rPr>
+                <w:noProof/>
+                <w:webHidden/>
+              </w:rPr>
+              <w:instrText xml:space="preserve"> PAGEREF _Toc230021434 \h </w:instrText>
+            </w:r>
+            <w:r>
+              <w:rPr>
+                <w:noProof/>
+                <w:webHidden/>
+              </w:rPr>
+            </w:r>
+            <w:r>
+              <w:rPr>
+                <w:noProof/>
+                <w:webHidden/>
+              </w:rPr>
+              <w:fldChar w:fldCharType="separate"/>
+            </w:r>
+            <w:r>
+              <w:rPr>
+                <w:noProof/>
+                <w:webHidden/>
+              </w:rPr>
+              <w:t>5</w:t>
+            </w:r>
+            <w:r>
+              <w:rPr>
+                <w:noProof/>
+                <w:webHidden/>
+              </w:rPr>
+              <w:fldChar w:fldCharType="end"/>
+            </w:r>
+          </w:hyperlink>
+        </w:p>
+        <w:p>
+          <w:pPr>
+            <w:pStyle w:val="TM2"/>
+            <w:tabs>
+              <w:tab w:val="left" w:pos="960"/>
+              <w:tab w:val="right" w:leader="dot" w:pos="9062"/>
+            </w:tabs>
+            <w:rPr>
+              <w:noProof/>
+            </w:rPr>
+          </w:pPr>
+          <w:hyperlink w:anchor="_Toc230021435" w:history="1">
+            <w:r>
+              <w:rPr>
+                <w:rStyle w:val="Lienhypertexte"/>
+                <w:noProof/>
+              </w:rPr>
+              <w:t>3.3</w:t>
+            </w:r>
+            <w:r>
+              <w:rPr>
+                <w:noProof/>
+              </w:rPr>
+              <w:tab/>
+            </w:r>
+            <w:r>
+              <w:rPr>
+                <w:rStyle w:val="Lienhypertexte"/>
+                <w:noProof/>
+              </w:rPr>
+              <w:t>Analyse des codes défauts</w:t>
+            </w:r>
+            <w:r>
+              <w:rPr>
+                <w:noProof/>
+                <w:webHidden/>
+              </w:rPr>
+              <w:tab/>
+            </w:r>
+            <w:r>
+              <w:rPr>
+                <w:noProof/>
+                <w:webHidden/>
+              </w:rPr>
+              <w:fldChar w:fldCharType="begin"/>
+            </w:r>
+            <w:r>
+              <w:rPr>
+                <w:noProof/>
+                <w:webHidden/>
+              </w:rPr>
+              <w:instrText xml:space="preserve"> PAGEREF _Toc230021435 \h </w:instrText>
+            </w:r>
+            <w:r>
+              <w:rPr>
+                <w:noProof/>
+                <w:webHidden/>
+              </w:rPr>
+            </w:r>
+            <w:r>
+              <w:rPr>
+                <w:noProof/>
+                <w:webHidden/>
+              </w:rPr>
+              <w:fldChar w:fldCharType="separate"/>
+            </w:r>
+            <w:r>
+              <w:rPr>
+                <w:noProof/>
+                <w:webHidden/>
+              </w:rPr>
+              <w:t>6</w:t>
+            </w:r>
+            <w:r>
+              <w:rPr>
+                <w:noProof/>
+                <w:webHidden/>
+              </w:rPr>
+              <w:fldChar w:fldCharType="end"/>
+            </w:r>
+          </w:hyperlink>
+        </w:p>
+        <w:p>
+          <w:pPr>
+            <w:pStyle w:val="TM2"/>
+            <w:tabs>
+              <w:tab w:val="left" w:pos="960"/>
+              <w:tab w:val="right" w:leader="dot" w:pos="9062"/>
+            </w:tabs>
+            <w:rPr>
+              <w:noProof/>
+            </w:rPr>
+          </w:pPr>
+          <w:hyperlink w:anchor="_Toc230021436" w:history="1">
+            <w:r>
+              <w:rPr>
+                <w:rStyle w:val="Lienhypertexte"/>
+                <w:noProof/>
+              </w:rPr>
+              <w:t>3.4</w:t>
+            </w:r>
+            <w:r>
+              <w:rPr>
+                <w:noProof/>
+              </w:rPr>
+              <w:tab/>
+            </w:r>
+            <w:r>
+              <w:rPr>
+                <w:rStyle w:val="Lienhypertexte"/>
+                <w:noProof/>
+              </w:rPr>
+              <w:t>Analyse de la direction du vent</w:t>
+            </w:r>
+            <w:r>
+              <w:rPr>
+                <w:noProof/>
+                <w:webHidden/>
+              </w:rPr>
+              <w:tab/>
+            </w:r>
+            <w:r>
+              <w:rPr>
+                <w:noProof/>
+                <w:webHidden/>
+              </w:rPr>
+              <w:fldChar w:fldCharType="begin"/>
+            </w:r>
+            <w:r>
+              <w:rPr>
+                <w:noProof/>
+                <w:webHidden/>
+              </w:rPr>
+              <w:instrText xml:space="preserve"> PAGEREF _Toc230021436 \h </w:instrText>
+            </w:r>
+            <w:r>
+              <w:rPr>
+                <w:noProof/>
+                <w:webHidden/>
+              </w:rPr>
+            </w:r>
+            <w:r>
+              <w:rPr>
+                <w:noProof/>
+                <w:webHidden/>
+              </w:rPr>
+              <w:fldChar w:fldCharType="separate"/>
+            </w:r>
+            <w:r>
+              <w:rPr>
+                <w:noProof/>
+                <w:webHidden/>
+              </w:rPr>
+              <w:t>6</w:t>
+            </w:r>
+            <w:r>
+              <w:rPr>
+                <w:noProof/>
+                <w:webHidden/>
+              </w:rPr>
+              <w:fldChar w:fldCharType="end"/>
+            </w:r>
+          </w:hyperlink>
+        </w:p>
+        <w:p>
+          <w:pPr>
+            <w:pStyle w:val="TM2"/>
+            <w:tabs>
+              <w:tab w:val="left" w:pos="960"/>
+              <w:tab w:val="right" w:leader="dot" w:pos="9062"/>
+            </w:tabs>
+            <w:rPr>
+              <w:noProof/>
+            </w:rPr>
+          </w:pPr>
+          <w:hyperlink w:anchor="_Toc230021437" w:history="1">
+            <w:r>
+              <w:rPr>
+                <w:rStyle w:val="Lienhypertexte"/>
+                <w:noProof/>
+              </w:rPr>
+              <w:t>3.5</w:t>
+            </w:r>
+            <w:r>
+              <w:rPr>
+                <w:noProof/>
+              </w:rPr>
+              <w:tab/>
+            </w:r>
+            <w:r>
+              <w:rPr>
+                <w:rStyle w:val="Lienhypertexte"/>
+                <w:noProof/>
+              </w:rPr>
+              <w:t>Analyse des courbes de puissance selon la norme IEC 61400-2</w:t>
+            </w:r>
+            <w:r>
+              <w:rPr>
+                <w:noProof/>
+                <w:webHidden/>
+              </w:rPr>
+              <w:tab/>
+            </w:r>
+            <w:r>
+              <w:rPr>
+                <w:noProof/>
+                <w:webHidden/>
+              </w:rPr>
+              <w:fldChar w:fldCharType="begin"/>
+            </w:r>
+            <w:r>
+              <w:rPr>
+                <w:noProof/>
+                <w:webHidden/>
+              </w:rPr>
+              <w:instrText xml:space="preserve"> PAGEREF _Toc230021437 \h </w:instrText>
+            </w:r>
+            <w:r>
+              <w:rPr>
+                <w:noProof/>
+                <w:webHidden/>
+              </w:rPr>
+            </w:r>
+            <w:r>
+              <w:rPr>
+                <w:noProof/>
+                <w:webHidden/>
+              </w:rPr>
+              <w:fldChar w:fldCharType="separate"/>
+            </w:r>
+            <w:r>
+              <w:rPr>
+                <w:noProof/>
+                <w:webHidden/>
+              </w:rPr>
+              <w:t>7</w:t>
+            </w:r>
+            <w:r>
+              <w:rPr>
+                <w:noProof/>
+                <w:webHidden/>
+              </w:rPr>
+              <w:fldChar w:fldCharType="end"/>
+            </w:r>
+          </w:hyperlink>
+        </w:p>
+        <w:p>
+          <w:pPr>
+            <w:pStyle w:val="TM2"/>
+            <w:tabs>
+              <w:tab w:val="left" w:pos="960"/>
+              <w:tab w:val="right" w:leader="dot" w:pos="9062"/>
+            </w:tabs>
+            <w:rPr>
+              <w:noProof/>
+            </w:rPr>
+          </w:pPr>
+          <w:hyperlink w:anchor="_Toc230021438" w:history="1">
+            <w:r>
+              <w:rPr>
+                <w:rStyle w:val="Lienhypertexte"/>
+                <w:noProof/>
+              </w:rPr>
+              <w:t>3.6</w:t>
+            </w:r>
+            <w:r>
+              <w:rPr>
+                <w:noProof/>
+              </w:rPr>
+              <w:tab/>
+            </w:r>
+            <w:r>
+              <w:rPr>
+                <w:rStyle w:val="Lienhypertexte"/>
+                <w:noProof/>
+              </w:rPr>
+              <w:t>Analyse de la vitesse de rotation (Rotor RPM)</w:t>
+            </w:r>
+            <w:r>
+              <w:rPr>
+                <w:noProof/>
+                <w:webHidden/>
+              </w:rPr>
+              <w:tab/>
+            </w:r>
+            <w:r>
+              <w:rPr>
+                <w:noProof/>
+                <w:webHidden/>
+              </w:rPr>
+              <w:fldChar w:fldCharType="begin"/>
+            </w:r>
+            <w:r>
+              <w:rPr>
+                <w:noProof/>
+                <w:webHidden/>
+              </w:rPr>
+              <w:instrText xml:space="preserve"> PAGEREF _Toc230021438 \h </w:instrText>
+            </w:r>
+            <w:r>
+              <w:rPr>
+                <w:noProof/>
+                <w:webHidden/>
+              </w:rPr>
+            </w:r>
+            <w:r>
+              <w:rPr>
+                <w:noProof/>
+                <w:webHidden/>
+              </w:rPr>
+              <w:fldChar w:fldCharType="separate"/>
+            </w:r>
+            <w:r>
+              <w:rPr>
+                <w:noProof/>
+                <w:webHidden/>
+              </w:rPr>
+              <w:t>7</w:t>
+            </w:r>
+            <w:r>
+              <w:rPr>
+                <w:noProof/>
+                <w:webHidden/>
+              </w:rPr>
+              <w:fldChar w:fldCharType="end"/>
+            </w:r>
+          </w:hyperlink>
+        </w:p>
+        <w:p>
+          <w:pPr>
+            <w:pStyle w:val="TM2"/>
+            <w:tabs>
+              <w:tab w:val="left" w:pos="960"/>
+              <w:tab w:val="right" w:leader="dot" w:pos="9062"/>
+            </w:tabs>
+            <w:rPr>
+              <w:noProof/>
+            </w:rPr>
+          </w:pPr>
+          <w:hyperlink w:anchor="_Toc230021439" w:history="1">
+            <w:r>
+              <w:rPr>
+                <w:rStyle w:val="Lienhypertexte"/>
+                <w:noProof/>
+              </w:rPr>
+              <w:t>3.7</w:t>
+            </w:r>
+            <w:r>
+              <w:rPr>
+                <w:noProof/>
+              </w:rPr>
+              <w:tab/>
+            </w:r>
+            <w:r>
+              <w:rPr>
+                <w:rStyle w:val="Lienhypertexte"/>
+                <w:noProof/>
+              </w:rPr>
+              <w:t>Analyse du comportement du pitch</w:t>
+            </w:r>
+            <w:r>
+              <w:rPr>
+                <w:noProof/>
+                <w:webHidden/>
+              </w:rPr>
+              <w:tab/>
+            </w:r>
+            <w:r>
+              <w:rPr>
+                <w:noProof/>
+                <w:webHidden/>
+              </w:rPr>
+              <w:fldChar w:fldCharType="begin"/>
+            </w:r>
+            <w:r>
+              <w:rPr>
+                <w:noProof/>
+                <w:webHidden/>
+              </w:rPr>
+              <w:instrText xml:space="preserve"> PAGEREF _Toc230021439 \h </w:instrText>
+            </w:r>
+            <w:r>
+              <w:rPr>
+                <w:noProof/>
+                <w:webHidden/>
+              </w:rPr>
+            </w:r>
+            <w:r>
+              <w:rPr>
+                <w:noProof/>
+                <w:webHidden/>
+              </w:rPr>
+              <w:fldChar w:fldCharType="separate"/>
+            </w:r>
+            <w:r>
+              <w:rPr>
+                <w:noProof/>
+                <w:webHidden/>
+              </w:rPr>
+              <w:t>8</w:t>
+            </w:r>
+            <w:r>
+              <w:rPr>
+                <w:noProof/>
+                <w:webHidden/>
+              </w:rPr>
+              <w:fldChar w:fldCharType="end"/>
+            </w:r>
+          </w:hyperlink>
+        </w:p>
+        <w:p>
+          <w:pPr>
+            <w:pStyle w:val="TM2"/>
+            <w:tabs>
+              <w:tab w:val="left" w:pos="960"/>
+              <w:tab w:val="right" w:leader="dot" w:pos="9062"/>
+            </w:tabs>
+            <w:rPr>
+              <w:noProof/>
+            </w:rPr>
+          </w:pPr>
+          <w:hyperlink w:anchor="_Toc230021440" w:history="1">
+            <w:r>
+              <w:rPr>
+                <w:rStyle w:val="Lienhypertexte"/>
+                <w:noProof/>
+              </w:rPr>
+              <w:t>3.8</w:t>
+            </w:r>
+            <w:r>
+              <w:rPr>
+                <w:noProof/>
+              </w:rPr>
+              <w:tab/>
+            </w:r>
+            <w:r>
+              <w:rPr>
+                <w:rStyle w:val="Lienhypertexte"/>
+                <w:noProof/>
+              </w:rPr>
+              <w:t>Analyse des limitations</w:t>
+            </w:r>
+            <w:r>
+              <w:rPr>
+                <w:noProof/>
+                <w:webHidden/>
+              </w:rPr>
+              <w:tab/>
+            </w:r>
+            <w:r>
+              <w:rPr>
+                <w:noProof/>
+                <w:webHidden/>
+              </w:rPr>
+              <w:fldChar w:fldCharType="begin"/>
+            </w:r>
+            <w:r>
+              <w:rPr>
+                <w:noProof/>
+                <w:webHidden/>
+              </w:rPr>
+              <w:instrText xml:space="preserve"> PAGEREF _Toc230021440 \h </w:instrText>
+            </w:r>
+            <w:r>
+              <w:rPr>
+                <w:noProof/>
+                <w:webHidden/>
+              </w:rPr>
+            </w:r>
+            <w:r>
+              <w:rPr>
+                <w:noProof/>
+                <w:webHidden/>
+              </w:rPr>
+              <w:fldChar w:fldCharType="separate"/>
+            </w:r>
+            <w:r>
+              <w:rPr>
+                <w:noProof/>
+                <w:webHidden/>
+              </w:rPr>
+              <w:t>8</w:t>
+            </w:r>
+            <w:r>
+              <w:rPr>
+                <w:noProof/>
+                <w:webHidden/>
+              </w:rPr>
+              <w:fldChar w:fldCharType="end"/>
+            </w:r>
+          </w:hyperlink>
+        </w:p>
+        <w:p>
+          <w:pPr>
+            <w:pStyle w:val="TM1"/>
+            <w:tabs>
+              <w:tab w:val="left" w:pos="480"/>
+              <w:tab w:val="right" w:leader="dot" w:pos="9062"/>
+            </w:tabs>
+            <w:rPr>
+              <w:noProof/>
+            </w:rPr>
+          </w:pPr>
+          <w:hyperlink w:anchor="_Toc230021441" w:history="1">
+            <w:r>
+              <w:rPr>
+                <w:rStyle w:val="Lienhypertexte"/>
+                <w:noProof/>
+              </w:rPr>
+              <w:t>4</w:t>
+            </w:r>
+            <w:r>
+              <w:rPr>
+                <w:noProof/>
+              </w:rPr>
+              <w:tab/>
+            </w:r>
+            <w:r>
+              <w:rPr>
+                <w:rStyle w:val="Lienhypertexte"/>
+                <w:noProof/>
+              </w:rPr>
+              <w:t>Recommandations &amp; Action</w:t>
+            </w:r>
+            <w:r>
+              <w:rPr>
+                <w:noProof/>
+                <w:webHidden/>
+              </w:rPr>
+              <w:tab/>
+            </w:r>
+            <w:r>
+              <w:rPr>
+                <w:noProof/>
+                <w:webHidden/>
+              </w:rPr>
+              <w:fldChar w:fldCharType="begin"/>
+            </w:r>
+            <w:r>
+              <w:rPr>
+                <w:noProof/>
+                <w:webHidden/>
+              </w:rPr>
+              <w:instrText xml:space="preserve"> PAGEREF _Toc230021441 \h </w:instrText>
+            </w:r>
+            <w:r>
+              <w:rPr>
+                <w:noProof/>
+                <w:webHidden/>
+              </w:rPr>
+            </w:r>
+            <w:r>
+              <w:rPr>
+                <w:noProof/>
+                <w:webHidden/>
+              </w:rPr>
+              <w:fldChar w:fldCharType="separate"/>
+            </w:r>
+            <w:r>
+              <w:rPr>
+                <w:noProof/>
+                <w:webHidden/>
+              </w:rPr>
+              <w:t>9</w:t>
+            </w:r>
+            <w:r>
+              <w:rPr>
+                <w:noProof/>
+                <w:webHidden/>
+              </w:rPr>
+              <w:fldChar w:fldCharType="end"/>
+            </w:r>
+          </w:hyperlink>
+        </w:p>
+        <w:p>
+          <w:pPr>
+            <w:pStyle w:val="TM1"/>
+            <w:tabs>
+              <w:tab w:val="left" w:pos="480"/>
+              <w:tab w:val="right" w:leader="dot" w:pos="9062"/>
+            </w:tabs>
+            <w:rPr>
+              <w:noProof/>
+            </w:rPr>
+          </w:pPr>
+          <w:hyperlink w:anchor="_Toc230021442" w:history="1">
+            <w:r>
+              <w:rPr>
+                <w:rStyle w:val="Lienhypertexte"/>
+                <w:noProof/>
+              </w:rPr>
+              <w:t>5</w:t>
+            </w:r>
+            <w:r>
+              <w:rPr>
+                <w:noProof/>
+              </w:rPr>
+              <w:tab/>
+            </w:r>
+            <w:r>
+              <w:rPr>
+                <w:rStyle w:val="Lienhypertexte"/>
+                <w:noProof/>
+              </w:rPr>
+              <w:t>Conclusion</w:t>
+            </w:r>
+            <w:r>
+              <w:rPr>
+                <w:noProof/>
+                <w:webHidden/>
+              </w:rPr>
+              <w:tab/>
+            </w:r>
+            <w:r>
+              <w:rPr>
+                <w:noProof/>
+                <w:webHidden/>
+              </w:rPr>
+              <w:fldChar w:fldCharType="begin"/>
+            </w:r>
+            <w:r>
+              <w:rPr>
+                <w:noProof/>
+                <w:webHidden/>
+              </w:rPr>
+              <w:instrText xml:space="preserve"> PAGEREF _Toc230021442 \h </w:instrText>
+            </w:r>
+            <w:r>
+              <w:rPr>
+                <w:noProof/>
+                <w:webHidden/>
+              </w:rPr>
+            </w:r>
+            <w:r>
+              <w:rPr>
+                <w:noProof/>
+                <w:webHidden/>
+              </w:rPr>
+              <w:fldChar w:fldCharType="separate"/>
+            </w:r>
+            <w:r>
+              <w:rPr>
+                <w:noProof/>
+                <w:webHidden/>
+              </w:rPr>
+              <w:t>9</w:t>
+            </w:r>
+            <w:r>
+              <w:rPr>
+                <w:noProof/>
+                <w:webHidden/>
+              </w:rPr>
+              <w:fldChar w:fldCharType="end"/>
+            </w:r>
+          </w:hyperlink>
+        </w:p>
+        <w:p>
+          <w:pPr>
+            <w:pStyle w:val="TM1"/>
+            <w:tabs>
+              <w:tab w:val="left" w:pos="480"/>
+              <w:tab w:val="right" w:leader="dot" w:pos="9062"/>
+            </w:tabs>
+            <w:rPr>
+              <w:noProof/>
+            </w:rPr>
+          </w:pPr>
+          <w:hyperlink w:anchor="_Toc230021443" w:history="1">
+            <w:r>
+              <w:rPr>
+                <w:rStyle w:val="Lienhypertexte"/>
+                <w:noProof/>
+              </w:rPr>
+              <w:t>6</w:t>
+            </w:r>
+            <w:r>
+              <w:rPr>
+                <w:noProof/>
+              </w:rPr>
+              <w:tab/>
+            </w:r>
+            <w:r>
+              <w:rPr>
+                <w:rStyle w:val="Lienhypertexte"/>
+                <w:noProof/>
+              </w:rPr>
+              <w:t>ANNEXE</w:t>
+            </w:r>
+            <w:r>
+              <w:rPr>
+                <w:noProof/>
+                <w:webHidden/>
+              </w:rPr>
+              <w:tab/>
+            </w:r>
+            <w:r>
+              <w:rPr>
+                <w:noProof/>
+                <w:webHidden/>
+              </w:rPr>
+              <w:fldChar w:fldCharType="begin"/>
+            </w:r>
+            <w:r>
+              <w:rPr>
+                <w:noProof/>
+                <w:webHidden/>
+              </w:rPr>
+              <w:instrText xml:space="preserve"> PAGEREF _Toc230021443 \h </w:instrText>
+            </w:r>
+            <w:r>
+              <w:rPr>
+                <w:noProof/>
+                <w:webHidden/>
+              </w:rPr>
+            </w:r>
+            <w:r>
+              <w:rPr>
+                <w:noProof/>
+                <w:webHidden/>
+              </w:rPr>
+              <w:fldChar w:fldCharType="separate"/>
+            </w:r>
+            <w:r>
+              <w:rPr>
+                <w:noProof/>
+                <w:webHidden/>
+              </w:rPr>
+              <w:t>9</w:t>
+            </w:r>
+            <w:r>
+              <w:rPr>
+                <w:noProof/>
+                <w:webHidden/>
+              </w:rPr>
+              <w:fldChar w:fldCharType="end"/>
+            </w:r>
+          </w:hyperlink>
+        </w:p>
+        <w:p>
+          <w:pPr>
+            <w:pStyle w:val="TM2"/>
+            <w:tabs>
+              <w:tab w:val="left" w:pos="960"/>
+              <w:tab w:val="right" w:leader="dot" w:pos="9062"/>
+            </w:tabs>
+            <w:rPr>
+              <w:noProof/>
+            </w:rPr>
+          </w:pPr>
+          <w:hyperlink w:anchor="_Toc230021444" w:history="1">
+            <w:r>
+              <w:rPr>
+                <w:rStyle w:val="Lienhypertexte"/>
+                <w:noProof/>
+              </w:rPr>
+              <w:t>6.1</w:t>
+            </w:r>
+            <w:r>
+              <w:rPr>
+                <w:noProof/>
+              </w:rPr>
+              <w:tab/>
+            </w:r>
+            <w:r>
+              <w:rPr>
+                <w:rStyle w:val="Lienhypertexte"/>
+                <w:noProof/>
+              </w:rPr>
+              <w:t>Disponibilité temporelle (Time-Based Availability – TBA)</w:t>
+            </w:r>
+            <w:r>
+              <w:rPr>
+                <w:noProof/>
+                <w:webHidden/>
+              </w:rPr>
+              <w:tab/>
+            </w:r>
+            <w:r>
+              <w:rPr>
+                <w:noProof/>
+                <w:webHidden/>
+              </w:rPr>
+              <w:fldChar w:fldCharType="begin"/>
+            </w:r>
+            <w:r>
+              <w:rPr>
+                <w:noProof/>
+                <w:webHidden/>
+              </w:rPr>
+              <w:instrText xml:space="preserve"> PAGEREF _Toc230021444 \h </w:instrText>
+            </w:r>
+            <w:r>
+              <w:rPr>
+                <w:noProof/>
+                <w:webHidden/>
+              </w:rPr>
+            </w:r>
+            <w:r>
+              <w:rPr>
+                <w:noProof/>
+                <w:webHidden/>
+              </w:rPr>
+              <w:fldChar w:fldCharType="separate"/>
+            </w:r>
+            <w:r>
+              <w:rPr>
+                <w:noProof/>
+                <w:webHidden/>
+              </w:rPr>
+              <w:t>9</w:t>
+            </w:r>
+            <w:r>
+              <w:rPr>
+                <w:noProof/>
+                <w:webHidden/>
+              </w:rPr>
+              <w:fldChar w:fldCharType="end"/>
+            </w:r>
+          </w:hyperlink>
+        </w:p>
+        <w:p>
+          <w:pPr>
+            <w:pStyle w:val="TM2"/>
+            <w:tabs>
+              <w:tab w:val="left" w:pos="960"/>
+              <w:tab w:val="right" w:leader="dot" w:pos="9062"/>
+            </w:tabs>
+            <w:rPr>
+              <w:noProof/>
+            </w:rPr>
+          </w:pPr>
+          <w:hyperlink w:anchor="_Toc230021445" w:history="1">
+            <w:r>
+              <w:rPr>
+                <w:rStyle w:val="Lienhypertexte"/>
+                <w:noProof/>
+              </w:rPr>
+              <w:t>6.2</w:t>
+            </w:r>
+            <w:r>
+              <w:rPr>
+                <w:noProof/>
+              </w:rPr>
+              <w:tab/>
+            </w:r>
+            <w:r>
+              <w:rPr>
+                <w:rStyle w:val="Lienhypertexte"/>
+                <w:noProof/>
+              </w:rPr>
+              <w:t>Analyse détaillée des courbes de puissance</w:t>
+            </w:r>
+            <w:r>
+              <w:rPr>
+                <w:noProof/>
+                <w:webHidden/>
+              </w:rPr>
+              <w:tab/>
+            </w:r>
+            <w:r>
+              <w:rPr>
+                <w:noProof/>
+                <w:webHidden/>
+              </w:rPr>
+              <w:fldChar w:fldCharType="begin"/>
+            </w:r>
+            <w:r>
+              <w:rPr>
+                <w:noProof/>
+                <w:webHidden/>
+              </w:rPr>
+              <w:instrText xml:space="preserve"> PAGEREF _Toc230021445 \h </w:instrText>
+            </w:r>
+            <w:r>
+              <w:rPr>
+                <w:noProof/>
+                <w:webHidden/>
+              </w:rPr>
+            </w:r>
+            <w:r>
+              <w:rPr>
+                <w:noProof/>
+                <w:webHidden/>
+              </w:rPr>
+              <w:fldChar w:fldCharType="separate"/>
+            </w:r>
+            <w:r>
+              <w:rPr>
+                <w:noProof/>
+                <w:webHidden/>
+              </w:rPr>
+              <w:t>9</w:t>
+            </w:r>
+            <w:r>
+              <w:rPr>
+                <w:noProof/>
+                <w:webHidden/>
+              </w:rPr>
+              <w:fldChar w:fldCharType="end"/>
+            </w:r>
+          </w:hyperlink>
+        </w:p>
+        <w:p>
+          <w:r>
+            <w:rPr>
+              <w:b/>
+              <w:bCs/>
+            </w:rPr>
+            <w:fldChar w:fldCharType="end"/>
+          </w:r>
+        </w:p>
+      </w:sdtContent>
+    </w:sdt>
+    <w:p>
+      <w:pPr>
+        <w:spacing w:after="160" w:line="259" w:lineRule="auto"/>
+      </w:pPr>
+      <w:r>
+        <w:br w:type="page"/>
+      </w:r>
+    </w:p>
+    <w:p>
+      <w:pPr>
+        <w:pStyle w:val="Titre1"/>
+      </w:pPr>
+      <w:bookmarkStart w:id="0" w:name="_Toc230021426"/>
+      <w:r>
+        <w:lastRenderedPageBreak/>
+        <w:t>Synthèse</w:t>
+      </w:r>
+      <w:bookmarkEnd w:id="0"/>
+    </w:p>
+    <w:p>
+      <w:pPr>
+        <w:jc w:val="both"/>
+      </w:pPr>
+      <w:r>
+        <w:t xml:space="preserve">Les données SCADA du parc éolien </w:t>
+      </w:r>
+      <w:r>
+        <w:t>{{park_name}}</w:t>
+      </w:r>
+      <w:r>
+        <w:t xml:space="preserve"> ont été analysées sur la période du </w:t>
+      </w:r>
+      <w:r>
+        <w:t>{{analysis_start}}</w:t>
+      </w:r>
+      <w:r>
+        <w:t xml:space="preserve"> au </w:t>
+      </w:r>
+      <w:r>
+        <w:t>{{analysis_end}}</w:t>
+      </w:r>
+      <w:r>
+        <w:t xml:space="preserve">, à partir des informations fournies par le client. Le parc est composé de </w:t>
+      </w:r>
+      <w:r>
+        <w:t>{{turbine_count}}</w:t>
+      </w:r>
+      <w:r>
+        <w:t xml:space="preserve"> éoliennes de type</w:t>
+      </w:r>
+      <w:r>
+        <w:t xml:space="preserve"> </w:t>
+      </w:r>
+      <w:r>
+        <w:t>{{model_wtg}</w:t>
+      </w:r>
+      <w:r>
+        <w:t>}</w:t>
+      </w:r>
+      <w:r>
+        <w:t xml:space="preserve">, désignées </w:t>
+      </w:r>
+      <w:r>
+        <w:t>{{turbine_list}}</w:t>
+      </w:r>
+      <w:r>
+        <w:t xml:space="preserve"> L’ensemble des turbines a été pris en compte dans l’analyse.</w:t>
+      </w:r>
+    </w:p>
+    <w:p>
+      <w:pPr>
+        <w:jc w:val="both"/>
+      </w:pPr>
+    </w:p>
+    <w:p>
+      <w:pPr>
+        <w:jc w:val="both"/>
+      </w:pPr>
+      <w:r>
+        <w:t>Le tableau ci-après présente une évaluation synthétique des performances du parc, en mettant en évidence, pour chaque indicateur, le niveau de performance de chaque éolienne ainsi que les éventuels écarts observés.</w:t>
+      </w:r>
+    </w:p>
+    <w:p>
+      <w:pPr>
+        <w:jc w:val="both"/>
+      </w:pPr>
+    </w:p>
+    <w:p>
+      <w:pPr>
+        <w:jc w:val="both"/>
+      </w:pPr>
+      <w:r>
+        <w:t>[TABLE:STATUS_SUMMARY_TABLE]</w:t>
+      </w:r>
+    </w:p>
     <w:p/>
     <w:p>
       <w:pPr>
         <w:pStyle w:val="Titre1"/>
       </w:pPr>
-      <w:r>
-        <w:t>Synthèse</w:t>
-      </w:r>
+      <w:bookmarkStart w:id="1" w:name="_Toc230021427"/>
+      <w:r>
+        <w:t>Contexte de l’étude</w:t>
+      </w:r>
+      <w:bookmarkEnd w:id="1"/>
+    </w:p>
+    <w:p>
+      <w:pPr>
+        <w:pStyle w:val="Titre2"/>
+      </w:pPr>
+      <w:bookmarkStart w:id="2" w:name="_Toc230021428"/>
+      <w:r>
+        <w:t>Présentation générale du parc</w:t>
+      </w:r>
+      <w:bookmarkEnd w:id="2"/>
     </w:p>
     <w:p>
       <w:pPr>
         <w:jc w:val="both"/>
       </w:pPr>
       <w:r>
-        <w:t xml:space="preserve">Les données SCADA du parc éolien </w:t>
-      </w:r>
-      <w:r>
-        <w:t>{{park_name}}</w:t>
-      </w:r>
-      <w:r>
-        <w:t xml:space="preserve"> ont été analysées sur la période du </w:t>
-      </w:r>
-      <w:r>
-        <w:t>{{analysis_start}}</w:t>
-      </w:r>
-      <w:r>
-        <w:t xml:space="preserve"> au </w:t>
-      </w:r>
-      <w:r>
-        <w:t>{{analysis_end}}</w:t>
-      </w:r>
-      <w:r>
-        <w:t xml:space="preserve">, à partir des informations fournies par le client. Le parc est composé de </w:t>
-      </w:r>
-      <w:r>
-        <w:t>{{turbine_count}}</w:t>
-      </w:r>
-      <w:r>
-        <w:t xml:space="preserve"> éoliennes de type</w:t>
-      </w:r>
+        <w:t>Le parc éolien {{</w:t>
+      </w:r>
+      <w:r>
+        <w:t>park_name</w:t>
+      </w:r>
+      <w:r>
+        <w:t>}} est situé sur le territoire des communes de {{</w:t>
+      </w:r>
+      <w:r>
+        <w:t>commune</w:t>
+      </w:r>
+      <w:r>
+        <w:t>}}, dans la région de {{</w:t>
+      </w:r>
+      <w:r>
+        <w:t>region</w:t>
+      </w:r>
+      <w:r>
+        <w:t>}}. Il est composé de {{</w:t>
+      </w:r>
+      <w:r>
+        <w:t>turbine_count</w:t>
+      </w:r>
+      <w:r>
+        <w:t>}} éoliennes de type {{</w:t>
+      </w:r>
+      <w:r>
+        <w:t>model_wtg</w:t>
+      </w:r>
+      <w:r>
+        <w:t>}}, d’une puissance nominale unitaire de {{</w:t>
+      </w:r>
+      <w:r>
+        <w:t>nominal_power</w:t>
+      </w:r>
+      <w:r>
+        <w:t>}}</w:t>
+      </w:r>
+      <w:r>
+        <w:t>.</w:t>
+      </w:r>
+    </w:p>
+    <w:p>
+      <w:pPr>
+        <w:jc w:val="both"/>
+      </w:pPr>
+    </w:p>
+    <w:p>
+      <w:pPr>
+        <w:jc w:val="both"/>
+      </w:pPr>
+      <w:r>
+        <w:t>Les éoliennes du parc sont identifiées comme suit : {{</w:t>
+      </w:r>
+      <w:r>
+        <w:t>turbine_list</w:t>
+      </w:r>
+      <w:r>
+        <w:t>}}. L’implantation du parc et la disposition des éoliennes sont présentées dans la figure ci-</w:t>
+      </w:r>
+      <w:r>
+        <w:t>après :</w:t>
+      </w:r>
+    </w:p>
+    <w:p>
+      <w:pPr>
+        <w:jc w:val="both"/>
+      </w:pPr>
+      <w:r>
+        <w:t>[TODO.IMAGE_POSITION]</w:t>
+      </w:r>
+    </w:p>
+    <w:p>
       <w:r>
         <w:t xml:space="preserve"> </w:t>
       </w:r>
-      <w:r>
-        <w:t>{{model_wtg}</w:t>
-      </w:r>
-      <w:r>
-        <w:t>}</w:t>
-      </w:r>
-      <w:r>
-        <w:t xml:space="preserve">, désignées </w:t>
-      </w:r>
-      <w:r>
-        <w:t>{{turbine_list}}</w:t>
-      </w:r>
-      <w:r>
-        <w:t xml:space="preserve"> L’ensemble des turbines a été pris en compte dans l’analyse.</w:t>
-      </w:r>
-    </w:p>
-    <w:p>
-      <w:pPr>
-        <w:jc w:val="both"/>
-      </w:pPr>
-    </w:p>
-    <w:p>
-      <w:pPr>
-        <w:jc w:val="both"/>
-      </w:pPr>
-      <w:r>
-        <w:t>Le tableau ci-après présente une évaluation synthétique des performances du parc, en mettant en évidence, pour chaque indicateur, le niveau de performance de chaque éolienne ainsi que les éventuels écarts observés.</w:t>
-      </w:r>
-    </w:p>
-    <w:p>
-      <w:pPr>
-        <w:jc w:val="both"/>
-      </w:pPr>
-    </w:p>
-    <w:p>
-      <w:pPr>
-        <w:jc w:val="both"/>
-      </w:pPr>
-      <w:r>
-        <w:t>[TABLE:STATUS_SUMMARY_TABLE]</w:t>
-      </w:r>
-    </w:p>
-    <w:p/>
-    <w:p>
-      <w:pPr>
-        <w:pStyle w:val="Titre1"/>
-      </w:pPr>
-      <w:r>
-        <w:t>Contexte de l’étude</w:t>
-      </w:r>
     </w:p>
     <w:p>
       <w:pPr>
         <w:pStyle w:val="Titre2"/>
       </w:pPr>
-      <w:r>
-        <w:t>Présentation générale du parc</w:t>
-      </w:r>
-    </w:p>
-    <w:p>
-      <w:pPr>
-        <w:jc w:val="both"/>
-      </w:pPr>
-      <w:r>
-        <w:t>Le parc éolien {{</w:t>
-      </w:r>
-      <w:r>
-        <w:t>park_name</w:t>
-      </w:r>
-      <w:r>
-        <w:t>}} est situé sur le territoire des communes de {{</w:t>
-      </w:r>
-      <w:r>
-        <w:t>commune</w:t>
-      </w:r>
-      <w:r>
-        <w:t>}}, dans la région de {{</w:t>
-      </w:r>
-      <w:r>
-        <w:t>region</w:t>
-      </w:r>
-      <w:r>
-        <w:t>}}. Il est composé de {{</w:t>
-      </w:r>
-      <w:r>
-        <w:t>turbine_count</w:t>
-      </w:r>
-      <w:r>
-        <w:t>}} éoliennes de type {{</w:t>
-      </w:r>
-      <w:r>
-        <w:t>model_wtg</w:t>
-      </w:r>
-      <w:r>
-        <w:t>}}, d’une puissance nominale unitaire de {{</w:t>
-      </w:r>
-      <w:r>
-        <w:t>nominal_power</w:t>
-      </w:r>
-      <w:r>
-        <w:t>}}</w:t>
-      </w:r>
-      <w:r>
-        <w:t>.</w:t>
-      </w:r>
-    </w:p>
-    <w:p>
-      <w:pPr>
-        <w:jc w:val="both"/>
-      </w:pPr>
-    </w:p>
-    <w:p>
-      <w:pPr>
-        <w:jc w:val="both"/>
-      </w:pPr>
-      <w:r>
-        <w:t>Les éoliennes du parc sont identifiées comme suit : {{</w:t>
-      </w:r>
-      <w:r>
-        <w:t>turbine_list</w:t>
-      </w:r>
-      <w:r>
-        <w:t>}}. L’implantation du parc et la disposition des éoliennes sont présentées dans la figure ci-</w:t>
-      </w:r>
-      <w:r>
-        <w:t>après :</w:t>
-      </w:r>
-    </w:p>
-    <w:p>
-      <w:pPr>
-        <w:jc w:val="both"/>
-      </w:pPr>
-      <w:r>
-        <w:t>[TODO.IMAGE_POSITION]</w:t>
-      </w:r>
-    </w:p>
-    <w:p>
-      <w:r>
-        <w:t xml:space="preserve"> </w:t>
+      <w:bookmarkStart w:id="3" w:name="_Toc230021429"/>
+      <w:r>
+        <w:t>Coordonnées des éoliennes</w:t>
+      </w:r>
+      <w:bookmarkEnd w:id="3"/>
+    </w:p>
+    <w:p>
+      <w:r>
+        <w:t>Les coordonnées géographiques des éoliennes du parc sont présentées dans le tableau ci-dessous :</w:t>
+      </w:r>
+    </w:p>
+    <w:p>
+      <w:r>
+        <w:t>[TABLE:GPS_COORDINATES_TABLE]</w:t>
       </w:r>
     </w:p>
     <w:p>
       <w:pPr>
         <w:pStyle w:val="Titre2"/>
       </w:pPr>
-      <w:r>
-        <w:t>Coordonnées des éoliennes</w:t>
-      </w:r>
-    </w:p>
-    <w:p>
-      <w:r>
-        <w:t>Les coordonnées géographiques des éoliennes du parc sont présentées dans le tableau ci-dessous :</w:t>
-      </w:r>
-    </w:p>
-    <w:p>
-      <w:r>
-        <w:t>[TABLE:GPS_COORDINATES_TABLE]</w:t>
+      <w:bookmarkStart w:id="4" w:name="_Toc230021430"/>
+      <w:r>
+        <w:t>Données fournies par le client</w:t>
+      </w:r>
+      <w:bookmarkEnd w:id="4"/>
+    </w:p>
+    <w:p>
+      <w:r>
+        <w:t>Dans le cadre de cette étude, plusieurs jeux de données ont été transmis par le client afin de permettre l’analyse des performances du parc éolien.</w:t>
+      </w:r>
+    </w:p>
+    <w:p>
+      <w:r>
+        <w:t>[</w:t>
+      </w:r>
+      <w:r>
+        <w:t>TABLE</w:t>
+      </w:r>
+      <w:r>
+        <w:t>:CSV_FILES_TABLE]</w:t>
       </w:r>
     </w:p>
     <w:p>
       <w:pPr>
         <w:pStyle w:val="Titre2"/>
       </w:pPr>
-      <w:r>
-        <w:t>Données fournies par le client</w:t>
-      </w:r>
-    </w:p>
-    <w:p>
-      <w:r>
-        <w:t>Dans le cadre de cette étude, plusieurs jeux de données ont été transmis par le client afin de permettre l’analyse des performances du parc éolien.</w:t>
-      </w:r>
-    </w:p>
-    <w:p>
-      <w:r>
-        <w:t>[</w:t>
-      </w:r>
-      <w:r>
-        <w:t>TABLE</w:t>
-      </w:r>
-      <w:r>
-        <w:t>:CSV_FILES_TABLE]</w:t>
-      </w:r>
-    </w:p>
-    <w:p>
-      <w:pPr>
-        <w:pStyle w:val="Titre2"/>
-      </w:pPr>
+      <w:bookmarkStart w:id="5" w:name="_Toc230021431"/>
       <w:r>
         <w:t>Périmètre de l’analyse SCADA</w:t>
       </w:r>
+      <w:bookmarkEnd w:id="5"/>
     </w:p>
     <w:p>
       <w:r>
@@ -1631,7 +3338,7 @@
               <w:lastRenderedPageBreak/>
               <w:t>Thématiq</w:t>
             </w:r>
-            <w:commentRangeStart w:id="0"/>
+            <w:commentRangeStart w:id="6"/>
             <w:r>
               <w:rPr>
                 <w:rFonts w:ascii="Cambria" w:eastAsia="MS Mincho" w:hAnsi="Cambria"/>
@@ -1640,7 +3347,7 @@
               </w:rPr>
               <w:t>u</w:t>
             </w:r>
-            <w:commentRangeEnd w:id="0"/>
+            <w:commentRangeEnd w:id="6"/>
             <w:r>
               <w:rPr>
                 <w:rStyle w:val="Marquedecommentaire"/>
@@ -1648,7 +3355,7 @@
                 <w:sz w:val="22"/>
                 <w:szCs w:val="22"/>
               </w:rPr>
-              <w:commentReference w:id="0"/>
+              <w:commentReference w:id="6"/>
             </w:r>
             <w:r>
               <w:rPr>
@@ -2179,17 +3886,21 @@
       <w:pPr>
         <w:pStyle w:val="Titre1"/>
       </w:pPr>
+      <w:bookmarkStart w:id="7" w:name="_Toc230021432"/>
       <w:r>
         <w:t>Analyse détaillée</w:t>
       </w:r>
+      <w:bookmarkEnd w:id="7"/>
     </w:p>
     <w:p>
       <w:pPr>
         <w:pStyle w:val="Titre2"/>
       </w:pPr>
+      <w:bookmarkStart w:id="8" w:name="_Toc230021433"/>
       <w:r>
         <w:t>Disponibilité des données SCADA</w:t>
       </w:r>
+      <w:bookmarkEnd w:id="8"/>
     </w:p>
     <w:p>
       <w:r>
@@ -2388,8 +4099,13 @@
       <w:pPr>
         <w:pStyle w:val="Titre2"/>
       </w:pPr>
-      <w:r>
-        <w:t xml:space="preserve">Disponibilité énergétique </w:t>
+      <w:bookmarkStart w:id="9" w:name="_Toc230021434"/>
+      <w:r>
+        <w:t>Disponibilité énergétique</w:t>
+      </w:r>
+      <w:bookmarkEnd w:id="9"/>
+      <w:r>
+        <w:t xml:space="preserve"> </w:t>
       </w:r>
     </w:p>
     <w:p>
@@ -2641,9 +4357,14 @@
       <w:pPr>
         <w:pStyle w:val="Titre2"/>
       </w:pPr>
+      <w:bookmarkStart w:id="10" w:name="_Toc230021435"/>
       <w:r>
         <w:lastRenderedPageBreak/>
-        <w:t xml:space="preserve">Analyse des codes défauts </w:t>
+        <w:t>Analyse des codes défauts</w:t>
+      </w:r>
+      <w:bookmarkEnd w:id="10"/>
+      <w:r>
+        <w:t xml:space="preserve"> </w:t>
       </w:r>
     </w:p>
     <w:p>
@@ -2863,6 +4584,7 @@
       <w:pPr>
         <w:pStyle w:val="Titre2"/>
       </w:pPr>
+      <w:bookmarkStart w:id="11" w:name="_Toc230021436"/>
       <w:r>
         <w:t xml:space="preserve">Analyse de la </w:t>
       </w:r>
@@ -2872,6 +4594,7 @@
       <w:r>
         <w:t xml:space="preserve"> vent</w:t>
       </w:r>
+      <w:bookmarkEnd w:id="11"/>
     </w:p>
     <w:p>
       <w:r>
@@ -3027,9 +4750,11 @@
       <w:pPr>
         <w:pStyle w:val="Titre2"/>
       </w:pPr>
+      <w:bookmarkStart w:id="12" w:name="_Toc230021437"/>
       <w:r>
         <w:t>Analyse des courbes de puissance selon la norme IEC 61400-2</w:t>
       </w:r>
+      <w:bookmarkEnd w:id="12"/>
     </w:p>
     <w:p>
       <w:r>
@@ -3177,9 +4902,11 @@
       <w:pPr>
         <w:pStyle w:val="Titre2"/>
       </w:pPr>
+      <w:bookmarkStart w:id="13" w:name="_Toc230021438"/>
       <w:r>
         <w:t>Analyse de la vitesse de rotation (Rotor RPM)</w:t>
       </w:r>
+      <w:bookmarkEnd w:id="13"/>
     </w:p>
     <w:p>
       <w:r>
@@ -3358,9 +5085,11 @@
       <w:pPr>
         <w:pStyle w:val="Titre2"/>
       </w:pPr>
+      <w:bookmarkStart w:id="14" w:name="_Toc230021439"/>
       <w:r>
         <w:t>Analyse du comportement du pitch</w:t>
       </w:r>
+      <w:bookmarkEnd w:id="14"/>
     </w:p>
     <w:p>
       <w:r>
@@ -3514,9 +5243,11 @@
       <w:pPr>
         <w:pStyle w:val="Titre2"/>
       </w:pPr>
+      <w:bookmarkStart w:id="15" w:name="_Toc230021440"/>
       <w:r>
         <w:t>Analyse des limitations</w:t>
       </w:r>
+      <w:bookmarkEnd w:id="15"/>
     </w:p>
     <w:p>
       <w:r>
@@ -3659,9 +5390,11 @@
       <w:pPr>
         <w:pStyle w:val="Titre1"/>
       </w:pPr>
+      <w:bookmarkStart w:id="16" w:name="_Toc230021441"/>
       <w:r>
         <w:t>Recommandations &amp; Action</w:t>
       </w:r>
+      <w:bookmarkEnd w:id="16"/>
     </w:p>
     <w:p>
       <w:r>
@@ -3675,9 +5408,11 @@
       <w:pPr>
         <w:pStyle w:val="Titre1"/>
       </w:pPr>
+      <w:bookmarkStart w:id="17" w:name="_Toc230021442"/>
       <w:r>
         <w:t>Conclusion</w:t>
       </w:r>
+      <w:bookmarkEnd w:id="17"/>
     </w:p>
     <w:p>
       <w:r>
@@ -3691,17 +5426,21 @@
       <w:pPr>
         <w:pStyle w:val="Titre1"/>
       </w:pPr>
+      <w:bookmarkStart w:id="18" w:name="_Toc230021443"/>
       <w:r>
         <w:t>ANNEXE</w:t>
       </w:r>
+      <w:bookmarkEnd w:id="18"/>
     </w:p>
     <w:p>
       <w:pPr>
         <w:pStyle w:val="Titre2"/>
       </w:pPr>
+      <w:bookmarkStart w:id="19" w:name="_Toc230021444"/>
       <w:r>
         <w:t>Disponibilité temporelle (Time-Based Availability – TBA)</w:t>
       </w:r>
+      <w:bookmarkEnd w:id="19"/>
     </w:p>
     <w:p>
       <w:r>
@@ -3833,9 +5572,11 @@
       <w:pPr>
         <w:pStyle w:val="Titre2"/>
       </w:pPr>
+      <w:bookmarkStart w:id="20" w:name="_Toc230021445"/>
       <w:r>
         <w:t>Analyse détaillée des courbes de puissance</w:t>
       </w:r>
+      <w:bookmarkEnd w:id="20"/>
     </w:p>
     <w:p>
       <w:r>
@@ -3859,7 +5600,7 @@
 
 <file path=word/comments.xml><?xml version="1.0" encoding="utf-8"?>
 <w:comments xmlns:wpc="http://schemas.microsoft.com/office/word/2010/wordprocessingCanvas" xmlns:cx="http://schemas.microsoft.com/office/drawing/2014/chartex" xmlns:cx1="http://schemas.microsoft.com/office/drawing/2015/9/8/chartex" xmlns:cx2="http://schemas.microsoft.com/office/drawing/2015/10/21/chartex" xmlns:cx3="http://schemas.microsoft.com/office/drawing/2016/5/9/chartex" xmlns:cx4="http://schemas.microsoft.com/office/drawing/2016/5/10/chartex" xmlns:cx5="http://schemas.microsoft.com/office/drawing/2016/5/11/chartex" xmlns:cx6="http://schemas.microsoft.com/office/drawing/2016/5/12/chartex" xmlns:cx7="http://schemas.microsoft.com/office/drawing/2016/5/13/chartex" xmlns:cx8="http://schemas.microsoft.com/office/drawing/2016/5/14/chartex" xmlns:mc="http://schemas.openxmlformats.org/markup-compatibility/2006" xmlns:aink="http://schemas.microsoft.com/office/drawing/2016/ink" xmlns:am3d="http://schemas.microsoft.com/office/drawing/2017/model3d" xmlns:o="urn:schemas-microsoft-com:office:office" xmlns:oel="http://schemas.microsoft.com/office/2019/extlst" xmlns:r="http://schemas.openxmlformats.org/officeDocument/2006/relationships" xmlns:m="http://schemas.openxmlformats.org/officeDocument/2006/math" xmlns:v="urn:schemas-microsoft-com:vml" xmlns:wp14="http://schemas.microsoft.com/office/word/2010/wordprocessingDrawing" xmlns:wp="http://schemas.openxmlformats.org/drawingml/2006/wordprocessingDrawing" xmlns:w10="urn:schemas-microsoft-com:office:word" xmlns:w="http://schemas.openxmlformats.org/wordprocessingml/2006/main" xmlns:w14="http://schemas.microsoft.com/office/word/2010/wordml" xmlns:w15="http://schemas.microsoft.com/office/word/2012/wordml" xmlns:w16cex="http://schemas.microsoft.com/office/word/2018/wordml/cex" xmlns:w16cid="http://schemas.microsoft.com/office/word/2016/wordml/cid" xmlns:w16="http://schemas.microsoft.com/office/word/2018/wordml" xmlns:w16du="http://schemas.microsoft.com/office/word/2023/wordml/word16du" xmlns:w16sdtdh="http://schemas.microsoft.com/office/word/2020/wordml/sdtdatahash" xmlns:w16sdtfl="http://schemas.microsoft.com/office/word/2024/wordml/sdtformatlock" xmlns:w16se="http://schemas.microsoft.com/office/word/2015/wordml/symex" xmlns:wpg="http://schemas.microsoft.com/office/word/2010/wordprocessingGroup" xmlns:wpi="http://schemas.microsoft.com/office/word/2010/wordprocessingInk" xmlns:wne="http://schemas.microsoft.com/office/word/2006/wordml" xmlns:wps="http://schemas.microsoft.com/office/word/2010/wordprocessingShape" mc:Ignorable="w14 w15 w16se w16cid w16 w16cex w16sdtdh w16sdtfl w16du wp14">
-  <w:comment w:id="0" w:author="N Bernard" w:date="2026-04-09T16:50:00Z" w:initials="NB">
+  <w:comment w:id="6" w:author="N Bernard" w:date="2026-04-09T16:50:00Z" w:initials="NB">
     <w:p>
       <w:pPr>
         <w:pStyle w:val="Commentaire"/>
@@ -6849,6 +8590,62 @@
       </w:tcPr>
     </w:tblStylePr>
   </w:style>
+  <w:style w:type="paragraph" w:styleId="En-ttedetabledesmatires">
+    <w:name w:val="TOC Heading"/>
+    <w:basedOn w:val="Titre1"/>
+    <w:next w:val="Normal"/>
+    <w:uiPriority w:val="39"/>
+    <w:unhideWhenUsed/>
+    <w:qFormat/>
+    <w:rsid w:val="00611B20"/>
+    <w:pPr>
+      <w:numPr>
+        <w:numId w:val="0"/>
+      </w:numPr>
+      <w:spacing w:before="240" w:after="0" w:line="259" w:lineRule="auto"/>
+      <w:outlineLvl w:val="9"/>
+    </w:pPr>
+    <w:rPr>
+      <w:sz w:val="32"/>
+      <w:szCs w:val="32"/>
+    </w:rPr>
+  </w:style>
+  <w:style w:type="paragraph" w:styleId="TM1">
+    <w:name w:val="toc 1"/>
+    <w:basedOn w:val="Normal"/>
+    <w:next w:val="Normal"/>
+    <w:autoRedefine/>
+    <w:uiPriority w:val="39"/>
+    <w:unhideWhenUsed/>
+    <w:rsid w:val="00611B20"/>
+    <w:pPr>
+      <w:spacing w:after="100"/>
+    </w:pPr>
+  </w:style>
+  <w:style w:type="paragraph" w:styleId="TM2">
+    <w:name w:val="toc 2"/>
+    <w:basedOn w:val="Normal"/>
+    <w:next w:val="Normal"/>
+    <w:autoRedefine/>
+    <w:uiPriority w:val="39"/>
+    <w:unhideWhenUsed/>
+    <w:rsid w:val="00611B20"/>
+    <w:pPr>
+      <w:spacing w:after="100"/>
+      <w:ind w:left="240"/>
+    </w:pPr>
+  </w:style>
+  <w:style w:type="character" w:styleId="Lienhypertexte">
+    <w:name w:val="Hyperlink"/>
+    <w:basedOn w:val="Policepardfaut"/>
+    <w:uiPriority w:val="99"/>
+    <w:unhideWhenUsed/>
+    <w:rsid w:val="00611B20"/>
+    <w:rPr>
+      <w:color w:val="467886" w:themeColor="hyperlink"/>
+      <w:u w:val="single"/>
+    </w:rPr>
+  </w:style>
 </w:styles>
 </file>
 

</xml_diff>

<commit_message>
[CHANGE] change the template code for the document
</commit_message>
<xml_diff>
--- a/assets/templates/template_scada.docx
+++ b/assets/templates/template_scada.docx
@@ -152,7 +152,7 @@
           </mc:Choice>
           <mc:Fallback>
             <w:pict>
-              <v:shape w14:anchorId="53C37D39" id="Rectangle : avec coin rogné 31" o:spid="_x0000_s1026" style="position:absolute;margin-left:-14.05pt;margin-top:151.45pt;width:502.8pt;height:81.6pt;z-index:251660288;visibility:visible;mso-wrap-style:square;mso-width-percent:0;mso-height-percent:0;mso-wrap-distance-left:9pt;mso-wrap-distance-top:0;mso-wrap-distance-right:9pt;mso-wrap-distance-bottom:0;mso-position-horizontal:absolute;mso-position-horizontal-relative:margin;mso-position-vertical:absolute;mso-position-vertical-relative:page;mso-width-percent:0;mso-height-percent:0;mso-width-relative:margin;mso-height-relative:margin;v-text-anchor:top" coordsize="6385560,1036320" o:spt="100" o:gfxdata="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" adj="-11796480,,5400" path="m,l5924698,r460862,460862l6385560,1036320,,1036320,,xe" fillcolor="#0e2841 [3215]" stroked="f" strokeweight="1pt">
+              <v:shape w14:anchorId="53C37D39" id="Rectangle : avec coin rogné 31" o:spid="_x0000_s1026" style="position:absolute;left:0;text-align:left;margin-left:-14.05pt;margin-top:151.45pt;width:502.8pt;height:81.6pt;z-index:251660288;visibility:visible;mso-wrap-style:square;mso-width-percent:0;mso-height-percent:0;mso-wrap-distance-left:9pt;mso-wrap-distance-top:0;mso-wrap-distance-right:9pt;mso-wrap-distance-bottom:0;mso-position-horizontal:absolute;mso-position-horizontal-relative:margin;mso-position-vertical:absolute;mso-position-vertical-relative:page;mso-width-percent:0;mso-height-percent:0;mso-width-relative:margin;mso-height-relative:margin;v-text-anchor:top" coordsize="6385560,1036320" o:spt="100" o:gfxdata="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" adj="-11796480,,5400" path="m,l5924698,r460862,460862l6385560,1036320,,1036320,,xe" fillcolor="#0e2841 [3215]" stroked="f" strokeweight="1pt">
                 <v:stroke joinstyle="miter"/>
                 <v:formulas/>
                 <v:path arrowok="t" o:connecttype="custom" o:connectlocs="0,0;5924698,0;6385560,460862;6385560,1036320;0,1036320;0,0" o:connectangles="0,0,0,0,0,0" textboxrect="0,0,6385560,1036320"/>
@@ -270,6 +270,7 @@
         </w:rPr>
         <w:t xml:space="preserve"> {{</w:t>
       </w:r>
+      <w:proofErr w:type="spellStart"/>
       <w:r>
         <w:rPr>
           <w:sz w:val="36"/>
@@ -277,6 +278,7 @@
         </w:rPr>
         <w:t>client_name</w:t>
       </w:r>
+      <w:proofErr w:type="spellEnd"/>
       <w:r>
         <w:rPr>
           <w:sz w:val="36"/>
@@ -329,8 +331,17 @@
                 <w:b/>
                 <w:bCs/>
               </w:rPr>
-              <w:t>Date d’émission</w:t>
-            </w:r>
+              <w:t xml:space="preserve">Date </w:t>
+            </w:r>
+            <w:proofErr w:type="spellStart"/>
+            <w:r>
+              <w:rPr>
+                <w:b/>
+                <w:bCs/>
+              </w:rPr>
+              <w:t>d’émission</w:t>
+            </w:r>
+            <w:proofErr w:type="spellEnd"/>
           </w:p>
         </w:tc>
         <w:tc>
@@ -366,6 +377,7 @@
                 <w:bCs/>
               </w:rPr>
             </w:pPr>
+            <w:proofErr w:type="spellStart"/>
             <w:r>
               <w:rPr>
                 <w:b/>
@@ -373,6 +385,7 @@
               </w:rPr>
               <w:t>Rédacteur</w:t>
             </w:r>
+            <w:proofErr w:type="spellEnd"/>
           </w:p>
         </w:tc>
         <w:tc>
@@ -387,6 +400,7 @@
                 <w:bCs/>
               </w:rPr>
             </w:pPr>
+            <w:proofErr w:type="spellStart"/>
             <w:r>
               <w:rPr>
                 <w:b/>
@@ -394,6 +408,7 @@
               </w:rPr>
               <w:t>Vérificateur</w:t>
             </w:r>
+            <w:proofErr w:type="spellEnd"/>
           </w:p>
         </w:tc>
         <w:tc>
@@ -408,6 +423,7 @@
                 <w:bCs/>
               </w:rPr>
             </w:pPr>
+            <w:proofErr w:type="spellStart"/>
             <w:r>
               <w:rPr>
                 <w:b/>
@@ -415,6 +431,7 @@
               </w:rPr>
               <w:t>Approbateur</w:t>
             </w:r>
+            <w:proofErr w:type="spellEnd"/>
           </w:p>
         </w:tc>
       </w:tr>
@@ -535,7 +552,7 @@
                     </pic:cNvPicPr>
                   </pic:nvPicPr>
                   <pic:blipFill>
-                    <a:blip r:embed="rId6">
+                    <a:blip r:embed="rId8">
                       <a:extLst>
                         <a:ext uri="{28A0092B-C50C-407E-A947-70E740481C1C}">
                           <a14:useLocalDpi xmlns:a14="http://schemas.microsoft.com/office/drawing/2010/main" val="0"/>
@@ -988,9 +1005,11 @@
         <w:lastRenderedPageBreak/>
         <w:t>Nom du parc : {{</w:t>
       </w:r>
+      <w:proofErr w:type="spellStart"/>
       <w:r>
         <w:t>park_name</w:t>
       </w:r>
+      <w:proofErr w:type="spellEnd"/>
       <w:r>
         <w:t xml:space="preserve">}} </w:t>
       </w:r>
@@ -999,31 +1018,43 @@
       <w:r>
         <w:t>Type d’éoliennes : {{</w:t>
       </w:r>
+      <w:proofErr w:type="spellStart"/>
       <w:r>
         <w:t>model_wtg</w:t>
       </w:r>
+      <w:proofErr w:type="spellEnd"/>
       <w:r>
         <w:t xml:space="preserve">}} </w:t>
       </w:r>
     </w:p>
     <w:p>
       <w:r>
-        <w:t>Nombre d’éoliennes : {{N</w:t>
+        <w:t>Nombre d’éoliennes : {{</w:t>
+      </w:r>
+      <w:proofErr w:type="spellStart"/>
+      <w:r>
+        <w:t>N</w:t>
       </w:r>
       <w:r>
         <w:t>ombre</w:t>
       </w:r>
       <w:r>
-        <w:t xml:space="preserve">_WTG}} </w:t>
+        <w:t>_WTG</w:t>
+      </w:r>
+      <w:proofErr w:type="spellEnd"/>
+      <w:r>
+        <w:t xml:space="preserve">}} </w:t>
       </w:r>
     </w:p>
     <w:p>
       <w:r>
         <w:t>Puissance totale installée : {{</w:t>
       </w:r>
+      <w:proofErr w:type="spellStart"/>
       <w:r>
         <w:t>nominal_power</w:t>
       </w:r>
+      <w:proofErr w:type="spellEnd"/>
       <w:r>
         <w:t xml:space="preserve">}} </w:t>
       </w:r>
@@ -1032,9 +1063,11 @@
       <w:r>
         <w:t>Localisation : {{</w:t>
       </w:r>
+      <w:proofErr w:type="spellStart"/>
       <w:r>
         <w:t>client_location</w:t>
       </w:r>
+      <w:proofErr w:type="spellEnd"/>
       <w:r>
         <w:t xml:space="preserve">}} </w:t>
       </w:r>
@@ -1043,9 +1076,11 @@
       <w:r>
         <w:t>Client : {{</w:t>
       </w:r>
+      <w:proofErr w:type="spellStart"/>
       <w:r>
         <w:t>client_name</w:t>
       </w:r>
+      <w:proofErr w:type="spellEnd"/>
       <w:r>
         <w:t>}}</w:t>
       </w:r>
@@ -1054,9 +1089,11 @@
       <w:r>
         <w:t>Contact : {{</w:t>
       </w:r>
+      <w:proofErr w:type="spellStart"/>
       <w:r>
         <w:t>client_contact</w:t>
       </w:r>
+      <w:proofErr w:type="spellEnd"/>
       <w:r>
         <w:t xml:space="preserve">}} </w:t>
       </w:r>
@@ -1065,9 +1102,11 @@
       <w:r>
         <w:t>Constructeur / Exploitant : {{</w:t>
       </w:r>
+      <w:proofErr w:type="spellStart"/>
       <w:r>
         <w:t>constructor</w:t>
       </w:r>
+      <w:proofErr w:type="spellEnd"/>
       <w:r>
         <w:t xml:space="preserve">}} </w:t>
       </w:r>
@@ -1079,12 +1118,14 @@
           <w:lang w:val="en-US"/>
         </w:rPr>
       </w:pPr>
+      <w:proofErr w:type="spellStart"/>
       <w:r>
         <w:rPr>
           <w:lang w:val="en-US"/>
         </w:rPr>
         <w:t>Rédacteur</w:t>
       </w:r>
+      <w:proofErr w:type="spellEnd"/>
     </w:p>
     <w:p>
       <w:pPr>
@@ -1098,12 +1139,14 @@
         </w:rPr>
         <w:t>{{</w:t>
       </w:r>
+      <w:proofErr w:type="spellStart"/>
       <w:r>
         <w:rPr>
           <w:lang w:val="en-US"/>
         </w:rPr>
         <w:t>author_name</w:t>
       </w:r>
+      <w:proofErr w:type="spellEnd"/>
       <w:r>
         <w:rPr>
           <w:lang w:val="en-US"/>
@@ -1117,18 +1160,28 @@
           <w:lang w:val="en-US"/>
         </w:rPr>
       </w:pPr>
-      <w:r>
-        <w:rPr>
-          <w:lang w:val="en-US"/>
-        </w:rPr>
-        <w:t>Email : {{</w:t>
-      </w:r>
+      <w:proofErr w:type="gramStart"/>
+      <w:r>
+        <w:rPr>
+          <w:lang w:val="en-US"/>
+        </w:rPr>
+        <w:t>Email :</w:t>
+      </w:r>
+      <w:proofErr w:type="gramEnd"/>
+      <w:r>
+        <w:rPr>
+          <w:lang w:val="en-US"/>
+        </w:rPr>
+        <w:t xml:space="preserve"> {{</w:t>
+      </w:r>
+      <w:proofErr w:type="spellStart"/>
       <w:r>
         <w:rPr>
           <w:lang w:val="en-US"/>
         </w:rPr>
         <w:t>author_email</w:t>
       </w:r>
+      <w:proofErr w:type="spellEnd"/>
       <w:r>
         <w:rPr>
           <w:lang w:val="en-US"/>
@@ -1142,203 +1195,269 @@
           <w:lang w:val="en-US"/>
         </w:rPr>
       </w:pPr>
-      <w:r>
-        <w:rPr>
-          <w:lang w:val="en-US"/>
-        </w:rPr>
+      <w:proofErr w:type="spellStart"/>
+      <w:proofErr w:type="gramStart"/>
+      <w:r>
+        <w:rPr>
+          <w:lang w:val="en-US"/>
+        </w:rPr>
+        <w:t>Téléphone</w:t>
+      </w:r>
+      <w:proofErr w:type="spellEnd"/>
+      <w:r>
+        <w:rPr>
+          <w:lang w:val="en-US"/>
+        </w:rPr>
+        <w:t xml:space="preserve"> :</w:t>
+      </w:r>
+      <w:proofErr w:type="gramEnd"/>
+      <w:r>
+        <w:rPr>
+          <w:lang w:val="en-US"/>
+        </w:rPr>
+        <w:t xml:space="preserve"> {{</w:t>
+      </w:r>
+      <w:proofErr w:type="spellStart"/>
+      <w:r>
+        <w:rPr>
+          <w:lang w:val="en-US"/>
+        </w:rPr>
+        <w:t>author_phone</w:t>
+      </w:r>
+      <w:proofErr w:type="spellEnd"/>
+      <w:r>
+        <w:rPr>
+          <w:lang w:val="en-US"/>
+        </w:rPr>
+        <w:t>}}</w:t>
+      </w:r>
+    </w:p>
+    <w:p>
+      <w:pPr>
+        <w:rPr>
+          <w:lang w:val="en-US"/>
+        </w:rPr>
+      </w:pPr>
+    </w:p>
+    <w:p>
+      <w:pPr>
+        <w:rPr>
+          <w:lang w:val="en-US"/>
+        </w:rPr>
+      </w:pPr>
+      <w:proofErr w:type="spellStart"/>
+      <w:r>
+        <w:rPr>
+          <w:lang w:val="en-US"/>
+        </w:rPr>
+        <w:t>Vérificateur</w:t>
+      </w:r>
+      <w:proofErr w:type="spellEnd"/>
+    </w:p>
+    <w:p>
+      <w:pPr>
+        <w:rPr>
+          <w:lang w:val="en-US"/>
+        </w:rPr>
+      </w:pPr>
+      <w:r>
+        <w:rPr>
+          <w:lang w:val="en-US"/>
+        </w:rPr>
+        <w:t>{{</w:t>
+      </w:r>
+      <w:proofErr w:type="spellStart"/>
+      <w:r>
+        <w:rPr>
+          <w:lang w:val="en-US"/>
+        </w:rPr>
+        <w:t>verificator_name</w:t>
+      </w:r>
+      <w:proofErr w:type="spellEnd"/>
+      <w:r>
+        <w:rPr>
+          <w:lang w:val="en-US"/>
+        </w:rPr>
+        <w:t>}}</w:t>
+      </w:r>
+    </w:p>
+    <w:p>
+      <w:pPr>
+        <w:rPr>
+          <w:lang w:val="en-US"/>
+        </w:rPr>
+      </w:pPr>
+      <w:proofErr w:type="gramStart"/>
+      <w:r>
+        <w:rPr>
+          <w:lang w:val="en-US"/>
+        </w:rPr>
+        <w:t>Email :</w:t>
+      </w:r>
+      <w:proofErr w:type="gramEnd"/>
+      <w:r>
+        <w:rPr>
+          <w:lang w:val="en-US"/>
+        </w:rPr>
+        <w:t xml:space="preserve"> {{</w:t>
+      </w:r>
+      <w:proofErr w:type="spellStart"/>
+      <w:r>
+        <w:rPr>
+          <w:lang w:val="en-US"/>
+        </w:rPr>
+        <w:t>verificator_email</w:t>
+      </w:r>
+      <w:proofErr w:type="spellEnd"/>
+      <w:r>
+        <w:rPr>
+          <w:lang w:val="en-US"/>
+        </w:rPr>
+        <w:t>}}</w:t>
+      </w:r>
+    </w:p>
+    <w:p>
+      <w:pPr>
+        <w:rPr>
+          <w:lang w:val="en-US"/>
+        </w:rPr>
+      </w:pPr>
+      <w:proofErr w:type="spellStart"/>
+      <w:proofErr w:type="gramStart"/>
+      <w:r>
+        <w:rPr>
+          <w:lang w:val="en-US"/>
+        </w:rPr>
+        <w:t>Téléphone</w:t>
+      </w:r>
+      <w:proofErr w:type="spellEnd"/>
+      <w:r>
+        <w:rPr>
+          <w:lang w:val="en-US"/>
+        </w:rPr>
+        <w:t xml:space="preserve"> :</w:t>
+      </w:r>
+      <w:proofErr w:type="gramEnd"/>
+      <w:r>
+        <w:rPr>
+          <w:lang w:val="en-US"/>
+        </w:rPr>
+        <w:t xml:space="preserve"> {{</w:t>
+      </w:r>
+      <w:proofErr w:type="spellStart"/>
+      <w:r>
+        <w:rPr>
+          <w:lang w:val="en-US"/>
+        </w:rPr>
+        <w:t>verificator_phone</w:t>
+      </w:r>
+      <w:proofErr w:type="spellEnd"/>
+      <w:r>
+        <w:rPr>
+          <w:lang w:val="en-US"/>
+        </w:rPr>
+        <w:t>}}</w:t>
+      </w:r>
+    </w:p>
+    <w:p>
+      <w:pPr>
+        <w:rPr>
+          <w:lang w:val="en-US"/>
+        </w:rPr>
+      </w:pPr>
+    </w:p>
+    <w:p>
+      <w:pPr>
+        <w:rPr>
+          <w:lang w:val="en-US"/>
+        </w:rPr>
+      </w:pPr>
+      <w:proofErr w:type="spellStart"/>
+      <w:r>
+        <w:rPr>
+          <w:lang w:val="en-US"/>
+        </w:rPr>
+        <w:t>Approbateur</w:t>
+      </w:r>
+      <w:proofErr w:type="spellEnd"/>
+    </w:p>
+    <w:p>
+      <w:pPr>
+        <w:rPr>
+          <w:lang w:val="en-US"/>
+        </w:rPr>
+      </w:pPr>
+      <w:r>
+        <w:rPr>
+          <w:lang w:val="en-US"/>
+        </w:rPr>
+        <w:t>{{</w:t>
+      </w:r>
+      <w:proofErr w:type="spellStart"/>
+      <w:r>
+        <w:rPr>
+          <w:lang w:val="en-US"/>
+        </w:rPr>
+        <w:t>approver_name</w:t>
+      </w:r>
+      <w:proofErr w:type="spellEnd"/>
+      <w:r>
+        <w:rPr>
+          <w:lang w:val="en-US"/>
+        </w:rPr>
+        <w:t>}</w:t>
+      </w:r>
+      <w:r>
+        <w:rPr>
+          <w:lang w:val="en-US"/>
+        </w:rPr>
+        <w:t>}</w:t>
+      </w:r>
+    </w:p>
+    <w:p>
+      <w:pPr>
+        <w:rPr>
+          <w:lang w:val="en-US"/>
+        </w:rPr>
+      </w:pPr>
+      <w:proofErr w:type="gramStart"/>
+      <w:r>
+        <w:rPr>
+          <w:lang w:val="en-US"/>
+        </w:rPr>
+        <w:t>Email :</w:t>
+      </w:r>
+      <w:proofErr w:type="gramEnd"/>
+      <w:r>
+        <w:rPr>
+          <w:lang w:val="en-US"/>
+        </w:rPr>
+        <w:t xml:space="preserve"> {{</w:t>
+      </w:r>
+      <w:proofErr w:type="spellStart"/>
+      <w:r>
+        <w:rPr>
+          <w:lang w:val="en-US"/>
+        </w:rPr>
+        <w:t>approver_email</w:t>
+      </w:r>
+      <w:proofErr w:type="spellEnd"/>
+      <w:r>
+        <w:rPr>
+          <w:lang w:val="en-US"/>
+        </w:rPr>
+        <w:t>}}</w:t>
+      </w:r>
+    </w:p>
+    <w:p>
+      <w:r>
         <w:t>Téléphone : {{</w:t>
       </w:r>
-      <w:r>
-        <w:rPr>
-          <w:lang w:val="en-US"/>
-        </w:rPr>
-        <w:t>author_phone</w:t>
-      </w:r>
-      <w:r>
-        <w:rPr>
-          <w:lang w:val="en-US"/>
-        </w:rPr>
-        <w:t>}}</w:t>
-      </w:r>
-    </w:p>
-    <w:p>
-      <w:pPr>
-        <w:rPr>
-          <w:lang w:val="en-US"/>
-        </w:rPr>
-      </w:pPr>
-    </w:p>
-    <w:p>
-      <w:pPr>
-        <w:rPr>
-          <w:lang w:val="en-US"/>
-        </w:rPr>
-      </w:pPr>
-      <w:r>
-        <w:rPr>
-          <w:lang w:val="en-US"/>
-        </w:rPr>
-        <w:t>Vérificateur</w:t>
-      </w:r>
-    </w:p>
-    <w:p>
-      <w:pPr>
-        <w:rPr>
-          <w:lang w:val="en-US"/>
-        </w:rPr>
-      </w:pPr>
-      <w:r>
-        <w:rPr>
-          <w:lang w:val="en-US"/>
-        </w:rPr>
-        <w:t>{{</w:t>
-      </w:r>
-      <w:r>
-        <w:rPr>
-          <w:lang w:val="en-US"/>
-        </w:rPr>
-        <w:t>verificator_name</w:t>
-      </w:r>
-      <w:r>
-        <w:rPr>
-          <w:lang w:val="en-US"/>
-        </w:rPr>
-        <w:t>}}</w:t>
-      </w:r>
-    </w:p>
-    <w:p>
-      <w:pPr>
-        <w:rPr>
-          <w:lang w:val="en-US"/>
-        </w:rPr>
-      </w:pPr>
-      <w:r>
-        <w:rPr>
-          <w:lang w:val="en-US"/>
-        </w:rPr>
-        <w:t>Email : {{</w:t>
-      </w:r>
-      <w:r>
-        <w:rPr>
-          <w:lang w:val="en-US"/>
-        </w:rPr>
-        <w:t>verificator_email</w:t>
-      </w:r>
-      <w:r>
-        <w:rPr>
-          <w:lang w:val="en-US"/>
-        </w:rPr>
-        <w:t>}}</w:t>
-      </w:r>
-    </w:p>
-    <w:p>
-      <w:pPr>
-        <w:rPr>
-          <w:lang w:val="en-US"/>
-        </w:rPr>
-      </w:pPr>
-      <w:r>
-        <w:rPr>
-          <w:lang w:val="en-US"/>
-        </w:rPr>
-        <w:t>Téléphone : {{</w:t>
-      </w:r>
-      <w:r>
-        <w:rPr>
-          <w:lang w:val="en-US"/>
-        </w:rPr>
-        <w:t>verificator_phone</w:t>
-      </w:r>
-      <w:r>
-        <w:rPr>
-          <w:lang w:val="en-US"/>
-        </w:rPr>
-        <w:t>}}</w:t>
-      </w:r>
-    </w:p>
-    <w:p>
-      <w:pPr>
-        <w:rPr>
-          <w:lang w:val="en-US"/>
-        </w:rPr>
-      </w:pPr>
-    </w:p>
-    <w:p>
-      <w:pPr>
-        <w:rPr>
-          <w:lang w:val="en-US"/>
-        </w:rPr>
-      </w:pPr>
-      <w:r>
-        <w:rPr>
-          <w:lang w:val="en-US"/>
-        </w:rPr>
-        <w:t>Approbateur</w:t>
-      </w:r>
-    </w:p>
-    <w:p>
-      <w:pPr>
-        <w:rPr>
-          <w:lang w:val="en-US"/>
-        </w:rPr>
-      </w:pPr>
-      <w:r>
-        <w:rPr>
-          <w:lang w:val="en-US"/>
-        </w:rPr>
-        <w:t>{{</w:t>
-      </w:r>
-      <w:r>
-        <w:rPr>
-          <w:lang w:val="en-US"/>
-        </w:rPr>
-        <w:t>approver_name</w:t>
-      </w:r>
-      <w:r>
-        <w:rPr>
-          <w:lang w:val="en-US"/>
-        </w:rPr>
-        <w:t>}</w:t>
-      </w:r>
-      <w:r>
-        <w:rPr>
-          <w:lang w:val="en-US"/>
-        </w:rPr>
-        <w:t>}</w:t>
-      </w:r>
-    </w:p>
-    <w:p>
-      <w:pPr>
-        <w:rPr>
-          <w:lang w:val="en-US"/>
-        </w:rPr>
-      </w:pPr>
-      <w:r>
-        <w:rPr>
-          <w:lang w:val="en-US"/>
-        </w:rPr>
-        <w:t>Email : {{</w:t>
-      </w:r>
-      <w:r>
-        <w:rPr>
-          <w:lang w:val="en-US"/>
-        </w:rPr>
-        <w:t>approver_email</w:t>
-      </w:r>
-      <w:r>
-        <w:rPr>
-          <w:lang w:val="en-US"/>
-        </w:rPr>
-        <w:t>}}</w:t>
-      </w:r>
-    </w:p>
-    <w:p>
-      <w:r>
-        <w:t>Téléphone : {{</w:t>
-      </w:r>
+      <w:proofErr w:type="spellStart"/>
       <w:r>
         <w:t>approver_phone</w:t>
       </w:r>
+      <w:proofErr w:type="spellEnd"/>
       <w:r>
         <w:t>}}</w:t>
       </w:r>
@@ -1354,6 +1473,12 @@
     </w:p>
     <w:sdt>
       <w:sdtPr>
+        <w:rPr>
+          <w:rFonts w:ascii="Times New Roman" w:eastAsia="Times New Roman" w:hAnsi="Times New Roman" w:cs="Times New Roman"/>
+          <w:color w:val="auto"/>
+          <w:sz w:val="24"/>
+          <w:szCs w:val="24"/>
+        </w:rPr>
         <w:id w:val="-1308466361"/>
         <w:docPartObj>
           <w:docPartGallery w:val="Table of Contents"/>
@@ -1362,12 +1487,8 @@
       </w:sdtPr>
       <w:sdtEndPr>
         <w:rPr>
-          <w:rFonts w:ascii="Times New Roman" w:eastAsia="Times New Roman" w:hAnsi="Times New Roman" w:cs="Times New Roman"/>
           <w:b/>
           <w:bCs/>
-          <w:color w:val="auto"/>
-          <w:sz w:val="24"/>
-          <w:szCs w:val="24"/>
         </w:rPr>
       </w:sdtEndPr>
       <w:sdtContent>
@@ -3059,32 +3180,61 @@
       <w:bookmarkEnd w:id="0"/>
     </w:p>
     <w:p>
-      <w:pPr>
-        <w:jc w:val="both"/>
-      </w:pPr>
       <w:r>
         <w:t xml:space="preserve">Les données SCADA du parc éolien </w:t>
       </w:r>
       <w:r>
-        <w:t>{{park_name}}</w:t>
+        <w:t>{{</w:t>
+      </w:r>
+      <w:proofErr w:type="spellStart"/>
+      <w:r>
+        <w:t>park_name</w:t>
+      </w:r>
+      <w:proofErr w:type="spellEnd"/>
+      <w:r>
+        <w:t>}}</w:t>
       </w:r>
       <w:r>
         <w:t xml:space="preserve"> ont été analysées sur la période du </w:t>
       </w:r>
       <w:r>
-        <w:t>{{analysis_start}}</w:t>
+        <w:t>{{</w:t>
+      </w:r>
+      <w:proofErr w:type="spellStart"/>
+      <w:r>
+        <w:t>analysis_start</w:t>
+      </w:r>
+      <w:proofErr w:type="spellEnd"/>
+      <w:r>
+        <w:t>}}</w:t>
       </w:r>
       <w:r>
         <w:t xml:space="preserve"> au </w:t>
       </w:r>
       <w:r>
-        <w:t>{{analysis_end}}</w:t>
+        <w:t>{{</w:t>
+      </w:r>
+      <w:proofErr w:type="spellStart"/>
+      <w:r>
+        <w:t>analysis_end</w:t>
+      </w:r>
+      <w:proofErr w:type="spellEnd"/>
+      <w:r>
+        <w:t>}}</w:t>
       </w:r>
       <w:r>
         <w:t xml:space="preserve">, à partir des informations fournies par le client. Le parc est composé de </w:t>
       </w:r>
       <w:r>
-        <w:t>{{turbine_count}}</w:t>
+        <w:t>{{</w:t>
+      </w:r>
+      <w:proofErr w:type="spellStart"/>
+      <w:r>
+        <w:t>turbine_count</w:t>
+      </w:r>
+      <w:proofErr w:type="spellEnd"/>
+      <w:r>
+        <w:t>}}</w:t>
       </w:r>
       <w:r>
         <w:t xml:space="preserve"> éoliennes de type</w:t>
@@ -3093,49 +3243,59 @@
         <w:t xml:space="preserve"> </w:t>
       </w:r>
       <w:r>
-        <w:t>{{model_wtg}</w:t>
-      </w:r>
+        <w:t>{{</w:t>
+      </w:r>
+      <w:proofErr w:type="spellStart"/>
+      <w:r>
+        <w:t>model_wtg</w:t>
+      </w:r>
+      <w:proofErr w:type="spellEnd"/>
       <w:r>
         <w:t>}</w:t>
       </w:r>
       <w:r>
+        <w:t>}</w:t>
+      </w:r>
+      <w:r>
         <w:t xml:space="preserve">, désignées </w:t>
       </w:r>
       <w:r>
-        <w:t>{{turbine_list}}</w:t>
+        <w:t>{{</w:t>
+      </w:r>
+      <w:proofErr w:type="spellStart"/>
+      <w:r>
+        <w:t>turbine_list</w:t>
+      </w:r>
+      <w:proofErr w:type="spellEnd"/>
+      <w:r>
+        <w:t>}}</w:t>
       </w:r>
       <w:r>
         <w:t xml:space="preserve"> L’ensemble des turbines a été pris en compte dans l’analyse.</w:t>
       </w:r>
     </w:p>
-    <w:p>
-      <w:pPr>
-        <w:jc w:val="both"/>
-      </w:pPr>
-    </w:p>
-    <w:p>
-      <w:pPr>
-        <w:jc w:val="both"/>
-      </w:pPr>
+    <w:p/>
+    <w:p>
       <w:r>
         <w:t>Le tableau ci-après présente une évaluation synthétique des performances du parc, en mettant en évidence, pour chaque indicateur, le niveau de performance de chaque éolienne ainsi que les éventuels écarts observés.</w:t>
       </w:r>
     </w:p>
-    <w:p>
-      <w:pPr>
-        <w:jc w:val="both"/>
-      </w:pPr>
-    </w:p>
-    <w:p>
-      <w:pPr>
-        <w:jc w:val="both"/>
-      </w:pPr>
-      <w:r>
-        <w:t>[TABLE:STATUS_SUMMARY_TABLE]</w:t>
-      </w:r>
-    </w:p>
     <w:p/>
     <w:p>
+      <w:r>
+        <w:t>[</w:t>
+      </w:r>
+      <w:proofErr w:type="gramStart"/>
+      <w:r>
+        <w:t>TABLE:STATUS</w:t>
+      </w:r>
+      <w:proofErr w:type="gramEnd"/>
+      <w:r>
+        <w:t>_SUMMARY_TABLE]</w:t>
+      </w:r>
+    </w:p>
+    <w:p/>
+    <w:p>
       <w:pPr>
         <w:pStyle w:val="Titre1"/>
       </w:pPr>
@@ -3156,15 +3316,14 @@
       <w:bookmarkEnd w:id="2"/>
     </w:p>
     <w:p>
-      <w:pPr>
-        <w:jc w:val="both"/>
-      </w:pPr>
       <w:r>
         <w:t>Le parc éolien {{</w:t>
       </w:r>
+      <w:proofErr w:type="spellStart"/>
       <w:r>
         <w:t>park_name</w:t>
       </w:r>
+      <w:proofErr w:type="spellEnd"/>
       <w:r>
         <w:t>}} est situé sur le territoire des communes de {{</w:t>
       </w:r>
@@ -3174,27 +3333,35 @@
       <w:r>
         <w:t>}}, dans la région de {{</w:t>
       </w:r>
+      <w:proofErr w:type="spellStart"/>
       <w:r>
         <w:t>region</w:t>
       </w:r>
+      <w:proofErr w:type="spellEnd"/>
       <w:r>
         <w:t>}}. Il est composé de {{</w:t>
       </w:r>
+      <w:proofErr w:type="spellStart"/>
       <w:r>
         <w:t>turbine_count</w:t>
       </w:r>
+      <w:proofErr w:type="spellEnd"/>
       <w:r>
         <w:t>}} éoliennes de type {{</w:t>
       </w:r>
+      <w:proofErr w:type="spellStart"/>
       <w:r>
         <w:t>model_wtg</w:t>
       </w:r>
+      <w:proofErr w:type="spellEnd"/>
       <w:r>
         <w:t>}}, d’une puissance nominale unitaire de {{</w:t>
       </w:r>
+      <w:proofErr w:type="spellStart"/>
       <w:r>
         <w:t>nominal_power</w:t>
       </w:r>
+      <w:proofErr w:type="spellEnd"/>
       <w:r>
         <w:t>}}</w:t>
       </w:r>
@@ -3202,21 +3369,16 @@
         <w:t>.</w:t>
       </w:r>
     </w:p>
-    <w:p>
-      <w:pPr>
-        <w:jc w:val="both"/>
-      </w:pPr>
-    </w:p>
-    <w:p>
-      <w:pPr>
-        <w:jc w:val="both"/>
-      </w:pPr>
+    <w:p/>
+    <w:p>
       <w:r>
         <w:t>Les éoliennes du parc sont identifiées comme suit : {{</w:t>
       </w:r>
+      <w:proofErr w:type="spellStart"/>
       <w:r>
         <w:t>turbine_list</w:t>
       </w:r>
+      <w:proofErr w:type="spellEnd"/>
       <w:r>
         <w:t>}}. L’implantation du parc et la disposition des éoliennes sont présentées dans la figure ci-</w:t>
       </w:r>
@@ -3225,19 +3387,11 @@
       </w:r>
     </w:p>
     <w:p>
-      <w:pPr>
-        <w:jc w:val="both"/>
-      </w:pPr>
       <w:r>
         <w:t>[TODO.IMAGE_POSITION]</w:t>
       </w:r>
     </w:p>
     <w:p>
-      <w:r>
-        <w:t xml:space="preserve"> </w:t>
-      </w:r>
-    </w:p>
-    <w:p>
       <w:pPr>
         <w:pStyle w:val="Titre2"/>
       </w:pPr>
@@ -3254,7 +3408,15 @@
     </w:p>
     <w:p>
       <w:r>
-        <w:t>[TABLE:GPS_COORDINATES_TABLE]</w:t>
+        <w:t>[</w:t>
+      </w:r>
+      <w:proofErr w:type="gramStart"/>
+      <w:r>
+        <w:t>TABLE:GPS</w:t>
+      </w:r>
+      <w:proofErr w:type="gramEnd"/>
+      <w:r>
+        <w:t>_COORDINATES_TABLE]</w:t>
       </w:r>
     </w:p>
     <w:p>
@@ -3276,11 +3438,16 @@
       <w:r>
         <w:t>[</w:t>
       </w:r>
+      <w:proofErr w:type="gramStart"/>
       <w:r>
         <w:t>TABLE</w:t>
       </w:r>
       <w:r>
-        <w:t>:CSV_FILES_TABLE]</w:t>
+        <w:t>:</w:t>
+      </w:r>
+      <w:proofErr w:type="gramEnd"/>
+      <w:r>
+        <w:t>CSV_FILES_TABLE]</w:t>
       </w:r>
     </w:p>
     <w:p>
@@ -3311,8 +3478,8 @@
         <w:tblLook w:val="04A0" w:firstRow="1" w:lastRow="0" w:firstColumn="1" w:lastColumn="0" w:noHBand="0" w:noVBand="1"/>
       </w:tblPr>
       <w:tblGrid>
-        <w:gridCol w:w="2293"/>
-        <w:gridCol w:w="5964"/>
+        <w:gridCol w:w="2069"/>
+        <w:gridCol w:w="6188"/>
       </w:tblGrid>
       <w:tr>
         <w:tc>
@@ -3329,6 +3496,7 @@
                 <w:szCs w:val="22"/>
               </w:rPr>
             </w:pPr>
+            <w:proofErr w:type="spellStart"/>
             <w:r>
               <w:rPr>
                 <w:rFonts w:ascii="Cambria" w:eastAsia="MS Mincho" w:hAnsi="Cambria"/>
@@ -3336,35 +3504,9 @@
                 <w:szCs w:val="22"/>
               </w:rPr>
               <w:lastRenderedPageBreak/>
-              <w:t>Thématiq</w:t>
-            </w:r>
-            <w:commentRangeStart w:id="6"/>
-            <w:r>
-              <w:rPr>
-                <w:rFonts w:ascii="Cambria" w:eastAsia="MS Mincho" w:hAnsi="Cambria"/>
-                <w:sz w:val="22"/>
-                <w:szCs w:val="22"/>
-              </w:rPr>
-              <w:t>u</w:t>
-            </w:r>
-            <w:commentRangeEnd w:id="6"/>
-            <w:r>
-              <w:rPr>
-                <w:rStyle w:val="Marquedecommentaire"/>
-                <w:rFonts w:ascii="Cambria" w:eastAsia="MS Mincho" w:hAnsi="Cambria"/>
-                <w:sz w:val="22"/>
-                <w:szCs w:val="22"/>
-              </w:rPr>
-              <w:commentReference w:id="6"/>
-            </w:r>
-            <w:r>
-              <w:rPr>
-                <w:rFonts w:ascii="Cambria" w:eastAsia="MS Mincho" w:hAnsi="Cambria"/>
-                <w:sz w:val="22"/>
-                <w:szCs w:val="22"/>
-              </w:rPr>
-              <w:t>e</w:t>
-            </w:r>
+              <w:t>Thématique</w:t>
+            </w:r>
+            <w:proofErr w:type="spellEnd"/>
           </w:p>
         </w:tc>
         <w:tc>
@@ -3388,8 +3530,18 @@
                 <w:sz w:val="22"/>
                 <w:szCs w:val="22"/>
               </w:rPr>
-              <w:t>Axes d’analyse</w:t>
-            </w:r>
+              <w:t xml:space="preserve">Axes </w:t>
+            </w:r>
+            <w:proofErr w:type="spellStart"/>
+            <w:r>
+              <w:rPr>
+                <w:rFonts w:ascii="Cambria" w:eastAsia="MS Mincho" w:hAnsi="Cambria"/>
+                <w:sz w:val="22"/>
+                <w:szCs w:val="22"/>
+              </w:rPr>
+              <w:t>d’analyse</w:t>
+            </w:r>
+            <w:proofErr w:type="spellEnd"/>
           </w:p>
         </w:tc>
       </w:tr>
@@ -3409,13 +3561,23 @@
                 <w:szCs w:val="22"/>
               </w:rPr>
             </w:pPr>
+            <w:proofErr w:type="spellStart"/>
             <w:r>
               <w:rPr>
                 <w:rFonts w:ascii="Cambria" w:eastAsia="MS Mincho" w:hAnsi="Cambria"/>
                 <w:sz w:val="22"/>
                 <w:szCs w:val="22"/>
               </w:rPr>
-              <w:t>Qualité des données</w:t>
+              <w:t>Qualité</w:t>
+            </w:r>
+            <w:proofErr w:type="spellEnd"/>
+            <w:r>
+              <w:rPr>
+                <w:rFonts w:ascii="Cambria" w:eastAsia="MS Mincho" w:hAnsi="Cambria"/>
+                <w:sz w:val="22"/>
+                <w:szCs w:val="22"/>
+              </w:rPr>
+              <w:t xml:space="preserve"> des données</w:t>
             </w:r>
           </w:p>
         </w:tc>
@@ -3499,8 +3661,18 @@
                 <w:sz w:val="22"/>
                 <w:szCs w:val="22"/>
               </w:rPr>
-              <w:t>Production et disponibilité</w:t>
-            </w:r>
+              <w:t xml:space="preserve">Production et </w:t>
+            </w:r>
+            <w:proofErr w:type="spellStart"/>
+            <w:r>
+              <w:rPr>
+                <w:rFonts w:ascii="Cambria" w:eastAsia="MS Mincho" w:hAnsi="Cambria"/>
+                <w:sz w:val="22"/>
+                <w:szCs w:val="22"/>
+              </w:rPr>
+              <w:t>disponibilité</w:t>
+            </w:r>
+            <w:proofErr w:type="spellEnd"/>
           </w:p>
         </w:tc>
         <w:tc>
@@ -3522,14 +3694,52 @@
                 <w:szCs w:val="22"/>
               </w:rPr>
             </w:pPr>
+            <w:proofErr w:type="spellStart"/>
             <w:r>
               <w:rPr>
                 <w:rFonts w:ascii="Cambria" w:eastAsia="MS Mincho" w:hAnsi="Cambria"/>
                 <w:sz w:val="22"/>
                 <w:szCs w:val="22"/>
               </w:rPr>
-              <w:t>Calcul de la disponibilité énergétique</w:t>
-            </w:r>
+              <w:t>Calcul</w:t>
+            </w:r>
+            <w:proofErr w:type="spellEnd"/>
+            <w:r>
+              <w:rPr>
+                <w:rFonts w:ascii="Cambria" w:eastAsia="MS Mincho" w:hAnsi="Cambria"/>
+                <w:sz w:val="22"/>
+                <w:szCs w:val="22"/>
+              </w:rPr>
+              <w:t xml:space="preserve"> de la </w:t>
+            </w:r>
+            <w:proofErr w:type="spellStart"/>
+            <w:r>
+              <w:rPr>
+                <w:rFonts w:ascii="Cambria" w:eastAsia="MS Mincho" w:hAnsi="Cambria"/>
+                <w:sz w:val="22"/>
+                <w:szCs w:val="22"/>
+              </w:rPr>
+              <w:t>disponibilité</w:t>
+            </w:r>
+            <w:proofErr w:type="spellEnd"/>
+            <w:r>
+              <w:rPr>
+                <w:rFonts w:ascii="Cambria" w:eastAsia="MS Mincho" w:hAnsi="Cambria"/>
+                <w:sz w:val="22"/>
+                <w:szCs w:val="22"/>
+              </w:rPr>
+              <w:t xml:space="preserve"> </w:t>
+            </w:r>
+            <w:proofErr w:type="spellStart"/>
+            <w:r>
+              <w:rPr>
+                <w:rFonts w:ascii="Cambria" w:eastAsia="MS Mincho" w:hAnsi="Cambria"/>
+                <w:sz w:val="22"/>
+                <w:szCs w:val="22"/>
+              </w:rPr>
+              <w:t>énergétique</w:t>
+            </w:r>
+            <w:proofErr w:type="spellEnd"/>
           </w:p>
           <w:p>
             <w:pPr>
@@ -3546,14 +3756,52 @@
                 <w:szCs w:val="22"/>
               </w:rPr>
             </w:pPr>
+            <w:proofErr w:type="spellStart"/>
             <w:r>
               <w:rPr>
                 <w:rFonts w:ascii="Cambria" w:eastAsia="MS Mincho" w:hAnsi="Cambria"/>
                 <w:sz w:val="22"/>
                 <w:szCs w:val="22"/>
               </w:rPr>
-              <w:t>Calcul de la disponibilité temporelle</w:t>
-            </w:r>
+              <w:t>Calcul</w:t>
+            </w:r>
+            <w:proofErr w:type="spellEnd"/>
+            <w:r>
+              <w:rPr>
+                <w:rFonts w:ascii="Cambria" w:eastAsia="MS Mincho" w:hAnsi="Cambria"/>
+                <w:sz w:val="22"/>
+                <w:szCs w:val="22"/>
+              </w:rPr>
+              <w:t xml:space="preserve"> de la </w:t>
+            </w:r>
+            <w:proofErr w:type="spellStart"/>
+            <w:r>
+              <w:rPr>
+                <w:rFonts w:ascii="Cambria" w:eastAsia="MS Mincho" w:hAnsi="Cambria"/>
+                <w:sz w:val="22"/>
+                <w:szCs w:val="22"/>
+              </w:rPr>
+              <w:t>disponibilité</w:t>
+            </w:r>
+            <w:proofErr w:type="spellEnd"/>
+            <w:r>
+              <w:rPr>
+                <w:rFonts w:ascii="Cambria" w:eastAsia="MS Mincho" w:hAnsi="Cambria"/>
+                <w:sz w:val="22"/>
+                <w:szCs w:val="22"/>
+              </w:rPr>
+              <w:t xml:space="preserve"> </w:t>
+            </w:r>
+            <w:proofErr w:type="spellStart"/>
+            <w:r>
+              <w:rPr>
+                <w:rFonts w:ascii="Cambria" w:eastAsia="MS Mincho" w:hAnsi="Cambria"/>
+                <w:sz w:val="22"/>
+                <w:szCs w:val="22"/>
+              </w:rPr>
+              <w:t>temporelle</w:t>
+            </w:r>
+            <w:proofErr w:type="spellEnd"/>
           </w:p>
           <w:p>
             <w:pPr>
@@ -3625,13 +3873,41 @@
                 <w:szCs w:val="22"/>
               </w:rPr>
             </w:pPr>
+            <w:proofErr w:type="spellStart"/>
             <w:r>
               <w:rPr>
                 <w:rFonts w:ascii="Cambria" w:eastAsia="MS Mincho" w:hAnsi="Cambria"/>
                 <w:sz w:val="22"/>
                 <w:szCs w:val="22"/>
               </w:rPr>
-              <w:t>Bridages (si applicable)</w:t>
+              <w:t>Bridages</w:t>
+            </w:r>
+            <w:proofErr w:type="spellEnd"/>
+            <w:r>
+              <w:rPr>
+                <w:rFonts w:ascii="Cambria" w:eastAsia="MS Mincho" w:hAnsi="Cambria"/>
+                <w:sz w:val="22"/>
+                <w:szCs w:val="22"/>
+              </w:rPr>
+              <w:t xml:space="preserve"> (</w:t>
+            </w:r>
+            <w:proofErr w:type="spellStart"/>
+            <w:r>
+              <w:rPr>
+                <w:rFonts w:ascii="Cambria" w:eastAsia="MS Mincho" w:hAnsi="Cambria"/>
+                <w:sz w:val="22"/>
+                <w:szCs w:val="22"/>
+              </w:rPr>
+              <w:t>si</w:t>
+            </w:r>
+            <w:proofErr w:type="spellEnd"/>
+            <w:r>
+              <w:rPr>
+                <w:rFonts w:ascii="Cambria" w:eastAsia="MS Mincho" w:hAnsi="Cambria"/>
+                <w:sz w:val="22"/>
+                <w:szCs w:val="22"/>
+              </w:rPr>
+              <w:t xml:space="preserve"> applicable)</w:t>
             </w:r>
           </w:p>
         </w:tc>
@@ -3741,8 +4017,18 @@
                 <w:sz w:val="22"/>
                 <w:szCs w:val="22"/>
               </w:rPr>
-              <w:t>Performance des éoliennes</w:t>
-            </w:r>
+              <w:t xml:space="preserve">Performance des </w:t>
+            </w:r>
+            <w:proofErr w:type="spellStart"/>
+            <w:r>
+              <w:rPr>
+                <w:rFonts w:ascii="Cambria" w:eastAsia="MS Mincho" w:hAnsi="Cambria"/>
+                <w:sz w:val="22"/>
+                <w:szCs w:val="22"/>
+              </w:rPr>
+              <w:t>éoliennes</w:t>
+            </w:r>
+            <w:proofErr w:type="spellEnd"/>
           </w:p>
         </w:tc>
         <w:tc>
@@ -3792,13 +4078,41 @@
                 <w:szCs w:val="22"/>
               </w:rPr>
             </w:pPr>
+            <w:proofErr w:type="spellStart"/>
             <w:r>
               <w:rPr>
                 <w:rFonts w:ascii="Cambria" w:eastAsia="MS Mincho" w:hAnsi="Cambria"/>
                 <w:sz w:val="22"/>
                 <w:szCs w:val="22"/>
               </w:rPr>
-              <w:t>Analyse du comportement du pitch</w:t>
+              <w:t>Analyse</w:t>
+            </w:r>
+            <w:proofErr w:type="spellEnd"/>
+            <w:r>
+              <w:rPr>
+                <w:rFonts w:ascii="Cambria" w:eastAsia="MS Mincho" w:hAnsi="Cambria"/>
+                <w:sz w:val="22"/>
+                <w:szCs w:val="22"/>
+              </w:rPr>
+              <w:t xml:space="preserve"> du </w:t>
+            </w:r>
+            <w:proofErr w:type="spellStart"/>
+            <w:r>
+              <w:rPr>
+                <w:rFonts w:ascii="Cambria" w:eastAsia="MS Mincho" w:hAnsi="Cambria"/>
+                <w:sz w:val="22"/>
+                <w:szCs w:val="22"/>
+              </w:rPr>
+              <w:t>comportement</w:t>
+            </w:r>
+            <w:proofErr w:type="spellEnd"/>
+            <w:r>
+              <w:rPr>
+                <w:rFonts w:ascii="Cambria" w:eastAsia="MS Mincho" w:hAnsi="Cambria"/>
+                <w:sz w:val="22"/>
+                <w:szCs w:val="22"/>
+              </w:rPr>
+              <w:t xml:space="preserve"> du pitch</w:t>
             </w:r>
           </w:p>
           <w:p>
@@ -3844,13 +4158,23 @@
                 <w:szCs w:val="22"/>
               </w:rPr>
             </w:pPr>
+            <w:proofErr w:type="spellStart"/>
             <w:r>
               <w:rPr>
                 <w:rFonts w:ascii="Cambria" w:eastAsia="MS Mincho" w:hAnsi="Cambria"/>
                 <w:sz w:val="22"/>
                 <w:szCs w:val="22"/>
               </w:rPr>
-              <w:t>Analyse inter-turbines</w:t>
+              <w:t>Analyse</w:t>
+            </w:r>
+            <w:proofErr w:type="spellEnd"/>
+            <w:r>
+              <w:rPr>
+                <w:rFonts w:ascii="Cambria" w:eastAsia="MS Mincho" w:hAnsi="Cambria"/>
+                <w:sz w:val="22"/>
+                <w:szCs w:val="22"/>
+              </w:rPr>
+              <w:t xml:space="preserve"> inter-turbines</w:t>
             </w:r>
           </w:p>
           <w:p>
@@ -3869,13 +4193,41 @@
                 <w:szCs w:val="22"/>
               </w:rPr>
             </w:pPr>
+            <w:proofErr w:type="spellStart"/>
             <w:r>
               <w:rPr>
                 <w:rFonts w:ascii="Cambria" w:eastAsia="MS Mincho" w:hAnsi="Cambria"/>
                 <w:sz w:val="22"/>
                 <w:szCs w:val="22"/>
               </w:rPr>
-              <w:t>Cohérence globale des performances</w:t>
+              <w:t>Cohérence</w:t>
+            </w:r>
+            <w:proofErr w:type="spellEnd"/>
+            <w:r>
+              <w:rPr>
+                <w:rFonts w:ascii="Cambria" w:eastAsia="MS Mincho" w:hAnsi="Cambria"/>
+                <w:sz w:val="22"/>
+                <w:szCs w:val="22"/>
+              </w:rPr>
+              <w:t xml:space="preserve"> </w:t>
+            </w:r>
+            <w:proofErr w:type="spellStart"/>
+            <w:r>
+              <w:rPr>
+                <w:rFonts w:ascii="Cambria" w:eastAsia="MS Mincho" w:hAnsi="Cambria"/>
+                <w:sz w:val="22"/>
+                <w:szCs w:val="22"/>
+              </w:rPr>
+              <w:t>globale</w:t>
+            </w:r>
+            <w:proofErr w:type="spellEnd"/>
+            <w:r>
+              <w:rPr>
+                <w:rFonts w:ascii="Cambria" w:eastAsia="MS Mincho" w:hAnsi="Cambria"/>
+                <w:sz w:val="22"/>
+                <w:szCs w:val="22"/>
+              </w:rPr>
+              <w:t xml:space="preserve"> des performances</w:t>
             </w:r>
           </w:p>
         </w:tc>
@@ -3886,21 +4238,21 @@
       <w:pPr>
         <w:pStyle w:val="Titre1"/>
       </w:pPr>
-      <w:bookmarkStart w:id="7" w:name="_Toc230021432"/>
+      <w:bookmarkStart w:id="6" w:name="_Toc230021432"/>
       <w:r>
         <w:t>Analyse détaillée</w:t>
       </w:r>
+      <w:bookmarkEnd w:id="6"/>
+    </w:p>
+    <w:p>
+      <w:pPr>
+        <w:pStyle w:val="Titre2"/>
+      </w:pPr>
+      <w:bookmarkStart w:id="7" w:name="_Toc230021433"/>
+      <w:r>
+        <w:t>Disponibilité des données SCADA</w:t>
+      </w:r>
       <w:bookmarkEnd w:id="7"/>
-    </w:p>
-    <w:p>
-      <w:pPr>
-        <w:pStyle w:val="Titre2"/>
-      </w:pPr>
-      <w:bookmarkStart w:id="8" w:name="_Toc230021433"/>
-      <w:r>
-        <w:t>Disponibilité des données SCADA</w:t>
-      </w:r>
-      <w:bookmarkEnd w:id="8"/>
     </w:p>
     <w:p>
       <w:r>
@@ -3915,8 +4267,13 @@
           <w:numId w:val="6"/>
         </w:numPr>
       </w:pPr>
-      <w:r>
-        <w:t xml:space="preserve">variables environnementales : </w:t>
+      <w:proofErr w:type="gramStart"/>
+      <w:r>
+        <w:t>variables</w:t>
+      </w:r>
+      <w:proofErr w:type="gramEnd"/>
+      <w:r>
+        <w:t xml:space="preserve"> environnementales : </w:t>
       </w:r>
     </w:p>
     <w:p>
@@ -3927,8 +4284,13 @@
           <w:numId w:val="6"/>
         </w:numPr>
       </w:pPr>
-      <w:r>
-        <w:t xml:space="preserve">vitesse du vent </w:t>
+      <w:proofErr w:type="gramStart"/>
+      <w:r>
+        <w:t>vitesse</w:t>
+      </w:r>
+      <w:proofErr w:type="gramEnd"/>
+      <w:r>
+        <w:t xml:space="preserve"> du vent </w:t>
       </w:r>
     </w:p>
     <w:p>
@@ -3939,8 +4301,13 @@
           <w:numId w:val="6"/>
         </w:numPr>
       </w:pPr>
-      <w:r>
-        <w:t xml:space="preserve">direction du vent </w:t>
+      <w:proofErr w:type="gramStart"/>
+      <w:r>
+        <w:t>direction</w:t>
+      </w:r>
+      <w:proofErr w:type="gramEnd"/>
+      <w:r>
+        <w:t xml:space="preserve"> du vent </w:t>
       </w:r>
     </w:p>
     <w:p>
@@ -3951,8 +4318,13 @@
           <w:numId w:val="6"/>
         </w:numPr>
       </w:pPr>
-      <w:r>
-        <w:t xml:space="preserve">température ambiante </w:t>
+      <w:proofErr w:type="gramStart"/>
+      <w:r>
+        <w:t>température</w:t>
+      </w:r>
+      <w:proofErr w:type="gramEnd"/>
+      <w:r>
+        <w:t xml:space="preserve"> ambiante </w:t>
       </w:r>
     </w:p>
     <w:p>
@@ -3963,8 +4335,13 @@
           <w:numId w:val="6"/>
         </w:numPr>
       </w:pPr>
-      <w:r>
-        <w:t xml:space="preserve">variables opérationnelles clés : </w:t>
+      <w:proofErr w:type="gramStart"/>
+      <w:r>
+        <w:t>variables</w:t>
+      </w:r>
+      <w:proofErr w:type="gramEnd"/>
+      <w:r>
+        <w:t xml:space="preserve"> opérationnelles clés : </w:t>
       </w:r>
     </w:p>
     <w:p>
@@ -3975,8 +4352,13 @@
           <w:numId w:val="6"/>
         </w:numPr>
       </w:pPr>
-      <w:r>
-        <w:t xml:space="preserve">puissance active produite </w:t>
+      <w:proofErr w:type="gramStart"/>
+      <w:r>
+        <w:t>puissance</w:t>
+      </w:r>
+      <w:proofErr w:type="gramEnd"/>
+      <w:r>
+        <w:t xml:space="preserve"> active produite </w:t>
       </w:r>
     </w:p>
     <w:p/>
@@ -3997,13 +4379,29 @@
         <w:t xml:space="preserve">La figure ci-après présente la disponibilité des données SCADA, sur la période allant du </w:t>
       </w:r>
       <w:r>
-        <w:t>{{analysis_start}}</w:t>
+        <w:t>{{</w:t>
+      </w:r>
+      <w:proofErr w:type="spellStart"/>
+      <w:r>
+        <w:t>analysis_start</w:t>
+      </w:r>
+      <w:proofErr w:type="spellEnd"/>
+      <w:r>
+        <w:t>}}</w:t>
       </w:r>
       <w:r>
         <w:t xml:space="preserve"> au </w:t>
       </w:r>
       <w:r>
-        <w:t>{{analysis_end}}</w:t>
+        <w:t>{{</w:t>
+      </w:r>
+      <w:proofErr w:type="spellStart"/>
+      <w:r>
+        <w:t>analysis_end</w:t>
+      </w:r>
+      <w:proofErr w:type="spellEnd"/>
+      <w:r>
+        <w:t>}}</w:t>
       </w:r>
       <w:r>
         <w:t>.</w:t>
@@ -4021,7 +4419,16 @@
       </w:r>
       <w:r>
         <w:tab/>
-        <w:t xml:space="preserve">la disponibilité moyenne des données SCADA sur la période d’analyse est de {{DISPO_SCADA}} % pour l’ensemble des éoliennes, </w:t>
+        <w:t xml:space="preserve">la disponibilité moyenne des données SCADA sur la période d’analyse est de </w:t>
+      </w:r>
+      <w:r>
+        <w:rPr>
+          <w:highlight w:val="darkGray"/>
+        </w:rPr>
+        <w:t>{{DISPO_SCADA}}</w:t>
+      </w:r>
+      <w:r>
+        <w:t xml:space="preserve"> % pour l’ensemble des éoliennes, </w:t>
       </w:r>
     </w:p>
     <w:p>
@@ -4034,6 +4441,7 @@
         <w:t xml:space="preserve">Ce niveau de disponibilité est considéré comme satisfaisant/NON Satisfaisant pour la réalisation d’une analyse de performance fiable. </w:t>
       </w:r>
     </w:p>
+    <w:p/>
     <w:p>
       <w:r>
         <w:t xml:space="preserve">Cas satisfaisant Les éventuelles périodes de données manquantes restent limitées et n’affectent pas significativement la représentativité globale du jeu de données </w:t>
@@ -4085,7 +4493,21 @@
         <w:rPr>
           <w:lang w:val="en-US"/>
         </w:rPr>
-        <w:t>{{data_availability_chart}}</w:t>
+        <w:t>{{</w:t>
+      </w:r>
+      <w:proofErr w:type="spellStart"/>
+      <w:r>
+        <w:rPr>
+          <w:lang w:val="en-US"/>
+        </w:rPr>
+        <w:t>data_availability_chart</w:t>
+      </w:r>
+      <w:proofErr w:type="spellEnd"/>
+      <w:r>
+        <w:rPr>
+          <w:lang w:val="en-US"/>
+        </w:rPr>
+        <w:t>}}</w:t>
       </w:r>
     </w:p>
     <w:p>
@@ -4099,11 +4521,11 @@
       <w:pPr>
         <w:pStyle w:val="Titre2"/>
       </w:pPr>
-      <w:bookmarkStart w:id="9" w:name="_Toc230021434"/>
+      <w:bookmarkStart w:id="8" w:name="_Toc230021434"/>
       <w:r>
         <w:t>Disponibilité énergétique</w:t>
       </w:r>
-      <w:bookmarkEnd w:id="9"/>
+      <w:bookmarkEnd w:id="8"/>
       <w:r>
         <w:t xml:space="preserve"> </w:t>
       </w:r>
@@ -4113,6 +4535,7 @@
         <w:t>La disponibilité énergétique constitue un indicateur clé permettant d’évaluer la performance des éoliennes en intégrant à la fois leur comportement opérationnel et les conditions de vent. Elle permet notamment de quantifier l’impact des indisponibilités sur la production d’énergie et d’identifier les éventuelles pertes associées.</w:t>
       </w:r>
     </w:p>
+    <w:p/>
     <w:p>
       <w:r>
         <w:t>Deux indicateurs ont été considérés :</w:t>
@@ -4127,7 +4550,23 @@
         </w:numPr>
       </w:pPr>
       <w:r>
-        <w:t>Disponibilité énergétique brute (cut-in / cut-out) : calculée pour les périodes où la vitesse de vent est comprise entre les seuils de démarrage et d’arrêt des éoliennes, en incluant l’ensemble des indisponibilités (arrêts techniques, maintenance, limitations réseau, etc.)</w:t>
+        <w:t>Disponibilité énergétique brute (</w:t>
+      </w:r>
+      <w:proofErr w:type="spellStart"/>
+      <w:r>
+        <w:t>cut</w:t>
+      </w:r>
+      <w:proofErr w:type="spellEnd"/>
+      <w:r>
+        <w:t xml:space="preserve">-in / </w:t>
+      </w:r>
+      <w:proofErr w:type="spellStart"/>
+      <w:r>
+        <w:t>cut</w:t>
+      </w:r>
+      <w:proofErr w:type="spellEnd"/>
+      <w:r>
+        <w:t>-out) : calculée pour les périodes où la vitesse de vent est comprise entre les seuils de démarrage et d’arrêt des éoliennes, en incluant l’ensemble des indisponibilités (arrêts techniques, maintenance, limitations réseau, etc.)</w:t>
       </w:r>
     </w:p>
     <w:p>
@@ -4188,6 +4627,15 @@
       </w:r>
     </w:p>
     <w:p>
+      <w:pPr>
+        <w:pStyle w:val="Paragraphedeliste"/>
+        <w:numPr>
+          <w:ilvl w:val="1"/>
+          <w:numId w:val="7"/>
+        </w:numPr>
+      </w:pPr>
+    </w:p>
+    <w:p>
       <w:r>
         <w:t>À titre de référence, le seuil contractuel typique retenu dans l'industrie éolienne pour la disponibilité énergétique imputable au fabricant est de 97 % (</w:t>
       </w:r>
@@ -4198,6 +4646,7 @@
         <w:t xml:space="preserve"> NEVEN CE SEUIL). Ce seuil est représenté sur les figures à titre comparatif.</w:t>
       </w:r>
     </w:p>
+    <w:p/>
     <w:p>
       <w:r>
         <w:t>Les périodes de perte de communication SCADA sont exclues du calcul de disponibilité.</w:t>
@@ -4216,8 +4665,29 @@
           <w:numId w:val="8"/>
         </w:numPr>
       </w:pPr>
-      <w:r>
-        <w:t>la disponibilité énergétique brute (cut-in / cut-out),</w:t>
+      <w:proofErr w:type="gramStart"/>
+      <w:r>
+        <w:t>la</w:t>
+      </w:r>
+      <w:proofErr w:type="gramEnd"/>
+      <w:r>
+        <w:t xml:space="preserve"> disponibilité énergétique brute (</w:t>
+      </w:r>
+      <w:proofErr w:type="spellStart"/>
+      <w:r>
+        <w:t>cut</w:t>
+      </w:r>
+      <w:proofErr w:type="spellEnd"/>
+      <w:r>
+        <w:t xml:space="preserve">-in / </w:t>
+      </w:r>
+      <w:proofErr w:type="spellStart"/>
+      <w:r>
+        <w:t>cut</w:t>
+      </w:r>
+      <w:proofErr w:type="spellEnd"/>
+      <w:r>
+        <w:t>-out),</w:t>
       </w:r>
     </w:p>
     <w:p>
@@ -4228,54 +4698,101 @@
           <w:numId w:val="8"/>
         </w:numPr>
       </w:pPr>
-      <w:r>
-        <w:t>la disponibilité énergétique imputable au fabricant</w:t>
-      </w:r>
-    </w:p>
-    <w:p>
-      <w:pPr>
-        <w:rPr>
-          <w:lang w:val="en-US"/>
-        </w:rPr>
-      </w:pPr>
-      <w:r>
-        <w:rPr>
-          <w:lang w:val="en-US"/>
-        </w:rPr>
-        <w:t>[TABLE:EBA_CUT_IN_CUT_OUT_TABLE]</w:t>
-      </w:r>
-    </w:p>
-    <w:p>
-      <w:pPr>
-        <w:rPr>
-          <w:lang w:val="en-US"/>
-        </w:rPr>
-      </w:pPr>
-      <w:r>
-        <w:rPr>
-          <w:lang w:val="en-US"/>
-        </w:rPr>
-        <w:t>{{eba_cut_in_cut_out_chart}}</w:t>
-      </w:r>
-    </w:p>
-    <w:p>
-      <w:pPr>
-        <w:rPr>
-          <w:lang w:val="en-US"/>
-        </w:rPr>
-      </w:pPr>
-    </w:p>
-    <w:p>
-      <w:pPr>
-        <w:rPr>
-          <w:lang w:val="en-US"/>
-        </w:rPr>
-      </w:pPr>
-      <w:r>
-        <w:rPr>
-          <w:lang w:val="en-US"/>
-        </w:rPr>
-        <w:t>[TABLE:EBA_MANUFACTURER_TABLE]</w:t>
+      <w:proofErr w:type="gramStart"/>
+      <w:r>
+        <w:t>la</w:t>
+      </w:r>
+      <w:proofErr w:type="gramEnd"/>
+      <w:r>
+        <w:t xml:space="preserve"> disponibilité énergétique imputable au fabricant</w:t>
+      </w:r>
+    </w:p>
+    <w:p>
+      <w:pPr>
+        <w:rPr>
+          <w:lang w:val="en-US"/>
+        </w:rPr>
+      </w:pPr>
+      <w:r>
+        <w:rPr>
+          <w:lang w:val="en-US"/>
+        </w:rPr>
+        <w:t>[</w:t>
+      </w:r>
+      <w:proofErr w:type="gramStart"/>
+      <w:r>
+        <w:rPr>
+          <w:lang w:val="en-US"/>
+        </w:rPr>
+        <w:t>TABLE:EBA</w:t>
+      </w:r>
+      <w:proofErr w:type="gramEnd"/>
+      <w:r>
+        <w:rPr>
+          <w:lang w:val="en-US"/>
+        </w:rPr>
+        <w:t>_CUT_IN_CUT_OUT_TABLE]</w:t>
+      </w:r>
+    </w:p>
+    <w:p>
+      <w:pPr>
+        <w:rPr>
+          <w:lang w:val="en-US"/>
+        </w:rPr>
+      </w:pPr>
+      <w:r>
+        <w:rPr>
+          <w:lang w:val="en-US"/>
+        </w:rPr>
+        <w:t>{{</w:t>
+      </w:r>
+      <w:proofErr w:type="spellStart"/>
+      <w:r>
+        <w:rPr>
+          <w:lang w:val="en-US"/>
+        </w:rPr>
+        <w:t>eba_cut_in_cut_out_chart</w:t>
+      </w:r>
+      <w:proofErr w:type="spellEnd"/>
+      <w:r>
+        <w:rPr>
+          <w:lang w:val="en-US"/>
+        </w:rPr>
+        <w:t>}}</w:t>
+      </w:r>
+    </w:p>
+    <w:p>
+      <w:pPr>
+        <w:rPr>
+          <w:lang w:val="en-US"/>
+        </w:rPr>
+      </w:pPr>
+    </w:p>
+    <w:p>
+      <w:pPr>
+        <w:rPr>
+          <w:lang w:val="en-US"/>
+        </w:rPr>
+      </w:pPr>
+      <w:r>
+        <w:rPr>
+          <w:lang w:val="en-US"/>
+        </w:rPr>
+        <w:t>[</w:t>
+      </w:r>
+      <w:proofErr w:type="gramStart"/>
+      <w:r>
+        <w:rPr>
+          <w:lang w:val="en-US"/>
+        </w:rPr>
+        <w:t>TABLE:EBA</w:t>
+      </w:r>
+      <w:proofErr w:type="gramEnd"/>
+      <w:r>
+        <w:rPr>
+          <w:lang w:val="en-US"/>
+        </w:rPr>
+        <w:t>_MANUFACTURER_TABLE]</w:t>
       </w:r>
       <w:r>
         <w:rPr>
@@ -4294,7 +4811,14 @@
         <w:rPr>
           <w:lang w:val="en-US"/>
         </w:rPr>
-        <w:t>{{eba_man</w:t>
+        <w:t>{{</w:t>
+      </w:r>
+      <w:proofErr w:type="spellStart"/>
+      <w:r>
+        <w:rPr>
+          <w:lang w:val="en-US"/>
+        </w:rPr>
+        <w:t>eba_man</w:t>
       </w:r>
       <w:r>
         <w:rPr>
@@ -4306,21 +4830,37 @@
         <w:rPr>
           <w:lang w:val="en-US"/>
         </w:rPr>
-        <w:t>facturer_chart}}</w:t>
-      </w:r>
-    </w:p>
-    <w:p>
-      <w:pPr>
-        <w:rPr>
-          <w:lang w:val="en-US"/>
-        </w:rPr>
-      </w:pPr>
-    </w:p>
-    <w:p>
-      <w:r>
-        <w:t>[TABLE:EBA_LOSS_TABLE]</w:t>
-      </w:r>
-    </w:p>
+        <w:t>facturer_chart</w:t>
+      </w:r>
+      <w:proofErr w:type="spellEnd"/>
+      <w:r>
+        <w:rPr>
+          <w:lang w:val="en-US"/>
+        </w:rPr>
+        <w:t>}}</w:t>
+      </w:r>
+    </w:p>
+    <w:p>
+      <w:pPr>
+        <w:rPr>
+          <w:lang w:val="en-US"/>
+        </w:rPr>
+      </w:pPr>
+    </w:p>
+    <w:p>
+      <w:r>
+        <w:t>[</w:t>
+      </w:r>
+      <w:proofErr w:type="gramStart"/>
+      <w:r>
+        <w:t>TABLE:EBA</w:t>
+      </w:r>
+      <w:proofErr w:type="gramEnd"/>
+      <w:r>
+        <w:t>_LOSS_TABLE]</w:t>
+      </w:r>
+    </w:p>
+    <w:p/>
     <w:p>
       <w:r>
         <w:t>En complément, les figures suivantes illustrent les pertes énergétiques associées aux indisponibilités, en mettant en évidence leur répartition dans le temps ainsi que leur contribution relative.</w:t>
@@ -4337,6 +4877,7 @@
         <w:rPr>
           <w:lang w:val="en-US"/>
         </w:rPr>
+        <w:lastRenderedPageBreak/>
         <w:t>[TODO.ANALYSE]</w:t>
       </w:r>
     </w:p>
@@ -4346,23 +4887,43 @@
           <w:lang w:val="en-US"/>
         </w:rPr>
       </w:pPr>
-      <w:r>
-        <w:rPr>
-          <w:lang w:val="en-US"/>
-        </w:rPr>
-        <w:t>{{eba_loss_chart}}</w:t>
+    </w:p>
+    <w:p>
+      <w:pPr>
+        <w:rPr>
+          <w:lang w:val="en-US"/>
+        </w:rPr>
+      </w:pPr>
+      <w:r>
+        <w:rPr>
+          <w:lang w:val="en-US"/>
+        </w:rPr>
+        <w:t>{{</w:t>
+      </w:r>
+      <w:proofErr w:type="spellStart"/>
+      <w:r>
+        <w:rPr>
+          <w:lang w:val="en-US"/>
+        </w:rPr>
+        <w:t>eba_loss_chart</w:t>
+      </w:r>
+      <w:proofErr w:type="spellEnd"/>
+      <w:r>
+        <w:rPr>
+          <w:lang w:val="en-US"/>
+        </w:rPr>
+        <w:t>}}</w:t>
       </w:r>
     </w:p>
     <w:p>
       <w:pPr>
         <w:pStyle w:val="Titre2"/>
       </w:pPr>
-      <w:bookmarkStart w:id="10" w:name="_Toc230021435"/>
-      <w:r>
-        <w:lastRenderedPageBreak/>
+      <w:bookmarkStart w:id="9" w:name="_Toc230021435"/>
+      <w:r>
         <w:t>Analyse des codes défauts</w:t>
       </w:r>
-      <w:bookmarkEnd w:id="10"/>
+      <w:bookmarkEnd w:id="9"/>
       <w:r>
         <w:t xml:space="preserve"> </w:t>
       </w:r>
@@ -4377,24 +4938,30 @@
       <w:r>
         <w:t xml:space="preserve"> défauts a été réalisée sur la période du {{</w:t>
       </w:r>
+      <w:proofErr w:type="spellStart"/>
       <w:r>
         <w:t>analysis_start</w:t>
       </w:r>
+      <w:proofErr w:type="spellEnd"/>
       <w:r>
         <w:t>}} au {{</w:t>
       </w:r>
+      <w:proofErr w:type="spellStart"/>
       <w:r>
         <w:t>analysis_end</w:t>
       </w:r>
+      <w:proofErr w:type="spellEnd"/>
       <w:r>
         <w:t>}}, afin d’identifier les événements récurrents susceptibles d’impacter la disponibilité des éoliennes.</w:t>
       </w:r>
     </w:p>
+    <w:p/>
     <w:p>
       <w:r>
         <w:t>Cette analyse permet de corréler les périodes de dégradation de la disponibilité énergétique avec les défauts enregistrés dans les données SCADA, et ainsi de déterminer les causes potentielles des sous-performances observées.</w:t>
       </w:r>
     </w:p>
+    <w:p/>
     <w:p>
       <w:r>
         <w:t>L’analyse repose sur :</w:t>
@@ -4460,6 +5027,7 @@
         <w:t xml:space="preserve"> que leur évolution dans le temps. </w:t>
       </w:r>
     </w:p>
+    <w:p/>
     <w:p>
       <w:r>
         <w:t>Les codes retenus correspondent aux événements les plus significatifs en termes d’impact potentiel sur la disponibilité.</w:t>
@@ -4488,7 +5056,21 @@
         <w:rPr>
           <w:lang w:val="en-US"/>
         </w:rPr>
-        <w:t>[TABLE:ERROR_</w:t>
+        <w:t>[</w:t>
+      </w:r>
+      <w:proofErr w:type="gramStart"/>
+      <w:r>
+        <w:rPr>
+          <w:lang w:val="en-US"/>
+        </w:rPr>
+        <w:t>TABLE:ERROR</w:t>
+      </w:r>
+      <w:proofErr w:type="gramEnd"/>
+      <w:r>
+        <w:rPr>
+          <w:lang w:val="en-US"/>
+        </w:rPr>
+        <w:t>_</w:t>
       </w:r>
       <w:r>
         <w:rPr>
@@ -4520,7 +5102,21 @@
         <w:rPr>
           <w:lang w:val="en-US"/>
         </w:rPr>
-        <w:t>[TABLE:ERROR_</w:t>
+        <w:t>[</w:t>
+      </w:r>
+      <w:proofErr w:type="gramStart"/>
+      <w:r>
+        <w:rPr>
+          <w:lang w:val="en-US"/>
+        </w:rPr>
+        <w:t>TABLE:ERROR</w:t>
+      </w:r>
+      <w:proofErr w:type="gramEnd"/>
+      <w:r>
+        <w:rPr>
+          <w:lang w:val="en-US"/>
+        </w:rPr>
+        <w:t>_</w:t>
       </w:r>
       <w:r>
         <w:rPr>
@@ -4564,27 +5160,55 @@
         <w:rPr>
           <w:lang w:val="en-US"/>
         </w:rPr>
-        <w:t>{{top_error_code_frequency}}</w:t>
-      </w:r>
-    </w:p>
-    <w:p>
-      <w:pPr>
-        <w:rPr>
-          <w:lang w:val="en-US"/>
-        </w:rPr>
-      </w:pPr>
-      <w:r>
-        <w:rPr>
-          <w:lang w:val="en-US"/>
-        </w:rPr>
-        <w:t>{{treemap_error_code}}</w:t>
+        <w:t>{{</w:t>
+      </w:r>
+      <w:proofErr w:type="spellStart"/>
+      <w:r>
+        <w:rPr>
+          <w:lang w:val="en-US"/>
+        </w:rPr>
+        <w:t>top_error_code_frequency</w:t>
+      </w:r>
+      <w:proofErr w:type="spellEnd"/>
+      <w:r>
+        <w:rPr>
+          <w:lang w:val="en-US"/>
+        </w:rPr>
+        <w:t>}}</w:t>
+      </w:r>
+    </w:p>
+    <w:p>
+      <w:pPr>
+        <w:rPr>
+          <w:lang w:val="en-US"/>
+        </w:rPr>
+      </w:pPr>
+      <w:r>
+        <w:rPr>
+          <w:lang w:val="en-US"/>
+        </w:rPr>
+        <w:t>{{</w:t>
+      </w:r>
+      <w:proofErr w:type="spellStart"/>
+      <w:r>
+        <w:rPr>
+          <w:lang w:val="en-US"/>
+        </w:rPr>
+        <w:t>treemap_error_code</w:t>
+      </w:r>
+      <w:proofErr w:type="spellEnd"/>
+      <w:r>
+        <w:rPr>
+          <w:lang w:val="en-US"/>
+        </w:rPr>
+        <w:t>}}</w:t>
       </w:r>
     </w:p>
     <w:p>
       <w:pPr>
         <w:pStyle w:val="Titre2"/>
       </w:pPr>
-      <w:bookmarkStart w:id="11" w:name="_Toc230021436"/>
+      <w:bookmarkStart w:id="10" w:name="_Toc230021436"/>
       <w:r>
         <w:t xml:space="preserve">Analyse de la </w:t>
       </w:r>
@@ -4594,18 +5218,36 @@
       <w:r>
         <w:t xml:space="preserve"> vent</w:t>
       </w:r>
-      <w:bookmarkEnd w:id="11"/>
-    </w:p>
-    <w:p>
-      <w:r>
-        <w:t>L’analyse de la direction du vent vise à vérifier la cohérence des mesures directionnelles entre les éoliennes, ainsi que leur alignement avec une référence externe, afin de détecter d’éventuels défauts d’orientation (yaw misalignment).</w:t>
-      </w:r>
-    </w:p>
+      <w:bookmarkEnd w:id="10"/>
+    </w:p>
+    <w:p>
+      <w:r>
+        <w:t>L’analyse de la direction du vent vise à vérifier la cohérence des mesures directionnelles entre les éoliennes, ainsi que leur alignement avec une référence externe, afin de détecter d’éventuels défauts d’orientation (</w:t>
+      </w:r>
+      <w:proofErr w:type="spellStart"/>
+      <w:r>
+        <w:t>yaw</w:t>
+      </w:r>
+      <w:proofErr w:type="spellEnd"/>
+      <w:r>
+        <w:t xml:space="preserve"> </w:t>
+      </w:r>
+      <w:proofErr w:type="spellStart"/>
+      <w:r>
+        <w:t>misalignment</w:t>
+      </w:r>
+      <w:proofErr w:type="spellEnd"/>
+      <w:r>
+        <w:t>).</w:t>
+      </w:r>
+    </w:p>
+    <w:p/>
     <w:p>
       <w:r>
         <w:t>Une analyse de la direction du vent est réalisée à partir des données de direction nacelle, en s’appuyant sur une comparaison des roses des vents sur des périodes communes d’exploitation, correspondant aux instants où l’ensemble des éoliennes fonctionne simultanément.</w:t>
       </w:r>
     </w:p>
+    <w:p/>
     <w:p>
       <w:r>
         <w:t>Cette analyse vise à identifier d’éventuels désalignements d’orientation en évaluant la cohérence directionnelle selon deux approches complémentaires :</w:t>
@@ -4620,6 +5262,7 @@
         </w:numPr>
       </w:pPr>
       <w:r>
+        <w:lastRenderedPageBreak/>
         <w:t xml:space="preserve">Analyse relative inter-éoliennes : comparaison des directions mesurées entre les différentes éoliennes afin de détecter d’éventuels écarts d’orientation. </w:t>
       </w:r>
     </w:p>
@@ -4635,6 +5278,7 @@
         <w:t>Analyse absolue par rapport à une référence externe : comparaison des directions mesurées avec des données de référence externes (réanalyse météorologique), permettant d’évaluer un éventuel biais directionnel global.</w:t>
       </w:r>
     </w:p>
+    <w:p/>
     <w:p>
       <w:r>
         <w:t xml:space="preserve">Cette approche permet de </w:t>
@@ -4646,6 +5290,7 @@
         <w:t xml:space="preserve"> les écarts relatifs entre éoliennes d’un éventuel biais global du site. </w:t>
       </w:r>
     </w:p>
+    <w:p/>
     <w:p>
       <w:r>
         <w:t xml:space="preserve">Les seuils d'acceptabilité généralement retenus dans l'industrie éolienne sont les suivants : écart relatif inter-éoliennes &lt; 8°, écart absolu par rapport à la référence externe &lt; 20°. </w:t>
@@ -4668,53 +5313,123 @@
         <w:rPr>
           <w:lang w:val="en-US"/>
         </w:rPr>
-        <w:t>[TABLE:WIND_DIRECTION_CALIBRATION_TABLE]</w:t>
-      </w:r>
-    </w:p>
-    <w:p>
-      <w:pPr>
-        <w:rPr>
-          <w:lang w:val="en-US"/>
-        </w:rPr>
-      </w:pPr>
-    </w:p>
-    <w:p>
-      <w:pPr>
-        <w:rPr>
-          <w:lang w:val="en-US"/>
-        </w:rPr>
-      </w:pPr>
-      <w:r>
-        <w:rPr>
-          <w:lang w:val="en-US"/>
-        </w:rPr>
-        <w:t>{{wind_direction_calibration}}</w:t>
-      </w:r>
-    </w:p>
-    <w:p>
-      <w:pPr>
-        <w:rPr>
-          <w:lang w:val="en-US"/>
-        </w:rPr>
-      </w:pPr>
-      <w:r>
-        <w:rPr>
-          <w:lang w:val="en-US"/>
-        </w:rPr>
-        <w:t>{{power_rose_chart}}</w:t>
-      </w:r>
-    </w:p>
-    <w:p>
-      <w:pPr>
-        <w:rPr>
-          <w:lang w:val="en-US"/>
-        </w:rPr>
-      </w:pPr>
-      <w:r>
-        <w:rPr>
-          <w:lang w:val="en-US"/>
-        </w:rPr>
-        <w:t>{{wind_rose_chart}}</w:t>
+        <w:t>[</w:t>
+      </w:r>
+      <w:proofErr w:type="gramStart"/>
+      <w:r>
+        <w:rPr>
+          <w:lang w:val="en-US"/>
+        </w:rPr>
+        <w:t>TABLE:WIND</w:t>
+      </w:r>
+      <w:proofErr w:type="gramEnd"/>
+      <w:r>
+        <w:rPr>
+          <w:lang w:val="en-US"/>
+        </w:rPr>
+        <w:t>_DIRECTION_CALIBRATION_TABLE]</w:t>
+      </w:r>
+    </w:p>
+    <w:p>
+      <w:pPr>
+        <w:rPr>
+          <w:lang w:val="en-US"/>
+        </w:rPr>
+      </w:pPr>
+    </w:p>
+    <w:p>
+      <w:pPr>
+        <w:rPr>
+          <w:lang w:val="en-US"/>
+        </w:rPr>
+      </w:pPr>
+      <w:r>
+        <w:rPr>
+          <w:lang w:val="en-US"/>
+        </w:rPr>
+        <w:t>{{</w:t>
+      </w:r>
+      <w:proofErr w:type="spellStart"/>
+      <w:r>
+        <w:rPr>
+          <w:lang w:val="en-US"/>
+        </w:rPr>
+        <w:t>wind_direction_calibration</w:t>
+      </w:r>
+      <w:proofErr w:type="spellEnd"/>
+      <w:r>
+        <w:rPr>
+          <w:lang w:val="en-US"/>
+        </w:rPr>
+        <w:t>}}</w:t>
+      </w:r>
+    </w:p>
+    <w:p>
+      <w:pPr>
+        <w:rPr>
+          <w:lang w:val="en-US"/>
+        </w:rPr>
+      </w:pPr>
+    </w:p>
+    <w:p>
+      <w:pPr>
+        <w:rPr>
+          <w:lang w:val="en-US"/>
+        </w:rPr>
+      </w:pPr>
+      <w:r>
+        <w:rPr>
+          <w:lang w:val="en-US"/>
+        </w:rPr>
+        <w:t>{{</w:t>
+      </w:r>
+      <w:proofErr w:type="spellStart"/>
+      <w:r>
+        <w:rPr>
+          <w:lang w:val="en-US"/>
+        </w:rPr>
+        <w:t>power_rose_chart</w:t>
+      </w:r>
+      <w:proofErr w:type="spellEnd"/>
+      <w:r>
+        <w:rPr>
+          <w:lang w:val="en-US"/>
+        </w:rPr>
+        <w:t>}}</w:t>
+      </w:r>
+    </w:p>
+    <w:p>
+      <w:pPr>
+        <w:rPr>
+          <w:lang w:val="en-US"/>
+        </w:rPr>
+      </w:pPr>
+    </w:p>
+    <w:p>
+      <w:pPr>
+        <w:rPr>
+          <w:lang w:val="en-US"/>
+        </w:rPr>
+      </w:pPr>
+      <w:r>
+        <w:rPr>
+          <w:lang w:val="en-US"/>
+        </w:rPr>
+        <w:t>{{</w:t>
+      </w:r>
+      <w:proofErr w:type="spellStart"/>
+      <w:r>
+        <w:rPr>
+          <w:lang w:val="en-US"/>
+        </w:rPr>
+        <w:t>wind_rose_chart</w:t>
+      </w:r>
+      <w:proofErr w:type="spellEnd"/>
+      <w:r>
+        <w:rPr>
+          <w:lang w:val="en-US"/>
+        </w:rPr>
+        <w:t>}}</w:t>
       </w:r>
     </w:p>
     <w:p>
@@ -4750,27 +5465,30 @@
       <w:pPr>
         <w:pStyle w:val="Titre2"/>
       </w:pPr>
-      <w:bookmarkStart w:id="12" w:name="_Toc230021437"/>
+      <w:bookmarkStart w:id="11" w:name="_Toc230021437"/>
       <w:r>
         <w:t>Analyse des courbes de puissance selon la norme IEC 61400-2</w:t>
       </w:r>
-      <w:bookmarkEnd w:id="12"/>
+      <w:bookmarkEnd w:id="11"/>
     </w:p>
     <w:p>
       <w:r>
         <w:t xml:space="preserve">L’analyse des courbes de puissance vise à évaluer les performances des éoliennes en comparant la production électrique en fonction de la vitesse du vent, dans des conditions d’exploitation homogènes. </w:t>
       </w:r>
     </w:p>
+    <w:p/>
     <w:p>
       <w:r>
         <w:t>Elle permet d’identifier d’éventuels écarts de performance entre les éoliennes, ainsi que des situations de sous-performance susceptibles d’impacter la production du parc.</w:t>
       </w:r>
     </w:p>
+    <w:p/>
     <w:p>
       <w:r>
         <w:t>La comparaison des courbes de puissance est réalisée conformément aux principes de la norme IEC 61400-12, en s’appuyant sur des données SCADA filtrées afin de garantir des conditions de comparaison homogènes.</w:t>
       </w:r>
     </w:p>
+    <w:p/>
     <w:p>
       <w:r>
         <w:t>Les traitements suivants sont appliqués :</w:t>
@@ -4803,7 +5521,15 @@
         <w:t>Exclusion</w:t>
       </w:r>
       <w:r>
-        <w:t xml:space="preserve"> des situations de sillage (wake effect), </w:t>
+        <w:t xml:space="preserve"> des situations de sillage (wake </w:t>
+      </w:r>
+      <w:proofErr w:type="spellStart"/>
+      <w:r>
+        <w:t>effect</w:t>
+      </w:r>
+      <w:proofErr w:type="spellEnd"/>
+      <w:r>
+        <w:t xml:space="preserve">), </w:t>
       </w:r>
     </w:p>
     <w:p>
@@ -4848,29 +5574,53 @@
         <w:t>Homogénéisation</w:t>
       </w:r>
       <w:r>
-        <w:t xml:space="preserve"> des conditions de vent entre éoliennes afin de permettre une comparaison équitable des performances. </w:t>
-      </w:r>
-    </w:p>
-    <w:p>
-      <w:r>
+        <w:t xml:space="preserve"> des conditions de vent entre éoliennes afin de permettre une comparaison équitable des performances.</w:t>
+      </w:r>
+    </w:p>
+    <w:p/>
+    <w:p>
+      <w:r>
+        <w:lastRenderedPageBreak/>
         <w:t>La correction de densité est réalisée par rapport à la densité d'air standard de référence de 1.225 kg/m³</w:t>
       </w:r>
       <w:r>
         <w:t>.</w:t>
       </w:r>
     </w:p>
-    <w:p>
-      <w:pPr>
-        <w:rPr>
-          <w:lang w:val="en-US"/>
-        </w:rPr>
-      </w:pPr>
-      <w:r>
-        <w:rPr>
-          <w:lang w:val="en-US"/>
-        </w:rPr>
-        <w:t>[TABLE:NORMATIVE_YIELD_TABLE]</w:t>
-      </w:r>
+    <w:p/>
+    <w:p>
+      <w:pPr>
+        <w:rPr>
+          <w:lang w:val="en-US"/>
+        </w:rPr>
+      </w:pPr>
+      <w:r>
+        <w:rPr>
+          <w:lang w:val="en-US"/>
+        </w:rPr>
+        <w:t>[</w:t>
+      </w:r>
+      <w:proofErr w:type="gramStart"/>
+      <w:r>
+        <w:rPr>
+          <w:lang w:val="en-US"/>
+        </w:rPr>
+        <w:t>TABLE:NORMATIVE</w:t>
+      </w:r>
+      <w:proofErr w:type="gramEnd"/>
+      <w:r>
+        <w:rPr>
+          <w:lang w:val="en-US"/>
+        </w:rPr>
+        <w:t>_YIELD_TABLE]</w:t>
+      </w:r>
+    </w:p>
+    <w:p>
+      <w:pPr>
+        <w:rPr>
+          <w:lang w:val="en-US"/>
+        </w:rPr>
+      </w:pPr>
     </w:p>
     <w:p>
       <w:pPr>
@@ -4884,11 +5634,19 @@
         </w:rPr>
         <w:t>{{</w:t>
       </w:r>
-      <w:r>
-        <w:rPr>
-          <w:lang w:val="en-US"/>
-        </w:rPr>
-        <w:t>power_curve_chart}}</w:t>
+      <w:proofErr w:type="spellStart"/>
+      <w:r>
+        <w:rPr>
+          <w:lang w:val="en-US"/>
+        </w:rPr>
+        <w:t>power_curve_chart</w:t>
+      </w:r>
+      <w:proofErr w:type="spellEnd"/>
+      <w:r>
+        <w:rPr>
+          <w:lang w:val="en-US"/>
+        </w:rPr>
+        <w:t>}}</w:t>
       </w:r>
     </w:p>
     <w:p>
@@ -4902,17 +5660,18 @@
       <w:pPr>
         <w:pStyle w:val="Titre2"/>
       </w:pPr>
-      <w:bookmarkStart w:id="13" w:name="_Toc230021438"/>
+      <w:bookmarkStart w:id="12" w:name="_Toc230021438"/>
       <w:r>
         <w:t>Analyse de la vitesse de rotation (Rotor RPM)</w:t>
       </w:r>
-      <w:bookmarkEnd w:id="13"/>
+      <w:bookmarkEnd w:id="12"/>
     </w:p>
     <w:p>
       <w:r>
         <w:t>L’analyse de la vitesse de rotation du rotor vise à évaluer le comportement de régulation des éoliennes en fonction de la puissance produite, afin d’identifier d’éventuelles dérives ou incohérences dans la stratégie de contrôle.</w:t>
       </w:r>
     </w:p>
+    <w:p/>
     <w:p>
       <w:r>
         <w:t>Elle permet notamment de vérifier la stabilité du fonctionnement des éoliennes dans le temps et de détecter d’éventuelles anomalies susceptibles d’impacter la performance.</w:t>
@@ -4924,6 +5683,7 @@
         <w:t>L’analyse repose sur l’étude de la relation entre la vitesse de rotation du rotor (RPM) et la puissance active produite, à partir des données SCADA.</w:t>
       </w:r>
     </w:p>
+    <w:p/>
     <w:p>
       <w:r>
         <w:t>Afin de représenter le comportement nominal des éoliennes, les données sont filtrées pour exclure :</w:t>
@@ -4937,9 +5697,13 @@
           <w:numId w:val="13"/>
         </w:numPr>
       </w:pPr>
-      <w:r>
-        <w:lastRenderedPageBreak/>
-        <w:t xml:space="preserve">les périodes de limitations environnementales (bruit, chauves-souris, ombrage, etc.), </w:t>
+      <w:proofErr w:type="gramStart"/>
+      <w:r>
+        <w:t>les</w:t>
+      </w:r>
+      <w:proofErr w:type="gramEnd"/>
+      <w:r>
+        <w:t xml:space="preserve"> périodes de limitations environnementales (bruit, chauves-souris, ombrage, etc.), </w:t>
       </w:r>
     </w:p>
     <w:p>
@@ -4950,8 +5714,13 @@
           <w:numId w:val="13"/>
         </w:numPr>
       </w:pPr>
-      <w:r>
-        <w:t xml:space="preserve">les phases de démarrage et d’arrêt, </w:t>
+      <w:proofErr w:type="gramStart"/>
+      <w:r>
+        <w:t>les</w:t>
+      </w:r>
+      <w:proofErr w:type="gramEnd"/>
+      <w:r>
+        <w:t xml:space="preserve"> phases de démarrage et d’arrêt, </w:t>
       </w:r>
     </w:p>
     <w:p>
@@ -4962,14 +5731,17 @@
           <w:numId w:val="13"/>
         </w:numPr>
       </w:pPr>
-      <w:r>
-        <w:t xml:space="preserve">les situations transitoires ou non représentatives du fonctionnement normal. </w:t>
-      </w:r>
-    </w:p>
-    <w:p>
-      <w:pPr>
-        <w:jc w:val="both"/>
-      </w:pPr>
+      <w:proofErr w:type="gramStart"/>
+      <w:r>
+        <w:t>les</w:t>
+      </w:r>
+      <w:proofErr w:type="gramEnd"/>
+      <w:r>
+        <w:t xml:space="preserve"> situations transitoires ou non représentatives du fonctionnement normal. </w:t>
+      </w:r>
+    </w:p>
+    <w:p/>
+    <w:p>
       <w:r>
         <w:t xml:space="preserve">L’analyse est réalisée sur l’ensemble de la période d’étude, avec une visualisation de l’évolution </w:t>
       </w:r>
@@ -4980,10 +5752,8 @@
         <w:t>afin d’identifier d’éventuelles dérives du comportement.</w:t>
       </w:r>
     </w:p>
-    <w:p>
-      <w:pPr>
-        <w:jc w:val="both"/>
-      </w:pPr>
+    <w:p/>
+    <w:p>
       <w:r>
         <w:t>Le TSR</w:t>
       </w:r>
@@ -5000,10 +5770,8 @@
         <w:t>les pales ont tendance à s'éroder prématurément.</w:t>
       </w:r>
     </w:p>
-    <w:p>
-      <w:pPr>
-        <w:jc w:val="both"/>
-      </w:pPr>
+    <w:p/>
+    <w:p>
       <w:r>
         <w:t>Les figures ci-après présentent l’évolution de la vitesse de rotation du rotor en fonction de la puissance active pour chaque éolienne, sur la période analysée.</w:t>
       </w:r>
@@ -5019,7 +5787,21 @@
         <w:rPr>
           <w:lang w:val="en-US"/>
         </w:rPr>
-        <w:t>[TABLE:TIP_SPEED_RATIO_TABLE]</w:t>
+        <w:t>[</w:t>
+      </w:r>
+      <w:proofErr w:type="gramStart"/>
+      <w:r>
+        <w:rPr>
+          <w:lang w:val="en-US"/>
+        </w:rPr>
+        <w:t>TABLE:TIP</w:t>
+      </w:r>
+      <w:proofErr w:type="gramEnd"/>
+      <w:r>
+        <w:rPr>
+          <w:lang w:val="en-US"/>
+        </w:rPr>
+        <w:t>_SPEED_RATIO_TABLE]</w:t>
       </w:r>
     </w:p>
     <w:p>
@@ -5061,9 +5843,11 @@
         </w:rPr>
         <w:t>{{</w:t>
       </w:r>
+      <w:proofErr w:type="spellStart"/>
       <w:r>
         <w:t>rpm_chart</w:t>
       </w:r>
+      <w:proofErr w:type="spellEnd"/>
       <w:r>
         <w:rPr>
           <w:lang w:val="en-US"/>
@@ -5085,11 +5869,11 @@
       <w:pPr>
         <w:pStyle w:val="Titre2"/>
       </w:pPr>
-      <w:bookmarkStart w:id="14" w:name="_Toc230021439"/>
+      <w:bookmarkStart w:id="13" w:name="_Toc230021439"/>
       <w:r>
         <w:t>Analyse du comportement du pitch</w:t>
       </w:r>
-      <w:bookmarkEnd w:id="14"/>
+      <w:bookmarkEnd w:id="13"/>
     </w:p>
     <w:p>
       <w:r>
@@ -5098,14 +5882,17 @@
     </w:p>
     <w:p>
       <w:r>
+        <w:lastRenderedPageBreak/>
         <w:t>Elle permet d’identifier d’éventuelles anomalies de fonctionnement, des écarts de réglage ou des dérives susceptibles d’impacter la performance et les charges mécaniques.</w:t>
       </w:r>
     </w:p>
+    <w:p/>
     <w:p>
       <w:r>
         <w:t>L’analyse repose sur l’étude de la relation entre l’angle de pitch et la puissance active produite, à partir des données SCADA.</w:t>
       </w:r>
     </w:p>
+    <w:p/>
     <w:p>
       <w:r>
         <w:t>Afin de représenter le comportement nominal des éoliennes, les données sont filtrées pour exclure :</w:t>
@@ -5156,6 +5943,7 @@
         <w:t xml:space="preserve"> situations transitoires non représentatives du fonctionnement normal. </w:t>
       </w:r>
     </w:p>
+    <w:p/>
     <w:p>
       <w:r>
         <w:t>L’analyse est réalisée sur l’ensemble de la période d’étude, avec une visualisation temporelle (par exemple mensuelle) afin d’identifier d’éventuelles évolutions du comportement.</w:t>
@@ -5177,13 +5965,27 @@
         <w:rPr>
           <w:lang w:val="en-US"/>
         </w:rPr>
-        <w:t>[T</w:t>
-      </w:r>
-      <w:r>
-        <w:rPr>
-          <w:lang w:val="en-US"/>
-        </w:rPr>
-        <w:t>ABLE:PITCH_TABLE</w:t>
+        <w:t>[</w:t>
+      </w:r>
+      <w:proofErr w:type="gramStart"/>
+      <w:r>
+        <w:rPr>
+          <w:lang w:val="en-US"/>
+        </w:rPr>
+        <w:t>T</w:t>
+      </w:r>
+      <w:r>
+        <w:rPr>
+          <w:lang w:val="en-US"/>
+        </w:rPr>
+        <w:t>ABLE:PITCH</w:t>
+      </w:r>
+      <w:proofErr w:type="gramEnd"/>
+      <w:r>
+        <w:rPr>
+          <w:lang w:val="en-US"/>
+        </w:rPr>
+        <w:t>_TABLE</w:t>
       </w:r>
       <w:r>
         <w:rPr>
@@ -5211,12 +6013,14 @@
         </w:rPr>
         <w:t>{{</w:t>
       </w:r>
+      <w:proofErr w:type="spellStart"/>
       <w:r>
         <w:rPr>
           <w:lang w:val="en-US"/>
         </w:rPr>
         <w:t>pitch_chart</w:t>
       </w:r>
+      <w:proofErr w:type="spellEnd"/>
       <w:r>
         <w:rPr>
           <w:lang w:val="en-US"/>
@@ -5243,28 +6047,37 @@
       <w:pPr>
         <w:pStyle w:val="Titre2"/>
       </w:pPr>
-      <w:bookmarkStart w:id="15" w:name="_Toc230021440"/>
+      <w:bookmarkStart w:id="14" w:name="_Toc230021440"/>
       <w:r>
         <w:t>Analyse des limitations</w:t>
       </w:r>
-      <w:bookmarkEnd w:id="15"/>
-    </w:p>
-    <w:p>
-      <w:r>
-        <w:t xml:space="preserve">En complément de l'analyse comparative des courbes de puissance, une analyse individuelle de chaque éolienne est réalisée à partir des données SCADA brutes, sous forme de nuages de points. Cette approche vise à détecter d'éventuelles limitations de production non prévues, non nécessairement visibles dans une comparaison inter-éoliennes. Elle permet notamment </w:t>
-      </w:r>
-      <w:r>
-        <w:lastRenderedPageBreak/>
-        <w:t xml:space="preserve">d'identifier des situations de curtailment inattendu, visibles à travers des regroupements de points (clusters) s'écartant de la courbe de puissance nominale attendue. L'analyse repose sur la représentation de la puissance active en fonction de la vitesse du vent sous forme de nuages de points. Les figures ci-après présentent les nuages de points pour chaque éolienne. </w:t>
+      <w:bookmarkEnd w:id="14"/>
+    </w:p>
+    <w:p>
+      <w:r>
+        <w:t xml:space="preserve">En complément de l'analyse comparative des courbes de puissance, une analyse individuelle de chaque éolienne est réalisée à partir des données SCADA brutes, sous forme de nuages de points. Cette approche vise à détecter d'éventuelles limitations de production non prévues, non nécessairement visibles dans une comparaison inter-éoliennes. Elle permet notamment d'identifier des situations de </w:t>
+      </w:r>
+      <w:proofErr w:type="spellStart"/>
+      <w:r>
+        <w:t>curtailment</w:t>
+      </w:r>
+      <w:proofErr w:type="spellEnd"/>
+      <w:r>
+        <w:t xml:space="preserve"> inattendu, visibles à travers des regroupements de points (clusters) s'écartant de la courbe de puissance nominale attendue. L'analyse repose sur la représentation de la puissance active en fonction de la vitesse du vent sous forme de nuages de points. Les figures ci-après présentent les nuages de points pour chaque éolienne. </w:t>
       </w:r>
       <w:r>
         <w:t xml:space="preserve">Les figures illustres des classes de fonctionnements pour la puissance, l’orientation des pales et la rotation par </w:t>
       </w:r>
+      <w:proofErr w:type="gramStart"/>
       <w:r>
         <w:t>minute</w:t>
       </w:r>
       <w:r>
-        <w:t xml:space="preserve">:  </w:t>
+        <w:t>:</w:t>
+      </w:r>
+      <w:proofErr w:type="gramEnd"/>
+      <w:r>
+        <w:t xml:space="preserve">  </w:t>
       </w:r>
     </w:p>
     <w:p>
@@ -5276,7 +6089,23 @@
         </w:numPr>
       </w:pPr>
       <w:r>
-        <w:t>Stop (low wind)</w:t>
+        <w:t>Stop (</w:t>
+      </w:r>
+      <w:proofErr w:type="spellStart"/>
+      <w:r>
+        <w:t>low</w:t>
+      </w:r>
+      <w:proofErr w:type="spellEnd"/>
+      <w:r>
+        <w:t xml:space="preserve"> </w:t>
+      </w:r>
+      <w:proofErr w:type="spellStart"/>
+      <w:r>
+        <w:t>wind</w:t>
+      </w:r>
+      <w:proofErr w:type="spellEnd"/>
+      <w:r>
+        <w:t>)</w:t>
       </w:r>
     </w:p>
     <w:p>
@@ -5324,7 +6153,15 @@
         </w:numPr>
       </w:pPr>
       <w:r>
-        <w:t>Stop (high wind)</w:t>
+        <w:t xml:space="preserve">Stop (high </w:t>
+      </w:r>
+      <w:proofErr w:type="spellStart"/>
+      <w:r>
+        <w:t>wind</w:t>
+      </w:r>
+      <w:proofErr w:type="spellEnd"/>
+      <w:r>
+        <w:t>)</w:t>
       </w:r>
     </w:p>
     <w:p>
@@ -5335,34 +6172,61 @@
           <w:numId w:val="16"/>
         </w:numPr>
       </w:pPr>
-      <w:r>
-        <w:t>Outlier (anomalies)</w:t>
+      <w:proofErr w:type="spellStart"/>
+      <w:r>
+        <w:t>Outlier</w:t>
+      </w:r>
+      <w:proofErr w:type="spellEnd"/>
+      <w:r>
+        <w:t xml:space="preserve"> (anomalies)</w:t>
       </w:r>
     </w:p>
     <w:p/>
     <w:p>
       <w:r>
-        <w:t>[TABLE:PERFORMANCE_LEVEL_TABLE]</w:t>
-      </w:r>
-    </w:p>
-    <w:p>
-      <w:pPr>
-        <w:rPr>
-          <w:lang w:val="en-US"/>
-        </w:rPr>
-      </w:pPr>
-    </w:p>
-    <w:p>
-      <w:pPr>
-        <w:rPr>
-          <w:lang w:val="en-US"/>
-        </w:rPr>
-      </w:pPr>
-      <w:r>
-        <w:rPr>
-          <w:lang w:val="en-US"/>
-        </w:rPr>
-        <w:t>{{performance_level_chart}}</w:t>
+        <w:t>[</w:t>
+      </w:r>
+      <w:proofErr w:type="gramStart"/>
+      <w:r>
+        <w:t>TABLE:PERFORMANCE</w:t>
+      </w:r>
+      <w:proofErr w:type="gramEnd"/>
+      <w:r>
+        <w:t>_LEVEL_TABLE]</w:t>
+      </w:r>
+    </w:p>
+    <w:p>
+      <w:pPr>
+        <w:rPr>
+          <w:lang w:val="en-US"/>
+        </w:rPr>
+      </w:pPr>
+    </w:p>
+    <w:p>
+      <w:pPr>
+        <w:rPr>
+          <w:lang w:val="en-US"/>
+        </w:rPr>
+      </w:pPr>
+      <w:r>
+        <w:rPr>
+          <w:lang w:val="en-US"/>
+        </w:rPr>
+        <w:t>{{</w:t>
+      </w:r>
+      <w:proofErr w:type="spellStart"/>
+      <w:r>
+        <w:rPr>
+          <w:lang w:val="en-US"/>
+        </w:rPr>
+        <w:t>performance_level_chart</w:t>
+      </w:r>
+      <w:proofErr w:type="spellEnd"/>
+      <w:r>
+        <w:rPr>
+          <w:lang w:val="en-US"/>
+        </w:rPr>
+        <w:t>}}</w:t>
       </w:r>
     </w:p>
     <w:p>
@@ -5390,10 +6254,29 @@
       <w:pPr>
         <w:pStyle w:val="Titre1"/>
       </w:pPr>
-      <w:bookmarkStart w:id="16" w:name="_Toc230021441"/>
-      <w:r>
+      <w:bookmarkStart w:id="15" w:name="_Toc230021441"/>
+      <w:r>
+        <w:lastRenderedPageBreak/>
         <w:t>Recommandations &amp; Action</w:t>
       </w:r>
+      <w:bookmarkEnd w:id="15"/>
+    </w:p>
+    <w:p>
+      <w:r>
+        <w:rPr>
+          <w:highlight w:val="lightGray"/>
+        </w:rPr>
+        <w:t>[ANALYSE]</w:t>
+      </w:r>
+    </w:p>
+    <w:p>
+      <w:pPr>
+        <w:pStyle w:val="Titre1"/>
+      </w:pPr>
+      <w:bookmarkStart w:id="16" w:name="_Toc230021442"/>
+      <w:r>
+        <w:t>Conclusion</w:t>
+      </w:r>
       <w:bookmarkEnd w:id="16"/>
     </w:p>
     <w:p>
@@ -5401,185 +6284,207 @@
         <w:rPr>
           <w:highlight w:val="lightGray"/>
         </w:rPr>
-        <w:t>[ANALYSE]</w:t>
+        <w:t>[A COMPLETER]</w:t>
       </w:r>
     </w:p>
     <w:p>
       <w:pPr>
         <w:pStyle w:val="Titre1"/>
       </w:pPr>
-      <w:bookmarkStart w:id="17" w:name="_Toc230021442"/>
-      <w:r>
-        <w:t>Conclusion</w:t>
+      <w:bookmarkStart w:id="17" w:name="_Toc230021443"/>
+      <w:r>
+        <w:t>ANNEXE</w:t>
       </w:r>
       <w:bookmarkEnd w:id="17"/>
     </w:p>
     <w:p>
-      <w:r>
-        <w:rPr>
-          <w:highlight w:val="lightGray"/>
-        </w:rPr>
-        <w:t>[A COMPLETER]</w:t>
-      </w:r>
-    </w:p>
-    <w:p>
-      <w:pPr>
-        <w:pStyle w:val="Titre1"/>
-      </w:pPr>
-      <w:bookmarkStart w:id="18" w:name="_Toc230021443"/>
-      <w:r>
-        <w:t>ANNEXE</w:t>
+      <w:pPr>
+        <w:pStyle w:val="Titre2"/>
+      </w:pPr>
+      <w:bookmarkStart w:id="18" w:name="_Toc230021444"/>
+      <w:r>
+        <w:t xml:space="preserve">Disponibilité temporelle (Time-Based </w:t>
+      </w:r>
+      <w:proofErr w:type="spellStart"/>
+      <w:r>
+        <w:t>Availability</w:t>
+      </w:r>
+      <w:proofErr w:type="spellEnd"/>
+      <w:r>
+        <w:t xml:space="preserve"> – TBA)</w:t>
       </w:r>
       <w:bookmarkEnd w:id="18"/>
     </w:p>
     <w:p>
+      <w:r>
+        <w:t>La disponibilité temporelle (TBA) permet d’évaluer la proportion du temps pendant lequel les éoliennes sont en état de fonctionnement, indépendamment du niveau de production.</w:t>
+      </w:r>
+    </w:p>
+    <w:p/>
+    <w:p>
+      <w:pPr>
+        <w:rPr>
+          <w:lang w:val="en-US"/>
+        </w:rPr>
+      </w:pPr>
+      <w:r>
+        <w:rPr>
+          <w:lang w:val="en-US"/>
+        </w:rPr>
+        <w:t>[</w:t>
+      </w:r>
+      <w:proofErr w:type="gramStart"/>
+      <w:r>
+        <w:rPr>
+          <w:lang w:val="en-US"/>
+        </w:rPr>
+        <w:t>T</w:t>
+      </w:r>
+      <w:r>
+        <w:rPr>
+          <w:lang w:val="en-US"/>
+        </w:rPr>
+        <w:t>ABLE:TBA</w:t>
+      </w:r>
+      <w:proofErr w:type="gramEnd"/>
+      <w:r>
+        <w:rPr>
+          <w:lang w:val="en-US"/>
+        </w:rPr>
+        <w:t>_CUT_IN_CUT_OUT_TABLE</w:t>
+      </w:r>
+      <w:r>
+        <w:rPr>
+          <w:lang w:val="en-US"/>
+        </w:rPr>
+        <w:t>]</w:t>
+      </w:r>
+    </w:p>
+    <w:p>
+      <w:pPr>
+        <w:rPr>
+          <w:lang w:val="en-US"/>
+        </w:rPr>
+      </w:pPr>
+      <w:r>
+        <w:rPr>
+          <w:lang w:val="en-US"/>
+        </w:rPr>
+        <w:t>{{</w:t>
+      </w:r>
+      <w:proofErr w:type="spellStart"/>
+      <w:r>
+        <w:rPr>
+          <w:lang w:val="en-US"/>
+        </w:rPr>
+        <w:t>tba_cut_in_cut_out_chart</w:t>
+      </w:r>
+      <w:proofErr w:type="spellEnd"/>
+      <w:r>
+        <w:rPr>
+          <w:lang w:val="en-US"/>
+        </w:rPr>
+        <w:t>}}</w:t>
+      </w:r>
+    </w:p>
+    <w:p>
+      <w:pPr>
+        <w:rPr>
+          <w:lang w:val="en-US"/>
+        </w:rPr>
+      </w:pPr>
+    </w:p>
+    <w:p>
+      <w:pPr>
+        <w:rPr>
+          <w:lang w:val="en-US"/>
+        </w:rPr>
+      </w:pPr>
+      <w:r>
+        <w:rPr>
+          <w:lang w:val="en-US"/>
+        </w:rPr>
+        <w:t>[</w:t>
+      </w:r>
+      <w:proofErr w:type="gramStart"/>
+      <w:r>
+        <w:rPr>
+          <w:lang w:val="en-US"/>
+        </w:rPr>
+        <w:t>TABLE:TBA</w:t>
+      </w:r>
+      <w:proofErr w:type="gramEnd"/>
+      <w:r>
+        <w:rPr>
+          <w:lang w:val="en-US"/>
+        </w:rPr>
+        <w:t>_</w:t>
+      </w:r>
+      <w:r>
+        <w:rPr>
+          <w:lang w:val="en-US"/>
+        </w:rPr>
+        <w:t>MANUFAC</w:t>
+      </w:r>
+      <w:r>
+        <w:rPr>
+          <w:lang w:val="en-US"/>
+        </w:rPr>
+        <w:t>T</w:t>
+      </w:r>
+      <w:r>
+        <w:rPr>
+          <w:lang w:val="en-US"/>
+        </w:rPr>
+        <w:t>URER_TABLE]</w:t>
+      </w:r>
+    </w:p>
+    <w:p>
+      <w:pPr>
+        <w:rPr>
+          <w:lang w:val="en-US"/>
+        </w:rPr>
+      </w:pPr>
+      <w:r>
+        <w:rPr>
+          <w:lang w:val="en-US"/>
+        </w:rPr>
+        <w:t>{{</w:t>
+      </w:r>
+      <w:proofErr w:type="spellStart"/>
+      <w:r>
+        <w:rPr>
+          <w:lang w:val="en-US"/>
+        </w:rPr>
+        <w:t>tba_manufacturer_chart</w:t>
+      </w:r>
+      <w:proofErr w:type="spellEnd"/>
+      <w:r>
+        <w:rPr>
+          <w:lang w:val="en-US"/>
+        </w:rPr>
+        <w:t>}}</w:t>
+      </w:r>
+    </w:p>
+    <w:p>
+      <w:pPr>
+        <w:rPr>
+          <w:lang w:val="en-US"/>
+        </w:rPr>
+      </w:pPr>
+    </w:p>
+    <w:p>
       <w:pPr>
         <w:pStyle w:val="Titre2"/>
       </w:pPr>
-      <w:bookmarkStart w:id="19" w:name="_Toc230021444"/>
-      <w:r>
-        <w:t>Disponibilité temporelle (Time-Based Availability – TBA)</w:t>
+      <w:bookmarkStart w:id="19" w:name="_Toc230021445"/>
+      <w:r>
+        <w:t>Analyse détaillée des courbes de puissance</w:t>
       </w:r>
       <w:bookmarkEnd w:id="19"/>
     </w:p>
     <w:p>
       <w:r>
-        <w:t>La disponibilité temporelle (TBA) permet d’évaluer la proportion du temps pendant lequel les éoliennes sont en état de fonctionnement, indépendamment du niveau de production.</w:t>
-      </w:r>
-    </w:p>
-    <w:p/>
-    <w:p>
-      <w:pPr>
-        <w:rPr>
-          <w:lang w:val="en-US"/>
-        </w:rPr>
-      </w:pPr>
-      <w:r>
-        <w:rPr>
-          <w:lang w:val="en-US"/>
-        </w:rPr>
-        <w:t>[T</w:t>
-      </w:r>
-      <w:r>
-        <w:rPr>
-          <w:lang w:val="en-US"/>
-        </w:rPr>
-        <w:t>ABLE:TBA</w:t>
-      </w:r>
-      <w:r>
-        <w:rPr>
-          <w:lang w:val="en-US"/>
-        </w:rPr>
-        <w:t>_CUT_IN_CUT_OUT_TABLE</w:t>
-      </w:r>
-      <w:r>
-        <w:rPr>
-          <w:lang w:val="en-US"/>
-        </w:rPr>
-        <w:t>]</w:t>
-      </w:r>
-    </w:p>
-    <w:p>
-      <w:pPr>
-        <w:rPr>
-          <w:lang w:val="en-US"/>
-        </w:rPr>
-      </w:pPr>
-      <w:r>
-        <w:rPr>
-          <w:lang w:val="en-US"/>
-        </w:rPr>
-        <w:t>{{</w:t>
-      </w:r>
-      <w:r>
-        <w:rPr>
-          <w:lang w:val="en-US"/>
-        </w:rPr>
-        <w:t>tba_cut_in_cut_out_chart</w:t>
-      </w:r>
-      <w:r>
-        <w:rPr>
-          <w:lang w:val="en-US"/>
-        </w:rPr>
-        <w:t>}}</w:t>
-      </w:r>
-    </w:p>
-    <w:p>
-      <w:pPr>
-        <w:rPr>
-          <w:lang w:val="en-US"/>
-        </w:rPr>
-      </w:pPr>
-    </w:p>
-    <w:p>
-      <w:pPr>
-        <w:rPr>
-          <w:lang w:val="en-US"/>
-        </w:rPr>
-      </w:pPr>
-      <w:r>
-        <w:rPr>
-          <w:lang w:val="en-US"/>
-        </w:rPr>
-        <w:t>[TABLE:TBA_</w:t>
-      </w:r>
-      <w:r>
-        <w:rPr>
-          <w:lang w:val="en-US"/>
-        </w:rPr>
-        <w:t>MANUFAC</w:t>
-      </w:r>
-      <w:r>
-        <w:rPr>
-          <w:lang w:val="en-US"/>
-        </w:rPr>
-        <w:t>T</w:t>
-      </w:r>
-      <w:r>
-        <w:rPr>
-          <w:lang w:val="en-US"/>
-        </w:rPr>
-        <w:t>URER_TABLE]</w:t>
-      </w:r>
-    </w:p>
-    <w:p>
-      <w:pPr>
-        <w:rPr>
-          <w:lang w:val="en-US"/>
-        </w:rPr>
-      </w:pPr>
-      <w:r>
-        <w:rPr>
-          <w:lang w:val="en-US"/>
-        </w:rPr>
-        <w:t>{{</w:t>
-      </w:r>
-      <w:r>
-        <w:rPr>
-          <w:lang w:val="en-US"/>
-        </w:rPr>
-        <w:t>tba_manufacturer_chart}}</w:t>
-      </w:r>
-    </w:p>
-    <w:p>
-      <w:pPr>
-        <w:rPr>
-          <w:lang w:val="en-US"/>
-        </w:rPr>
-      </w:pPr>
-    </w:p>
-    <w:p>
-      <w:pPr>
-        <w:pStyle w:val="Titre2"/>
-      </w:pPr>
-      <w:bookmarkStart w:id="20" w:name="_Toc230021445"/>
-      <w:r>
-        <w:t>Analyse détaillée des courbes de puissance</w:t>
-      </w:r>
-      <w:bookmarkEnd w:id="20"/>
-    </w:p>
-    <w:p>
-      <w:r>
         <w:t>[TODO.FIGURE]</w:t>
       </w:r>
     </w:p>
@@ -5589,52 +6494,95 @@
       </w:r>
     </w:p>
     <w:sectPr>
+      <w:footerReference w:type="default" r:id="rId9"/>
       <w:pgSz w:w="11906" w:h="16838"/>
       <w:pgMar w:top="1417" w:right="1417" w:bottom="1417" w:left="1417" w:header="708" w:footer="708" w:gutter="0"/>
       <w:cols w:space="708"/>
+      <w:titlePg/>
       <w:docGrid w:linePitch="360"/>
     </w:sectPr>
   </w:body>
 </w:document>
 </file>
 
-<file path=word/comments.xml><?xml version="1.0" encoding="utf-8"?>
-<w:comments xmlns:wpc="http://schemas.microsoft.com/office/word/2010/wordprocessingCanvas" xmlns:cx="http://schemas.microsoft.com/office/drawing/2014/chartex" xmlns:cx1="http://schemas.microsoft.com/office/drawing/2015/9/8/chartex" xmlns:cx2="http://schemas.microsoft.com/office/drawing/2015/10/21/chartex" xmlns:cx3="http://schemas.microsoft.com/office/drawing/2016/5/9/chartex" xmlns:cx4="http://schemas.microsoft.com/office/drawing/2016/5/10/chartex" xmlns:cx5="http://schemas.microsoft.com/office/drawing/2016/5/11/chartex" xmlns:cx6="http://schemas.microsoft.com/office/drawing/2016/5/12/chartex" xmlns:cx7="http://schemas.microsoft.com/office/drawing/2016/5/13/chartex" xmlns:cx8="http://schemas.microsoft.com/office/drawing/2016/5/14/chartex" xmlns:mc="http://schemas.openxmlformats.org/markup-compatibility/2006" xmlns:aink="http://schemas.microsoft.com/office/drawing/2016/ink" xmlns:am3d="http://schemas.microsoft.com/office/drawing/2017/model3d" xmlns:o="urn:schemas-microsoft-com:office:office" xmlns:oel="http://schemas.microsoft.com/office/2019/extlst" xmlns:r="http://schemas.openxmlformats.org/officeDocument/2006/relationships" xmlns:m="http://schemas.openxmlformats.org/officeDocument/2006/math" xmlns:v="urn:schemas-microsoft-com:vml" xmlns:wp14="http://schemas.microsoft.com/office/word/2010/wordprocessingDrawing" xmlns:wp="http://schemas.openxmlformats.org/drawingml/2006/wordprocessingDrawing" xmlns:w10="urn:schemas-microsoft-com:office:word" xmlns:w="http://schemas.openxmlformats.org/wordprocessingml/2006/main" xmlns:w14="http://schemas.microsoft.com/office/word/2010/wordml" xmlns:w15="http://schemas.microsoft.com/office/word/2012/wordml" xmlns:w16cex="http://schemas.microsoft.com/office/word/2018/wordml/cex" xmlns:w16cid="http://schemas.microsoft.com/office/word/2016/wordml/cid" xmlns:w16="http://schemas.microsoft.com/office/word/2018/wordml" xmlns:w16du="http://schemas.microsoft.com/office/word/2023/wordml/word16du" xmlns:w16sdtdh="http://schemas.microsoft.com/office/word/2020/wordml/sdtdatahash" xmlns:w16sdtfl="http://schemas.microsoft.com/office/word/2024/wordml/sdtformatlock" xmlns:w16se="http://schemas.microsoft.com/office/word/2015/wordml/symex" xmlns:wpg="http://schemas.microsoft.com/office/word/2010/wordprocessingGroup" xmlns:wpi="http://schemas.microsoft.com/office/word/2010/wordprocessingInk" xmlns:wne="http://schemas.microsoft.com/office/word/2006/wordml" xmlns:wps="http://schemas.microsoft.com/office/word/2010/wordprocessingShape" mc:Ignorable="w14 w15 w16se w16cid w16 w16cex w16sdtdh w16sdtfl w16du wp14">
-  <w:comment w:id="6" w:author="N Bernard" w:date="2026-04-09T16:50:00Z" w:initials="NB">
-    <w:p>
-      <w:pPr>
-        <w:pStyle w:val="Commentaire"/>
-      </w:pPr>
-      <w:r>
-        <w:rPr>
-          <w:rStyle w:val="Marquedecommentaire"/>
-        </w:rPr>
-        <w:annotationRef/>
-      </w:r>
-      <w:r>
-        <w:t>On doit retrouver également ici la structure des chapitres et sous chapitres, mais ici en regroupant.</w:t>
-      </w:r>
-    </w:p>
-  </w:comment>
-</w:comments>
+<file path=word/endnotes.xml><?xml version="1.0" encoding="utf-8"?>
+<w:endnotes xmlns:wpc="http://schemas.microsoft.com/office/word/2010/wordprocessingCanvas" xmlns:cx="http://schemas.microsoft.com/office/drawing/2014/chartex" xmlns:cx1="http://schemas.microsoft.com/office/drawing/2015/9/8/chartex" xmlns:cx2="http://schemas.microsoft.com/office/drawing/2015/10/21/chartex" xmlns:cx3="http://schemas.microsoft.com/office/drawing/2016/5/9/chartex" xmlns:cx4="http://schemas.microsoft.com/office/drawing/2016/5/10/chartex" xmlns:cx5="http://schemas.microsoft.com/office/drawing/2016/5/11/chartex" xmlns:cx6="http://schemas.microsoft.com/office/drawing/2016/5/12/chartex" xmlns:cx7="http://schemas.microsoft.com/office/drawing/2016/5/13/chartex" xmlns:cx8="http://schemas.microsoft.com/office/drawing/2016/5/14/chartex" xmlns:mc="http://schemas.openxmlformats.org/markup-compatibility/2006" xmlns:aink="http://schemas.microsoft.com/office/drawing/2016/ink" xmlns:am3d="http://schemas.microsoft.com/office/drawing/2017/model3d" xmlns:o="urn:schemas-microsoft-com:office:office" xmlns:oel="http://schemas.microsoft.com/office/2019/extlst" xmlns:r="http://schemas.openxmlformats.org/officeDocument/2006/relationships" xmlns:m="http://schemas.openxmlformats.org/officeDocument/2006/math" xmlns:v="urn:schemas-microsoft-com:vml" xmlns:wp14="http://schemas.microsoft.com/office/word/2010/wordprocessingDrawing" xmlns:wp="http://schemas.openxmlformats.org/drawingml/2006/wordprocessingDrawing" xmlns:w10="urn:schemas-microsoft-com:office:word" xmlns:w="http://schemas.openxmlformats.org/wordprocessingml/2006/main" xmlns:w14="http://schemas.microsoft.com/office/word/2010/wordml" xmlns:w15="http://schemas.microsoft.com/office/word/2012/wordml" xmlns:w16cex="http://schemas.microsoft.com/office/word/2018/wordml/cex" xmlns:w16cid="http://schemas.microsoft.com/office/word/2016/wordml/cid" xmlns:w16="http://schemas.microsoft.com/office/word/2018/wordml" xmlns:w16du="http://schemas.microsoft.com/office/word/2023/wordml/word16du" xmlns:w16sdtdh="http://schemas.microsoft.com/office/word/2020/wordml/sdtdatahash" xmlns:w16sdtfl="http://schemas.microsoft.com/office/word/2024/wordml/sdtformatlock" xmlns:w16se="http://schemas.microsoft.com/office/word/2015/wordml/symex" xmlns:wpg="http://schemas.microsoft.com/office/word/2010/wordprocessingGroup" xmlns:wpi="http://schemas.microsoft.com/office/word/2010/wordprocessingInk" xmlns:wne="http://schemas.microsoft.com/office/word/2006/wordml" xmlns:wps="http://schemas.microsoft.com/office/word/2010/wordprocessingShape" mc:Ignorable="w14 w15 w16se w16cid w16 w16cex w16sdtdh w16sdtfl w16du wp14">
+  <w:endnote w:type="separator" w:id="-1">
+    <w:p>
+      <w:r>
+        <w:separator/>
+      </w:r>
+    </w:p>
+  </w:endnote>
+  <w:endnote w:type="continuationSeparator" w:id="0">
+    <w:p>
+      <w:r>
+        <w:continuationSeparator/>
+      </w:r>
+    </w:p>
+  </w:endnote>
+</w:endnotes>
 </file>
 
-<file path=word/commentsExtended.xml><?xml version="1.0" encoding="utf-8"?>
-<w15:commentsEx xmlns:wpc="http://schemas.microsoft.com/office/word/2010/wordprocessingCanvas" xmlns:cx="http://schemas.microsoft.com/office/drawing/2014/chartex" xmlns:cx1="http://schemas.microsoft.com/office/drawing/2015/9/8/chartex" xmlns:cx2="http://schemas.microsoft.com/office/drawing/2015/10/21/chartex" xmlns:cx3="http://schemas.microsoft.com/office/drawing/2016/5/9/chartex" xmlns:cx4="http://schemas.microsoft.com/office/drawing/2016/5/10/chartex" xmlns:cx5="http://schemas.microsoft.com/office/drawing/2016/5/11/chartex" xmlns:cx6="http://schemas.microsoft.com/office/drawing/2016/5/12/chartex" xmlns:cx7="http://schemas.microsoft.com/office/drawing/2016/5/13/chartex" xmlns:cx8="http://schemas.microsoft.com/office/drawing/2016/5/14/chartex" xmlns:mc="http://schemas.openxmlformats.org/markup-compatibility/2006" xmlns:aink="http://schemas.microsoft.com/office/drawing/2016/ink" xmlns:am3d="http://schemas.microsoft.com/office/drawing/2017/model3d" xmlns:o="urn:schemas-microsoft-com:office:office" xmlns:oel="http://schemas.microsoft.com/office/2019/extlst" xmlns:r="http://schemas.openxmlformats.org/officeDocument/2006/relationships" xmlns:m="http://schemas.openxmlformats.org/officeDocument/2006/math" xmlns:v="urn:schemas-microsoft-com:vml" xmlns:wp14="http://schemas.microsoft.com/office/word/2010/wordprocessingDrawing" xmlns:wp="http://schemas.openxmlformats.org/drawingml/2006/wordprocessingDrawing" xmlns:w10="urn:schemas-microsoft-com:office:word" xmlns:w="http://schemas.openxmlformats.org/wordprocessingml/2006/main" xmlns:w14="http://schemas.microsoft.com/office/word/2010/wordml" xmlns:w15="http://schemas.microsoft.com/office/word/2012/wordml" xmlns:w16cex="http://schemas.microsoft.com/office/word/2018/wordml/cex" xmlns:w16cid="http://schemas.microsoft.com/office/word/2016/wordml/cid" xmlns:w16="http://schemas.microsoft.com/office/word/2018/wordml" xmlns:w16du="http://schemas.microsoft.com/office/word/2023/wordml/word16du" xmlns:w16sdtdh="http://schemas.microsoft.com/office/word/2020/wordml/sdtdatahash" xmlns:w16sdtfl="http://schemas.microsoft.com/office/word/2024/wordml/sdtformatlock" xmlns:w16se="http://schemas.microsoft.com/office/word/2015/wordml/symex" xmlns:wpg="http://schemas.microsoft.com/office/word/2010/wordprocessingGroup" xmlns:wpi="http://schemas.microsoft.com/office/word/2010/wordprocessingInk" xmlns:wne="http://schemas.microsoft.com/office/word/2006/wordml" xmlns:wps="http://schemas.microsoft.com/office/word/2010/wordprocessingShape" mc:Ignorable="w14 w15 w16se w16cid w16 w16cex w16sdtdh w16sdtfl w16du wp14">
-  <w15:commentEx w15:paraId="68049A65" w15:done="0"/>
-</w15:commentsEx>
+<file path=word/footer1.xml><?xml version="1.0" encoding="utf-8"?>
+<w:ftr xmlns:wpc="http://schemas.microsoft.com/office/word/2010/wordprocessingCanvas" xmlns:cx="http://schemas.microsoft.com/office/drawing/2014/chartex" xmlns:cx1="http://schemas.microsoft.com/office/drawing/2015/9/8/chartex" xmlns:cx2="http://schemas.microsoft.com/office/drawing/2015/10/21/chartex" xmlns:cx3="http://schemas.microsoft.com/office/drawing/2016/5/9/chartex" xmlns:cx4="http://schemas.microsoft.com/office/drawing/2016/5/10/chartex" xmlns:cx5="http://schemas.microsoft.com/office/drawing/2016/5/11/chartex" xmlns:cx6="http://schemas.microsoft.com/office/drawing/2016/5/12/chartex" xmlns:cx7="http://schemas.microsoft.com/office/drawing/2016/5/13/chartex" xmlns:cx8="http://schemas.microsoft.com/office/drawing/2016/5/14/chartex" xmlns:mc="http://schemas.openxmlformats.org/markup-compatibility/2006" xmlns:aink="http://schemas.microsoft.com/office/drawing/2016/ink" xmlns:am3d="http://schemas.microsoft.com/office/drawing/2017/model3d" xmlns:o="urn:schemas-microsoft-com:office:office" xmlns:oel="http://schemas.microsoft.com/office/2019/extlst" xmlns:r="http://schemas.openxmlformats.org/officeDocument/2006/relationships" xmlns:m="http://schemas.openxmlformats.org/officeDocument/2006/math" xmlns:v="urn:schemas-microsoft-com:vml" xmlns:wp14="http://schemas.microsoft.com/office/word/2010/wordprocessingDrawing" xmlns:wp="http://schemas.openxmlformats.org/drawingml/2006/wordprocessingDrawing" xmlns:w10="urn:schemas-microsoft-com:office:word" xmlns:w="http://schemas.openxmlformats.org/wordprocessingml/2006/main" xmlns:w14="http://schemas.microsoft.com/office/word/2010/wordml" xmlns:w15="http://schemas.microsoft.com/office/word/2012/wordml" xmlns:w16cex="http://schemas.microsoft.com/office/word/2018/wordml/cex" xmlns:w16cid="http://schemas.microsoft.com/office/word/2016/wordml/cid" xmlns:w16="http://schemas.microsoft.com/office/word/2018/wordml" xmlns:w16du="http://schemas.microsoft.com/office/word/2023/wordml/word16du" xmlns:w16sdtdh="http://schemas.microsoft.com/office/word/2020/wordml/sdtdatahash" xmlns:w16sdtfl="http://schemas.microsoft.com/office/word/2024/wordml/sdtformatlock" xmlns:w16se="http://schemas.microsoft.com/office/word/2015/wordml/symex" xmlns:wpg="http://schemas.microsoft.com/office/word/2010/wordprocessingGroup" xmlns:wpi="http://schemas.microsoft.com/office/word/2010/wordprocessingInk" xmlns:wne="http://schemas.microsoft.com/office/word/2006/wordml" xmlns:wps="http://schemas.microsoft.com/office/word/2010/wordprocessingShape" mc:Ignorable="w14 w15 w16se w16cid w16 w16cex w16sdtdh w16sdtfl w16du wp14">
+  <w:sdt>
+    <w:sdtPr>
+      <w:id w:val="12741086"/>
+      <w:docPartObj>
+        <w:docPartGallery w:val="Page Numbers (Bottom of Page)"/>
+        <w:docPartUnique/>
+      </w:docPartObj>
+    </w:sdtPr>
+    <w:sdtContent>
+      <w:p>
+        <w:pPr>
+          <w:pStyle w:val="Pieddepage"/>
+          <w:jc w:val="center"/>
+        </w:pPr>
+        <w:r>
+          <w:fldChar w:fldCharType="begin"/>
+        </w:r>
+        <w:r>
+          <w:instrText>PAGE   \* MERGEFORMAT</w:instrText>
+        </w:r>
+        <w:r>
+          <w:fldChar w:fldCharType="separate"/>
+        </w:r>
+        <w:r>
+          <w:t>2</w:t>
+        </w:r>
+        <w:r>
+          <w:fldChar w:fldCharType="end"/>
+        </w:r>
+      </w:p>
+    </w:sdtContent>
+  </w:sdt>
+  <w:p>
+    <w:pPr>
+      <w:pStyle w:val="Pieddepage"/>
+    </w:pPr>
+  </w:p>
+</w:ftr>
 </file>
 
-<file path=word/commentsExtensible.xml><?xml version="1.0" encoding="utf-8"?>
-<w16cex:commentsExtensible xmlns:wpc="http://schemas.microsoft.com/office/word/2010/wordprocessingCanvas" xmlns:cx="http://schemas.microsoft.com/office/drawing/2014/chartex" xmlns:cx1="http://schemas.microsoft.com/office/drawing/2015/9/8/chartex" xmlns:cx2="http://schemas.microsoft.com/office/drawing/2015/10/21/chartex" xmlns:cx3="http://schemas.microsoft.com/office/drawing/2016/5/9/chartex" xmlns:cx4="http://schemas.microsoft.com/office/drawing/2016/5/10/chartex" xmlns:cx5="http://schemas.microsoft.com/office/drawing/2016/5/11/chartex" xmlns:cx6="http://schemas.microsoft.com/office/drawing/2016/5/12/chartex" xmlns:cx7="http://schemas.microsoft.com/office/drawing/2016/5/13/chartex" xmlns:cx8="http://schemas.microsoft.com/office/drawing/2016/5/14/chartex" xmlns:cr="http://schemas.microsoft.com/office/comments/2020/reactions" xmlns:mc="http://schemas.openxmlformats.org/markup-compatibility/2006" xmlns:aink="http://schemas.microsoft.com/office/drawing/2016/ink" xmlns:am3d="http://schemas.microsoft.com/office/drawing/2017/model3d" xmlns:o="urn:schemas-microsoft-com:office:office" xmlns:oel="http://schemas.microsoft.com/office/2019/extlst" xmlns:r="http://schemas.openxmlformats.org/officeDocument/2006/relationships" xmlns:m="http://schemas.openxmlformats.org/officeDocument/2006/math" xmlns:v="urn:schemas-microsoft-com:vml" xmlns:wp14="http://schemas.microsoft.com/office/word/2010/wordprocessingDrawing" xmlns:wp="http://schemas.openxmlformats.org/drawingml/2006/wordprocessingDrawing" xmlns:w10="urn:schemas-microsoft-com:office:word" xmlns:w="http://schemas.openxmlformats.org/wordprocessingml/2006/main" xmlns:w14="http://schemas.microsoft.com/office/word/2010/wordml" xmlns:w15="http://schemas.microsoft.com/office/word/2012/wordml" xmlns:w16cex="http://schemas.microsoft.com/office/word/2018/wordml/cex" xmlns:w16cid="http://schemas.microsoft.com/office/word/2016/wordml/cid" xmlns:w16="http://schemas.microsoft.com/office/word/2018/wordml" xmlns:w16du="http://schemas.microsoft.com/office/word/2023/wordml/word16du" xmlns:w16sdtdh="http://schemas.microsoft.com/office/word/2020/wordml/sdtdatahash" xmlns:w16sdtfl="http://schemas.microsoft.com/office/word/2024/wordml/sdtformatlock" xmlns:w16se="http://schemas.microsoft.com/office/word/2015/wordml/symex" xmlns:wpg="http://schemas.microsoft.com/office/word/2010/wordprocessingGroup" xmlns:wpi="http://schemas.microsoft.com/office/word/2010/wordprocessingInk" xmlns:wne="http://schemas.microsoft.com/office/word/2006/wordml" xmlns:wps="http://schemas.microsoft.com/office/word/2010/wordprocessingShape" mc:Ignorable="w14 w15 w16se w16cid w16 w16cex w16sdtdh w16sdtfl cr w16du wp14">
-  <w16cex:commentExtensible w16cex:durableId="417ECA6A" w16cex:dateUtc="2026-04-09T14:50:00Z"/>
-</w16cex:commentsExtensible>
-</file>
-
-<file path=word/commentsIds.xml><?xml version="1.0" encoding="utf-8"?>
-<w16cid:commentsIds xmlns:wpc="http://schemas.microsoft.com/office/word/2010/wordprocessingCanvas" xmlns:cx="http://schemas.microsoft.com/office/drawing/2014/chartex" xmlns:cx1="http://schemas.microsoft.com/office/drawing/2015/9/8/chartex" xmlns:cx2="http://schemas.microsoft.com/office/drawing/2015/10/21/chartex" xmlns:cx3="http://schemas.microsoft.com/office/drawing/2016/5/9/chartex" xmlns:cx4="http://schemas.microsoft.com/office/drawing/2016/5/10/chartex" xmlns:cx5="http://schemas.microsoft.com/office/drawing/2016/5/11/chartex" xmlns:cx6="http://schemas.microsoft.com/office/drawing/2016/5/12/chartex" xmlns:cx7="http://schemas.microsoft.com/office/drawing/2016/5/13/chartex" xmlns:cx8="http://schemas.microsoft.com/office/drawing/2016/5/14/chartex" xmlns:mc="http://schemas.openxmlformats.org/markup-compatibility/2006" xmlns:aink="http://schemas.microsoft.com/office/drawing/2016/ink" xmlns:am3d="http://schemas.microsoft.com/office/drawing/2017/model3d" xmlns:o="urn:schemas-microsoft-com:office:office" xmlns:oel="http://schemas.microsoft.com/office/2019/extlst" xmlns:r="http://schemas.openxmlformats.org/officeDocument/2006/relationships" xmlns:m="http://schemas.openxmlformats.org/officeDocument/2006/math" xmlns:v="urn:schemas-microsoft-com:vml" xmlns:wp14="http://schemas.microsoft.com/office/word/2010/wordprocessingDrawing" xmlns:wp="http://schemas.openxmlformats.org/drawingml/2006/wordprocessingDrawing" xmlns:w10="urn:schemas-microsoft-com:office:word" xmlns:w="http://schemas.openxmlformats.org/wordprocessingml/2006/main" xmlns:w14="http://schemas.microsoft.com/office/word/2010/wordml" xmlns:w15="http://schemas.microsoft.com/office/word/2012/wordml" xmlns:w16cex="http://schemas.microsoft.com/office/word/2018/wordml/cex" xmlns:w16cid="http://schemas.microsoft.com/office/word/2016/wordml/cid" xmlns:w16="http://schemas.microsoft.com/office/word/2018/wordml" xmlns:w16du="http://schemas.microsoft.com/office/word/2023/wordml/word16du" xmlns:w16sdtdh="http://schemas.microsoft.com/office/word/2020/wordml/sdtdatahash" xmlns:w16sdtfl="http://schemas.microsoft.com/office/word/2024/wordml/sdtformatlock" xmlns:w16se="http://schemas.microsoft.com/office/word/2015/wordml/symex" xmlns:wpg="http://schemas.microsoft.com/office/word/2010/wordprocessingGroup" xmlns:wpi="http://schemas.microsoft.com/office/word/2010/wordprocessingInk" xmlns:wne="http://schemas.microsoft.com/office/word/2006/wordml" xmlns:wps="http://schemas.microsoft.com/office/word/2010/wordprocessingShape" mc:Ignorable="w14 w15 w16se w16cid w16 w16cex w16sdtdh w16sdtfl w16du wp14">
-  <w16cid:commentId w16cid:paraId="68049A65" w16cid:durableId="417ECA6A"/>
-</w16cid:commentsIds>
+<file path=word/footnotes.xml><?xml version="1.0" encoding="utf-8"?>
+<w:footnotes xmlns:wpc="http://schemas.microsoft.com/office/word/2010/wordprocessingCanvas" xmlns:cx="http://schemas.microsoft.com/office/drawing/2014/chartex" xmlns:cx1="http://schemas.microsoft.com/office/drawing/2015/9/8/chartex" xmlns:cx2="http://schemas.microsoft.com/office/drawing/2015/10/21/chartex" xmlns:cx3="http://schemas.microsoft.com/office/drawing/2016/5/9/chartex" xmlns:cx4="http://schemas.microsoft.com/office/drawing/2016/5/10/chartex" xmlns:cx5="http://schemas.microsoft.com/office/drawing/2016/5/11/chartex" xmlns:cx6="http://schemas.microsoft.com/office/drawing/2016/5/12/chartex" xmlns:cx7="http://schemas.microsoft.com/office/drawing/2016/5/13/chartex" xmlns:cx8="http://schemas.microsoft.com/office/drawing/2016/5/14/chartex" xmlns:mc="http://schemas.openxmlformats.org/markup-compatibility/2006" xmlns:aink="http://schemas.microsoft.com/office/drawing/2016/ink" xmlns:am3d="http://schemas.microsoft.com/office/drawing/2017/model3d" xmlns:o="urn:schemas-microsoft-com:office:office" xmlns:oel="http://schemas.microsoft.com/office/2019/extlst" xmlns:r="http://schemas.openxmlformats.org/officeDocument/2006/relationships" xmlns:m="http://schemas.openxmlformats.org/officeDocument/2006/math" xmlns:v="urn:schemas-microsoft-com:vml" xmlns:wp14="http://schemas.microsoft.com/office/word/2010/wordprocessingDrawing" xmlns:wp="http://schemas.openxmlformats.org/drawingml/2006/wordprocessingDrawing" xmlns:w10="urn:schemas-microsoft-com:office:word" xmlns:w="http://schemas.openxmlformats.org/wordprocessingml/2006/main" xmlns:w14="http://schemas.microsoft.com/office/word/2010/wordml" xmlns:w15="http://schemas.microsoft.com/office/word/2012/wordml" xmlns:w16cex="http://schemas.microsoft.com/office/word/2018/wordml/cex" xmlns:w16cid="http://schemas.microsoft.com/office/word/2016/wordml/cid" xmlns:w16="http://schemas.microsoft.com/office/word/2018/wordml" xmlns:w16du="http://schemas.microsoft.com/office/word/2023/wordml/word16du" xmlns:w16sdtdh="http://schemas.microsoft.com/office/word/2020/wordml/sdtdatahash" xmlns:w16sdtfl="http://schemas.microsoft.com/office/word/2024/wordml/sdtformatlock" xmlns:w16se="http://schemas.microsoft.com/office/word/2015/wordml/symex" xmlns:wpg="http://schemas.microsoft.com/office/word/2010/wordprocessingGroup" xmlns:wpi="http://schemas.microsoft.com/office/word/2010/wordprocessingInk" xmlns:wne="http://schemas.microsoft.com/office/word/2006/wordml" xmlns:wps="http://schemas.microsoft.com/office/word/2010/wordprocessingShape" mc:Ignorable="w14 w15 w16se w16cid w16 w16cex w16sdtdh w16sdtfl w16du wp14">
+  <w:footnote w:type="separator" w:id="-1">
+    <w:p>
+      <w:r>
+        <w:separator/>
+      </w:r>
+    </w:p>
+  </w:footnote>
+  <w:footnote w:type="continuationSeparator" w:id="0">
+    <w:p>
+      <w:r>
+        <w:continuationSeparator/>
+      </w:r>
+    </w:p>
+  </w:footnote>
+</w:footnotes>
 </file>
 
 <file path=word/numbering.xml><?xml version="1.0" encoding="utf-8"?>
@@ -7478,14 +8426,6 @@
     <w:abstractNumId w:val="4"/>
   </w:num>
 </w:numbering>
-</file>
-
-<file path=word/people.xml><?xml version="1.0" encoding="utf-8"?>
-<w15:people xmlns:wpc="http://schemas.microsoft.com/office/word/2010/wordprocessingCanvas" xmlns:cx="http://schemas.microsoft.com/office/drawing/2014/chartex" xmlns:cx1="http://schemas.microsoft.com/office/drawing/2015/9/8/chartex" xmlns:cx2="http://schemas.microsoft.com/office/drawing/2015/10/21/chartex" xmlns:cx3="http://schemas.microsoft.com/office/drawing/2016/5/9/chartex" xmlns:cx4="http://schemas.microsoft.com/office/drawing/2016/5/10/chartex" xmlns:cx5="http://schemas.microsoft.com/office/drawing/2016/5/11/chartex" xmlns:cx6="http://schemas.microsoft.com/office/drawing/2016/5/12/chartex" xmlns:cx7="http://schemas.microsoft.com/office/drawing/2016/5/13/chartex" xmlns:cx8="http://schemas.microsoft.com/office/drawing/2016/5/14/chartex" xmlns:mc="http://schemas.openxmlformats.org/markup-compatibility/2006" xmlns:aink="http://schemas.microsoft.com/office/drawing/2016/ink" xmlns:am3d="http://schemas.microsoft.com/office/drawing/2017/model3d" xmlns:o="urn:schemas-microsoft-com:office:office" xmlns:oel="http://schemas.microsoft.com/office/2019/extlst" xmlns:r="http://schemas.openxmlformats.org/officeDocument/2006/relationships" xmlns:m="http://schemas.openxmlformats.org/officeDocument/2006/math" xmlns:v="urn:schemas-microsoft-com:vml" xmlns:wp14="http://schemas.microsoft.com/office/word/2010/wordprocessingDrawing" xmlns:wp="http://schemas.openxmlformats.org/drawingml/2006/wordprocessingDrawing" xmlns:w10="urn:schemas-microsoft-com:office:word" xmlns:w="http://schemas.openxmlformats.org/wordprocessingml/2006/main" xmlns:w14="http://schemas.microsoft.com/office/word/2010/wordml" xmlns:w15="http://schemas.microsoft.com/office/word/2012/wordml" xmlns:w16cex="http://schemas.microsoft.com/office/word/2018/wordml/cex" xmlns:w16cid="http://schemas.microsoft.com/office/word/2016/wordml/cid" xmlns:w16="http://schemas.microsoft.com/office/word/2018/wordml" xmlns:w16du="http://schemas.microsoft.com/office/word/2023/wordml/word16du" xmlns:w16sdtdh="http://schemas.microsoft.com/office/word/2020/wordml/sdtdatahash" xmlns:w16sdtfl="http://schemas.microsoft.com/office/word/2024/wordml/sdtformatlock" xmlns:w16se="http://schemas.microsoft.com/office/word/2015/wordml/symex" xmlns:wpg="http://schemas.microsoft.com/office/word/2010/wordprocessingGroup" xmlns:wpi="http://schemas.microsoft.com/office/word/2010/wordprocessingInk" xmlns:wne="http://schemas.microsoft.com/office/word/2006/wordml" xmlns:wps="http://schemas.microsoft.com/office/word/2010/wordprocessingShape" mc:Ignorable="w14 w15 w16se w16cid w16 w16cex w16sdtdh w16sdtfl w16du wp14">
-  <w15:person w15:author="N Bernard">
-    <w15:presenceInfo w15:providerId="None" w15:userId="N Bernard"/>
-  </w15:person>
-</w15:people>
 </file>
 
 <file path=word/styles.xml><?xml version="1.0" encoding="utf-8"?>
@@ -7889,9 +8829,10 @@
     <w:name w:val="Normal"/>
     <w:uiPriority w:val="1"/>
     <w:qFormat/>
-    <w:rsid w:val="00776EF5"/>
+    <w:rsid w:val="002F7BEA"/>
     <w:pPr>
       <w:spacing w:after="0" w:line="240" w:lineRule="auto"/>
+      <w:jc w:val="both"/>
     </w:pPr>
     <w:rPr>
       <w:rFonts w:ascii="Times New Roman" w:eastAsia="Times New Roman" w:hAnsi="Times New Roman" w:cs="Times New Roman"/>
@@ -8646,6 +9587,64 @@
       <w:u w:val="single"/>
     </w:rPr>
   </w:style>
+  <w:style w:type="paragraph" w:styleId="En-tte">
+    <w:name w:val="header"/>
+    <w:basedOn w:val="Normal"/>
+    <w:link w:val="En-tteCar"/>
+    <w:uiPriority w:val="99"/>
+    <w:unhideWhenUsed/>
+    <w:rsid w:val="00E34BD0"/>
+    <w:pPr>
+      <w:tabs>
+        <w:tab w:val="center" w:pos="4536"/>
+        <w:tab w:val="right" w:pos="9072"/>
+      </w:tabs>
+    </w:pPr>
+  </w:style>
+  <w:style w:type="character" w:customStyle="1" w:styleId="En-tteCar">
+    <w:name w:val="En-tête Car"/>
+    <w:basedOn w:val="Policepardfaut"/>
+    <w:link w:val="En-tte"/>
+    <w:uiPriority w:val="99"/>
+    <w:rsid w:val="00E34BD0"/>
+    <w:rPr>
+      <w:rFonts w:ascii="Times New Roman" w:eastAsia="Times New Roman" w:hAnsi="Times New Roman" w:cs="Times New Roman"/>
+      <w:kern w:val="0"/>
+      <w:sz w:val="24"/>
+      <w:szCs w:val="24"/>
+      <w:lang w:eastAsia="fr-FR"/>
+      <w14:ligatures w14:val="none"/>
+    </w:rPr>
+  </w:style>
+  <w:style w:type="paragraph" w:styleId="Pieddepage">
+    <w:name w:val="footer"/>
+    <w:basedOn w:val="Normal"/>
+    <w:link w:val="PieddepageCar"/>
+    <w:uiPriority w:val="99"/>
+    <w:unhideWhenUsed/>
+    <w:rsid w:val="00E34BD0"/>
+    <w:pPr>
+      <w:tabs>
+        <w:tab w:val="center" w:pos="4536"/>
+        <w:tab w:val="right" w:pos="9072"/>
+      </w:tabs>
+    </w:pPr>
+  </w:style>
+  <w:style w:type="character" w:customStyle="1" w:styleId="PieddepageCar">
+    <w:name w:val="Pied de page Car"/>
+    <w:basedOn w:val="Policepardfaut"/>
+    <w:link w:val="Pieddepage"/>
+    <w:uiPriority w:val="99"/>
+    <w:rsid w:val="00E34BD0"/>
+    <w:rPr>
+      <w:rFonts w:ascii="Times New Roman" w:eastAsia="Times New Roman" w:hAnsi="Times New Roman" w:cs="Times New Roman"/>
+      <w:kern w:val="0"/>
+      <w:sz w:val="24"/>
+      <w:szCs w:val="24"/>
+      <w:lang w:eastAsia="fr-FR"/>
+      <w14:ligatures w14:val="none"/>
+    </w:rPr>
+  </w:style>
 </w:styles>
 </file>
 

</xml_diff>